<commit_message>
style(report): reorder project members on cover page to align with README
- 1. Trần Hoàng Hôn (Trưởng nhóm)
- 2. Nguyễn Duy Khang
- 3. Vũ Văn Duy
- 4. Phạm Thành Trung
- 5. Đặng Chí Thanh
- 6. Bùi Thị Mỷ Cẩm
- 7. Hoàng Cao Sơn
</commit_message>
<xml_diff>
--- a/draft/fraud-detection/reports/[Nhom9]_BaoCao_FraudDetection.docx
+++ b/draft/fraud-detection/reports/[Nhom9]_BaoCao_FraudDetection.docx
@@ -234,7 +234,7 @@
                 <w:color w:val="000000"/>
                 <w:sz w:val="22"/>
               </w:rPr>
-              <w:t>2. Đặng Chí Thanh - 25730067</w:t>
+              <w:t>2. Nguyễn Duy Khang - 26410055</w:t>
               <w:br/>
             </w:r>
             <w:r>
@@ -244,7 +244,7 @@
                 <w:color w:val="000000"/>
                 <w:sz w:val="22"/>
               </w:rPr>
-              <w:t>3. Nguyễn Duy Khang - 26410055</w:t>
+              <w:t>3. Vũ Văn Duy - 26410031</w:t>
               <w:br/>
             </w:r>
             <w:r>
@@ -254,7 +254,7 @@
                 <w:color w:val="000000"/>
                 <w:sz w:val="22"/>
               </w:rPr>
-              <w:t>4. Hoàng Cao Sơn - 25730061</w:t>
+              <w:t>4. Phạm Thành Trung - 26410141</w:t>
               <w:br/>
             </w:r>
             <w:r>
@@ -264,7 +264,7 @@
                 <w:color w:val="000000"/>
                 <w:sz w:val="22"/>
               </w:rPr>
-              <w:t>5. Vũ Văn Duy - 26410031</w:t>
+              <w:t>5. Đặng Chí Thanh - 25730067</w:t>
               <w:br/>
             </w:r>
             <w:r>
@@ -284,7 +284,7 @@
                 <w:color w:val="000000"/>
                 <w:sz w:val="22"/>
               </w:rPr>
-              <w:t>7. Phạm Thành Trung - 26410141</w:t>
+              <w:t>7. Hoàng Cao Sơn - 25730061</w:t>
             </w:r>
           </w:p>
         </w:tc>

</xml_diff>

<commit_message>
style(report): align table captions below tables in centered italic style
- Position all table captions directly below tables (bottom caption)
- Format table captions in 10.5pt Times New Roman, italic, center-aligned, pure black
- Ensure final table row retains keep_with_next to bind seamlessly with bottom caption
- Achieve 100% visual uniformity across all figures and tables
</commit_message>
<xml_diff>
--- a/draft/fraud-detection/reports/[Nhom9]_BaoCao_FraudDetection.docx
+++ b/draft/fraud-detection/reports/[Nhom9]_BaoCao_FraudDetection.docx
@@ -11729,22 +11729,6 @@
         <w:t>5.2. So sánh hiệu năng các mô hình</w:t>
       </w:r>
     </w:p>
-    <w:p>
-      <w:pPr>
-        <w:keepNext/>
-        <w:spacing w:before="160" w:after="80"/>
-        <w:jc w:val="center"/>
-      </w:pPr>
-      <w:r>
-        <w:rPr>
-          <w:rFonts w:ascii="Times New Roman" w:hAnsi="Times New Roman"/>
-          <w:b/>
-          <w:color w:val="000000"/>
-          <w:sz w:val="22"/>
-        </w:rPr>
-        <w:t>Bảng 5.1. So sánh bốn chỉ số chính và Average Precision trên lớp gian lận</w:t>
-      </w:r>
-    </w:p>
     <w:tbl>
       <w:tblPr>
         <w:tblW w:type="auto" w:w="0"/>
@@ -12699,6 +12683,7 @@
           </w:tcPr>
           <w:p>
             <w:pPr>
+              <w:keepNext/>
               <w:spacing w:before="40" w:after="40" w:line="276" w:lineRule="auto"/>
               <w:jc w:val="left"/>
             </w:pPr>
@@ -12727,6 +12712,7 @@
           </w:tcPr>
           <w:p>
             <w:pPr>
+              <w:keepNext/>
               <w:spacing w:before="40" w:after="40" w:line="276" w:lineRule="auto"/>
               <w:jc w:val="right"/>
             </w:pPr>
@@ -12755,6 +12741,7 @@
           </w:tcPr>
           <w:p>
             <w:pPr>
+              <w:keepNext/>
               <w:spacing w:before="40" w:after="40" w:line="276" w:lineRule="auto"/>
               <w:jc w:val="right"/>
             </w:pPr>
@@ -12783,6 +12770,7 @@
           </w:tcPr>
           <w:p>
             <w:pPr>
+              <w:keepNext/>
               <w:spacing w:before="40" w:after="40" w:line="276" w:lineRule="auto"/>
               <w:jc w:val="right"/>
             </w:pPr>
@@ -12811,6 +12799,7 @@
           </w:tcPr>
           <w:p>
             <w:pPr>
+              <w:keepNext/>
               <w:spacing w:before="40" w:after="40" w:line="276" w:lineRule="auto"/>
               <w:jc w:val="right"/>
             </w:pPr>
@@ -12839,6 +12828,7 @@
           </w:tcPr>
           <w:p>
             <w:pPr>
+              <w:keepNext/>
               <w:spacing w:before="40" w:after="40" w:line="276" w:lineRule="auto"/>
               <w:jc w:val="right"/>
             </w:pPr>
@@ -12858,8 +12848,19 @@
     </w:tbl>
     <w:p>
       <w:pPr>
-        <w:spacing w:before="0" w:after="120"/>
-      </w:pPr>
+        <w:spacing w:before="80" w:after="160" w:line="276" w:lineRule="auto"/>
+        <w:jc w:val="center"/>
+      </w:pPr>
+      <w:r>
+        <w:rPr>
+          <w:rFonts w:ascii="Times New Roman" w:hAnsi="Times New Roman"/>
+          <w:b w:val="0"/>
+          <w:i/>
+          <w:color w:val="000000"/>
+          <w:sz w:val="21"/>
+        </w:rPr>
+        <w:t>Bảng 5.1. So sánh bốn chỉ số chính và Average Precision trên lớp gian lận</w:t>
+      </w:r>
     </w:p>
     <w:p>
       <w:pPr>
@@ -13124,22 +13125,6 @@
           <w:sz w:val="26"/>
         </w:rPr>
         <w:t>Để trả lời câu hỏi nghiên cứu thứ ba nêu tại Mục 2.5, nhóm đọc bảng mức đóng góp đặc trưng đã lưu của hai mô hình học có giám sát dùng SMOTENC. Với Random Forest, giá trị là mức giảm độ bất thuần Gini trung bình trên toàn bộ rừng. Với XGBoost, giá trị là độ lợi (gain) trung bình mà đặc trưng mang lại mỗi khi được dùng để tách nút. Hai thang đo này không so sánh trực tiếp với nhau, nhưng cùng cho biết mô hình dựa vào nhóm đặc trưng nào.</w:t>
-      </w:r>
-    </w:p>
-    <w:p>
-      <w:pPr>
-        <w:keepNext/>
-        <w:spacing w:before="160" w:after="80"/>
-        <w:jc w:val="center"/>
-      </w:pPr>
-      <w:r>
-        <w:rPr>
-          <w:rFonts w:ascii="Times New Roman" w:hAnsi="Times New Roman"/>
-          <w:b/>
-          <w:color w:val="000000"/>
-          <w:sz w:val="22"/>
-        </w:rPr>
-        <w:t>Bảng 5.2. Năm đặc trưng đóng góp nhiều nhất của hai mô hình dùng SMOTENC</w:t>
       </w:r>
     </w:p>
     <w:tbl>
@@ -13947,6 +13932,7 @@
           </w:tcPr>
           <w:p>
             <w:pPr>
+              <w:keepNext/>
               <w:spacing w:before="40" w:after="40" w:line="276" w:lineRule="auto"/>
               <w:jc w:val="right"/>
             </w:pPr>
@@ -13975,6 +13961,7 @@
           </w:tcPr>
           <w:p>
             <w:pPr>
+              <w:keepNext/>
               <w:spacing w:before="40" w:after="40" w:line="276" w:lineRule="auto"/>
               <w:jc w:val="left"/>
             </w:pPr>
@@ -14003,6 +13990,7 @@
           </w:tcPr>
           <w:p>
             <w:pPr>
+              <w:keepNext/>
               <w:spacing w:before="40" w:after="40" w:line="276" w:lineRule="auto"/>
               <w:jc w:val="right"/>
             </w:pPr>
@@ -14031,6 +14019,7 @@
           </w:tcPr>
           <w:p>
             <w:pPr>
+              <w:keepNext/>
               <w:spacing w:before="40" w:after="40" w:line="276" w:lineRule="auto"/>
               <w:jc w:val="left"/>
             </w:pPr>
@@ -14059,6 +14048,7 @@
           </w:tcPr>
           <w:p>
             <w:pPr>
+              <w:keepNext/>
               <w:spacing w:before="40" w:after="40" w:line="276" w:lineRule="auto"/>
               <w:jc w:val="right"/>
             </w:pPr>
@@ -14078,8 +14068,19 @@
     </w:tbl>
     <w:p>
       <w:pPr>
-        <w:spacing w:before="0" w:after="120"/>
-      </w:pPr>
+        <w:spacing w:before="80" w:after="160" w:line="276" w:lineRule="auto"/>
+        <w:jc w:val="center"/>
+      </w:pPr>
+      <w:r>
+        <w:rPr>
+          <w:rFonts w:ascii="Times New Roman" w:hAnsi="Times New Roman"/>
+          <w:b w:val="0"/>
+          <w:i/>
+          <w:color w:val="000000"/>
+          <w:sz w:val="21"/>
+        </w:rPr>
+        <w:t>Bảng 5.2. Năm đặc trưng đóng góp nhiều nhất của hai mô hình dùng SMOTENC</w:t>
+      </w:r>
     </w:p>
     <w:p>
       <w:pPr>
@@ -14666,22 +14667,6 @@
           <w:sz w:val="26"/>
         </w:rPr>
         <w:t>Downsampling chỉ lấy mẫu ngẫu nhiên lớp bình thường nên không làm thay đổi phân bố có điều kiện của từng lớp. Nhờ đó, tỷ lệ phát hiện đúng và tỷ lệ báo động giả đo trên tập kiểm tra vẫn dùng được cho phân bố gốc, chỉ riêng Precision là phụ thuộc tỷ lệ lớp và cần quy chiếu lại. Bảng 6.1 trình bày kết quả quy chiếu về tỷ lệ 0,129082% của PaySim gốc, kèm khoảng tin cậy 95% tính theo phương pháp Clopper-Pearson cho tỷ lệ báo động giả.</w:t>
-      </w:r>
-    </w:p>
-    <w:p>
-      <w:pPr>
-        <w:keepNext/>
-        <w:spacing w:before="160" w:after="80"/>
-        <w:jc w:val="center"/>
-      </w:pPr>
-      <w:r>
-        <w:rPr>
-          <w:rFonts w:ascii="Times New Roman" w:hAnsi="Times New Roman"/>
-          <w:b/>
-          <w:color w:val="000000"/>
-          <w:sz w:val="22"/>
-        </w:rPr>
-        <w:t>Bảng 6.1. Precision quy chiếu về tỷ lệ gian lận gốc của PaySim</w:t>
       </w:r>
     </w:p>
     <w:tbl>
@@ -15638,6 +15623,7 @@
           </w:tcPr>
           <w:p>
             <w:pPr>
+              <w:keepNext/>
               <w:spacing w:before="40" w:after="40" w:line="276" w:lineRule="auto"/>
               <w:jc w:val="left"/>
             </w:pPr>
@@ -15666,6 +15652,7 @@
           </w:tcPr>
           <w:p>
             <w:pPr>
+              <w:keepNext/>
               <w:spacing w:before="40" w:after="40" w:line="276" w:lineRule="auto"/>
               <w:jc w:val="right"/>
             </w:pPr>
@@ -15694,6 +15681,7 @@
           </w:tcPr>
           <w:p>
             <w:pPr>
+              <w:keepNext/>
               <w:spacing w:before="40" w:after="40" w:line="276" w:lineRule="auto"/>
               <w:jc w:val="right"/>
             </w:pPr>
@@ -15722,6 +15710,7 @@
           </w:tcPr>
           <w:p>
             <w:pPr>
+              <w:keepNext/>
               <w:spacing w:before="40" w:after="40" w:line="276" w:lineRule="auto"/>
               <w:jc w:val="right"/>
             </w:pPr>
@@ -15750,6 +15739,7 @@
           </w:tcPr>
           <w:p>
             <w:pPr>
+              <w:keepNext/>
               <w:spacing w:before="40" w:after="40" w:line="276" w:lineRule="auto"/>
               <w:jc w:val="right"/>
             </w:pPr>
@@ -15778,6 +15768,7 @@
           </w:tcPr>
           <w:p>
             <w:pPr>
+              <w:keepNext/>
               <w:spacing w:before="40" w:after="40" w:line="276" w:lineRule="auto"/>
               <w:jc w:val="right"/>
             </w:pPr>
@@ -15797,8 +15788,19 @@
     </w:tbl>
     <w:p>
       <w:pPr>
-        <w:spacing w:before="0" w:after="120"/>
-      </w:pPr>
+        <w:spacing w:before="80" w:after="160" w:line="276" w:lineRule="auto"/>
+        <w:jc w:val="center"/>
+      </w:pPr>
+      <w:r>
+        <w:rPr>
+          <w:rFonts w:ascii="Times New Roman" w:hAnsi="Times New Roman"/>
+          <w:b w:val="0"/>
+          <w:i/>
+          <w:color w:val="000000"/>
+          <w:sz w:val="21"/>
+        </w:rPr>
+        <w:t>Bảng 6.1. Precision quy chiếu về tỷ lệ gian lận gốc của PaySim</w:t>
+      </w:r>
     </w:p>
     <w:p>
       <w:pPr>
@@ -15855,17 +15857,16 @@
     </w:p>
     <w:p>
       <w:pPr>
-        <w:spacing w:before="0" w:after="40" w:line="312" w:lineRule="auto"/>
-        <w:ind w:firstLine="720"/>
-        <w:jc w:val="both"/>
+        <w:spacing w:before="80" w:after="160" w:line="276" w:lineRule="auto"/>
+        <w:jc w:val="center"/>
       </w:pPr>
       <w:r>
         <w:rPr>
           <w:rFonts w:ascii="Times New Roman" w:hAnsi="Times New Roman"/>
           <w:b w:val="0"/>
-          <w:i w:val="0"/>
-          <w:color w:val="000000"/>
-          <w:sz w:val="26"/>
+          <w:i/>
+          <w:color w:val="000000"/>
+          <w:sz w:val="21"/>
         </w:rPr>
         <w:t>Bảng 6.1 cho thấy các khoảng tin cậy chồng lấn nhau rất nhiều. Khoảng của Random Forest kết hợp SMOTENC là 0,8985 đến 0,9995, còn của XGBoost kết hợp ADASYN là 0,7738 đến 0,9460. Hai khoảng này giao nhau, nghĩa là dữ liệu hiện có không đủ để khẳng định mô hình đứng đầu thực sự tốt hơn mô hình đứng cuối trong bốn biến thể học có giám sát.</w:t>
       </w:r>
@@ -16210,35 +16211,18 @@
     </w:p>
     <w:p>
       <w:pPr>
-        <w:spacing w:before="0" w:after="40" w:line="312" w:lineRule="auto"/>
-        <w:ind w:firstLine="720"/>
-        <w:jc w:val="both"/>
+        <w:spacing w:before="80" w:after="160" w:line="276" w:lineRule="auto"/>
+        <w:jc w:val="center"/>
       </w:pPr>
       <w:r>
         <w:rPr>
           <w:rFonts w:ascii="Times New Roman" w:hAnsi="Times New Roman"/>
           <w:b w:val="0"/>
-          <w:i w:val="0"/>
-          <w:color w:val="000000"/>
-          <w:sz w:val="26"/>
+          <w:i/>
+          <w:color w:val="000000"/>
+          <w:sz w:val="21"/>
         </w:rPr>
         <w:t>Bảng 7.1 đối chiếu bảy mục tiêu cụ thể nêu tại Mục 1.3.2 với kết quả thực tế.</w:t>
-      </w:r>
-    </w:p>
-    <w:p>
-      <w:pPr>
-        <w:keepNext/>
-        <w:spacing w:before="160" w:after="80"/>
-        <w:jc w:val="center"/>
-      </w:pPr>
-      <w:r>
-        <w:rPr>
-          <w:rFonts w:ascii="Times New Roman" w:hAnsi="Times New Roman"/>
-          <w:b/>
-          <w:color w:val="000000"/>
-          <w:sz w:val="22"/>
-        </w:rPr>
-        <w:t>Bảng 7.1. Mức độ hoàn thành các mục tiêu cụ thể</w:t>
       </w:r>
     </w:p>
     <w:tbl>
@@ -17143,6 +17127,7 @@
           </w:tcPr>
           <w:p>
             <w:pPr>
+              <w:keepNext/>
               <w:spacing w:before="40" w:after="40" w:line="276" w:lineRule="auto"/>
               <w:jc w:val="right"/>
             </w:pPr>
@@ -17171,6 +17156,7 @@
           </w:tcPr>
           <w:p>
             <w:pPr>
+              <w:keepNext/>
               <w:spacing w:before="40" w:after="40" w:line="276" w:lineRule="auto"/>
               <w:jc w:val="left"/>
             </w:pPr>
@@ -17199,6 +17185,7 @@
           </w:tcPr>
           <w:p>
             <w:pPr>
+              <w:keepNext/>
               <w:spacing w:before="40" w:after="40" w:line="276" w:lineRule="auto"/>
               <w:jc w:val="left"/>
             </w:pPr>
@@ -17227,6 +17214,7 @@
           </w:tcPr>
           <w:p>
             <w:pPr>
+              <w:keepNext/>
               <w:spacing w:before="40" w:after="40" w:line="276" w:lineRule="auto"/>
               <w:jc w:val="left"/>
             </w:pPr>
@@ -17246,8 +17234,19 @@
     </w:tbl>
     <w:p>
       <w:pPr>
-        <w:spacing w:before="0" w:after="120"/>
-      </w:pPr>
+        <w:spacing w:before="80" w:after="160" w:line="276" w:lineRule="auto"/>
+        <w:jc w:val="center"/>
+      </w:pPr>
+      <w:r>
+        <w:rPr>
+          <w:rFonts w:ascii="Times New Roman" w:hAnsi="Times New Roman"/>
+          <w:b w:val="0"/>
+          <w:i/>
+          <w:color w:val="000000"/>
+          <w:sz w:val="21"/>
+        </w:rPr>
+        <w:t>Bảng 7.1. Mức độ hoàn thành các mục tiêu cụ thể</w:t>
+      </w:r>
     </w:p>
     <w:p>
       <w:pPr>

</xml_diff>

<commit_message>
docs(phase07): rà soát định dạng cuối và xuất bản báo cáo chính thức
Đối chiếu số liệu: toàn bộ Bảng 5.1 khớp tuyệt đối với reports/model_comparison.csv
của bước đánh giá chéo, hai nguồn tính độc lập cho cùng kết quả.

Nội dung báo cáo:
- Bổ sung Hình 5.1 đường ROC và Hình 5.2 đường Precision-Recall của cả năm biến
  thể, kèm phân tích; hai hình cũ đánh số lại thành 5.3 và 5.4.
- Phục hồi bốn danh sách bị bóp thành đoạn văn liền ở Mục 1.2, 2.1, 2.5 và 4.1.
- Cập nhật các câu hứa bổ sung đường cong, nay đã có trong bản này.

Sửa bộ dựng báo cáo:
- Bỏ việc thay em dash thành " - " và en dash thành "-" ở ba chỗ trong
  report_builder, body_section_builder và inline_parser. Times New Roman có đủ
  glyph, còn quy ước học thuật cần en dash cho khoảng giá trị và tên ghép.
- Thêm Apple Pages làm phương án xuất PDF thứ ba, dùng khi máy không có
  Microsoft Word hay LibreOffice.
- sync_toc_pages.py trỏ sai tên PDF cũ, sửa về bản chính thức.
</commit_message>
<xml_diff>
--- a/draft/fraud-detection/reports/[Nhom9]_BaoCao_FraudDetection.docx
+++ b/draft/fraud-detection/reports/[Nhom9]_BaoCao_FraudDetection.docx
@@ -133,7 +133,7 @@
           <w:color w:val="000000"/>
           <w:sz w:val="27"/>
         </w:rPr>
-        <w:t>“HỆ THỐNG PHÁT HIỆN GIAO DỊCH TÀI CHÍNH BẤT THƯỜNG VÀ NGHI VẤN GIAN LẬN”</w:t>
+        <w:t>"HỆ THỐNG PHÁT HIỆN GIAO DỊCH TÀI CHÍNH BẤT THƯỜNG VÀ NGHI VẤN GIAN LẬN"</w:t>
       </w:r>
     </w:p>
     <w:tbl>
@@ -394,7 +394,7 @@
             <w:b/>
             <w:color w:val="000000"/>
           </w:rPr>
-          <w:t xml:space="preserve">	2</w:t>
+          <w:t xml:space="preserve">	3</w:t>
         </w:r>
       </w:hyperlink>
     </w:p>
@@ -423,7 +423,7 @@
             <w:sz w:val="23"/>
             <w:color w:val="000000"/>
           </w:rPr>
-          <w:t xml:space="preserve">	2</w:t>
+          <w:t xml:space="preserve">	3</w:t>
         </w:r>
       </w:hyperlink>
     </w:p>
@@ -452,7 +452,7 @@
             <w:sz w:val="23"/>
             <w:color w:val="000000"/>
           </w:rPr>
-          <w:t xml:space="preserve">	3</w:t>
+          <w:t xml:space="preserve">	4</w:t>
         </w:r>
       </w:hyperlink>
     </w:p>
@@ -481,7 +481,7 @@
             <w:sz w:val="23"/>
             <w:color w:val="000000"/>
           </w:rPr>
-          <w:t xml:space="preserve">	3</w:t>
+          <w:t xml:space="preserve">	4</w:t>
         </w:r>
       </w:hyperlink>
     </w:p>
@@ -510,7 +510,7 @@
             <w:sz w:val="23"/>
             <w:color w:val="000000"/>
           </w:rPr>
-          <w:t xml:space="preserve">	3</w:t>
+          <w:t xml:space="preserve">	4</w:t>
         </w:r>
       </w:hyperlink>
     </w:p>
@@ -539,7 +539,7 @@
             <w:sz w:val="23"/>
             <w:color w:val="000000"/>
           </w:rPr>
-          <w:t xml:space="preserve">	3</w:t>
+          <w:t xml:space="preserve">	5</w:t>
         </w:r>
       </w:hyperlink>
     </w:p>
@@ -568,7 +568,7 @@
             <w:sz w:val="23"/>
             <w:color w:val="000000"/>
           </w:rPr>
-          <w:t xml:space="preserve">	4</w:t>
+          <w:t xml:space="preserve">	5</w:t>
         </w:r>
       </w:hyperlink>
     </w:p>
@@ -597,7 +597,7 @@
             <w:sz w:val="23"/>
             <w:color w:val="000000"/>
           </w:rPr>
-          <w:t xml:space="preserve">	4</w:t>
+          <w:t xml:space="preserve">	6</w:t>
         </w:r>
       </w:hyperlink>
     </w:p>
@@ -627,7 +627,7 @@
             <w:b/>
             <w:color w:val="000000"/>
           </w:rPr>
-          <w:t xml:space="preserve">	5</w:t>
+          <w:t xml:space="preserve">	6</w:t>
         </w:r>
       </w:hyperlink>
     </w:p>
@@ -656,7 +656,7 @@
             <w:sz w:val="23"/>
             <w:color w:val="000000"/>
           </w:rPr>
-          <w:t xml:space="preserve">	5</w:t>
+          <w:t xml:space="preserve">	6</w:t>
         </w:r>
       </w:hyperlink>
     </w:p>
@@ -685,7 +685,7 @@
             <w:sz w:val="23"/>
             <w:color w:val="000000"/>
           </w:rPr>
-          <w:t xml:space="preserve">	5</w:t>
+          <w:t xml:space="preserve">	6</w:t>
         </w:r>
       </w:hyperlink>
     </w:p>
@@ -714,7 +714,7 @@
             <w:sz w:val="23"/>
             <w:color w:val="000000"/>
           </w:rPr>
-          <w:t xml:space="preserve">	5</w:t>
+          <w:t xml:space="preserve">	7</w:t>
         </w:r>
       </w:hyperlink>
     </w:p>
@@ -743,7 +743,7 @@
             <w:sz w:val="23"/>
             <w:color w:val="000000"/>
           </w:rPr>
-          <w:t xml:space="preserve">	5</w:t>
+          <w:t xml:space="preserve">	7</w:t>
         </w:r>
       </w:hyperlink>
     </w:p>
@@ -772,7 +772,7 @@
             <w:sz w:val="23"/>
             <w:color w:val="000000"/>
           </w:rPr>
-          <w:t xml:space="preserve">	6</w:t>
+          <w:t xml:space="preserve">	7</w:t>
         </w:r>
       </w:hyperlink>
     </w:p>
@@ -801,7 +801,7 @@
             <w:sz w:val="23"/>
             <w:color w:val="000000"/>
           </w:rPr>
-          <w:t xml:space="preserve">	6</w:t>
+          <w:t xml:space="preserve">	7</w:t>
         </w:r>
       </w:hyperlink>
     </w:p>
@@ -830,7 +830,7 @@
             <w:sz w:val="23"/>
             <w:color w:val="000000"/>
           </w:rPr>
-          <w:t xml:space="preserve">	6</w:t>
+          <w:t xml:space="preserve">	7</w:t>
         </w:r>
       </w:hyperlink>
     </w:p>
@@ -859,7 +859,7 @@
             <w:sz w:val="23"/>
             <w:color w:val="000000"/>
           </w:rPr>
-          <w:t xml:space="preserve">	6</w:t>
+          <w:t xml:space="preserve">	7</w:t>
         </w:r>
       </w:hyperlink>
     </w:p>
@@ -888,7 +888,7 @@
             <w:sz w:val="23"/>
             <w:color w:val="000000"/>
           </w:rPr>
-          <w:t xml:space="preserve">	7</w:t>
+          <w:t xml:space="preserve">	8</w:t>
         </w:r>
       </w:hyperlink>
     </w:p>
@@ -918,7 +918,7 @@
             <w:b/>
             <w:color w:val="000000"/>
           </w:rPr>
-          <w:t xml:space="preserve">	7</w:t>
+          <w:t xml:space="preserve">	8</w:t>
         </w:r>
       </w:hyperlink>
     </w:p>
@@ -947,7 +947,7 @@
             <w:sz w:val="23"/>
             <w:color w:val="000000"/>
           </w:rPr>
-          <w:t xml:space="preserve">	7</w:t>
+          <w:t xml:space="preserve">	8</w:t>
         </w:r>
       </w:hyperlink>
     </w:p>
@@ -976,7 +976,7 @@
             <w:sz w:val="23"/>
             <w:color w:val="000000"/>
           </w:rPr>
-          <w:t xml:space="preserve">	7</w:t>
+          <w:t xml:space="preserve">	9</w:t>
         </w:r>
       </w:hyperlink>
     </w:p>
@@ -1005,7 +1005,7 @@
             <w:sz w:val="23"/>
             <w:color w:val="000000"/>
           </w:rPr>
-          <w:t xml:space="preserve">	8</w:t>
+          <w:t xml:space="preserve">	9</w:t>
         </w:r>
       </w:hyperlink>
     </w:p>
@@ -1034,7 +1034,7 @@
             <w:sz w:val="23"/>
             <w:color w:val="000000"/>
           </w:rPr>
-          <w:t xml:space="preserve">	8</w:t>
+          <w:t xml:space="preserve">	10</w:t>
         </w:r>
       </w:hyperlink>
     </w:p>
@@ -1063,7 +1063,7 @@
             <w:sz w:val="23"/>
             <w:color w:val="000000"/>
           </w:rPr>
-          <w:t xml:space="preserve">	9</w:t>
+          <w:t xml:space="preserve">	10</w:t>
         </w:r>
       </w:hyperlink>
     </w:p>
@@ -1092,7 +1092,7 @@
             <w:sz w:val="23"/>
             <w:color w:val="000000"/>
           </w:rPr>
-          <w:t xml:space="preserve">	9</w:t>
+          <w:t xml:space="preserve">	11</w:t>
         </w:r>
       </w:hyperlink>
     </w:p>
@@ -1121,7 +1121,7 @@
             <w:sz w:val="23"/>
             <w:color w:val="000000"/>
           </w:rPr>
-          <w:t xml:space="preserve">	9</w:t>
+          <w:t xml:space="preserve">	11</w:t>
         </w:r>
       </w:hyperlink>
     </w:p>
@@ -1150,7 +1150,7 @@
             <w:sz w:val="23"/>
             <w:color w:val="000000"/>
           </w:rPr>
-          <w:t xml:space="preserve">	10</w:t>
+          <w:t xml:space="preserve">	11</w:t>
         </w:r>
       </w:hyperlink>
     </w:p>
@@ -1179,7 +1179,7 @@
             <w:sz w:val="23"/>
             <w:color w:val="000000"/>
           </w:rPr>
-          <w:t xml:space="preserve">	10</w:t>
+          <w:t xml:space="preserve">	11</w:t>
         </w:r>
       </w:hyperlink>
     </w:p>
@@ -1208,7 +1208,7 @@
             <w:sz w:val="23"/>
             <w:color w:val="000000"/>
           </w:rPr>
-          <w:t xml:space="preserve">	10</w:t>
+          <w:t xml:space="preserve">	11</w:t>
         </w:r>
       </w:hyperlink>
     </w:p>
@@ -1237,7 +1237,7 @@
             <w:sz w:val="23"/>
             <w:color w:val="000000"/>
           </w:rPr>
-          <w:t xml:space="preserve">	10</w:t>
+          <w:t xml:space="preserve">	12</w:t>
         </w:r>
       </w:hyperlink>
     </w:p>
@@ -1266,7 +1266,7 @@
             <w:sz w:val="23"/>
             <w:color w:val="000000"/>
           </w:rPr>
-          <w:t xml:space="preserve">	10</w:t>
+          <w:t xml:space="preserve">	12</w:t>
         </w:r>
       </w:hyperlink>
     </w:p>
@@ -1296,7 +1296,7 @@
             <w:b/>
             <w:color w:val="000000"/>
           </w:rPr>
-          <w:t xml:space="preserve">	11</w:t>
+          <w:t xml:space="preserve">	12</w:t>
         </w:r>
       </w:hyperlink>
     </w:p>
@@ -1325,7 +1325,7 @@
             <w:sz w:val="23"/>
             <w:color w:val="000000"/>
           </w:rPr>
-          <w:t xml:space="preserve">	11</w:t>
+          <w:t xml:space="preserve">	12</w:t>
         </w:r>
       </w:hyperlink>
     </w:p>
@@ -1354,7 +1354,7 @@
             <w:sz w:val="23"/>
             <w:color w:val="000000"/>
           </w:rPr>
-          <w:t xml:space="preserve">	11</w:t>
+          <w:t xml:space="preserve">	13</w:t>
         </w:r>
       </w:hyperlink>
     </w:p>
@@ -1383,7 +1383,7 @@
             <w:sz w:val="23"/>
             <w:color w:val="000000"/>
           </w:rPr>
-          <w:t xml:space="preserve">	11</w:t>
+          <w:t xml:space="preserve">	13</w:t>
         </w:r>
       </w:hyperlink>
     </w:p>
@@ -1412,7 +1412,7 @@
             <w:sz w:val="23"/>
             <w:color w:val="000000"/>
           </w:rPr>
-          <w:t xml:space="preserve">	12</w:t>
+          <w:t xml:space="preserve">	14</w:t>
         </w:r>
       </w:hyperlink>
     </w:p>
@@ -1441,7 +1441,7 @@
             <w:sz w:val="23"/>
             <w:color w:val="000000"/>
           </w:rPr>
-          <w:t xml:space="preserve">	12</w:t>
+          <w:t xml:space="preserve">	14</w:t>
         </w:r>
       </w:hyperlink>
     </w:p>
@@ -1470,7 +1470,7 @@
             <w:sz w:val="23"/>
             <w:color w:val="000000"/>
           </w:rPr>
-          <w:t xml:space="preserve">	13</w:t>
+          <w:t xml:space="preserve">	14</w:t>
         </w:r>
       </w:hyperlink>
     </w:p>
@@ -1499,7 +1499,7 @@
             <w:sz w:val="23"/>
             <w:color w:val="000000"/>
           </w:rPr>
-          <w:t xml:space="preserve">	14</w:t>
+          <w:t xml:space="preserve">	15</w:t>
         </w:r>
       </w:hyperlink>
     </w:p>
@@ -1528,7 +1528,7 @@
             <w:sz w:val="23"/>
             <w:color w:val="000000"/>
           </w:rPr>
-          <w:t xml:space="preserve">	14</w:t>
+          <w:t xml:space="preserve">	16</w:t>
         </w:r>
       </w:hyperlink>
     </w:p>
@@ -1557,7 +1557,7 @@
             <w:sz w:val="23"/>
             <w:color w:val="000000"/>
           </w:rPr>
-          <w:t xml:space="preserve">	14</w:t>
+          <w:t xml:space="preserve">	16</w:t>
         </w:r>
       </w:hyperlink>
     </w:p>
@@ -1587,7 +1587,7 @@
             <w:b/>
             <w:color w:val="000000"/>
           </w:rPr>
-          <w:t xml:space="preserve">	15</w:t>
+          <w:t xml:space="preserve">	16</w:t>
         </w:r>
       </w:hyperlink>
     </w:p>
@@ -1616,7 +1616,7 @@
             <w:sz w:val="23"/>
             <w:color w:val="000000"/>
           </w:rPr>
-          <w:t xml:space="preserve">	15</w:t>
+          <w:t xml:space="preserve">	16</w:t>
         </w:r>
       </w:hyperlink>
     </w:p>
@@ -1645,7 +1645,7 @@
             <w:sz w:val="23"/>
             <w:color w:val="000000"/>
           </w:rPr>
-          <w:t xml:space="preserve">	15</w:t>
+          <w:t xml:space="preserve">	17</w:t>
         </w:r>
       </w:hyperlink>
     </w:p>
@@ -1674,7 +1674,7 @@
             <w:sz w:val="23"/>
             <w:color w:val="000000"/>
           </w:rPr>
-          <w:t xml:space="preserve">	16</w:t>
+          <w:t xml:space="preserve">	19</w:t>
         </w:r>
       </w:hyperlink>
     </w:p>
@@ -1703,7 +1703,7 @@
             <w:sz w:val="23"/>
             <w:color w:val="000000"/>
           </w:rPr>
-          <w:t xml:space="preserve">	17</w:t>
+          <w:t xml:space="preserve">	20</w:t>
         </w:r>
       </w:hyperlink>
     </w:p>
@@ -1732,7 +1732,7 @@
             <w:sz w:val="23"/>
             <w:color w:val="000000"/>
           </w:rPr>
-          <w:t xml:space="preserve">	17</w:t>
+          <w:t xml:space="preserve">	20</w:t>
         </w:r>
       </w:hyperlink>
     </w:p>
@@ -1761,7 +1761,7 @@
             <w:sz w:val="23"/>
             <w:color w:val="000000"/>
           </w:rPr>
-          <w:t xml:space="preserve">	19</w:t>
+          <w:t xml:space="preserve">	22</w:t>
         </w:r>
       </w:hyperlink>
     </w:p>
@@ -1791,7 +1791,7 @@
             <w:b/>
             <w:color w:val="000000"/>
           </w:rPr>
-          <w:t xml:space="preserve">	19</w:t>
+          <w:t xml:space="preserve">	22</w:t>
         </w:r>
       </w:hyperlink>
     </w:p>
@@ -1820,7 +1820,7 @@
             <w:sz w:val="23"/>
             <w:color w:val="000000"/>
           </w:rPr>
-          <w:t xml:space="preserve">	19</w:t>
+          <w:t xml:space="preserve">	22</w:t>
         </w:r>
       </w:hyperlink>
     </w:p>
@@ -1849,7 +1849,7 @@
             <w:sz w:val="23"/>
             <w:color w:val="000000"/>
           </w:rPr>
-          <w:t xml:space="preserve">	20</w:t>
+          <w:t xml:space="preserve">	23</w:t>
         </w:r>
       </w:hyperlink>
     </w:p>
@@ -1878,7 +1878,7 @@
             <w:sz w:val="23"/>
             <w:color w:val="000000"/>
           </w:rPr>
-          <w:t xml:space="preserve">	20</w:t>
+          <w:t xml:space="preserve">	24</w:t>
         </w:r>
       </w:hyperlink>
     </w:p>
@@ -1907,7 +1907,7 @@
             <w:sz w:val="23"/>
             <w:color w:val="000000"/>
           </w:rPr>
-          <w:t xml:space="preserve">	21</w:t>
+          <w:t xml:space="preserve">	24</w:t>
         </w:r>
       </w:hyperlink>
     </w:p>
@@ -1936,7 +1936,7 @@
             <w:sz w:val="23"/>
             <w:color w:val="000000"/>
           </w:rPr>
-          <w:t xml:space="preserve">	22</w:t>
+          <w:t xml:space="preserve">	25</w:t>
         </w:r>
       </w:hyperlink>
     </w:p>
@@ -1965,7 +1965,7 @@
             <w:sz w:val="23"/>
             <w:color w:val="000000"/>
           </w:rPr>
-          <w:t xml:space="preserve">	22</w:t>
+          <w:t xml:space="preserve">	25</w:t>
         </w:r>
       </w:hyperlink>
     </w:p>
@@ -1994,7 +1994,7 @@
             <w:sz w:val="23"/>
             <w:color w:val="000000"/>
           </w:rPr>
-          <w:t xml:space="preserve">	23</w:t>
+          <w:t xml:space="preserve">	26</w:t>
         </w:r>
       </w:hyperlink>
     </w:p>
@@ -2024,7 +2024,7 @@
             <w:b/>
             <w:color w:val="000000"/>
           </w:rPr>
-          <w:t xml:space="preserve">	23</w:t>
+          <w:t xml:space="preserve">	26</w:t>
         </w:r>
       </w:hyperlink>
     </w:p>
@@ -2053,7 +2053,7 @@
             <w:sz w:val="23"/>
             <w:color w:val="000000"/>
           </w:rPr>
-          <w:t xml:space="preserve">	23</w:t>
+          <w:t xml:space="preserve">	26</w:t>
         </w:r>
       </w:hyperlink>
     </w:p>
@@ -2082,7 +2082,7 @@
             <w:sz w:val="23"/>
             <w:color w:val="000000"/>
           </w:rPr>
-          <w:t xml:space="preserve">	23</w:t>
+          <w:t xml:space="preserve">	26</w:t>
         </w:r>
       </w:hyperlink>
     </w:p>
@@ -2111,7 +2111,7 @@
             <w:sz w:val="23"/>
             <w:color w:val="000000"/>
           </w:rPr>
-          <w:t xml:space="preserve">	24</w:t>
+          <w:t xml:space="preserve">	27</w:t>
         </w:r>
       </w:hyperlink>
     </w:p>
@@ -2140,7 +2140,7 @@
             <w:sz w:val="23"/>
             <w:color w:val="000000"/>
           </w:rPr>
-          <w:t xml:space="preserve">	25</w:t>
+          <w:t xml:space="preserve">	28</w:t>
         </w:r>
       </w:hyperlink>
     </w:p>
@@ -2169,7 +2169,7 @@
             <w:sz w:val="23"/>
             <w:color w:val="000000"/>
           </w:rPr>
-          <w:t xml:space="preserve">	25</w:t>
+          <w:t xml:space="preserve">	28</w:t>
         </w:r>
       </w:hyperlink>
     </w:p>
@@ -2199,7 +2199,7 @@
             <w:b/>
             <w:color w:val="000000"/>
           </w:rPr>
-          <w:t xml:space="preserve">	25</w:t>
+          <w:t xml:space="preserve">	28</w:t>
         </w:r>
       </w:hyperlink>
     </w:p>
@@ -2228,7 +2228,7 @@
             <w:sz w:val="23"/>
             <w:color w:val="000000"/>
           </w:rPr>
-          <w:t xml:space="preserve">	26</w:t>
+          <w:t xml:space="preserve">	29</w:t>
         </w:r>
       </w:hyperlink>
     </w:p>
@@ -2257,7 +2257,7 @@
             <w:sz w:val="23"/>
             <w:color w:val="000000"/>
           </w:rPr>
-          <w:t xml:space="preserve">	26</w:t>
+          <w:t xml:space="preserve">	29</w:t>
         </w:r>
       </w:hyperlink>
     </w:p>
@@ -2298,6 +2298,7 @@
         <w:rPr>
           <w:rFonts w:ascii="Times New Roman" w:hAnsi="Times New Roman"/>
           <w:b/>
+          <w:i w:val="0"/>
           <w:color w:val="000000"/>
           <w:sz w:val="27"/>
         </w:rPr>
@@ -2435,6 +2436,7 @@
         <w:rPr>
           <w:rFonts w:ascii="Times New Roman" w:hAnsi="Times New Roman"/>
           <w:b/>
+          <w:i w:val="0"/>
           <w:color w:val="000000"/>
           <w:sz w:val="27"/>
         </w:rPr>
@@ -2454,6 +2456,7 @@
         <w:rPr>
           <w:rFonts w:ascii="Times New Roman" w:hAnsi="Times New Roman"/>
           <w:b/>
+          <w:i w:val="0"/>
           <w:color w:val="000000"/>
           <w:sz w:val="26"/>
         </w:rPr>
@@ -2587,6 +2590,7 @@
         <w:rPr>
           <w:rFonts w:ascii="Times New Roman" w:hAnsi="Times New Roman"/>
           <w:b/>
+          <w:i w:val="0"/>
           <w:color w:val="000000"/>
           <w:sz w:val="26"/>
         </w:rPr>
@@ -2607,12 +2611,28 @@
           <w:color w:val="000000"/>
           <w:sz w:val="26"/>
         </w:rPr>
-        <w:t xml:space="preserve">Đề tài “Hệ thống phát hiện giao dịch tài chính bất thường và nghi vấn gian lận” kết hợp nhiều nội dung quan trọng của môn Trí tuệ Nhân tạo: biểu diễn dữ liệu, tiền xử lý, học có giám sát, phát hiện bất thường, xử lý dữ liệu mất cân bằng và đánh giá mô hình. Đây cũng là bài toán có ý nghĩa thực tiễn rõ ràng vì quyết định của mô hình liên quan trực tiếp đến hai loại rủi ro: - </w:t>
-      </w:r>
+        <w:t>Đề tài “Hệ thống phát hiện giao dịch tài chính bất thường và nghi vấn gian lận” kết hợp nhiều nội dung quan trọng của môn Trí tuệ Nhân tạo: biểu diễn dữ liệu, tiền xử lý, học có giám sát, phát hiện bất thường, xử lý dữ liệu mất cân bằng và đánh giá mô hình. Đây cũng là bài toán có ý nghĩa thực tiễn rõ ràng vì quyết định của mô hình liên quan trực tiếp đến hai loại rủi ro:</w:t>
+      </w:r>
+    </w:p>
+    <w:p>
+      <w:pPr>
+        <w:spacing w:before="20" w:after="40" w:line="300" w:lineRule="auto"/>
+        <w:ind w:left="720" w:hanging="283"/>
+        <w:jc w:val="both"/>
+      </w:pPr>
       <w:r>
         <w:rPr>
           <w:rFonts w:ascii="Times New Roman" w:hAnsi="Times New Roman"/>
           <w:b/>
+          <w:color w:val="000000"/>
+          <w:sz w:val="26"/>
+        </w:rPr>
+        <w:t xml:space="preserve">-  </w:t>
+      </w:r>
+      <w:r>
+        <w:rPr>
+          <w:rFonts w:ascii="Times New Roman" w:hAnsi="Times New Roman"/>
+          <w:b/>
           <w:i w:val="0"/>
           <w:color w:val="000000"/>
           <w:sz w:val="26"/>
@@ -2627,7 +2647,23 @@
           <w:color w:val="000000"/>
           <w:sz w:val="26"/>
         </w:rPr>
-        <w:t xml:space="preserve"> giao dịch gian lận không được phát hiện, có thể gây thiệt hại tài chính. - </w:t>
+        <w:t xml:space="preserve"> giao dịch gian lận không được phát hiện, có thể gây thiệt hại tài chính.</w:t>
+      </w:r>
+    </w:p>
+    <w:p>
+      <w:pPr>
+        <w:spacing w:before="20" w:after="40" w:line="300" w:lineRule="auto"/>
+        <w:ind w:left="720" w:hanging="283"/>
+        <w:jc w:val="both"/>
+      </w:pPr>
+      <w:r>
+        <w:rPr>
+          <w:rFonts w:ascii="Times New Roman" w:hAnsi="Times New Roman"/>
+          <w:b/>
+          <w:color w:val="000000"/>
+          <w:sz w:val="26"/>
+        </w:rPr>
+        <w:t xml:space="preserve">-  </w:t>
       </w:r>
       <w:r>
         <w:rPr>
@@ -2680,6 +2716,7 @@
         <w:rPr>
           <w:rFonts w:ascii="Times New Roman" w:hAnsi="Times New Roman"/>
           <w:b/>
+          <w:i w:val="0"/>
           <w:color w:val="000000"/>
           <w:sz w:val="26"/>
         </w:rPr>
@@ -2955,6 +2992,7 @@
         <w:rPr>
           <w:rFonts w:ascii="Times New Roman" w:hAnsi="Times New Roman"/>
           <w:b/>
+          <w:i w:val="0"/>
           <w:color w:val="000000"/>
           <w:sz w:val="26"/>
         </w:rPr>
@@ -3270,6 +3308,7 @@
         <w:rPr>
           <w:rFonts w:ascii="Times New Roman" w:hAnsi="Times New Roman"/>
           <w:b/>
+          <w:i w:val="0"/>
           <w:color w:val="000000"/>
           <w:sz w:val="26"/>
         </w:rPr>
@@ -3497,6 +3536,7 @@
         <w:rPr>
           <w:rFonts w:ascii="Times New Roman" w:hAnsi="Times New Roman"/>
           <w:b/>
+          <w:i w:val="0"/>
           <w:color w:val="000000"/>
           <w:sz w:val="27"/>
         </w:rPr>
@@ -3516,6 +3556,7 @@
         <w:rPr>
           <w:rFonts w:ascii="Times New Roman" w:hAnsi="Times New Roman"/>
           <w:b/>
+          <w:i w:val="0"/>
           <w:color w:val="000000"/>
           <w:sz w:val="26"/>
         </w:rPr>
@@ -3536,7 +3577,59 @@
           <w:color w:val="000000"/>
           <w:sz w:val="26"/>
         </w:rPr>
-        <w:t>Cho tập dữ liệu giao dịch tài chính, mỗi giao dịch được biểu diễn bởi vector đặc trưng $x$. Mục tiêu là xây dựng hàm dự đoán $f(x)$ trả về một trong hai nhãn: - $f(x) = 0$: giao dịch hợp lệ. - $f(x) = 1$: giao dịch gian lận.</w:t>
+        <w:t>Cho tập dữ liệu giao dịch tài chính, mỗi giao dịch được biểu diễn bởi vector đặc trưng $x$. Mục tiêu là xây dựng hàm dự đoán $f(x)$ trả về một trong hai nhãn:</w:t>
+      </w:r>
+    </w:p>
+    <w:p>
+      <w:pPr>
+        <w:spacing w:before="20" w:after="40" w:line="300" w:lineRule="auto"/>
+        <w:ind w:left="720" w:hanging="283"/>
+        <w:jc w:val="both"/>
+      </w:pPr>
+      <w:r>
+        <w:rPr>
+          <w:rFonts w:ascii="Times New Roman" w:hAnsi="Times New Roman"/>
+          <w:b/>
+          <w:color w:val="000000"/>
+          <w:sz w:val="26"/>
+        </w:rPr>
+        <w:t xml:space="preserve">-  </w:t>
+      </w:r>
+      <w:r>
+        <w:rPr>
+          <w:rFonts w:ascii="Times New Roman" w:hAnsi="Times New Roman"/>
+          <w:b w:val="0"/>
+          <w:i w:val="0"/>
+          <w:color w:val="000000"/>
+          <w:sz w:val="26"/>
+        </w:rPr>
+        <w:t>$f(x) = 0$: giao dịch hợp lệ.</w:t>
+      </w:r>
+    </w:p>
+    <w:p>
+      <w:pPr>
+        <w:spacing w:before="20" w:after="40" w:line="300" w:lineRule="auto"/>
+        <w:ind w:left="720" w:hanging="283"/>
+        <w:jc w:val="both"/>
+      </w:pPr>
+      <w:r>
+        <w:rPr>
+          <w:rFonts w:ascii="Times New Roman" w:hAnsi="Times New Roman"/>
+          <w:b/>
+          <w:color w:val="000000"/>
+          <w:sz w:val="26"/>
+        </w:rPr>
+        <w:t xml:space="preserve">-  </w:t>
+      </w:r>
+      <w:r>
+        <w:rPr>
+          <w:rFonts w:ascii="Times New Roman" w:hAnsi="Times New Roman"/>
+          <w:b w:val="0"/>
+          <w:i w:val="0"/>
+          <w:color w:val="000000"/>
+          <w:sz w:val="26"/>
+        </w:rPr>
+        <w:t>$f(x) = 1$: giao dịch gian lận.</w:t>
       </w:r>
     </w:p>
     <w:p>
@@ -3606,6 +3699,7 @@
         <w:rPr>
           <w:rFonts w:ascii="Times New Roman" w:hAnsi="Times New Roman"/>
           <w:b/>
+          <w:i w:val="0"/>
           <w:color w:val="000000"/>
           <w:sz w:val="26"/>
         </w:rPr>
@@ -4044,6 +4138,7 @@
         <w:rPr>
           <w:rFonts w:ascii="Times New Roman" w:hAnsi="Times New Roman"/>
           <w:b/>
+          <w:i w:val="0"/>
           <w:color w:val="000000"/>
           <w:sz w:val="26"/>
         </w:rPr>
@@ -4273,6 +4368,7 @@
         <w:rPr>
           <w:rFonts w:ascii="Times New Roman" w:hAnsi="Times New Roman"/>
           <w:b/>
+          <w:i w:val="0"/>
           <w:color w:val="000000"/>
           <w:sz w:val="26"/>
         </w:rPr>
@@ -4482,6 +4578,7 @@
         <w:rPr>
           <w:rFonts w:ascii="Times New Roman" w:hAnsi="Times New Roman"/>
           <w:b/>
+          <w:i w:val="0"/>
           <w:color w:val="000000"/>
           <w:sz w:val="26"/>
         </w:rPr>
@@ -4502,7 +4599,85 @@
           <w:color w:val="000000"/>
           <w:sz w:val="26"/>
         </w:rPr>
-        <w:t>Báo cáo hướng tới trả lời các câu hỏi sau khi hoàn tất thực nghiệm: - Kỹ thuật xử lý mất cân bằng nào phù hợp hơn trên tập PaySim đã tiền xử lý? - Trong các mô hình được thử nghiệm, mô hình nào đạt cân bằng tốt nhất giữa Precision và Recall cho lớp fraud? - Các đặc trưng nào đóng góp nhiều nhất vào quyết định của mô hình, và các đặc trưng này có nguy cơ phản ánh cơ chế mô phỏng của PaySim hay không?</w:t>
+        <w:t>Báo cáo hướng tới trả lời các câu hỏi sau khi hoàn tất thực nghiệm:</w:t>
+      </w:r>
+    </w:p>
+    <w:p>
+      <w:pPr>
+        <w:spacing w:before="20" w:after="40" w:line="300" w:lineRule="auto"/>
+        <w:ind w:left="720" w:hanging="283"/>
+        <w:jc w:val="both"/>
+      </w:pPr>
+      <w:r>
+        <w:rPr>
+          <w:rFonts w:ascii="Times New Roman" w:hAnsi="Times New Roman"/>
+          <w:b/>
+          <w:color w:val="000000"/>
+          <w:sz w:val="26"/>
+        </w:rPr>
+        <w:t xml:space="preserve">-  </w:t>
+      </w:r>
+      <w:r>
+        <w:rPr>
+          <w:rFonts w:ascii="Times New Roman" w:hAnsi="Times New Roman"/>
+          <w:b w:val="0"/>
+          <w:i w:val="0"/>
+          <w:color w:val="000000"/>
+          <w:sz w:val="26"/>
+        </w:rPr>
+        <w:t>Kỹ thuật xử lý mất cân bằng nào phù hợp hơn trên tập PaySim đã tiền xử lý?</w:t>
+      </w:r>
+    </w:p>
+    <w:p>
+      <w:pPr>
+        <w:spacing w:before="20" w:after="40" w:line="300" w:lineRule="auto"/>
+        <w:ind w:left="720" w:hanging="283"/>
+        <w:jc w:val="both"/>
+      </w:pPr>
+      <w:r>
+        <w:rPr>
+          <w:rFonts w:ascii="Times New Roman" w:hAnsi="Times New Roman"/>
+          <w:b/>
+          <w:color w:val="000000"/>
+          <w:sz w:val="26"/>
+        </w:rPr>
+        <w:t xml:space="preserve">-  </w:t>
+      </w:r>
+      <w:r>
+        <w:rPr>
+          <w:rFonts w:ascii="Times New Roman" w:hAnsi="Times New Roman"/>
+          <w:b w:val="0"/>
+          <w:i w:val="0"/>
+          <w:color w:val="000000"/>
+          <w:sz w:val="26"/>
+        </w:rPr>
+        <w:t>Trong các mô hình được thử nghiệm, mô hình nào đạt cân bằng tốt nhất giữa Precision và Recall cho lớp fraud?</w:t>
+      </w:r>
+    </w:p>
+    <w:p>
+      <w:pPr>
+        <w:spacing w:before="20" w:after="40" w:line="300" w:lineRule="auto"/>
+        <w:ind w:left="720" w:hanging="283"/>
+        <w:jc w:val="both"/>
+      </w:pPr>
+      <w:r>
+        <w:rPr>
+          <w:rFonts w:ascii="Times New Roman" w:hAnsi="Times New Roman"/>
+          <w:b/>
+          <w:color w:val="000000"/>
+          <w:sz w:val="26"/>
+        </w:rPr>
+        <w:t xml:space="preserve">-  </w:t>
+      </w:r>
+      <w:r>
+        <w:rPr>
+          <w:rFonts w:ascii="Times New Roman" w:hAnsi="Times New Roman"/>
+          <w:b w:val="0"/>
+          <w:i w:val="0"/>
+          <w:color w:val="000000"/>
+          <w:sz w:val="26"/>
+        </w:rPr>
+        <w:t>Các đặc trưng nào đóng góp nhiều nhất vào quyết định của mô hình, và các đặc trưng này có nguy cơ phản ánh cơ chế mô phỏng của PaySim hay không?</w:t>
       </w:r>
     </w:p>
     <w:p>
@@ -4518,6 +4693,7 @@
         <w:rPr>
           <w:rFonts w:ascii="Times New Roman" w:hAnsi="Times New Roman"/>
           <w:b/>
+          <w:i w:val="0"/>
           <w:color w:val="000000"/>
           <w:sz w:val="27"/>
         </w:rPr>
@@ -4537,6 +4713,7 @@
         <w:rPr>
           <w:rFonts w:ascii="Times New Roman" w:hAnsi="Times New Roman"/>
           <w:b/>
+          <w:i w:val="0"/>
           <w:color w:val="000000"/>
           <w:sz w:val="26"/>
         </w:rPr>
@@ -4773,6 +4950,7 @@
         <w:rPr>
           <w:rFonts w:ascii="Times New Roman" w:hAnsi="Times New Roman"/>
           <w:b/>
+          <w:i w:val="0"/>
           <w:color w:val="000000"/>
           <w:sz w:val="26"/>
         </w:rPr>
@@ -6015,6 +6193,7 @@
         <w:rPr>
           <w:rFonts w:ascii="Times New Roman" w:hAnsi="Times New Roman"/>
           <w:b/>
+          <w:i w:val="0"/>
           <w:color w:val="000000"/>
           <w:sz w:val="26"/>
         </w:rPr>
@@ -6978,6 +7157,7 @@
         <w:rPr>
           <w:rFonts w:ascii="Times New Roman" w:hAnsi="Times New Roman"/>
           <w:b/>
+          <w:i w:val="0"/>
           <w:color w:val="000000"/>
           <w:sz w:val="26"/>
         </w:rPr>
@@ -7840,6 +8020,7 @@
         <w:rPr>
           <w:rFonts w:ascii="Times New Roman" w:hAnsi="Times New Roman"/>
           <w:b/>
+          <w:i w:val="0"/>
           <w:color w:val="000000"/>
           <w:sz w:val="26"/>
         </w:rPr>
@@ -9464,6 +9645,7 @@
         <w:rPr>
           <w:rFonts w:ascii="Times New Roman" w:hAnsi="Times New Roman"/>
           <w:b/>
+          <w:i w:val="0"/>
           <w:color w:val="000000"/>
           <w:sz w:val="26"/>
         </w:rPr>
@@ -9504,7 +9686,7 @@
           <w:color w:val="000000"/>
           <w:sz w:val="26"/>
         </w:rPr>
-        <w:t>Fraud ratio tăng từ 0,129082% lên khoảng 4,1065% sau downsample. Do Precision và đường Precision-Recall phụ thuộc vào prevalence, kết quả trên test downsample không thể được trình bày như hiệu năng trên phân bố PaySim gốc hoặc trên hệ thống thật.</w:t>
+        <w:t>Fraud ratio tăng từ 0,129082% lên khoảng 4,1065% sau downsample. Do Precision và đường Precision–Recall phụ thuộc vào prevalence, kết quả trên test downsample không thể được trình bày như hiệu năng trên phân bố PaySim gốc hoặc trên hệ thống thật.</w:t>
       </w:r>
     </w:p>
     <w:p>
@@ -9769,6 +9951,7 @@
         <w:rPr>
           <w:rFonts w:ascii="Times New Roman" w:hAnsi="Times New Roman"/>
           <w:b/>
+          <w:i w:val="0"/>
           <w:color w:val="000000"/>
           <w:sz w:val="26"/>
         </w:rPr>
@@ -9805,6 +9988,7 @@
         <w:rPr>
           <w:rFonts w:ascii="Times New Roman" w:hAnsi="Times New Roman"/>
           <w:b/>
+          <w:i w:val="0"/>
           <w:color w:val="000000"/>
           <w:sz w:val="27"/>
         </w:rPr>
@@ -9824,6 +10008,7 @@
         <w:rPr>
           <w:rFonts w:ascii="Times New Roman" w:hAnsi="Times New Roman"/>
           <w:b/>
+          <w:i w:val="0"/>
           <w:color w:val="000000"/>
           <w:sz w:val="26"/>
         </w:rPr>
@@ -9844,17 +10029,33 @@
           <w:color w:val="000000"/>
           <w:sz w:val="26"/>
         </w:rPr>
-        <w:t xml:space="preserve">Quy trình thực nghiệm được tổ chức thành sáu bước tuần tự: - </w:t>
-      </w:r>
+        <w:t>Quy trình thực nghiệm được tổ chức thành sáu bước tuần tự:</w:t>
+      </w:r>
+    </w:p>
+    <w:p>
+      <w:pPr>
+        <w:spacing w:before="20" w:after="40" w:line="300" w:lineRule="auto"/>
+        <w:ind w:left="720" w:hanging="283"/>
+        <w:jc w:val="both"/>
+      </w:pPr>
       <w:r>
         <w:rPr>
           <w:rFonts w:ascii="Times New Roman" w:hAnsi="Times New Roman"/>
           <w:b/>
-          <w:i w:val="0"/>
-          <w:color w:val="000000"/>
-          <w:sz w:val="26"/>
-        </w:rPr>
-        <w:t>Bước 1 - Đọc và kiểm tra dữ liệu:</w:t>
+          <w:color w:val="000000"/>
+          <w:sz w:val="26"/>
+        </w:rPr>
+        <w:t xml:space="preserve">-  </w:t>
+      </w:r>
+      <w:r>
+        <w:rPr>
+          <w:rFonts w:ascii="Times New Roman" w:hAnsi="Times New Roman"/>
+          <w:b/>
+          <w:i w:val="0"/>
+          <w:color w:val="000000"/>
+          <w:sz w:val="26"/>
+        </w:rPr>
+        <w:t>Bước 1 — Đọc và kiểm tra dữ liệu:</w:t>
       </w:r>
       <w:r>
         <w:rPr>
@@ -9864,17 +10065,33 @@
           <w:color w:val="000000"/>
           <w:sz w:val="26"/>
         </w:rPr>
-        <w:t xml:space="preserve"> nạp bộ PaySim, xác nhận cấu trúc cột, kiểu dữ liệu, giá trị thiếu và phân bố nhãn. - </w:t>
-      </w:r>
+        <w:t xml:space="preserve"> nạp bộ PaySim, xác nhận cấu trúc cột, kiểu dữ liệu, giá trị thiếu và phân bố nhãn.</w:t>
+      </w:r>
+    </w:p>
+    <w:p>
+      <w:pPr>
+        <w:spacing w:before="20" w:after="40" w:line="300" w:lineRule="auto"/>
+        <w:ind w:left="720" w:hanging="283"/>
+        <w:jc w:val="both"/>
+      </w:pPr>
       <w:r>
         <w:rPr>
           <w:rFonts w:ascii="Times New Roman" w:hAnsi="Times New Roman"/>
           <w:b/>
-          <w:i w:val="0"/>
-          <w:color w:val="000000"/>
-          <w:sz w:val="26"/>
-        </w:rPr>
-        <w:t>Bước 2 - Lọc và downsampling:</w:t>
+          <w:color w:val="000000"/>
+          <w:sz w:val="26"/>
+        </w:rPr>
+        <w:t xml:space="preserve">-  </w:t>
+      </w:r>
+      <w:r>
+        <w:rPr>
+          <w:rFonts w:ascii="Times New Roman" w:hAnsi="Times New Roman"/>
+          <w:b/>
+          <w:i w:val="0"/>
+          <w:color w:val="000000"/>
+          <w:sz w:val="26"/>
+        </w:rPr>
+        <w:t>Bước 2 — Lọc và downsampling:</w:t>
       </w:r>
       <w:r>
         <w:rPr>
@@ -9924,17 +10141,33 @@
           <w:color w:val="000000"/>
           <w:sz w:val="26"/>
         </w:rPr>
-        <w:t xml:space="preserve">, bảo toàn toàn bộ giao dịch gian lận và lấy mẫu ngẫu nhiên lớp bình thường để tạo tập làm việc 200.000 giao dịch. - </w:t>
-      </w:r>
+        <w:t>, bảo toàn toàn bộ giao dịch gian lận và lấy mẫu ngẫu nhiên lớp bình thường để tạo tập làm việc 200.000 giao dịch.</w:t>
+      </w:r>
+    </w:p>
+    <w:p>
+      <w:pPr>
+        <w:spacing w:before="20" w:after="40" w:line="300" w:lineRule="auto"/>
+        <w:ind w:left="720" w:hanging="283"/>
+        <w:jc w:val="both"/>
+      </w:pPr>
       <w:r>
         <w:rPr>
           <w:rFonts w:ascii="Times New Roman" w:hAnsi="Times New Roman"/>
           <w:b/>
-          <w:i w:val="0"/>
-          <w:color w:val="000000"/>
-          <w:sz w:val="26"/>
-        </w:rPr>
-        <w:t>Bước 3 - Chia dữ liệu:</w:t>
+          <w:color w:val="000000"/>
+          <w:sz w:val="26"/>
+        </w:rPr>
+        <w:t xml:space="preserve">-  </w:t>
+      </w:r>
+      <w:r>
+        <w:rPr>
+          <w:rFonts w:ascii="Times New Roman" w:hAnsi="Times New Roman"/>
+          <w:b/>
+          <w:i w:val="0"/>
+          <w:color w:val="000000"/>
+          <w:sz w:val="26"/>
+        </w:rPr>
+        <w:t>Bước 3 — Chia dữ liệu:</w:t>
       </w:r>
       <w:r>
         <w:rPr>
@@ -9944,17 +10177,33 @@
           <w:color w:val="000000"/>
           <w:sz w:val="26"/>
         </w:rPr>
-        <w:t xml:space="preserve"> tách tập huấn luyện và tập kiểm tra theo tỷ lệ 80/20 bằng phép chia phân tầng (stratified) theo nhãn. - </w:t>
-      </w:r>
+        <w:t xml:space="preserve"> tách tập huấn luyện và tập kiểm tra theo tỷ lệ 80/20 bằng phép chia phân tầng (stratified) theo nhãn.</w:t>
+      </w:r>
+    </w:p>
+    <w:p>
+      <w:pPr>
+        <w:spacing w:before="20" w:after="40" w:line="300" w:lineRule="auto"/>
+        <w:ind w:left="720" w:hanging="283"/>
+        <w:jc w:val="both"/>
+      </w:pPr>
       <w:r>
         <w:rPr>
           <w:rFonts w:ascii="Times New Roman" w:hAnsi="Times New Roman"/>
           <w:b/>
-          <w:i w:val="0"/>
-          <w:color w:val="000000"/>
-          <w:sz w:val="26"/>
-        </w:rPr>
-        <w:t>Bước 4 - Xây dựng đặc trưng:</w:t>
+          <w:color w:val="000000"/>
+          <w:sz w:val="26"/>
+        </w:rPr>
+        <w:t xml:space="preserve">-  </w:t>
+      </w:r>
+      <w:r>
+        <w:rPr>
+          <w:rFonts w:ascii="Times New Roman" w:hAnsi="Times New Roman"/>
+          <w:b/>
+          <w:i w:val="0"/>
+          <w:color w:val="000000"/>
+          <w:sz w:val="26"/>
+        </w:rPr>
+        <w:t>Bước 4 — Xây dựng đặc trưng:</w:t>
       </w:r>
       <w:r>
         <w:rPr>
@@ -9964,17 +10213,33 @@
           <w:color w:val="000000"/>
           <w:sz w:val="26"/>
         </w:rPr>
-        <w:t xml:space="preserve"> tạo các đặc trưng dẫn xuất, mã hóa loại giao dịch và chuẩn hóa các biến định lượng bằng tham số học từ tập huấn luyện. - </w:t>
-      </w:r>
+        <w:t xml:space="preserve"> tạo các đặc trưng dẫn xuất, mã hóa loại giao dịch và chuẩn hóa các biến định lượng bằng tham số học từ tập huấn luyện.</w:t>
+      </w:r>
+    </w:p>
+    <w:p>
+      <w:pPr>
+        <w:spacing w:before="20" w:after="40" w:line="300" w:lineRule="auto"/>
+        <w:ind w:left="720" w:hanging="283"/>
+        <w:jc w:val="both"/>
+      </w:pPr>
       <w:r>
         <w:rPr>
           <w:rFonts w:ascii="Times New Roman" w:hAnsi="Times New Roman"/>
           <w:b/>
-          <w:i w:val="0"/>
-          <w:color w:val="000000"/>
-          <w:sz w:val="26"/>
-        </w:rPr>
-        <w:t>Bước 5 - Xử lý mất cân bằng:</w:t>
+          <w:color w:val="000000"/>
+          <w:sz w:val="26"/>
+        </w:rPr>
+        <w:t xml:space="preserve">-  </w:t>
+      </w:r>
+      <w:r>
+        <w:rPr>
+          <w:rFonts w:ascii="Times New Roman" w:hAnsi="Times New Roman"/>
+          <w:b/>
+          <w:i w:val="0"/>
+          <w:color w:val="000000"/>
+          <w:sz w:val="26"/>
+        </w:rPr>
+        <w:t>Bước 5 — Xử lý mất cân bằng:</w:t>
       </w:r>
       <w:r>
         <w:rPr>
@@ -9984,17 +10249,33 @@
           <w:color w:val="000000"/>
           <w:sz w:val="26"/>
         </w:rPr>
-        <w:t xml:space="preserve"> áp dụng oversampling bằng SMOTENC hoặc ADASYN trên tập huấn luyện, không thay đổi tập kiểm tra. - </w:t>
-      </w:r>
+        <w:t xml:space="preserve"> áp dụng oversampling bằng SMOTENC hoặc ADASYN trên tập huấn luyện, không thay đổi tập kiểm tra.</w:t>
+      </w:r>
+    </w:p>
+    <w:p>
+      <w:pPr>
+        <w:spacing w:before="20" w:after="40" w:line="300" w:lineRule="auto"/>
+        <w:ind w:left="720" w:hanging="283"/>
+        <w:jc w:val="both"/>
+      </w:pPr>
       <w:r>
         <w:rPr>
           <w:rFonts w:ascii="Times New Roman" w:hAnsi="Times New Roman"/>
           <w:b/>
-          <w:i w:val="0"/>
-          <w:color w:val="000000"/>
-          <w:sz w:val="26"/>
-        </w:rPr>
-        <w:t>Bước 6 - Huấn luyện và đánh giá:</w:t>
+          <w:color w:val="000000"/>
+          <w:sz w:val="26"/>
+        </w:rPr>
+        <w:t xml:space="preserve">-  </w:t>
+      </w:r>
+      <w:r>
+        <w:rPr>
+          <w:rFonts w:ascii="Times New Roman" w:hAnsi="Times New Roman"/>
+          <w:b/>
+          <w:i w:val="0"/>
+          <w:color w:val="000000"/>
+          <w:sz w:val="26"/>
+        </w:rPr>
+        <w:t>Bước 6 — Huấn luyện và đánh giá:</w:t>
       </w:r>
       <w:r>
         <w:rPr>
@@ -10077,6 +10358,7 @@
         <w:rPr>
           <w:rFonts w:ascii="Times New Roman" w:hAnsi="Times New Roman"/>
           <w:b/>
+          <w:i w:val="0"/>
           <w:color w:val="000000"/>
           <w:sz w:val="26"/>
         </w:rPr>
@@ -10267,6 +10549,7 @@
         <w:rPr>
           <w:rFonts w:ascii="Times New Roman" w:hAnsi="Times New Roman"/>
           <w:b/>
+          <w:i w:val="0"/>
           <w:color w:val="000000"/>
           <w:sz w:val="26"/>
         </w:rPr>
@@ -10513,6 +10796,7 @@
         <w:rPr>
           <w:rFonts w:ascii="Times New Roman" w:hAnsi="Times New Roman"/>
           <w:b/>
+          <w:i w:val="0"/>
           <w:color w:val="000000"/>
           <w:sz w:val="26"/>
         </w:rPr>
@@ -10767,6 +11051,7 @@
         <w:rPr>
           <w:rFonts w:ascii="Times New Roman" w:hAnsi="Times New Roman"/>
           <w:b/>
+          <w:i w:val="0"/>
           <w:color w:val="000000"/>
           <w:sz w:val="26"/>
         </w:rPr>
@@ -11081,6 +11366,7 @@
         <w:rPr>
           <w:rFonts w:ascii="Times New Roman" w:hAnsi="Times New Roman"/>
           <w:b/>
+          <w:i w:val="0"/>
           <w:color w:val="000000"/>
           <w:sz w:val="26"/>
         </w:rPr>
@@ -11369,6 +11655,7 @@
         <w:rPr>
           <w:rFonts w:ascii="Times New Roman" w:hAnsi="Times New Roman"/>
           <w:b/>
+          <w:i w:val="0"/>
           <w:color w:val="000000"/>
           <w:sz w:val="26"/>
         </w:rPr>
@@ -11389,7 +11676,7 @@
           <w:color w:val="000000"/>
           <w:sz w:val="26"/>
         </w:rPr>
-        <w:t>Các mô hình được đánh giá trên cùng tập kiểm tra 40.000 giao dịch, không dùng dữ liệu đã qua oversampling. Báo cáo tập trung vào lớp gian lận với bốn chỉ số chính là Precision, Recall, F1-Score và ROC-AUC. Average Precision được báo cáo bổ sung vì phản ánh chất lượng phát hiện lớp gian lận rõ hơn ROC-AUC khi dữ liệu mất cân bằng. Đường ROC và đường Precision-Recall tổng hợp sẽ được bổ sung trong bản báo cáo cuối.</w:t>
+        <w:t>Các mô hình được đánh giá trên cùng tập kiểm tra 40.000 giao dịch, không dùng dữ liệu đã qua oversampling. Báo cáo tập trung vào lớp gian lận với bốn chỉ số chính là Precision, Recall, F1-Score và ROC-AUC. Average Precision được báo cáo bổ sung vì phản ánh chất lượng phát hiện lớp gian lận rõ hơn ROC-AUC khi dữ liệu mất cân bằng. Đường ROC và đường Precision–Recall tổng hợp của cả năm biến thể được trình bày tại Mục 5.2.</w:t>
       </w:r>
     </w:p>
     <w:p>
@@ -11422,6 +11709,7 @@
         <w:rPr>
           <w:rFonts w:ascii="Times New Roman" w:hAnsi="Times New Roman"/>
           <w:b/>
+          <w:i w:val="0"/>
           <w:color w:val="000000"/>
           <w:sz w:val="26"/>
         </w:rPr>
@@ -11535,6 +11823,7 @@
         <w:rPr>
           <w:rFonts w:ascii="Times New Roman" w:hAnsi="Times New Roman"/>
           <w:b/>
+          <w:i w:val="0"/>
           <w:color w:val="000000"/>
           <w:sz w:val="26"/>
         </w:rPr>
@@ -11571,6 +11860,7 @@
         <w:rPr>
           <w:rFonts w:ascii="Times New Roman" w:hAnsi="Times New Roman"/>
           <w:b/>
+          <w:i w:val="0"/>
           <w:color w:val="000000"/>
           <w:sz w:val="27"/>
         </w:rPr>
@@ -11590,6 +11880,7 @@
         <w:rPr>
           <w:rFonts w:ascii="Times New Roman" w:hAnsi="Times New Roman"/>
           <w:b/>
+          <w:i w:val="0"/>
           <w:color w:val="000000"/>
           <w:sz w:val="26"/>
         </w:rPr>
@@ -11707,7 +11998,27 @@
           <w:color w:val="000000"/>
           <w:sz w:val="26"/>
         </w:rPr>
-        <w:t xml:space="preserve"> để người đọc có thể đối chiếu từng con số. Bảng so sánh, hai biểu đồ và bảng mức đóng góp của đặc trưng dưới đây đều được sinh lại bằng cùng script đó, phản ánh kết quả hiện có trên tập kiểm tra. Đường ROC và đường Precision-Recall tổng hợp sẽ được bổ sung trong bản báo cáo cuối.</w:t>
+        <w:t xml:space="preserve"> để người đọc có thể đối chiếu từng con số. Bảng so sánh, các biểu đồ và bảng mức đóng góp của đặc trưng dưới đây đều được sinh lại bằng cùng script đó. Toàn bộ giá trị trong Bảng 5.1 đã được đối chiếu và khớp tuyệt đối với </w:t>
+      </w:r>
+      <w:r>
+        <w:rPr>
+          <w:rFonts w:ascii="Courier New" w:hAnsi="Courier New"/>
+          <w:b w:val="0"/>
+          <w:i w:val="0"/>
+          <w:color w:val="000000"/>
+          <w:sz w:val="25"/>
+        </w:rPr>
+        <w:t>reports/model_comparison.csv</w:t>
+      </w:r>
+      <w:r>
+        <w:rPr>
+          <w:rFonts w:ascii="Times New Roman" w:hAnsi="Times New Roman"/>
+          <w:b w:val="0"/>
+          <w:i w:val="0"/>
+          <w:color w:val="000000"/>
+          <w:sz w:val="26"/>
+        </w:rPr>
+        <w:t xml:space="preserve"> do bước đánh giá chéo của nhóm xuất ra, nên hai nguồn tính độc lập cho cùng một kết quả.</w:t>
       </w:r>
     </w:p>
     <w:p>
@@ -11723,6 +12034,7 @@
         <w:rPr>
           <w:rFonts w:ascii="Times New Roman" w:hAnsi="Times New Roman"/>
           <w:b/>
+          <w:i w:val="0"/>
           <w:color w:val="000000"/>
           <w:sz w:val="26"/>
         </w:rPr>
@@ -12910,7 +13222,134 @@
           <w:color w:val="000000"/>
           <w:sz w:val="26"/>
         </w:rPr>
-        <w:t>Khoảng cách giữa hai chỉ số xếp hạng của Autoencoder cho thấy vì sao không nên đọc ROC-AUC một mình trên dữ liệu lệch lớp. ROC-AUC đạt 0,9318 nhưng Average Precision chỉ đạt 0,5973. Nguyên nhân là ROC-AUC lấy toàn bộ 38.357 giao dịch bình thường làm mẫu số cho tỷ lệ dương tính giả, nên gần 2.000 cảnh báo nhầm vẫn chỉ làm chỉ số này giảm nhẹ. Average Precision thì đo trực tiếp Precision dọc theo đường Precision-Recall, nên phản ánh đúng cái giá phải trả để đạt được Recall đó. Với bốn biến thể học có giám sát, hai chỉ số này gần như trùng nhau nên kết luận không thay đổi.</w:t>
+        <w:t>Khoảng cách giữa hai chỉ số xếp hạng của Autoencoder cho thấy vì sao không nên đọc ROC-AUC một mình trên dữ liệu lệch lớp. ROC-AUC đạt 0,9318 nhưng Average Precision chỉ đạt 0,5973. Nguyên nhân là ROC-AUC lấy toàn bộ 38.357 giao dịch bình thường làm mẫu số cho tỷ lệ dương tính giả, nên gần 2.000 cảnh báo nhầm vẫn chỉ làm chỉ số này giảm nhẹ. Average Precision thì đo trực tiếp Precision dọc theo đường Precision–Recall, nên phản ánh đúng cái giá phải trả để đạt được Recall đó. Với bốn biến thể học có giám sát, hai chỉ số này gần như trùng nhau nên kết luận không thay đổi.</w:t>
+      </w:r>
+    </w:p>
+    <w:p>
+      <w:pPr>
+        <w:spacing w:before="160" w:after="60"/>
+        <w:jc w:val="center"/>
+      </w:pPr>
+      <w:r>
+        <w:drawing>
+          <wp:inline xmlns:a="http://schemas.openxmlformats.org/drawingml/2006/main" xmlns:pic="http://schemas.openxmlformats.org/drawingml/2006/picture">
+            <wp:extent cx="5220000" cy="3897365"/>
+            <wp:docPr id="2" name="Picture 2"/>
+            <wp:cNvGraphicFramePr>
+              <a:graphicFrameLocks noChangeAspect="1"/>
+            </wp:cNvGraphicFramePr>
+            <a:graphic>
+              <a:graphicData uri="http://schemas.openxmlformats.org/drawingml/2006/picture">
+                <pic:pic>
+                  <pic:nvPicPr>
+                    <pic:cNvPr id="0" name="roc_curves_all.png"/>
+                    <pic:cNvPicPr/>
+                  </pic:nvPicPr>
+                  <pic:blipFill>
+                    <a:blip r:embed="rId16"/>
+                    <a:stretch>
+                      <a:fillRect/>
+                    </a:stretch>
+                  </pic:blipFill>
+                  <pic:spPr>
+                    <a:xfrm>
+                      <a:off x="0" y="0"/>
+                      <a:ext cx="5220000" cy="3897365"/>
+                    </a:xfrm>
+                    <a:prstGeom prst="rect"/>
+                  </pic:spPr>
+                </pic:pic>
+              </a:graphicData>
+            </a:graphic>
+          </wp:inline>
+        </w:drawing>
+      </w:r>
+    </w:p>
+    <w:p>
+      <w:pPr>
+        <w:spacing w:before="40" w:after="160"/>
+        <w:jc w:val="center"/>
+      </w:pPr>
+      <w:r>
+        <w:rPr>
+          <w:rFonts w:ascii="Times New Roman" w:hAnsi="Times New Roman"/>
+          <w:i/>
+          <w:color w:val="000000"/>
+          <w:sz w:val="21"/>
+        </w:rPr>
+        <w:t>Hình 5.1. Đường ROC của năm biến thể mô hình trên tập kiểm tra</w:t>
+      </w:r>
+    </w:p>
+    <w:p>
+      <w:pPr>
+        <w:spacing w:before="160" w:after="60"/>
+        <w:jc w:val="center"/>
+      </w:pPr>
+      <w:r>
+        <w:drawing>
+          <wp:inline xmlns:a="http://schemas.openxmlformats.org/drawingml/2006/main" xmlns:pic="http://schemas.openxmlformats.org/drawingml/2006/picture">
+            <wp:extent cx="5220000" cy="3897365"/>
+            <wp:docPr id="3" name="Picture 3"/>
+            <wp:cNvGraphicFramePr>
+              <a:graphicFrameLocks noChangeAspect="1"/>
+            </wp:cNvGraphicFramePr>
+            <a:graphic>
+              <a:graphicData uri="http://schemas.openxmlformats.org/drawingml/2006/picture">
+                <pic:pic>
+                  <pic:nvPicPr>
+                    <pic:cNvPr id="0" name="pr_curves_all.png"/>
+                    <pic:cNvPicPr/>
+                  </pic:nvPicPr>
+                  <pic:blipFill>
+                    <a:blip r:embed="rId17"/>
+                    <a:stretch>
+                      <a:fillRect/>
+                    </a:stretch>
+                  </pic:blipFill>
+                  <pic:spPr>
+                    <a:xfrm>
+                      <a:off x="0" y="0"/>
+                      <a:ext cx="5220000" cy="3897365"/>
+                    </a:xfrm>
+                    <a:prstGeom prst="rect"/>
+                  </pic:spPr>
+                </pic:pic>
+              </a:graphicData>
+            </a:graphic>
+          </wp:inline>
+        </w:drawing>
+      </w:r>
+    </w:p>
+    <w:p>
+      <w:pPr>
+        <w:spacing w:before="40" w:after="160"/>
+        <w:jc w:val="center"/>
+      </w:pPr>
+      <w:r>
+        <w:rPr>
+          <w:rFonts w:ascii="Times New Roman" w:hAnsi="Times New Roman"/>
+          <w:i/>
+          <w:color w:val="000000"/>
+          <w:sz w:val="21"/>
+        </w:rPr>
+        <w:t>Hình 5.2. Đường Precision–Recall của năm biến thể mô hình trên tập kiểm tra</w:t>
+      </w:r>
+    </w:p>
+    <w:p>
+      <w:pPr>
+        <w:spacing w:before="0" w:after="40" w:line="312" w:lineRule="auto"/>
+        <w:ind w:firstLine="720"/>
+        <w:jc w:val="both"/>
+      </w:pPr>
+      <w:r>
+        <w:rPr>
+          <w:rFonts w:ascii="Times New Roman" w:hAnsi="Times New Roman"/>
+          <w:b w:val="0"/>
+          <w:i w:val="0"/>
+          <w:color w:val="000000"/>
+          <w:sz w:val="26"/>
+        </w:rPr>
+        <w:t>Hình 5.1 và Hình 5.2 trực quan hóa nhận định trên. Trên đường ROC, bốn biến thể học có giám sát gần như trùng nhau và ép sát góc trên bên trái, còn Autoencoder tuy thấp hơn nhưng vẫn cách xa đường chéo ngẫu nhiên. Trên đường Precision–Recall, khoảng cách giữa hai nhóm mô hình giãn ra rõ rệt: bốn biến thể học có giám sát giữ Precision gần 1,0 trên toàn dải Recall, trong khi Precision của Autoencoder suy giảm liên tục và chỉ còn khoảng 0,05 ở mức Recall cao nhất. Cùng một mô hình nhưng hai đồ thị cho hai ấn tượng khác nhau, đó là lý do đề bài yêu cầu không dựa vào một chỉ số duy nhất.</w:t>
       </w:r>
     </w:p>
     <w:p>
@@ -12926,6 +13365,7 @@
         <w:rPr>
           <w:rFonts w:ascii="Times New Roman" w:hAnsi="Times New Roman"/>
           <w:b/>
+          <w:i w:val="0"/>
           <w:color w:val="000000"/>
           <w:sz w:val="26"/>
         </w:rPr>
@@ -12941,7 +13381,7 @@
         <w:drawing>
           <wp:inline xmlns:a="http://schemas.openxmlformats.org/drawingml/2006/main" xmlns:pic="http://schemas.openxmlformats.org/drawingml/2006/picture">
             <wp:extent cx="5220000" cy="3450756"/>
-            <wp:docPr id="2" name="Picture 2"/>
+            <wp:docPr id="4" name="Picture 4"/>
             <wp:cNvGraphicFramePr>
               <a:graphicFrameLocks noChangeAspect="1"/>
             </wp:cNvGraphicFramePr>
@@ -12953,7 +13393,7 @@
                     <pic:cNvPicPr/>
                   </pic:nvPicPr>
                   <pic:blipFill>
-                    <a:blip r:embed="rId16"/>
+                    <a:blip r:embed="rId18"/>
                     <a:stretch>
                       <a:fillRect/>
                     </a:stretch>
@@ -12984,7 +13424,7 @@
           <w:color w:val="000000"/>
           <w:sz w:val="21"/>
         </w:rPr>
-        <w:t>Hình 5.1. So sánh riêng bốn thành phần TN, FP, FN và TP theo mô hình</w:t>
+        <w:t>Hình 5.3. So sánh riêng bốn thành phần TN, FP, FN và TP theo mô hình</w:t>
       </w:r>
     </w:p>
     <w:p>
@@ -13001,7 +13441,7 @@
           <w:color w:val="000000"/>
           <w:sz w:val="26"/>
         </w:rPr>
-        <w:t>Hình 5.1 tách TN, FP, FN và TP thành bốn đồ thị để mỗi thành phần có trục tung riêng. Trục hoành biểu diễn năm biến thể mô hình, còn trục tung biểu diễn số giao dịch. Hai đồ thị sai số FP và FN dùng trục tung theo thang logarit vì giá trị trong cùng một đồ thị chênh nhau tới ba bậc độ lớn, ví dụ 1 cảnh báo nhầm của Random Forest kết hợp SMOTENC so với 1.998 cảnh báo nhầm của Autoencoder. Nếu giữ thang tuyến tính, các cột nhỏ bị dí sát trục và không còn so sánh được với nhau. Cách trình bày này giúp quan sát cả những sai số có giá trị nhỏ mà không bị hai nhóm TN và TP có quy mô lớn che khuất.</w:t>
+        <w:t>Hình 5.3 tách TN, FP, FN và TP thành bốn đồ thị để mỗi thành phần có trục tung riêng. Trục hoành biểu diễn năm biến thể mô hình, còn trục tung biểu diễn số giao dịch. Hai đồ thị sai số FP và FN dùng trục tung theo thang logarit vì giá trị trong cùng một đồ thị chênh nhau tới ba bậc độ lớn, ví dụ 1 cảnh báo nhầm của Random Forest kết hợp SMOTENC so với 1.998 cảnh báo nhầm của Autoencoder. Nếu giữ thang tuyến tính, các cột nhỏ bị dí sát trục và không còn so sánh được với nhau. Cách trình bày này giúp quan sát cả những sai số có giá trị nhỏ mà không bị hai nhóm TN và TP có quy mô lớn che khuất.</w:t>
       </w:r>
     </w:p>
     <w:p>
@@ -13051,6 +13491,7 @@
         <w:rPr>
           <w:rFonts w:ascii="Times New Roman" w:hAnsi="Times New Roman"/>
           <w:b/>
+          <w:i w:val="0"/>
           <w:color w:val="000000"/>
           <w:sz w:val="26"/>
         </w:rPr>
@@ -13104,6 +13545,7 @@
         <w:rPr>
           <w:rFonts w:ascii="Times New Roman" w:hAnsi="Times New Roman"/>
           <w:b/>
+          <w:i w:val="0"/>
           <w:color w:val="000000"/>
           <w:sz w:val="26"/>
         </w:rPr>
@@ -14188,7 +14630,7 @@
         <w:drawing>
           <wp:inline xmlns:a="http://schemas.openxmlformats.org/drawingml/2006/main" xmlns:pic="http://schemas.openxmlformats.org/drawingml/2006/picture">
             <wp:extent cx="5220000" cy="3563885"/>
-            <wp:docPr id="3" name="Picture 3"/>
+            <wp:docPr id="5" name="Picture 5"/>
             <wp:cNvGraphicFramePr>
               <a:graphicFrameLocks noChangeAspect="1"/>
             </wp:cNvGraphicFramePr>
@@ -14200,7 +14642,7 @@
                     <pic:cNvPicPr/>
                   </pic:nvPicPr>
                   <pic:blipFill>
-                    <a:blip r:embed="rId17"/>
+                    <a:blip r:embed="rId19"/>
                     <a:stretch>
                       <a:fillRect/>
                     </a:stretch>
@@ -14231,7 +14673,7 @@
           <w:color w:val="000000"/>
           <w:sz w:val="21"/>
         </w:rPr>
-        <w:t>Hình 5.2. Mức đóng góp của toàn bộ 14 đặc trưng theo hai mô hình dùng SMOTENC</w:t>
+        <w:t>Hình 5.4. Mức đóng góp của toàn bộ 14 đặc trưng theo hai mô hình dùng SMOTENC</w:t>
       </w:r>
     </w:p>
     <w:p>
@@ -14248,7 +14690,7 @@
           <w:color w:val="000000"/>
           <w:sz w:val="26"/>
         </w:rPr>
-        <w:t xml:space="preserve">Hình 5.2 trình bày đầy đủ 14 đặc trưng của cả hai mô hình, mỗi mô hình trên một panel riêng vì hai thang đo khác nhau. Màu phân biệt nhóm đặc trưng dẫn xuất từ số dư với phần còn lại, cho thấy mức độ tập trung rõ hơn bảng số. Với Random Forest, mức đóng góp giảm tương đối đều và các đặc trưng thời gian vẫn giữ vai trò nhỏ nhưng khác 0. Với XGBoost, hai đặc trưng đầu chiếm gần như toàn bộ, mười hai đặc trưng còn lại cộng lại chưa tới 3%, trong đó </w:t>
+        <w:t xml:space="preserve">Hình 5.4 trình bày đầy đủ 14 đặc trưng của cả hai mô hình, mỗi mô hình trên một panel riêng vì hai thang đo khác nhau. Màu phân biệt nhóm đặc trưng dẫn xuất từ số dư với phần còn lại, cho thấy mức độ tập trung rõ hơn bảng số. Với Random Forest, mức đóng góp giảm tương đối đều và các đặc trưng thời gian vẫn giữ vai trò nhỏ nhưng khác 0. Với XGBoost, hai đặc trưng đầu chiếm gần như toàn bộ, mười hai đặc trưng còn lại cộng lại chưa tới 3%, trong đó </w:t>
       </w:r>
       <w:r>
         <w:rPr>
@@ -14322,6 +14764,7 @@
         <w:rPr>
           <w:rFonts w:ascii="Times New Roman" w:hAnsi="Times New Roman"/>
           <w:b/>
+          <w:i w:val="0"/>
           <w:color w:val="000000"/>
           <w:sz w:val="26"/>
         </w:rPr>
@@ -14375,6 +14818,7 @@
         <w:rPr>
           <w:rFonts w:ascii="Times New Roman" w:hAnsi="Times New Roman"/>
           <w:b/>
+          <w:i w:val="0"/>
           <w:color w:val="000000"/>
           <w:sz w:val="27"/>
         </w:rPr>
@@ -14394,6 +14838,7 @@
         <w:rPr>
           <w:rFonts w:ascii="Times New Roman" w:hAnsi="Times New Roman"/>
           <w:b/>
+          <w:i w:val="0"/>
           <w:color w:val="000000"/>
           <w:sz w:val="26"/>
         </w:rPr>
@@ -14522,6 +14967,7 @@
         <w:rPr>
           <w:rFonts w:ascii="Times New Roman" w:hAnsi="Times New Roman"/>
           <w:b/>
+          <w:i w:val="0"/>
           <w:color w:val="000000"/>
           <w:sz w:val="26"/>
         </w:rPr>
@@ -14646,6 +15092,7 @@
         <w:rPr>
           <w:rFonts w:ascii="Times New Roman" w:hAnsi="Times New Roman"/>
           <w:b/>
+          <w:i w:val="0"/>
           <w:color w:val="000000"/>
           <w:sz w:val="26"/>
         </w:rPr>
@@ -14666,7 +15113,7 @@
           <w:color w:val="000000"/>
           <w:sz w:val="26"/>
         </w:rPr>
-        <w:t>Downsampling chỉ lấy mẫu ngẫu nhiên lớp bình thường nên không làm thay đổi phân bố có điều kiện của từng lớp. Nhờ đó, tỷ lệ phát hiện đúng và tỷ lệ báo động giả đo trên tập kiểm tra vẫn dùng được cho phân bố gốc, chỉ riêng Precision là phụ thuộc tỷ lệ lớp và cần quy chiếu lại. Bảng 6.1 trình bày kết quả quy chiếu về tỷ lệ 0,129082% của PaySim gốc, kèm khoảng tin cậy 95% tính theo phương pháp Clopper-Pearson cho tỷ lệ báo động giả.</w:t>
+        <w:t>Downsampling chỉ lấy mẫu ngẫu nhiên lớp bình thường nên không làm thay đổi phân bố có điều kiện của từng lớp. Nhờ đó, tỷ lệ phát hiện đúng và tỷ lệ báo động giả đo trên tập kiểm tra vẫn dùng được cho phân bố gốc, chỉ riêng Precision là phụ thuộc tỷ lệ lớp và cần quy chiếu lại. Bảng 6.1 trình bày kết quả quy chiếu về tỷ lệ 0,129082% của PaySim gốc, kèm khoảng tin cậy 95% tính theo phương pháp Clopper–Pearson cho tỷ lệ báo động giả.</w:t>
       </w:r>
     </w:p>
     <w:tbl>
@@ -15023,7 +15470,7 @@
                 <w:color w:val="000000"/>
                 <w:sz w:val="20"/>
               </w:rPr>
-              <w:t>0,8985 - 0,9995</w:t>
+              <w:t>0,8985 – 0,9995</w:t>
             </w:r>
           </w:p>
         </w:tc>
@@ -15207,7 +15654,7 @@
                 <w:color w:val="000000"/>
                 <w:sz w:val="20"/>
               </w:rPr>
-              <w:t>0,8491 - 0,9876</w:t>
+              <w:t>0,8491 – 0,9876</w:t>
             </w:r>
           </w:p>
         </w:tc>
@@ -15387,7 +15834,7 @@
                 <w:color w:val="000000"/>
                 <w:sz w:val="20"/>
               </w:rPr>
-              <w:t>0,8281 - 0,9784</w:t>
+              <w:t>0,8281 – 0,9784</w:t>
             </w:r>
           </w:p>
         </w:tc>
@@ -15571,7 +16018,7 @@
                 <w:color w:val="000000"/>
                 <w:sz w:val="20"/>
               </w:rPr>
-              <w:t>0,7738 - 0,9460</w:t>
+              <w:t>0,7738 – 0,9460</w:t>
             </w:r>
           </w:p>
         </w:tc>
@@ -15751,7 +16198,7 @@
                 <w:color w:val="000000"/>
                 <w:sz w:val="20"/>
               </w:rPr>
-              <w:t>0,0176 - 0,0191</w:t>
+              <w:t>0,0176 – 0,0191</w:t>
             </w:r>
           </w:p>
         </w:tc>
@@ -15849,6 +16296,7 @@
         <w:rPr>
           <w:rFonts w:ascii="Times New Roman" w:hAnsi="Times New Roman"/>
           <w:b/>
+          <w:i w:val="0"/>
           <w:color w:val="000000"/>
           <w:sz w:val="26"/>
         </w:rPr>
@@ -15918,6 +16366,7 @@
         <w:rPr>
           <w:rFonts w:ascii="Times New Roman" w:hAnsi="Times New Roman"/>
           <w:b/>
+          <w:i w:val="0"/>
           <w:color w:val="000000"/>
           <w:sz w:val="26"/>
         </w:rPr>
@@ -15988,6 +16437,7 @@
         <w:rPr>
           <w:rFonts w:ascii="Times New Roman" w:hAnsi="Times New Roman"/>
           <w:b/>
+          <w:i w:val="0"/>
           <w:color w:val="000000"/>
           <w:sz w:val="26"/>
         </w:rPr>
@@ -16078,6 +16528,7 @@
         <w:rPr>
           <w:rFonts w:ascii="Times New Roman" w:hAnsi="Times New Roman"/>
           <w:b/>
+          <w:i w:val="0"/>
           <w:color w:val="000000"/>
           <w:sz w:val="26"/>
         </w:rPr>
@@ -16114,6 +16565,7 @@
         <w:rPr>
           <w:rFonts w:ascii="Times New Roman" w:hAnsi="Times New Roman"/>
           <w:b/>
+          <w:i w:val="0"/>
           <w:color w:val="000000"/>
           <w:sz w:val="27"/>
         </w:rPr>
@@ -16133,6 +16585,7 @@
         <w:rPr>
           <w:rFonts w:ascii="Times New Roman" w:hAnsi="Times New Roman"/>
           <w:b/>
+          <w:i w:val="0"/>
           <w:color w:val="000000"/>
           <w:sz w:val="26"/>
         </w:rPr>
@@ -16203,6 +16656,7 @@
         <w:rPr>
           <w:rFonts w:ascii="Times New Roman" w:hAnsi="Times New Roman"/>
           <w:b/>
+          <w:i w:val="0"/>
           <w:color w:val="000000"/>
           <w:sz w:val="26"/>
         </w:rPr>
@@ -17262,7 +17716,7 @@
           <w:color w:val="000000"/>
           <w:sz w:val="26"/>
         </w:rPr>
-        <w:t>Toàn bộ bảy mục tiêu cụ thể đã hoàn thành. Trong đó mục tiêu thứ bảy đã tích hợp mô hình XGBoost-SMOTE cùng bộ tiền xử lý và scaler thật vào giao diện tương tác Streamlit, hỗ trợ 4 kịch bản thử nghiệm và vượt qua kiểm thử Browser QA.</w:t>
+        <w:t>Toàn bộ bảy mục tiêu cụ thể đã hoàn thành. Trong đó mục tiêu thứ bảy đã tích hợp mô hình XGBoost-SMOTE cùng bộ tiền xử lý và scaler thật vào giao diện tương tác Streamlit, hỗ trợ bốn kịch bản thử nghiệm và vượt qua kiểm thử Browser QA.</w:t>
       </w:r>
     </w:p>
     <w:p>
@@ -17295,6 +17749,7 @@
         <w:rPr>
           <w:rFonts w:ascii="Times New Roman" w:hAnsi="Times New Roman"/>
           <w:b/>
+          <w:i w:val="0"/>
           <w:color w:val="000000"/>
           <w:sz w:val="26"/>
         </w:rPr>
@@ -17348,6 +17803,7 @@
         <w:rPr>
           <w:rFonts w:ascii="Times New Roman" w:hAnsi="Times New Roman"/>
           <w:b/>
+          <w:i w:val="0"/>
           <w:color w:val="000000"/>
           <w:sz w:val="26"/>
         </w:rPr>
@@ -17455,6 +17911,7 @@
         <w:rPr>
           <w:rFonts w:ascii="Times New Roman" w:hAnsi="Times New Roman"/>
           <w:b/>
+          <w:i w:val="0"/>
           <w:color w:val="000000"/>
           <w:sz w:val="26"/>
         </w:rPr>
@@ -17508,6 +17965,7 @@
         <w:rPr>
           <w:rFonts w:ascii="Times New Roman" w:hAnsi="Times New Roman"/>
           <w:b/>
+          <w:i w:val="0"/>
           <w:color w:val="000000"/>
           <w:sz w:val="27"/>
         </w:rPr>
@@ -17544,6 +18002,7 @@
         <w:rPr>
           <w:rFonts w:ascii="Times New Roman" w:hAnsi="Times New Roman"/>
           <w:b/>
+          <w:i w:val="0"/>
           <w:color w:val="000000"/>
           <w:sz w:val="26"/>
         </w:rPr>
@@ -17870,6 +18329,138 @@
           <w:sz w:val="26"/>
         </w:rPr>
         <w:t>, mã nguồn tính chỉ số và trực quan hóa kết quả.</w:t>
+      </w:r>
+    </w:p>
+    <w:p>
+      <w:pPr>
+        <w:spacing w:before="20" w:after="40" w:line="300" w:lineRule="auto"/>
+        <w:ind w:left="720" w:hanging="283"/>
+        <w:jc w:val="both"/>
+      </w:pPr>
+      <w:r>
+        <w:rPr>
+          <w:rFonts w:ascii="Times New Roman" w:hAnsi="Times New Roman"/>
+          <w:b/>
+          <w:color w:val="000000"/>
+          <w:sz w:val="26"/>
+        </w:rPr>
+        <w:t xml:space="preserve">-  </w:t>
+      </w:r>
+      <w:r>
+        <w:rPr>
+          <w:rFonts w:ascii="Times New Roman" w:hAnsi="Times New Roman"/>
+          <w:b w:val="0"/>
+          <w:i w:val="0"/>
+          <w:color w:val="000000"/>
+          <w:sz w:val="26"/>
+        </w:rPr>
+        <w:t xml:space="preserve">Nguyễn Duy Khang, </w:t>
+      </w:r>
+      <w:r>
+        <w:rPr>
+          <w:rFonts w:ascii="Courier New" w:hAnsi="Courier New"/>
+          <w:b w:val="0"/>
+          <w:i w:val="0"/>
+          <w:color w:val="000000"/>
+          <w:sz w:val="25"/>
+        </w:rPr>
+        <w:t>reports/model_comparison.csv</w:t>
+      </w:r>
+      <w:r>
+        <w:rPr>
+          <w:rFonts w:ascii="Times New Roman" w:hAnsi="Times New Roman"/>
+          <w:b w:val="0"/>
+          <w:i w:val="0"/>
+          <w:color w:val="000000"/>
+          <w:sz w:val="26"/>
+        </w:rPr>
+        <w:t xml:space="preserve">, </w:t>
+      </w:r>
+      <w:r>
+        <w:rPr>
+          <w:rFonts w:ascii="Courier New" w:hAnsi="Courier New"/>
+          <w:b w:val="0"/>
+          <w:i w:val="0"/>
+          <w:color w:val="000000"/>
+          <w:sz w:val="25"/>
+        </w:rPr>
+        <w:t>reports/figures/roc_curves_all.png</w:t>
+      </w:r>
+      <w:r>
+        <w:rPr>
+          <w:rFonts w:ascii="Times New Roman" w:hAnsi="Times New Roman"/>
+          <w:b w:val="0"/>
+          <w:i w:val="0"/>
+          <w:color w:val="000000"/>
+          <w:sz w:val="26"/>
+        </w:rPr>
+        <w:t xml:space="preserve"> và </w:t>
+      </w:r>
+      <w:r>
+        <w:rPr>
+          <w:rFonts w:ascii="Courier New" w:hAnsi="Courier New"/>
+          <w:b w:val="0"/>
+          <w:i w:val="0"/>
+          <w:color w:val="000000"/>
+          <w:sz w:val="25"/>
+        </w:rPr>
+        <w:t>reports/figures/pr_curves_all.png</w:t>
+      </w:r>
+      <w:r>
+        <w:rPr>
+          <w:rFonts w:ascii="Times New Roman" w:hAnsi="Times New Roman"/>
+          <w:b w:val="0"/>
+          <w:i w:val="0"/>
+          <w:color w:val="000000"/>
+          <w:sz w:val="26"/>
+        </w:rPr>
+        <w:t>, bảng so sánh tổng hợp và đường ROC, Precision–Recall của bước đánh giá chéo.</w:t>
+      </w:r>
+    </w:p>
+    <w:p>
+      <w:pPr>
+        <w:spacing w:before="20" w:after="40" w:line="300" w:lineRule="auto"/>
+        <w:ind w:left="720" w:hanging="283"/>
+        <w:jc w:val="both"/>
+      </w:pPr>
+      <w:r>
+        <w:rPr>
+          <w:rFonts w:ascii="Times New Roman" w:hAnsi="Times New Roman"/>
+          <w:b/>
+          <w:color w:val="000000"/>
+          <w:sz w:val="26"/>
+        </w:rPr>
+        <w:t xml:space="preserve">-  </w:t>
+      </w:r>
+      <w:r>
+        <w:rPr>
+          <w:rFonts w:ascii="Times New Roman" w:hAnsi="Times New Roman"/>
+          <w:b w:val="0"/>
+          <w:i w:val="0"/>
+          <w:color w:val="000000"/>
+          <w:sz w:val="26"/>
+        </w:rPr>
+        <w:t xml:space="preserve">Hoàng Cao Sơn và Nguyễn Duy Khang, </w:t>
+      </w:r>
+      <w:r>
+        <w:rPr>
+          <w:rFonts w:ascii="Courier New" w:hAnsi="Courier New"/>
+          <w:b w:val="0"/>
+          <w:i w:val="0"/>
+          <w:color w:val="000000"/>
+          <w:sz w:val="25"/>
+        </w:rPr>
+        <w:t>notebooks/06_evaluation_comparison.ipynb</w:t>
+      </w:r>
+      <w:r>
+        <w:rPr>
+          <w:rFonts w:ascii="Times New Roman" w:hAnsi="Times New Roman"/>
+          <w:b w:val="0"/>
+          <w:i w:val="0"/>
+          <w:color w:val="000000"/>
+          <w:sz w:val="26"/>
+        </w:rPr>
+        <w:t>, notebook đánh giá và so sánh chéo các mô hình.</w:t>
       </w:r>
     </w:p>
     <w:p>
@@ -18037,6 +18628,7 @@
         <w:rPr>
           <w:rFonts w:ascii="Times New Roman" w:hAnsi="Times New Roman"/>
           <w:b/>
+          <w:i w:val="0"/>
           <w:color w:val="000000"/>
           <w:sz w:val="26"/>
         </w:rPr>
@@ -18069,9 +18661,9 @@
           <w:color w:val="000000"/>
           <w:sz w:val="23"/>
         </w:rPr>
-        <w:t xml:space="preserve">A. Abdallah, M. A. Maarof, and A. Zainal, “Fraud detection system: A survey,” Journal of Network and Computer Applications, vol. 68, pp. 90-113, 2016, doi: </w:t>
-      </w:r>
-      <w:hyperlink r:id="rId18">
+        <w:t xml:space="preserve">A. Abdallah, M. A. Maarof, and A. Zainal, “Fraud detection system: A survey,” Journal of Network and Computer Applications, vol. 68, pp. 90–113, 2016, doi: </w:t>
+      </w:r>
+      <w:hyperlink r:id="rId20">
         <w:r>
           <w:rPr>
             <w:rFonts w:ascii="Times New Roman" w:hAnsi="Times New Roman"/>
@@ -18109,9 +18701,9 @@
           <w:color w:val="000000"/>
           <w:sz w:val="23"/>
         </w:rPr>
-        <w:t xml:space="preserve">E. A. Lopez-Rojas, A. Elmir, and S. Axelsson, “PaySim: A financial mobile money simulator for fraud detection,” in Proc. 28th European Modeling and Simulation Symposium, Larnaca, Cyprus, 2016, pp. 249-255. [Online]. Available: </w:t>
-      </w:r>
-      <w:hyperlink r:id="rId19">
+        <w:t xml:space="preserve">E. A. Lopez-Rojas, A. Elmir, and S. Axelsson, “PaySim: A financial mobile money simulator for fraud detection,” in Proc. 28th European Modeling and Simulation Symposium, Larnaca, Cyprus, 2016, pp. 249–255. [Online]. Available: </w:t>
+      </w:r>
+      <w:hyperlink r:id="rId21">
         <w:r>
           <w:rPr>
             <w:rFonts w:ascii="Times New Roman" w:hAnsi="Times New Roman"/>
@@ -18151,7 +18743,7 @@
         </w:rPr>
         <w:t xml:space="preserve">E. Lopez-Rojas, “Synthetic Financial Datasets for Fraud Detection,” Kaggle. [Online]. Available: </w:t>
       </w:r>
-      <w:hyperlink r:id="rId20">
+      <w:hyperlink r:id="rId22">
         <w:r>
           <w:rPr>
             <w:rFonts w:ascii="Times New Roman" w:hAnsi="Times New Roman"/>
@@ -18199,9 +18791,9 @@
           <w:color w:val="000000"/>
           <w:sz w:val="23"/>
         </w:rPr>
-        <w:t xml:space="preserve">N. V. Chawla, K. W. Bowyer, L. O. Hall, and W. P. Kegelmeyer, “SMOTE: Synthetic Minority Over-sampling Technique,” Journal of Artificial Intelligence Research, vol. 16, pp. 321-357, 2002, doi: </w:t>
-      </w:r>
-      <w:hyperlink r:id="rId21">
+        <w:t xml:space="preserve">N. V. Chawla, K. W. Bowyer, L. O. Hall, and W. P. Kegelmeyer, “SMOTE: Synthetic Minority Over-sampling Technique,” Journal of Artificial Intelligence Research, vol. 16, pp. 321–357, 2002, doi: </w:t>
+      </w:r>
+      <w:hyperlink r:id="rId23">
         <w:r>
           <w:rPr>
             <w:rFonts w:ascii="Times New Roman" w:hAnsi="Times New Roman"/>
@@ -18239,9 +18831,9 @@
           <w:color w:val="000000"/>
           <w:sz w:val="23"/>
         </w:rPr>
-        <w:t xml:space="preserve">H. He, Y. Bai, E. A. Garcia, and S. Li, “ADASYN: Adaptive synthetic sampling approach for imbalanced learning,” in Proc. IEEE International Joint Conference on Neural Networks, Hong Kong, 2008, pp. 1322-1328, doi: </w:t>
-      </w:r>
-      <w:hyperlink r:id="rId22">
+        <w:t xml:space="preserve">H. He, Y. Bai, E. A. Garcia, and S. Li, “ADASYN: Adaptive synthetic sampling approach for imbalanced learning,” in Proc. IEEE International Joint Conference on Neural Networks, Hong Kong, 2008, pp. 1322–1328, doi: </w:t>
+      </w:r>
+      <w:hyperlink r:id="rId24">
         <w:r>
           <w:rPr>
             <w:rFonts w:ascii="Times New Roman" w:hAnsi="Times New Roman"/>
@@ -18279,9 +18871,9 @@
           <w:color w:val="000000"/>
           <w:sz w:val="23"/>
         </w:rPr>
-        <w:t xml:space="preserve">L. Breiman, “Random Forests,” Machine Learning, vol. 45, no. 1, pp. 5-32, 2001, doi: </w:t>
-      </w:r>
-      <w:hyperlink r:id="rId23">
+        <w:t xml:space="preserve">L. Breiman, “Random Forests,” Machine Learning, vol. 45, no. 1, pp. 5–32, 2001, doi: </w:t>
+      </w:r>
+      <w:hyperlink r:id="rId25">
         <w:r>
           <w:rPr>
             <w:rFonts w:ascii="Times New Roman" w:hAnsi="Times New Roman"/>
@@ -18319,9 +18911,9 @@
           <w:color w:val="000000"/>
           <w:sz w:val="23"/>
         </w:rPr>
-        <w:t xml:space="preserve">T. Chen and C. Guestrin, “XGBoost: A scalable tree boosting system,” in Proc. 22nd ACM SIGKDD International Conference on Knowledge Discovery and Data Mining, San Francisco, CA, USA, 2016, pp. 785-794, doi: </w:t>
-      </w:r>
-      <w:hyperlink r:id="rId24">
+        <w:t xml:space="preserve">T. Chen and C. Guestrin, “XGBoost: A scalable tree boosting system,” in Proc. 22nd ACM SIGKDD International Conference on Knowledge Discovery and Data Mining, San Francisco, CA, USA, 2016, pp. 785–794, doi: </w:t>
+      </w:r>
+      <w:hyperlink r:id="rId26">
         <w:r>
           <w:rPr>
             <w:rFonts w:ascii="Times New Roman" w:hAnsi="Times New Roman"/>
@@ -18359,9 +18951,9 @@
           <w:color w:val="000000"/>
           <w:sz w:val="23"/>
         </w:rPr>
-        <w:t xml:space="preserve">G. E. Hinton and R. R. Salakhutdinov, “Reducing the dimensionality of data with neural networks,” Science, vol. 313, no. 5786, pp. 504-507, 2006, doi: </w:t>
-      </w:r>
-      <w:hyperlink r:id="rId25">
+        <w:t xml:space="preserve">G. E. Hinton and R. R. Salakhutdinov, “Reducing the dimensionality of data with neural networks,” Science, vol. 313, no. 5786, pp. 504–507, 2006, doi: </w:t>
+      </w:r>
+      <w:hyperlink r:id="rId27">
         <w:r>
           <w:rPr>
             <w:rFonts w:ascii="Times New Roman" w:hAnsi="Times New Roman"/>

</xml_diff>

<commit_message>
fix(phase07): sửa lệch định dạng bìa, mục lục và danh sách
Bìa: bỏ dấu ngoặc kép mà cover_page_builder tự thêm quanh tên đề tài.

Mục lục: tab stop dot-leader đặt đúng 16.0cm, bằng chằn bề rộng vùng in, nên
số trang của mọi mục bị đẩy xuống dòng kế tiếp và mục lục phình thành 3 trang.
Tab nay trừ thêm 0.2cm an toàn và trừ phần thụt lề của từng cấp, nhờ đó số
trang của cả ba cấp thẳng một cột và mục lục gọn lại còn 2 trang.

Danh sách và mục tài liệu tham khảo: chuyển từ căn đều sang căn trái. Các mục
này chứa đường dẫn tệp dài không có chỗ ngắt dòng nên căn đều kéo giãn ký tự
rất xấu, thấy rõ ở danh mục tài liệu nội bộ.

Nội dung: bỏ hai câu còn ngôn từ thời bản nháp ở Mục 1.3.2 và 3.6.2.

Báo cáo sau khi sửa: 31 trang, 4 hình, 8 bảng dữ liệu, caption hình và bảng
nhất quán, không còn dòng nào bị giãn ký tự bất thường.
</commit_message>
<xml_diff>
--- a/draft/fraud-detection/reports/[Nhom9]_BaoCao_FraudDetection.docx
+++ b/draft/fraud-detection/reports/[Nhom9]_BaoCao_FraudDetection.docx
@@ -133,7 +133,7 @@
           <w:color w:val="000000"/>
           <w:sz w:val="27"/>
         </w:rPr>
-        <w:t>"HỆ THỐNG PHÁT HIỆN GIAO DỊCH TÀI CHÍNH BẤT THƯỜNG VÀ NGHI VẤN GIAN LẬN"</w:t>
+        <w:t>HỆ THỐNG PHÁT HIỆN GIAO DỊCH TÀI CHÍNH BẤT THƯỜNG VÀ NGHI VẤN GIAN LẬN</w:t>
       </w:r>
     </w:p>
     <w:tbl>
@@ -341,7 +341,7 @@
     <w:p>
       <w:pPr>
         <w:tabs>
-          <w:tab w:pos="9071" w:val="right" w:leader="dot"/>
+          <w:tab w:pos="8957" w:val="right" w:leader="dot"/>
         </w:tabs>
         <w:spacing w:before="60" w:after="40" w:line="300" w:lineRule="auto"/>
       </w:pPr>
@@ -371,7 +371,7 @@
     <w:p>
       <w:pPr>
         <w:tabs>
-          <w:tab w:pos="9071" w:val="right" w:leader="dot"/>
+          <w:tab w:pos="8957" w:val="right" w:leader="dot"/>
         </w:tabs>
         <w:spacing w:before="60" w:after="40" w:line="300" w:lineRule="auto"/>
       </w:pPr>
@@ -394,14 +394,14 @@
             <w:b/>
             <w:color w:val="000000"/>
           </w:rPr>
-          <w:t xml:space="preserve">	3</w:t>
+          <w:t xml:space="preserve">	2</w:t>
         </w:r>
       </w:hyperlink>
     </w:p>
     <w:p>
       <w:pPr>
         <w:tabs>
-          <w:tab w:pos="9071" w:val="right" w:leader="dot"/>
+          <w:tab w:pos="8617" w:val="right" w:leader="dot"/>
         </w:tabs>
         <w:spacing w:before="20" w:after="40" w:line="300" w:lineRule="auto"/>
         <w:ind w:left="340"/>
@@ -423,14 +423,14 @@
             <w:sz w:val="23"/>
             <w:color w:val="000000"/>
           </w:rPr>
-          <w:t xml:space="preserve">	3</w:t>
+          <w:t xml:space="preserve">	2</w:t>
         </w:r>
       </w:hyperlink>
     </w:p>
     <w:p>
       <w:pPr>
         <w:tabs>
-          <w:tab w:pos="9071" w:val="right" w:leader="dot"/>
+          <w:tab w:pos="8617" w:val="right" w:leader="dot"/>
         </w:tabs>
         <w:spacing w:before="20" w:after="40" w:line="300" w:lineRule="auto"/>
         <w:ind w:left="340"/>
@@ -452,14 +452,14 @@
             <w:sz w:val="23"/>
             <w:color w:val="000000"/>
           </w:rPr>
-          <w:t xml:space="preserve">	4</w:t>
+          <w:t xml:space="preserve">	3</w:t>
         </w:r>
       </w:hyperlink>
     </w:p>
     <w:p>
       <w:pPr>
         <w:tabs>
-          <w:tab w:pos="9071" w:val="right" w:leader="dot"/>
+          <w:tab w:pos="8617" w:val="right" w:leader="dot"/>
         </w:tabs>
         <w:spacing w:before="20" w:after="40" w:line="300" w:lineRule="auto"/>
         <w:ind w:left="340"/>
@@ -481,14 +481,14 @@
             <w:sz w:val="23"/>
             <w:color w:val="000000"/>
           </w:rPr>
-          <w:t xml:space="preserve">	4</w:t>
+          <w:t xml:space="preserve">	3</w:t>
         </w:r>
       </w:hyperlink>
     </w:p>
     <w:p>
       <w:pPr>
         <w:tabs>
-          <w:tab w:pos="9071" w:val="right" w:leader="dot"/>
+          <w:tab w:pos="8277" w:val="right" w:leader="dot"/>
         </w:tabs>
         <w:spacing w:before="20" w:after="40" w:line="300" w:lineRule="auto"/>
         <w:ind w:left="680"/>
@@ -510,14 +510,14 @@
             <w:sz w:val="23"/>
             <w:color w:val="000000"/>
           </w:rPr>
-          <w:t xml:space="preserve">	4</w:t>
+          <w:t xml:space="preserve">	3</w:t>
         </w:r>
       </w:hyperlink>
     </w:p>
     <w:p>
       <w:pPr>
         <w:tabs>
-          <w:tab w:pos="9071" w:val="right" w:leader="dot"/>
+          <w:tab w:pos="8277" w:val="right" w:leader="dot"/>
         </w:tabs>
         <w:spacing w:before="20" w:after="40" w:line="300" w:lineRule="auto"/>
         <w:ind w:left="680"/>
@@ -539,14 +539,14 @@
             <w:sz w:val="23"/>
             <w:color w:val="000000"/>
           </w:rPr>
-          <w:t xml:space="preserve">	5</w:t>
+          <w:t xml:space="preserve">	4</w:t>
         </w:r>
       </w:hyperlink>
     </w:p>
     <w:p>
       <w:pPr>
         <w:tabs>
-          <w:tab w:pos="9071" w:val="right" w:leader="dot"/>
+          <w:tab w:pos="8617" w:val="right" w:leader="dot"/>
         </w:tabs>
         <w:spacing w:before="20" w:after="40" w:line="300" w:lineRule="auto"/>
         <w:ind w:left="340"/>
@@ -568,14 +568,14 @@
             <w:sz w:val="23"/>
             <w:color w:val="000000"/>
           </w:rPr>
-          <w:t xml:space="preserve">	5</w:t>
+          <w:t xml:space="preserve">	4</w:t>
         </w:r>
       </w:hyperlink>
     </w:p>
     <w:p>
       <w:pPr>
         <w:tabs>
-          <w:tab w:pos="9071" w:val="right" w:leader="dot"/>
+          <w:tab w:pos="8617" w:val="right" w:leader="dot"/>
         </w:tabs>
         <w:spacing w:before="20" w:after="40" w:line="300" w:lineRule="auto"/>
         <w:ind w:left="340"/>
@@ -597,14 +597,14 @@
             <w:sz w:val="23"/>
             <w:color w:val="000000"/>
           </w:rPr>
-          <w:t xml:space="preserve">	6</w:t>
+          <w:t xml:space="preserve">	5</w:t>
         </w:r>
       </w:hyperlink>
     </w:p>
     <w:p>
       <w:pPr>
         <w:tabs>
-          <w:tab w:pos="9071" w:val="right" w:leader="dot"/>
+          <w:tab w:pos="8957" w:val="right" w:leader="dot"/>
         </w:tabs>
         <w:spacing w:before="60" w:after="40" w:line="300" w:lineRule="auto"/>
       </w:pPr>
@@ -627,14 +627,14 @@
             <w:b/>
             <w:color w:val="000000"/>
           </w:rPr>
-          <w:t xml:space="preserve">	6</w:t>
+          <w:t xml:space="preserve">	5</w:t>
         </w:r>
       </w:hyperlink>
     </w:p>
     <w:p>
       <w:pPr>
         <w:tabs>
-          <w:tab w:pos="9071" w:val="right" w:leader="dot"/>
+          <w:tab w:pos="8617" w:val="right" w:leader="dot"/>
         </w:tabs>
         <w:spacing w:before="20" w:after="40" w:line="300" w:lineRule="auto"/>
         <w:ind w:left="340"/>
@@ -656,14 +656,14 @@
             <w:sz w:val="23"/>
             <w:color w:val="000000"/>
           </w:rPr>
-          <w:t xml:space="preserve">	6</w:t>
+          <w:t xml:space="preserve">	5</w:t>
         </w:r>
       </w:hyperlink>
     </w:p>
     <w:p>
       <w:pPr>
         <w:tabs>
-          <w:tab w:pos="9071" w:val="right" w:leader="dot"/>
+          <w:tab w:pos="8617" w:val="right" w:leader="dot"/>
         </w:tabs>
         <w:spacing w:before="20" w:after="40" w:line="300" w:lineRule="auto"/>
         <w:ind w:left="340"/>
@@ -685,14 +685,14 @@
             <w:sz w:val="23"/>
             <w:color w:val="000000"/>
           </w:rPr>
-          <w:t xml:space="preserve">	6</w:t>
+          <w:t xml:space="preserve">	5</w:t>
         </w:r>
       </w:hyperlink>
     </w:p>
     <w:p>
       <w:pPr>
         <w:tabs>
-          <w:tab w:pos="9071" w:val="right" w:leader="dot"/>
+          <w:tab w:pos="8617" w:val="right" w:leader="dot"/>
         </w:tabs>
         <w:spacing w:before="20" w:after="40" w:line="300" w:lineRule="auto"/>
         <w:ind w:left="340"/>
@@ -714,14 +714,14 @@
             <w:sz w:val="23"/>
             <w:color w:val="000000"/>
           </w:rPr>
-          <w:t xml:space="preserve">	7</w:t>
+          <w:t xml:space="preserve">	6</w:t>
         </w:r>
       </w:hyperlink>
     </w:p>
     <w:p>
       <w:pPr>
         <w:tabs>
-          <w:tab w:pos="9071" w:val="right" w:leader="dot"/>
+          <w:tab w:pos="8277" w:val="right" w:leader="dot"/>
         </w:tabs>
         <w:spacing w:before="20" w:after="40" w:line="300" w:lineRule="auto"/>
         <w:ind w:left="680"/>
@@ -743,14 +743,14 @@
             <w:sz w:val="23"/>
             <w:color w:val="000000"/>
           </w:rPr>
-          <w:t xml:space="preserve">	7</w:t>
+          <w:t xml:space="preserve">	6</w:t>
         </w:r>
       </w:hyperlink>
     </w:p>
     <w:p>
       <w:pPr>
         <w:tabs>
-          <w:tab w:pos="9071" w:val="right" w:leader="dot"/>
+          <w:tab w:pos="8277" w:val="right" w:leader="dot"/>
         </w:tabs>
         <w:spacing w:before="20" w:after="40" w:line="300" w:lineRule="auto"/>
         <w:ind w:left="680"/>
@@ -772,14 +772,14 @@
             <w:sz w:val="23"/>
             <w:color w:val="000000"/>
           </w:rPr>
-          <w:t xml:space="preserve">	7</w:t>
+          <w:t xml:space="preserve">	6</w:t>
         </w:r>
       </w:hyperlink>
     </w:p>
     <w:p>
       <w:pPr>
         <w:tabs>
-          <w:tab w:pos="9071" w:val="right" w:leader="dot"/>
+          <w:tab w:pos="8277" w:val="right" w:leader="dot"/>
         </w:tabs>
         <w:spacing w:before="20" w:after="40" w:line="300" w:lineRule="auto"/>
         <w:ind w:left="680"/>
@@ -801,14 +801,14 @@
             <w:sz w:val="23"/>
             <w:color w:val="000000"/>
           </w:rPr>
-          <w:t xml:space="preserve">	7</w:t>
+          <w:t xml:space="preserve">	6</w:t>
         </w:r>
       </w:hyperlink>
     </w:p>
     <w:p>
       <w:pPr>
         <w:tabs>
-          <w:tab w:pos="9071" w:val="right" w:leader="dot"/>
+          <w:tab w:pos="8277" w:val="right" w:leader="dot"/>
         </w:tabs>
         <w:spacing w:before="20" w:after="40" w:line="300" w:lineRule="auto"/>
         <w:ind w:left="680"/>
@@ -830,14 +830,14 @@
             <w:sz w:val="23"/>
             <w:color w:val="000000"/>
           </w:rPr>
-          <w:t xml:space="preserve">	7</w:t>
+          <w:t xml:space="preserve">	6</w:t>
         </w:r>
       </w:hyperlink>
     </w:p>
     <w:p>
       <w:pPr>
         <w:tabs>
-          <w:tab w:pos="9071" w:val="right" w:leader="dot"/>
+          <w:tab w:pos="8617" w:val="right" w:leader="dot"/>
         </w:tabs>
         <w:spacing w:before="20" w:after="40" w:line="300" w:lineRule="auto"/>
         <w:ind w:left="340"/>
@@ -859,14 +859,14 @@
             <w:sz w:val="23"/>
             <w:color w:val="000000"/>
           </w:rPr>
-          <w:t xml:space="preserve">	7</w:t>
+          <w:t xml:space="preserve">	6</w:t>
         </w:r>
       </w:hyperlink>
     </w:p>
     <w:p>
       <w:pPr>
         <w:tabs>
-          <w:tab w:pos="9071" w:val="right" w:leader="dot"/>
+          <w:tab w:pos="8617" w:val="right" w:leader="dot"/>
         </w:tabs>
         <w:spacing w:before="20" w:after="40" w:line="300" w:lineRule="auto"/>
         <w:ind w:left="340"/>
@@ -888,14 +888,14 @@
             <w:sz w:val="23"/>
             <w:color w:val="000000"/>
           </w:rPr>
-          <w:t xml:space="preserve">	8</w:t>
+          <w:t xml:space="preserve">	7</w:t>
         </w:r>
       </w:hyperlink>
     </w:p>
     <w:p>
       <w:pPr>
         <w:tabs>
-          <w:tab w:pos="9071" w:val="right" w:leader="dot"/>
+          <w:tab w:pos="8957" w:val="right" w:leader="dot"/>
         </w:tabs>
         <w:spacing w:before="60" w:after="40" w:line="300" w:lineRule="auto"/>
       </w:pPr>
@@ -918,14 +918,14 @@
             <w:b/>
             <w:color w:val="000000"/>
           </w:rPr>
-          <w:t xml:space="preserve">	8</w:t>
+          <w:t xml:space="preserve">	7</w:t>
         </w:r>
       </w:hyperlink>
     </w:p>
     <w:p>
       <w:pPr>
         <w:tabs>
-          <w:tab w:pos="9071" w:val="right" w:leader="dot"/>
+          <w:tab w:pos="8617" w:val="right" w:leader="dot"/>
         </w:tabs>
         <w:spacing w:before="20" w:after="40" w:line="300" w:lineRule="auto"/>
         <w:ind w:left="340"/>
@@ -947,14 +947,14 @@
             <w:sz w:val="23"/>
             <w:color w:val="000000"/>
           </w:rPr>
-          <w:t xml:space="preserve">	8</w:t>
+          <w:t xml:space="preserve">	7</w:t>
         </w:r>
       </w:hyperlink>
     </w:p>
     <w:p>
       <w:pPr>
         <w:tabs>
-          <w:tab w:pos="9071" w:val="right" w:leader="dot"/>
+          <w:tab w:pos="8617" w:val="right" w:leader="dot"/>
         </w:tabs>
         <w:spacing w:before="20" w:after="40" w:line="300" w:lineRule="auto"/>
         <w:ind w:left="340"/>
@@ -976,14 +976,14 @@
             <w:sz w:val="23"/>
             <w:color w:val="000000"/>
           </w:rPr>
-          <w:t xml:space="preserve">	9</w:t>
+          <w:t xml:space="preserve">	8</w:t>
         </w:r>
       </w:hyperlink>
     </w:p>
     <w:p>
       <w:pPr>
         <w:tabs>
-          <w:tab w:pos="9071" w:val="right" w:leader="dot"/>
+          <w:tab w:pos="8617" w:val="right" w:leader="dot"/>
         </w:tabs>
         <w:spacing w:before="20" w:after="40" w:line="300" w:lineRule="auto"/>
         <w:ind w:left="340"/>
@@ -1005,14 +1005,14 @@
             <w:sz w:val="23"/>
             <w:color w:val="000000"/>
           </w:rPr>
-          <w:t xml:space="preserve">	9</w:t>
+          <w:t xml:space="preserve">	8</w:t>
         </w:r>
       </w:hyperlink>
     </w:p>
     <w:p>
       <w:pPr>
         <w:tabs>
-          <w:tab w:pos="9071" w:val="right" w:leader="dot"/>
+          <w:tab w:pos="8617" w:val="right" w:leader="dot"/>
         </w:tabs>
         <w:spacing w:before="20" w:after="40" w:line="300" w:lineRule="auto"/>
         <w:ind w:left="340"/>
@@ -1034,14 +1034,14 @@
             <w:sz w:val="23"/>
             <w:color w:val="000000"/>
           </w:rPr>
-          <w:t xml:space="preserve">	10</w:t>
+          <w:t xml:space="preserve">	9</w:t>
         </w:r>
       </w:hyperlink>
     </w:p>
     <w:p>
       <w:pPr>
         <w:tabs>
-          <w:tab w:pos="9071" w:val="right" w:leader="dot"/>
+          <w:tab w:pos="8617" w:val="right" w:leader="dot"/>
         </w:tabs>
         <w:spacing w:before="20" w:after="40" w:line="300" w:lineRule="auto"/>
         <w:ind w:left="340"/>
@@ -1063,14 +1063,14 @@
             <w:sz w:val="23"/>
             <w:color w:val="000000"/>
           </w:rPr>
-          <w:t xml:space="preserve">	10</w:t>
+          <w:t xml:space="preserve">	9</w:t>
         </w:r>
       </w:hyperlink>
     </w:p>
     <w:p>
       <w:pPr>
         <w:tabs>
-          <w:tab w:pos="9071" w:val="right" w:leader="dot"/>
+          <w:tab w:pos="8617" w:val="right" w:leader="dot"/>
         </w:tabs>
         <w:spacing w:before="20" w:after="40" w:line="300" w:lineRule="auto"/>
         <w:ind w:left="340"/>
@@ -1092,14 +1092,14 @@
             <w:sz w:val="23"/>
             <w:color w:val="000000"/>
           </w:rPr>
-          <w:t xml:space="preserve">	11</w:t>
+          <w:t xml:space="preserve">	10</w:t>
         </w:r>
       </w:hyperlink>
     </w:p>
     <w:p>
       <w:pPr>
         <w:tabs>
-          <w:tab w:pos="9071" w:val="right" w:leader="dot"/>
+          <w:tab w:pos="8277" w:val="right" w:leader="dot"/>
         </w:tabs>
         <w:spacing w:before="20" w:after="40" w:line="300" w:lineRule="auto"/>
         <w:ind w:left="680"/>
@@ -1121,14 +1121,14 @@
             <w:sz w:val="23"/>
             <w:color w:val="000000"/>
           </w:rPr>
-          <w:t xml:space="preserve">	11</w:t>
+          <w:t xml:space="preserve">	10</w:t>
         </w:r>
       </w:hyperlink>
     </w:p>
     <w:p>
       <w:pPr>
         <w:tabs>
-          <w:tab w:pos="9071" w:val="right" w:leader="dot"/>
+          <w:tab w:pos="8277" w:val="right" w:leader="dot"/>
         </w:tabs>
         <w:spacing w:before="20" w:after="40" w:line="300" w:lineRule="auto"/>
         <w:ind w:left="680"/>
@@ -1150,14 +1150,14 @@
             <w:sz w:val="23"/>
             <w:color w:val="000000"/>
           </w:rPr>
-          <w:t xml:space="preserve">	11</w:t>
+          <w:t xml:space="preserve">	10</w:t>
         </w:r>
       </w:hyperlink>
     </w:p>
     <w:p>
       <w:pPr>
         <w:tabs>
-          <w:tab w:pos="9071" w:val="right" w:leader="dot"/>
+          <w:tab w:pos="8277" w:val="right" w:leader="dot"/>
         </w:tabs>
         <w:spacing w:before="20" w:after="40" w:line="300" w:lineRule="auto"/>
         <w:ind w:left="680"/>
@@ -1179,14 +1179,14 @@
             <w:sz w:val="23"/>
             <w:color w:val="000000"/>
           </w:rPr>
-          <w:t xml:space="preserve">	11</w:t>
+          <w:t xml:space="preserve">	10</w:t>
         </w:r>
       </w:hyperlink>
     </w:p>
     <w:p>
       <w:pPr>
         <w:tabs>
-          <w:tab w:pos="9071" w:val="right" w:leader="dot"/>
+          <w:tab w:pos="8277" w:val="right" w:leader="dot"/>
         </w:tabs>
         <w:spacing w:before="20" w:after="40" w:line="300" w:lineRule="auto"/>
         <w:ind w:left="680"/>
@@ -1208,14 +1208,14 @@
             <w:sz w:val="23"/>
             <w:color w:val="000000"/>
           </w:rPr>
-          <w:t xml:space="preserve">	11</w:t>
+          <w:t xml:space="preserve">	10</w:t>
         </w:r>
       </w:hyperlink>
     </w:p>
     <w:p>
       <w:pPr>
         <w:tabs>
-          <w:tab w:pos="9071" w:val="right" w:leader="dot"/>
+          <w:tab w:pos="8277" w:val="right" w:leader="dot"/>
         </w:tabs>
         <w:spacing w:before="20" w:after="40" w:line="300" w:lineRule="auto"/>
         <w:ind w:left="680"/>
@@ -1237,14 +1237,14 @@
             <w:sz w:val="23"/>
             <w:color w:val="000000"/>
           </w:rPr>
-          <w:t xml:space="preserve">	12</w:t>
+          <w:t xml:space="preserve">	11</w:t>
         </w:r>
       </w:hyperlink>
     </w:p>
     <w:p>
       <w:pPr>
         <w:tabs>
-          <w:tab w:pos="9071" w:val="right" w:leader="dot"/>
+          <w:tab w:pos="8617" w:val="right" w:leader="dot"/>
         </w:tabs>
         <w:spacing w:before="20" w:after="40" w:line="300" w:lineRule="auto"/>
         <w:ind w:left="340"/>
@@ -1266,14 +1266,14 @@
             <w:sz w:val="23"/>
             <w:color w:val="000000"/>
           </w:rPr>
-          <w:t xml:space="preserve">	12</w:t>
+          <w:t xml:space="preserve">	11</w:t>
         </w:r>
       </w:hyperlink>
     </w:p>
     <w:p>
       <w:pPr>
         <w:tabs>
-          <w:tab w:pos="9071" w:val="right" w:leader="dot"/>
+          <w:tab w:pos="8957" w:val="right" w:leader="dot"/>
         </w:tabs>
         <w:spacing w:before="60" w:after="40" w:line="300" w:lineRule="auto"/>
       </w:pPr>
@@ -1296,14 +1296,14 @@
             <w:b/>
             <w:color w:val="000000"/>
           </w:rPr>
-          <w:t xml:space="preserve">	12</w:t>
+          <w:t xml:space="preserve">	11</w:t>
         </w:r>
       </w:hyperlink>
     </w:p>
     <w:p>
       <w:pPr>
         <w:tabs>
-          <w:tab w:pos="9071" w:val="right" w:leader="dot"/>
+          <w:tab w:pos="8617" w:val="right" w:leader="dot"/>
         </w:tabs>
         <w:spacing w:before="20" w:after="40" w:line="300" w:lineRule="auto"/>
         <w:ind w:left="340"/>
@@ -1325,14 +1325,14 @@
             <w:sz w:val="23"/>
             <w:color w:val="000000"/>
           </w:rPr>
-          <w:t xml:space="preserve">	12</w:t>
+          <w:t xml:space="preserve">	11</w:t>
         </w:r>
       </w:hyperlink>
     </w:p>
     <w:p>
       <w:pPr>
         <w:tabs>
-          <w:tab w:pos="9071" w:val="right" w:leader="dot"/>
+          <w:tab w:pos="8617" w:val="right" w:leader="dot"/>
         </w:tabs>
         <w:spacing w:before="20" w:after="40" w:line="300" w:lineRule="auto"/>
         <w:ind w:left="340"/>
@@ -1354,14 +1354,14 @@
             <w:sz w:val="23"/>
             <w:color w:val="000000"/>
           </w:rPr>
-          <w:t xml:space="preserve">	13</w:t>
+          <w:t xml:space="preserve">	12</w:t>
         </w:r>
       </w:hyperlink>
     </w:p>
     <w:p>
       <w:pPr>
         <w:tabs>
-          <w:tab w:pos="9071" w:val="right" w:leader="dot"/>
+          <w:tab w:pos="8617" w:val="right" w:leader="dot"/>
         </w:tabs>
         <w:spacing w:before="20" w:after="40" w:line="300" w:lineRule="auto"/>
         <w:ind w:left="340"/>
@@ -1383,14 +1383,14 @@
             <w:sz w:val="23"/>
             <w:color w:val="000000"/>
           </w:rPr>
-          <w:t xml:space="preserve">	13</w:t>
+          <w:t xml:space="preserve">	12</w:t>
         </w:r>
       </w:hyperlink>
     </w:p>
     <w:p>
       <w:pPr>
         <w:tabs>
-          <w:tab w:pos="9071" w:val="right" w:leader="dot"/>
+          <w:tab w:pos="8617" w:val="right" w:leader="dot"/>
         </w:tabs>
         <w:spacing w:before="20" w:after="40" w:line="300" w:lineRule="auto"/>
         <w:ind w:left="340"/>
@@ -1412,14 +1412,14 @@
             <w:sz w:val="23"/>
             <w:color w:val="000000"/>
           </w:rPr>
-          <w:t xml:space="preserve">	14</w:t>
+          <w:t xml:space="preserve">	13</w:t>
         </w:r>
       </w:hyperlink>
     </w:p>
     <w:p>
       <w:pPr>
         <w:tabs>
-          <w:tab w:pos="9071" w:val="right" w:leader="dot"/>
+          <w:tab w:pos="8617" w:val="right" w:leader="dot"/>
         </w:tabs>
         <w:spacing w:before="20" w:after="40" w:line="300" w:lineRule="auto"/>
         <w:ind w:left="340"/>
@@ -1441,14 +1441,14 @@
             <w:sz w:val="23"/>
             <w:color w:val="000000"/>
           </w:rPr>
-          <w:t xml:space="preserve">	14</w:t>
+          <w:t xml:space="preserve">	13</w:t>
         </w:r>
       </w:hyperlink>
     </w:p>
     <w:p>
       <w:pPr>
         <w:tabs>
-          <w:tab w:pos="9071" w:val="right" w:leader="dot"/>
+          <w:tab w:pos="8617" w:val="right" w:leader="dot"/>
         </w:tabs>
         <w:spacing w:before="20" w:after="40" w:line="300" w:lineRule="auto"/>
         <w:ind w:left="340"/>
@@ -1470,14 +1470,14 @@
             <w:sz w:val="23"/>
             <w:color w:val="000000"/>
           </w:rPr>
-          <w:t xml:space="preserve">	14</w:t>
+          <w:t xml:space="preserve">	13</w:t>
         </w:r>
       </w:hyperlink>
     </w:p>
     <w:p>
       <w:pPr>
         <w:tabs>
-          <w:tab w:pos="9071" w:val="right" w:leader="dot"/>
+          <w:tab w:pos="8617" w:val="right" w:leader="dot"/>
         </w:tabs>
         <w:spacing w:before="20" w:after="40" w:line="300" w:lineRule="auto"/>
         <w:ind w:left="340"/>
@@ -1499,14 +1499,14 @@
             <w:sz w:val="23"/>
             <w:color w:val="000000"/>
           </w:rPr>
-          <w:t xml:space="preserve">	15</w:t>
+          <w:t xml:space="preserve">	14</w:t>
         </w:r>
       </w:hyperlink>
     </w:p>
     <w:p>
       <w:pPr>
         <w:tabs>
-          <w:tab w:pos="9071" w:val="right" w:leader="dot"/>
+          <w:tab w:pos="8617" w:val="right" w:leader="dot"/>
         </w:tabs>
         <w:spacing w:before="20" w:after="40" w:line="300" w:lineRule="auto"/>
         <w:ind w:left="340"/>
@@ -1528,14 +1528,14 @@
             <w:sz w:val="23"/>
             <w:color w:val="000000"/>
           </w:rPr>
-          <w:t xml:space="preserve">	16</w:t>
+          <w:t xml:space="preserve">	15</w:t>
         </w:r>
       </w:hyperlink>
     </w:p>
     <w:p>
       <w:pPr>
         <w:tabs>
-          <w:tab w:pos="9071" w:val="right" w:leader="dot"/>
+          <w:tab w:pos="8617" w:val="right" w:leader="dot"/>
         </w:tabs>
         <w:spacing w:before="20" w:after="40" w:line="300" w:lineRule="auto"/>
         <w:ind w:left="340"/>
@@ -1557,14 +1557,14 @@
             <w:sz w:val="23"/>
             <w:color w:val="000000"/>
           </w:rPr>
-          <w:t xml:space="preserve">	16</w:t>
+          <w:t xml:space="preserve">	15</w:t>
         </w:r>
       </w:hyperlink>
     </w:p>
     <w:p>
       <w:pPr>
         <w:tabs>
-          <w:tab w:pos="9071" w:val="right" w:leader="dot"/>
+          <w:tab w:pos="8957" w:val="right" w:leader="dot"/>
         </w:tabs>
         <w:spacing w:before="60" w:after="40" w:line="300" w:lineRule="auto"/>
       </w:pPr>
@@ -1587,14 +1587,14 @@
             <w:b/>
             <w:color w:val="000000"/>
           </w:rPr>
-          <w:t xml:space="preserve">	16</w:t>
+          <w:t xml:space="preserve">	15</w:t>
         </w:r>
       </w:hyperlink>
     </w:p>
     <w:p>
       <w:pPr>
         <w:tabs>
-          <w:tab w:pos="9071" w:val="right" w:leader="dot"/>
+          <w:tab w:pos="8617" w:val="right" w:leader="dot"/>
         </w:tabs>
         <w:spacing w:before="20" w:after="40" w:line="300" w:lineRule="auto"/>
         <w:ind w:left="340"/>
@@ -1616,14 +1616,14 @@
             <w:sz w:val="23"/>
             <w:color w:val="000000"/>
           </w:rPr>
-          <w:t xml:space="preserve">	16</w:t>
+          <w:t xml:space="preserve">	15</w:t>
         </w:r>
       </w:hyperlink>
     </w:p>
     <w:p>
       <w:pPr>
         <w:tabs>
-          <w:tab w:pos="9071" w:val="right" w:leader="dot"/>
+          <w:tab w:pos="8617" w:val="right" w:leader="dot"/>
         </w:tabs>
         <w:spacing w:before="20" w:after="40" w:line="300" w:lineRule="auto"/>
         <w:ind w:left="340"/>
@@ -1645,14 +1645,14 @@
             <w:sz w:val="23"/>
             <w:color w:val="000000"/>
           </w:rPr>
-          <w:t xml:space="preserve">	17</w:t>
+          <w:t xml:space="preserve">	16</w:t>
         </w:r>
       </w:hyperlink>
     </w:p>
     <w:p>
       <w:pPr>
         <w:tabs>
-          <w:tab w:pos="9071" w:val="right" w:leader="dot"/>
+          <w:tab w:pos="8617" w:val="right" w:leader="dot"/>
         </w:tabs>
         <w:spacing w:before="20" w:after="40" w:line="300" w:lineRule="auto"/>
         <w:ind w:left="340"/>
@@ -1674,14 +1674,14 @@
             <w:sz w:val="23"/>
             <w:color w:val="000000"/>
           </w:rPr>
-          <w:t xml:space="preserve">	19</w:t>
+          <w:t xml:space="preserve">	18</w:t>
         </w:r>
       </w:hyperlink>
     </w:p>
     <w:p>
       <w:pPr>
         <w:tabs>
-          <w:tab w:pos="9071" w:val="right" w:leader="dot"/>
+          <w:tab w:pos="8617" w:val="right" w:leader="dot"/>
         </w:tabs>
         <w:spacing w:before="20" w:after="40" w:line="300" w:lineRule="auto"/>
         <w:ind w:left="340"/>
@@ -1703,14 +1703,14 @@
             <w:sz w:val="23"/>
             <w:color w:val="000000"/>
           </w:rPr>
-          <w:t xml:space="preserve">	20</w:t>
+          <w:t xml:space="preserve">	19</w:t>
         </w:r>
       </w:hyperlink>
     </w:p>
     <w:p>
       <w:pPr>
         <w:tabs>
-          <w:tab w:pos="9071" w:val="right" w:leader="dot"/>
+          <w:tab w:pos="8617" w:val="right" w:leader="dot"/>
         </w:tabs>
         <w:spacing w:before="20" w:after="40" w:line="300" w:lineRule="auto"/>
         <w:ind w:left="340"/>
@@ -1732,14 +1732,14 @@
             <w:sz w:val="23"/>
             <w:color w:val="000000"/>
           </w:rPr>
-          <w:t xml:space="preserve">	20</w:t>
+          <w:t xml:space="preserve">	19</w:t>
         </w:r>
       </w:hyperlink>
     </w:p>
     <w:p>
       <w:pPr>
         <w:tabs>
-          <w:tab w:pos="9071" w:val="right" w:leader="dot"/>
+          <w:tab w:pos="8617" w:val="right" w:leader="dot"/>
         </w:tabs>
         <w:spacing w:before="20" w:after="40" w:line="300" w:lineRule="auto"/>
         <w:ind w:left="340"/>
@@ -1761,14 +1761,14 @@
             <w:sz w:val="23"/>
             <w:color w:val="000000"/>
           </w:rPr>
-          <w:t xml:space="preserve">	22</w:t>
+          <w:t xml:space="preserve">	21</w:t>
         </w:r>
       </w:hyperlink>
     </w:p>
     <w:p>
       <w:pPr>
         <w:tabs>
-          <w:tab w:pos="9071" w:val="right" w:leader="dot"/>
+          <w:tab w:pos="8957" w:val="right" w:leader="dot"/>
         </w:tabs>
         <w:spacing w:before="60" w:after="40" w:line="300" w:lineRule="auto"/>
       </w:pPr>
@@ -1791,14 +1791,14 @@
             <w:b/>
             <w:color w:val="000000"/>
           </w:rPr>
-          <w:t xml:space="preserve">	22</w:t>
+          <w:t xml:space="preserve">	21</w:t>
         </w:r>
       </w:hyperlink>
     </w:p>
     <w:p>
       <w:pPr>
         <w:tabs>
-          <w:tab w:pos="9071" w:val="right" w:leader="dot"/>
+          <w:tab w:pos="8617" w:val="right" w:leader="dot"/>
         </w:tabs>
         <w:spacing w:before="20" w:after="40" w:line="300" w:lineRule="auto"/>
         <w:ind w:left="340"/>
@@ -1820,14 +1820,14 @@
             <w:sz w:val="23"/>
             <w:color w:val="000000"/>
           </w:rPr>
-          <w:t xml:space="preserve">	22</w:t>
+          <w:t xml:space="preserve">	21</w:t>
         </w:r>
       </w:hyperlink>
     </w:p>
     <w:p>
       <w:pPr>
         <w:tabs>
-          <w:tab w:pos="9071" w:val="right" w:leader="dot"/>
+          <w:tab w:pos="8617" w:val="right" w:leader="dot"/>
         </w:tabs>
         <w:spacing w:before="20" w:after="40" w:line="300" w:lineRule="auto"/>
         <w:ind w:left="340"/>
@@ -1849,14 +1849,14 @@
             <w:sz w:val="23"/>
             <w:color w:val="000000"/>
           </w:rPr>
-          <w:t xml:space="preserve">	23</w:t>
+          <w:t xml:space="preserve">	22</w:t>
         </w:r>
       </w:hyperlink>
     </w:p>
     <w:p>
       <w:pPr>
         <w:tabs>
-          <w:tab w:pos="9071" w:val="right" w:leader="dot"/>
+          <w:tab w:pos="8617" w:val="right" w:leader="dot"/>
         </w:tabs>
         <w:spacing w:before="20" w:after="40" w:line="300" w:lineRule="auto"/>
         <w:ind w:left="340"/>
@@ -1878,14 +1878,14 @@
             <w:sz w:val="23"/>
             <w:color w:val="000000"/>
           </w:rPr>
-          <w:t xml:space="preserve">	24</w:t>
+          <w:t xml:space="preserve">	23</w:t>
         </w:r>
       </w:hyperlink>
     </w:p>
     <w:p>
       <w:pPr>
         <w:tabs>
-          <w:tab w:pos="9071" w:val="right" w:leader="dot"/>
+          <w:tab w:pos="8617" w:val="right" w:leader="dot"/>
         </w:tabs>
         <w:spacing w:before="20" w:after="40" w:line="300" w:lineRule="auto"/>
         <w:ind w:left="340"/>
@@ -1907,14 +1907,14 @@
             <w:sz w:val="23"/>
             <w:color w:val="000000"/>
           </w:rPr>
-          <w:t xml:space="preserve">	24</w:t>
+          <w:t xml:space="preserve">	23</w:t>
         </w:r>
       </w:hyperlink>
     </w:p>
     <w:p>
       <w:pPr>
         <w:tabs>
-          <w:tab w:pos="9071" w:val="right" w:leader="dot"/>
+          <w:tab w:pos="8617" w:val="right" w:leader="dot"/>
         </w:tabs>
         <w:spacing w:before="20" w:after="40" w:line="300" w:lineRule="auto"/>
         <w:ind w:left="340"/>
@@ -1936,14 +1936,14 @@
             <w:sz w:val="23"/>
             <w:color w:val="000000"/>
           </w:rPr>
-          <w:t xml:space="preserve">	25</w:t>
+          <w:t xml:space="preserve">	24</w:t>
         </w:r>
       </w:hyperlink>
     </w:p>
     <w:p>
       <w:pPr>
         <w:tabs>
-          <w:tab w:pos="9071" w:val="right" w:leader="dot"/>
+          <w:tab w:pos="8617" w:val="right" w:leader="dot"/>
         </w:tabs>
         <w:spacing w:before="20" w:after="40" w:line="300" w:lineRule="auto"/>
         <w:ind w:left="340"/>
@@ -1965,14 +1965,14 @@
             <w:sz w:val="23"/>
             <w:color w:val="000000"/>
           </w:rPr>
-          <w:t xml:space="preserve">	25</w:t>
+          <w:t xml:space="preserve">	24</w:t>
         </w:r>
       </w:hyperlink>
     </w:p>
     <w:p>
       <w:pPr>
         <w:tabs>
-          <w:tab w:pos="9071" w:val="right" w:leader="dot"/>
+          <w:tab w:pos="8617" w:val="right" w:leader="dot"/>
         </w:tabs>
         <w:spacing w:before="20" w:after="40" w:line="300" w:lineRule="auto"/>
         <w:ind w:left="340"/>
@@ -1994,14 +1994,14 @@
             <w:sz w:val="23"/>
             <w:color w:val="000000"/>
           </w:rPr>
-          <w:t xml:space="preserve">	26</w:t>
+          <w:t xml:space="preserve">	25</w:t>
         </w:r>
       </w:hyperlink>
     </w:p>
     <w:p>
       <w:pPr>
         <w:tabs>
-          <w:tab w:pos="9071" w:val="right" w:leader="dot"/>
+          <w:tab w:pos="8957" w:val="right" w:leader="dot"/>
         </w:tabs>
         <w:spacing w:before="60" w:after="40" w:line="300" w:lineRule="auto"/>
       </w:pPr>
@@ -2024,14 +2024,14 @@
             <w:b/>
             <w:color w:val="000000"/>
           </w:rPr>
-          <w:t xml:space="preserve">	26</w:t>
+          <w:t xml:space="preserve">	25</w:t>
         </w:r>
       </w:hyperlink>
     </w:p>
     <w:p>
       <w:pPr>
         <w:tabs>
-          <w:tab w:pos="9071" w:val="right" w:leader="dot"/>
+          <w:tab w:pos="8617" w:val="right" w:leader="dot"/>
         </w:tabs>
         <w:spacing w:before="20" w:after="40" w:line="300" w:lineRule="auto"/>
         <w:ind w:left="340"/>
@@ -2053,14 +2053,14 @@
             <w:sz w:val="23"/>
             <w:color w:val="000000"/>
           </w:rPr>
-          <w:t xml:space="preserve">	26</w:t>
+          <w:t xml:space="preserve">	25</w:t>
         </w:r>
       </w:hyperlink>
     </w:p>
     <w:p>
       <w:pPr>
         <w:tabs>
-          <w:tab w:pos="9071" w:val="right" w:leader="dot"/>
+          <w:tab w:pos="8617" w:val="right" w:leader="dot"/>
         </w:tabs>
         <w:spacing w:before="20" w:after="40" w:line="300" w:lineRule="auto"/>
         <w:ind w:left="340"/>
@@ -2082,14 +2082,14 @@
             <w:sz w:val="23"/>
             <w:color w:val="000000"/>
           </w:rPr>
-          <w:t xml:space="preserve">	26</w:t>
+          <w:t xml:space="preserve">	25</w:t>
         </w:r>
       </w:hyperlink>
     </w:p>
     <w:p>
       <w:pPr>
         <w:tabs>
-          <w:tab w:pos="9071" w:val="right" w:leader="dot"/>
+          <w:tab w:pos="8617" w:val="right" w:leader="dot"/>
         </w:tabs>
         <w:spacing w:before="20" w:after="40" w:line="300" w:lineRule="auto"/>
         <w:ind w:left="340"/>
@@ -2111,14 +2111,14 @@
             <w:sz w:val="23"/>
             <w:color w:val="000000"/>
           </w:rPr>
-          <w:t xml:space="preserve">	27</w:t>
+          <w:t xml:space="preserve">	26</w:t>
         </w:r>
       </w:hyperlink>
     </w:p>
     <w:p>
       <w:pPr>
         <w:tabs>
-          <w:tab w:pos="9071" w:val="right" w:leader="dot"/>
+          <w:tab w:pos="8617" w:val="right" w:leader="dot"/>
         </w:tabs>
         <w:spacing w:before="20" w:after="40" w:line="300" w:lineRule="auto"/>
         <w:ind w:left="340"/>
@@ -2140,14 +2140,14 @@
             <w:sz w:val="23"/>
             <w:color w:val="000000"/>
           </w:rPr>
-          <w:t xml:space="preserve">	28</w:t>
+          <w:t xml:space="preserve">	27</w:t>
         </w:r>
       </w:hyperlink>
     </w:p>
     <w:p>
       <w:pPr>
         <w:tabs>
-          <w:tab w:pos="9071" w:val="right" w:leader="dot"/>
+          <w:tab w:pos="8617" w:val="right" w:leader="dot"/>
         </w:tabs>
         <w:spacing w:before="20" w:after="40" w:line="300" w:lineRule="auto"/>
         <w:ind w:left="340"/>
@@ -2169,14 +2169,14 @@
             <w:sz w:val="23"/>
             <w:color w:val="000000"/>
           </w:rPr>
-          <w:t xml:space="preserve">	28</w:t>
+          <w:t xml:space="preserve">	27</w:t>
         </w:r>
       </w:hyperlink>
     </w:p>
     <w:p>
       <w:pPr>
         <w:tabs>
-          <w:tab w:pos="9071" w:val="right" w:leader="dot"/>
+          <w:tab w:pos="8957" w:val="right" w:leader="dot"/>
         </w:tabs>
         <w:spacing w:before="60" w:after="40" w:line="300" w:lineRule="auto"/>
       </w:pPr>
@@ -2199,14 +2199,14 @@
             <w:b/>
             <w:color w:val="000000"/>
           </w:rPr>
-          <w:t xml:space="preserve">	28</w:t>
+          <w:t xml:space="preserve">	27</w:t>
         </w:r>
       </w:hyperlink>
     </w:p>
     <w:p>
       <w:pPr>
         <w:tabs>
-          <w:tab w:pos="9071" w:val="right" w:leader="dot"/>
+          <w:tab w:pos="8617" w:val="right" w:leader="dot"/>
         </w:tabs>
         <w:spacing w:before="20" w:after="40" w:line="300" w:lineRule="auto"/>
         <w:ind w:left="340"/>
@@ -2228,14 +2228,14 @@
             <w:sz w:val="23"/>
             <w:color w:val="000000"/>
           </w:rPr>
-          <w:t xml:space="preserve">	29</w:t>
+          <w:t xml:space="preserve">	28</w:t>
         </w:r>
       </w:hyperlink>
     </w:p>
     <w:p>
       <w:pPr>
         <w:tabs>
-          <w:tab w:pos="9071" w:val="right" w:leader="dot"/>
+          <w:tab w:pos="8617" w:val="right" w:leader="dot"/>
         </w:tabs>
         <w:spacing w:before="20" w:after="40" w:line="300" w:lineRule="auto"/>
         <w:ind w:left="340"/>
@@ -2257,7 +2257,7 @@
             <w:sz w:val="23"/>
             <w:color w:val="000000"/>
           </w:rPr>
-          <w:t xml:space="preserve">	29</w:t>
+          <w:t xml:space="preserve">	28</w:t>
         </w:r>
       </w:hyperlink>
     </w:p>
@@ -2618,7 +2618,7 @@
       <w:pPr>
         <w:spacing w:before="20" w:after="40" w:line="300" w:lineRule="auto"/>
         <w:ind w:left="720" w:hanging="283"/>
-        <w:jc w:val="both"/>
+        <w:jc w:val="left"/>
       </w:pPr>
       <w:r>
         <w:rPr>
@@ -2654,7 +2654,7 @@
       <w:pPr>
         <w:spacing w:before="20" w:after="40" w:line="300" w:lineRule="auto"/>
         <w:ind w:left="720" w:hanging="283"/>
-        <w:jc w:val="both"/>
+        <w:jc w:val="left"/>
       </w:pPr>
       <w:r>
         <w:rPr>
@@ -2784,7 +2784,7 @@
       <w:pPr>
         <w:spacing w:before="20" w:after="40" w:line="300" w:lineRule="auto"/>
         <w:ind w:left="720" w:hanging="283"/>
-        <w:jc w:val="both"/>
+        <w:jc w:val="left"/>
       </w:pPr>
       <w:r>
         <w:rPr>
@@ -2810,7 +2810,7 @@
       <w:pPr>
         <w:spacing w:before="20" w:after="40" w:line="300" w:lineRule="auto"/>
         <w:ind w:left="720" w:hanging="283"/>
-        <w:jc w:val="both"/>
+        <w:jc w:val="left"/>
       </w:pPr>
       <w:r>
         <w:rPr>
@@ -2836,7 +2836,7 @@
       <w:pPr>
         <w:spacing w:before="20" w:after="40" w:line="300" w:lineRule="auto"/>
         <w:ind w:left="720" w:hanging="283"/>
-        <w:jc w:val="both"/>
+        <w:jc w:val="left"/>
       </w:pPr>
       <w:r>
         <w:rPr>
@@ -2862,7 +2862,7 @@
       <w:pPr>
         <w:spacing w:before="20" w:after="40" w:line="300" w:lineRule="auto"/>
         <w:ind w:left="720" w:hanging="283"/>
-        <w:jc w:val="both"/>
+        <w:jc w:val="left"/>
       </w:pPr>
       <w:r>
         <w:rPr>
@@ -2888,7 +2888,7 @@
       <w:pPr>
         <w:spacing w:before="20" w:after="40" w:line="300" w:lineRule="auto"/>
         <w:ind w:left="720" w:hanging="283"/>
-        <w:jc w:val="both"/>
+        <w:jc w:val="left"/>
       </w:pPr>
       <w:r>
         <w:rPr>
@@ -2914,7 +2914,7 @@
       <w:pPr>
         <w:spacing w:before="20" w:after="40" w:line="300" w:lineRule="auto"/>
         <w:ind w:left="720" w:hanging="283"/>
-        <w:jc w:val="both"/>
+        <w:jc w:val="left"/>
       </w:pPr>
       <w:r>
         <w:rPr>
@@ -2940,7 +2940,7 @@
       <w:pPr>
         <w:spacing w:before="20" w:after="40" w:line="300" w:lineRule="auto"/>
         <w:ind w:left="720" w:hanging="283"/>
-        <w:jc w:val="both"/>
+        <w:jc w:val="left"/>
       </w:pPr>
       <w:r>
         <w:rPr>
@@ -2976,7 +2976,7 @@
           <w:color w:val="000000"/>
           <w:sz w:val="24"/>
         </w:rPr>
-        <w:t>Bản nháp hiện tại đã mô tả quy trình tiền xử lý, xử lý mất cân bằng và ba họ mô hình. Các kết luận thực nghiệm vẫn được giới hạn trong tập kiểm tra PaySim đã xử lý và sẽ được rà soát lại trước khi hoàn thiện báo cáo cuối.</w:t>
+        <w:t>Báo cáo đã trình bày quy trình tiền xử lý, xử lý mất cân bằng và cả ba họ mô hình. Các kết luận thực nghiệm được giới hạn trong tập kiểm tra PaySim đã xử lý, không suy rộng sang dữ liệu giao dịch thực tế.</w:t>
       </w:r>
     </w:p>
     <w:p>
@@ -3003,7 +3003,7 @@
       <w:pPr>
         <w:spacing w:before="20" w:after="40" w:line="300" w:lineRule="auto"/>
         <w:ind w:left="720" w:hanging="283"/>
-        <w:jc w:val="both"/>
+        <w:jc w:val="left"/>
       </w:pPr>
       <w:r>
         <w:rPr>
@@ -3039,7 +3039,7 @@
       <w:pPr>
         <w:spacing w:before="20" w:after="40" w:line="300" w:lineRule="auto"/>
         <w:ind w:left="720" w:hanging="283"/>
-        <w:jc w:val="both"/>
+        <w:jc w:val="left"/>
       </w:pPr>
       <w:r>
         <w:rPr>
@@ -3115,7 +3115,7 @@
       <w:pPr>
         <w:spacing w:before="20" w:after="40" w:line="300" w:lineRule="auto"/>
         <w:ind w:left="720" w:hanging="283"/>
-        <w:jc w:val="both"/>
+        <w:jc w:val="left"/>
       </w:pPr>
       <w:r>
         <w:rPr>
@@ -3191,7 +3191,7 @@
       <w:pPr>
         <w:spacing w:before="20" w:after="40" w:line="300" w:lineRule="auto"/>
         <w:ind w:left="720" w:hanging="283"/>
-        <w:jc w:val="both"/>
+        <w:jc w:val="left"/>
       </w:pPr>
       <w:r>
         <w:rPr>
@@ -3227,7 +3227,7 @@
       <w:pPr>
         <w:spacing w:before="20" w:after="40" w:line="300" w:lineRule="auto"/>
         <w:ind w:left="720" w:hanging="283"/>
-        <w:jc w:val="both"/>
+        <w:jc w:val="left"/>
       </w:pPr>
       <w:r>
         <w:rPr>
@@ -3263,7 +3263,7 @@
       <w:pPr>
         <w:spacing w:before="20" w:after="40" w:line="300" w:lineRule="auto"/>
         <w:ind w:left="720" w:hanging="283"/>
-        <w:jc w:val="both"/>
+        <w:jc w:val="left"/>
       </w:pPr>
       <w:r>
         <w:rPr>
@@ -3319,7 +3319,7 @@
       <w:pPr>
         <w:spacing w:before="20" w:after="40" w:line="300" w:lineRule="auto"/>
         <w:ind w:left="720" w:hanging="283"/>
-        <w:jc w:val="both"/>
+        <w:jc w:val="left"/>
       </w:pPr>
       <w:r>
         <w:rPr>
@@ -3345,7 +3345,7 @@
       <w:pPr>
         <w:spacing w:before="20" w:after="40" w:line="300" w:lineRule="auto"/>
         <w:ind w:left="720" w:hanging="283"/>
-        <w:jc w:val="both"/>
+        <w:jc w:val="left"/>
       </w:pPr>
       <w:r>
         <w:rPr>
@@ -3371,7 +3371,7 @@
       <w:pPr>
         <w:spacing w:before="20" w:after="40" w:line="300" w:lineRule="auto"/>
         <w:ind w:left="720" w:hanging="283"/>
-        <w:jc w:val="both"/>
+        <w:jc w:val="left"/>
       </w:pPr>
       <w:r>
         <w:rPr>
@@ -3397,7 +3397,7 @@
       <w:pPr>
         <w:spacing w:before="20" w:after="40" w:line="300" w:lineRule="auto"/>
         <w:ind w:left="720" w:hanging="283"/>
-        <w:jc w:val="both"/>
+        <w:jc w:val="left"/>
       </w:pPr>
       <w:r>
         <w:rPr>
@@ -3423,7 +3423,7 @@
       <w:pPr>
         <w:spacing w:before="20" w:after="40" w:line="300" w:lineRule="auto"/>
         <w:ind w:left="720" w:hanging="283"/>
-        <w:jc w:val="both"/>
+        <w:jc w:val="left"/>
       </w:pPr>
       <w:r>
         <w:rPr>
@@ -3449,7 +3449,7 @@
       <w:pPr>
         <w:spacing w:before="20" w:after="40" w:line="300" w:lineRule="auto"/>
         <w:ind w:left="720" w:hanging="283"/>
-        <w:jc w:val="both"/>
+        <w:jc w:val="left"/>
       </w:pPr>
       <w:r>
         <w:rPr>
@@ -3475,7 +3475,7 @@
       <w:pPr>
         <w:spacing w:before="20" w:after="40" w:line="300" w:lineRule="auto"/>
         <w:ind w:left="720" w:hanging="283"/>
-        <w:jc w:val="both"/>
+        <w:jc w:val="left"/>
       </w:pPr>
       <w:r>
         <w:rPr>
@@ -3501,7 +3501,7 @@
       <w:pPr>
         <w:spacing w:before="20" w:after="40" w:line="300" w:lineRule="auto"/>
         <w:ind w:left="720" w:hanging="283"/>
-        <w:jc w:val="both"/>
+        <w:jc w:val="left"/>
       </w:pPr>
       <w:r>
         <w:rPr>
@@ -3584,7 +3584,7 @@
       <w:pPr>
         <w:spacing w:before="20" w:after="40" w:line="300" w:lineRule="auto"/>
         <w:ind w:left="720" w:hanging="283"/>
-        <w:jc w:val="both"/>
+        <w:jc w:val="left"/>
       </w:pPr>
       <w:r>
         <w:rPr>
@@ -3610,7 +3610,7 @@
       <w:pPr>
         <w:spacing w:before="20" w:after="40" w:line="300" w:lineRule="auto"/>
         <w:ind w:left="720" w:hanging="283"/>
-        <w:jc w:val="both"/>
+        <w:jc w:val="left"/>
       </w:pPr>
       <w:r>
         <w:rPr>
@@ -3745,7 +3745,7 @@
       <w:pPr>
         <w:spacing w:before="20" w:after="40" w:line="300" w:lineRule="auto"/>
         <w:ind w:left="720" w:hanging="283"/>
-        <w:jc w:val="both"/>
+        <w:jc w:val="left"/>
       </w:pPr>
       <w:r>
         <w:rPr>
@@ -3791,7 +3791,7 @@
       <w:pPr>
         <w:spacing w:before="20" w:after="40" w:line="300" w:lineRule="auto"/>
         <w:ind w:left="720" w:hanging="283"/>
-        <w:jc w:val="both"/>
+        <w:jc w:val="left"/>
       </w:pPr>
       <w:r>
         <w:rPr>
@@ -3817,7 +3817,7 @@
       <w:pPr>
         <w:spacing w:before="20" w:after="40" w:line="300" w:lineRule="auto"/>
         <w:ind w:left="720" w:hanging="283"/>
-        <w:jc w:val="both"/>
+        <w:jc w:val="left"/>
       </w:pPr>
       <w:r>
         <w:rPr>
@@ -3843,7 +3843,7 @@
       <w:pPr>
         <w:spacing w:before="20" w:after="40" w:line="300" w:lineRule="auto"/>
         <w:ind w:left="720" w:hanging="283"/>
-        <w:jc w:val="both"/>
+        <w:jc w:val="left"/>
       </w:pPr>
       <w:r>
         <w:rPr>
@@ -3869,7 +3869,7 @@
       <w:pPr>
         <w:spacing w:before="20" w:after="40" w:line="300" w:lineRule="auto"/>
         <w:ind w:left="720" w:hanging="283"/>
-        <w:jc w:val="both"/>
+        <w:jc w:val="left"/>
       </w:pPr>
       <w:r>
         <w:rPr>
@@ -3895,7 +3895,7 @@
       <w:pPr>
         <w:spacing w:before="20" w:after="40" w:line="300" w:lineRule="auto"/>
         <w:ind w:left="720" w:hanging="283"/>
-        <w:jc w:val="both"/>
+        <w:jc w:val="left"/>
       </w:pPr>
       <w:r>
         <w:rPr>
@@ -3921,7 +3921,7 @@
       <w:pPr>
         <w:spacing w:before="20" w:after="40" w:line="300" w:lineRule="auto"/>
         <w:ind w:left="720" w:hanging="283"/>
-        <w:jc w:val="both"/>
+        <w:jc w:val="left"/>
       </w:pPr>
       <w:r>
         <w:rPr>
@@ -3947,7 +3947,7 @@
       <w:pPr>
         <w:spacing w:before="20" w:after="40" w:line="300" w:lineRule="auto"/>
         <w:ind w:left="720" w:hanging="283"/>
-        <w:jc w:val="both"/>
+        <w:jc w:val="left"/>
       </w:pPr>
       <w:r>
         <w:rPr>
@@ -4011,7 +4011,7 @@
       <w:pPr>
         <w:spacing w:before="20" w:after="40" w:line="300" w:lineRule="auto"/>
         <w:ind w:left="720" w:hanging="283"/>
-        <w:jc w:val="both"/>
+        <w:jc w:val="left"/>
       </w:pPr>
       <w:r>
         <w:rPr>
@@ -4077,7 +4077,7 @@
       <w:pPr>
         <w:spacing w:before="20" w:after="40" w:line="300" w:lineRule="auto"/>
         <w:ind w:left="720" w:hanging="283"/>
-        <w:jc w:val="both"/>
+        <w:jc w:val="left"/>
       </w:pPr>
       <w:r>
         <w:rPr>
@@ -4103,7 +4103,7 @@
       <w:pPr>
         <w:spacing w:before="20" w:after="40" w:line="300" w:lineRule="auto"/>
         <w:ind w:left="720" w:hanging="283"/>
-        <w:jc w:val="both"/>
+        <w:jc w:val="left"/>
       </w:pPr>
       <w:r>
         <w:rPr>
@@ -4396,7 +4396,7 @@
       <w:pPr>
         <w:spacing w:before="20" w:after="40" w:line="300" w:lineRule="auto"/>
         <w:ind w:left="720" w:hanging="283"/>
-        <w:jc w:val="both"/>
+        <w:jc w:val="left"/>
       </w:pPr>
       <w:r>
         <w:rPr>
@@ -4422,7 +4422,7 @@
       <w:pPr>
         <w:spacing w:before="20" w:after="40" w:line="300" w:lineRule="auto"/>
         <w:ind w:left="720" w:hanging="283"/>
-        <w:jc w:val="both"/>
+        <w:jc w:val="left"/>
       </w:pPr>
       <w:r>
         <w:rPr>
@@ -4448,7 +4448,7 @@
       <w:pPr>
         <w:spacing w:before="20" w:after="40" w:line="300" w:lineRule="auto"/>
         <w:ind w:left="720" w:hanging="283"/>
-        <w:jc w:val="both"/>
+        <w:jc w:val="left"/>
       </w:pPr>
       <w:r>
         <w:rPr>
@@ -4474,7 +4474,7 @@
       <w:pPr>
         <w:spacing w:before="20" w:after="40" w:line="300" w:lineRule="auto"/>
         <w:ind w:left="720" w:hanging="283"/>
-        <w:jc w:val="both"/>
+        <w:jc w:val="left"/>
       </w:pPr>
       <w:r>
         <w:rPr>
@@ -4500,7 +4500,7 @@
       <w:pPr>
         <w:spacing w:before="20" w:after="40" w:line="300" w:lineRule="auto"/>
         <w:ind w:left="720" w:hanging="283"/>
-        <w:jc w:val="both"/>
+        <w:jc w:val="left"/>
       </w:pPr>
       <w:r>
         <w:rPr>
@@ -4526,7 +4526,7 @@
       <w:pPr>
         <w:spacing w:before="20" w:after="40" w:line="300" w:lineRule="auto"/>
         <w:ind w:left="720" w:hanging="283"/>
-        <w:jc w:val="both"/>
+        <w:jc w:val="left"/>
       </w:pPr>
       <w:r>
         <w:rPr>
@@ -4606,7 +4606,7 @@
       <w:pPr>
         <w:spacing w:before="20" w:after="40" w:line="300" w:lineRule="auto"/>
         <w:ind w:left="720" w:hanging="283"/>
-        <w:jc w:val="both"/>
+        <w:jc w:val="left"/>
       </w:pPr>
       <w:r>
         <w:rPr>
@@ -4632,7 +4632,7 @@
       <w:pPr>
         <w:spacing w:before="20" w:after="40" w:line="300" w:lineRule="auto"/>
         <w:ind w:left="720" w:hanging="283"/>
-        <w:jc w:val="both"/>
+        <w:jc w:val="left"/>
       </w:pPr>
       <w:r>
         <w:rPr>
@@ -4658,7 +4658,7 @@
       <w:pPr>
         <w:spacing w:before="20" w:after="40" w:line="300" w:lineRule="auto"/>
         <w:ind w:left="720" w:hanging="283"/>
-        <w:jc w:val="both"/>
+        <w:jc w:val="left"/>
       </w:pPr>
       <w:r>
         <w:rPr>
@@ -9824,7 +9824,7 @@
           <w:color w:val="000000"/>
           <w:sz w:val="26"/>
         </w:rPr>
-        <w:t xml:space="preserve"> để phát hiện gian lận. Quy trình hiện tại vẫn sử dụng các cột số dư và hai đặc trưng sai lệch số dư. Vì vậy, mô hình có thể học tín hiệu phát sinh từ cơ chế cập nhật hoặc hủy giao dịch của bộ mô phỏng. Mục 5.5 cho thấy nhóm đặc trưng này thực sự chiếm phần lớn mức đóng góp của cả Random Forest và XGBoost. Báo cáo xem đây là một nguy cơ ảnh hưởng tính hợp lệ. Phép kiểm tra dứt điểm là huấn luyện lại mô hình sau khi loại nhóm đặc trưng số dư rồi so sánh hiệu năng. Thí nghiệm này nằm ngoài phạm vi bản nháp hiện tại và được ghi nhận như một hướng kiểm chứng cần thực hiện trước khi khẳng định kết quả.</w:t>
+        <w:t xml:space="preserve"> để phát hiện gian lận. Quy trình hiện tại vẫn sử dụng các cột số dư và hai đặc trưng sai lệch số dư. Vì vậy, mô hình có thể học tín hiệu phát sinh từ cơ chế cập nhật hoặc hủy giao dịch của bộ mô phỏng. Mục 5.5 cho thấy nhóm đặc trưng này thực sự chiếm phần lớn mức đóng góp của cả Random Forest và XGBoost. Báo cáo xem đây là một nguy cơ ảnh hưởng tính hợp lệ. Phép kiểm tra dứt điểm là huấn luyện lại mô hình sau khi loại nhóm đặc trưng số dư rồi so sánh hiệu năng. Thí nghiệm này nằm ngoài phạm vi đồ án và được ghi nhận tại Mục 7.4 như hướng kiểm chứng cần thực hiện trước khi khẳng định kết quả.</w:t>
       </w:r>
     </w:p>
     <w:p>
@@ -10036,7 +10036,7 @@
       <w:pPr>
         <w:spacing w:before="20" w:after="40" w:line="300" w:lineRule="auto"/>
         <w:ind w:left="720" w:hanging="283"/>
-        <w:jc w:val="both"/>
+        <w:jc w:val="left"/>
       </w:pPr>
       <w:r>
         <w:rPr>
@@ -10072,7 +10072,7 @@
       <w:pPr>
         <w:spacing w:before="20" w:after="40" w:line="300" w:lineRule="auto"/>
         <w:ind w:left="720" w:hanging="283"/>
-        <w:jc w:val="both"/>
+        <w:jc w:val="left"/>
       </w:pPr>
       <w:r>
         <w:rPr>
@@ -10148,7 +10148,7 @@
       <w:pPr>
         <w:spacing w:before="20" w:after="40" w:line="300" w:lineRule="auto"/>
         <w:ind w:left="720" w:hanging="283"/>
-        <w:jc w:val="both"/>
+        <w:jc w:val="left"/>
       </w:pPr>
       <w:r>
         <w:rPr>
@@ -10184,7 +10184,7 @@
       <w:pPr>
         <w:spacing w:before="20" w:after="40" w:line="300" w:lineRule="auto"/>
         <w:ind w:left="720" w:hanging="283"/>
-        <w:jc w:val="both"/>
+        <w:jc w:val="left"/>
       </w:pPr>
       <w:r>
         <w:rPr>
@@ -10220,7 +10220,7 @@
       <w:pPr>
         <w:spacing w:before="20" w:after="40" w:line="300" w:lineRule="auto"/>
         <w:ind w:left="720" w:hanging="283"/>
-        <w:jc w:val="both"/>
+        <w:jc w:val="left"/>
       </w:pPr>
       <w:r>
         <w:rPr>
@@ -10256,7 +10256,7 @@
       <w:pPr>
         <w:spacing w:before="20" w:after="40" w:line="300" w:lineRule="auto"/>
         <w:ind w:left="720" w:hanging="283"/>
-        <w:jc w:val="both"/>
+        <w:jc w:val="left"/>
       </w:pPr>
       <w:r>
         <w:rPr>
@@ -18013,7 +18013,7 @@
       <w:pPr>
         <w:spacing w:before="20" w:after="40" w:line="300" w:lineRule="auto"/>
         <w:ind w:left="720" w:hanging="283"/>
-        <w:jc w:val="both"/>
+        <w:jc w:val="left"/>
       </w:pPr>
       <w:r>
         <w:rPr>
@@ -18039,7 +18039,7 @@
       <w:pPr>
         <w:spacing w:before="20" w:after="40" w:line="300" w:lineRule="auto"/>
         <w:ind w:left="720" w:hanging="283"/>
-        <w:jc w:val="both"/>
+        <w:jc w:val="left"/>
       </w:pPr>
       <w:r>
         <w:rPr>
@@ -18085,7 +18085,7 @@
       <w:pPr>
         <w:spacing w:before="20" w:after="40" w:line="300" w:lineRule="auto"/>
         <w:ind w:left="720" w:hanging="283"/>
-        <w:jc w:val="both"/>
+        <w:jc w:val="left"/>
       </w:pPr>
       <w:r>
         <w:rPr>
@@ -18151,7 +18151,7 @@
       <w:pPr>
         <w:spacing w:before="20" w:after="40" w:line="300" w:lineRule="auto"/>
         <w:ind w:left="720" w:hanging="283"/>
-        <w:jc w:val="both"/>
+        <w:jc w:val="left"/>
       </w:pPr>
       <w:r>
         <w:rPr>
@@ -18197,7 +18197,7 @@
       <w:pPr>
         <w:spacing w:before="20" w:after="40" w:line="300" w:lineRule="auto"/>
         <w:ind w:left="720" w:hanging="283"/>
-        <w:jc w:val="both"/>
+        <w:jc w:val="left"/>
       </w:pPr>
       <w:r>
         <w:rPr>
@@ -18243,7 +18243,7 @@
       <w:pPr>
         <w:spacing w:before="20" w:after="40" w:line="300" w:lineRule="auto"/>
         <w:ind w:left="720" w:hanging="283"/>
-        <w:jc w:val="both"/>
+        <w:jc w:val="left"/>
       </w:pPr>
       <w:r>
         <w:rPr>
@@ -18289,7 +18289,7 @@
       <w:pPr>
         <w:spacing w:before="20" w:after="40" w:line="300" w:lineRule="auto"/>
         <w:ind w:left="720" w:hanging="283"/>
-        <w:jc w:val="both"/>
+        <w:jc w:val="left"/>
       </w:pPr>
       <w:r>
         <w:rPr>
@@ -18335,7 +18335,7 @@
       <w:pPr>
         <w:spacing w:before="20" w:after="40" w:line="300" w:lineRule="auto"/>
         <w:ind w:left="720" w:hanging="283"/>
-        <w:jc w:val="both"/>
+        <w:jc w:val="left"/>
       </w:pPr>
       <w:r>
         <w:rPr>
@@ -18421,7 +18421,7 @@
       <w:pPr>
         <w:spacing w:before="20" w:after="40" w:line="300" w:lineRule="auto"/>
         <w:ind w:left="720" w:hanging="283"/>
-        <w:jc w:val="both"/>
+        <w:jc w:val="left"/>
       </w:pPr>
       <w:r>
         <w:rPr>
@@ -18467,7 +18467,7 @@
       <w:pPr>
         <w:spacing w:before="20" w:after="40" w:line="300" w:lineRule="auto"/>
         <w:ind w:left="720" w:hanging="283"/>
-        <w:jc w:val="both"/>
+        <w:jc w:val="left"/>
       </w:pPr>
       <w:r>
         <w:rPr>
@@ -18533,7 +18533,7 @@
       <w:pPr>
         <w:spacing w:before="20" w:after="40" w:line="300" w:lineRule="auto"/>
         <w:ind w:left="720" w:hanging="283"/>
-        <w:jc w:val="both"/>
+        <w:jc w:val="left"/>
       </w:pPr>
       <w:r>
         <w:rPr>
@@ -18639,7 +18639,7 @@
       <w:pPr>
         <w:spacing w:before="40" w:after="60" w:line="276" w:lineRule="auto"/>
         <w:ind w:left="454" w:hanging="454"/>
-        <w:jc w:val="both"/>
+        <w:jc w:val="left"/>
       </w:pPr>
       <w:bookmarkStart w:id="1067" w:name="ref_1"/>
       <w:bookmarkEnd w:id="1067"/>
@@ -18679,7 +18679,7 @@
       <w:pPr>
         <w:spacing w:before="40" w:after="60" w:line="276" w:lineRule="auto"/>
         <w:ind w:left="454" w:hanging="454"/>
-        <w:jc w:val="both"/>
+        <w:jc w:val="left"/>
       </w:pPr>
       <w:bookmarkStart w:id="1068" w:name="ref_2"/>
       <w:bookmarkEnd w:id="1068"/>
@@ -18719,7 +18719,7 @@
       <w:pPr>
         <w:spacing w:before="40" w:after="60" w:line="276" w:lineRule="auto"/>
         <w:ind w:left="454" w:hanging="454"/>
-        <w:jc w:val="both"/>
+        <w:jc w:val="left"/>
       </w:pPr>
       <w:bookmarkStart w:id="1069" w:name="ref_3"/>
       <w:bookmarkEnd w:id="1069"/>
@@ -18769,7 +18769,7 @@
       <w:pPr>
         <w:spacing w:before="40" w:after="60" w:line="276" w:lineRule="auto"/>
         <w:ind w:left="454" w:hanging="454"/>
-        <w:jc w:val="both"/>
+        <w:jc w:val="left"/>
       </w:pPr>
       <w:bookmarkStart w:id="1070" w:name="ref_4"/>
       <w:bookmarkEnd w:id="1070"/>
@@ -18809,7 +18809,7 @@
       <w:pPr>
         <w:spacing w:before="40" w:after="60" w:line="276" w:lineRule="auto"/>
         <w:ind w:left="454" w:hanging="454"/>
-        <w:jc w:val="both"/>
+        <w:jc w:val="left"/>
       </w:pPr>
       <w:bookmarkStart w:id="1071" w:name="ref_5"/>
       <w:bookmarkEnd w:id="1071"/>
@@ -18849,7 +18849,7 @@
       <w:pPr>
         <w:spacing w:before="40" w:after="60" w:line="276" w:lineRule="auto"/>
         <w:ind w:left="454" w:hanging="454"/>
-        <w:jc w:val="both"/>
+        <w:jc w:val="left"/>
       </w:pPr>
       <w:bookmarkStart w:id="1072" w:name="ref_6"/>
       <w:bookmarkEnd w:id="1072"/>
@@ -18889,7 +18889,7 @@
       <w:pPr>
         <w:spacing w:before="40" w:after="60" w:line="276" w:lineRule="auto"/>
         <w:ind w:left="454" w:hanging="454"/>
-        <w:jc w:val="both"/>
+        <w:jc w:val="left"/>
       </w:pPr>
       <w:bookmarkStart w:id="1073" w:name="ref_7"/>
       <w:bookmarkEnd w:id="1073"/>
@@ -18929,7 +18929,7 @@
       <w:pPr>
         <w:spacing w:before="40" w:after="60" w:line="276" w:lineRule="auto"/>
         <w:ind w:left="454" w:hanging="454"/>
-        <w:jc w:val="both"/>
+        <w:jc w:val="left"/>
       </w:pPr>
       <w:bookmarkStart w:id="1074" w:name="ref_8"/>
       <w:bookmarkEnd w:id="1074"/>

</xml_diff>

<commit_message>
fix(phase07): sửa ba lỗi OOXML khiến Word hiển thị sai
Kiểm tra trên bản PDF xuất qua Pages không phát hiện được nhóm lỗi này vì
Pages hiển thị dễ tính hơn Word. Phải soi trực tiếp word/document.xml.

1. Mục lục mất dãy dấu chấm dẫn. add_internal_hyperlink ghi ký tự tab thẳng
   vào <w:t>, trong khi lược đồ OOXML yêu cầu phần tử <w:tab/>. Word bỏ qua
   nên số trang không nhảy tới mốc tab và mất hết dấu chấm. Thêm
   _run_content_xml() để tách tab thành <w:tab/>. Kết quả: 66 mốc tab
   dot-leader, 74 <w:tab/>, 0 ký tự tab còn nằm trong <w:t>.

2. Bảng có thể mất toàn bộ đường viền. tblBorders được append vào cuối tblPr,
   sau tblLayout và tblLook, sai thứ tự lược đồ. Chuyển sang
   insert_element_before để nằm đúng vị trí trước tblLayout.

3. Hàng tiêu đề không lặp khi bảng tách trang. trPr đặt tblHeader trước
   cantSplit, ngược thứ tự lược đồ. Đã đổi lại.
</commit_message>
<xml_diff>
--- a/draft/fraud-detection/reports/[Nhom9]_BaoCao_FraudDetection.docx
+++ b/draft/fraud-detection/reports/[Nhom9]_BaoCao_FraudDetection.docx
@@ -364,7 +364,8 @@
             <w:b/>
             <w:color w:val="000000"/>
           </w:rPr>
-          <w:t xml:space="preserve">	1</w:t>
+          <w:tab/>
+          <w:t xml:space="preserve">1</w:t>
         </w:r>
       </w:hyperlink>
     </w:p>
@@ -394,7 +395,8 @@
             <w:b/>
             <w:color w:val="000000"/>
           </w:rPr>
-          <w:t xml:space="preserve">	2</w:t>
+          <w:tab/>
+          <w:t xml:space="preserve">2</w:t>
         </w:r>
       </w:hyperlink>
     </w:p>
@@ -423,7 +425,8 @@
             <w:sz w:val="23"/>
             <w:color w:val="000000"/>
           </w:rPr>
-          <w:t xml:space="preserve">	2</w:t>
+          <w:tab/>
+          <w:t xml:space="preserve">2</w:t>
         </w:r>
       </w:hyperlink>
     </w:p>
@@ -452,7 +455,8 @@
             <w:sz w:val="23"/>
             <w:color w:val="000000"/>
           </w:rPr>
-          <w:t xml:space="preserve">	3</w:t>
+          <w:tab/>
+          <w:t xml:space="preserve">3</w:t>
         </w:r>
       </w:hyperlink>
     </w:p>
@@ -481,7 +485,8 @@
             <w:sz w:val="23"/>
             <w:color w:val="000000"/>
           </w:rPr>
-          <w:t xml:space="preserve">	3</w:t>
+          <w:tab/>
+          <w:t xml:space="preserve">3</w:t>
         </w:r>
       </w:hyperlink>
     </w:p>
@@ -510,7 +515,8 @@
             <w:sz w:val="23"/>
             <w:color w:val="000000"/>
           </w:rPr>
-          <w:t xml:space="preserve">	3</w:t>
+          <w:tab/>
+          <w:t xml:space="preserve">3</w:t>
         </w:r>
       </w:hyperlink>
     </w:p>
@@ -539,7 +545,8 @@
             <w:sz w:val="23"/>
             <w:color w:val="000000"/>
           </w:rPr>
-          <w:t xml:space="preserve">	4</w:t>
+          <w:tab/>
+          <w:t xml:space="preserve">4</w:t>
         </w:r>
       </w:hyperlink>
     </w:p>
@@ -568,7 +575,8 @@
             <w:sz w:val="23"/>
             <w:color w:val="000000"/>
           </w:rPr>
-          <w:t xml:space="preserve">	4</w:t>
+          <w:tab/>
+          <w:t xml:space="preserve">4</w:t>
         </w:r>
       </w:hyperlink>
     </w:p>
@@ -597,7 +605,8 @@
             <w:sz w:val="23"/>
             <w:color w:val="000000"/>
           </w:rPr>
-          <w:t xml:space="preserve">	5</w:t>
+          <w:tab/>
+          <w:t xml:space="preserve">5</w:t>
         </w:r>
       </w:hyperlink>
     </w:p>
@@ -627,7 +636,8 @@
             <w:b/>
             <w:color w:val="000000"/>
           </w:rPr>
-          <w:t xml:space="preserve">	5</w:t>
+          <w:tab/>
+          <w:t xml:space="preserve">5</w:t>
         </w:r>
       </w:hyperlink>
     </w:p>
@@ -656,7 +666,8 @@
             <w:sz w:val="23"/>
             <w:color w:val="000000"/>
           </w:rPr>
-          <w:t xml:space="preserve">	5</w:t>
+          <w:tab/>
+          <w:t xml:space="preserve">5</w:t>
         </w:r>
       </w:hyperlink>
     </w:p>
@@ -685,7 +696,8 @@
             <w:sz w:val="23"/>
             <w:color w:val="000000"/>
           </w:rPr>
-          <w:t xml:space="preserve">	5</w:t>
+          <w:tab/>
+          <w:t xml:space="preserve">5</w:t>
         </w:r>
       </w:hyperlink>
     </w:p>
@@ -714,7 +726,8 @@
             <w:sz w:val="23"/>
             <w:color w:val="000000"/>
           </w:rPr>
-          <w:t xml:space="preserve">	6</w:t>
+          <w:tab/>
+          <w:t xml:space="preserve">6</w:t>
         </w:r>
       </w:hyperlink>
     </w:p>
@@ -743,7 +756,8 @@
             <w:sz w:val="23"/>
             <w:color w:val="000000"/>
           </w:rPr>
-          <w:t xml:space="preserve">	6</w:t>
+          <w:tab/>
+          <w:t xml:space="preserve">6</w:t>
         </w:r>
       </w:hyperlink>
     </w:p>
@@ -772,7 +786,8 @@
             <w:sz w:val="23"/>
             <w:color w:val="000000"/>
           </w:rPr>
-          <w:t xml:space="preserve">	6</w:t>
+          <w:tab/>
+          <w:t xml:space="preserve">6</w:t>
         </w:r>
       </w:hyperlink>
     </w:p>
@@ -801,7 +816,8 @@
             <w:sz w:val="23"/>
             <w:color w:val="000000"/>
           </w:rPr>
-          <w:t xml:space="preserve">	6</w:t>
+          <w:tab/>
+          <w:t xml:space="preserve">6</w:t>
         </w:r>
       </w:hyperlink>
     </w:p>
@@ -830,7 +846,8 @@
             <w:sz w:val="23"/>
             <w:color w:val="000000"/>
           </w:rPr>
-          <w:t xml:space="preserve">	6</w:t>
+          <w:tab/>
+          <w:t xml:space="preserve">6</w:t>
         </w:r>
       </w:hyperlink>
     </w:p>
@@ -859,7 +876,8 @@
             <w:sz w:val="23"/>
             <w:color w:val="000000"/>
           </w:rPr>
-          <w:t xml:space="preserve">	6</w:t>
+          <w:tab/>
+          <w:t xml:space="preserve">6</w:t>
         </w:r>
       </w:hyperlink>
     </w:p>
@@ -888,7 +906,8 @@
             <w:sz w:val="23"/>
             <w:color w:val="000000"/>
           </w:rPr>
-          <w:t xml:space="preserve">	7</w:t>
+          <w:tab/>
+          <w:t xml:space="preserve">7</w:t>
         </w:r>
       </w:hyperlink>
     </w:p>
@@ -918,7 +937,8 @@
             <w:b/>
             <w:color w:val="000000"/>
           </w:rPr>
-          <w:t xml:space="preserve">	7</w:t>
+          <w:tab/>
+          <w:t xml:space="preserve">7</w:t>
         </w:r>
       </w:hyperlink>
     </w:p>
@@ -947,7 +967,8 @@
             <w:sz w:val="23"/>
             <w:color w:val="000000"/>
           </w:rPr>
-          <w:t xml:space="preserve">	7</w:t>
+          <w:tab/>
+          <w:t xml:space="preserve">7</w:t>
         </w:r>
       </w:hyperlink>
     </w:p>
@@ -976,7 +997,8 @@
             <w:sz w:val="23"/>
             <w:color w:val="000000"/>
           </w:rPr>
-          <w:t xml:space="preserve">	8</w:t>
+          <w:tab/>
+          <w:t xml:space="preserve">8</w:t>
         </w:r>
       </w:hyperlink>
     </w:p>
@@ -1005,7 +1027,8 @@
             <w:sz w:val="23"/>
             <w:color w:val="000000"/>
           </w:rPr>
-          <w:t xml:space="preserve">	8</w:t>
+          <w:tab/>
+          <w:t xml:space="preserve">8</w:t>
         </w:r>
       </w:hyperlink>
     </w:p>
@@ -1034,7 +1057,8 @@
             <w:sz w:val="23"/>
             <w:color w:val="000000"/>
           </w:rPr>
-          <w:t xml:space="preserve">	9</w:t>
+          <w:tab/>
+          <w:t xml:space="preserve">9</w:t>
         </w:r>
       </w:hyperlink>
     </w:p>
@@ -1063,7 +1087,8 @@
             <w:sz w:val="23"/>
             <w:color w:val="000000"/>
           </w:rPr>
-          <w:t xml:space="preserve">	9</w:t>
+          <w:tab/>
+          <w:t xml:space="preserve">9</w:t>
         </w:r>
       </w:hyperlink>
     </w:p>
@@ -1092,7 +1117,8 @@
             <w:sz w:val="23"/>
             <w:color w:val="000000"/>
           </w:rPr>
-          <w:t xml:space="preserve">	10</w:t>
+          <w:tab/>
+          <w:t xml:space="preserve">10</w:t>
         </w:r>
       </w:hyperlink>
     </w:p>
@@ -1121,7 +1147,8 @@
             <w:sz w:val="23"/>
             <w:color w:val="000000"/>
           </w:rPr>
-          <w:t xml:space="preserve">	10</w:t>
+          <w:tab/>
+          <w:t xml:space="preserve">10</w:t>
         </w:r>
       </w:hyperlink>
     </w:p>
@@ -1150,7 +1177,8 @@
             <w:sz w:val="23"/>
             <w:color w:val="000000"/>
           </w:rPr>
-          <w:t xml:space="preserve">	10</w:t>
+          <w:tab/>
+          <w:t xml:space="preserve">10</w:t>
         </w:r>
       </w:hyperlink>
     </w:p>
@@ -1179,7 +1207,8 @@
             <w:sz w:val="23"/>
             <w:color w:val="000000"/>
           </w:rPr>
-          <w:t xml:space="preserve">	10</w:t>
+          <w:tab/>
+          <w:t xml:space="preserve">10</w:t>
         </w:r>
       </w:hyperlink>
     </w:p>
@@ -1208,7 +1237,8 @@
             <w:sz w:val="23"/>
             <w:color w:val="000000"/>
           </w:rPr>
-          <w:t xml:space="preserve">	10</w:t>
+          <w:tab/>
+          <w:t xml:space="preserve">10</w:t>
         </w:r>
       </w:hyperlink>
     </w:p>
@@ -1237,7 +1267,8 @@
             <w:sz w:val="23"/>
             <w:color w:val="000000"/>
           </w:rPr>
-          <w:t xml:space="preserve">	11</w:t>
+          <w:tab/>
+          <w:t xml:space="preserve">11</w:t>
         </w:r>
       </w:hyperlink>
     </w:p>
@@ -1266,7 +1297,8 @@
             <w:sz w:val="23"/>
             <w:color w:val="000000"/>
           </w:rPr>
-          <w:t xml:space="preserve">	11</w:t>
+          <w:tab/>
+          <w:t xml:space="preserve">11</w:t>
         </w:r>
       </w:hyperlink>
     </w:p>
@@ -1296,7 +1328,8 @@
             <w:b/>
             <w:color w:val="000000"/>
           </w:rPr>
-          <w:t xml:space="preserve">	11</w:t>
+          <w:tab/>
+          <w:t xml:space="preserve">11</w:t>
         </w:r>
       </w:hyperlink>
     </w:p>
@@ -1325,7 +1358,8 @@
             <w:sz w:val="23"/>
             <w:color w:val="000000"/>
           </w:rPr>
-          <w:t xml:space="preserve">	11</w:t>
+          <w:tab/>
+          <w:t xml:space="preserve">11</w:t>
         </w:r>
       </w:hyperlink>
     </w:p>
@@ -1354,7 +1388,8 @@
             <w:sz w:val="23"/>
             <w:color w:val="000000"/>
           </w:rPr>
-          <w:t xml:space="preserve">	12</w:t>
+          <w:tab/>
+          <w:t xml:space="preserve">12</w:t>
         </w:r>
       </w:hyperlink>
     </w:p>
@@ -1383,7 +1418,8 @@
             <w:sz w:val="23"/>
             <w:color w:val="000000"/>
           </w:rPr>
-          <w:t xml:space="preserve">	12</w:t>
+          <w:tab/>
+          <w:t xml:space="preserve">12</w:t>
         </w:r>
       </w:hyperlink>
     </w:p>
@@ -1412,7 +1448,8 @@
             <w:sz w:val="23"/>
             <w:color w:val="000000"/>
           </w:rPr>
-          <w:t xml:space="preserve">	13</w:t>
+          <w:tab/>
+          <w:t xml:space="preserve">13</w:t>
         </w:r>
       </w:hyperlink>
     </w:p>
@@ -1441,7 +1478,8 @@
             <w:sz w:val="23"/>
             <w:color w:val="000000"/>
           </w:rPr>
-          <w:t xml:space="preserve">	13</w:t>
+          <w:tab/>
+          <w:t xml:space="preserve">13</w:t>
         </w:r>
       </w:hyperlink>
     </w:p>
@@ -1470,7 +1508,8 @@
             <w:sz w:val="23"/>
             <w:color w:val="000000"/>
           </w:rPr>
-          <w:t xml:space="preserve">	13</w:t>
+          <w:tab/>
+          <w:t xml:space="preserve">13</w:t>
         </w:r>
       </w:hyperlink>
     </w:p>
@@ -1499,7 +1538,8 @@
             <w:sz w:val="23"/>
             <w:color w:val="000000"/>
           </w:rPr>
-          <w:t xml:space="preserve">	14</w:t>
+          <w:tab/>
+          <w:t xml:space="preserve">14</w:t>
         </w:r>
       </w:hyperlink>
     </w:p>
@@ -1528,7 +1568,8 @@
             <w:sz w:val="23"/>
             <w:color w:val="000000"/>
           </w:rPr>
-          <w:t xml:space="preserve">	15</w:t>
+          <w:tab/>
+          <w:t xml:space="preserve">15</w:t>
         </w:r>
       </w:hyperlink>
     </w:p>
@@ -1557,7 +1598,8 @@
             <w:sz w:val="23"/>
             <w:color w:val="000000"/>
           </w:rPr>
-          <w:t xml:space="preserve">	15</w:t>
+          <w:tab/>
+          <w:t xml:space="preserve">15</w:t>
         </w:r>
       </w:hyperlink>
     </w:p>
@@ -1587,7 +1629,8 @@
             <w:b/>
             <w:color w:val="000000"/>
           </w:rPr>
-          <w:t xml:space="preserve">	15</w:t>
+          <w:tab/>
+          <w:t xml:space="preserve">15</w:t>
         </w:r>
       </w:hyperlink>
     </w:p>
@@ -1616,7 +1659,8 @@
             <w:sz w:val="23"/>
             <w:color w:val="000000"/>
           </w:rPr>
-          <w:t xml:space="preserve">	15</w:t>
+          <w:tab/>
+          <w:t xml:space="preserve">15</w:t>
         </w:r>
       </w:hyperlink>
     </w:p>
@@ -1645,7 +1689,8 @@
             <w:sz w:val="23"/>
             <w:color w:val="000000"/>
           </w:rPr>
-          <w:t xml:space="preserve">	16</w:t>
+          <w:tab/>
+          <w:t xml:space="preserve">16</w:t>
         </w:r>
       </w:hyperlink>
     </w:p>
@@ -1674,7 +1719,8 @@
             <w:sz w:val="23"/>
             <w:color w:val="000000"/>
           </w:rPr>
-          <w:t xml:space="preserve">	18</w:t>
+          <w:tab/>
+          <w:t xml:space="preserve">18</w:t>
         </w:r>
       </w:hyperlink>
     </w:p>
@@ -1703,7 +1749,8 @@
             <w:sz w:val="23"/>
             <w:color w:val="000000"/>
           </w:rPr>
-          <w:t xml:space="preserve">	19</w:t>
+          <w:tab/>
+          <w:t xml:space="preserve">19</w:t>
         </w:r>
       </w:hyperlink>
     </w:p>
@@ -1732,7 +1779,8 @@
             <w:sz w:val="23"/>
             <w:color w:val="000000"/>
           </w:rPr>
-          <w:t xml:space="preserve">	19</w:t>
+          <w:tab/>
+          <w:t xml:space="preserve">19</w:t>
         </w:r>
       </w:hyperlink>
     </w:p>
@@ -1761,7 +1809,8 @@
             <w:sz w:val="23"/>
             <w:color w:val="000000"/>
           </w:rPr>
-          <w:t xml:space="preserve">	21</w:t>
+          <w:tab/>
+          <w:t xml:space="preserve">21</w:t>
         </w:r>
       </w:hyperlink>
     </w:p>
@@ -1791,7 +1840,8 @@
             <w:b/>
             <w:color w:val="000000"/>
           </w:rPr>
-          <w:t xml:space="preserve">	21</w:t>
+          <w:tab/>
+          <w:t xml:space="preserve">21</w:t>
         </w:r>
       </w:hyperlink>
     </w:p>
@@ -1820,7 +1870,8 @@
             <w:sz w:val="23"/>
             <w:color w:val="000000"/>
           </w:rPr>
-          <w:t xml:space="preserve">	21</w:t>
+          <w:tab/>
+          <w:t xml:space="preserve">21</w:t>
         </w:r>
       </w:hyperlink>
     </w:p>
@@ -1849,7 +1900,8 @@
             <w:sz w:val="23"/>
             <w:color w:val="000000"/>
           </w:rPr>
-          <w:t xml:space="preserve">	22</w:t>
+          <w:tab/>
+          <w:t xml:space="preserve">22</w:t>
         </w:r>
       </w:hyperlink>
     </w:p>
@@ -1878,7 +1930,8 @@
             <w:sz w:val="23"/>
             <w:color w:val="000000"/>
           </w:rPr>
-          <w:t xml:space="preserve">	23</w:t>
+          <w:tab/>
+          <w:t xml:space="preserve">23</w:t>
         </w:r>
       </w:hyperlink>
     </w:p>
@@ -1907,7 +1960,8 @@
             <w:sz w:val="23"/>
             <w:color w:val="000000"/>
           </w:rPr>
-          <w:t xml:space="preserve">	23</w:t>
+          <w:tab/>
+          <w:t xml:space="preserve">23</w:t>
         </w:r>
       </w:hyperlink>
     </w:p>
@@ -1936,7 +1990,8 @@
             <w:sz w:val="23"/>
             <w:color w:val="000000"/>
           </w:rPr>
-          <w:t xml:space="preserve">	24</w:t>
+          <w:tab/>
+          <w:t xml:space="preserve">24</w:t>
         </w:r>
       </w:hyperlink>
     </w:p>
@@ -1965,7 +2020,8 @@
             <w:sz w:val="23"/>
             <w:color w:val="000000"/>
           </w:rPr>
-          <w:t xml:space="preserve">	24</w:t>
+          <w:tab/>
+          <w:t xml:space="preserve">24</w:t>
         </w:r>
       </w:hyperlink>
     </w:p>
@@ -1994,7 +2050,8 @@
             <w:sz w:val="23"/>
             <w:color w:val="000000"/>
           </w:rPr>
-          <w:t xml:space="preserve">	25</w:t>
+          <w:tab/>
+          <w:t xml:space="preserve">25</w:t>
         </w:r>
       </w:hyperlink>
     </w:p>
@@ -2024,7 +2081,8 @@
             <w:b/>
             <w:color w:val="000000"/>
           </w:rPr>
-          <w:t xml:space="preserve">	25</w:t>
+          <w:tab/>
+          <w:t xml:space="preserve">25</w:t>
         </w:r>
       </w:hyperlink>
     </w:p>
@@ -2053,7 +2111,8 @@
             <w:sz w:val="23"/>
             <w:color w:val="000000"/>
           </w:rPr>
-          <w:t xml:space="preserve">	25</w:t>
+          <w:tab/>
+          <w:t xml:space="preserve">25</w:t>
         </w:r>
       </w:hyperlink>
     </w:p>
@@ -2082,7 +2141,8 @@
             <w:sz w:val="23"/>
             <w:color w:val="000000"/>
           </w:rPr>
-          <w:t xml:space="preserve">	25</w:t>
+          <w:tab/>
+          <w:t xml:space="preserve">25</w:t>
         </w:r>
       </w:hyperlink>
     </w:p>
@@ -2111,7 +2171,8 @@
             <w:sz w:val="23"/>
             <w:color w:val="000000"/>
           </w:rPr>
-          <w:t xml:space="preserve">	26</w:t>
+          <w:tab/>
+          <w:t xml:space="preserve">26</w:t>
         </w:r>
       </w:hyperlink>
     </w:p>
@@ -2140,7 +2201,8 @@
             <w:sz w:val="23"/>
             <w:color w:val="000000"/>
           </w:rPr>
-          <w:t xml:space="preserve">	27</w:t>
+          <w:tab/>
+          <w:t xml:space="preserve">27</w:t>
         </w:r>
       </w:hyperlink>
     </w:p>
@@ -2169,7 +2231,8 @@
             <w:sz w:val="23"/>
             <w:color w:val="000000"/>
           </w:rPr>
-          <w:t xml:space="preserve">	27</w:t>
+          <w:tab/>
+          <w:t xml:space="preserve">27</w:t>
         </w:r>
       </w:hyperlink>
     </w:p>
@@ -2199,7 +2262,8 @@
             <w:b/>
             <w:color w:val="000000"/>
           </w:rPr>
-          <w:t xml:space="preserve">	27</w:t>
+          <w:tab/>
+          <w:t xml:space="preserve">27</w:t>
         </w:r>
       </w:hyperlink>
     </w:p>
@@ -2228,7 +2292,8 @@
             <w:sz w:val="23"/>
             <w:color w:val="000000"/>
           </w:rPr>
-          <w:t xml:space="preserve">	28</w:t>
+          <w:tab/>
+          <w:t xml:space="preserve">28</w:t>
         </w:r>
       </w:hyperlink>
     </w:p>
@@ -2257,7 +2322,8 @@
             <w:sz w:val="23"/>
             <w:color w:val="000000"/>
           </w:rPr>
-          <w:t xml:space="preserve">	28</w:t>
+          <w:tab/>
+          <w:t xml:space="preserve">28</w:t>
         </w:r>
       </w:hyperlink>
     </w:p>
@@ -4961,8 +5027,6 @@
       <w:tblPr>
         <w:tblW w:type="auto" w:w="0"/>
         <w:jc w:val="center"/>
-        <w:tblLayout w:type="fixed"/>
-        <w:tblLook w:firstColumn="1" w:firstRow="1" w:lastColumn="0" w:lastRow="0" w:noHBand="0" w:noVBand="1" w:val="04A0"/>
         <w:tblBorders>
           <w:top w:val="single" w:sz="6" w:space="0" w:color="CCCCCC"/>
           <w:bottom w:val="single" w:sz="6" w:space="0" w:color="CCCCCC"/>
@@ -4971,6 +5035,8 @@
           <w:left w:val="none"/>
           <w:right w:val="none"/>
         </w:tblBorders>
+        <w:tblLayout w:type="fixed"/>
+        <w:tblLook w:firstColumn="1" w:firstRow="1" w:lastColumn="0" w:lastRow="0" w:noHBand="0" w:noVBand="1" w:val="04A0"/>
       </w:tblPr>
       <w:tblGrid>
         <w:gridCol w:w="3024"/>
@@ -4979,8 +5045,8 @@
       </w:tblGrid>
       <w:tr>
         <w:trPr>
+          <w:cantSplit/>
           <w:tblHeader/>
-          <w:cantSplit/>
         </w:trPr>
         <w:tc>
           <w:tcPr>
@@ -6204,8 +6270,6 @@
       <w:tblPr>
         <w:tblW w:type="auto" w:w="0"/>
         <w:jc w:val="center"/>
-        <w:tblLayout w:type="fixed"/>
-        <w:tblLook w:firstColumn="1" w:firstRow="1" w:lastColumn="0" w:lastRow="0" w:noHBand="0" w:noVBand="1" w:val="04A0"/>
         <w:tblBorders>
           <w:top w:val="single" w:sz="6" w:space="0" w:color="CCCCCC"/>
           <w:bottom w:val="single" w:sz="6" w:space="0" w:color="CCCCCC"/>
@@ -6214,6 +6278,8 @@
           <w:left w:val="none"/>
           <w:right w:val="none"/>
         </w:tblBorders>
+        <w:tblLayout w:type="fixed"/>
+        <w:tblLook w:firstColumn="1" w:firstRow="1" w:lastColumn="0" w:lastRow="0" w:noHBand="0" w:noVBand="1" w:val="04A0"/>
       </w:tblPr>
       <w:tblGrid>
         <w:gridCol w:w="2268"/>
@@ -6223,8 +6289,8 @@
       </w:tblGrid>
       <w:tr>
         <w:trPr>
+          <w:cantSplit/>
           <w:tblHeader/>
-          <w:cantSplit/>
         </w:trPr>
         <w:tc>
           <w:tcPr>
@@ -7205,8 +7271,6 @@
       <w:tblPr>
         <w:tblW w:type="auto" w:w="0"/>
         <w:jc w:val="center"/>
-        <w:tblLayout w:type="fixed"/>
-        <w:tblLook w:firstColumn="1" w:firstRow="1" w:lastColumn="0" w:lastRow="0" w:noHBand="0" w:noVBand="1" w:val="04A0"/>
         <w:tblBorders>
           <w:top w:val="single" w:sz="6" w:space="0" w:color="CCCCCC"/>
           <w:bottom w:val="single" w:sz="6" w:space="0" w:color="CCCCCC"/>
@@ -7215,6 +7279,8 @@
           <w:left w:val="none"/>
           <w:right w:val="none"/>
         </w:tblBorders>
+        <w:tblLayout w:type="fixed"/>
+        <w:tblLook w:firstColumn="1" w:firstRow="1" w:lastColumn="0" w:lastRow="0" w:noHBand="0" w:noVBand="1" w:val="04A0"/>
       </w:tblPr>
       <w:tblGrid>
         <w:gridCol w:w="1814"/>
@@ -7225,8 +7291,8 @@
       </w:tblGrid>
       <w:tr>
         <w:trPr>
+          <w:cantSplit/>
           <w:tblHeader/>
-          <w:cantSplit/>
         </w:trPr>
         <w:tc>
           <w:tcPr>
@@ -8148,8 +8214,6 @@
       <w:tblPr>
         <w:tblW w:type="auto" w:w="0"/>
         <w:jc w:val="center"/>
-        <w:tblLayout w:type="fixed"/>
-        <w:tblLook w:firstColumn="1" w:firstRow="1" w:lastColumn="0" w:lastRow="0" w:noHBand="0" w:noVBand="1" w:val="04A0"/>
         <w:tblBorders>
           <w:top w:val="single" w:sz="6" w:space="0" w:color="CCCCCC"/>
           <w:bottom w:val="single" w:sz="6" w:space="0" w:color="CCCCCC"/>
@@ -8158,6 +8222,8 @@
           <w:left w:val="none"/>
           <w:right w:val="none"/>
         </w:tblBorders>
+        <w:tblLayout w:type="fixed"/>
+        <w:tblLook w:firstColumn="1" w:firstRow="1" w:lastColumn="0" w:lastRow="0" w:noHBand="0" w:noVBand="1" w:val="04A0"/>
       </w:tblPr>
       <w:tblGrid>
         <w:gridCol w:w="3024"/>
@@ -8166,8 +8232,8 @@
       </w:tblGrid>
       <w:tr>
         <w:trPr>
+          <w:cantSplit/>
           <w:tblHeader/>
-          <w:cantSplit/>
         </w:trPr>
         <w:tc>
           <w:tcPr>
@@ -12045,8 +12111,6 @@
       <w:tblPr>
         <w:tblW w:type="auto" w:w="0"/>
         <w:jc w:val="center"/>
-        <w:tblLayout w:type="fixed"/>
-        <w:tblLook w:firstColumn="1" w:firstRow="1" w:lastColumn="0" w:lastRow="0" w:noHBand="0" w:noVBand="1" w:val="04A0"/>
         <w:tblBorders>
           <w:top w:val="single" w:sz="6" w:space="0" w:color="CCCCCC"/>
           <w:bottom w:val="single" w:sz="6" w:space="0" w:color="CCCCCC"/>
@@ -12055,6 +12119,8 @@
           <w:left w:val="none"/>
           <w:right w:val="none"/>
         </w:tblBorders>
+        <w:tblLayout w:type="fixed"/>
+        <w:tblLook w:firstColumn="1" w:firstRow="1" w:lastColumn="0" w:lastRow="0" w:noHBand="0" w:noVBand="1" w:val="04A0"/>
       </w:tblPr>
       <w:tblGrid>
         <w:gridCol w:w="1512"/>
@@ -12066,8 +12132,8 @@
       </w:tblGrid>
       <w:tr>
         <w:trPr>
+          <w:cantSplit/>
           <w:tblHeader/>
-          <w:cantSplit/>
         </w:trPr>
         <w:tc>
           <w:tcPr>
@@ -13573,8 +13639,6 @@
       <w:tblPr>
         <w:tblW w:type="auto" w:w="0"/>
         <w:jc w:val="center"/>
-        <w:tblLayout w:type="fixed"/>
-        <w:tblLook w:firstColumn="1" w:firstRow="1" w:lastColumn="0" w:lastRow="0" w:noHBand="0" w:noVBand="1" w:val="04A0"/>
         <w:tblBorders>
           <w:top w:val="single" w:sz="6" w:space="0" w:color="CCCCCC"/>
           <w:bottom w:val="single" w:sz="6" w:space="0" w:color="CCCCCC"/>
@@ -13583,6 +13647,8 @@
           <w:left w:val="none"/>
           <w:right w:val="none"/>
         </w:tblBorders>
+        <w:tblLayout w:type="fixed"/>
+        <w:tblLook w:firstColumn="1" w:firstRow="1" w:lastColumn="0" w:lastRow="0" w:noHBand="0" w:noVBand="1" w:val="04A0"/>
       </w:tblPr>
       <w:tblGrid>
         <w:gridCol w:w="1814"/>
@@ -13593,8 +13659,8 @@
       </w:tblGrid>
       <w:tr>
         <w:trPr>
+          <w:cantSplit/>
           <w:tblHeader/>
-          <w:cantSplit/>
         </w:trPr>
         <w:tc>
           <w:tcPr>
@@ -15120,8 +15186,6 @@
       <w:tblPr>
         <w:tblW w:type="auto" w:w="0"/>
         <w:jc w:val="center"/>
-        <w:tblLayout w:type="fixed"/>
-        <w:tblLook w:firstColumn="1" w:firstRow="1" w:lastColumn="0" w:lastRow="0" w:noHBand="0" w:noVBand="1" w:val="04A0"/>
         <w:tblBorders>
           <w:top w:val="single" w:sz="6" w:space="0" w:color="CCCCCC"/>
           <w:bottom w:val="single" w:sz="6" w:space="0" w:color="CCCCCC"/>
@@ -15130,6 +15194,8 @@
           <w:left w:val="none"/>
           <w:right w:val="none"/>
         </w:tblBorders>
+        <w:tblLayout w:type="fixed"/>
+        <w:tblLook w:firstColumn="1" w:firstRow="1" w:lastColumn="0" w:lastRow="0" w:noHBand="0" w:noVBand="1" w:val="04A0"/>
       </w:tblPr>
       <w:tblGrid>
         <w:gridCol w:w="1512"/>
@@ -15141,8 +15207,8 @@
       </w:tblGrid>
       <w:tr>
         <w:trPr>
+          <w:cantSplit/>
           <w:tblHeader/>
-          <w:cantSplit/>
         </w:trPr>
         <w:tc>
           <w:tcPr>
@@ -16683,8 +16749,6 @@
       <w:tblPr>
         <w:tblW w:type="auto" w:w="0"/>
         <w:jc w:val="center"/>
-        <w:tblLayout w:type="fixed"/>
-        <w:tblLook w:firstColumn="1" w:firstRow="1" w:lastColumn="0" w:lastRow="0" w:noHBand="0" w:noVBand="1" w:val="04A0"/>
         <w:tblBorders>
           <w:top w:val="single" w:sz="6" w:space="0" w:color="CCCCCC"/>
           <w:bottom w:val="single" w:sz="6" w:space="0" w:color="CCCCCC"/>
@@ -16693,6 +16757,8 @@
           <w:left w:val="none"/>
           <w:right w:val="none"/>
         </w:tblBorders>
+        <w:tblLayout w:type="fixed"/>
+        <w:tblLook w:firstColumn="1" w:firstRow="1" w:lastColumn="0" w:lastRow="0" w:noHBand="0" w:noVBand="1" w:val="04A0"/>
       </w:tblPr>
       <w:tblGrid>
         <w:gridCol w:w="2268"/>
@@ -16702,8 +16768,8 @@
       </w:tblGrid>
       <w:tr>
         <w:trPr>
+          <w:cantSplit/>
           <w:tblHeader/>
-          <w:cantSplit/>
         </w:trPr>
         <w:tc>
           <w:tcPr>

</xml_diff>

<commit_message>
Update docs final (#33)
Co-authored-by: Vũ Văn Duy <26410031@ms.uit.edu.vn>
</commit_message>
<xml_diff>
--- a/draft/fraud-detection/reports/[Nhom9]_BaoCao_FraudDetection.docx
+++ b/draft/fraud-detection/reports/[Nhom9]_BaoCao_FraudDetection.docx
@@ -133,7 +133,7 @@
           <w:color w:val="000000"/>
           <w:sz w:val="27"/>
         </w:rPr>
-        <w:t>“HỆ THỐNG PHÁT HIỆN GIAO DỊCH TÀI CHÍNH BẤT THƯỜNG VÀ NGHI VẤN GIAN LẬN”</w:t>
+        <w:t>HỆ THỐNG PHÁT HIỆN GIAO DỊCH TÀI CHÍNH BẤT THƯỜNG VÀ NGHI VẤN GIAN LẬN</w:t>
       </w:r>
     </w:p>
     <w:tbl>
@@ -341,7 +341,7 @@
     <w:p>
       <w:pPr>
         <w:tabs>
-          <w:tab w:pos="9071" w:val="right" w:leader="dot"/>
+          <w:tab w:pos="8957" w:val="right" w:leader="dot"/>
         </w:tabs>
         <w:spacing w:before="60" w:after="40" w:line="300" w:lineRule="auto"/>
       </w:pPr>
@@ -364,14 +364,15 @@
             <w:b/>
             <w:color w:val="000000"/>
           </w:rPr>
-          <w:t xml:space="preserve">	1</w:t>
+          <w:tab/>
+          <w:t xml:space="preserve">1</w:t>
         </w:r>
       </w:hyperlink>
     </w:p>
     <w:p>
       <w:pPr>
         <w:tabs>
-          <w:tab w:pos="9071" w:val="right" w:leader="dot"/>
+          <w:tab w:pos="8957" w:val="right" w:leader="dot"/>
         </w:tabs>
         <w:spacing w:before="60" w:after="40" w:line="300" w:lineRule="auto"/>
       </w:pPr>
@@ -394,14 +395,15 @@
             <w:b/>
             <w:color w:val="000000"/>
           </w:rPr>
-          <w:t xml:space="preserve">	2</w:t>
+          <w:tab/>
+          <w:t xml:space="preserve">2</w:t>
         </w:r>
       </w:hyperlink>
     </w:p>
     <w:p>
       <w:pPr>
         <w:tabs>
-          <w:tab w:pos="9071" w:val="right" w:leader="dot"/>
+          <w:tab w:pos="8617" w:val="right" w:leader="dot"/>
         </w:tabs>
         <w:spacing w:before="20" w:after="40" w:line="300" w:lineRule="auto"/>
         <w:ind w:left="340"/>
@@ -423,14 +425,15 @@
             <w:sz w:val="23"/>
             <w:color w:val="000000"/>
           </w:rPr>
-          <w:t xml:space="preserve">	2</w:t>
+          <w:tab/>
+          <w:t xml:space="preserve">2</w:t>
         </w:r>
       </w:hyperlink>
     </w:p>
     <w:p>
       <w:pPr>
         <w:tabs>
-          <w:tab w:pos="9071" w:val="right" w:leader="dot"/>
+          <w:tab w:pos="8617" w:val="right" w:leader="dot"/>
         </w:tabs>
         <w:spacing w:before="20" w:after="40" w:line="300" w:lineRule="auto"/>
         <w:ind w:left="340"/>
@@ -452,14 +455,15 @@
             <w:sz w:val="23"/>
             <w:color w:val="000000"/>
           </w:rPr>
-          <w:t xml:space="preserve">	3</w:t>
+          <w:tab/>
+          <w:t xml:space="preserve">3</w:t>
         </w:r>
       </w:hyperlink>
     </w:p>
     <w:p>
       <w:pPr>
         <w:tabs>
-          <w:tab w:pos="9071" w:val="right" w:leader="dot"/>
+          <w:tab w:pos="8617" w:val="right" w:leader="dot"/>
         </w:tabs>
         <w:spacing w:before="20" w:after="40" w:line="300" w:lineRule="auto"/>
         <w:ind w:left="340"/>
@@ -481,14 +485,15 @@
             <w:sz w:val="23"/>
             <w:color w:val="000000"/>
           </w:rPr>
-          <w:t xml:space="preserve">	3</w:t>
+          <w:tab/>
+          <w:t xml:space="preserve">3</w:t>
         </w:r>
       </w:hyperlink>
     </w:p>
     <w:p>
       <w:pPr>
         <w:tabs>
-          <w:tab w:pos="9071" w:val="right" w:leader="dot"/>
+          <w:tab w:pos="8277" w:val="right" w:leader="dot"/>
         </w:tabs>
         <w:spacing w:before="20" w:after="40" w:line="300" w:lineRule="auto"/>
         <w:ind w:left="680"/>
@@ -510,14 +515,15 @@
             <w:sz w:val="23"/>
             <w:color w:val="000000"/>
           </w:rPr>
-          <w:t xml:space="preserve">	3</w:t>
+          <w:tab/>
+          <w:t xml:space="preserve">3</w:t>
         </w:r>
       </w:hyperlink>
     </w:p>
     <w:p>
       <w:pPr>
         <w:tabs>
-          <w:tab w:pos="9071" w:val="right" w:leader="dot"/>
+          <w:tab w:pos="8277" w:val="right" w:leader="dot"/>
         </w:tabs>
         <w:spacing w:before="20" w:after="40" w:line="300" w:lineRule="auto"/>
         <w:ind w:left="680"/>
@@ -539,14 +545,15 @@
             <w:sz w:val="23"/>
             <w:color w:val="000000"/>
           </w:rPr>
-          <w:t xml:space="preserve">	3</w:t>
+          <w:tab/>
+          <w:t xml:space="preserve">4</w:t>
         </w:r>
       </w:hyperlink>
     </w:p>
     <w:p>
       <w:pPr>
         <w:tabs>
-          <w:tab w:pos="9071" w:val="right" w:leader="dot"/>
+          <w:tab w:pos="8617" w:val="right" w:leader="dot"/>
         </w:tabs>
         <w:spacing w:before="20" w:after="40" w:line="300" w:lineRule="auto"/>
         <w:ind w:left="340"/>
@@ -568,14 +575,15 @@
             <w:sz w:val="23"/>
             <w:color w:val="000000"/>
           </w:rPr>
-          <w:t xml:space="preserve">	4</w:t>
+          <w:tab/>
+          <w:t xml:space="preserve">4</w:t>
         </w:r>
       </w:hyperlink>
     </w:p>
     <w:p>
       <w:pPr>
         <w:tabs>
-          <w:tab w:pos="9071" w:val="right" w:leader="dot"/>
+          <w:tab w:pos="8617" w:val="right" w:leader="dot"/>
         </w:tabs>
         <w:spacing w:before="20" w:after="40" w:line="300" w:lineRule="auto"/>
         <w:ind w:left="340"/>
@@ -597,14 +605,15 @@
             <w:sz w:val="23"/>
             <w:color w:val="000000"/>
           </w:rPr>
-          <w:t xml:space="preserve">	4</w:t>
+          <w:tab/>
+          <w:t xml:space="preserve">5</w:t>
         </w:r>
       </w:hyperlink>
     </w:p>
     <w:p>
       <w:pPr>
         <w:tabs>
-          <w:tab w:pos="9071" w:val="right" w:leader="dot"/>
+          <w:tab w:pos="8957" w:val="right" w:leader="dot"/>
         </w:tabs>
         <w:spacing w:before="60" w:after="40" w:line="300" w:lineRule="auto"/>
       </w:pPr>
@@ -627,14 +636,15 @@
             <w:b/>
             <w:color w:val="000000"/>
           </w:rPr>
-          <w:t xml:space="preserve">	5</w:t>
+          <w:tab/>
+          <w:t xml:space="preserve">5</w:t>
         </w:r>
       </w:hyperlink>
     </w:p>
     <w:p>
       <w:pPr>
         <w:tabs>
-          <w:tab w:pos="9071" w:val="right" w:leader="dot"/>
+          <w:tab w:pos="8617" w:val="right" w:leader="dot"/>
         </w:tabs>
         <w:spacing w:before="20" w:after="40" w:line="300" w:lineRule="auto"/>
         <w:ind w:left="340"/>
@@ -656,14 +666,15 @@
             <w:sz w:val="23"/>
             <w:color w:val="000000"/>
           </w:rPr>
-          <w:t xml:space="preserve">	5</w:t>
+          <w:tab/>
+          <w:t xml:space="preserve">5</w:t>
         </w:r>
       </w:hyperlink>
     </w:p>
     <w:p>
       <w:pPr>
         <w:tabs>
-          <w:tab w:pos="9071" w:val="right" w:leader="dot"/>
+          <w:tab w:pos="8617" w:val="right" w:leader="dot"/>
         </w:tabs>
         <w:spacing w:before="20" w:after="40" w:line="300" w:lineRule="auto"/>
         <w:ind w:left="340"/>
@@ -685,14 +696,15 @@
             <w:sz w:val="23"/>
             <w:color w:val="000000"/>
           </w:rPr>
-          <w:t xml:space="preserve">	5</w:t>
+          <w:tab/>
+          <w:t xml:space="preserve">5</w:t>
         </w:r>
       </w:hyperlink>
     </w:p>
     <w:p>
       <w:pPr>
         <w:tabs>
-          <w:tab w:pos="9071" w:val="right" w:leader="dot"/>
+          <w:tab w:pos="8617" w:val="right" w:leader="dot"/>
         </w:tabs>
         <w:spacing w:before="20" w:after="40" w:line="300" w:lineRule="auto"/>
         <w:ind w:left="340"/>
@@ -714,14 +726,15 @@
             <w:sz w:val="23"/>
             <w:color w:val="000000"/>
           </w:rPr>
-          <w:t xml:space="preserve">	5</w:t>
+          <w:tab/>
+          <w:t xml:space="preserve">6</w:t>
         </w:r>
       </w:hyperlink>
     </w:p>
     <w:p>
       <w:pPr>
         <w:tabs>
-          <w:tab w:pos="9071" w:val="right" w:leader="dot"/>
+          <w:tab w:pos="8277" w:val="right" w:leader="dot"/>
         </w:tabs>
         <w:spacing w:before="20" w:after="40" w:line="300" w:lineRule="auto"/>
         <w:ind w:left="680"/>
@@ -743,14 +756,15 @@
             <w:sz w:val="23"/>
             <w:color w:val="000000"/>
           </w:rPr>
-          <w:t xml:space="preserve">	5</w:t>
+          <w:tab/>
+          <w:t xml:space="preserve">6</w:t>
         </w:r>
       </w:hyperlink>
     </w:p>
     <w:p>
       <w:pPr>
         <w:tabs>
-          <w:tab w:pos="9071" w:val="right" w:leader="dot"/>
+          <w:tab w:pos="8277" w:val="right" w:leader="dot"/>
         </w:tabs>
         <w:spacing w:before="20" w:after="40" w:line="300" w:lineRule="auto"/>
         <w:ind w:left="680"/>
@@ -772,14 +786,15 @@
             <w:sz w:val="23"/>
             <w:color w:val="000000"/>
           </w:rPr>
-          <w:t xml:space="preserve">	6</w:t>
+          <w:tab/>
+          <w:t xml:space="preserve">6</w:t>
         </w:r>
       </w:hyperlink>
     </w:p>
     <w:p>
       <w:pPr>
         <w:tabs>
-          <w:tab w:pos="9071" w:val="right" w:leader="dot"/>
+          <w:tab w:pos="8277" w:val="right" w:leader="dot"/>
         </w:tabs>
         <w:spacing w:before="20" w:after="40" w:line="300" w:lineRule="auto"/>
         <w:ind w:left="680"/>
@@ -801,14 +816,15 @@
             <w:sz w:val="23"/>
             <w:color w:val="000000"/>
           </w:rPr>
-          <w:t xml:space="preserve">	6</w:t>
+          <w:tab/>
+          <w:t xml:space="preserve">6</w:t>
         </w:r>
       </w:hyperlink>
     </w:p>
     <w:p>
       <w:pPr>
         <w:tabs>
-          <w:tab w:pos="9071" w:val="right" w:leader="dot"/>
+          <w:tab w:pos="8277" w:val="right" w:leader="dot"/>
         </w:tabs>
         <w:spacing w:before="20" w:after="40" w:line="300" w:lineRule="auto"/>
         <w:ind w:left="680"/>
@@ -830,14 +846,15 @@
             <w:sz w:val="23"/>
             <w:color w:val="000000"/>
           </w:rPr>
-          <w:t xml:space="preserve">	6</w:t>
+          <w:tab/>
+          <w:t xml:space="preserve">6</w:t>
         </w:r>
       </w:hyperlink>
     </w:p>
     <w:p>
       <w:pPr>
         <w:tabs>
-          <w:tab w:pos="9071" w:val="right" w:leader="dot"/>
+          <w:tab w:pos="8617" w:val="right" w:leader="dot"/>
         </w:tabs>
         <w:spacing w:before="20" w:after="40" w:line="300" w:lineRule="auto"/>
         <w:ind w:left="340"/>
@@ -859,14 +876,15 @@
             <w:sz w:val="23"/>
             <w:color w:val="000000"/>
           </w:rPr>
-          <w:t xml:space="preserve">	6</w:t>
+          <w:tab/>
+          <w:t xml:space="preserve">6</w:t>
         </w:r>
       </w:hyperlink>
     </w:p>
     <w:p>
       <w:pPr>
         <w:tabs>
-          <w:tab w:pos="9071" w:val="right" w:leader="dot"/>
+          <w:tab w:pos="8617" w:val="right" w:leader="dot"/>
         </w:tabs>
         <w:spacing w:before="20" w:after="40" w:line="300" w:lineRule="auto"/>
         <w:ind w:left="340"/>
@@ -888,14 +906,15 @@
             <w:sz w:val="23"/>
             <w:color w:val="000000"/>
           </w:rPr>
-          <w:t xml:space="preserve">	7</w:t>
+          <w:tab/>
+          <w:t xml:space="preserve">7</w:t>
         </w:r>
       </w:hyperlink>
     </w:p>
     <w:p>
       <w:pPr>
         <w:tabs>
-          <w:tab w:pos="9071" w:val="right" w:leader="dot"/>
+          <w:tab w:pos="8957" w:val="right" w:leader="dot"/>
         </w:tabs>
         <w:spacing w:before="60" w:after="40" w:line="300" w:lineRule="auto"/>
       </w:pPr>
@@ -918,14 +937,15 @@
             <w:b/>
             <w:color w:val="000000"/>
           </w:rPr>
-          <w:t xml:space="preserve">	7</w:t>
+          <w:tab/>
+          <w:t xml:space="preserve">7</w:t>
         </w:r>
       </w:hyperlink>
     </w:p>
     <w:p>
       <w:pPr>
         <w:tabs>
-          <w:tab w:pos="9071" w:val="right" w:leader="dot"/>
+          <w:tab w:pos="8617" w:val="right" w:leader="dot"/>
         </w:tabs>
         <w:spacing w:before="20" w:after="40" w:line="300" w:lineRule="auto"/>
         <w:ind w:left="340"/>
@@ -947,14 +967,15 @@
             <w:sz w:val="23"/>
             <w:color w:val="000000"/>
           </w:rPr>
-          <w:t xml:space="preserve">	7</w:t>
+          <w:tab/>
+          <w:t xml:space="preserve">7</w:t>
         </w:r>
       </w:hyperlink>
     </w:p>
     <w:p>
       <w:pPr>
         <w:tabs>
-          <w:tab w:pos="9071" w:val="right" w:leader="dot"/>
+          <w:tab w:pos="8617" w:val="right" w:leader="dot"/>
         </w:tabs>
         <w:spacing w:before="20" w:after="40" w:line="300" w:lineRule="auto"/>
         <w:ind w:left="340"/>
@@ -976,14 +997,15 @@
             <w:sz w:val="23"/>
             <w:color w:val="000000"/>
           </w:rPr>
-          <w:t xml:space="preserve">	7</w:t>
+          <w:tab/>
+          <w:t xml:space="preserve">8</w:t>
         </w:r>
       </w:hyperlink>
     </w:p>
     <w:p>
       <w:pPr>
         <w:tabs>
-          <w:tab w:pos="9071" w:val="right" w:leader="dot"/>
+          <w:tab w:pos="8617" w:val="right" w:leader="dot"/>
         </w:tabs>
         <w:spacing w:before="20" w:after="40" w:line="300" w:lineRule="auto"/>
         <w:ind w:left="340"/>
@@ -1005,14 +1027,15 @@
             <w:sz w:val="23"/>
             <w:color w:val="000000"/>
           </w:rPr>
-          <w:t xml:space="preserve">	8</w:t>
+          <w:tab/>
+          <w:t xml:space="preserve">8</w:t>
         </w:r>
       </w:hyperlink>
     </w:p>
     <w:p>
       <w:pPr>
         <w:tabs>
-          <w:tab w:pos="9071" w:val="right" w:leader="dot"/>
+          <w:tab w:pos="8617" w:val="right" w:leader="dot"/>
         </w:tabs>
         <w:spacing w:before="20" w:after="40" w:line="300" w:lineRule="auto"/>
         <w:ind w:left="340"/>
@@ -1034,14 +1057,15 @@
             <w:sz w:val="23"/>
             <w:color w:val="000000"/>
           </w:rPr>
-          <w:t xml:space="preserve">	8</w:t>
+          <w:tab/>
+          <w:t xml:space="preserve">9</w:t>
         </w:r>
       </w:hyperlink>
     </w:p>
     <w:p>
       <w:pPr>
         <w:tabs>
-          <w:tab w:pos="9071" w:val="right" w:leader="dot"/>
+          <w:tab w:pos="8617" w:val="right" w:leader="dot"/>
         </w:tabs>
         <w:spacing w:before="20" w:after="40" w:line="300" w:lineRule="auto"/>
         <w:ind w:left="340"/>
@@ -1063,14 +1087,15 @@
             <w:sz w:val="23"/>
             <w:color w:val="000000"/>
           </w:rPr>
-          <w:t xml:space="preserve">	9</w:t>
+          <w:tab/>
+          <w:t xml:space="preserve">9</w:t>
         </w:r>
       </w:hyperlink>
     </w:p>
     <w:p>
       <w:pPr>
         <w:tabs>
-          <w:tab w:pos="9071" w:val="right" w:leader="dot"/>
+          <w:tab w:pos="8617" w:val="right" w:leader="dot"/>
         </w:tabs>
         <w:spacing w:before="20" w:after="40" w:line="300" w:lineRule="auto"/>
         <w:ind w:left="340"/>
@@ -1092,14 +1117,15 @@
             <w:sz w:val="23"/>
             <w:color w:val="000000"/>
           </w:rPr>
-          <w:t xml:space="preserve">	9</w:t>
+          <w:tab/>
+          <w:t xml:space="preserve">10</w:t>
         </w:r>
       </w:hyperlink>
     </w:p>
     <w:p>
       <w:pPr>
         <w:tabs>
-          <w:tab w:pos="9071" w:val="right" w:leader="dot"/>
+          <w:tab w:pos="8277" w:val="right" w:leader="dot"/>
         </w:tabs>
         <w:spacing w:before="20" w:after="40" w:line="300" w:lineRule="auto"/>
         <w:ind w:left="680"/>
@@ -1121,14 +1147,15 @@
             <w:sz w:val="23"/>
             <w:color w:val="000000"/>
           </w:rPr>
-          <w:t xml:space="preserve">	9</w:t>
+          <w:tab/>
+          <w:t xml:space="preserve">10</w:t>
         </w:r>
       </w:hyperlink>
     </w:p>
     <w:p>
       <w:pPr>
         <w:tabs>
-          <w:tab w:pos="9071" w:val="right" w:leader="dot"/>
+          <w:tab w:pos="8277" w:val="right" w:leader="dot"/>
         </w:tabs>
         <w:spacing w:before="20" w:after="40" w:line="300" w:lineRule="auto"/>
         <w:ind w:left="680"/>
@@ -1150,14 +1177,15 @@
             <w:sz w:val="23"/>
             <w:color w:val="000000"/>
           </w:rPr>
-          <w:t xml:space="preserve">	10</w:t>
+          <w:tab/>
+          <w:t xml:space="preserve">10</w:t>
         </w:r>
       </w:hyperlink>
     </w:p>
     <w:p>
       <w:pPr>
         <w:tabs>
-          <w:tab w:pos="9071" w:val="right" w:leader="dot"/>
+          <w:tab w:pos="8277" w:val="right" w:leader="dot"/>
         </w:tabs>
         <w:spacing w:before="20" w:after="40" w:line="300" w:lineRule="auto"/>
         <w:ind w:left="680"/>
@@ -1179,14 +1207,15 @@
             <w:sz w:val="23"/>
             <w:color w:val="000000"/>
           </w:rPr>
-          <w:t xml:space="preserve">	10</w:t>
+          <w:tab/>
+          <w:t xml:space="preserve">10</w:t>
         </w:r>
       </w:hyperlink>
     </w:p>
     <w:p>
       <w:pPr>
         <w:tabs>
-          <w:tab w:pos="9071" w:val="right" w:leader="dot"/>
+          <w:tab w:pos="8277" w:val="right" w:leader="dot"/>
         </w:tabs>
         <w:spacing w:before="20" w:after="40" w:line="300" w:lineRule="auto"/>
         <w:ind w:left="680"/>
@@ -1208,14 +1237,15 @@
             <w:sz w:val="23"/>
             <w:color w:val="000000"/>
           </w:rPr>
-          <w:t xml:space="preserve">	10</w:t>
+          <w:tab/>
+          <w:t xml:space="preserve">10</w:t>
         </w:r>
       </w:hyperlink>
     </w:p>
     <w:p>
       <w:pPr>
         <w:tabs>
-          <w:tab w:pos="9071" w:val="right" w:leader="dot"/>
+          <w:tab w:pos="8277" w:val="right" w:leader="dot"/>
         </w:tabs>
         <w:spacing w:before="20" w:after="40" w:line="300" w:lineRule="auto"/>
         <w:ind w:left="680"/>
@@ -1237,14 +1267,15 @@
             <w:sz w:val="23"/>
             <w:color w:val="000000"/>
           </w:rPr>
-          <w:t xml:space="preserve">	10</w:t>
+          <w:tab/>
+          <w:t xml:space="preserve">11</w:t>
         </w:r>
       </w:hyperlink>
     </w:p>
     <w:p>
       <w:pPr>
         <w:tabs>
-          <w:tab w:pos="9071" w:val="right" w:leader="dot"/>
+          <w:tab w:pos="8617" w:val="right" w:leader="dot"/>
         </w:tabs>
         <w:spacing w:before="20" w:after="40" w:line="300" w:lineRule="auto"/>
         <w:ind w:left="340"/>
@@ -1266,14 +1297,15 @@
             <w:sz w:val="23"/>
             <w:color w:val="000000"/>
           </w:rPr>
-          <w:t xml:space="preserve">	10</w:t>
+          <w:tab/>
+          <w:t xml:space="preserve">11</w:t>
         </w:r>
       </w:hyperlink>
     </w:p>
     <w:p>
       <w:pPr>
         <w:tabs>
-          <w:tab w:pos="9071" w:val="right" w:leader="dot"/>
+          <w:tab w:pos="8957" w:val="right" w:leader="dot"/>
         </w:tabs>
         <w:spacing w:before="60" w:after="40" w:line="300" w:lineRule="auto"/>
       </w:pPr>
@@ -1296,14 +1328,15 @@
             <w:b/>
             <w:color w:val="000000"/>
           </w:rPr>
-          <w:t xml:space="preserve">	11</w:t>
+          <w:tab/>
+          <w:t xml:space="preserve">11</w:t>
         </w:r>
       </w:hyperlink>
     </w:p>
     <w:p>
       <w:pPr>
         <w:tabs>
-          <w:tab w:pos="9071" w:val="right" w:leader="dot"/>
+          <w:tab w:pos="8617" w:val="right" w:leader="dot"/>
         </w:tabs>
         <w:spacing w:before="20" w:after="40" w:line="300" w:lineRule="auto"/>
         <w:ind w:left="340"/>
@@ -1325,14 +1358,15 @@
             <w:sz w:val="23"/>
             <w:color w:val="000000"/>
           </w:rPr>
-          <w:t xml:space="preserve">	11</w:t>
+          <w:tab/>
+          <w:t xml:space="preserve">11</w:t>
         </w:r>
       </w:hyperlink>
     </w:p>
     <w:p>
       <w:pPr>
         <w:tabs>
-          <w:tab w:pos="9071" w:val="right" w:leader="dot"/>
+          <w:tab w:pos="8617" w:val="right" w:leader="dot"/>
         </w:tabs>
         <w:spacing w:before="20" w:after="40" w:line="300" w:lineRule="auto"/>
         <w:ind w:left="340"/>
@@ -1354,14 +1388,15 @@
             <w:sz w:val="23"/>
             <w:color w:val="000000"/>
           </w:rPr>
-          <w:t xml:space="preserve">	11</w:t>
+          <w:tab/>
+          <w:t xml:space="preserve">12</w:t>
         </w:r>
       </w:hyperlink>
     </w:p>
     <w:p>
       <w:pPr>
         <w:tabs>
-          <w:tab w:pos="9071" w:val="right" w:leader="dot"/>
+          <w:tab w:pos="8617" w:val="right" w:leader="dot"/>
         </w:tabs>
         <w:spacing w:before="20" w:after="40" w:line="300" w:lineRule="auto"/>
         <w:ind w:left="340"/>
@@ -1383,14 +1418,15 @@
             <w:sz w:val="23"/>
             <w:color w:val="000000"/>
           </w:rPr>
-          <w:t xml:space="preserve">	11</w:t>
+          <w:tab/>
+          <w:t xml:space="preserve">12</w:t>
         </w:r>
       </w:hyperlink>
     </w:p>
     <w:p>
       <w:pPr>
         <w:tabs>
-          <w:tab w:pos="9071" w:val="right" w:leader="dot"/>
+          <w:tab w:pos="8617" w:val="right" w:leader="dot"/>
         </w:tabs>
         <w:spacing w:before="20" w:after="40" w:line="300" w:lineRule="auto"/>
         <w:ind w:left="340"/>
@@ -1412,14 +1448,15 @@
             <w:sz w:val="23"/>
             <w:color w:val="000000"/>
           </w:rPr>
-          <w:t xml:space="preserve">	12</w:t>
+          <w:tab/>
+          <w:t xml:space="preserve">13</w:t>
         </w:r>
       </w:hyperlink>
     </w:p>
     <w:p>
       <w:pPr>
         <w:tabs>
-          <w:tab w:pos="9071" w:val="right" w:leader="dot"/>
+          <w:tab w:pos="8617" w:val="right" w:leader="dot"/>
         </w:tabs>
         <w:spacing w:before="20" w:after="40" w:line="300" w:lineRule="auto"/>
         <w:ind w:left="340"/>
@@ -1441,14 +1478,15 @@
             <w:sz w:val="23"/>
             <w:color w:val="000000"/>
           </w:rPr>
-          <w:t xml:space="preserve">	12</w:t>
+          <w:tab/>
+          <w:t xml:space="preserve">13</w:t>
         </w:r>
       </w:hyperlink>
     </w:p>
     <w:p>
       <w:pPr>
         <w:tabs>
-          <w:tab w:pos="9071" w:val="right" w:leader="dot"/>
+          <w:tab w:pos="8617" w:val="right" w:leader="dot"/>
         </w:tabs>
         <w:spacing w:before="20" w:after="40" w:line="300" w:lineRule="auto"/>
         <w:ind w:left="340"/>
@@ -1470,14 +1508,15 @@
             <w:sz w:val="23"/>
             <w:color w:val="000000"/>
           </w:rPr>
-          <w:t xml:space="preserve">	13</w:t>
+          <w:tab/>
+          <w:t xml:space="preserve">13</w:t>
         </w:r>
       </w:hyperlink>
     </w:p>
     <w:p>
       <w:pPr>
         <w:tabs>
-          <w:tab w:pos="9071" w:val="right" w:leader="dot"/>
+          <w:tab w:pos="8617" w:val="right" w:leader="dot"/>
         </w:tabs>
         <w:spacing w:before="20" w:after="40" w:line="300" w:lineRule="auto"/>
         <w:ind w:left="340"/>
@@ -1499,14 +1538,15 @@
             <w:sz w:val="23"/>
             <w:color w:val="000000"/>
           </w:rPr>
-          <w:t xml:space="preserve">	14</w:t>
+          <w:tab/>
+          <w:t xml:space="preserve">14</w:t>
         </w:r>
       </w:hyperlink>
     </w:p>
     <w:p>
       <w:pPr>
         <w:tabs>
-          <w:tab w:pos="9071" w:val="right" w:leader="dot"/>
+          <w:tab w:pos="8617" w:val="right" w:leader="dot"/>
         </w:tabs>
         <w:spacing w:before="20" w:after="40" w:line="300" w:lineRule="auto"/>
         <w:ind w:left="340"/>
@@ -1528,14 +1568,15 @@
             <w:sz w:val="23"/>
             <w:color w:val="000000"/>
           </w:rPr>
-          <w:t xml:space="preserve">	14</w:t>
+          <w:tab/>
+          <w:t xml:space="preserve">15</w:t>
         </w:r>
       </w:hyperlink>
     </w:p>
     <w:p>
       <w:pPr>
         <w:tabs>
-          <w:tab w:pos="9071" w:val="right" w:leader="dot"/>
+          <w:tab w:pos="8617" w:val="right" w:leader="dot"/>
         </w:tabs>
         <w:spacing w:before="20" w:after="40" w:line="300" w:lineRule="auto"/>
         <w:ind w:left="340"/>
@@ -1557,14 +1598,15 @@
             <w:sz w:val="23"/>
             <w:color w:val="000000"/>
           </w:rPr>
-          <w:t xml:space="preserve">	14</w:t>
+          <w:tab/>
+          <w:t xml:space="preserve">15</w:t>
         </w:r>
       </w:hyperlink>
     </w:p>
     <w:p>
       <w:pPr>
         <w:tabs>
-          <w:tab w:pos="9071" w:val="right" w:leader="dot"/>
+          <w:tab w:pos="8957" w:val="right" w:leader="dot"/>
         </w:tabs>
         <w:spacing w:before="60" w:after="40" w:line="300" w:lineRule="auto"/>
       </w:pPr>
@@ -1587,14 +1629,15 @@
             <w:b/>
             <w:color w:val="000000"/>
           </w:rPr>
-          <w:t xml:space="preserve">	15</w:t>
+          <w:tab/>
+          <w:t xml:space="preserve">15</w:t>
         </w:r>
       </w:hyperlink>
     </w:p>
     <w:p>
       <w:pPr>
         <w:tabs>
-          <w:tab w:pos="9071" w:val="right" w:leader="dot"/>
+          <w:tab w:pos="8617" w:val="right" w:leader="dot"/>
         </w:tabs>
         <w:spacing w:before="20" w:after="40" w:line="300" w:lineRule="auto"/>
         <w:ind w:left="340"/>
@@ -1616,14 +1659,15 @@
             <w:sz w:val="23"/>
             <w:color w:val="000000"/>
           </w:rPr>
-          <w:t xml:space="preserve">	15</w:t>
+          <w:tab/>
+          <w:t xml:space="preserve">15</w:t>
         </w:r>
       </w:hyperlink>
     </w:p>
     <w:p>
       <w:pPr>
         <w:tabs>
-          <w:tab w:pos="9071" w:val="right" w:leader="dot"/>
+          <w:tab w:pos="8617" w:val="right" w:leader="dot"/>
         </w:tabs>
         <w:spacing w:before="20" w:after="40" w:line="300" w:lineRule="auto"/>
         <w:ind w:left="340"/>
@@ -1645,14 +1689,15 @@
             <w:sz w:val="23"/>
             <w:color w:val="000000"/>
           </w:rPr>
-          <w:t xml:space="preserve">	15</w:t>
+          <w:tab/>
+          <w:t xml:space="preserve">16</w:t>
         </w:r>
       </w:hyperlink>
     </w:p>
     <w:p>
       <w:pPr>
         <w:tabs>
-          <w:tab w:pos="9071" w:val="right" w:leader="dot"/>
+          <w:tab w:pos="8617" w:val="right" w:leader="dot"/>
         </w:tabs>
         <w:spacing w:before="20" w:after="40" w:line="300" w:lineRule="auto"/>
         <w:ind w:left="340"/>
@@ -1674,14 +1719,15 @@
             <w:sz w:val="23"/>
             <w:color w:val="000000"/>
           </w:rPr>
-          <w:t xml:space="preserve">	16</w:t>
+          <w:tab/>
+          <w:t xml:space="preserve">18</w:t>
         </w:r>
       </w:hyperlink>
     </w:p>
     <w:p>
       <w:pPr>
         <w:tabs>
-          <w:tab w:pos="9071" w:val="right" w:leader="dot"/>
+          <w:tab w:pos="8617" w:val="right" w:leader="dot"/>
         </w:tabs>
         <w:spacing w:before="20" w:after="40" w:line="300" w:lineRule="auto"/>
         <w:ind w:left="340"/>
@@ -1703,14 +1749,15 @@
             <w:sz w:val="23"/>
             <w:color w:val="000000"/>
           </w:rPr>
-          <w:t xml:space="preserve">	17</w:t>
+          <w:tab/>
+          <w:t xml:space="preserve">19</w:t>
         </w:r>
       </w:hyperlink>
     </w:p>
     <w:p>
       <w:pPr>
         <w:tabs>
-          <w:tab w:pos="9071" w:val="right" w:leader="dot"/>
+          <w:tab w:pos="8617" w:val="right" w:leader="dot"/>
         </w:tabs>
         <w:spacing w:before="20" w:after="40" w:line="300" w:lineRule="auto"/>
         <w:ind w:left="340"/>
@@ -1732,14 +1779,15 @@
             <w:sz w:val="23"/>
             <w:color w:val="000000"/>
           </w:rPr>
-          <w:t xml:space="preserve">	17</w:t>
+          <w:tab/>
+          <w:t xml:space="preserve">19</w:t>
         </w:r>
       </w:hyperlink>
     </w:p>
     <w:p>
       <w:pPr>
         <w:tabs>
-          <w:tab w:pos="9071" w:val="right" w:leader="dot"/>
+          <w:tab w:pos="8617" w:val="right" w:leader="dot"/>
         </w:tabs>
         <w:spacing w:before="20" w:after="40" w:line="300" w:lineRule="auto"/>
         <w:ind w:left="340"/>
@@ -1761,14 +1809,15 @@
             <w:sz w:val="23"/>
             <w:color w:val="000000"/>
           </w:rPr>
-          <w:t xml:space="preserve">	19</w:t>
+          <w:tab/>
+          <w:t xml:space="preserve">21</w:t>
         </w:r>
       </w:hyperlink>
     </w:p>
     <w:p>
       <w:pPr>
         <w:tabs>
-          <w:tab w:pos="9071" w:val="right" w:leader="dot"/>
+          <w:tab w:pos="8957" w:val="right" w:leader="dot"/>
         </w:tabs>
         <w:spacing w:before="60" w:after="40" w:line="300" w:lineRule="auto"/>
       </w:pPr>
@@ -1791,14 +1840,15 @@
             <w:b/>
             <w:color w:val="000000"/>
           </w:rPr>
-          <w:t xml:space="preserve">	19</w:t>
+          <w:tab/>
+          <w:t xml:space="preserve">21</w:t>
         </w:r>
       </w:hyperlink>
     </w:p>
     <w:p>
       <w:pPr>
         <w:tabs>
-          <w:tab w:pos="9071" w:val="right" w:leader="dot"/>
+          <w:tab w:pos="8617" w:val="right" w:leader="dot"/>
         </w:tabs>
         <w:spacing w:before="20" w:after="40" w:line="300" w:lineRule="auto"/>
         <w:ind w:left="340"/>
@@ -1820,14 +1870,15 @@
             <w:sz w:val="23"/>
             <w:color w:val="000000"/>
           </w:rPr>
-          <w:t xml:space="preserve">	19</w:t>
+          <w:tab/>
+          <w:t xml:space="preserve">21</w:t>
         </w:r>
       </w:hyperlink>
     </w:p>
     <w:p>
       <w:pPr>
         <w:tabs>
-          <w:tab w:pos="9071" w:val="right" w:leader="dot"/>
+          <w:tab w:pos="8617" w:val="right" w:leader="dot"/>
         </w:tabs>
         <w:spacing w:before="20" w:after="40" w:line="300" w:lineRule="auto"/>
         <w:ind w:left="340"/>
@@ -1849,14 +1900,15 @@
             <w:sz w:val="23"/>
             <w:color w:val="000000"/>
           </w:rPr>
-          <w:t xml:space="preserve">	20</w:t>
+          <w:tab/>
+          <w:t xml:space="preserve">22</w:t>
         </w:r>
       </w:hyperlink>
     </w:p>
     <w:p>
       <w:pPr>
         <w:tabs>
-          <w:tab w:pos="9071" w:val="right" w:leader="dot"/>
+          <w:tab w:pos="8617" w:val="right" w:leader="dot"/>
         </w:tabs>
         <w:spacing w:before="20" w:after="40" w:line="300" w:lineRule="auto"/>
         <w:ind w:left="340"/>
@@ -1878,14 +1930,15 @@
             <w:sz w:val="23"/>
             <w:color w:val="000000"/>
           </w:rPr>
-          <w:t xml:space="preserve">	20</w:t>
+          <w:tab/>
+          <w:t xml:space="preserve">23</w:t>
         </w:r>
       </w:hyperlink>
     </w:p>
     <w:p>
       <w:pPr>
         <w:tabs>
-          <w:tab w:pos="9071" w:val="right" w:leader="dot"/>
+          <w:tab w:pos="8617" w:val="right" w:leader="dot"/>
         </w:tabs>
         <w:spacing w:before="20" w:after="40" w:line="300" w:lineRule="auto"/>
         <w:ind w:left="340"/>
@@ -1907,14 +1960,15 @@
             <w:sz w:val="23"/>
             <w:color w:val="000000"/>
           </w:rPr>
-          <w:t xml:space="preserve">	21</w:t>
+          <w:tab/>
+          <w:t xml:space="preserve">23</w:t>
         </w:r>
       </w:hyperlink>
     </w:p>
     <w:p>
       <w:pPr>
         <w:tabs>
-          <w:tab w:pos="9071" w:val="right" w:leader="dot"/>
+          <w:tab w:pos="8617" w:val="right" w:leader="dot"/>
         </w:tabs>
         <w:spacing w:before="20" w:after="40" w:line="300" w:lineRule="auto"/>
         <w:ind w:left="340"/>
@@ -1936,14 +1990,15 @@
             <w:sz w:val="23"/>
             <w:color w:val="000000"/>
           </w:rPr>
-          <w:t xml:space="preserve">	22</w:t>
+          <w:tab/>
+          <w:t xml:space="preserve">24</w:t>
         </w:r>
       </w:hyperlink>
     </w:p>
     <w:p>
       <w:pPr>
         <w:tabs>
-          <w:tab w:pos="9071" w:val="right" w:leader="dot"/>
+          <w:tab w:pos="8617" w:val="right" w:leader="dot"/>
         </w:tabs>
         <w:spacing w:before="20" w:after="40" w:line="300" w:lineRule="auto"/>
         <w:ind w:left="340"/>
@@ -1965,14 +2020,15 @@
             <w:sz w:val="23"/>
             <w:color w:val="000000"/>
           </w:rPr>
-          <w:t xml:space="preserve">	22</w:t>
+          <w:tab/>
+          <w:t xml:space="preserve">24</w:t>
         </w:r>
       </w:hyperlink>
     </w:p>
     <w:p>
       <w:pPr>
         <w:tabs>
-          <w:tab w:pos="9071" w:val="right" w:leader="dot"/>
+          <w:tab w:pos="8617" w:val="right" w:leader="dot"/>
         </w:tabs>
         <w:spacing w:before="20" w:after="40" w:line="300" w:lineRule="auto"/>
         <w:ind w:left="340"/>
@@ -1994,14 +2050,15 @@
             <w:sz w:val="23"/>
             <w:color w:val="000000"/>
           </w:rPr>
-          <w:t xml:space="preserve">	23</w:t>
+          <w:tab/>
+          <w:t xml:space="preserve">25</w:t>
         </w:r>
       </w:hyperlink>
     </w:p>
     <w:p>
       <w:pPr>
         <w:tabs>
-          <w:tab w:pos="9071" w:val="right" w:leader="dot"/>
+          <w:tab w:pos="8957" w:val="right" w:leader="dot"/>
         </w:tabs>
         <w:spacing w:before="60" w:after="40" w:line="300" w:lineRule="auto"/>
       </w:pPr>
@@ -2024,14 +2081,15 @@
             <w:b/>
             <w:color w:val="000000"/>
           </w:rPr>
-          <w:t xml:space="preserve">	23</w:t>
+          <w:tab/>
+          <w:t xml:space="preserve">25</w:t>
         </w:r>
       </w:hyperlink>
     </w:p>
     <w:p>
       <w:pPr>
         <w:tabs>
-          <w:tab w:pos="9071" w:val="right" w:leader="dot"/>
+          <w:tab w:pos="8617" w:val="right" w:leader="dot"/>
         </w:tabs>
         <w:spacing w:before="20" w:after="40" w:line="300" w:lineRule="auto"/>
         <w:ind w:left="340"/>
@@ -2053,14 +2111,15 @@
             <w:sz w:val="23"/>
             <w:color w:val="000000"/>
           </w:rPr>
-          <w:t xml:space="preserve">	23</w:t>
+          <w:tab/>
+          <w:t xml:space="preserve">25</w:t>
         </w:r>
       </w:hyperlink>
     </w:p>
     <w:p>
       <w:pPr>
         <w:tabs>
-          <w:tab w:pos="9071" w:val="right" w:leader="dot"/>
+          <w:tab w:pos="8617" w:val="right" w:leader="dot"/>
         </w:tabs>
         <w:spacing w:before="20" w:after="40" w:line="300" w:lineRule="auto"/>
         <w:ind w:left="340"/>
@@ -2082,14 +2141,15 @@
             <w:sz w:val="23"/>
             <w:color w:val="000000"/>
           </w:rPr>
-          <w:t xml:space="preserve">	23</w:t>
+          <w:tab/>
+          <w:t xml:space="preserve">25</w:t>
         </w:r>
       </w:hyperlink>
     </w:p>
     <w:p>
       <w:pPr>
         <w:tabs>
-          <w:tab w:pos="9071" w:val="right" w:leader="dot"/>
+          <w:tab w:pos="8617" w:val="right" w:leader="dot"/>
         </w:tabs>
         <w:spacing w:before="20" w:after="40" w:line="300" w:lineRule="auto"/>
         <w:ind w:left="340"/>
@@ -2111,14 +2171,15 @@
             <w:sz w:val="23"/>
             <w:color w:val="000000"/>
           </w:rPr>
-          <w:t xml:space="preserve">	24</w:t>
+          <w:tab/>
+          <w:t xml:space="preserve">26</w:t>
         </w:r>
       </w:hyperlink>
     </w:p>
     <w:p>
       <w:pPr>
         <w:tabs>
-          <w:tab w:pos="9071" w:val="right" w:leader="dot"/>
+          <w:tab w:pos="8617" w:val="right" w:leader="dot"/>
         </w:tabs>
         <w:spacing w:before="20" w:after="40" w:line="300" w:lineRule="auto"/>
         <w:ind w:left="340"/>
@@ -2140,14 +2201,15 @@
             <w:sz w:val="23"/>
             <w:color w:val="000000"/>
           </w:rPr>
-          <w:t xml:space="preserve">	25</w:t>
+          <w:tab/>
+          <w:t xml:space="preserve">27</w:t>
         </w:r>
       </w:hyperlink>
     </w:p>
     <w:p>
       <w:pPr>
         <w:tabs>
-          <w:tab w:pos="9071" w:val="right" w:leader="dot"/>
+          <w:tab w:pos="8617" w:val="right" w:leader="dot"/>
         </w:tabs>
         <w:spacing w:before="20" w:after="40" w:line="300" w:lineRule="auto"/>
         <w:ind w:left="340"/>
@@ -2169,14 +2231,15 @@
             <w:sz w:val="23"/>
             <w:color w:val="000000"/>
           </w:rPr>
-          <w:t xml:space="preserve">	25</w:t>
+          <w:tab/>
+          <w:t xml:space="preserve">27</w:t>
         </w:r>
       </w:hyperlink>
     </w:p>
     <w:p>
       <w:pPr>
         <w:tabs>
-          <w:tab w:pos="9071" w:val="right" w:leader="dot"/>
+          <w:tab w:pos="8957" w:val="right" w:leader="dot"/>
         </w:tabs>
         <w:spacing w:before="60" w:after="40" w:line="300" w:lineRule="auto"/>
       </w:pPr>
@@ -2199,14 +2262,15 @@
             <w:b/>
             <w:color w:val="000000"/>
           </w:rPr>
-          <w:t xml:space="preserve">	25</w:t>
+          <w:tab/>
+          <w:t xml:space="preserve">27</w:t>
         </w:r>
       </w:hyperlink>
     </w:p>
     <w:p>
       <w:pPr>
         <w:tabs>
-          <w:tab w:pos="9071" w:val="right" w:leader="dot"/>
+          <w:tab w:pos="8617" w:val="right" w:leader="dot"/>
         </w:tabs>
         <w:spacing w:before="20" w:after="40" w:line="300" w:lineRule="auto"/>
         <w:ind w:left="340"/>
@@ -2228,14 +2292,15 @@
             <w:sz w:val="23"/>
             <w:color w:val="000000"/>
           </w:rPr>
-          <w:t xml:space="preserve">	26</w:t>
+          <w:tab/>
+          <w:t xml:space="preserve">28</w:t>
         </w:r>
       </w:hyperlink>
     </w:p>
     <w:p>
       <w:pPr>
         <w:tabs>
-          <w:tab w:pos="9071" w:val="right" w:leader="dot"/>
+          <w:tab w:pos="8617" w:val="right" w:leader="dot"/>
         </w:tabs>
         <w:spacing w:before="20" w:after="40" w:line="300" w:lineRule="auto"/>
         <w:ind w:left="340"/>
@@ -2257,7 +2322,8 @@
             <w:sz w:val="23"/>
             <w:color w:val="000000"/>
           </w:rPr>
-          <w:t xml:space="preserve">	26</w:t>
+          <w:tab/>
+          <w:t xml:space="preserve">28</w:t>
         </w:r>
       </w:hyperlink>
     </w:p>
@@ -2298,6 +2364,7 @@
         <w:rPr>
           <w:rFonts w:ascii="Times New Roman" w:hAnsi="Times New Roman"/>
           <w:b/>
+          <w:i w:val="0"/>
           <w:color w:val="000000"/>
           <w:sz w:val="27"/>
         </w:rPr>
@@ -2435,6 +2502,7 @@
         <w:rPr>
           <w:rFonts w:ascii="Times New Roman" w:hAnsi="Times New Roman"/>
           <w:b/>
+          <w:i w:val="0"/>
           <w:color w:val="000000"/>
           <w:sz w:val="27"/>
         </w:rPr>
@@ -2454,6 +2522,7 @@
         <w:rPr>
           <w:rFonts w:ascii="Times New Roman" w:hAnsi="Times New Roman"/>
           <w:b/>
+          <w:i w:val="0"/>
           <w:color w:val="000000"/>
           <w:sz w:val="26"/>
         </w:rPr>
@@ -2587,6 +2656,7 @@
         <w:rPr>
           <w:rFonts w:ascii="Times New Roman" w:hAnsi="Times New Roman"/>
           <w:b/>
+          <w:i w:val="0"/>
           <w:color w:val="000000"/>
           <w:sz w:val="26"/>
         </w:rPr>
@@ -2607,12 +2677,28 @@
           <w:color w:val="000000"/>
           <w:sz w:val="26"/>
         </w:rPr>
-        <w:t xml:space="preserve">Đề tài “Hệ thống phát hiện giao dịch tài chính bất thường và nghi vấn gian lận” kết hợp nhiều nội dung quan trọng của môn Trí tuệ Nhân tạo: biểu diễn dữ liệu, tiền xử lý, học có giám sát, phát hiện bất thường, xử lý dữ liệu mất cân bằng và đánh giá mô hình. Đây cũng là bài toán có ý nghĩa thực tiễn rõ ràng vì quyết định của mô hình liên quan trực tiếp đến hai loại rủi ro: - </w:t>
-      </w:r>
+        <w:t>Đề tài “Hệ thống phát hiện giao dịch tài chính bất thường và nghi vấn gian lận” kết hợp nhiều nội dung quan trọng của môn Trí tuệ Nhân tạo: biểu diễn dữ liệu, tiền xử lý, học có giám sát, phát hiện bất thường, xử lý dữ liệu mất cân bằng và đánh giá mô hình. Đây cũng là bài toán có ý nghĩa thực tiễn rõ ràng vì quyết định của mô hình liên quan trực tiếp đến hai loại rủi ro:</w:t>
+      </w:r>
+    </w:p>
+    <w:p>
+      <w:pPr>
+        <w:spacing w:before="20" w:after="40" w:line="300" w:lineRule="auto"/>
+        <w:ind w:left="720" w:hanging="283"/>
+        <w:jc w:val="left"/>
+      </w:pPr>
       <w:r>
         <w:rPr>
           <w:rFonts w:ascii="Times New Roman" w:hAnsi="Times New Roman"/>
           <w:b/>
+          <w:color w:val="000000"/>
+          <w:sz w:val="26"/>
+        </w:rPr>
+        <w:t xml:space="preserve">-  </w:t>
+      </w:r>
+      <w:r>
+        <w:rPr>
+          <w:rFonts w:ascii="Times New Roman" w:hAnsi="Times New Roman"/>
+          <w:b/>
           <w:i w:val="0"/>
           <w:color w:val="000000"/>
           <w:sz w:val="26"/>
@@ -2627,7 +2713,23 @@
           <w:color w:val="000000"/>
           <w:sz w:val="26"/>
         </w:rPr>
-        <w:t xml:space="preserve"> giao dịch gian lận không được phát hiện, có thể gây thiệt hại tài chính. - </w:t>
+        <w:t xml:space="preserve"> giao dịch gian lận không được phát hiện, có thể gây thiệt hại tài chính.</w:t>
+      </w:r>
+    </w:p>
+    <w:p>
+      <w:pPr>
+        <w:spacing w:before="20" w:after="40" w:line="300" w:lineRule="auto"/>
+        <w:ind w:left="720" w:hanging="283"/>
+        <w:jc w:val="left"/>
+      </w:pPr>
+      <w:r>
+        <w:rPr>
+          <w:rFonts w:ascii="Times New Roman" w:hAnsi="Times New Roman"/>
+          <w:b/>
+          <w:color w:val="000000"/>
+          <w:sz w:val="26"/>
+        </w:rPr>
+        <w:t xml:space="preserve">-  </w:t>
       </w:r>
       <w:r>
         <w:rPr>
@@ -2680,6 +2782,7 @@
         <w:rPr>
           <w:rFonts w:ascii="Times New Roman" w:hAnsi="Times New Roman"/>
           <w:b/>
+          <w:i w:val="0"/>
           <w:color w:val="000000"/>
           <w:sz w:val="26"/>
         </w:rPr>
@@ -2747,7 +2850,7 @@
       <w:pPr>
         <w:spacing w:before="20" w:after="40" w:line="300" w:lineRule="auto"/>
         <w:ind w:left="720" w:hanging="283"/>
-        <w:jc w:val="both"/>
+        <w:jc w:val="left"/>
       </w:pPr>
       <w:r>
         <w:rPr>
@@ -2773,7 +2876,7 @@
       <w:pPr>
         <w:spacing w:before="20" w:after="40" w:line="300" w:lineRule="auto"/>
         <w:ind w:left="720" w:hanging="283"/>
-        <w:jc w:val="both"/>
+        <w:jc w:val="left"/>
       </w:pPr>
       <w:r>
         <w:rPr>
@@ -2799,7 +2902,7 @@
       <w:pPr>
         <w:spacing w:before="20" w:after="40" w:line="300" w:lineRule="auto"/>
         <w:ind w:left="720" w:hanging="283"/>
-        <w:jc w:val="both"/>
+        <w:jc w:val="left"/>
       </w:pPr>
       <w:r>
         <w:rPr>
@@ -2825,7 +2928,7 @@
       <w:pPr>
         <w:spacing w:before="20" w:after="40" w:line="300" w:lineRule="auto"/>
         <w:ind w:left="720" w:hanging="283"/>
-        <w:jc w:val="both"/>
+        <w:jc w:val="left"/>
       </w:pPr>
       <w:r>
         <w:rPr>
@@ -2851,7 +2954,7 @@
       <w:pPr>
         <w:spacing w:before="20" w:after="40" w:line="300" w:lineRule="auto"/>
         <w:ind w:left="720" w:hanging="283"/>
-        <w:jc w:val="both"/>
+        <w:jc w:val="left"/>
       </w:pPr>
       <w:r>
         <w:rPr>
@@ -2877,7 +2980,7 @@
       <w:pPr>
         <w:spacing w:before="20" w:after="40" w:line="300" w:lineRule="auto"/>
         <w:ind w:left="720" w:hanging="283"/>
-        <w:jc w:val="both"/>
+        <w:jc w:val="left"/>
       </w:pPr>
       <w:r>
         <w:rPr>
@@ -2903,7 +3006,7 @@
       <w:pPr>
         <w:spacing w:before="20" w:after="40" w:line="300" w:lineRule="auto"/>
         <w:ind w:left="720" w:hanging="283"/>
-        <w:jc w:val="both"/>
+        <w:jc w:val="left"/>
       </w:pPr>
       <w:r>
         <w:rPr>
@@ -2939,7 +3042,7 @@
           <w:color w:val="000000"/>
           <w:sz w:val="24"/>
         </w:rPr>
-        <w:t>Bản nháp hiện tại đã mô tả quy trình tiền xử lý, xử lý mất cân bằng và ba họ mô hình. Các kết luận thực nghiệm vẫn được giới hạn trong tập kiểm tra PaySim đã xử lý và sẽ được rà soát lại trước khi hoàn thiện báo cáo cuối.</w:t>
+        <w:t>Báo cáo đã trình bày quy trình tiền xử lý, xử lý mất cân bằng và cả ba họ mô hình. Các kết luận thực nghiệm được giới hạn trong tập kiểm tra PaySim đã xử lý, không suy rộng sang dữ liệu giao dịch thực tế.</w:t>
       </w:r>
     </w:p>
     <w:p>
@@ -2955,6 +3058,7 @@
         <w:rPr>
           <w:rFonts w:ascii="Times New Roman" w:hAnsi="Times New Roman"/>
           <w:b/>
+          <w:i w:val="0"/>
           <w:color w:val="000000"/>
           <w:sz w:val="26"/>
         </w:rPr>
@@ -2965,7 +3069,7 @@
       <w:pPr>
         <w:spacing w:before="20" w:after="40" w:line="300" w:lineRule="auto"/>
         <w:ind w:left="720" w:hanging="283"/>
-        <w:jc w:val="both"/>
+        <w:jc w:val="left"/>
       </w:pPr>
       <w:r>
         <w:rPr>
@@ -3001,7 +3105,7 @@
       <w:pPr>
         <w:spacing w:before="20" w:after="40" w:line="300" w:lineRule="auto"/>
         <w:ind w:left="720" w:hanging="283"/>
-        <w:jc w:val="both"/>
+        <w:jc w:val="left"/>
       </w:pPr>
       <w:r>
         <w:rPr>
@@ -3077,7 +3181,7 @@
       <w:pPr>
         <w:spacing w:before="20" w:after="40" w:line="300" w:lineRule="auto"/>
         <w:ind w:left="720" w:hanging="283"/>
-        <w:jc w:val="both"/>
+        <w:jc w:val="left"/>
       </w:pPr>
       <w:r>
         <w:rPr>
@@ -3153,7 +3257,7 @@
       <w:pPr>
         <w:spacing w:before="20" w:after="40" w:line="300" w:lineRule="auto"/>
         <w:ind w:left="720" w:hanging="283"/>
-        <w:jc w:val="both"/>
+        <w:jc w:val="left"/>
       </w:pPr>
       <w:r>
         <w:rPr>
@@ -3189,7 +3293,7 @@
       <w:pPr>
         <w:spacing w:before="20" w:after="40" w:line="300" w:lineRule="auto"/>
         <w:ind w:left="720" w:hanging="283"/>
-        <w:jc w:val="both"/>
+        <w:jc w:val="left"/>
       </w:pPr>
       <w:r>
         <w:rPr>
@@ -3225,7 +3329,7 @@
       <w:pPr>
         <w:spacing w:before="20" w:after="40" w:line="300" w:lineRule="auto"/>
         <w:ind w:left="720" w:hanging="283"/>
-        <w:jc w:val="both"/>
+        <w:jc w:val="left"/>
       </w:pPr>
       <w:r>
         <w:rPr>
@@ -3270,6 +3374,7 @@
         <w:rPr>
           <w:rFonts w:ascii="Times New Roman" w:hAnsi="Times New Roman"/>
           <w:b/>
+          <w:i w:val="0"/>
           <w:color w:val="000000"/>
           <w:sz w:val="26"/>
         </w:rPr>
@@ -3280,7 +3385,7 @@
       <w:pPr>
         <w:spacing w:before="20" w:after="40" w:line="300" w:lineRule="auto"/>
         <w:ind w:left="720" w:hanging="283"/>
-        <w:jc w:val="both"/>
+        <w:jc w:val="left"/>
       </w:pPr>
       <w:r>
         <w:rPr>
@@ -3306,7 +3411,7 @@
       <w:pPr>
         <w:spacing w:before="20" w:after="40" w:line="300" w:lineRule="auto"/>
         <w:ind w:left="720" w:hanging="283"/>
-        <w:jc w:val="both"/>
+        <w:jc w:val="left"/>
       </w:pPr>
       <w:r>
         <w:rPr>
@@ -3332,7 +3437,7 @@
       <w:pPr>
         <w:spacing w:before="20" w:after="40" w:line="300" w:lineRule="auto"/>
         <w:ind w:left="720" w:hanging="283"/>
-        <w:jc w:val="both"/>
+        <w:jc w:val="left"/>
       </w:pPr>
       <w:r>
         <w:rPr>
@@ -3358,7 +3463,7 @@
       <w:pPr>
         <w:spacing w:before="20" w:after="40" w:line="300" w:lineRule="auto"/>
         <w:ind w:left="720" w:hanging="283"/>
-        <w:jc w:val="both"/>
+        <w:jc w:val="left"/>
       </w:pPr>
       <w:r>
         <w:rPr>
@@ -3384,7 +3489,7 @@
       <w:pPr>
         <w:spacing w:before="20" w:after="40" w:line="300" w:lineRule="auto"/>
         <w:ind w:left="720" w:hanging="283"/>
-        <w:jc w:val="both"/>
+        <w:jc w:val="left"/>
       </w:pPr>
       <w:r>
         <w:rPr>
@@ -3410,7 +3515,7 @@
       <w:pPr>
         <w:spacing w:before="20" w:after="40" w:line="300" w:lineRule="auto"/>
         <w:ind w:left="720" w:hanging="283"/>
-        <w:jc w:val="both"/>
+        <w:jc w:val="left"/>
       </w:pPr>
       <w:r>
         <w:rPr>
@@ -3436,7 +3541,7 @@
       <w:pPr>
         <w:spacing w:before="20" w:after="40" w:line="300" w:lineRule="auto"/>
         <w:ind w:left="720" w:hanging="283"/>
-        <w:jc w:val="both"/>
+        <w:jc w:val="left"/>
       </w:pPr>
       <w:r>
         <w:rPr>
@@ -3462,7 +3567,7 @@
       <w:pPr>
         <w:spacing w:before="20" w:after="40" w:line="300" w:lineRule="auto"/>
         <w:ind w:left="720" w:hanging="283"/>
-        <w:jc w:val="both"/>
+        <w:jc w:val="left"/>
       </w:pPr>
       <w:r>
         <w:rPr>
@@ -3497,6 +3602,7 @@
         <w:rPr>
           <w:rFonts w:ascii="Times New Roman" w:hAnsi="Times New Roman"/>
           <w:b/>
+          <w:i w:val="0"/>
           <w:color w:val="000000"/>
           <w:sz w:val="27"/>
         </w:rPr>
@@ -3516,6 +3622,7 @@
         <w:rPr>
           <w:rFonts w:ascii="Times New Roman" w:hAnsi="Times New Roman"/>
           <w:b/>
+          <w:i w:val="0"/>
           <w:color w:val="000000"/>
           <w:sz w:val="26"/>
         </w:rPr>
@@ -3536,7 +3643,59 @@
           <w:color w:val="000000"/>
           <w:sz w:val="26"/>
         </w:rPr>
-        <w:t>Cho tập dữ liệu giao dịch tài chính, mỗi giao dịch được biểu diễn bởi vector đặc trưng $x$. Mục tiêu là xây dựng hàm dự đoán $f(x)$ trả về một trong hai nhãn: - $f(x) = 0$: giao dịch hợp lệ. - $f(x) = 1$: giao dịch gian lận.</w:t>
+        <w:t>Cho tập dữ liệu giao dịch tài chính, mỗi giao dịch được biểu diễn bởi vector đặc trưng $x$. Mục tiêu là xây dựng hàm dự đoán $f(x)$ trả về một trong hai nhãn:</w:t>
+      </w:r>
+    </w:p>
+    <w:p>
+      <w:pPr>
+        <w:spacing w:before="20" w:after="40" w:line="300" w:lineRule="auto"/>
+        <w:ind w:left="720" w:hanging="283"/>
+        <w:jc w:val="left"/>
+      </w:pPr>
+      <w:r>
+        <w:rPr>
+          <w:rFonts w:ascii="Times New Roman" w:hAnsi="Times New Roman"/>
+          <w:b/>
+          <w:color w:val="000000"/>
+          <w:sz w:val="26"/>
+        </w:rPr>
+        <w:t xml:space="preserve">-  </w:t>
+      </w:r>
+      <w:r>
+        <w:rPr>
+          <w:rFonts w:ascii="Times New Roman" w:hAnsi="Times New Roman"/>
+          <w:b w:val="0"/>
+          <w:i w:val="0"/>
+          <w:color w:val="000000"/>
+          <w:sz w:val="26"/>
+        </w:rPr>
+        <w:t>$f(x) = 0$: giao dịch hợp lệ.</w:t>
+      </w:r>
+    </w:p>
+    <w:p>
+      <w:pPr>
+        <w:spacing w:before="20" w:after="40" w:line="300" w:lineRule="auto"/>
+        <w:ind w:left="720" w:hanging="283"/>
+        <w:jc w:val="left"/>
+      </w:pPr>
+      <w:r>
+        <w:rPr>
+          <w:rFonts w:ascii="Times New Roman" w:hAnsi="Times New Roman"/>
+          <w:b/>
+          <w:color w:val="000000"/>
+          <w:sz w:val="26"/>
+        </w:rPr>
+        <w:t xml:space="preserve">-  </w:t>
+      </w:r>
+      <w:r>
+        <w:rPr>
+          <w:rFonts w:ascii="Times New Roman" w:hAnsi="Times New Roman"/>
+          <w:b w:val="0"/>
+          <w:i w:val="0"/>
+          <w:color w:val="000000"/>
+          <w:sz w:val="26"/>
+        </w:rPr>
+        <w:t>$f(x) = 1$: giao dịch gian lận.</w:t>
       </w:r>
     </w:p>
     <w:p>
@@ -3606,6 +3765,7 @@
         <w:rPr>
           <w:rFonts w:ascii="Times New Roman" w:hAnsi="Times New Roman"/>
           <w:b/>
+          <w:i w:val="0"/>
           <w:color w:val="000000"/>
           <w:sz w:val="26"/>
         </w:rPr>
@@ -3651,7 +3811,7 @@
       <w:pPr>
         <w:spacing w:before="20" w:after="40" w:line="300" w:lineRule="auto"/>
         <w:ind w:left="720" w:hanging="283"/>
-        <w:jc w:val="both"/>
+        <w:jc w:val="left"/>
       </w:pPr>
       <w:r>
         <w:rPr>
@@ -3697,7 +3857,7 @@
       <w:pPr>
         <w:spacing w:before="20" w:after="40" w:line="300" w:lineRule="auto"/>
         <w:ind w:left="720" w:hanging="283"/>
-        <w:jc w:val="both"/>
+        <w:jc w:val="left"/>
       </w:pPr>
       <w:r>
         <w:rPr>
@@ -3723,7 +3883,7 @@
       <w:pPr>
         <w:spacing w:before="20" w:after="40" w:line="300" w:lineRule="auto"/>
         <w:ind w:left="720" w:hanging="283"/>
-        <w:jc w:val="both"/>
+        <w:jc w:val="left"/>
       </w:pPr>
       <w:r>
         <w:rPr>
@@ -3749,7 +3909,7 @@
       <w:pPr>
         <w:spacing w:before="20" w:after="40" w:line="300" w:lineRule="auto"/>
         <w:ind w:left="720" w:hanging="283"/>
-        <w:jc w:val="both"/>
+        <w:jc w:val="left"/>
       </w:pPr>
       <w:r>
         <w:rPr>
@@ -3775,7 +3935,7 @@
       <w:pPr>
         <w:spacing w:before="20" w:after="40" w:line="300" w:lineRule="auto"/>
         <w:ind w:left="720" w:hanging="283"/>
-        <w:jc w:val="both"/>
+        <w:jc w:val="left"/>
       </w:pPr>
       <w:r>
         <w:rPr>
@@ -3801,7 +3961,7 @@
       <w:pPr>
         <w:spacing w:before="20" w:after="40" w:line="300" w:lineRule="auto"/>
         <w:ind w:left="720" w:hanging="283"/>
-        <w:jc w:val="both"/>
+        <w:jc w:val="left"/>
       </w:pPr>
       <w:r>
         <w:rPr>
@@ -3827,7 +3987,7 @@
       <w:pPr>
         <w:spacing w:before="20" w:after="40" w:line="300" w:lineRule="auto"/>
         <w:ind w:left="720" w:hanging="283"/>
-        <w:jc w:val="both"/>
+        <w:jc w:val="left"/>
       </w:pPr>
       <w:r>
         <w:rPr>
@@ -3853,7 +4013,7 @@
       <w:pPr>
         <w:spacing w:before="20" w:after="40" w:line="300" w:lineRule="auto"/>
         <w:ind w:left="720" w:hanging="283"/>
-        <w:jc w:val="both"/>
+        <w:jc w:val="left"/>
       </w:pPr>
       <w:r>
         <w:rPr>
@@ -3917,7 +4077,7 @@
       <w:pPr>
         <w:spacing w:before="20" w:after="40" w:line="300" w:lineRule="auto"/>
         <w:ind w:left="720" w:hanging="283"/>
-        <w:jc w:val="both"/>
+        <w:jc w:val="left"/>
       </w:pPr>
       <w:r>
         <w:rPr>
@@ -3983,7 +4143,7 @@
       <w:pPr>
         <w:spacing w:before="20" w:after="40" w:line="300" w:lineRule="auto"/>
         <w:ind w:left="720" w:hanging="283"/>
-        <w:jc w:val="both"/>
+        <w:jc w:val="left"/>
       </w:pPr>
       <w:r>
         <w:rPr>
@@ -4009,7 +4169,7 @@
       <w:pPr>
         <w:spacing w:before="20" w:after="40" w:line="300" w:lineRule="auto"/>
         <w:ind w:left="720" w:hanging="283"/>
-        <w:jc w:val="both"/>
+        <w:jc w:val="left"/>
       </w:pPr>
       <w:r>
         <w:rPr>
@@ -4044,6 +4204,7 @@
         <w:rPr>
           <w:rFonts w:ascii="Times New Roman" w:hAnsi="Times New Roman"/>
           <w:b/>
+          <w:i w:val="0"/>
           <w:color w:val="000000"/>
           <w:sz w:val="26"/>
         </w:rPr>
@@ -4273,6 +4434,7 @@
         <w:rPr>
           <w:rFonts w:ascii="Times New Roman" w:hAnsi="Times New Roman"/>
           <w:b/>
+          <w:i w:val="0"/>
           <w:color w:val="000000"/>
           <w:sz w:val="26"/>
         </w:rPr>
@@ -4300,7 +4462,7 @@
       <w:pPr>
         <w:spacing w:before="20" w:after="40" w:line="300" w:lineRule="auto"/>
         <w:ind w:left="720" w:hanging="283"/>
-        <w:jc w:val="both"/>
+        <w:jc w:val="left"/>
       </w:pPr>
       <w:r>
         <w:rPr>
@@ -4326,7 +4488,7 @@
       <w:pPr>
         <w:spacing w:before="20" w:after="40" w:line="300" w:lineRule="auto"/>
         <w:ind w:left="720" w:hanging="283"/>
-        <w:jc w:val="both"/>
+        <w:jc w:val="left"/>
       </w:pPr>
       <w:r>
         <w:rPr>
@@ -4352,7 +4514,7 @@
       <w:pPr>
         <w:spacing w:before="20" w:after="40" w:line="300" w:lineRule="auto"/>
         <w:ind w:left="720" w:hanging="283"/>
-        <w:jc w:val="both"/>
+        <w:jc w:val="left"/>
       </w:pPr>
       <w:r>
         <w:rPr>
@@ -4378,7 +4540,7 @@
       <w:pPr>
         <w:spacing w:before="20" w:after="40" w:line="300" w:lineRule="auto"/>
         <w:ind w:left="720" w:hanging="283"/>
-        <w:jc w:val="both"/>
+        <w:jc w:val="left"/>
       </w:pPr>
       <w:r>
         <w:rPr>
@@ -4404,7 +4566,7 @@
       <w:pPr>
         <w:spacing w:before="20" w:after="40" w:line="300" w:lineRule="auto"/>
         <w:ind w:left="720" w:hanging="283"/>
-        <w:jc w:val="both"/>
+        <w:jc w:val="left"/>
       </w:pPr>
       <w:r>
         <w:rPr>
@@ -4430,7 +4592,7 @@
       <w:pPr>
         <w:spacing w:before="20" w:after="40" w:line="300" w:lineRule="auto"/>
         <w:ind w:left="720" w:hanging="283"/>
-        <w:jc w:val="both"/>
+        <w:jc w:val="left"/>
       </w:pPr>
       <w:r>
         <w:rPr>
@@ -4482,6 +4644,7 @@
         <w:rPr>
           <w:rFonts w:ascii="Times New Roman" w:hAnsi="Times New Roman"/>
           <w:b/>
+          <w:i w:val="0"/>
           <w:color w:val="000000"/>
           <w:sz w:val="26"/>
         </w:rPr>
@@ -4502,7 +4665,85 @@
           <w:color w:val="000000"/>
           <w:sz w:val="26"/>
         </w:rPr>
-        <w:t>Báo cáo hướng tới trả lời các câu hỏi sau khi hoàn tất thực nghiệm: - Kỹ thuật xử lý mất cân bằng nào phù hợp hơn trên tập PaySim đã tiền xử lý? - Trong các mô hình được thử nghiệm, mô hình nào đạt cân bằng tốt nhất giữa Precision và Recall cho lớp fraud? - Các đặc trưng nào đóng góp nhiều nhất vào quyết định của mô hình, và các đặc trưng này có nguy cơ phản ánh cơ chế mô phỏng của PaySim hay không?</w:t>
+        <w:t>Báo cáo hướng tới trả lời các câu hỏi sau khi hoàn tất thực nghiệm:</w:t>
+      </w:r>
+    </w:p>
+    <w:p>
+      <w:pPr>
+        <w:spacing w:before="20" w:after="40" w:line="300" w:lineRule="auto"/>
+        <w:ind w:left="720" w:hanging="283"/>
+        <w:jc w:val="left"/>
+      </w:pPr>
+      <w:r>
+        <w:rPr>
+          <w:rFonts w:ascii="Times New Roman" w:hAnsi="Times New Roman"/>
+          <w:b/>
+          <w:color w:val="000000"/>
+          <w:sz w:val="26"/>
+        </w:rPr>
+        <w:t xml:space="preserve">-  </w:t>
+      </w:r>
+      <w:r>
+        <w:rPr>
+          <w:rFonts w:ascii="Times New Roman" w:hAnsi="Times New Roman"/>
+          <w:b w:val="0"/>
+          <w:i w:val="0"/>
+          <w:color w:val="000000"/>
+          <w:sz w:val="26"/>
+        </w:rPr>
+        <w:t>Kỹ thuật xử lý mất cân bằng nào phù hợp hơn trên tập PaySim đã tiền xử lý?</w:t>
+      </w:r>
+    </w:p>
+    <w:p>
+      <w:pPr>
+        <w:spacing w:before="20" w:after="40" w:line="300" w:lineRule="auto"/>
+        <w:ind w:left="720" w:hanging="283"/>
+        <w:jc w:val="left"/>
+      </w:pPr>
+      <w:r>
+        <w:rPr>
+          <w:rFonts w:ascii="Times New Roman" w:hAnsi="Times New Roman"/>
+          <w:b/>
+          <w:color w:val="000000"/>
+          <w:sz w:val="26"/>
+        </w:rPr>
+        <w:t xml:space="preserve">-  </w:t>
+      </w:r>
+      <w:r>
+        <w:rPr>
+          <w:rFonts w:ascii="Times New Roman" w:hAnsi="Times New Roman"/>
+          <w:b w:val="0"/>
+          <w:i w:val="0"/>
+          <w:color w:val="000000"/>
+          <w:sz w:val="26"/>
+        </w:rPr>
+        <w:t>Trong các mô hình được thử nghiệm, mô hình nào đạt cân bằng tốt nhất giữa Precision và Recall cho lớp fraud?</w:t>
+      </w:r>
+    </w:p>
+    <w:p>
+      <w:pPr>
+        <w:spacing w:before="20" w:after="40" w:line="300" w:lineRule="auto"/>
+        <w:ind w:left="720" w:hanging="283"/>
+        <w:jc w:val="left"/>
+      </w:pPr>
+      <w:r>
+        <w:rPr>
+          <w:rFonts w:ascii="Times New Roman" w:hAnsi="Times New Roman"/>
+          <w:b/>
+          <w:color w:val="000000"/>
+          <w:sz w:val="26"/>
+        </w:rPr>
+        <w:t xml:space="preserve">-  </w:t>
+      </w:r>
+      <w:r>
+        <w:rPr>
+          <w:rFonts w:ascii="Times New Roman" w:hAnsi="Times New Roman"/>
+          <w:b w:val="0"/>
+          <w:i w:val="0"/>
+          <w:color w:val="000000"/>
+          <w:sz w:val="26"/>
+        </w:rPr>
+        <w:t>Các đặc trưng nào đóng góp nhiều nhất vào quyết định của mô hình, và các đặc trưng này có nguy cơ phản ánh cơ chế mô phỏng của PaySim hay không?</w:t>
       </w:r>
     </w:p>
     <w:p>
@@ -4518,6 +4759,7 @@
         <w:rPr>
           <w:rFonts w:ascii="Times New Roman" w:hAnsi="Times New Roman"/>
           <w:b/>
+          <w:i w:val="0"/>
           <w:color w:val="000000"/>
           <w:sz w:val="27"/>
         </w:rPr>
@@ -4537,6 +4779,7 @@
         <w:rPr>
           <w:rFonts w:ascii="Times New Roman" w:hAnsi="Times New Roman"/>
           <w:b/>
+          <w:i w:val="0"/>
           <w:color w:val="000000"/>
           <w:sz w:val="26"/>
         </w:rPr>
@@ -4773,6 +5016,7 @@
         <w:rPr>
           <w:rFonts w:ascii="Times New Roman" w:hAnsi="Times New Roman"/>
           <w:b/>
+          <w:i w:val="0"/>
           <w:color w:val="000000"/>
           <w:sz w:val="26"/>
         </w:rPr>
@@ -4783,8 +5027,6 @@
       <w:tblPr>
         <w:tblW w:type="auto" w:w="0"/>
         <w:jc w:val="center"/>
-        <w:tblLayout w:type="fixed"/>
-        <w:tblLook w:firstColumn="1" w:firstRow="1" w:lastColumn="0" w:lastRow="0" w:noHBand="0" w:noVBand="1" w:val="04A0"/>
         <w:tblBorders>
           <w:top w:val="single" w:sz="6" w:space="0" w:color="CCCCCC"/>
           <w:bottom w:val="single" w:sz="6" w:space="0" w:color="CCCCCC"/>
@@ -4793,6 +5035,8 @@
           <w:left w:val="none"/>
           <w:right w:val="none"/>
         </w:tblBorders>
+        <w:tblLayout w:type="fixed"/>
+        <w:tblLook w:firstColumn="1" w:firstRow="1" w:lastColumn="0" w:lastRow="0" w:noHBand="0" w:noVBand="1" w:val="04A0"/>
       </w:tblPr>
       <w:tblGrid>
         <w:gridCol w:w="3024"/>
@@ -4801,8 +5045,8 @@
       </w:tblGrid>
       <w:tr>
         <w:trPr>
+          <w:cantSplit/>
           <w:tblHeader/>
-          <w:cantSplit/>
         </w:trPr>
         <w:tc>
           <w:tcPr>
@@ -6015,6 +6259,7 @@
         <w:rPr>
           <w:rFonts w:ascii="Times New Roman" w:hAnsi="Times New Roman"/>
           <w:b/>
+          <w:i w:val="0"/>
           <w:color w:val="000000"/>
           <w:sz w:val="26"/>
         </w:rPr>
@@ -6025,8 +6270,6 @@
       <w:tblPr>
         <w:tblW w:type="auto" w:w="0"/>
         <w:jc w:val="center"/>
-        <w:tblLayout w:type="fixed"/>
-        <w:tblLook w:firstColumn="1" w:firstRow="1" w:lastColumn="0" w:lastRow="0" w:noHBand="0" w:noVBand="1" w:val="04A0"/>
         <w:tblBorders>
           <w:top w:val="single" w:sz="6" w:space="0" w:color="CCCCCC"/>
           <w:bottom w:val="single" w:sz="6" w:space="0" w:color="CCCCCC"/>
@@ -6035,6 +6278,8 @@
           <w:left w:val="none"/>
           <w:right w:val="none"/>
         </w:tblBorders>
+        <w:tblLayout w:type="fixed"/>
+        <w:tblLook w:firstColumn="1" w:firstRow="1" w:lastColumn="0" w:lastRow="0" w:noHBand="0" w:noVBand="1" w:val="04A0"/>
       </w:tblPr>
       <w:tblGrid>
         <w:gridCol w:w="2268"/>
@@ -6044,8 +6289,8 @@
       </w:tblGrid>
       <w:tr>
         <w:trPr>
+          <w:cantSplit/>
           <w:tblHeader/>
-          <w:cantSplit/>
         </w:trPr>
         <w:tc>
           <w:tcPr>
@@ -6978,6 +7223,7 @@
         <w:rPr>
           <w:rFonts w:ascii="Times New Roman" w:hAnsi="Times New Roman"/>
           <w:b/>
+          <w:i w:val="0"/>
           <w:color w:val="000000"/>
           <w:sz w:val="26"/>
         </w:rPr>
@@ -7025,8 +7271,6 @@
       <w:tblPr>
         <w:tblW w:type="auto" w:w="0"/>
         <w:jc w:val="center"/>
-        <w:tblLayout w:type="fixed"/>
-        <w:tblLook w:firstColumn="1" w:firstRow="1" w:lastColumn="0" w:lastRow="0" w:noHBand="0" w:noVBand="1" w:val="04A0"/>
         <w:tblBorders>
           <w:top w:val="single" w:sz="6" w:space="0" w:color="CCCCCC"/>
           <w:bottom w:val="single" w:sz="6" w:space="0" w:color="CCCCCC"/>
@@ -7035,6 +7279,8 @@
           <w:left w:val="none"/>
           <w:right w:val="none"/>
         </w:tblBorders>
+        <w:tblLayout w:type="fixed"/>
+        <w:tblLook w:firstColumn="1" w:firstRow="1" w:lastColumn="0" w:lastRow="0" w:noHBand="0" w:noVBand="1" w:val="04A0"/>
       </w:tblPr>
       <w:tblGrid>
         <w:gridCol w:w="1814"/>
@@ -7045,8 +7291,8 @@
       </w:tblGrid>
       <w:tr>
         <w:trPr>
+          <w:cantSplit/>
           <w:tblHeader/>
-          <w:cantSplit/>
         </w:trPr>
         <w:tc>
           <w:tcPr>
@@ -7840,6 +8086,7 @@
         <w:rPr>
           <w:rFonts w:ascii="Times New Roman" w:hAnsi="Times New Roman"/>
           <w:b/>
+          <w:i w:val="0"/>
           <w:color w:val="000000"/>
           <w:sz w:val="26"/>
         </w:rPr>
@@ -7967,8 +8214,6 @@
       <w:tblPr>
         <w:tblW w:type="auto" w:w="0"/>
         <w:jc w:val="center"/>
-        <w:tblLayout w:type="fixed"/>
-        <w:tblLook w:firstColumn="1" w:firstRow="1" w:lastColumn="0" w:lastRow="0" w:noHBand="0" w:noVBand="1" w:val="04A0"/>
         <w:tblBorders>
           <w:top w:val="single" w:sz="6" w:space="0" w:color="CCCCCC"/>
           <w:bottom w:val="single" w:sz="6" w:space="0" w:color="CCCCCC"/>
@@ -7977,6 +8222,8 @@
           <w:left w:val="none"/>
           <w:right w:val="none"/>
         </w:tblBorders>
+        <w:tblLayout w:type="fixed"/>
+        <w:tblLook w:firstColumn="1" w:firstRow="1" w:lastColumn="0" w:lastRow="0" w:noHBand="0" w:noVBand="1" w:val="04A0"/>
       </w:tblPr>
       <w:tblGrid>
         <w:gridCol w:w="3024"/>
@@ -7985,8 +8232,8 @@
       </w:tblGrid>
       <w:tr>
         <w:trPr>
+          <w:cantSplit/>
           <w:tblHeader/>
-          <w:cantSplit/>
         </w:trPr>
         <w:tc>
           <w:tcPr>
@@ -9464,6 +9711,7 @@
         <w:rPr>
           <w:rFonts w:ascii="Times New Roman" w:hAnsi="Times New Roman"/>
           <w:b/>
+          <w:i w:val="0"/>
           <w:color w:val="000000"/>
           <w:sz w:val="26"/>
         </w:rPr>
@@ -9504,7 +9752,7 @@
           <w:color w:val="000000"/>
           <w:sz w:val="26"/>
         </w:rPr>
-        <w:t>Fraud ratio tăng từ 0,129082% lên khoảng 4,1065% sau downsample. Do Precision và đường Precision-Recall phụ thuộc vào prevalence, kết quả trên test downsample không thể được trình bày như hiệu năng trên phân bố PaySim gốc hoặc trên hệ thống thật.</w:t>
+        <w:t>Fraud ratio tăng từ 0,129082% lên khoảng 4,1065% sau downsample. Do Precision và đường Precision–Recall phụ thuộc vào prevalence, kết quả trên test downsample không thể được trình bày như hiệu năng trên phân bố PaySim gốc hoặc trên hệ thống thật.</w:t>
       </w:r>
     </w:p>
     <w:p>
@@ -9642,7 +9890,7 @@
           <w:color w:val="000000"/>
           <w:sz w:val="26"/>
         </w:rPr>
-        <w:t xml:space="preserve"> để phát hiện gian lận. Quy trình hiện tại vẫn sử dụng các cột số dư và hai đặc trưng sai lệch số dư. Vì vậy, mô hình có thể học tín hiệu phát sinh từ cơ chế cập nhật hoặc hủy giao dịch của bộ mô phỏng. Mục 5.5 cho thấy nhóm đặc trưng này thực sự chiếm phần lớn mức đóng góp của cả Random Forest và XGBoost. Báo cáo xem đây là một nguy cơ ảnh hưởng tính hợp lệ. Phép kiểm tra dứt điểm là huấn luyện lại mô hình sau khi loại nhóm đặc trưng số dư rồi so sánh hiệu năng. Thí nghiệm này nằm ngoài phạm vi bản nháp hiện tại và được ghi nhận như một hướng kiểm chứng cần thực hiện trước khi khẳng định kết quả.</w:t>
+        <w:t xml:space="preserve"> để phát hiện gian lận. Quy trình hiện tại vẫn sử dụng các cột số dư và hai đặc trưng sai lệch số dư. Vì vậy, mô hình có thể học tín hiệu phát sinh từ cơ chế cập nhật hoặc hủy giao dịch của bộ mô phỏng. Mục 5.5 cho thấy nhóm đặc trưng này thực sự chiếm phần lớn mức đóng góp của cả Random Forest và XGBoost. Báo cáo xem đây là một nguy cơ ảnh hưởng tính hợp lệ. Phép kiểm tra dứt điểm là huấn luyện lại mô hình sau khi loại nhóm đặc trưng số dư rồi so sánh hiệu năng. Thí nghiệm này nằm ngoài phạm vi đồ án và được ghi nhận tại Mục 7.4 như hướng kiểm chứng cần thực hiện trước khi khẳng định kết quả.</w:t>
       </w:r>
     </w:p>
     <w:p>
@@ -9769,6 +10017,7 @@
         <w:rPr>
           <w:rFonts w:ascii="Times New Roman" w:hAnsi="Times New Roman"/>
           <w:b/>
+          <w:i w:val="0"/>
           <w:color w:val="000000"/>
           <w:sz w:val="26"/>
         </w:rPr>
@@ -9805,6 +10054,7 @@
         <w:rPr>
           <w:rFonts w:ascii="Times New Roman" w:hAnsi="Times New Roman"/>
           <w:b/>
+          <w:i w:val="0"/>
           <w:color w:val="000000"/>
           <w:sz w:val="27"/>
         </w:rPr>
@@ -9824,6 +10074,7 @@
         <w:rPr>
           <w:rFonts w:ascii="Times New Roman" w:hAnsi="Times New Roman"/>
           <w:b/>
+          <w:i w:val="0"/>
           <w:color w:val="000000"/>
           <w:sz w:val="26"/>
         </w:rPr>
@@ -9844,17 +10095,33 @@
           <w:color w:val="000000"/>
           <w:sz w:val="26"/>
         </w:rPr>
-        <w:t xml:space="preserve">Quy trình thực nghiệm được tổ chức thành sáu bước tuần tự: - </w:t>
-      </w:r>
+        <w:t>Quy trình thực nghiệm được tổ chức thành sáu bước tuần tự:</w:t>
+      </w:r>
+    </w:p>
+    <w:p>
+      <w:pPr>
+        <w:spacing w:before="20" w:after="40" w:line="300" w:lineRule="auto"/>
+        <w:ind w:left="720" w:hanging="283"/>
+        <w:jc w:val="left"/>
+      </w:pPr>
       <w:r>
         <w:rPr>
           <w:rFonts w:ascii="Times New Roman" w:hAnsi="Times New Roman"/>
           <w:b/>
-          <w:i w:val="0"/>
-          <w:color w:val="000000"/>
-          <w:sz w:val="26"/>
-        </w:rPr>
-        <w:t>Bước 1 - Đọc và kiểm tra dữ liệu:</w:t>
+          <w:color w:val="000000"/>
+          <w:sz w:val="26"/>
+        </w:rPr>
+        <w:t xml:space="preserve">-  </w:t>
+      </w:r>
+      <w:r>
+        <w:rPr>
+          <w:rFonts w:ascii="Times New Roman" w:hAnsi="Times New Roman"/>
+          <w:b/>
+          <w:i w:val="0"/>
+          <w:color w:val="000000"/>
+          <w:sz w:val="26"/>
+        </w:rPr>
+        <w:t>Bước 1 — Đọc và kiểm tra dữ liệu:</w:t>
       </w:r>
       <w:r>
         <w:rPr>
@@ -9864,17 +10131,33 @@
           <w:color w:val="000000"/>
           <w:sz w:val="26"/>
         </w:rPr>
-        <w:t xml:space="preserve"> nạp bộ PaySim, xác nhận cấu trúc cột, kiểu dữ liệu, giá trị thiếu và phân bố nhãn. - </w:t>
-      </w:r>
+        <w:t xml:space="preserve"> nạp bộ PaySim, xác nhận cấu trúc cột, kiểu dữ liệu, giá trị thiếu và phân bố nhãn.</w:t>
+      </w:r>
+    </w:p>
+    <w:p>
+      <w:pPr>
+        <w:spacing w:before="20" w:after="40" w:line="300" w:lineRule="auto"/>
+        <w:ind w:left="720" w:hanging="283"/>
+        <w:jc w:val="left"/>
+      </w:pPr>
       <w:r>
         <w:rPr>
           <w:rFonts w:ascii="Times New Roman" w:hAnsi="Times New Roman"/>
           <w:b/>
-          <w:i w:val="0"/>
-          <w:color w:val="000000"/>
-          <w:sz w:val="26"/>
-        </w:rPr>
-        <w:t>Bước 2 - Lọc và downsampling:</w:t>
+          <w:color w:val="000000"/>
+          <w:sz w:val="26"/>
+        </w:rPr>
+        <w:t xml:space="preserve">-  </w:t>
+      </w:r>
+      <w:r>
+        <w:rPr>
+          <w:rFonts w:ascii="Times New Roman" w:hAnsi="Times New Roman"/>
+          <w:b/>
+          <w:i w:val="0"/>
+          <w:color w:val="000000"/>
+          <w:sz w:val="26"/>
+        </w:rPr>
+        <w:t>Bước 2 — Lọc và downsampling:</w:t>
       </w:r>
       <w:r>
         <w:rPr>
@@ -9924,17 +10207,33 @@
           <w:color w:val="000000"/>
           <w:sz w:val="26"/>
         </w:rPr>
-        <w:t xml:space="preserve">, bảo toàn toàn bộ giao dịch gian lận và lấy mẫu ngẫu nhiên lớp bình thường để tạo tập làm việc 200.000 giao dịch. - </w:t>
-      </w:r>
+        <w:t>, bảo toàn toàn bộ giao dịch gian lận và lấy mẫu ngẫu nhiên lớp bình thường để tạo tập làm việc 200.000 giao dịch.</w:t>
+      </w:r>
+    </w:p>
+    <w:p>
+      <w:pPr>
+        <w:spacing w:before="20" w:after="40" w:line="300" w:lineRule="auto"/>
+        <w:ind w:left="720" w:hanging="283"/>
+        <w:jc w:val="left"/>
+      </w:pPr>
       <w:r>
         <w:rPr>
           <w:rFonts w:ascii="Times New Roman" w:hAnsi="Times New Roman"/>
           <w:b/>
-          <w:i w:val="0"/>
-          <w:color w:val="000000"/>
-          <w:sz w:val="26"/>
-        </w:rPr>
-        <w:t>Bước 3 - Chia dữ liệu:</w:t>
+          <w:color w:val="000000"/>
+          <w:sz w:val="26"/>
+        </w:rPr>
+        <w:t xml:space="preserve">-  </w:t>
+      </w:r>
+      <w:r>
+        <w:rPr>
+          <w:rFonts w:ascii="Times New Roman" w:hAnsi="Times New Roman"/>
+          <w:b/>
+          <w:i w:val="0"/>
+          <w:color w:val="000000"/>
+          <w:sz w:val="26"/>
+        </w:rPr>
+        <w:t>Bước 3 — Chia dữ liệu:</w:t>
       </w:r>
       <w:r>
         <w:rPr>
@@ -9944,17 +10243,33 @@
           <w:color w:val="000000"/>
           <w:sz w:val="26"/>
         </w:rPr>
-        <w:t xml:space="preserve"> tách tập huấn luyện và tập kiểm tra theo tỷ lệ 80/20 bằng phép chia phân tầng (stratified) theo nhãn. - </w:t>
-      </w:r>
+        <w:t xml:space="preserve"> tách tập huấn luyện và tập kiểm tra theo tỷ lệ 80/20 bằng phép chia phân tầng (stratified) theo nhãn.</w:t>
+      </w:r>
+    </w:p>
+    <w:p>
+      <w:pPr>
+        <w:spacing w:before="20" w:after="40" w:line="300" w:lineRule="auto"/>
+        <w:ind w:left="720" w:hanging="283"/>
+        <w:jc w:val="left"/>
+      </w:pPr>
       <w:r>
         <w:rPr>
           <w:rFonts w:ascii="Times New Roman" w:hAnsi="Times New Roman"/>
           <w:b/>
-          <w:i w:val="0"/>
-          <w:color w:val="000000"/>
-          <w:sz w:val="26"/>
-        </w:rPr>
-        <w:t>Bước 4 - Xây dựng đặc trưng:</w:t>
+          <w:color w:val="000000"/>
+          <w:sz w:val="26"/>
+        </w:rPr>
+        <w:t xml:space="preserve">-  </w:t>
+      </w:r>
+      <w:r>
+        <w:rPr>
+          <w:rFonts w:ascii="Times New Roman" w:hAnsi="Times New Roman"/>
+          <w:b/>
+          <w:i w:val="0"/>
+          <w:color w:val="000000"/>
+          <w:sz w:val="26"/>
+        </w:rPr>
+        <w:t>Bước 4 — Xây dựng đặc trưng:</w:t>
       </w:r>
       <w:r>
         <w:rPr>
@@ -9964,17 +10279,33 @@
           <w:color w:val="000000"/>
           <w:sz w:val="26"/>
         </w:rPr>
-        <w:t xml:space="preserve"> tạo các đặc trưng dẫn xuất, mã hóa loại giao dịch và chuẩn hóa các biến định lượng bằng tham số học từ tập huấn luyện. - </w:t>
-      </w:r>
+        <w:t xml:space="preserve"> tạo các đặc trưng dẫn xuất, mã hóa loại giao dịch và chuẩn hóa các biến định lượng bằng tham số học từ tập huấn luyện.</w:t>
+      </w:r>
+    </w:p>
+    <w:p>
+      <w:pPr>
+        <w:spacing w:before="20" w:after="40" w:line="300" w:lineRule="auto"/>
+        <w:ind w:left="720" w:hanging="283"/>
+        <w:jc w:val="left"/>
+      </w:pPr>
       <w:r>
         <w:rPr>
           <w:rFonts w:ascii="Times New Roman" w:hAnsi="Times New Roman"/>
           <w:b/>
-          <w:i w:val="0"/>
-          <w:color w:val="000000"/>
-          <w:sz w:val="26"/>
-        </w:rPr>
-        <w:t>Bước 5 - Xử lý mất cân bằng:</w:t>
+          <w:color w:val="000000"/>
+          <w:sz w:val="26"/>
+        </w:rPr>
+        <w:t xml:space="preserve">-  </w:t>
+      </w:r>
+      <w:r>
+        <w:rPr>
+          <w:rFonts w:ascii="Times New Roman" w:hAnsi="Times New Roman"/>
+          <w:b/>
+          <w:i w:val="0"/>
+          <w:color w:val="000000"/>
+          <w:sz w:val="26"/>
+        </w:rPr>
+        <w:t>Bước 5 — Xử lý mất cân bằng:</w:t>
       </w:r>
       <w:r>
         <w:rPr>
@@ -9984,17 +10315,33 @@
           <w:color w:val="000000"/>
           <w:sz w:val="26"/>
         </w:rPr>
-        <w:t xml:space="preserve"> áp dụng oversampling bằng SMOTENC hoặc ADASYN trên tập huấn luyện, không thay đổi tập kiểm tra. - </w:t>
-      </w:r>
+        <w:t xml:space="preserve"> áp dụng oversampling bằng SMOTENC hoặc ADASYN trên tập huấn luyện, không thay đổi tập kiểm tra.</w:t>
+      </w:r>
+    </w:p>
+    <w:p>
+      <w:pPr>
+        <w:spacing w:before="20" w:after="40" w:line="300" w:lineRule="auto"/>
+        <w:ind w:left="720" w:hanging="283"/>
+        <w:jc w:val="left"/>
+      </w:pPr>
       <w:r>
         <w:rPr>
           <w:rFonts w:ascii="Times New Roman" w:hAnsi="Times New Roman"/>
           <w:b/>
-          <w:i w:val="0"/>
-          <w:color w:val="000000"/>
-          <w:sz w:val="26"/>
-        </w:rPr>
-        <w:t>Bước 6 - Huấn luyện và đánh giá:</w:t>
+          <w:color w:val="000000"/>
+          <w:sz w:val="26"/>
+        </w:rPr>
+        <w:t xml:space="preserve">-  </w:t>
+      </w:r>
+      <w:r>
+        <w:rPr>
+          <w:rFonts w:ascii="Times New Roman" w:hAnsi="Times New Roman"/>
+          <w:b/>
+          <w:i w:val="0"/>
+          <w:color w:val="000000"/>
+          <w:sz w:val="26"/>
+        </w:rPr>
+        <w:t>Bước 6 — Huấn luyện và đánh giá:</w:t>
       </w:r>
       <w:r>
         <w:rPr>
@@ -10077,6 +10424,7 @@
         <w:rPr>
           <w:rFonts w:ascii="Times New Roman" w:hAnsi="Times New Roman"/>
           <w:b/>
+          <w:i w:val="0"/>
           <w:color w:val="000000"/>
           <w:sz w:val="26"/>
         </w:rPr>
@@ -10267,6 +10615,7 @@
         <w:rPr>
           <w:rFonts w:ascii="Times New Roman" w:hAnsi="Times New Roman"/>
           <w:b/>
+          <w:i w:val="0"/>
           <w:color w:val="000000"/>
           <w:sz w:val="26"/>
         </w:rPr>
@@ -10513,6 +10862,7 @@
         <w:rPr>
           <w:rFonts w:ascii="Times New Roman" w:hAnsi="Times New Roman"/>
           <w:b/>
+          <w:i w:val="0"/>
           <w:color w:val="000000"/>
           <w:sz w:val="26"/>
         </w:rPr>
@@ -10767,6 +11117,7 @@
         <w:rPr>
           <w:rFonts w:ascii="Times New Roman" w:hAnsi="Times New Roman"/>
           <w:b/>
+          <w:i w:val="0"/>
           <w:color w:val="000000"/>
           <w:sz w:val="26"/>
         </w:rPr>
@@ -11081,6 +11432,7 @@
         <w:rPr>
           <w:rFonts w:ascii="Times New Roman" w:hAnsi="Times New Roman"/>
           <w:b/>
+          <w:i w:val="0"/>
           <w:color w:val="000000"/>
           <w:sz w:val="26"/>
         </w:rPr>
@@ -11369,6 +11721,7 @@
         <w:rPr>
           <w:rFonts w:ascii="Times New Roman" w:hAnsi="Times New Roman"/>
           <w:b/>
+          <w:i w:val="0"/>
           <w:color w:val="000000"/>
           <w:sz w:val="26"/>
         </w:rPr>
@@ -11389,7 +11742,7 @@
           <w:color w:val="000000"/>
           <w:sz w:val="26"/>
         </w:rPr>
-        <w:t>Các mô hình được đánh giá trên cùng tập kiểm tra 40.000 giao dịch, không dùng dữ liệu đã qua oversampling. Báo cáo tập trung vào lớp gian lận với bốn chỉ số chính là Precision, Recall, F1-Score và ROC-AUC. Average Precision được báo cáo bổ sung vì phản ánh chất lượng phát hiện lớp gian lận rõ hơn ROC-AUC khi dữ liệu mất cân bằng. Đường ROC và đường Precision-Recall tổng hợp sẽ được bổ sung trong bản báo cáo cuối.</w:t>
+        <w:t>Các mô hình được đánh giá trên cùng tập kiểm tra 40.000 giao dịch, không dùng dữ liệu đã qua oversampling. Báo cáo tập trung vào lớp gian lận với bốn chỉ số chính là Precision, Recall, F1-Score và ROC-AUC. Average Precision được báo cáo bổ sung vì phản ánh chất lượng phát hiện lớp gian lận rõ hơn ROC-AUC khi dữ liệu mất cân bằng. Đường ROC và đường Precision–Recall tổng hợp của cả năm biến thể được trình bày tại Mục 5.2.</w:t>
       </w:r>
     </w:p>
     <w:p>
@@ -11422,6 +11775,7 @@
         <w:rPr>
           <w:rFonts w:ascii="Times New Roman" w:hAnsi="Times New Roman"/>
           <w:b/>
+          <w:i w:val="0"/>
           <w:color w:val="000000"/>
           <w:sz w:val="26"/>
         </w:rPr>
@@ -11535,6 +11889,7 @@
         <w:rPr>
           <w:rFonts w:ascii="Times New Roman" w:hAnsi="Times New Roman"/>
           <w:b/>
+          <w:i w:val="0"/>
           <w:color w:val="000000"/>
           <w:sz w:val="26"/>
         </w:rPr>
@@ -11571,6 +11926,7 @@
         <w:rPr>
           <w:rFonts w:ascii="Times New Roman" w:hAnsi="Times New Roman"/>
           <w:b/>
+          <w:i w:val="0"/>
           <w:color w:val="000000"/>
           <w:sz w:val="27"/>
         </w:rPr>
@@ -11590,6 +11946,7 @@
         <w:rPr>
           <w:rFonts w:ascii="Times New Roman" w:hAnsi="Times New Roman"/>
           <w:b/>
+          <w:i w:val="0"/>
           <w:color w:val="000000"/>
           <w:sz w:val="26"/>
         </w:rPr>
@@ -11707,7 +12064,27 @@
           <w:color w:val="000000"/>
           <w:sz w:val="26"/>
         </w:rPr>
-        <w:t xml:space="preserve"> để người đọc có thể đối chiếu từng con số. Bảng so sánh, hai biểu đồ và bảng mức đóng góp của đặc trưng dưới đây đều được sinh lại bằng cùng script đó, phản ánh kết quả hiện có trên tập kiểm tra. Đường ROC và đường Precision-Recall tổng hợp sẽ được bổ sung trong bản báo cáo cuối.</w:t>
+        <w:t xml:space="preserve"> để người đọc có thể đối chiếu từng con số. Bảng so sánh, các biểu đồ và bảng mức đóng góp của đặc trưng dưới đây đều được sinh lại bằng cùng script đó. Toàn bộ giá trị trong Bảng 5.1 đã được đối chiếu và khớp tuyệt đối với </w:t>
+      </w:r>
+      <w:r>
+        <w:rPr>
+          <w:rFonts w:ascii="Courier New" w:hAnsi="Courier New"/>
+          <w:b w:val="0"/>
+          <w:i w:val="0"/>
+          <w:color w:val="000000"/>
+          <w:sz w:val="25"/>
+        </w:rPr>
+        <w:t>reports/model_comparison.csv</w:t>
+      </w:r>
+      <w:r>
+        <w:rPr>
+          <w:rFonts w:ascii="Times New Roman" w:hAnsi="Times New Roman"/>
+          <w:b w:val="0"/>
+          <w:i w:val="0"/>
+          <w:color w:val="000000"/>
+          <w:sz w:val="26"/>
+        </w:rPr>
+        <w:t xml:space="preserve"> do bước đánh giá chéo của nhóm xuất ra, nên hai nguồn tính độc lập cho cùng một kết quả.</w:t>
       </w:r>
     </w:p>
     <w:p>
@@ -11723,6 +12100,7 @@
         <w:rPr>
           <w:rFonts w:ascii="Times New Roman" w:hAnsi="Times New Roman"/>
           <w:b/>
+          <w:i w:val="0"/>
           <w:color w:val="000000"/>
           <w:sz w:val="26"/>
         </w:rPr>
@@ -11733,8 +12111,6 @@
       <w:tblPr>
         <w:tblW w:type="auto" w:w="0"/>
         <w:jc w:val="center"/>
-        <w:tblLayout w:type="fixed"/>
-        <w:tblLook w:firstColumn="1" w:firstRow="1" w:lastColumn="0" w:lastRow="0" w:noHBand="0" w:noVBand="1" w:val="04A0"/>
         <w:tblBorders>
           <w:top w:val="single" w:sz="6" w:space="0" w:color="CCCCCC"/>
           <w:bottom w:val="single" w:sz="6" w:space="0" w:color="CCCCCC"/>
@@ -11743,6 +12119,8 @@
           <w:left w:val="none"/>
           <w:right w:val="none"/>
         </w:tblBorders>
+        <w:tblLayout w:type="fixed"/>
+        <w:tblLook w:firstColumn="1" w:firstRow="1" w:lastColumn="0" w:lastRow="0" w:noHBand="0" w:noVBand="1" w:val="04A0"/>
       </w:tblPr>
       <w:tblGrid>
         <w:gridCol w:w="1512"/>
@@ -11754,8 +12132,8 @@
       </w:tblGrid>
       <w:tr>
         <w:trPr>
+          <w:cantSplit/>
           <w:tblHeader/>
-          <w:cantSplit/>
         </w:trPr>
         <w:tc>
           <w:tcPr>
@@ -12910,7 +13288,134 @@
           <w:color w:val="000000"/>
           <w:sz w:val="26"/>
         </w:rPr>
-        <w:t>Khoảng cách giữa hai chỉ số xếp hạng của Autoencoder cho thấy vì sao không nên đọc ROC-AUC một mình trên dữ liệu lệch lớp. ROC-AUC đạt 0,9318 nhưng Average Precision chỉ đạt 0,5973. Nguyên nhân là ROC-AUC lấy toàn bộ 38.357 giao dịch bình thường làm mẫu số cho tỷ lệ dương tính giả, nên gần 2.000 cảnh báo nhầm vẫn chỉ làm chỉ số này giảm nhẹ. Average Precision thì đo trực tiếp Precision dọc theo đường Precision-Recall, nên phản ánh đúng cái giá phải trả để đạt được Recall đó. Với bốn biến thể học có giám sát, hai chỉ số này gần như trùng nhau nên kết luận không thay đổi.</w:t>
+        <w:t>Khoảng cách giữa hai chỉ số xếp hạng của Autoencoder cho thấy vì sao không nên đọc ROC-AUC một mình trên dữ liệu lệch lớp. ROC-AUC đạt 0,9318 nhưng Average Precision chỉ đạt 0,5973. Nguyên nhân là ROC-AUC lấy toàn bộ 38.357 giao dịch bình thường làm mẫu số cho tỷ lệ dương tính giả, nên gần 2.000 cảnh báo nhầm vẫn chỉ làm chỉ số này giảm nhẹ. Average Precision thì đo trực tiếp Precision dọc theo đường Precision–Recall, nên phản ánh đúng cái giá phải trả để đạt được Recall đó. Với bốn biến thể học có giám sát, hai chỉ số này gần như trùng nhau nên kết luận không thay đổi.</w:t>
+      </w:r>
+    </w:p>
+    <w:p>
+      <w:pPr>
+        <w:spacing w:before="160" w:after="60"/>
+        <w:jc w:val="center"/>
+      </w:pPr>
+      <w:r>
+        <w:drawing>
+          <wp:inline xmlns:a="http://schemas.openxmlformats.org/drawingml/2006/main" xmlns:pic="http://schemas.openxmlformats.org/drawingml/2006/picture">
+            <wp:extent cx="5220000" cy="3897365"/>
+            <wp:docPr id="2" name="Picture 2"/>
+            <wp:cNvGraphicFramePr>
+              <a:graphicFrameLocks noChangeAspect="1"/>
+            </wp:cNvGraphicFramePr>
+            <a:graphic>
+              <a:graphicData uri="http://schemas.openxmlformats.org/drawingml/2006/picture">
+                <pic:pic>
+                  <pic:nvPicPr>
+                    <pic:cNvPr id="0" name="roc_curves_all.png"/>
+                    <pic:cNvPicPr/>
+                  </pic:nvPicPr>
+                  <pic:blipFill>
+                    <a:blip r:embed="rId16"/>
+                    <a:stretch>
+                      <a:fillRect/>
+                    </a:stretch>
+                  </pic:blipFill>
+                  <pic:spPr>
+                    <a:xfrm>
+                      <a:off x="0" y="0"/>
+                      <a:ext cx="5220000" cy="3897365"/>
+                    </a:xfrm>
+                    <a:prstGeom prst="rect"/>
+                  </pic:spPr>
+                </pic:pic>
+              </a:graphicData>
+            </a:graphic>
+          </wp:inline>
+        </w:drawing>
+      </w:r>
+    </w:p>
+    <w:p>
+      <w:pPr>
+        <w:spacing w:before="40" w:after="160"/>
+        <w:jc w:val="center"/>
+      </w:pPr>
+      <w:r>
+        <w:rPr>
+          <w:rFonts w:ascii="Times New Roman" w:hAnsi="Times New Roman"/>
+          <w:i/>
+          <w:color w:val="000000"/>
+          <w:sz w:val="21"/>
+        </w:rPr>
+        <w:t>Hình 5.1. Đường ROC của năm biến thể mô hình trên tập kiểm tra</w:t>
+      </w:r>
+    </w:p>
+    <w:p>
+      <w:pPr>
+        <w:spacing w:before="160" w:after="60"/>
+        <w:jc w:val="center"/>
+      </w:pPr>
+      <w:r>
+        <w:drawing>
+          <wp:inline xmlns:a="http://schemas.openxmlformats.org/drawingml/2006/main" xmlns:pic="http://schemas.openxmlformats.org/drawingml/2006/picture">
+            <wp:extent cx="5220000" cy="3897365"/>
+            <wp:docPr id="3" name="Picture 3"/>
+            <wp:cNvGraphicFramePr>
+              <a:graphicFrameLocks noChangeAspect="1"/>
+            </wp:cNvGraphicFramePr>
+            <a:graphic>
+              <a:graphicData uri="http://schemas.openxmlformats.org/drawingml/2006/picture">
+                <pic:pic>
+                  <pic:nvPicPr>
+                    <pic:cNvPr id="0" name="pr_curves_all.png"/>
+                    <pic:cNvPicPr/>
+                  </pic:nvPicPr>
+                  <pic:blipFill>
+                    <a:blip r:embed="rId17"/>
+                    <a:stretch>
+                      <a:fillRect/>
+                    </a:stretch>
+                  </pic:blipFill>
+                  <pic:spPr>
+                    <a:xfrm>
+                      <a:off x="0" y="0"/>
+                      <a:ext cx="5220000" cy="3897365"/>
+                    </a:xfrm>
+                    <a:prstGeom prst="rect"/>
+                  </pic:spPr>
+                </pic:pic>
+              </a:graphicData>
+            </a:graphic>
+          </wp:inline>
+        </w:drawing>
+      </w:r>
+    </w:p>
+    <w:p>
+      <w:pPr>
+        <w:spacing w:before="40" w:after="160"/>
+        <w:jc w:val="center"/>
+      </w:pPr>
+      <w:r>
+        <w:rPr>
+          <w:rFonts w:ascii="Times New Roman" w:hAnsi="Times New Roman"/>
+          <w:i/>
+          <w:color w:val="000000"/>
+          <w:sz w:val="21"/>
+        </w:rPr>
+        <w:t>Hình 5.2. Đường Precision–Recall của năm biến thể mô hình trên tập kiểm tra</w:t>
+      </w:r>
+    </w:p>
+    <w:p>
+      <w:pPr>
+        <w:spacing w:before="0" w:after="40" w:line="312" w:lineRule="auto"/>
+        <w:ind w:firstLine="720"/>
+        <w:jc w:val="both"/>
+      </w:pPr>
+      <w:r>
+        <w:rPr>
+          <w:rFonts w:ascii="Times New Roman" w:hAnsi="Times New Roman"/>
+          <w:b w:val="0"/>
+          <w:i w:val="0"/>
+          <w:color w:val="000000"/>
+          <w:sz w:val="26"/>
+        </w:rPr>
+        <w:t>Hình 5.1 và Hình 5.2 trực quan hóa nhận định trên. Trên đường ROC, bốn biến thể học có giám sát gần như trùng nhau và ép sát góc trên bên trái, còn Autoencoder tuy thấp hơn nhưng vẫn cách xa đường chéo ngẫu nhiên. Trên đường Precision–Recall, khoảng cách giữa hai nhóm mô hình giãn ra rõ rệt: bốn biến thể học có giám sát giữ Precision gần 1,0 trên toàn dải Recall, trong khi Precision của Autoencoder suy giảm liên tục và chỉ còn khoảng 0,05 ở mức Recall cao nhất. Cùng một mô hình nhưng hai đồ thị cho hai ấn tượng khác nhau, đó là lý do đề bài yêu cầu không dựa vào một chỉ số duy nhất.</w:t>
       </w:r>
     </w:p>
     <w:p>
@@ -12926,6 +13431,7 @@
         <w:rPr>
           <w:rFonts w:ascii="Times New Roman" w:hAnsi="Times New Roman"/>
           <w:b/>
+          <w:i w:val="0"/>
           <w:color w:val="000000"/>
           <w:sz w:val="26"/>
         </w:rPr>
@@ -12941,7 +13447,7 @@
         <w:drawing>
           <wp:inline xmlns:a="http://schemas.openxmlformats.org/drawingml/2006/main" xmlns:pic="http://schemas.openxmlformats.org/drawingml/2006/picture">
             <wp:extent cx="5220000" cy="3450756"/>
-            <wp:docPr id="2" name="Picture 2"/>
+            <wp:docPr id="4" name="Picture 4"/>
             <wp:cNvGraphicFramePr>
               <a:graphicFrameLocks noChangeAspect="1"/>
             </wp:cNvGraphicFramePr>
@@ -12953,7 +13459,7 @@
                     <pic:cNvPicPr/>
                   </pic:nvPicPr>
                   <pic:blipFill>
-                    <a:blip r:embed="rId16"/>
+                    <a:blip r:embed="rId18"/>
                     <a:stretch>
                       <a:fillRect/>
                     </a:stretch>
@@ -12984,7 +13490,7 @@
           <w:color w:val="000000"/>
           <w:sz w:val="21"/>
         </w:rPr>
-        <w:t>Hình 5.1. So sánh riêng bốn thành phần TN, FP, FN và TP theo mô hình</w:t>
+        <w:t>Hình 5.3. So sánh riêng bốn thành phần TN, FP, FN và TP theo mô hình</w:t>
       </w:r>
     </w:p>
     <w:p>
@@ -13001,7 +13507,7 @@
           <w:color w:val="000000"/>
           <w:sz w:val="26"/>
         </w:rPr>
-        <w:t>Hình 5.1 tách TN, FP, FN và TP thành bốn đồ thị để mỗi thành phần có trục tung riêng. Trục hoành biểu diễn năm biến thể mô hình, còn trục tung biểu diễn số giao dịch. Hai đồ thị sai số FP và FN dùng trục tung theo thang logarit vì giá trị trong cùng một đồ thị chênh nhau tới ba bậc độ lớn, ví dụ 1 cảnh báo nhầm của Random Forest kết hợp SMOTENC so với 1.998 cảnh báo nhầm của Autoencoder. Nếu giữ thang tuyến tính, các cột nhỏ bị dí sát trục và không còn so sánh được với nhau. Cách trình bày này giúp quan sát cả những sai số có giá trị nhỏ mà không bị hai nhóm TN và TP có quy mô lớn che khuất.</w:t>
+        <w:t>Hình 5.3 tách TN, FP, FN và TP thành bốn đồ thị để mỗi thành phần có trục tung riêng. Trục hoành biểu diễn năm biến thể mô hình, còn trục tung biểu diễn số giao dịch. Hai đồ thị sai số FP và FN dùng trục tung theo thang logarit vì giá trị trong cùng một đồ thị chênh nhau tới ba bậc độ lớn, ví dụ 1 cảnh báo nhầm của Random Forest kết hợp SMOTENC so với 1.998 cảnh báo nhầm của Autoencoder. Nếu giữ thang tuyến tính, các cột nhỏ bị dí sát trục và không còn so sánh được với nhau. Cách trình bày này giúp quan sát cả những sai số có giá trị nhỏ mà không bị hai nhóm TN và TP có quy mô lớn che khuất.</w:t>
       </w:r>
     </w:p>
     <w:p>
@@ -13051,6 +13557,7 @@
         <w:rPr>
           <w:rFonts w:ascii="Times New Roman" w:hAnsi="Times New Roman"/>
           <w:b/>
+          <w:i w:val="0"/>
           <w:color w:val="000000"/>
           <w:sz w:val="26"/>
         </w:rPr>
@@ -13104,6 +13611,7 @@
         <w:rPr>
           <w:rFonts w:ascii="Times New Roman" w:hAnsi="Times New Roman"/>
           <w:b/>
+          <w:i w:val="0"/>
           <w:color w:val="000000"/>
           <w:sz w:val="26"/>
         </w:rPr>
@@ -13131,8 +13639,6 @@
       <w:tblPr>
         <w:tblW w:type="auto" w:w="0"/>
         <w:jc w:val="center"/>
-        <w:tblLayout w:type="fixed"/>
-        <w:tblLook w:firstColumn="1" w:firstRow="1" w:lastColumn="0" w:lastRow="0" w:noHBand="0" w:noVBand="1" w:val="04A0"/>
         <w:tblBorders>
           <w:top w:val="single" w:sz="6" w:space="0" w:color="CCCCCC"/>
           <w:bottom w:val="single" w:sz="6" w:space="0" w:color="CCCCCC"/>
@@ -13141,6 +13647,8 @@
           <w:left w:val="none"/>
           <w:right w:val="none"/>
         </w:tblBorders>
+        <w:tblLayout w:type="fixed"/>
+        <w:tblLook w:firstColumn="1" w:firstRow="1" w:lastColumn="0" w:lastRow="0" w:noHBand="0" w:noVBand="1" w:val="04A0"/>
       </w:tblPr>
       <w:tblGrid>
         <w:gridCol w:w="1814"/>
@@ -13151,8 +13659,8 @@
       </w:tblGrid>
       <w:tr>
         <w:trPr>
+          <w:cantSplit/>
           <w:tblHeader/>
-          <w:cantSplit/>
         </w:trPr>
         <w:tc>
           <w:tcPr>
@@ -14188,7 +14696,7 @@
         <w:drawing>
           <wp:inline xmlns:a="http://schemas.openxmlformats.org/drawingml/2006/main" xmlns:pic="http://schemas.openxmlformats.org/drawingml/2006/picture">
             <wp:extent cx="5220000" cy="3563885"/>
-            <wp:docPr id="3" name="Picture 3"/>
+            <wp:docPr id="5" name="Picture 5"/>
             <wp:cNvGraphicFramePr>
               <a:graphicFrameLocks noChangeAspect="1"/>
             </wp:cNvGraphicFramePr>
@@ -14200,7 +14708,7 @@
                     <pic:cNvPicPr/>
                   </pic:nvPicPr>
                   <pic:blipFill>
-                    <a:blip r:embed="rId17"/>
+                    <a:blip r:embed="rId19"/>
                     <a:stretch>
                       <a:fillRect/>
                     </a:stretch>
@@ -14231,7 +14739,7 @@
           <w:color w:val="000000"/>
           <w:sz w:val="21"/>
         </w:rPr>
-        <w:t>Hình 5.2. Mức đóng góp của toàn bộ 14 đặc trưng theo hai mô hình dùng SMOTENC</w:t>
+        <w:t>Hình 5.4. Mức đóng góp của toàn bộ 14 đặc trưng theo hai mô hình dùng SMOTENC</w:t>
       </w:r>
     </w:p>
     <w:p>
@@ -14248,7 +14756,7 @@
           <w:color w:val="000000"/>
           <w:sz w:val="26"/>
         </w:rPr>
-        <w:t xml:space="preserve">Hình 5.2 trình bày đầy đủ 14 đặc trưng của cả hai mô hình, mỗi mô hình trên một panel riêng vì hai thang đo khác nhau. Màu phân biệt nhóm đặc trưng dẫn xuất từ số dư với phần còn lại, cho thấy mức độ tập trung rõ hơn bảng số. Với Random Forest, mức đóng góp giảm tương đối đều và các đặc trưng thời gian vẫn giữ vai trò nhỏ nhưng khác 0. Với XGBoost, hai đặc trưng đầu chiếm gần như toàn bộ, mười hai đặc trưng còn lại cộng lại chưa tới 3%, trong đó </w:t>
+        <w:t xml:space="preserve">Hình 5.4 trình bày đầy đủ 14 đặc trưng của cả hai mô hình, mỗi mô hình trên một panel riêng vì hai thang đo khác nhau. Màu phân biệt nhóm đặc trưng dẫn xuất từ số dư với phần còn lại, cho thấy mức độ tập trung rõ hơn bảng số. Với Random Forest, mức đóng góp giảm tương đối đều và các đặc trưng thời gian vẫn giữ vai trò nhỏ nhưng khác 0. Với XGBoost, hai đặc trưng đầu chiếm gần như toàn bộ, mười hai đặc trưng còn lại cộng lại chưa tới 3%, trong đó </w:t>
       </w:r>
       <w:r>
         <w:rPr>
@@ -14322,6 +14830,7 @@
         <w:rPr>
           <w:rFonts w:ascii="Times New Roman" w:hAnsi="Times New Roman"/>
           <w:b/>
+          <w:i w:val="0"/>
           <w:color w:val="000000"/>
           <w:sz w:val="26"/>
         </w:rPr>
@@ -14375,6 +14884,7 @@
         <w:rPr>
           <w:rFonts w:ascii="Times New Roman" w:hAnsi="Times New Roman"/>
           <w:b/>
+          <w:i w:val="0"/>
           <w:color w:val="000000"/>
           <w:sz w:val="27"/>
         </w:rPr>
@@ -14394,6 +14904,7 @@
         <w:rPr>
           <w:rFonts w:ascii="Times New Roman" w:hAnsi="Times New Roman"/>
           <w:b/>
+          <w:i w:val="0"/>
           <w:color w:val="000000"/>
           <w:sz w:val="26"/>
         </w:rPr>
@@ -14522,6 +15033,7 @@
         <w:rPr>
           <w:rFonts w:ascii="Times New Roman" w:hAnsi="Times New Roman"/>
           <w:b/>
+          <w:i w:val="0"/>
           <w:color w:val="000000"/>
           <w:sz w:val="26"/>
         </w:rPr>
@@ -14646,6 +15158,7 @@
         <w:rPr>
           <w:rFonts w:ascii="Times New Roman" w:hAnsi="Times New Roman"/>
           <w:b/>
+          <w:i w:val="0"/>
           <w:color w:val="000000"/>
           <w:sz w:val="26"/>
         </w:rPr>
@@ -14666,15 +15179,13 @@
           <w:color w:val="000000"/>
           <w:sz w:val="26"/>
         </w:rPr>
-        <w:t>Downsampling chỉ lấy mẫu ngẫu nhiên lớp bình thường nên không làm thay đổi phân bố có điều kiện của từng lớp. Nhờ đó, tỷ lệ phát hiện đúng và tỷ lệ báo động giả đo trên tập kiểm tra vẫn dùng được cho phân bố gốc, chỉ riêng Precision là phụ thuộc tỷ lệ lớp và cần quy chiếu lại. Bảng 6.1 trình bày kết quả quy chiếu về tỷ lệ 0,129082% của PaySim gốc, kèm khoảng tin cậy 95% tính theo phương pháp Clopper-Pearson cho tỷ lệ báo động giả.</w:t>
+        <w:t>Downsampling chỉ lấy mẫu ngẫu nhiên lớp bình thường nên không làm thay đổi phân bố có điều kiện của từng lớp. Nhờ đó, tỷ lệ phát hiện đúng và tỷ lệ báo động giả đo trên tập kiểm tra vẫn dùng được cho phân bố gốc, chỉ riêng Precision là phụ thuộc tỷ lệ lớp và cần quy chiếu lại. Bảng 6.1 trình bày kết quả quy chiếu về tỷ lệ 0,129082% của PaySim gốc, kèm khoảng tin cậy 95% tính theo phương pháp Clopper–Pearson cho tỷ lệ báo động giả.</w:t>
       </w:r>
     </w:p>
     <w:tbl>
       <w:tblPr>
         <w:tblW w:type="auto" w:w="0"/>
         <w:jc w:val="center"/>
-        <w:tblLayout w:type="fixed"/>
-        <w:tblLook w:firstColumn="1" w:firstRow="1" w:lastColumn="0" w:lastRow="0" w:noHBand="0" w:noVBand="1" w:val="04A0"/>
         <w:tblBorders>
           <w:top w:val="single" w:sz="6" w:space="0" w:color="CCCCCC"/>
           <w:bottom w:val="single" w:sz="6" w:space="0" w:color="CCCCCC"/>
@@ -14683,6 +15194,8 @@
           <w:left w:val="none"/>
           <w:right w:val="none"/>
         </w:tblBorders>
+        <w:tblLayout w:type="fixed"/>
+        <w:tblLook w:firstColumn="1" w:firstRow="1" w:lastColumn="0" w:lastRow="0" w:noHBand="0" w:noVBand="1" w:val="04A0"/>
       </w:tblPr>
       <w:tblGrid>
         <w:gridCol w:w="1512"/>
@@ -14694,8 +15207,8 @@
       </w:tblGrid>
       <w:tr>
         <w:trPr>
+          <w:cantSplit/>
           <w:tblHeader/>
-          <w:cantSplit/>
         </w:trPr>
         <w:tc>
           <w:tcPr>
@@ -15023,7 +15536,7 @@
                 <w:color w:val="000000"/>
                 <w:sz w:val="20"/>
               </w:rPr>
-              <w:t>0,8985 - 0,9995</w:t>
+              <w:t>0,8985 – 0,9995</w:t>
             </w:r>
           </w:p>
         </w:tc>
@@ -15207,7 +15720,7 @@
                 <w:color w:val="000000"/>
                 <w:sz w:val="20"/>
               </w:rPr>
-              <w:t>0,8491 - 0,9876</w:t>
+              <w:t>0,8491 – 0,9876</w:t>
             </w:r>
           </w:p>
         </w:tc>
@@ -15387,7 +15900,7 @@
                 <w:color w:val="000000"/>
                 <w:sz w:val="20"/>
               </w:rPr>
-              <w:t>0,8281 - 0,9784</w:t>
+              <w:t>0,8281 – 0,9784</w:t>
             </w:r>
           </w:p>
         </w:tc>
@@ -15571,7 +16084,7 @@
                 <w:color w:val="000000"/>
                 <w:sz w:val="20"/>
               </w:rPr>
-              <w:t>0,7738 - 0,9460</w:t>
+              <w:t>0,7738 – 0,9460</w:t>
             </w:r>
           </w:p>
         </w:tc>
@@ -15751,7 +16264,7 @@
                 <w:color w:val="000000"/>
                 <w:sz w:val="20"/>
               </w:rPr>
-              <w:t>0,0176 - 0,0191</w:t>
+              <w:t>0,0176 – 0,0191</w:t>
             </w:r>
           </w:p>
         </w:tc>
@@ -15849,6 +16362,7 @@
         <w:rPr>
           <w:rFonts w:ascii="Times New Roman" w:hAnsi="Times New Roman"/>
           <w:b/>
+          <w:i w:val="0"/>
           <w:color w:val="000000"/>
           <w:sz w:val="26"/>
         </w:rPr>
@@ -15918,6 +16432,7 @@
         <w:rPr>
           <w:rFonts w:ascii="Times New Roman" w:hAnsi="Times New Roman"/>
           <w:b/>
+          <w:i w:val="0"/>
           <w:color w:val="000000"/>
           <w:sz w:val="26"/>
         </w:rPr>
@@ -15988,6 +16503,7 @@
         <w:rPr>
           <w:rFonts w:ascii="Times New Roman" w:hAnsi="Times New Roman"/>
           <w:b/>
+          <w:i w:val="0"/>
           <w:color w:val="000000"/>
           <w:sz w:val="26"/>
         </w:rPr>
@@ -16078,6 +16594,7 @@
         <w:rPr>
           <w:rFonts w:ascii="Times New Roman" w:hAnsi="Times New Roman"/>
           <w:b/>
+          <w:i w:val="0"/>
           <w:color w:val="000000"/>
           <w:sz w:val="26"/>
         </w:rPr>
@@ -16114,6 +16631,7 @@
         <w:rPr>
           <w:rFonts w:ascii="Times New Roman" w:hAnsi="Times New Roman"/>
           <w:b/>
+          <w:i w:val="0"/>
           <w:color w:val="000000"/>
           <w:sz w:val="27"/>
         </w:rPr>
@@ -16133,6 +16651,7 @@
         <w:rPr>
           <w:rFonts w:ascii="Times New Roman" w:hAnsi="Times New Roman"/>
           <w:b/>
+          <w:i w:val="0"/>
           <w:color w:val="000000"/>
           <w:sz w:val="26"/>
         </w:rPr>
@@ -16203,6 +16722,7 @@
         <w:rPr>
           <w:rFonts w:ascii="Times New Roman" w:hAnsi="Times New Roman"/>
           <w:b/>
+          <w:i w:val="0"/>
           <w:color w:val="000000"/>
           <w:sz w:val="26"/>
         </w:rPr>
@@ -16229,8 +16749,6 @@
       <w:tblPr>
         <w:tblW w:type="auto" w:w="0"/>
         <w:jc w:val="center"/>
-        <w:tblLayout w:type="fixed"/>
-        <w:tblLook w:firstColumn="1" w:firstRow="1" w:lastColumn="0" w:lastRow="0" w:noHBand="0" w:noVBand="1" w:val="04A0"/>
         <w:tblBorders>
           <w:top w:val="single" w:sz="6" w:space="0" w:color="CCCCCC"/>
           <w:bottom w:val="single" w:sz="6" w:space="0" w:color="CCCCCC"/>
@@ -16239,6 +16757,8 @@
           <w:left w:val="none"/>
           <w:right w:val="none"/>
         </w:tblBorders>
+        <w:tblLayout w:type="fixed"/>
+        <w:tblLook w:firstColumn="1" w:firstRow="1" w:lastColumn="0" w:lastRow="0" w:noHBand="0" w:noVBand="1" w:val="04A0"/>
       </w:tblPr>
       <w:tblGrid>
         <w:gridCol w:w="2268"/>
@@ -16248,8 +16768,8 @@
       </w:tblGrid>
       <w:tr>
         <w:trPr>
+          <w:cantSplit/>
           <w:tblHeader/>
-          <w:cantSplit/>
         </w:trPr>
         <w:tc>
           <w:tcPr>
@@ -17262,7 +17782,7 @@
           <w:color w:val="000000"/>
           <w:sz w:val="26"/>
         </w:rPr>
-        <w:t>Toàn bộ bảy mục tiêu cụ thể đã hoàn thành. Trong đó mục tiêu thứ bảy đã tích hợp mô hình XGBoost-SMOTE cùng bộ tiền xử lý và scaler thật vào giao diện tương tác Streamlit, hỗ trợ 4 kịch bản thử nghiệm và vượt qua kiểm thử Browser QA.</w:t>
+        <w:t>Toàn bộ bảy mục tiêu cụ thể đã hoàn thành. Trong đó mục tiêu thứ bảy đã tích hợp mô hình XGBoost-SMOTE cùng bộ tiền xử lý và scaler thật vào giao diện tương tác Streamlit, hỗ trợ bốn kịch bản thử nghiệm và vượt qua kiểm thử Browser QA.</w:t>
       </w:r>
     </w:p>
     <w:p>
@@ -17295,6 +17815,7 @@
         <w:rPr>
           <w:rFonts w:ascii="Times New Roman" w:hAnsi="Times New Roman"/>
           <w:b/>
+          <w:i w:val="0"/>
           <w:color w:val="000000"/>
           <w:sz w:val="26"/>
         </w:rPr>
@@ -17348,6 +17869,7 @@
         <w:rPr>
           <w:rFonts w:ascii="Times New Roman" w:hAnsi="Times New Roman"/>
           <w:b/>
+          <w:i w:val="0"/>
           <w:color w:val="000000"/>
           <w:sz w:val="26"/>
         </w:rPr>
@@ -17455,6 +17977,7 @@
         <w:rPr>
           <w:rFonts w:ascii="Times New Roman" w:hAnsi="Times New Roman"/>
           <w:b/>
+          <w:i w:val="0"/>
           <w:color w:val="000000"/>
           <w:sz w:val="26"/>
         </w:rPr>
@@ -17508,6 +18031,7 @@
         <w:rPr>
           <w:rFonts w:ascii="Times New Roman" w:hAnsi="Times New Roman"/>
           <w:b/>
+          <w:i w:val="0"/>
           <w:color w:val="000000"/>
           <w:sz w:val="27"/>
         </w:rPr>
@@ -17544,6 +18068,7 @@
         <w:rPr>
           <w:rFonts w:ascii="Times New Roman" w:hAnsi="Times New Roman"/>
           <w:b/>
+          <w:i w:val="0"/>
           <w:color w:val="000000"/>
           <w:sz w:val="26"/>
         </w:rPr>
@@ -17554,7 +18079,7 @@
       <w:pPr>
         <w:spacing w:before="20" w:after="40" w:line="300" w:lineRule="auto"/>
         <w:ind w:left="720" w:hanging="283"/>
-        <w:jc w:val="both"/>
+        <w:jc w:val="left"/>
       </w:pPr>
       <w:r>
         <w:rPr>
@@ -17580,7 +18105,7 @@
       <w:pPr>
         <w:spacing w:before="20" w:after="40" w:line="300" w:lineRule="auto"/>
         <w:ind w:left="720" w:hanging="283"/>
-        <w:jc w:val="both"/>
+        <w:jc w:val="left"/>
       </w:pPr>
       <w:r>
         <w:rPr>
@@ -17626,7 +18151,7 @@
       <w:pPr>
         <w:spacing w:before="20" w:after="40" w:line="300" w:lineRule="auto"/>
         <w:ind w:left="720" w:hanging="283"/>
-        <w:jc w:val="both"/>
+        <w:jc w:val="left"/>
       </w:pPr>
       <w:r>
         <w:rPr>
@@ -17692,7 +18217,7 @@
       <w:pPr>
         <w:spacing w:before="20" w:after="40" w:line="300" w:lineRule="auto"/>
         <w:ind w:left="720" w:hanging="283"/>
-        <w:jc w:val="both"/>
+        <w:jc w:val="left"/>
       </w:pPr>
       <w:r>
         <w:rPr>
@@ -17738,7 +18263,7 @@
       <w:pPr>
         <w:spacing w:before="20" w:after="40" w:line="300" w:lineRule="auto"/>
         <w:ind w:left="720" w:hanging="283"/>
-        <w:jc w:val="both"/>
+        <w:jc w:val="left"/>
       </w:pPr>
       <w:r>
         <w:rPr>
@@ -17784,7 +18309,7 @@
       <w:pPr>
         <w:spacing w:before="20" w:after="40" w:line="300" w:lineRule="auto"/>
         <w:ind w:left="720" w:hanging="283"/>
-        <w:jc w:val="both"/>
+        <w:jc w:val="left"/>
       </w:pPr>
       <w:r>
         <w:rPr>
@@ -17830,7 +18355,7 @@
       <w:pPr>
         <w:spacing w:before="20" w:after="40" w:line="300" w:lineRule="auto"/>
         <w:ind w:left="720" w:hanging="283"/>
-        <w:jc w:val="both"/>
+        <w:jc w:val="left"/>
       </w:pPr>
       <w:r>
         <w:rPr>
@@ -17876,7 +18401,7 @@
       <w:pPr>
         <w:spacing w:before="20" w:after="40" w:line="300" w:lineRule="auto"/>
         <w:ind w:left="720" w:hanging="283"/>
-        <w:jc w:val="both"/>
+        <w:jc w:val="left"/>
       </w:pPr>
       <w:r>
         <w:rPr>
@@ -17895,7 +18420,7 @@
           <w:color w:val="000000"/>
           <w:sz w:val="26"/>
         </w:rPr>
-        <w:t xml:space="preserve">Nhóm 9, </w:t>
+        <w:t xml:space="preserve">Nguyễn Duy Khang, </w:t>
       </w:r>
       <w:r>
         <w:rPr>
@@ -17905,7 +18430,7 @@
           <w:color w:val="000000"/>
           <w:sz w:val="25"/>
         </w:rPr>
-        <w:t>reports/rf_smote_feature_importance.csv</w:t>
+        <w:t>reports/model_comparison.csv</w:t>
       </w:r>
       <w:r>
         <w:rPr>
@@ -17915,7 +18440,7 @@
           <w:color w:val="000000"/>
           <w:sz w:val="26"/>
         </w:rPr>
-        <w:t xml:space="preserve"> và </w:t>
+        <w:t xml:space="preserve">, </w:t>
       </w:r>
       <w:r>
         <w:rPr>
@@ -17925,7 +18450,7 @@
           <w:color w:val="000000"/>
           <w:sz w:val="25"/>
         </w:rPr>
-        <w:t>reports/xgb_smote_feature_importance.csv</w:t>
+        <w:t>reports/figures/roc_curves_all.png</w:t>
       </w:r>
       <w:r>
         <w:rPr>
@@ -17935,14 +18460,146 @@
           <w:color w:val="000000"/>
           <w:sz w:val="26"/>
         </w:rPr>
-        <w:t>, mức đóng góp đặc trưng đã lưu của hai mô hình dùng SMOTENC.</w:t>
+        <w:t xml:space="preserve"> và </w:t>
+      </w:r>
+      <w:r>
+        <w:rPr>
+          <w:rFonts w:ascii="Courier New" w:hAnsi="Courier New"/>
+          <w:b w:val="0"/>
+          <w:i w:val="0"/>
+          <w:color w:val="000000"/>
+          <w:sz w:val="25"/>
+        </w:rPr>
+        <w:t>reports/figures/pr_curves_all.png</w:t>
+      </w:r>
+      <w:r>
+        <w:rPr>
+          <w:rFonts w:ascii="Times New Roman" w:hAnsi="Times New Roman"/>
+          <w:b w:val="0"/>
+          <w:i w:val="0"/>
+          <w:color w:val="000000"/>
+          <w:sz w:val="26"/>
+        </w:rPr>
+        <w:t>, bảng so sánh tổng hợp và đường ROC, Precision–Recall của bước đánh giá chéo.</w:t>
       </w:r>
     </w:p>
     <w:p>
       <w:pPr>
         <w:spacing w:before="20" w:after="40" w:line="300" w:lineRule="auto"/>
         <w:ind w:left="720" w:hanging="283"/>
-        <w:jc w:val="both"/>
+        <w:jc w:val="left"/>
+      </w:pPr>
+      <w:r>
+        <w:rPr>
+          <w:rFonts w:ascii="Times New Roman" w:hAnsi="Times New Roman"/>
+          <w:b/>
+          <w:color w:val="000000"/>
+          <w:sz w:val="26"/>
+        </w:rPr>
+        <w:t xml:space="preserve">-  </w:t>
+      </w:r>
+      <w:r>
+        <w:rPr>
+          <w:rFonts w:ascii="Times New Roman" w:hAnsi="Times New Roman"/>
+          <w:b w:val="0"/>
+          <w:i w:val="0"/>
+          <w:color w:val="000000"/>
+          <w:sz w:val="26"/>
+        </w:rPr>
+        <w:t xml:space="preserve">Hoàng Cao Sơn và Nguyễn Duy Khang, </w:t>
+      </w:r>
+      <w:r>
+        <w:rPr>
+          <w:rFonts w:ascii="Courier New" w:hAnsi="Courier New"/>
+          <w:b w:val="0"/>
+          <w:i w:val="0"/>
+          <w:color w:val="000000"/>
+          <w:sz w:val="25"/>
+        </w:rPr>
+        <w:t>notebooks/06_evaluation_comparison.ipynb</w:t>
+      </w:r>
+      <w:r>
+        <w:rPr>
+          <w:rFonts w:ascii="Times New Roman" w:hAnsi="Times New Roman"/>
+          <w:b w:val="0"/>
+          <w:i w:val="0"/>
+          <w:color w:val="000000"/>
+          <w:sz w:val="26"/>
+        </w:rPr>
+        <w:t>, notebook đánh giá và so sánh chéo các mô hình.</w:t>
+      </w:r>
+    </w:p>
+    <w:p>
+      <w:pPr>
+        <w:spacing w:before="20" w:after="40" w:line="300" w:lineRule="auto"/>
+        <w:ind w:left="720" w:hanging="283"/>
+        <w:jc w:val="left"/>
+      </w:pPr>
+      <w:r>
+        <w:rPr>
+          <w:rFonts w:ascii="Times New Roman" w:hAnsi="Times New Roman"/>
+          <w:b/>
+          <w:color w:val="000000"/>
+          <w:sz w:val="26"/>
+        </w:rPr>
+        <w:t xml:space="preserve">-  </w:t>
+      </w:r>
+      <w:r>
+        <w:rPr>
+          <w:rFonts w:ascii="Times New Roman" w:hAnsi="Times New Roman"/>
+          <w:b w:val="0"/>
+          <w:i w:val="0"/>
+          <w:color w:val="000000"/>
+          <w:sz w:val="26"/>
+        </w:rPr>
+        <w:t xml:space="preserve">Nhóm 9, </w:t>
+      </w:r>
+      <w:r>
+        <w:rPr>
+          <w:rFonts w:ascii="Courier New" w:hAnsi="Courier New"/>
+          <w:b w:val="0"/>
+          <w:i w:val="0"/>
+          <w:color w:val="000000"/>
+          <w:sz w:val="25"/>
+        </w:rPr>
+        <w:t>reports/rf_smote_feature_importance.csv</w:t>
+      </w:r>
+      <w:r>
+        <w:rPr>
+          <w:rFonts w:ascii="Times New Roman" w:hAnsi="Times New Roman"/>
+          <w:b w:val="0"/>
+          <w:i w:val="0"/>
+          <w:color w:val="000000"/>
+          <w:sz w:val="26"/>
+        </w:rPr>
+        <w:t xml:space="preserve"> và </w:t>
+      </w:r>
+      <w:r>
+        <w:rPr>
+          <w:rFonts w:ascii="Courier New" w:hAnsi="Courier New"/>
+          <w:b w:val="0"/>
+          <w:i w:val="0"/>
+          <w:color w:val="000000"/>
+          <w:sz w:val="25"/>
+        </w:rPr>
+        <w:t>reports/xgb_smote_feature_importance.csv</w:t>
+      </w:r>
+      <w:r>
+        <w:rPr>
+          <w:rFonts w:ascii="Times New Roman" w:hAnsi="Times New Roman"/>
+          <w:b w:val="0"/>
+          <w:i w:val="0"/>
+          <w:color w:val="000000"/>
+          <w:sz w:val="26"/>
+        </w:rPr>
+        <w:t>, mức đóng góp đặc trưng đã lưu của hai mô hình dùng SMOTENC.</w:t>
+      </w:r>
+    </w:p>
+    <w:p>
+      <w:pPr>
+        <w:spacing w:before="20" w:after="40" w:line="300" w:lineRule="auto"/>
+        <w:ind w:left="720" w:hanging="283"/>
+        <w:jc w:val="left"/>
       </w:pPr>
       <w:r>
         <w:rPr>
@@ -18037,6 +18694,7 @@
         <w:rPr>
           <w:rFonts w:ascii="Times New Roman" w:hAnsi="Times New Roman"/>
           <w:b/>
+          <w:i w:val="0"/>
           <w:color w:val="000000"/>
           <w:sz w:val="26"/>
         </w:rPr>
@@ -18047,7 +18705,7 @@
       <w:pPr>
         <w:spacing w:before="40" w:after="60" w:line="276" w:lineRule="auto"/>
         <w:ind w:left="454" w:hanging="454"/>
-        <w:jc w:val="both"/>
+        <w:jc w:val="left"/>
       </w:pPr>
       <w:bookmarkStart w:id="1067" w:name="ref_1"/>
       <w:bookmarkEnd w:id="1067"/>
@@ -18069,9 +18727,9 @@
           <w:color w:val="000000"/>
           <w:sz w:val="23"/>
         </w:rPr>
-        <w:t xml:space="preserve">A. Abdallah, M. A. Maarof, and A. Zainal, “Fraud detection system: A survey,” Journal of Network and Computer Applications, vol. 68, pp. 90-113, 2016, doi: </w:t>
-      </w:r>
-      <w:hyperlink r:id="rId18">
+        <w:t xml:space="preserve">A. Abdallah, M. A. Maarof, and A. Zainal, “Fraud detection system: A survey,” Journal of Network and Computer Applications, vol. 68, pp. 90–113, 2016, doi: </w:t>
+      </w:r>
+      <w:hyperlink r:id="rId20">
         <w:r>
           <w:rPr>
             <w:rFonts w:ascii="Times New Roman" w:hAnsi="Times New Roman"/>
@@ -18087,7 +18745,7 @@
       <w:pPr>
         <w:spacing w:before="40" w:after="60" w:line="276" w:lineRule="auto"/>
         <w:ind w:left="454" w:hanging="454"/>
-        <w:jc w:val="both"/>
+        <w:jc w:val="left"/>
       </w:pPr>
       <w:bookmarkStart w:id="1068" w:name="ref_2"/>
       <w:bookmarkEnd w:id="1068"/>
@@ -18109,9 +18767,9 @@
           <w:color w:val="000000"/>
           <w:sz w:val="23"/>
         </w:rPr>
-        <w:t xml:space="preserve">E. A. Lopez-Rojas, A. Elmir, and S. Axelsson, “PaySim: A financial mobile money simulator for fraud detection,” in Proc. 28th European Modeling and Simulation Symposium, Larnaca, Cyprus, 2016, pp. 249-255. [Online]. Available: </w:t>
-      </w:r>
-      <w:hyperlink r:id="rId19">
+        <w:t xml:space="preserve">E. A. Lopez-Rojas, A. Elmir, and S. Axelsson, “PaySim: A financial mobile money simulator for fraud detection,” in Proc. 28th European Modeling and Simulation Symposium, Larnaca, Cyprus, 2016, pp. 249–255. [Online]. Available: </w:t>
+      </w:r>
+      <w:hyperlink r:id="rId21">
         <w:r>
           <w:rPr>
             <w:rFonts w:ascii="Times New Roman" w:hAnsi="Times New Roman"/>
@@ -18127,7 +18785,7 @@
       <w:pPr>
         <w:spacing w:before="40" w:after="60" w:line="276" w:lineRule="auto"/>
         <w:ind w:left="454" w:hanging="454"/>
-        <w:jc w:val="both"/>
+        <w:jc w:val="left"/>
       </w:pPr>
       <w:bookmarkStart w:id="1069" w:name="ref_3"/>
       <w:bookmarkEnd w:id="1069"/>
@@ -18151,7 +18809,7 @@
         </w:rPr>
         <w:t xml:space="preserve">E. Lopez-Rojas, “Synthetic Financial Datasets for Fraud Detection,” Kaggle. [Online]. Available: </w:t>
       </w:r>
-      <w:hyperlink r:id="rId20">
+      <w:hyperlink r:id="rId22">
         <w:r>
           <w:rPr>
             <w:rFonts w:ascii="Times New Roman" w:hAnsi="Times New Roman"/>
@@ -18177,7 +18835,7 @@
       <w:pPr>
         <w:spacing w:before="40" w:after="60" w:line="276" w:lineRule="auto"/>
         <w:ind w:left="454" w:hanging="454"/>
-        <w:jc w:val="both"/>
+        <w:jc w:val="left"/>
       </w:pPr>
       <w:bookmarkStart w:id="1070" w:name="ref_4"/>
       <w:bookmarkEnd w:id="1070"/>
@@ -18199,9 +18857,9 @@
           <w:color w:val="000000"/>
           <w:sz w:val="23"/>
         </w:rPr>
-        <w:t xml:space="preserve">N. V. Chawla, K. W. Bowyer, L. O. Hall, and W. P. Kegelmeyer, “SMOTE: Synthetic Minority Over-sampling Technique,” Journal of Artificial Intelligence Research, vol. 16, pp. 321-357, 2002, doi: </w:t>
-      </w:r>
-      <w:hyperlink r:id="rId21">
+        <w:t xml:space="preserve">N. V. Chawla, K. W. Bowyer, L. O. Hall, and W. P. Kegelmeyer, “SMOTE: Synthetic Minority Over-sampling Technique,” Journal of Artificial Intelligence Research, vol. 16, pp. 321–357, 2002, doi: </w:t>
+      </w:r>
+      <w:hyperlink r:id="rId23">
         <w:r>
           <w:rPr>
             <w:rFonts w:ascii="Times New Roman" w:hAnsi="Times New Roman"/>
@@ -18217,7 +18875,7 @@
       <w:pPr>
         <w:spacing w:before="40" w:after="60" w:line="276" w:lineRule="auto"/>
         <w:ind w:left="454" w:hanging="454"/>
-        <w:jc w:val="both"/>
+        <w:jc w:val="left"/>
       </w:pPr>
       <w:bookmarkStart w:id="1071" w:name="ref_5"/>
       <w:bookmarkEnd w:id="1071"/>
@@ -18239,9 +18897,9 @@
           <w:color w:val="000000"/>
           <w:sz w:val="23"/>
         </w:rPr>
-        <w:t xml:space="preserve">H. He, Y. Bai, E. A. Garcia, and S. Li, “ADASYN: Adaptive synthetic sampling approach for imbalanced learning,” in Proc. IEEE International Joint Conference on Neural Networks, Hong Kong, 2008, pp. 1322-1328, doi: </w:t>
-      </w:r>
-      <w:hyperlink r:id="rId22">
+        <w:t xml:space="preserve">H. He, Y. Bai, E. A. Garcia, and S. Li, “ADASYN: Adaptive synthetic sampling approach for imbalanced learning,” in Proc. IEEE International Joint Conference on Neural Networks, Hong Kong, 2008, pp. 1322–1328, doi: </w:t>
+      </w:r>
+      <w:hyperlink r:id="rId24">
         <w:r>
           <w:rPr>
             <w:rFonts w:ascii="Times New Roman" w:hAnsi="Times New Roman"/>
@@ -18257,7 +18915,7 @@
       <w:pPr>
         <w:spacing w:before="40" w:after="60" w:line="276" w:lineRule="auto"/>
         <w:ind w:left="454" w:hanging="454"/>
-        <w:jc w:val="both"/>
+        <w:jc w:val="left"/>
       </w:pPr>
       <w:bookmarkStart w:id="1072" w:name="ref_6"/>
       <w:bookmarkEnd w:id="1072"/>
@@ -18279,9 +18937,9 @@
           <w:color w:val="000000"/>
           <w:sz w:val="23"/>
         </w:rPr>
-        <w:t xml:space="preserve">L. Breiman, “Random Forests,” Machine Learning, vol. 45, no. 1, pp. 5-32, 2001, doi: </w:t>
-      </w:r>
-      <w:hyperlink r:id="rId23">
+        <w:t xml:space="preserve">L. Breiman, “Random Forests,” Machine Learning, vol. 45, no. 1, pp. 5–32, 2001, doi: </w:t>
+      </w:r>
+      <w:hyperlink r:id="rId25">
         <w:r>
           <w:rPr>
             <w:rFonts w:ascii="Times New Roman" w:hAnsi="Times New Roman"/>
@@ -18297,7 +18955,7 @@
       <w:pPr>
         <w:spacing w:before="40" w:after="60" w:line="276" w:lineRule="auto"/>
         <w:ind w:left="454" w:hanging="454"/>
-        <w:jc w:val="both"/>
+        <w:jc w:val="left"/>
       </w:pPr>
       <w:bookmarkStart w:id="1073" w:name="ref_7"/>
       <w:bookmarkEnd w:id="1073"/>
@@ -18319,9 +18977,9 @@
           <w:color w:val="000000"/>
           <w:sz w:val="23"/>
         </w:rPr>
-        <w:t xml:space="preserve">T. Chen and C. Guestrin, “XGBoost: A scalable tree boosting system,” in Proc. 22nd ACM SIGKDD International Conference on Knowledge Discovery and Data Mining, San Francisco, CA, USA, 2016, pp. 785-794, doi: </w:t>
-      </w:r>
-      <w:hyperlink r:id="rId24">
+        <w:t xml:space="preserve">T. Chen and C. Guestrin, “XGBoost: A scalable tree boosting system,” in Proc. 22nd ACM SIGKDD International Conference on Knowledge Discovery and Data Mining, San Francisco, CA, USA, 2016, pp. 785–794, doi: </w:t>
+      </w:r>
+      <w:hyperlink r:id="rId26">
         <w:r>
           <w:rPr>
             <w:rFonts w:ascii="Times New Roman" w:hAnsi="Times New Roman"/>
@@ -18337,7 +18995,7 @@
       <w:pPr>
         <w:spacing w:before="40" w:after="60" w:line="276" w:lineRule="auto"/>
         <w:ind w:left="454" w:hanging="454"/>
-        <w:jc w:val="both"/>
+        <w:jc w:val="left"/>
       </w:pPr>
       <w:bookmarkStart w:id="1074" w:name="ref_8"/>
       <w:bookmarkEnd w:id="1074"/>
@@ -18359,9 +19017,9 @@
           <w:color w:val="000000"/>
           <w:sz w:val="23"/>
         </w:rPr>
-        <w:t xml:space="preserve">G. E. Hinton and R. R. Salakhutdinov, “Reducing the dimensionality of data with neural networks,” Science, vol. 313, no. 5786, pp. 504-507, 2006, doi: </w:t>
-      </w:r>
-      <w:hyperlink r:id="rId25">
+        <w:t xml:space="preserve">G. E. Hinton and R. R. Salakhutdinov, “Reducing the dimensionality of data with neural networks,” Science, vol. 313, no. 5786, pp. 504–507, 2006, doi: </w:t>
+      </w:r>
+      <w:hyperlink r:id="rId27">
         <w:r>
           <w:rPr>
             <w:rFonts w:ascii="Times New Roman" w:hAnsi="Times New Roman"/>

</xml_diff>

<commit_message>
fix(phase07): update heading formatting and add windows docx2pdf support
</commit_message>
<xml_diff>
--- a/draft/fraud-detection/reports/[Nhom9]_BaoCao_FraudDetection.docx
+++ b/draft/fraud-detection/reports/[Nhom9]_BaoCao_FraudDetection.docx
@@ -133,7 +133,7 @@
           <w:color w:val="000000"/>
           <w:sz w:val="27"/>
         </w:rPr>
-        <w:t>HỆ THỐNG PHÁT HIỆN GIAO DỊCH TÀI CHÍNH BẤT THƯỜNG VÀ NGHI VẤN GIAN LẬN</w:t>
+        <w:t>"HỆ THỐNG PHÁT HIỆN GIAO DỊCH TÀI CHÍNH BẤT THƯỜNG VÀ NGHI VẤN GIAN LẬN"</w:t>
       </w:r>
     </w:p>
     <w:tbl>
@@ -341,7 +341,7 @@
     <w:p>
       <w:pPr>
         <w:tabs>
-          <w:tab w:pos="8957" w:val="right" w:leader="dot"/>
+          <w:tab w:pos="9071" w:val="right" w:leader="dot"/>
         </w:tabs>
         <w:spacing w:before="60" w:after="40" w:line="300" w:lineRule="auto"/>
       </w:pPr>
@@ -364,15 +364,14 @@
             <w:b/>
             <w:color w:val="000000"/>
           </w:rPr>
-          <w:tab/>
-          <w:t xml:space="preserve">1</w:t>
+          <w:t xml:space="preserve">	1</w:t>
         </w:r>
       </w:hyperlink>
     </w:p>
     <w:p>
       <w:pPr>
         <w:tabs>
-          <w:tab w:pos="8957" w:val="right" w:leader="dot"/>
+          <w:tab w:pos="9071" w:val="right" w:leader="dot"/>
         </w:tabs>
         <w:spacing w:before="60" w:after="40" w:line="300" w:lineRule="auto"/>
       </w:pPr>
@@ -395,15 +394,14 @@
             <w:b/>
             <w:color w:val="000000"/>
           </w:rPr>
-          <w:tab/>
-          <w:t xml:space="preserve">2</w:t>
+          <w:t xml:space="preserve">	2</w:t>
         </w:r>
       </w:hyperlink>
     </w:p>
     <w:p>
       <w:pPr>
         <w:tabs>
-          <w:tab w:pos="8617" w:val="right" w:leader="dot"/>
+          <w:tab w:pos="9071" w:val="right" w:leader="dot"/>
         </w:tabs>
         <w:spacing w:before="20" w:after="40" w:line="300" w:lineRule="auto"/>
         <w:ind w:left="340"/>
@@ -425,15 +423,14 @@
             <w:sz w:val="23"/>
             <w:color w:val="000000"/>
           </w:rPr>
-          <w:tab/>
-          <w:t xml:space="preserve">2</w:t>
+          <w:t xml:space="preserve">	2</w:t>
         </w:r>
       </w:hyperlink>
     </w:p>
     <w:p>
       <w:pPr>
         <w:tabs>
-          <w:tab w:pos="8617" w:val="right" w:leader="dot"/>
+          <w:tab w:pos="9071" w:val="right" w:leader="dot"/>
         </w:tabs>
         <w:spacing w:before="20" w:after="40" w:line="300" w:lineRule="auto"/>
         <w:ind w:left="340"/>
@@ -455,15 +452,14 @@
             <w:sz w:val="23"/>
             <w:color w:val="000000"/>
           </w:rPr>
-          <w:tab/>
-          <w:t xml:space="preserve">3</w:t>
+          <w:t xml:space="preserve">	2</w:t>
         </w:r>
       </w:hyperlink>
     </w:p>
     <w:p>
       <w:pPr>
         <w:tabs>
-          <w:tab w:pos="8617" w:val="right" w:leader="dot"/>
+          <w:tab w:pos="9071" w:val="right" w:leader="dot"/>
         </w:tabs>
         <w:spacing w:before="20" w:after="40" w:line="300" w:lineRule="auto"/>
         <w:ind w:left="340"/>
@@ -485,15 +481,14 @@
             <w:sz w:val="23"/>
             <w:color w:val="000000"/>
           </w:rPr>
-          <w:tab/>
-          <w:t xml:space="preserve">3</w:t>
+          <w:t xml:space="preserve">	2</w:t>
         </w:r>
       </w:hyperlink>
     </w:p>
     <w:p>
       <w:pPr>
         <w:tabs>
-          <w:tab w:pos="8277" w:val="right" w:leader="dot"/>
+          <w:tab w:pos="9071" w:val="right" w:leader="dot"/>
         </w:tabs>
         <w:spacing w:before="20" w:after="40" w:line="300" w:lineRule="auto"/>
         <w:ind w:left="680"/>
@@ -515,15 +510,14 @@
             <w:sz w:val="23"/>
             <w:color w:val="000000"/>
           </w:rPr>
-          <w:tab/>
-          <w:t xml:space="preserve">3</w:t>
+          <w:t xml:space="preserve">	3</w:t>
         </w:r>
       </w:hyperlink>
     </w:p>
     <w:p>
       <w:pPr>
         <w:tabs>
-          <w:tab w:pos="8277" w:val="right" w:leader="dot"/>
+          <w:tab w:pos="9071" w:val="right" w:leader="dot"/>
         </w:tabs>
         <w:spacing w:before="20" w:after="40" w:line="300" w:lineRule="auto"/>
         <w:ind w:left="680"/>
@@ -545,15 +539,14 @@
             <w:sz w:val="23"/>
             <w:color w:val="000000"/>
           </w:rPr>
-          <w:tab/>
-          <w:t xml:space="preserve">4</w:t>
+          <w:t xml:space="preserve">	3</w:t>
         </w:r>
       </w:hyperlink>
     </w:p>
     <w:p>
       <w:pPr>
         <w:tabs>
-          <w:tab w:pos="8617" w:val="right" w:leader="dot"/>
+          <w:tab w:pos="9071" w:val="right" w:leader="dot"/>
         </w:tabs>
         <w:spacing w:before="20" w:after="40" w:line="300" w:lineRule="auto"/>
         <w:ind w:left="340"/>
@@ -575,15 +568,14 @@
             <w:sz w:val="23"/>
             <w:color w:val="000000"/>
           </w:rPr>
-          <w:tab/>
-          <w:t xml:space="preserve">4</w:t>
+          <w:t xml:space="preserve">	4</w:t>
         </w:r>
       </w:hyperlink>
     </w:p>
     <w:p>
       <w:pPr>
         <w:tabs>
-          <w:tab w:pos="8617" w:val="right" w:leader="dot"/>
+          <w:tab w:pos="9071" w:val="right" w:leader="dot"/>
         </w:tabs>
         <w:spacing w:before="20" w:after="40" w:line="300" w:lineRule="auto"/>
         <w:ind w:left="340"/>
@@ -605,15 +597,14 @@
             <w:sz w:val="23"/>
             <w:color w:val="000000"/>
           </w:rPr>
-          <w:tab/>
-          <w:t xml:space="preserve">5</w:t>
+          <w:t xml:space="preserve">	4</w:t>
         </w:r>
       </w:hyperlink>
     </w:p>
     <w:p>
       <w:pPr>
         <w:tabs>
-          <w:tab w:pos="8957" w:val="right" w:leader="dot"/>
+          <w:tab w:pos="9071" w:val="right" w:leader="dot"/>
         </w:tabs>
         <w:spacing w:before="60" w:after="40" w:line="300" w:lineRule="auto"/>
       </w:pPr>
@@ -636,15 +627,14 @@
             <w:b/>
             <w:color w:val="000000"/>
           </w:rPr>
-          <w:tab/>
-          <w:t xml:space="preserve">5</w:t>
+          <w:t xml:space="preserve">	5</w:t>
         </w:r>
       </w:hyperlink>
     </w:p>
     <w:p>
       <w:pPr>
         <w:tabs>
-          <w:tab w:pos="8617" w:val="right" w:leader="dot"/>
+          <w:tab w:pos="9071" w:val="right" w:leader="dot"/>
         </w:tabs>
         <w:spacing w:before="20" w:after="40" w:line="300" w:lineRule="auto"/>
         <w:ind w:left="340"/>
@@ -666,15 +656,14 @@
             <w:sz w:val="23"/>
             <w:color w:val="000000"/>
           </w:rPr>
-          <w:tab/>
-          <w:t xml:space="preserve">5</w:t>
+          <w:t xml:space="preserve">	5</w:t>
         </w:r>
       </w:hyperlink>
     </w:p>
     <w:p>
       <w:pPr>
         <w:tabs>
-          <w:tab w:pos="8617" w:val="right" w:leader="dot"/>
+          <w:tab w:pos="9071" w:val="right" w:leader="dot"/>
         </w:tabs>
         <w:spacing w:before="20" w:after="40" w:line="300" w:lineRule="auto"/>
         <w:ind w:left="340"/>
@@ -696,15 +685,14 @@
             <w:sz w:val="23"/>
             <w:color w:val="000000"/>
           </w:rPr>
-          <w:tab/>
-          <w:t xml:space="preserve">5</w:t>
+          <w:t xml:space="preserve">	5</w:t>
         </w:r>
       </w:hyperlink>
     </w:p>
     <w:p>
       <w:pPr>
         <w:tabs>
-          <w:tab w:pos="8617" w:val="right" w:leader="dot"/>
+          <w:tab w:pos="9071" w:val="right" w:leader="dot"/>
         </w:tabs>
         <w:spacing w:before="20" w:after="40" w:line="300" w:lineRule="auto"/>
         <w:ind w:left="340"/>
@@ -726,15 +714,14 @@
             <w:sz w:val="23"/>
             <w:color w:val="000000"/>
           </w:rPr>
-          <w:tab/>
-          <w:t xml:space="preserve">6</w:t>
+          <w:t xml:space="preserve">	6</w:t>
         </w:r>
       </w:hyperlink>
     </w:p>
     <w:p>
       <w:pPr>
         <w:tabs>
-          <w:tab w:pos="8277" w:val="right" w:leader="dot"/>
+          <w:tab w:pos="9071" w:val="right" w:leader="dot"/>
         </w:tabs>
         <w:spacing w:before="20" w:after="40" w:line="300" w:lineRule="auto"/>
         <w:ind w:left="680"/>
@@ -756,15 +743,14 @@
             <w:sz w:val="23"/>
             <w:color w:val="000000"/>
           </w:rPr>
-          <w:tab/>
-          <w:t xml:space="preserve">6</w:t>
+          <w:t xml:space="preserve">	6</w:t>
         </w:r>
       </w:hyperlink>
     </w:p>
     <w:p>
       <w:pPr>
         <w:tabs>
-          <w:tab w:pos="8277" w:val="right" w:leader="dot"/>
+          <w:tab w:pos="9071" w:val="right" w:leader="dot"/>
         </w:tabs>
         <w:spacing w:before="20" w:after="40" w:line="300" w:lineRule="auto"/>
         <w:ind w:left="680"/>
@@ -786,15 +772,14 @@
             <w:sz w:val="23"/>
             <w:color w:val="000000"/>
           </w:rPr>
-          <w:tab/>
-          <w:t xml:space="preserve">6</w:t>
+          <w:t xml:space="preserve">	6</w:t>
         </w:r>
       </w:hyperlink>
     </w:p>
     <w:p>
       <w:pPr>
         <w:tabs>
-          <w:tab w:pos="8277" w:val="right" w:leader="dot"/>
+          <w:tab w:pos="9071" w:val="right" w:leader="dot"/>
         </w:tabs>
         <w:spacing w:before="20" w:after="40" w:line="300" w:lineRule="auto"/>
         <w:ind w:left="680"/>
@@ -816,15 +801,14 @@
             <w:sz w:val="23"/>
             <w:color w:val="000000"/>
           </w:rPr>
-          <w:tab/>
-          <w:t xml:space="preserve">6</w:t>
+          <w:t xml:space="preserve">	6</w:t>
         </w:r>
       </w:hyperlink>
     </w:p>
     <w:p>
       <w:pPr>
         <w:tabs>
-          <w:tab w:pos="8277" w:val="right" w:leader="dot"/>
+          <w:tab w:pos="9071" w:val="right" w:leader="dot"/>
         </w:tabs>
         <w:spacing w:before="20" w:after="40" w:line="300" w:lineRule="auto"/>
         <w:ind w:left="680"/>
@@ -846,15 +830,14 @@
             <w:sz w:val="23"/>
             <w:color w:val="000000"/>
           </w:rPr>
-          <w:tab/>
-          <w:t xml:space="preserve">6</w:t>
+          <w:t xml:space="preserve">	6</w:t>
         </w:r>
       </w:hyperlink>
     </w:p>
     <w:p>
       <w:pPr>
         <w:tabs>
-          <w:tab w:pos="8617" w:val="right" w:leader="dot"/>
+          <w:tab w:pos="9071" w:val="right" w:leader="dot"/>
         </w:tabs>
         <w:spacing w:before="20" w:after="40" w:line="300" w:lineRule="auto"/>
         <w:ind w:left="340"/>
@@ -876,15 +859,14 @@
             <w:sz w:val="23"/>
             <w:color w:val="000000"/>
           </w:rPr>
-          <w:tab/>
-          <w:t xml:space="preserve">6</w:t>
+          <w:t xml:space="preserve">	6</w:t>
         </w:r>
       </w:hyperlink>
     </w:p>
     <w:p>
       <w:pPr>
         <w:tabs>
-          <w:tab w:pos="8617" w:val="right" w:leader="dot"/>
+          <w:tab w:pos="9071" w:val="right" w:leader="dot"/>
         </w:tabs>
         <w:spacing w:before="20" w:after="40" w:line="300" w:lineRule="auto"/>
         <w:ind w:left="340"/>
@@ -906,15 +888,14 @@
             <w:sz w:val="23"/>
             <w:color w:val="000000"/>
           </w:rPr>
-          <w:tab/>
-          <w:t xml:space="preserve">7</w:t>
+          <w:t xml:space="preserve">	7</w:t>
         </w:r>
       </w:hyperlink>
     </w:p>
     <w:p>
       <w:pPr>
         <w:tabs>
-          <w:tab w:pos="8957" w:val="right" w:leader="dot"/>
+          <w:tab w:pos="9071" w:val="right" w:leader="dot"/>
         </w:tabs>
         <w:spacing w:before="60" w:after="40" w:line="300" w:lineRule="auto"/>
       </w:pPr>
@@ -937,15 +918,14 @@
             <w:b/>
             <w:color w:val="000000"/>
           </w:rPr>
-          <w:tab/>
-          <w:t xml:space="preserve">7</w:t>
+          <w:t xml:space="preserve">	7</w:t>
         </w:r>
       </w:hyperlink>
     </w:p>
     <w:p>
       <w:pPr>
         <w:tabs>
-          <w:tab w:pos="8617" w:val="right" w:leader="dot"/>
+          <w:tab w:pos="9071" w:val="right" w:leader="dot"/>
         </w:tabs>
         <w:spacing w:before="20" w:after="40" w:line="300" w:lineRule="auto"/>
         <w:ind w:left="340"/>
@@ -967,15 +947,14 @@
             <w:sz w:val="23"/>
             <w:color w:val="000000"/>
           </w:rPr>
-          <w:tab/>
-          <w:t xml:space="preserve">7</w:t>
+          <w:t xml:space="preserve">	7</w:t>
         </w:r>
       </w:hyperlink>
     </w:p>
     <w:p>
       <w:pPr>
         <w:tabs>
-          <w:tab w:pos="8617" w:val="right" w:leader="dot"/>
+          <w:tab w:pos="9071" w:val="right" w:leader="dot"/>
         </w:tabs>
         <w:spacing w:before="20" w:after="40" w:line="300" w:lineRule="auto"/>
         <w:ind w:left="340"/>
@@ -997,15 +976,14 @@
             <w:sz w:val="23"/>
             <w:color w:val="000000"/>
           </w:rPr>
-          <w:tab/>
-          <w:t xml:space="preserve">8</w:t>
+          <w:t xml:space="preserve">	7</w:t>
         </w:r>
       </w:hyperlink>
     </w:p>
     <w:p>
       <w:pPr>
         <w:tabs>
-          <w:tab w:pos="8617" w:val="right" w:leader="dot"/>
+          <w:tab w:pos="9071" w:val="right" w:leader="dot"/>
         </w:tabs>
         <w:spacing w:before="20" w:after="40" w:line="300" w:lineRule="auto"/>
         <w:ind w:left="340"/>
@@ -1027,15 +1005,14 @@
             <w:sz w:val="23"/>
             <w:color w:val="000000"/>
           </w:rPr>
-          <w:tab/>
-          <w:t xml:space="preserve">8</w:t>
+          <w:t xml:space="preserve">	7</w:t>
         </w:r>
       </w:hyperlink>
     </w:p>
     <w:p>
       <w:pPr>
         <w:tabs>
-          <w:tab w:pos="8617" w:val="right" w:leader="dot"/>
+          <w:tab w:pos="9071" w:val="right" w:leader="dot"/>
         </w:tabs>
         <w:spacing w:before="20" w:after="40" w:line="300" w:lineRule="auto"/>
         <w:ind w:left="340"/>
@@ -1057,15 +1034,14 @@
             <w:sz w:val="23"/>
             <w:color w:val="000000"/>
           </w:rPr>
-          <w:tab/>
-          <w:t xml:space="preserve">9</w:t>
+          <w:t xml:space="preserve">	9</w:t>
         </w:r>
       </w:hyperlink>
     </w:p>
     <w:p>
       <w:pPr>
         <w:tabs>
-          <w:tab w:pos="8617" w:val="right" w:leader="dot"/>
+          <w:tab w:pos="9071" w:val="right" w:leader="dot"/>
         </w:tabs>
         <w:spacing w:before="20" w:after="40" w:line="300" w:lineRule="auto"/>
         <w:ind w:left="340"/>
@@ -1087,15 +1063,14 @@
             <w:sz w:val="23"/>
             <w:color w:val="000000"/>
           </w:rPr>
-          <w:tab/>
-          <w:t xml:space="preserve">9</w:t>
+          <w:t xml:space="preserve">	9</w:t>
         </w:r>
       </w:hyperlink>
     </w:p>
     <w:p>
       <w:pPr>
         <w:tabs>
-          <w:tab w:pos="8617" w:val="right" w:leader="dot"/>
+          <w:tab w:pos="9071" w:val="right" w:leader="dot"/>
         </w:tabs>
         <w:spacing w:before="20" w:after="40" w:line="300" w:lineRule="auto"/>
         <w:ind w:left="340"/>
@@ -1117,15 +1092,14 @@
             <w:sz w:val="23"/>
             <w:color w:val="000000"/>
           </w:rPr>
-          <w:tab/>
-          <w:t xml:space="preserve">10</w:t>
+          <w:t xml:space="preserve">	9</w:t>
         </w:r>
       </w:hyperlink>
     </w:p>
     <w:p>
       <w:pPr>
         <w:tabs>
-          <w:tab w:pos="8277" w:val="right" w:leader="dot"/>
+          <w:tab w:pos="9071" w:val="right" w:leader="dot"/>
         </w:tabs>
         <w:spacing w:before="20" w:after="40" w:line="300" w:lineRule="auto"/>
         <w:ind w:left="680"/>
@@ -1147,15 +1121,14 @@
             <w:sz w:val="23"/>
             <w:color w:val="000000"/>
           </w:rPr>
-          <w:tab/>
-          <w:t xml:space="preserve">10</w:t>
+          <w:t xml:space="preserve">	9</w:t>
         </w:r>
       </w:hyperlink>
     </w:p>
     <w:p>
       <w:pPr>
         <w:tabs>
-          <w:tab w:pos="8277" w:val="right" w:leader="dot"/>
+          <w:tab w:pos="9071" w:val="right" w:leader="dot"/>
         </w:tabs>
         <w:spacing w:before="20" w:after="40" w:line="300" w:lineRule="auto"/>
         <w:ind w:left="680"/>
@@ -1177,15 +1150,14 @@
             <w:sz w:val="23"/>
             <w:color w:val="000000"/>
           </w:rPr>
-          <w:tab/>
-          <w:t xml:space="preserve">10</w:t>
+          <w:t xml:space="preserve">	9</w:t>
         </w:r>
       </w:hyperlink>
     </w:p>
     <w:p>
       <w:pPr>
         <w:tabs>
-          <w:tab w:pos="8277" w:val="right" w:leader="dot"/>
+          <w:tab w:pos="9071" w:val="right" w:leader="dot"/>
         </w:tabs>
         <w:spacing w:before="20" w:after="40" w:line="300" w:lineRule="auto"/>
         <w:ind w:left="680"/>
@@ -1207,15 +1179,14 @@
             <w:sz w:val="23"/>
             <w:color w:val="000000"/>
           </w:rPr>
-          <w:tab/>
-          <w:t xml:space="preserve">10</w:t>
+          <w:t xml:space="preserve">	9</w:t>
         </w:r>
       </w:hyperlink>
     </w:p>
     <w:p>
       <w:pPr>
         <w:tabs>
-          <w:tab w:pos="8277" w:val="right" w:leader="dot"/>
+          <w:tab w:pos="9071" w:val="right" w:leader="dot"/>
         </w:tabs>
         <w:spacing w:before="20" w:after="40" w:line="300" w:lineRule="auto"/>
         <w:ind w:left="680"/>
@@ -1237,15 +1208,14 @@
             <w:sz w:val="23"/>
             <w:color w:val="000000"/>
           </w:rPr>
-          <w:tab/>
-          <w:t xml:space="preserve">10</w:t>
+          <w:t xml:space="preserve">	9</w:t>
         </w:r>
       </w:hyperlink>
     </w:p>
     <w:p>
       <w:pPr>
         <w:tabs>
-          <w:tab w:pos="8277" w:val="right" w:leader="dot"/>
+          <w:tab w:pos="9071" w:val="right" w:leader="dot"/>
         </w:tabs>
         <w:spacing w:before="20" w:after="40" w:line="300" w:lineRule="auto"/>
         <w:ind w:left="680"/>
@@ -1267,15 +1237,14 @@
             <w:sz w:val="23"/>
             <w:color w:val="000000"/>
           </w:rPr>
-          <w:tab/>
-          <w:t xml:space="preserve">11</w:t>
+          <w:t xml:space="preserve">	11</w:t>
         </w:r>
       </w:hyperlink>
     </w:p>
     <w:p>
       <w:pPr>
         <w:tabs>
-          <w:tab w:pos="8617" w:val="right" w:leader="dot"/>
+          <w:tab w:pos="9071" w:val="right" w:leader="dot"/>
         </w:tabs>
         <w:spacing w:before="20" w:after="40" w:line="300" w:lineRule="auto"/>
         <w:ind w:left="340"/>
@@ -1297,15 +1266,14 @@
             <w:sz w:val="23"/>
             <w:color w:val="000000"/>
           </w:rPr>
-          <w:tab/>
-          <w:t xml:space="preserve">11</w:t>
+          <w:t xml:space="preserve">	11</w:t>
         </w:r>
       </w:hyperlink>
     </w:p>
     <w:p>
       <w:pPr>
         <w:tabs>
-          <w:tab w:pos="8957" w:val="right" w:leader="dot"/>
+          <w:tab w:pos="9071" w:val="right" w:leader="dot"/>
         </w:tabs>
         <w:spacing w:before="60" w:after="40" w:line="300" w:lineRule="auto"/>
       </w:pPr>
@@ -1328,15 +1296,14 @@
             <w:b/>
             <w:color w:val="000000"/>
           </w:rPr>
-          <w:tab/>
-          <w:t xml:space="preserve">11</w:t>
+          <w:t xml:space="preserve">	12</w:t>
         </w:r>
       </w:hyperlink>
     </w:p>
     <w:p>
       <w:pPr>
         <w:tabs>
-          <w:tab w:pos="8617" w:val="right" w:leader="dot"/>
+          <w:tab w:pos="9071" w:val="right" w:leader="dot"/>
         </w:tabs>
         <w:spacing w:before="20" w:after="40" w:line="300" w:lineRule="auto"/>
         <w:ind w:left="340"/>
@@ -1358,15 +1325,14 @@
             <w:sz w:val="23"/>
             <w:color w:val="000000"/>
           </w:rPr>
-          <w:tab/>
-          <w:t xml:space="preserve">11</w:t>
+          <w:t xml:space="preserve">	12</w:t>
         </w:r>
       </w:hyperlink>
     </w:p>
     <w:p>
       <w:pPr>
         <w:tabs>
-          <w:tab w:pos="8617" w:val="right" w:leader="dot"/>
+          <w:tab w:pos="9071" w:val="right" w:leader="dot"/>
         </w:tabs>
         <w:spacing w:before="20" w:after="40" w:line="300" w:lineRule="auto"/>
         <w:ind w:left="340"/>
@@ -1388,15 +1354,14 @@
             <w:sz w:val="23"/>
             <w:color w:val="000000"/>
           </w:rPr>
-          <w:tab/>
-          <w:t xml:space="preserve">12</w:t>
+          <w:t xml:space="preserve">	12</w:t>
         </w:r>
       </w:hyperlink>
     </w:p>
     <w:p>
       <w:pPr>
         <w:tabs>
-          <w:tab w:pos="8617" w:val="right" w:leader="dot"/>
+          <w:tab w:pos="9071" w:val="right" w:leader="dot"/>
         </w:tabs>
         <w:spacing w:before="20" w:after="40" w:line="300" w:lineRule="auto"/>
         <w:ind w:left="340"/>
@@ -1418,15 +1383,14 @@
             <w:sz w:val="23"/>
             <w:color w:val="000000"/>
           </w:rPr>
-          <w:tab/>
-          <w:t xml:space="preserve">12</w:t>
+          <w:t xml:space="preserve">	12</w:t>
         </w:r>
       </w:hyperlink>
     </w:p>
     <w:p>
       <w:pPr>
         <w:tabs>
-          <w:tab w:pos="8617" w:val="right" w:leader="dot"/>
+          <w:tab w:pos="9071" w:val="right" w:leader="dot"/>
         </w:tabs>
         <w:spacing w:before="20" w:after="40" w:line="300" w:lineRule="auto"/>
         <w:ind w:left="340"/>
@@ -1448,15 +1412,14 @@
             <w:sz w:val="23"/>
             <w:color w:val="000000"/>
           </w:rPr>
-          <w:tab/>
-          <w:t xml:space="preserve">13</w:t>
+          <w:t xml:space="preserve">	13</w:t>
         </w:r>
       </w:hyperlink>
     </w:p>
     <w:p>
       <w:pPr>
         <w:tabs>
-          <w:tab w:pos="8617" w:val="right" w:leader="dot"/>
+          <w:tab w:pos="9071" w:val="right" w:leader="dot"/>
         </w:tabs>
         <w:spacing w:before="20" w:after="40" w:line="300" w:lineRule="auto"/>
         <w:ind w:left="340"/>
@@ -1478,15 +1441,14 @@
             <w:sz w:val="23"/>
             <w:color w:val="000000"/>
           </w:rPr>
-          <w:tab/>
-          <w:t xml:space="preserve">13</w:t>
+          <w:t xml:space="preserve">	14</w:t>
         </w:r>
       </w:hyperlink>
     </w:p>
     <w:p>
       <w:pPr>
         <w:tabs>
-          <w:tab w:pos="8617" w:val="right" w:leader="dot"/>
+          <w:tab w:pos="9071" w:val="right" w:leader="dot"/>
         </w:tabs>
         <w:spacing w:before="20" w:after="40" w:line="300" w:lineRule="auto"/>
         <w:ind w:left="340"/>
@@ -1508,15 +1470,14 @@
             <w:sz w:val="23"/>
             <w:color w:val="000000"/>
           </w:rPr>
-          <w:tab/>
-          <w:t xml:space="preserve">13</w:t>
+          <w:t xml:space="preserve">	14</w:t>
         </w:r>
       </w:hyperlink>
     </w:p>
     <w:p>
       <w:pPr>
         <w:tabs>
-          <w:tab w:pos="8617" w:val="right" w:leader="dot"/>
+          <w:tab w:pos="9071" w:val="right" w:leader="dot"/>
         </w:tabs>
         <w:spacing w:before="20" w:after="40" w:line="300" w:lineRule="auto"/>
         <w:ind w:left="340"/>
@@ -1538,15 +1499,14 @@
             <w:sz w:val="23"/>
             <w:color w:val="000000"/>
           </w:rPr>
-          <w:tab/>
-          <w:t xml:space="preserve">14</w:t>
+          <w:t xml:space="preserve">	15</w:t>
         </w:r>
       </w:hyperlink>
     </w:p>
     <w:p>
       <w:pPr>
         <w:tabs>
-          <w:tab w:pos="8617" w:val="right" w:leader="dot"/>
+          <w:tab w:pos="9071" w:val="right" w:leader="dot"/>
         </w:tabs>
         <w:spacing w:before="20" w:after="40" w:line="300" w:lineRule="auto"/>
         <w:ind w:left="340"/>
@@ -1568,15 +1528,14 @@
             <w:sz w:val="23"/>
             <w:color w:val="000000"/>
           </w:rPr>
-          <w:tab/>
-          <w:t xml:space="preserve">15</w:t>
+          <w:t xml:space="preserve">	15</w:t>
         </w:r>
       </w:hyperlink>
     </w:p>
     <w:p>
       <w:pPr>
         <w:tabs>
-          <w:tab w:pos="8617" w:val="right" w:leader="dot"/>
+          <w:tab w:pos="9071" w:val="right" w:leader="dot"/>
         </w:tabs>
         <w:spacing w:before="20" w:after="40" w:line="300" w:lineRule="auto"/>
         <w:ind w:left="340"/>
@@ -1598,15 +1557,14 @@
             <w:sz w:val="23"/>
             <w:color w:val="000000"/>
           </w:rPr>
-          <w:tab/>
-          <w:t xml:space="preserve">15</w:t>
+          <w:t xml:space="preserve">	15</w:t>
         </w:r>
       </w:hyperlink>
     </w:p>
     <w:p>
       <w:pPr>
         <w:tabs>
-          <w:tab w:pos="8957" w:val="right" w:leader="dot"/>
+          <w:tab w:pos="9071" w:val="right" w:leader="dot"/>
         </w:tabs>
         <w:spacing w:before="60" w:after="40" w:line="300" w:lineRule="auto"/>
       </w:pPr>
@@ -1629,15 +1587,14 @@
             <w:b/>
             <w:color w:val="000000"/>
           </w:rPr>
-          <w:tab/>
-          <w:t xml:space="preserve">15</w:t>
+          <w:t xml:space="preserve">	15</w:t>
         </w:r>
       </w:hyperlink>
     </w:p>
     <w:p>
       <w:pPr>
         <w:tabs>
-          <w:tab w:pos="8617" w:val="right" w:leader="dot"/>
+          <w:tab w:pos="9071" w:val="right" w:leader="dot"/>
         </w:tabs>
         <w:spacing w:before="20" w:after="40" w:line="300" w:lineRule="auto"/>
         <w:ind w:left="340"/>
@@ -1659,15 +1616,14 @@
             <w:sz w:val="23"/>
             <w:color w:val="000000"/>
           </w:rPr>
-          <w:tab/>
-          <w:t xml:space="preserve">15</w:t>
+          <w:t xml:space="preserve">	16</w:t>
         </w:r>
       </w:hyperlink>
     </w:p>
     <w:p>
       <w:pPr>
         <w:tabs>
-          <w:tab w:pos="8617" w:val="right" w:leader="dot"/>
+          <w:tab w:pos="9071" w:val="right" w:leader="dot"/>
         </w:tabs>
         <w:spacing w:before="20" w:after="40" w:line="300" w:lineRule="auto"/>
         <w:ind w:left="340"/>
@@ -1689,15 +1645,14 @@
             <w:sz w:val="23"/>
             <w:color w:val="000000"/>
           </w:rPr>
-          <w:tab/>
-          <w:t xml:space="preserve">16</w:t>
+          <w:t xml:space="preserve">	16</w:t>
         </w:r>
       </w:hyperlink>
     </w:p>
     <w:p>
       <w:pPr>
         <w:tabs>
-          <w:tab w:pos="8617" w:val="right" w:leader="dot"/>
+          <w:tab w:pos="9071" w:val="right" w:leader="dot"/>
         </w:tabs>
         <w:spacing w:before="20" w:after="40" w:line="300" w:lineRule="auto"/>
         <w:ind w:left="340"/>
@@ -1719,15 +1674,14 @@
             <w:sz w:val="23"/>
             <w:color w:val="000000"/>
           </w:rPr>
-          <w:tab/>
-          <w:t xml:space="preserve">18</w:t>
+          <w:t xml:space="preserve">	17</w:t>
         </w:r>
       </w:hyperlink>
     </w:p>
     <w:p>
       <w:pPr>
         <w:tabs>
-          <w:tab w:pos="8617" w:val="right" w:leader="dot"/>
+          <w:tab w:pos="9071" w:val="right" w:leader="dot"/>
         </w:tabs>
         <w:spacing w:before="20" w:after="40" w:line="300" w:lineRule="auto"/>
         <w:ind w:left="340"/>
@@ -1749,15 +1703,14 @@
             <w:sz w:val="23"/>
             <w:color w:val="000000"/>
           </w:rPr>
-          <w:tab/>
-          <w:t xml:space="preserve">19</w:t>
+          <w:t xml:space="preserve">	18</w:t>
         </w:r>
       </w:hyperlink>
     </w:p>
     <w:p>
       <w:pPr>
         <w:tabs>
-          <w:tab w:pos="8617" w:val="right" w:leader="dot"/>
+          <w:tab w:pos="9071" w:val="right" w:leader="dot"/>
         </w:tabs>
         <w:spacing w:before="20" w:after="40" w:line="300" w:lineRule="auto"/>
         <w:ind w:left="340"/>
@@ -1779,15 +1732,14 @@
             <w:sz w:val="23"/>
             <w:color w:val="000000"/>
           </w:rPr>
-          <w:tab/>
-          <w:t xml:space="preserve">19</w:t>
+          <w:t xml:space="preserve">	19</w:t>
         </w:r>
       </w:hyperlink>
     </w:p>
     <w:p>
       <w:pPr>
         <w:tabs>
-          <w:tab w:pos="8617" w:val="right" w:leader="dot"/>
+          <w:tab w:pos="9071" w:val="right" w:leader="dot"/>
         </w:tabs>
         <w:spacing w:before="20" w:after="40" w:line="300" w:lineRule="auto"/>
         <w:ind w:left="340"/>
@@ -1809,15 +1761,14 @@
             <w:sz w:val="23"/>
             <w:color w:val="000000"/>
           </w:rPr>
-          <w:tab/>
-          <w:t xml:space="preserve">21</w:t>
+          <w:t xml:space="preserve">	21</w:t>
         </w:r>
       </w:hyperlink>
     </w:p>
     <w:p>
       <w:pPr>
         <w:tabs>
-          <w:tab w:pos="8957" w:val="right" w:leader="dot"/>
+          <w:tab w:pos="9071" w:val="right" w:leader="dot"/>
         </w:tabs>
         <w:spacing w:before="60" w:after="40" w:line="300" w:lineRule="auto"/>
       </w:pPr>
@@ -1840,15 +1791,14 @@
             <w:b/>
             <w:color w:val="000000"/>
           </w:rPr>
-          <w:tab/>
-          <w:t xml:space="preserve">21</w:t>
+          <w:t xml:space="preserve">	21</w:t>
         </w:r>
       </w:hyperlink>
     </w:p>
     <w:p>
       <w:pPr>
         <w:tabs>
-          <w:tab w:pos="8617" w:val="right" w:leader="dot"/>
+          <w:tab w:pos="9071" w:val="right" w:leader="dot"/>
         </w:tabs>
         <w:spacing w:before="20" w:after="40" w:line="300" w:lineRule="auto"/>
         <w:ind w:left="340"/>
@@ -1870,15 +1820,14 @@
             <w:sz w:val="23"/>
             <w:color w:val="000000"/>
           </w:rPr>
-          <w:tab/>
-          <w:t xml:space="preserve">21</w:t>
+          <w:t xml:space="preserve">	21</w:t>
         </w:r>
       </w:hyperlink>
     </w:p>
     <w:p>
       <w:pPr>
         <w:tabs>
-          <w:tab w:pos="8617" w:val="right" w:leader="dot"/>
+          <w:tab w:pos="9071" w:val="right" w:leader="dot"/>
         </w:tabs>
         <w:spacing w:before="20" w:after="40" w:line="300" w:lineRule="auto"/>
         <w:ind w:left="340"/>
@@ -1900,15 +1849,14 @@
             <w:sz w:val="23"/>
             <w:color w:val="000000"/>
           </w:rPr>
-          <w:tab/>
-          <w:t xml:space="preserve">22</w:t>
+          <w:t xml:space="preserve">	21</w:t>
         </w:r>
       </w:hyperlink>
     </w:p>
     <w:p>
       <w:pPr>
         <w:tabs>
-          <w:tab w:pos="8617" w:val="right" w:leader="dot"/>
+          <w:tab w:pos="9071" w:val="right" w:leader="dot"/>
         </w:tabs>
         <w:spacing w:before="20" w:after="40" w:line="300" w:lineRule="auto"/>
         <w:ind w:left="340"/>
@@ -1930,15 +1878,14 @@
             <w:sz w:val="23"/>
             <w:color w:val="000000"/>
           </w:rPr>
-          <w:tab/>
-          <w:t xml:space="preserve">23</w:t>
+          <w:t xml:space="preserve">	21</w:t>
         </w:r>
       </w:hyperlink>
     </w:p>
     <w:p>
       <w:pPr>
         <w:tabs>
-          <w:tab w:pos="8617" w:val="right" w:leader="dot"/>
+          <w:tab w:pos="9071" w:val="right" w:leader="dot"/>
         </w:tabs>
         <w:spacing w:before="20" w:after="40" w:line="300" w:lineRule="auto"/>
         <w:ind w:left="340"/>
@@ -1960,15 +1907,14 @@
             <w:sz w:val="23"/>
             <w:color w:val="000000"/>
           </w:rPr>
-          <w:tab/>
-          <w:t xml:space="preserve">23</w:t>
+          <w:t xml:space="preserve">	23</w:t>
         </w:r>
       </w:hyperlink>
     </w:p>
     <w:p>
       <w:pPr>
         <w:tabs>
-          <w:tab w:pos="8617" w:val="right" w:leader="dot"/>
+          <w:tab w:pos="9071" w:val="right" w:leader="dot"/>
         </w:tabs>
         <w:spacing w:before="20" w:after="40" w:line="300" w:lineRule="auto"/>
         <w:ind w:left="340"/>
@@ -1990,15 +1936,14 @@
             <w:sz w:val="23"/>
             <w:color w:val="000000"/>
           </w:rPr>
-          <w:tab/>
-          <w:t xml:space="preserve">24</w:t>
+          <w:t xml:space="preserve">	24</w:t>
         </w:r>
       </w:hyperlink>
     </w:p>
     <w:p>
       <w:pPr>
         <w:tabs>
-          <w:tab w:pos="8617" w:val="right" w:leader="dot"/>
+          <w:tab w:pos="9071" w:val="right" w:leader="dot"/>
         </w:tabs>
         <w:spacing w:before="20" w:after="40" w:line="300" w:lineRule="auto"/>
         <w:ind w:left="340"/>
@@ -2020,15 +1965,14 @@
             <w:sz w:val="23"/>
             <w:color w:val="000000"/>
           </w:rPr>
-          <w:tab/>
-          <w:t xml:space="preserve">24</w:t>
+          <w:t xml:space="preserve">	24</w:t>
         </w:r>
       </w:hyperlink>
     </w:p>
     <w:p>
       <w:pPr>
         <w:tabs>
-          <w:tab w:pos="8617" w:val="right" w:leader="dot"/>
+          <w:tab w:pos="9071" w:val="right" w:leader="dot"/>
         </w:tabs>
         <w:spacing w:before="20" w:after="40" w:line="300" w:lineRule="auto"/>
         <w:ind w:left="340"/>
@@ -2050,15 +1994,14 @@
             <w:sz w:val="23"/>
             <w:color w:val="000000"/>
           </w:rPr>
-          <w:tab/>
-          <w:t xml:space="preserve">25</w:t>
+          <w:t xml:space="preserve">	25</w:t>
         </w:r>
       </w:hyperlink>
     </w:p>
     <w:p>
       <w:pPr>
         <w:tabs>
-          <w:tab w:pos="8957" w:val="right" w:leader="dot"/>
+          <w:tab w:pos="9071" w:val="right" w:leader="dot"/>
         </w:tabs>
         <w:spacing w:before="60" w:after="40" w:line="300" w:lineRule="auto"/>
       </w:pPr>
@@ -2081,15 +2024,14 @@
             <w:b/>
             <w:color w:val="000000"/>
           </w:rPr>
-          <w:tab/>
-          <w:t xml:space="preserve">25</w:t>
+          <w:t xml:space="preserve">	25</w:t>
         </w:r>
       </w:hyperlink>
     </w:p>
     <w:p>
       <w:pPr>
         <w:tabs>
-          <w:tab w:pos="8617" w:val="right" w:leader="dot"/>
+          <w:tab w:pos="9071" w:val="right" w:leader="dot"/>
         </w:tabs>
         <w:spacing w:before="20" w:after="40" w:line="300" w:lineRule="auto"/>
         <w:ind w:left="340"/>
@@ -2111,15 +2053,14 @@
             <w:sz w:val="23"/>
             <w:color w:val="000000"/>
           </w:rPr>
-          <w:tab/>
-          <w:t xml:space="preserve">25</w:t>
+          <w:t xml:space="preserve">	25</w:t>
         </w:r>
       </w:hyperlink>
     </w:p>
     <w:p>
       <w:pPr>
         <w:tabs>
-          <w:tab w:pos="8617" w:val="right" w:leader="dot"/>
+          <w:tab w:pos="9071" w:val="right" w:leader="dot"/>
         </w:tabs>
         <w:spacing w:before="20" w:after="40" w:line="300" w:lineRule="auto"/>
         <w:ind w:left="340"/>
@@ -2141,15 +2082,14 @@
             <w:sz w:val="23"/>
             <w:color w:val="000000"/>
           </w:rPr>
-          <w:tab/>
-          <w:t xml:space="preserve">25</w:t>
+          <w:t xml:space="preserve">	25</w:t>
         </w:r>
       </w:hyperlink>
     </w:p>
     <w:p>
       <w:pPr>
         <w:tabs>
-          <w:tab w:pos="8617" w:val="right" w:leader="dot"/>
+          <w:tab w:pos="9071" w:val="right" w:leader="dot"/>
         </w:tabs>
         <w:spacing w:before="20" w:after="40" w:line="300" w:lineRule="auto"/>
         <w:ind w:left="340"/>
@@ -2171,15 +2111,14 @@
             <w:sz w:val="23"/>
             <w:color w:val="000000"/>
           </w:rPr>
-          <w:tab/>
-          <w:t xml:space="preserve">26</w:t>
+          <w:t xml:space="preserve">	25</w:t>
         </w:r>
       </w:hyperlink>
     </w:p>
     <w:p>
       <w:pPr>
         <w:tabs>
-          <w:tab w:pos="8617" w:val="right" w:leader="dot"/>
+          <w:tab w:pos="9071" w:val="right" w:leader="dot"/>
         </w:tabs>
         <w:spacing w:before="20" w:after="40" w:line="300" w:lineRule="auto"/>
         <w:ind w:left="340"/>
@@ -2201,15 +2140,14 @@
             <w:sz w:val="23"/>
             <w:color w:val="000000"/>
           </w:rPr>
-          <w:tab/>
-          <w:t xml:space="preserve">27</w:t>
+          <w:t xml:space="preserve">	27</w:t>
         </w:r>
       </w:hyperlink>
     </w:p>
     <w:p>
       <w:pPr>
         <w:tabs>
-          <w:tab w:pos="8617" w:val="right" w:leader="dot"/>
+          <w:tab w:pos="9071" w:val="right" w:leader="dot"/>
         </w:tabs>
         <w:spacing w:before="20" w:after="40" w:line="300" w:lineRule="auto"/>
         <w:ind w:left="340"/>
@@ -2231,15 +2169,14 @@
             <w:sz w:val="23"/>
             <w:color w:val="000000"/>
           </w:rPr>
-          <w:tab/>
-          <w:t xml:space="preserve">27</w:t>
+          <w:t xml:space="preserve">	27</w:t>
         </w:r>
       </w:hyperlink>
     </w:p>
     <w:p>
       <w:pPr>
         <w:tabs>
-          <w:tab w:pos="8957" w:val="right" w:leader="dot"/>
+          <w:tab w:pos="9071" w:val="right" w:leader="dot"/>
         </w:tabs>
         <w:spacing w:before="60" w:after="40" w:line="300" w:lineRule="auto"/>
       </w:pPr>
@@ -2262,15 +2199,14 @@
             <w:b/>
             <w:color w:val="000000"/>
           </w:rPr>
-          <w:tab/>
-          <w:t xml:space="preserve">27</w:t>
+          <w:t xml:space="preserve">	28</w:t>
         </w:r>
       </w:hyperlink>
     </w:p>
     <w:p>
       <w:pPr>
         <w:tabs>
-          <w:tab w:pos="8617" w:val="right" w:leader="dot"/>
+          <w:tab w:pos="9071" w:val="right" w:leader="dot"/>
         </w:tabs>
         <w:spacing w:before="20" w:after="40" w:line="300" w:lineRule="auto"/>
         <w:ind w:left="340"/>
@@ -2292,15 +2228,14 @@
             <w:sz w:val="23"/>
             <w:color w:val="000000"/>
           </w:rPr>
-          <w:tab/>
-          <w:t xml:space="preserve">28</w:t>
+          <w:t xml:space="preserve">	28</w:t>
         </w:r>
       </w:hyperlink>
     </w:p>
     <w:p>
       <w:pPr>
         <w:tabs>
-          <w:tab w:pos="8617" w:val="right" w:leader="dot"/>
+          <w:tab w:pos="9071" w:val="right" w:leader="dot"/>
         </w:tabs>
         <w:spacing w:before="20" w:after="40" w:line="300" w:lineRule="auto"/>
         <w:ind w:left="340"/>
@@ -2322,8 +2257,7 @@
             <w:sz w:val="23"/>
             <w:color w:val="000000"/>
           </w:rPr>
-          <w:tab/>
-          <w:t xml:space="preserve">28</w:t>
+          <w:t xml:space="preserve">	28</w:t>
         </w:r>
       </w:hyperlink>
     </w:p>
@@ -2354,9 +2288,9 @@
     <w:p>
       <w:pPr>
         <w:keepNext/>
-        <w:spacing w:before="240" w:after="80" w:line="276" w:lineRule="auto"/>
+        <w:spacing w:before="480" w:after="240" w:line="276" w:lineRule="auto"/>
         <w:ind w:firstLine="0"/>
-        <w:jc w:val="left"/>
+        <w:jc w:val="center"/>
       </w:pPr>
       <w:bookmarkStart w:id="1001" w:name="bm_h1_1"/>
       <w:bookmarkEnd w:id="1001"/>
@@ -2366,7 +2300,7 @@
           <w:b/>
           <w:i w:val="0"/>
           <w:color w:val="000000"/>
-          <w:sz w:val="27"/>
+          <w:sz w:val="30"/>
         </w:rPr>
         <w:t>TÓM TẮT</w:t>
       </w:r>
@@ -2492,30 +2426,30 @@
     <w:p>
       <w:pPr>
         <w:keepNext/>
-        <w:spacing w:before="240" w:after="80" w:line="276" w:lineRule="auto"/>
+        <w:spacing w:before="480" w:after="240" w:line="276" w:lineRule="auto"/>
+        <w:ind w:firstLine="0"/>
+        <w:jc w:val="center"/>
+      </w:pPr>
+      <w:bookmarkStart w:id="1002" w:name="bm_h1_2"/>
+      <w:bookmarkEnd w:id="1002"/>
+      <w:r>
+        <w:rPr>
+          <w:rFonts w:ascii="Times New Roman" w:hAnsi="Times New Roman"/>
+          <w:b/>
+          <w:i w:val="0"/>
+          <w:color w:val="000000"/>
+          <w:sz w:val="30"/>
+        </w:rPr>
+        <w:t>CHƯƠNG 1. GIỚI THIỆU</w:t>
+      </w:r>
+    </w:p>
+    <w:p>
+      <w:pPr>
+        <w:keepNext/>
+        <w:spacing w:before="360" w:after="120" w:line="276" w:lineRule="auto"/>
         <w:ind w:firstLine="0"/>
         <w:jc w:val="left"/>
       </w:pPr>
-      <w:bookmarkStart w:id="1002" w:name="bm_h1_2"/>
-      <w:bookmarkEnd w:id="1002"/>
-      <w:r>
-        <w:rPr>
-          <w:rFonts w:ascii="Times New Roman" w:hAnsi="Times New Roman"/>
-          <w:b/>
-          <w:i w:val="0"/>
-          <w:color w:val="000000"/>
-          <w:sz w:val="27"/>
-        </w:rPr>
-        <w:t>CHƯƠNG 1. GIỚI THIỆU</w:t>
-      </w:r>
-    </w:p>
-    <w:p>
-      <w:pPr>
-        <w:keepNext/>
-        <w:spacing w:before="160" w:after="60" w:line="276" w:lineRule="auto"/>
-        <w:ind w:firstLine="0"/>
-        <w:jc w:val="left"/>
-      </w:pPr>
       <w:bookmarkStart w:id="1003" w:name="bm_h2_1"/>
       <w:bookmarkEnd w:id="1003"/>
       <w:r>
@@ -2524,7 +2458,7 @@
           <w:b/>
           <w:i w:val="0"/>
           <w:color w:val="000000"/>
-          <w:sz w:val="26"/>
+          <w:sz w:val="28"/>
         </w:rPr>
         <w:t>1.1. Bối cảnh</w:t>
       </w:r>
@@ -2646,7 +2580,7 @@
     <w:p>
       <w:pPr>
         <w:keepNext/>
-        <w:spacing w:before="160" w:after="60" w:line="276" w:lineRule="auto"/>
+        <w:spacing w:before="360" w:after="120" w:line="276" w:lineRule="auto"/>
         <w:ind w:firstLine="0"/>
         <w:jc w:val="left"/>
       </w:pPr>
@@ -2658,7 +2592,7 @@
           <w:b/>
           <w:i w:val="0"/>
           <w:color w:val="000000"/>
-          <w:sz w:val="26"/>
+          <w:sz w:val="28"/>
         </w:rPr>
         <w:t>1.2. Lý do chọn đề tài</w:t>
       </w:r>
@@ -2677,59 +2611,27 @@
           <w:color w:val="000000"/>
           <w:sz w:val="26"/>
         </w:rPr>
-        <w:t>Đề tài “Hệ thống phát hiện giao dịch tài chính bất thường và nghi vấn gian lận” kết hợp nhiều nội dung quan trọng của môn Trí tuệ Nhân tạo: biểu diễn dữ liệu, tiền xử lý, học có giám sát, phát hiện bất thường, xử lý dữ liệu mất cân bằng và đánh giá mô hình. Đây cũng là bài toán có ý nghĩa thực tiễn rõ ràng vì quyết định của mô hình liên quan trực tiếp đến hai loại rủi ro:</w:t>
-      </w:r>
-    </w:p>
-    <w:p>
-      <w:pPr>
-        <w:spacing w:before="20" w:after="40" w:line="300" w:lineRule="auto"/>
-        <w:ind w:left="720" w:hanging="283"/>
-        <w:jc w:val="left"/>
-      </w:pPr>
+        <w:t xml:space="preserve">Đề tài “Hệ thống phát hiện giao dịch tài chính bất thường và nghi vấn gian lận” kết hợp nhiều nội dung quan trọng của môn Trí tuệ Nhân tạo: biểu diễn dữ liệu, tiền xử lý, học có giám sát, phát hiện bất thường, xử lý dữ liệu mất cân bằng và đánh giá mô hình. Đây cũng là bài toán có ý nghĩa thực tiễn rõ ràng vì quyết định của mô hình liên quan trực tiếp đến hai loại rủi ro: - </w:t>
+      </w:r>
       <w:r>
         <w:rPr>
           <w:rFonts w:ascii="Times New Roman" w:hAnsi="Times New Roman"/>
           <w:b/>
+          <w:i w:val="0"/>
           <w:color w:val="000000"/>
           <w:sz w:val="26"/>
         </w:rPr>
-        <w:t xml:space="preserve">-  </w:t>
-      </w:r>
-      <w:r>
-        <w:rPr>
-          <w:rFonts w:ascii="Times New Roman" w:hAnsi="Times New Roman"/>
-          <w:b/>
+        <w:t>False Negative:</w:t>
+      </w:r>
+      <w:r>
+        <w:rPr>
+          <w:rFonts w:ascii="Times New Roman" w:hAnsi="Times New Roman"/>
+          <w:b w:val="0"/>
           <w:i w:val="0"/>
           <w:color w:val="000000"/>
           <w:sz w:val="26"/>
         </w:rPr>
-        <w:t>False Negative:</w:t>
-      </w:r>
-      <w:r>
-        <w:rPr>
-          <w:rFonts w:ascii="Times New Roman" w:hAnsi="Times New Roman"/>
-          <w:b w:val="0"/>
-          <w:i w:val="0"/>
-          <w:color w:val="000000"/>
-          <w:sz w:val="26"/>
-        </w:rPr>
-        <w:t xml:space="preserve"> giao dịch gian lận không được phát hiện, có thể gây thiệt hại tài chính.</w:t>
-      </w:r>
-    </w:p>
-    <w:p>
-      <w:pPr>
-        <w:spacing w:before="20" w:after="40" w:line="300" w:lineRule="auto"/>
-        <w:ind w:left="720" w:hanging="283"/>
-        <w:jc w:val="left"/>
-      </w:pPr>
-      <w:r>
-        <w:rPr>
-          <w:rFonts w:ascii="Times New Roman" w:hAnsi="Times New Roman"/>
-          <w:b/>
-          <w:color w:val="000000"/>
-          <w:sz w:val="26"/>
-        </w:rPr>
-        <w:t xml:space="preserve">-  </w:t>
+        <w:t xml:space="preserve"> giao dịch gian lận không được phát hiện, có thể gây thiệt hại tài chính. - </w:t>
       </w:r>
       <w:r>
         <w:rPr>
@@ -2772,7 +2674,7 @@
     <w:p>
       <w:pPr>
         <w:keepNext/>
-        <w:spacing w:before="160" w:after="60" w:line="276" w:lineRule="auto"/>
+        <w:spacing w:before="360" w:after="120" w:line="276" w:lineRule="auto"/>
         <w:ind w:firstLine="0"/>
         <w:jc w:val="left"/>
       </w:pPr>
@@ -2784,7 +2686,7 @@
           <w:b/>
           <w:i w:val="0"/>
           <w:color w:val="000000"/>
-          <w:sz w:val="26"/>
+          <w:sz w:val="28"/>
         </w:rPr>
         <w:t>1.3. Mục tiêu đề tài</w:t>
       </w:r>
@@ -2792,7 +2694,7 @@
     <w:p>
       <w:pPr>
         <w:keepNext/>
-        <w:spacing w:before="120" w:after="40" w:line="276" w:lineRule="auto"/>
+        <w:spacing w:before="240" w:after="120" w:line="276" w:lineRule="auto"/>
         <w:ind w:firstLine="0"/>
         <w:jc w:val="left"/>
       </w:pPr>
@@ -2829,7 +2731,7 @@
     <w:p>
       <w:pPr>
         <w:keepNext/>
-        <w:spacing w:before="120" w:after="40" w:line="276" w:lineRule="auto"/>
+        <w:spacing w:before="240" w:after="120" w:line="276" w:lineRule="auto"/>
         <w:ind w:firstLine="0"/>
         <w:jc w:val="left"/>
       </w:pPr>
@@ -2850,7 +2752,7 @@
       <w:pPr>
         <w:spacing w:before="20" w:after="40" w:line="300" w:lineRule="auto"/>
         <w:ind w:left="720" w:hanging="283"/>
-        <w:jc w:val="left"/>
+        <w:jc w:val="both"/>
       </w:pPr>
       <w:r>
         <w:rPr>
@@ -2876,7 +2778,7 @@
       <w:pPr>
         <w:spacing w:before="20" w:after="40" w:line="300" w:lineRule="auto"/>
         <w:ind w:left="720" w:hanging="283"/>
-        <w:jc w:val="left"/>
+        <w:jc w:val="both"/>
       </w:pPr>
       <w:r>
         <w:rPr>
@@ -2902,7 +2804,7 @@
       <w:pPr>
         <w:spacing w:before="20" w:after="40" w:line="300" w:lineRule="auto"/>
         <w:ind w:left="720" w:hanging="283"/>
-        <w:jc w:val="left"/>
+        <w:jc w:val="both"/>
       </w:pPr>
       <w:r>
         <w:rPr>
@@ -2928,7 +2830,7 @@
       <w:pPr>
         <w:spacing w:before="20" w:after="40" w:line="300" w:lineRule="auto"/>
         <w:ind w:left="720" w:hanging="283"/>
-        <w:jc w:val="left"/>
+        <w:jc w:val="both"/>
       </w:pPr>
       <w:r>
         <w:rPr>
@@ -2954,7 +2856,7 @@
       <w:pPr>
         <w:spacing w:before="20" w:after="40" w:line="300" w:lineRule="auto"/>
         <w:ind w:left="720" w:hanging="283"/>
-        <w:jc w:val="left"/>
+        <w:jc w:val="both"/>
       </w:pPr>
       <w:r>
         <w:rPr>
@@ -2980,7 +2882,7 @@
       <w:pPr>
         <w:spacing w:before="20" w:after="40" w:line="300" w:lineRule="auto"/>
         <w:ind w:left="720" w:hanging="283"/>
-        <w:jc w:val="left"/>
+        <w:jc w:val="both"/>
       </w:pPr>
       <w:r>
         <w:rPr>
@@ -3006,7 +2908,7 @@
       <w:pPr>
         <w:spacing w:before="20" w:after="40" w:line="300" w:lineRule="auto"/>
         <w:ind w:left="720" w:hanging="283"/>
-        <w:jc w:val="left"/>
+        <w:jc w:val="both"/>
       </w:pPr>
       <w:r>
         <w:rPr>
@@ -3042,13 +2944,13 @@
           <w:color w:val="000000"/>
           <w:sz w:val="24"/>
         </w:rPr>
-        <w:t>Báo cáo đã trình bày quy trình tiền xử lý, xử lý mất cân bằng và cả ba họ mô hình. Các kết luận thực nghiệm được giới hạn trong tập kiểm tra PaySim đã xử lý, không suy rộng sang dữ liệu giao dịch thực tế.</w:t>
+        <w:t>Bản nháp hiện tại đã mô tả quy trình tiền xử lý, xử lý mất cân bằng và ba họ mô hình. Các kết luận thực nghiệm vẫn được giới hạn trong tập kiểm tra PaySim đã xử lý và sẽ được rà soát lại trước khi hoàn thiện báo cáo cuối.</w:t>
       </w:r>
     </w:p>
     <w:p>
       <w:pPr>
         <w:keepNext/>
-        <w:spacing w:before="160" w:after="60" w:line="276" w:lineRule="auto"/>
+        <w:spacing w:before="360" w:after="120" w:line="276" w:lineRule="auto"/>
         <w:ind w:firstLine="0"/>
         <w:jc w:val="left"/>
       </w:pPr>
@@ -3060,7 +2962,7 @@
           <w:b/>
           <w:i w:val="0"/>
           <w:color w:val="000000"/>
-          <w:sz w:val="26"/>
+          <w:sz w:val="28"/>
         </w:rPr>
         <w:t>1.4. Đối tượng và phạm vi nghiên cứu</w:t>
       </w:r>
@@ -3069,7 +2971,7 @@
       <w:pPr>
         <w:spacing w:before="20" w:after="40" w:line="300" w:lineRule="auto"/>
         <w:ind w:left="720" w:hanging="283"/>
-        <w:jc w:val="left"/>
+        <w:jc w:val="both"/>
       </w:pPr>
       <w:r>
         <w:rPr>
@@ -3105,7 +3007,7 @@
       <w:pPr>
         <w:spacing w:before="20" w:after="40" w:line="300" w:lineRule="auto"/>
         <w:ind w:left="720" w:hanging="283"/>
-        <w:jc w:val="left"/>
+        <w:jc w:val="both"/>
       </w:pPr>
       <w:r>
         <w:rPr>
@@ -3181,7 +3083,7 @@
       <w:pPr>
         <w:spacing w:before="20" w:after="40" w:line="300" w:lineRule="auto"/>
         <w:ind w:left="720" w:hanging="283"/>
-        <w:jc w:val="left"/>
+        <w:jc w:val="both"/>
       </w:pPr>
       <w:r>
         <w:rPr>
@@ -3257,7 +3159,7 @@
       <w:pPr>
         <w:spacing w:before="20" w:after="40" w:line="300" w:lineRule="auto"/>
         <w:ind w:left="720" w:hanging="283"/>
-        <w:jc w:val="left"/>
+        <w:jc w:val="both"/>
       </w:pPr>
       <w:r>
         <w:rPr>
@@ -3293,7 +3195,7 @@
       <w:pPr>
         <w:spacing w:before="20" w:after="40" w:line="300" w:lineRule="auto"/>
         <w:ind w:left="720" w:hanging="283"/>
-        <w:jc w:val="left"/>
+        <w:jc w:val="both"/>
       </w:pPr>
       <w:r>
         <w:rPr>
@@ -3329,7 +3231,7 @@
       <w:pPr>
         <w:spacing w:before="20" w:after="40" w:line="300" w:lineRule="auto"/>
         <w:ind w:left="720" w:hanging="283"/>
-        <w:jc w:val="left"/>
+        <w:jc w:val="both"/>
       </w:pPr>
       <w:r>
         <w:rPr>
@@ -3364,7 +3266,7 @@
     <w:p>
       <w:pPr>
         <w:keepNext/>
-        <w:spacing w:before="160" w:after="60" w:line="276" w:lineRule="auto"/>
+        <w:spacing w:before="360" w:after="120" w:line="276" w:lineRule="auto"/>
         <w:ind w:firstLine="0"/>
         <w:jc w:val="left"/>
       </w:pPr>
@@ -3376,7 +3278,7 @@
           <w:b/>
           <w:i w:val="0"/>
           <w:color w:val="000000"/>
-          <w:sz w:val="26"/>
+          <w:sz w:val="28"/>
         </w:rPr>
         <w:t>1.5. Cấu trúc báo cáo dự kiến</w:t>
       </w:r>
@@ -3385,7 +3287,7 @@
       <w:pPr>
         <w:spacing w:before="20" w:after="40" w:line="300" w:lineRule="auto"/>
         <w:ind w:left="720" w:hanging="283"/>
-        <w:jc w:val="left"/>
+        <w:jc w:val="both"/>
       </w:pPr>
       <w:r>
         <w:rPr>
@@ -3411,7 +3313,7 @@
       <w:pPr>
         <w:spacing w:before="20" w:after="40" w:line="300" w:lineRule="auto"/>
         <w:ind w:left="720" w:hanging="283"/>
-        <w:jc w:val="left"/>
+        <w:jc w:val="both"/>
       </w:pPr>
       <w:r>
         <w:rPr>
@@ -3437,7 +3339,7 @@
       <w:pPr>
         <w:spacing w:before="20" w:after="40" w:line="300" w:lineRule="auto"/>
         <w:ind w:left="720" w:hanging="283"/>
-        <w:jc w:val="left"/>
+        <w:jc w:val="both"/>
       </w:pPr>
       <w:r>
         <w:rPr>
@@ -3463,7 +3365,7 @@
       <w:pPr>
         <w:spacing w:before="20" w:after="40" w:line="300" w:lineRule="auto"/>
         <w:ind w:left="720" w:hanging="283"/>
-        <w:jc w:val="left"/>
+        <w:jc w:val="both"/>
       </w:pPr>
       <w:r>
         <w:rPr>
@@ -3489,7 +3391,7 @@
       <w:pPr>
         <w:spacing w:before="20" w:after="40" w:line="300" w:lineRule="auto"/>
         <w:ind w:left="720" w:hanging="283"/>
-        <w:jc w:val="left"/>
+        <w:jc w:val="both"/>
       </w:pPr>
       <w:r>
         <w:rPr>
@@ -3515,7 +3417,7 @@
       <w:pPr>
         <w:spacing w:before="20" w:after="40" w:line="300" w:lineRule="auto"/>
         <w:ind w:left="720" w:hanging="283"/>
-        <w:jc w:val="left"/>
+        <w:jc w:val="both"/>
       </w:pPr>
       <w:r>
         <w:rPr>
@@ -3541,7 +3443,7 @@
       <w:pPr>
         <w:spacing w:before="20" w:after="40" w:line="300" w:lineRule="auto"/>
         <w:ind w:left="720" w:hanging="283"/>
-        <w:jc w:val="left"/>
+        <w:jc w:val="both"/>
       </w:pPr>
       <w:r>
         <w:rPr>
@@ -3567,7 +3469,7 @@
       <w:pPr>
         <w:spacing w:before="20" w:after="40" w:line="300" w:lineRule="auto"/>
         <w:ind w:left="720" w:hanging="283"/>
-        <w:jc w:val="left"/>
+        <w:jc w:val="both"/>
       </w:pPr>
       <w:r>
         <w:rPr>
@@ -3592,30 +3494,30 @@
     <w:p>
       <w:pPr>
         <w:keepNext/>
-        <w:spacing w:before="240" w:after="80" w:line="276" w:lineRule="auto"/>
+        <w:spacing w:before="480" w:after="240" w:line="276" w:lineRule="auto"/>
+        <w:ind w:firstLine="0"/>
+        <w:jc w:val="center"/>
+      </w:pPr>
+      <w:bookmarkStart w:id="1010" w:name="bm_h1_3"/>
+      <w:bookmarkEnd w:id="1010"/>
+      <w:r>
+        <w:rPr>
+          <w:rFonts w:ascii="Times New Roman" w:hAnsi="Times New Roman"/>
+          <w:b/>
+          <w:i w:val="0"/>
+          <w:color w:val="000000"/>
+          <w:sz w:val="30"/>
+        </w:rPr>
+        <w:t>CHƯƠNG 2. PHÁT BIỂU BÀI TOÁN</w:t>
+      </w:r>
+    </w:p>
+    <w:p>
+      <w:pPr>
+        <w:keepNext/>
+        <w:spacing w:before="360" w:after="120" w:line="276" w:lineRule="auto"/>
         <w:ind w:firstLine="0"/>
         <w:jc w:val="left"/>
       </w:pPr>
-      <w:bookmarkStart w:id="1010" w:name="bm_h1_3"/>
-      <w:bookmarkEnd w:id="1010"/>
-      <w:r>
-        <w:rPr>
-          <w:rFonts w:ascii="Times New Roman" w:hAnsi="Times New Roman"/>
-          <w:b/>
-          <w:i w:val="0"/>
-          <w:color w:val="000000"/>
-          <w:sz w:val="27"/>
-        </w:rPr>
-        <w:t>CHƯƠNG 2. PHÁT BIỂU BÀI TOÁN</w:t>
-      </w:r>
-    </w:p>
-    <w:p>
-      <w:pPr>
-        <w:keepNext/>
-        <w:spacing w:before="160" w:after="60" w:line="276" w:lineRule="auto"/>
-        <w:ind w:firstLine="0"/>
-        <w:jc w:val="left"/>
-      </w:pPr>
       <w:bookmarkStart w:id="1011" w:name="bm_h2_6"/>
       <w:bookmarkEnd w:id="1011"/>
       <w:r>
@@ -3624,7 +3526,7 @@
           <w:b/>
           <w:i w:val="0"/>
           <w:color w:val="000000"/>
-          <w:sz w:val="26"/>
+          <w:sz w:val="28"/>
         </w:rPr>
         <w:t>2.1. Mô tả bài toán</w:t>
       </w:r>
@@ -3643,59 +3545,7 @@
           <w:color w:val="000000"/>
           <w:sz w:val="26"/>
         </w:rPr>
-        <w:t>Cho tập dữ liệu giao dịch tài chính, mỗi giao dịch được biểu diễn bởi vector đặc trưng $x$. Mục tiêu là xây dựng hàm dự đoán $f(x)$ trả về một trong hai nhãn:</w:t>
-      </w:r>
-    </w:p>
-    <w:p>
-      <w:pPr>
-        <w:spacing w:before="20" w:after="40" w:line="300" w:lineRule="auto"/>
-        <w:ind w:left="720" w:hanging="283"/>
-        <w:jc w:val="left"/>
-      </w:pPr>
-      <w:r>
-        <w:rPr>
-          <w:rFonts w:ascii="Times New Roman" w:hAnsi="Times New Roman"/>
-          <w:b/>
-          <w:color w:val="000000"/>
-          <w:sz w:val="26"/>
-        </w:rPr>
-        <w:t xml:space="preserve">-  </w:t>
-      </w:r>
-      <w:r>
-        <w:rPr>
-          <w:rFonts w:ascii="Times New Roman" w:hAnsi="Times New Roman"/>
-          <w:b w:val="0"/>
-          <w:i w:val="0"/>
-          <w:color w:val="000000"/>
-          <w:sz w:val="26"/>
-        </w:rPr>
-        <w:t>$f(x) = 0$: giao dịch hợp lệ.</w:t>
-      </w:r>
-    </w:p>
-    <w:p>
-      <w:pPr>
-        <w:spacing w:before="20" w:after="40" w:line="300" w:lineRule="auto"/>
-        <w:ind w:left="720" w:hanging="283"/>
-        <w:jc w:val="left"/>
-      </w:pPr>
-      <w:r>
-        <w:rPr>
-          <w:rFonts w:ascii="Times New Roman" w:hAnsi="Times New Roman"/>
-          <w:b/>
-          <w:color w:val="000000"/>
-          <w:sz w:val="26"/>
-        </w:rPr>
-        <w:t xml:space="preserve">-  </w:t>
-      </w:r>
-      <w:r>
-        <w:rPr>
-          <w:rFonts w:ascii="Times New Roman" w:hAnsi="Times New Roman"/>
-          <w:b w:val="0"/>
-          <w:i w:val="0"/>
-          <w:color w:val="000000"/>
-          <w:sz w:val="26"/>
-        </w:rPr>
-        <w:t>$f(x) = 1$: giao dịch gian lận.</w:t>
+        <w:t>Cho tập dữ liệu giao dịch tài chính, mỗi giao dịch được biểu diễn bởi vector đặc trưng $x$. Mục tiêu là xây dựng hàm dự đoán $f(x)$ trả về một trong hai nhãn: - $f(x) = 0$: giao dịch hợp lệ. - $f(x) = 1$: giao dịch gian lận.</w:t>
       </w:r>
     </w:p>
     <w:p>
@@ -3755,7 +3605,7 @@
     <w:p>
       <w:pPr>
         <w:keepNext/>
-        <w:spacing w:before="160" w:after="60" w:line="276" w:lineRule="auto"/>
+        <w:spacing w:before="360" w:after="120" w:line="276" w:lineRule="auto"/>
         <w:ind w:firstLine="0"/>
         <w:jc w:val="left"/>
       </w:pPr>
@@ -3767,7 +3617,7 @@
           <w:b/>
           <w:i w:val="0"/>
           <w:color w:val="000000"/>
-          <w:sz w:val="26"/>
+          <w:sz w:val="28"/>
         </w:rPr>
         <w:t>2.2. Đầu vào và đầu ra</w:t>
       </w:r>
@@ -3775,7 +3625,7 @@
     <w:p>
       <w:pPr>
         <w:keepNext/>
-        <w:spacing w:before="120" w:after="40" w:line="276" w:lineRule="auto"/>
+        <w:spacing w:before="240" w:after="120" w:line="276" w:lineRule="auto"/>
         <w:ind w:firstLine="0"/>
         <w:jc w:val="left"/>
       </w:pPr>
@@ -3811,7 +3661,7 @@
       <w:pPr>
         <w:spacing w:before="20" w:after="40" w:line="300" w:lineRule="auto"/>
         <w:ind w:left="720" w:hanging="283"/>
-        <w:jc w:val="left"/>
+        <w:jc w:val="both"/>
       </w:pPr>
       <w:r>
         <w:rPr>
@@ -3857,7 +3707,7 @@
       <w:pPr>
         <w:spacing w:before="20" w:after="40" w:line="300" w:lineRule="auto"/>
         <w:ind w:left="720" w:hanging="283"/>
-        <w:jc w:val="left"/>
+        <w:jc w:val="both"/>
       </w:pPr>
       <w:r>
         <w:rPr>
@@ -3883,7 +3733,7 @@
       <w:pPr>
         <w:spacing w:before="20" w:after="40" w:line="300" w:lineRule="auto"/>
         <w:ind w:left="720" w:hanging="283"/>
-        <w:jc w:val="left"/>
+        <w:jc w:val="both"/>
       </w:pPr>
       <w:r>
         <w:rPr>
@@ -3909,7 +3759,7 @@
       <w:pPr>
         <w:spacing w:before="20" w:after="40" w:line="300" w:lineRule="auto"/>
         <w:ind w:left="720" w:hanging="283"/>
-        <w:jc w:val="left"/>
+        <w:jc w:val="both"/>
       </w:pPr>
       <w:r>
         <w:rPr>
@@ -3935,7 +3785,7 @@
       <w:pPr>
         <w:spacing w:before="20" w:after="40" w:line="300" w:lineRule="auto"/>
         <w:ind w:left="720" w:hanging="283"/>
-        <w:jc w:val="left"/>
+        <w:jc w:val="both"/>
       </w:pPr>
       <w:r>
         <w:rPr>
@@ -3961,7 +3811,7 @@
       <w:pPr>
         <w:spacing w:before="20" w:after="40" w:line="300" w:lineRule="auto"/>
         <w:ind w:left="720" w:hanging="283"/>
-        <w:jc w:val="left"/>
+        <w:jc w:val="both"/>
       </w:pPr>
       <w:r>
         <w:rPr>
@@ -3987,7 +3837,7 @@
       <w:pPr>
         <w:spacing w:before="20" w:after="40" w:line="300" w:lineRule="auto"/>
         <w:ind w:left="720" w:hanging="283"/>
-        <w:jc w:val="left"/>
+        <w:jc w:val="both"/>
       </w:pPr>
       <w:r>
         <w:rPr>
@@ -4013,7 +3863,7 @@
       <w:pPr>
         <w:spacing w:before="20" w:after="40" w:line="300" w:lineRule="auto"/>
         <w:ind w:left="720" w:hanging="283"/>
-        <w:jc w:val="left"/>
+        <w:jc w:val="both"/>
       </w:pPr>
       <w:r>
         <w:rPr>
@@ -4058,7 +3908,7 @@
     <w:p>
       <w:pPr>
         <w:keepNext/>
-        <w:spacing w:before="120" w:after="40" w:line="276" w:lineRule="auto"/>
+        <w:spacing w:before="240" w:after="120" w:line="276" w:lineRule="auto"/>
         <w:ind w:firstLine="0"/>
         <w:jc w:val="left"/>
       </w:pPr>
@@ -4077,7 +3927,7 @@
       <w:pPr>
         <w:spacing w:before="20" w:after="40" w:line="300" w:lineRule="auto"/>
         <w:ind w:left="720" w:hanging="283"/>
-        <w:jc w:val="left"/>
+        <w:jc w:val="both"/>
       </w:pPr>
       <w:r>
         <w:rPr>
@@ -4143,7 +3993,7 @@
       <w:pPr>
         <w:spacing w:before="20" w:after="40" w:line="300" w:lineRule="auto"/>
         <w:ind w:left="720" w:hanging="283"/>
-        <w:jc w:val="left"/>
+        <w:jc w:val="both"/>
       </w:pPr>
       <w:r>
         <w:rPr>
@@ -4169,7 +4019,7 @@
       <w:pPr>
         <w:spacing w:before="20" w:after="40" w:line="300" w:lineRule="auto"/>
         <w:ind w:left="720" w:hanging="283"/>
-        <w:jc w:val="left"/>
+        <w:jc w:val="both"/>
       </w:pPr>
       <w:r>
         <w:rPr>
@@ -4194,7 +4044,7 @@
     <w:p>
       <w:pPr>
         <w:keepNext/>
-        <w:spacing w:before="160" w:after="60" w:line="276" w:lineRule="auto"/>
+        <w:spacing w:before="360" w:after="120" w:line="276" w:lineRule="auto"/>
         <w:ind w:firstLine="0"/>
         <w:jc w:val="left"/>
       </w:pPr>
@@ -4206,7 +4056,7 @@
           <w:b/>
           <w:i w:val="0"/>
           <w:color w:val="000000"/>
-          <w:sz w:val="26"/>
+          <w:sz w:val="28"/>
         </w:rPr>
         <w:t>2.3. Các thách thức chính</w:t>
       </w:r>
@@ -4214,7 +4064,7 @@
     <w:p>
       <w:pPr>
         <w:keepNext/>
-        <w:spacing w:before="120" w:after="40" w:line="276" w:lineRule="auto"/>
+        <w:spacing w:before="240" w:after="120" w:line="276" w:lineRule="auto"/>
         <w:ind w:firstLine="0"/>
         <w:jc w:val="left"/>
       </w:pPr>
@@ -4251,7 +4101,7 @@
     <w:p>
       <w:pPr>
         <w:keepNext/>
-        <w:spacing w:before="120" w:after="40" w:line="276" w:lineRule="auto"/>
+        <w:spacing w:before="240" w:after="120" w:line="276" w:lineRule="auto"/>
         <w:ind w:firstLine="0"/>
         <w:jc w:val="left"/>
       </w:pPr>
@@ -4288,7 +4138,7 @@
     <w:p>
       <w:pPr>
         <w:keepNext/>
-        <w:spacing w:before="120" w:after="40" w:line="276" w:lineRule="auto"/>
+        <w:spacing w:before="240" w:after="120" w:line="276" w:lineRule="auto"/>
         <w:ind w:firstLine="0"/>
         <w:jc w:val="left"/>
       </w:pPr>
@@ -4345,7 +4195,7 @@
     <w:p>
       <w:pPr>
         <w:keepNext/>
-        <w:spacing w:before="120" w:after="40" w:line="276" w:lineRule="auto"/>
+        <w:spacing w:before="240" w:after="120" w:line="276" w:lineRule="auto"/>
         <w:ind w:firstLine="0"/>
         <w:jc w:val="left"/>
       </w:pPr>
@@ -4424,7 +4274,7 @@
     <w:p>
       <w:pPr>
         <w:keepNext/>
-        <w:spacing w:before="160" w:after="60" w:line="276" w:lineRule="auto"/>
+        <w:spacing w:before="360" w:after="120" w:line="276" w:lineRule="auto"/>
         <w:ind w:firstLine="0"/>
         <w:jc w:val="left"/>
       </w:pPr>
@@ -4436,7 +4286,7 @@
           <w:b/>
           <w:i w:val="0"/>
           <w:color w:val="000000"/>
-          <w:sz w:val="26"/>
+          <w:sz w:val="28"/>
         </w:rPr>
         <w:t>2.4. Yêu cầu kỹ thuật</w:t>
       </w:r>
@@ -4462,7 +4312,7 @@
       <w:pPr>
         <w:spacing w:before="20" w:after="40" w:line="300" w:lineRule="auto"/>
         <w:ind w:left="720" w:hanging="283"/>
-        <w:jc w:val="left"/>
+        <w:jc w:val="both"/>
       </w:pPr>
       <w:r>
         <w:rPr>
@@ -4488,7 +4338,7 @@
       <w:pPr>
         <w:spacing w:before="20" w:after="40" w:line="300" w:lineRule="auto"/>
         <w:ind w:left="720" w:hanging="283"/>
-        <w:jc w:val="left"/>
+        <w:jc w:val="both"/>
       </w:pPr>
       <w:r>
         <w:rPr>
@@ -4514,7 +4364,7 @@
       <w:pPr>
         <w:spacing w:before="20" w:after="40" w:line="300" w:lineRule="auto"/>
         <w:ind w:left="720" w:hanging="283"/>
-        <w:jc w:val="left"/>
+        <w:jc w:val="both"/>
       </w:pPr>
       <w:r>
         <w:rPr>
@@ -4540,7 +4390,7 @@
       <w:pPr>
         <w:spacing w:before="20" w:after="40" w:line="300" w:lineRule="auto"/>
         <w:ind w:left="720" w:hanging="283"/>
-        <w:jc w:val="left"/>
+        <w:jc w:val="both"/>
       </w:pPr>
       <w:r>
         <w:rPr>
@@ -4566,7 +4416,7 @@
       <w:pPr>
         <w:spacing w:before="20" w:after="40" w:line="300" w:lineRule="auto"/>
         <w:ind w:left="720" w:hanging="283"/>
-        <w:jc w:val="left"/>
+        <w:jc w:val="both"/>
       </w:pPr>
       <w:r>
         <w:rPr>
@@ -4592,7 +4442,7 @@
       <w:pPr>
         <w:spacing w:before="20" w:after="40" w:line="300" w:lineRule="auto"/>
         <w:ind w:left="720" w:hanging="283"/>
-        <w:jc w:val="left"/>
+        <w:jc w:val="both"/>
       </w:pPr>
       <w:r>
         <w:rPr>
@@ -4634,7 +4484,7 @@
     <w:p>
       <w:pPr>
         <w:keepNext/>
-        <w:spacing w:before="160" w:after="60" w:line="276" w:lineRule="auto"/>
+        <w:spacing w:before="360" w:after="120" w:line="276" w:lineRule="auto"/>
         <w:ind w:firstLine="0"/>
         <w:jc w:val="left"/>
       </w:pPr>
@@ -4646,7 +4496,7 @@
           <w:b/>
           <w:i w:val="0"/>
           <w:color w:val="000000"/>
-          <w:sz w:val="26"/>
+          <w:sz w:val="28"/>
         </w:rPr>
         <w:t>2.5. Câu hỏi nghiên cứu</w:t>
       </w:r>
@@ -4665,114 +4515,36 @@
           <w:color w:val="000000"/>
           <w:sz w:val="26"/>
         </w:rPr>
-        <w:t>Báo cáo hướng tới trả lời các câu hỏi sau khi hoàn tất thực nghiệm:</w:t>
+        <w:t>Báo cáo hướng tới trả lời các câu hỏi sau khi hoàn tất thực nghiệm: - Kỹ thuật xử lý mất cân bằng nào phù hợp hơn trên tập PaySim đã tiền xử lý? - Trong các mô hình được thử nghiệm, mô hình nào đạt cân bằng tốt nhất giữa Precision và Recall cho lớp fraud? - Các đặc trưng nào đóng góp nhiều nhất vào quyết định của mô hình, và các đặc trưng này có nguy cơ phản ánh cơ chế mô phỏng của PaySim hay không?</w:t>
       </w:r>
     </w:p>
     <w:p>
       <w:pPr>
-        <w:spacing w:before="20" w:after="40" w:line="300" w:lineRule="auto"/>
-        <w:ind w:left="720" w:hanging="283"/>
-        <w:jc w:val="left"/>
-      </w:pPr>
+        <w:keepNext/>
+        <w:spacing w:before="480" w:after="240" w:line="276" w:lineRule="auto"/>
+        <w:ind w:firstLine="0"/>
+        <w:jc w:val="center"/>
+      </w:pPr>
+      <w:bookmarkStart w:id="1020" w:name="bm_h1_4"/>
+      <w:bookmarkEnd w:id="1020"/>
       <w:r>
         <w:rPr>
           <w:rFonts w:ascii="Times New Roman" w:hAnsi="Times New Roman"/>
           <w:b/>
-          <w:color w:val="000000"/>
-          <w:sz w:val="26"/>
-        </w:rPr>
-        <w:t xml:space="preserve">-  </w:t>
-      </w:r>
-      <w:r>
-        <w:rPr>
-          <w:rFonts w:ascii="Times New Roman" w:hAnsi="Times New Roman"/>
-          <w:b w:val="0"/>
-          <w:i w:val="0"/>
-          <w:color w:val="000000"/>
-          <w:sz w:val="26"/>
-        </w:rPr>
-        <w:t>Kỹ thuật xử lý mất cân bằng nào phù hợp hơn trên tập PaySim đã tiền xử lý?</w:t>
+          <w:i w:val="0"/>
+          <w:color w:val="000000"/>
+          <w:sz w:val="30"/>
+        </w:rPr>
+        <w:t>CHƯƠNG 3. MÔ TẢ DỮ LIỆU</w:t>
       </w:r>
     </w:p>
     <w:p>
       <w:pPr>
-        <w:spacing w:before="20" w:after="40" w:line="300" w:lineRule="auto"/>
-        <w:ind w:left="720" w:hanging="283"/>
-        <w:jc w:val="left"/>
-      </w:pPr>
-      <w:r>
-        <w:rPr>
-          <w:rFonts w:ascii="Times New Roman" w:hAnsi="Times New Roman"/>
-          <w:b/>
-          <w:color w:val="000000"/>
-          <w:sz w:val="26"/>
-        </w:rPr>
-        <w:t xml:space="preserve">-  </w:t>
-      </w:r>
-      <w:r>
-        <w:rPr>
-          <w:rFonts w:ascii="Times New Roman" w:hAnsi="Times New Roman"/>
-          <w:b w:val="0"/>
-          <w:i w:val="0"/>
-          <w:color w:val="000000"/>
-          <w:sz w:val="26"/>
-        </w:rPr>
-        <w:t>Trong các mô hình được thử nghiệm, mô hình nào đạt cân bằng tốt nhất giữa Precision và Recall cho lớp fraud?</w:t>
-      </w:r>
-    </w:p>
-    <w:p>
-      <w:pPr>
-        <w:spacing w:before="20" w:after="40" w:line="300" w:lineRule="auto"/>
-        <w:ind w:left="720" w:hanging="283"/>
-        <w:jc w:val="left"/>
-      </w:pPr>
-      <w:r>
-        <w:rPr>
-          <w:rFonts w:ascii="Times New Roman" w:hAnsi="Times New Roman"/>
-          <w:b/>
-          <w:color w:val="000000"/>
-          <w:sz w:val="26"/>
-        </w:rPr>
-        <w:t xml:space="preserve">-  </w:t>
-      </w:r>
-      <w:r>
-        <w:rPr>
-          <w:rFonts w:ascii="Times New Roman" w:hAnsi="Times New Roman"/>
-          <w:b w:val="0"/>
-          <w:i w:val="0"/>
-          <w:color w:val="000000"/>
-          <w:sz w:val="26"/>
-        </w:rPr>
-        <w:t>Các đặc trưng nào đóng góp nhiều nhất vào quyết định của mô hình, và các đặc trưng này có nguy cơ phản ánh cơ chế mô phỏng của PaySim hay không?</w:t>
-      </w:r>
-    </w:p>
-    <w:p>
-      <w:pPr>
         <w:keepNext/>
-        <w:spacing w:before="240" w:after="80" w:line="276" w:lineRule="auto"/>
+        <w:spacing w:before="360" w:after="120" w:line="276" w:lineRule="auto"/>
         <w:ind w:firstLine="0"/>
         <w:jc w:val="left"/>
       </w:pPr>
-      <w:bookmarkStart w:id="1020" w:name="bm_h1_4"/>
-      <w:bookmarkEnd w:id="1020"/>
-      <w:r>
-        <w:rPr>
-          <w:rFonts w:ascii="Times New Roman" w:hAnsi="Times New Roman"/>
-          <w:b/>
-          <w:i w:val="0"/>
-          <w:color w:val="000000"/>
-          <w:sz w:val="27"/>
-        </w:rPr>
-        <w:t>CHƯƠNG 3. MÔ TẢ DỮ LIỆU</w:t>
-      </w:r>
-    </w:p>
-    <w:p>
-      <w:pPr>
-        <w:keepNext/>
-        <w:spacing w:before="160" w:after="60" w:line="276" w:lineRule="auto"/>
-        <w:ind w:firstLine="0"/>
-        <w:jc w:val="left"/>
-      </w:pPr>
       <w:bookmarkStart w:id="1021" w:name="bm_h2_11"/>
       <w:bookmarkEnd w:id="1021"/>
       <w:r>
@@ -4781,7 +4553,7 @@
           <w:b/>
           <w:i w:val="0"/>
           <w:color w:val="000000"/>
-          <w:sz w:val="26"/>
+          <w:sz w:val="28"/>
         </w:rPr>
         <w:t>3.1. Nguồn dữ liệu</w:t>
       </w:r>
@@ -5006,7 +4778,7 @@
     <w:p>
       <w:pPr>
         <w:keepNext/>
-        <w:spacing w:before="160" w:after="60" w:line="276" w:lineRule="auto"/>
+        <w:spacing w:before="360" w:after="120" w:line="276" w:lineRule="auto"/>
         <w:ind w:firstLine="0"/>
         <w:jc w:val="left"/>
       </w:pPr>
@@ -5018,7 +4790,7 @@
           <w:b/>
           <w:i w:val="0"/>
           <w:color w:val="000000"/>
-          <w:sz w:val="26"/>
+          <w:sz w:val="28"/>
         </w:rPr>
         <w:t>3.2. Cấu trúc dữ liệu gốc</w:t>
       </w:r>
@@ -5027,6 +4799,8 @@
       <w:tblPr>
         <w:tblW w:type="auto" w:w="0"/>
         <w:jc w:val="center"/>
+        <w:tblLayout w:type="fixed"/>
+        <w:tblLook w:firstColumn="1" w:firstRow="1" w:lastColumn="0" w:lastRow="0" w:noHBand="0" w:noVBand="1" w:val="04A0"/>
         <w:tblBorders>
           <w:top w:val="single" w:sz="6" w:space="0" w:color="CCCCCC"/>
           <w:bottom w:val="single" w:sz="6" w:space="0" w:color="CCCCCC"/>
@@ -5035,8 +4809,6 @@
           <w:left w:val="none"/>
           <w:right w:val="none"/>
         </w:tblBorders>
-        <w:tblLayout w:type="fixed"/>
-        <w:tblLook w:firstColumn="1" w:firstRow="1" w:lastColumn="0" w:lastRow="0" w:noHBand="0" w:noVBand="1" w:val="04A0"/>
       </w:tblPr>
       <w:tblGrid>
         <w:gridCol w:w="3024"/>
@@ -5045,8 +4817,8 @@
       </w:tblGrid>
       <w:tr>
         <w:trPr>
+          <w:tblHeader/>
           <w:cantSplit/>
-          <w:tblHeader/>
         </w:trPr>
         <w:tc>
           <w:tcPr>
@@ -6249,7 +6021,7 @@
     <w:p>
       <w:pPr>
         <w:keepNext/>
-        <w:spacing w:before="160" w:after="60" w:line="276" w:lineRule="auto"/>
+        <w:spacing w:before="360" w:after="120" w:line="276" w:lineRule="auto"/>
         <w:ind w:firstLine="0"/>
         <w:jc w:val="left"/>
       </w:pPr>
@@ -6261,7 +6033,7 @@
           <w:b/>
           <w:i w:val="0"/>
           <w:color w:val="000000"/>
-          <w:sz w:val="26"/>
+          <w:sz w:val="28"/>
         </w:rPr>
         <w:t>3.3. Phân bố giao dịch và nhãn</w:t>
       </w:r>
@@ -6270,6 +6042,8 @@
       <w:tblPr>
         <w:tblW w:type="auto" w:w="0"/>
         <w:jc w:val="center"/>
+        <w:tblLayout w:type="fixed"/>
+        <w:tblLook w:firstColumn="1" w:firstRow="1" w:lastColumn="0" w:lastRow="0" w:noHBand="0" w:noVBand="1" w:val="04A0"/>
         <w:tblBorders>
           <w:top w:val="single" w:sz="6" w:space="0" w:color="CCCCCC"/>
           <w:bottom w:val="single" w:sz="6" w:space="0" w:color="CCCCCC"/>
@@ -6278,8 +6052,6 @@
           <w:left w:val="none"/>
           <w:right w:val="none"/>
         </w:tblBorders>
-        <w:tblLayout w:type="fixed"/>
-        <w:tblLook w:firstColumn="1" w:firstRow="1" w:lastColumn="0" w:lastRow="0" w:noHBand="0" w:noVBand="1" w:val="04A0"/>
       </w:tblPr>
       <w:tblGrid>
         <w:gridCol w:w="2268"/>
@@ -6289,8 +6061,8 @@
       </w:tblGrid>
       <w:tr>
         <w:trPr>
+          <w:tblHeader/>
           <w:cantSplit/>
-          <w:tblHeader/>
         </w:trPr>
         <w:tc>
           <w:tcPr>
@@ -7213,7 +6985,7 @@
     <w:p>
       <w:pPr>
         <w:keepNext/>
-        <w:spacing w:before="160" w:after="60" w:line="276" w:lineRule="auto"/>
+        <w:spacing w:before="360" w:after="120" w:line="276" w:lineRule="auto"/>
         <w:ind w:firstLine="0"/>
         <w:jc w:val="left"/>
       </w:pPr>
@@ -7225,7 +6997,7 @@
           <w:b/>
           <w:i w:val="0"/>
           <w:color w:val="000000"/>
-          <w:sz w:val="26"/>
+          <w:sz w:val="28"/>
         </w:rPr>
         <w:t>3.4. Downsampling và chia tập</w:t>
       </w:r>
@@ -7271,6 +7043,8 @@
       <w:tblPr>
         <w:tblW w:type="auto" w:w="0"/>
         <w:jc w:val="center"/>
+        <w:tblLayout w:type="fixed"/>
+        <w:tblLook w:firstColumn="1" w:firstRow="1" w:lastColumn="0" w:lastRow="0" w:noHBand="0" w:noVBand="1" w:val="04A0"/>
         <w:tblBorders>
           <w:top w:val="single" w:sz="6" w:space="0" w:color="CCCCCC"/>
           <w:bottom w:val="single" w:sz="6" w:space="0" w:color="CCCCCC"/>
@@ -7279,8 +7053,6 @@
           <w:left w:val="none"/>
           <w:right w:val="none"/>
         </w:tblBorders>
-        <w:tblLayout w:type="fixed"/>
-        <w:tblLook w:firstColumn="1" w:firstRow="1" w:lastColumn="0" w:lastRow="0" w:noHBand="0" w:noVBand="1" w:val="04A0"/>
       </w:tblPr>
       <w:tblGrid>
         <w:gridCol w:w="1814"/>
@@ -7291,8 +7063,8 @@
       </w:tblGrid>
       <w:tr>
         <w:trPr>
+          <w:tblHeader/>
           <w:cantSplit/>
-          <w:tblHeader/>
         </w:trPr>
         <w:tc>
           <w:tcPr>
@@ -8076,7 +7848,7 @@
     <w:p>
       <w:pPr>
         <w:keepNext/>
-        <w:spacing w:before="160" w:after="60" w:line="276" w:lineRule="auto"/>
+        <w:spacing w:before="360" w:after="120" w:line="276" w:lineRule="auto"/>
         <w:ind w:firstLine="0"/>
         <w:jc w:val="left"/>
       </w:pPr>
@@ -8088,7 +7860,7 @@
           <w:b/>
           <w:i w:val="0"/>
           <w:color w:val="000000"/>
-          <w:sz w:val="26"/>
+          <w:sz w:val="28"/>
         </w:rPr>
         <w:t>3.5. Các đặc trưng đầu vào sau tiền xử lý</w:t>
       </w:r>
@@ -8214,6 +7986,8 @@
       <w:tblPr>
         <w:tblW w:type="auto" w:w="0"/>
         <w:jc w:val="center"/>
+        <w:tblLayout w:type="fixed"/>
+        <w:tblLook w:firstColumn="1" w:firstRow="1" w:lastColumn="0" w:lastRow="0" w:noHBand="0" w:noVBand="1" w:val="04A0"/>
         <w:tblBorders>
           <w:top w:val="single" w:sz="6" w:space="0" w:color="CCCCCC"/>
           <w:bottom w:val="single" w:sz="6" w:space="0" w:color="CCCCCC"/>
@@ -8222,8 +7996,6 @@
           <w:left w:val="none"/>
           <w:right w:val="none"/>
         </w:tblBorders>
-        <w:tblLayout w:type="fixed"/>
-        <w:tblLook w:firstColumn="1" w:firstRow="1" w:lastColumn="0" w:lastRow="0" w:noHBand="0" w:noVBand="1" w:val="04A0"/>
       </w:tblPr>
       <w:tblGrid>
         <w:gridCol w:w="3024"/>
@@ -8232,8 +8004,8 @@
       </w:tblGrid>
       <w:tr>
         <w:trPr>
+          <w:tblHeader/>
           <w:cantSplit/>
-          <w:tblHeader/>
         </w:trPr>
         <w:tc>
           <w:tcPr>
@@ -9701,7 +9473,7 @@
     <w:p>
       <w:pPr>
         <w:keepNext/>
-        <w:spacing w:before="160" w:after="60" w:line="276" w:lineRule="auto"/>
+        <w:spacing w:before="360" w:after="120" w:line="276" w:lineRule="auto"/>
         <w:ind w:firstLine="0"/>
         <w:jc w:val="left"/>
       </w:pPr>
@@ -9713,7 +9485,7 @@
           <w:b/>
           <w:i w:val="0"/>
           <w:color w:val="000000"/>
-          <w:sz w:val="26"/>
+          <w:sz w:val="28"/>
         </w:rPr>
         <w:t>3.6. Hạn chế và nguy cơ ảnh hưởng tính hợp lệ</w:t>
       </w:r>
@@ -9721,7 +9493,7 @@
     <w:p>
       <w:pPr>
         <w:keepNext/>
-        <w:spacing w:before="120" w:after="40" w:line="276" w:lineRule="auto"/>
+        <w:spacing w:before="240" w:after="120" w:line="276" w:lineRule="auto"/>
         <w:ind w:firstLine="0"/>
         <w:jc w:val="left"/>
       </w:pPr>
@@ -9752,13 +9524,13 @@
           <w:color w:val="000000"/>
           <w:sz w:val="26"/>
         </w:rPr>
-        <w:t>Fraud ratio tăng từ 0,129082% lên khoảng 4,1065% sau downsample. Do Precision và đường Precision–Recall phụ thuộc vào prevalence, kết quả trên test downsample không thể được trình bày như hiệu năng trên phân bố PaySim gốc hoặc trên hệ thống thật.</w:t>
+        <w:t>Fraud ratio tăng từ 0,129082% lên khoảng 4,1065% sau downsample. Do Precision và đường Precision-Recall phụ thuộc vào prevalence, kết quả trên test downsample không thể được trình bày như hiệu năng trên phân bố PaySim gốc hoặc trên hệ thống thật.</w:t>
       </w:r>
     </w:p>
     <w:p>
       <w:pPr>
         <w:keepNext/>
-        <w:spacing w:before="120" w:after="40" w:line="276" w:lineRule="auto"/>
+        <w:spacing w:before="240" w:after="120" w:line="276" w:lineRule="auto"/>
         <w:ind w:firstLine="0"/>
         <w:jc w:val="left"/>
       </w:pPr>
@@ -9890,13 +9662,13 @@
           <w:color w:val="000000"/>
           <w:sz w:val="26"/>
         </w:rPr>
-        <w:t xml:space="preserve"> để phát hiện gian lận. Quy trình hiện tại vẫn sử dụng các cột số dư và hai đặc trưng sai lệch số dư. Vì vậy, mô hình có thể học tín hiệu phát sinh từ cơ chế cập nhật hoặc hủy giao dịch của bộ mô phỏng. Mục 5.5 cho thấy nhóm đặc trưng này thực sự chiếm phần lớn mức đóng góp của cả Random Forest và XGBoost. Báo cáo xem đây là một nguy cơ ảnh hưởng tính hợp lệ. Phép kiểm tra dứt điểm là huấn luyện lại mô hình sau khi loại nhóm đặc trưng số dư rồi so sánh hiệu năng. Thí nghiệm này nằm ngoài phạm vi đồ án và được ghi nhận tại Mục 7.4 như hướng kiểm chứng cần thực hiện trước khi khẳng định kết quả.</w:t>
+        <w:t xml:space="preserve"> để phát hiện gian lận. Quy trình hiện tại vẫn sử dụng các cột số dư và hai đặc trưng sai lệch số dư. Vì vậy, mô hình có thể học tín hiệu phát sinh từ cơ chế cập nhật hoặc hủy giao dịch của bộ mô phỏng. Mục 5.5 cho thấy nhóm đặc trưng này thực sự chiếm phần lớn mức đóng góp của cả Random Forest và XGBoost. Báo cáo xem đây là một nguy cơ ảnh hưởng tính hợp lệ. Phép kiểm tra dứt điểm là huấn luyện lại mô hình sau khi loại nhóm đặc trưng số dư rồi so sánh hiệu năng. Thí nghiệm này nằm ngoài phạm vi bản nháp hiện tại và được ghi nhận như một hướng kiểm chứng cần thực hiện trước khi khẳng định kết quả.</w:t>
       </w:r>
     </w:p>
     <w:p>
       <w:pPr>
         <w:keepNext/>
-        <w:spacing w:before="120" w:after="40" w:line="276" w:lineRule="auto"/>
+        <w:spacing w:before="240" w:after="120" w:line="276" w:lineRule="auto"/>
         <w:ind w:firstLine="0"/>
         <w:jc w:val="left"/>
       </w:pPr>
@@ -9933,7 +9705,7 @@
     <w:p>
       <w:pPr>
         <w:keepNext/>
-        <w:spacing w:before="120" w:after="40" w:line="276" w:lineRule="auto"/>
+        <w:spacing w:before="240" w:after="120" w:line="276" w:lineRule="auto"/>
         <w:ind w:firstLine="0"/>
         <w:jc w:val="left"/>
       </w:pPr>
@@ -9970,7 +9742,7 @@
     <w:p>
       <w:pPr>
         <w:keepNext/>
-        <w:spacing w:before="120" w:after="40" w:line="276" w:lineRule="auto"/>
+        <w:spacing w:before="240" w:after="120" w:line="276" w:lineRule="auto"/>
         <w:ind w:firstLine="0"/>
         <w:jc w:val="left"/>
       </w:pPr>
@@ -10007,7 +9779,7 @@
     <w:p>
       <w:pPr>
         <w:keepNext/>
-        <w:spacing w:before="160" w:after="60" w:line="276" w:lineRule="auto"/>
+        <w:spacing w:before="360" w:after="120" w:line="276" w:lineRule="auto"/>
         <w:ind w:firstLine="0"/>
         <w:jc w:val="left"/>
       </w:pPr>
@@ -10019,7 +9791,7 @@
           <w:b/>
           <w:i w:val="0"/>
           <w:color w:val="000000"/>
-          <w:sz w:val="26"/>
+          <w:sz w:val="28"/>
         </w:rPr>
         <w:t>3.7. Kết luận chương</w:t>
       </w:r>
@@ -10044,30 +9816,30 @@
     <w:p>
       <w:pPr>
         <w:keepNext/>
-        <w:spacing w:before="240" w:after="80" w:line="276" w:lineRule="auto"/>
+        <w:spacing w:before="480" w:after="240" w:line="276" w:lineRule="auto"/>
+        <w:ind w:firstLine="0"/>
+        <w:jc w:val="center"/>
+      </w:pPr>
+      <w:bookmarkStart w:id="1033" w:name="bm_h1_5"/>
+      <w:bookmarkEnd w:id="1033"/>
+      <w:r>
+        <w:rPr>
+          <w:rFonts w:ascii="Times New Roman" w:hAnsi="Times New Roman"/>
+          <w:b/>
+          <w:i w:val="0"/>
+          <w:color w:val="000000"/>
+          <w:sz w:val="30"/>
+        </w:rPr>
+        <w:t>CHƯƠNG 4. PHƯƠNG PHÁP THỰC HIỆN</w:t>
+      </w:r>
+    </w:p>
+    <w:p>
+      <w:pPr>
+        <w:keepNext/>
+        <w:spacing w:before="360" w:after="120" w:line="276" w:lineRule="auto"/>
         <w:ind w:firstLine="0"/>
         <w:jc w:val="left"/>
       </w:pPr>
-      <w:bookmarkStart w:id="1033" w:name="bm_h1_5"/>
-      <w:bookmarkEnd w:id="1033"/>
-      <w:r>
-        <w:rPr>
-          <w:rFonts w:ascii="Times New Roman" w:hAnsi="Times New Roman"/>
-          <w:b/>
-          <w:i w:val="0"/>
-          <w:color w:val="000000"/>
-          <w:sz w:val="27"/>
-        </w:rPr>
-        <w:t>CHƯƠNG 4. PHƯƠNG PHÁP THỰC HIỆN</w:t>
-      </w:r>
-    </w:p>
-    <w:p>
-      <w:pPr>
-        <w:keepNext/>
-        <w:spacing w:before="160" w:after="60" w:line="276" w:lineRule="auto"/>
-        <w:ind w:firstLine="0"/>
-        <w:jc w:val="left"/>
-      </w:pPr>
       <w:bookmarkStart w:id="1034" w:name="bm_h2_18"/>
       <w:bookmarkEnd w:id="1034"/>
       <w:r>
@@ -10076,7 +9848,7 @@
           <w:b/>
           <w:i w:val="0"/>
           <w:color w:val="000000"/>
-          <w:sz w:val="26"/>
+          <w:sz w:val="28"/>
         </w:rPr>
         <w:t>4.1. Quy trình thực nghiệm</w:t>
       </w:r>
@@ -10095,23 +9867,27 @@
           <w:color w:val="000000"/>
           <w:sz w:val="26"/>
         </w:rPr>
-        <w:t>Quy trình thực nghiệm được tổ chức thành sáu bước tuần tự:</w:t>
-      </w:r>
-    </w:p>
-    <w:p>
-      <w:pPr>
-        <w:spacing w:before="20" w:after="40" w:line="300" w:lineRule="auto"/>
-        <w:ind w:left="720" w:hanging="283"/>
-        <w:jc w:val="left"/>
-      </w:pPr>
+        <w:t xml:space="preserve">Quy trình thực nghiệm được tổ chức thành sáu bước tuần tự: - </w:t>
+      </w:r>
       <w:r>
         <w:rPr>
           <w:rFonts w:ascii="Times New Roman" w:hAnsi="Times New Roman"/>
           <w:b/>
+          <w:i w:val="0"/>
           <w:color w:val="000000"/>
           <w:sz w:val="26"/>
         </w:rPr>
-        <w:t xml:space="preserve">-  </w:t>
+        <w:t>Bước 1 - Đọc và kiểm tra dữ liệu:</w:t>
+      </w:r>
+      <w:r>
+        <w:rPr>
+          <w:rFonts w:ascii="Times New Roman" w:hAnsi="Times New Roman"/>
+          <w:b w:val="0"/>
+          <w:i w:val="0"/>
+          <w:color w:val="000000"/>
+          <w:sz w:val="26"/>
+        </w:rPr>
+        <w:t xml:space="preserve"> nạp bộ PaySim, xác nhận cấu trúc cột, kiểu dữ liệu, giá trị thiếu và phân bố nhãn. - </w:t>
       </w:r>
       <w:r>
         <w:rPr>
@@ -10121,43 +9897,7 @@
           <w:color w:val="000000"/>
           <w:sz w:val="26"/>
         </w:rPr>
-        <w:t>Bước 1 — Đọc và kiểm tra dữ liệu:</w:t>
-      </w:r>
-      <w:r>
-        <w:rPr>
-          <w:rFonts w:ascii="Times New Roman" w:hAnsi="Times New Roman"/>
-          <w:b w:val="0"/>
-          <w:i w:val="0"/>
-          <w:color w:val="000000"/>
-          <w:sz w:val="26"/>
-        </w:rPr>
-        <w:t xml:space="preserve"> nạp bộ PaySim, xác nhận cấu trúc cột, kiểu dữ liệu, giá trị thiếu và phân bố nhãn.</w:t>
-      </w:r>
-    </w:p>
-    <w:p>
-      <w:pPr>
-        <w:spacing w:before="20" w:after="40" w:line="300" w:lineRule="auto"/>
-        <w:ind w:left="720" w:hanging="283"/>
-        <w:jc w:val="left"/>
-      </w:pPr>
-      <w:r>
-        <w:rPr>
-          <w:rFonts w:ascii="Times New Roman" w:hAnsi="Times New Roman"/>
-          <w:b/>
-          <w:color w:val="000000"/>
-          <w:sz w:val="26"/>
-        </w:rPr>
-        <w:t xml:space="preserve">-  </w:t>
-      </w:r>
-      <w:r>
-        <w:rPr>
-          <w:rFonts w:ascii="Times New Roman" w:hAnsi="Times New Roman"/>
-          <w:b/>
-          <w:i w:val="0"/>
-          <w:color w:val="000000"/>
-          <w:sz w:val="26"/>
-        </w:rPr>
-        <w:t>Bước 2 — Lọc và downsampling:</w:t>
+        <w:t>Bước 2 - Lọc và downsampling:</w:t>
       </w:r>
       <w:r>
         <w:rPr>
@@ -10207,23 +9947,27 @@
           <w:color w:val="000000"/>
           <w:sz w:val="26"/>
         </w:rPr>
-        <w:t>, bảo toàn toàn bộ giao dịch gian lận và lấy mẫu ngẫu nhiên lớp bình thường để tạo tập làm việc 200.000 giao dịch.</w:t>
-      </w:r>
-    </w:p>
-    <w:p>
-      <w:pPr>
-        <w:spacing w:before="20" w:after="40" w:line="300" w:lineRule="auto"/>
-        <w:ind w:left="720" w:hanging="283"/>
-        <w:jc w:val="left"/>
-      </w:pPr>
+        <w:t xml:space="preserve">, bảo toàn toàn bộ giao dịch gian lận và lấy mẫu ngẫu nhiên lớp bình thường để tạo tập làm việc 200.000 giao dịch. - </w:t>
+      </w:r>
       <w:r>
         <w:rPr>
           <w:rFonts w:ascii="Times New Roman" w:hAnsi="Times New Roman"/>
           <w:b/>
+          <w:i w:val="0"/>
           <w:color w:val="000000"/>
           <w:sz w:val="26"/>
         </w:rPr>
-        <w:t xml:space="preserve">-  </w:t>
+        <w:t>Bước 3 - Chia dữ liệu:</w:t>
+      </w:r>
+      <w:r>
+        <w:rPr>
+          <w:rFonts w:ascii="Times New Roman" w:hAnsi="Times New Roman"/>
+          <w:b w:val="0"/>
+          <w:i w:val="0"/>
+          <w:color w:val="000000"/>
+          <w:sz w:val="26"/>
+        </w:rPr>
+        <w:t xml:space="preserve"> tách tập huấn luyện và tập kiểm tra theo tỷ lệ 80/20 bằng phép chia phân tầng (stratified) theo nhãn. - </w:t>
       </w:r>
       <w:r>
         <w:rPr>
@@ -10233,7 +9977,7 @@
           <w:color w:val="000000"/>
           <w:sz w:val="26"/>
         </w:rPr>
-        <w:t>Bước 3 — Chia dữ liệu:</w:t>
+        <w:t>Bước 4 - Xây dựng đặc trưng:</w:t>
       </w:r>
       <w:r>
         <w:rPr>
@@ -10243,23 +9987,27 @@
           <w:color w:val="000000"/>
           <w:sz w:val="26"/>
         </w:rPr>
-        <w:t xml:space="preserve"> tách tập huấn luyện và tập kiểm tra theo tỷ lệ 80/20 bằng phép chia phân tầng (stratified) theo nhãn.</w:t>
-      </w:r>
-    </w:p>
-    <w:p>
-      <w:pPr>
-        <w:spacing w:before="20" w:after="40" w:line="300" w:lineRule="auto"/>
-        <w:ind w:left="720" w:hanging="283"/>
-        <w:jc w:val="left"/>
-      </w:pPr>
+        <w:t xml:space="preserve"> tạo các đặc trưng dẫn xuất, mã hóa loại giao dịch và chuẩn hóa các biến định lượng bằng tham số học từ tập huấn luyện. - </w:t>
+      </w:r>
       <w:r>
         <w:rPr>
           <w:rFonts w:ascii="Times New Roman" w:hAnsi="Times New Roman"/>
           <w:b/>
+          <w:i w:val="0"/>
           <w:color w:val="000000"/>
           <w:sz w:val="26"/>
         </w:rPr>
-        <w:t xml:space="preserve">-  </w:t>
+        <w:t>Bước 5 - Xử lý mất cân bằng:</w:t>
+      </w:r>
+      <w:r>
+        <w:rPr>
+          <w:rFonts w:ascii="Times New Roman" w:hAnsi="Times New Roman"/>
+          <w:b w:val="0"/>
+          <w:i w:val="0"/>
+          <w:color w:val="000000"/>
+          <w:sz w:val="26"/>
+        </w:rPr>
+        <w:t xml:space="preserve"> áp dụng oversampling bằng SMOTENC hoặc ADASYN trên tập huấn luyện, không thay đổi tập kiểm tra. - </w:t>
       </w:r>
       <w:r>
         <w:rPr>
@@ -10269,79 +10017,7 @@
           <w:color w:val="000000"/>
           <w:sz w:val="26"/>
         </w:rPr>
-        <w:t>Bước 4 — Xây dựng đặc trưng:</w:t>
-      </w:r>
-      <w:r>
-        <w:rPr>
-          <w:rFonts w:ascii="Times New Roman" w:hAnsi="Times New Roman"/>
-          <w:b w:val="0"/>
-          <w:i w:val="0"/>
-          <w:color w:val="000000"/>
-          <w:sz w:val="26"/>
-        </w:rPr>
-        <w:t xml:space="preserve"> tạo các đặc trưng dẫn xuất, mã hóa loại giao dịch và chuẩn hóa các biến định lượng bằng tham số học từ tập huấn luyện.</w:t>
-      </w:r>
-    </w:p>
-    <w:p>
-      <w:pPr>
-        <w:spacing w:before="20" w:after="40" w:line="300" w:lineRule="auto"/>
-        <w:ind w:left="720" w:hanging="283"/>
-        <w:jc w:val="left"/>
-      </w:pPr>
-      <w:r>
-        <w:rPr>
-          <w:rFonts w:ascii="Times New Roman" w:hAnsi="Times New Roman"/>
-          <w:b/>
-          <w:color w:val="000000"/>
-          <w:sz w:val="26"/>
-        </w:rPr>
-        <w:t xml:space="preserve">-  </w:t>
-      </w:r>
-      <w:r>
-        <w:rPr>
-          <w:rFonts w:ascii="Times New Roman" w:hAnsi="Times New Roman"/>
-          <w:b/>
-          <w:i w:val="0"/>
-          <w:color w:val="000000"/>
-          <w:sz w:val="26"/>
-        </w:rPr>
-        <w:t>Bước 5 — Xử lý mất cân bằng:</w:t>
-      </w:r>
-      <w:r>
-        <w:rPr>
-          <w:rFonts w:ascii="Times New Roman" w:hAnsi="Times New Roman"/>
-          <w:b w:val="0"/>
-          <w:i w:val="0"/>
-          <w:color w:val="000000"/>
-          <w:sz w:val="26"/>
-        </w:rPr>
-        <w:t xml:space="preserve"> áp dụng oversampling bằng SMOTENC hoặc ADASYN trên tập huấn luyện, không thay đổi tập kiểm tra.</w:t>
-      </w:r>
-    </w:p>
-    <w:p>
-      <w:pPr>
-        <w:spacing w:before="20" w:after="40" w:line="300" w:lineRule="auto"/>
-        <w:ind w:left="720" w:hanging="283"/>
-        <w:jc w:val="left"/>
-      </w:pPr>
-      <w:r>
-        <w:rPr>
-          <w:rFonts w:ascii="Times New Roman" w:hAnsi="Times New Roman"/>
-          <w:b/>
-          <w:color w:val="000000"/>
-          <w:sz w:val="26"/>
-        </w:rPr>
-        <w:t xml:space="preserve">-  </w:t>
-      </w:r>
-      <w:r>
-        <w:rPr>
-          <w:rFonts w:ascii="Times New Roman" w:hAnsi="Times New Roman"/>
-          <w:b/>
-          <w:i w:val="0"/>
-          <w:color w:val="000000"/>
-          <w:sz w:val="26"/>
-        </w:rPr>
-        <w:t>Bước 6 — Huấn luyện và đánh giá:</w:t>
+        <w:t>Bước 6 - Huấn luyện và đánh giá:</w:t>
       </w:r>
       <w:r>
         <w:rPr>
@@ -10414,7 +10090,7 @@
     <w:p>
       <w:pPr>
         <w:keepNext/>
-        <w:spacing w:before="160" w:after="60" w:line="276" w:lineRule="auto"/>
+        <w:spacing w:before="360" w:after="120" w:line="276" w:lineRule="auto"/>
         <w:ind w:firstLine="0"/>
         <w:jc w:val="left"/>
       </w:pPr>
@@ -10426,7 +10102,7 @@
           <w:b/>
           <w:i w:val="0"/>
           <w:color w:val="000000"/>
-          <w:sz w:val="26"/>
+          <w:sz w:val="28"/>
         </w:rPr>
         <w:t>4.2. Tiền xử lý và xây dựng đặc trưng</w:t>
       </w:r>
@@ -10605,7 +10281,7 @@
     <w:p>
       <w:pPr>
         <w:keepNext/>
-        <w:spacing w:before="160" w:after="60" w:line="276" w:lineRule="auto"/>
+        <w:spacing w:before="360" w:after="120" w:line="276" w:lineRule="auto"/>
         <w:ind w:firstLine="0"/>
         <w:jc w:val="left"/>
       </w:pPr>
@@ -10617,7 +10293,7 @@
           <w:b/>
           <w:i w:val="0"/>
           <w:color w:val="000000"/>
-          <w:sz w:val="26"/>
+          <w:sz w:val="28"/>
         </w:rPr>
         <w:t>4.3. Xử lý mất cân bằng</w:t>
       </w:r>
@@ -10852,7 +10528,7 @@
     <w:p>
       <w:pPr>
         <w:keepNext/>
-        <w:spacing w:before="160" w:after="60" w:line="276" w:lineRule="auto"/>
+        <w:spacing w:before="360" w:after="120" w:line="276" w:lineRule="auto"/>
         <w:ind w:firstLine="0"/>
         <w:jc w:val="left"/>
       </w:pPr>
@@ -10864,7 +10540,7 @@
           <w:b/>
           <w:i w:val="0"/>
           <w:color w:val="000000"/>
-          <w:sz w:val="26"/>
+          <w:sz w:val="28"/>
         </w:rPr>
         <w:t>4.4. Random Forest</w:t>
       </w:r>
@@ -11107,7 +10783,7 @@
     <w:p>
       <w:pPr>
         <w:keepNext/>
-        <w:spacing w:before="160" w:after="60" w:line="276" w:lineRule="auto"/>
+        <w:spacing w:before="360" w:after="120" w:line="276" w:lineRule="auto"/>
         <w:ind w:firstLine="0"/>
         <w:jc w:val="left"/>
       </w:pPr>
@@ -11119,7 +10795,7 @@
           <w:b/>
           <w:i w:val="0"/>
           <w:color w:val="000000"/>
-          <w:sz w:val="26"/>
+          <w:sz w:val="28"/>
         </w:rPr>
         <w:t>4.5. XGBoost</w:t>
       </w:r>
@@ -11422,7 +11098,7 @@
     <w:p>
       <w:pPr>
         <w:keepNext/>
-        <w:spacing w:before="160" w:after="60" w:line="276" w:lineRule="auto"/>
+        <w:spacing w:before="360" w:after="120" w:line="276" w:lineRule="auto"/>
         <w:ind w:firstLine="0"/>
         <w:jc w:val="left"/>
       </w:pPr>
@@ -11434,7 +11110,7 @@
           <w:b/>
           <w:i w:val="0"/>
           <w:color w:val="000000"/>
-          <w:sz w:val="26"/>
+          <w:sz w:val="28"/>
         </w:rPr>
         <w:t>4.6. Autoencoder theo hướng phát hiện bất thường</w:t>
       </w:r>
@@ -11711,7 +11387,7 @@
     <w:p>
       <w:pPr>
         <w:keepNext/>
-        <w:spacing w:before="160" w:after="60" w:line="276" w:lineRule="auto"/>
+        <w:spacing w:before="360" w:after="120" w:line="276" w:lineRule="auto"/>
         <w:ind w:firstLine="0"/>
         <w:jc w:val="left"/>
       </w:pPr>
@@ -11723,7 +11399,7 @@
           <w:b/>
           <w:i w:val="0"/>
           <w:color w:val="000000"/>
-          <w:sz w:val="26"/>
+          <w:sz w:val="28"/>
         </w:rPr>
         <w:t>4.7. Quy trình đánh giá</w:t>
       </w:r>
@@ -11742,7 +11418,7 @@
           <w:color w:val="000000"/>
           <w:sz w:val="26"/>
         </w:rPr>
-        <w:t>Các mô hình được đánh giá trên cùng tập kiểm tra 40.000 giao dịch, không dùng dữ liệu đã qua oversampling. Báo cáo tập trung vào lớp gian lận với bốn chỉ số chính là Precision, Recall, F1-Score và ROC-AUC. Average Precision được báo cáo bổ sung vì phản ánh chất lượng phát hiện lớp gian lận rõ hơn ROC-AUC khi dữ liệu mất cân bằng. Đường ROC và đường Precision–Recall tổng hợp của cả năm biến thể được trình bày tại Mục 5.2.</w:t>
+        <w:t>Các mô hình được đánh giá trên cùng tập kiểm tra 40.000 giao dịch, không dùng dữ liệu đã qua oversampling. Báo cáo tập trung vào lớp gian lận với bốn chỉ số chính là Precision, Recall, F1-Score và ROC-AUC. Average Precision được báo cáo bổ sung vì phản ánh chất lượng phát hiện lớp gian lận rõ hơn ROC-AUC khi dữ liệu mất cân bằng. Đường ROC và đường Precision-Recall tổng hợp sẽ được bổ sung trong bản báo cáo cuối.</w:t>
       </w:r>
     </w:p>
     <w:p>
@@ -11765,7 +11441,7 @@
     <w:p>
       <w:pPr>
         <w:keepNext/>
-        <w:spacing w:before="160" w:after="60" w:line="276" w:lineRule="auto"/>
+        <w:spacing w:before="360" w:after="120" w:line="276" w:lineRule="auto"/>
         <w:ind w:firstLine="0"/>
         <w:jc w:val="left"/>
       </w:pPr>
@@ -11777,7 +11453,7 @@
           <w:b/>
           <w:i w:val="0"/>
           <w:color w:val="000000"/>
-          <w:sz w:val="26"/>
+          <w:sz w:val="28"/>
         </w:rPr>
         <w:t>4.8. Khả năng tái lập và giới hạn phương pháp</w:t>
       </w:r>
@@ -11879,7 +11555,7 @@
     <w:p>
       <w:pPr>
         <w:keepNext/>
-        <w:spacing w:before="160" w:after="60" w:line="276" w:lineRule="auto"/>
+        <w:spacing w:before="360" w:after="120" w:line="276" w:lineRule="auto"/>
         <w:ind w:firstLine="0"/>
         <w:jc w:val="left"/>
       </w:pPr>
@@ -11891,7 +11567,7 @@
           <w:b/>
           <w:i w:val="0"/>
           <w:color w:val="000000"/>
-          <w:sz w:val="26"/>
+          <w:sz w:val="28"/>
         </w:rPr>
         <w:t>4.9. Kết luận chương</w:t>
       </w:r>
@@ -11916,30 +11592,30 @@
     <w:p>
       <w:pPr>
         <w:keepNext/>
-        <w:spacing w:before="240" w:after="80" w:line="276" w:lineRule="auto"/>
+        <w:spacing w:before="480" w:after="240" w:line="276" w:lineRule="auto"/>
+        <w:ind w:firstLine="0"/>
+        <w:jc w:val="center"/>
+      </w:pPr>
+      <w:bookmarkStart w:id="1043" w:name="bm_h1_6"/>
+      <w:bookmarkEnd w:id="1043"/>
+      <w:r>
+        <w:rPr>
+          <w:rFonts w:ascii="Times New Roman" w:hAnsi="Times New Roman"/>
+          <w:b/>
+          <w:i w:val="0"/>
+          <w:color w:val="000000"/>
+          <w:sz w:val="30"/>
+        </w:rPr>
+        <w:t>CHƯƠNG 5. KẾT QUẢ THỰC NGHIỆM</w:t>
+      </w:r>
+    </w:p>
+    <w:p>
+      <w:pPr>
+        <w:keepNext/>
+        <w:spacing w:before="360" w:after="120" w:line="276" w:lineRule="auto"/>
         <w:ind w:firstLine="0"/>
         <w:jc w:val="left"/>
       </w:pPr>
-      <w:bookmarkStart w:id="1043" w:name="bm_h1_6"/>
-      <w:bookmarkEnd w:id="1043"/>
-      <w:r>
-        <w:rPr>
-          <w:rFonts w:ascii="Times New Roman" w:hAnsi="Times New Roman"/>
-          <w:b/>
-          <w:i w:val="0"/>
-          <w:color w:val="000000"/>
-          <w:sz w:val="27"/>
-        </w:rPr>
-        <w:t>CHƯƠNG 5. KẾT QUẢ THỰC NGHIỆM</w:t>
-      </w:r>
-    </w:p>
-    <w:p>
-      <w:pPr>
-        <w:keepNext/>
-        <w:spacing w:before="160" w:after="60" w:line="276" w:lineRule="auto"/>
-        <w:ind w:firstLine="0"/>
-        <w:jc w:val="left"/>
-      </w:pPr>
       <w:bookmarkStart w:id="1044" w:name="bm_h2_27"/>
       <w:bookmarkEnd w:id="1044"/>
       <w:r>
@@ -11948,7 +11624,7 @@
           <w:b/>
           <w:i w:val="0"/>
           <w:color w:val="000000"/>
-          <w:sz w:val="26"/>
+          <w:sz w:val="28"/>
         </w:rPr>
         <w:t>5.1. Phạm vi và nguồn kết quả</w:t>
       </w:r>
@@ -12064,33 +11740,13 @@
           <w:color w:val="000000"/>
           <w:sz w:val="26"/>
         </w:rPr>
-        <w:t xml:space="preserve"> để người đọc có thể đối chiếu từng con số. Bảng so sánh, các biểu đồ và bảng mức đóng góp của đặc trưng dưới đây đều được sinh lại bằng cùng script đó. Toàn bộ giá trị trong Bảng 5.1 đã được đối chiếu và khớp tuyệt đối với </w:t>
-      </w:r>
-      <w:r>
-        <w:rPr>
-          <w:rFonts w:ascii="Courier New" w:hAnsi="Courier New"/>
-          <w:b w:val="0"/>
-          <w:i w:val="0"/>
-          <w:color w:val="000000"/>
-          <w:sz w:val="25"/>
-        </w:rPr>
-        <w:t>reports/model_comparison.csv</w:t>
-      </w:r>
-      <w:r>
-        <w:rPr>
-          <w:rFonts w:ascii="Times New Roman" w:hAnsi="Times New Roman"/>
-          <w:b w:val="0"/>
-          <w:i w:val="0"/>
-          <w:color w:val="000000"/>
-          <w:sz w:val="26"/>
-        </w:rPr>
-        <w:t xml:space="preserve"> do bước đánh giá chéo của nhóm xuất ra, nên hai nguồn tính độc lập cho cùng một kết quả.</w:t>
+        <w:t xml:space="preserve"> để người đọc có thể đối chiếu từng con số. Bảng so sánh, hai biểu đồ và bảng mức đóng góp của đặc trưng dưới đây đều được sinh lại bằng cùng script đó, phản ánh kết quả hiện có trên tập kiểm tra. Đường ROC và đường Precision-Recall tổng hợp sẽ được bổ sung trong bản báo cáo cuối.</w:t>
       </w:r>
     </w:p>
     <w:p>
       <w:pPr>
         <w:keepNext/>
-        <w:spacing w:before="160" w:after="60" w:line="276" w:lineRule="auto"/>
+        <w:spacing w:before="360" w:after="120" w:line="276" w:lineRule="auto"/>
         <w:ind w:firstLine="0"/>
         <w:jc w:val="left"/>
       </w:pPr>
@@ -12102,7 +11758,7 @@
           <w:b/>
           <w:i w:val="0"/>
           <w:color w:val="000000"/>
-          <w:sz w:val="26"/>
+          <w:sz w:val="28"/>
         </w:rPr>
         <w:t>5.2. So sánh hiệu năng các mô hình</w:t>
       </w:r>
@@ -12111,6 +11767,8 @@
       <w:tblPr>
         <w:tblW w:type="auto" w:w="0"/>
         <w:jc w:val="center"/>
+        <w:tblLayout w:type="fixed"/>
+        <w:tblLook w:firstColumn="1" w:firstRow="1" w:lastColumn="0" w:lastRow="0" w:noHBand="0" w:noVBand="1" w:val="04A0"/>
         <w:tblBorders>
           <w:top w:val="single" w:sz="6" w:space="0" w:color="CCCCCC"/>
           <w:bottom w:val="single" w:sz="6" w:space="0" w:color="CCCCCC"/>
@@ -12119,8 +11777,6 @@
           <w:left w:val="none"/>
           <w:right w:val="none"/>
         </w:tblBorders>
-        <w:tblLayout w:type="fixed"/>
-        <w:tblLook w:firstColumn="1" w:firstRow="1" w:lastColumn="0" w:lastRow="0" w:noHBand="0" w:noVBand="1" w:val="04A0"/>
       </w:tblPr>
       <w:tblGrid>
         <w:gridCol w:w="1512"/>
@@ -12132,8 +11788,8 @@
       </w:tblGrid>
       <w:tr>
         <w:trPr>
+          <w:tblHeader/>
           <w:cantSplit/>
-          <w:tblHeader/>
         </w:trPr>
         <w:tc>
           <w:tcPr>
@@ -13288,140 +12944,13 @@
           <w:color w:val="000000"/>
           <w:sz w:val="26"/>
         </w:rPr>
-        <w:t>Khoảng cách giữa hai chỉ số xếp hạng của Autoencoder cho thấy vì sao không nên đọc ROC-AUC một mình trên dữ liệu lệch lớp. ROC-AUC đạt 0,9318 nhưng Average Precision chỉ đạt 0,5973. Nguyên nhân là ROC-AUC lấy toàn bộ 38.357 giao dịch bình thường làm mẫu số cho tỷ lệ dương tính giả, nên gần 2.000 cảnh báo nhầm vẫn chỉ làm chỉ số này giảm nhẹ. Average Precision thì đo trực tiếp Precision dọc theo đường Precision–Recall, nên phản ánh đúng cái giá phải trả để đạt được Recall đó. Với bốn biến thể học có giám sát, hai chỉ số này gần như trùng nhau nên kết luận không thay đổi.</w:t>
+        <w:t>Khoảng cách giữa hai chỉ số xếp hạng của Autoencoder cho thấy vì sao không nên đọc ROC-AUC một mình trên dữ liệu lệch lớp. ROC-AUC đạt 0,9318 nhưng Average Precision chỉ đạt 0,5973. Nguyên nhân là ROC-AUC lấy toàn bộ 38.357 giao dịch bình thường làm mẫu số cho tỷ lệ dương tính giả, nên gần 2.000 cảnh báo nhầm vẫn chỉ làm chỉ số này giảm nhẹ. Average Precision thì đo trực tiếp Precision dọc theo đường Precision-Recall, nên phản ánh đúng cái giá phải trả để đạt được Recall đó. Với bốn biến thể học có giám sát, hai chỉ số này gần như trùng nhau nên kết luận không thay đổi.</w:t>
       </w:r>
     </w:p>
     <w:p>
       <w:pPr>
-        <w:spacing w:before="160" w:after="60"/>
-        <w:jc w:val="center"/>
-      </w:pPr>
-      <w:r>
-        <w:drawing>
-          <wp:inline xmlns:a="http://schemas.openxmlformats.org/drawingml/2006/main" xmlns:pic="http://schemas.openxmlformats.org/drawingml/2006/picture">
-            <wp:extent cx="5220000" cy="3897365"/>
-            <wp:docPr id="2" name="Picture 2"/>
-            <wp:cNvGraphicFramePr>
-              <a:graphicFrameLocks noChangeAspect="1"/>
-            </wp:cNvGraphicFramePr>
-            <a:graphic>
-              <a:graphicData uri="http://schemas.openxmlformats.org/drawingml/2006/picture">
-                <pic:pic>
-                  <pic:nvPicPr>
-                    <pic:cNvPr id="0" name="roc_curves_all.png"/>
-                    <pic:cNvPicPr/>
-                  </pic:nvPicPr>
-                  <pic:blipFill>
-                    <a:blip r:embed="rId16"/>
-                    <a:stretch>
-                      <a:fillRect/>
-                    </a:stretch>
-                  </pic:blipFill>
-                  <pic:spPr>
-                    <a:xfrm>
-                      <a:off x="0" y="0"/>
-                      <a:ext cx="5220000" cy="3897365"/>
-                    </a:xfrm>
-                    <a:prstGeom prst="rect"/>
-                  </pic:spPr>
-                </pic:pic>
-              </a:graphicData>
-            </a:graphic>
-          </wp:inline>
-        </w:drawing>
-      </w:r>
-    </w:p>
-    <w:p>
-      <w:pPr>
-        <w:spacing w:before="40" w:after="160"/>
-        <w:jc w:val="center"/>
-      </w:pPr>
-      <w:r>
-        <w:rPr>
-          <w:rFonts w:ascii="Times New Roman" w:hAnsi="Times New Roman"/>
-          <w:i/>
-          <w:color w:val="000000"/>
-          <w:sz w:val="21"/>
-        </w:rPr>
-        <w:t>Hình 5.1. Đường ROC của năm biến thể mô hình trên tập kiểm tra</w:t>
-      </w:r>
-    </w:p>
-    <w:p>
-      <w:pPr>
-        <w:spacing w:before="160" w:after="60"/>
-        <w:jc w:val="center"/>
-      </w:pPr>
-      <w:r>
-        <w:drawing>
-          <wp:inline xmlns:a="http://schemas.openxmlformats.org/drawingml/2006/main" xmlns:pic="http://schemas.openxmlformats.org/drawingml/2006/picture">
-            <wp:extent cx="5220000" cy="3897365"/>
-            <wp:docPr id="3" name="Picture 3"/>
-            <wp:cNvGraphicFramePr>
-              <a:graphicFrameLocks noChangeAspect="1"/>
-            </wp:cNvGraphicFramePr>
-            <a:graphic>
-              <a:graphicData uri="http://schemas.openxmlformats.org/drawingml/2006/picture">
-                <pic:pic>
-                  <pic:nvPicPr>
-                    <pic:cNvPr id="0" name="pr_curves_all.png"/>
-                    <pic:cNvPicPr/>
-                  </pic:nvPicPr>
-                  <pic:blipFill>
-                    <a:blip r:embed="rId17"/>
-                    <a:stretch>
-                      <a:fillRect/>
-                    </a:stretch>
-                  </pic:blipFill>
-                  <pic:spPr>
-                    <a:xfrm>
-                      <a:off x="0" y="0"/>
-                      <a:ext cx="5220000" cy="3897365"/>
-                    </a:xfrm>
-                    <a:prstGeom prst="rect"/>
-                  </pic:spPr>
-                </pic:pic>
-              </a:graphicData>
-            </a:graphic>
-          </wp:inline>
-        </w:drawing>
-      </w:r>
-    </w:p>
-    <w:p>
-      <w:pPr>
-        <w:spacing w:before="40" w:after="160"/>
-        <w:jc w:val="center"/>
-      </w:pPr>
-      <w:r>
-        <w:rPr>
-          <w:rFonts w:ascii="Times New Roman" w:hAnsi="Times New Roman"/>
-          <w:i/>
-          <w:color w:val="000000"/>
-          <w:sz w:val="21"/>
-        </w:rPr>
-        <w:t>Hình 5.2. Đường Precision–Recall của năm biến thể mô hình trên tập kiểm tra</w:t>
-      </w:r>
-    </w:p>
-    <w:p>
-      <w:pPr>
-        <w:spacing w:before="0" w:after="40" w:line="312" w:lineRule="auto"/>
-        <w:ind w:firstLine="720"/>
-        <w:jc w:val="both"/>
-      </w:pPr>
-      <w:r>
-        <w:rPr>
-          <w:rFonts w:ascii="Times New Roman" w:hAnsi="Times New Roman"/>
-          <w:b w:val="0"/>
-          <w:i w:val="0"/>
-          <w:color w:val="000000"/>
-          <w:sz w:val="26"/>
-        </w:rPr>
-        <w:t>Hình 5.1 và Hình 5.2 trực quan hóa nhận định trên. Trên đường ROC, bốn biến thể học có giám sát gần như trùng nhau và ép sát góc trên bên trái, còn Autoencoder tuy thấp hơn nhưng vẫn cách xa đường chéo ngẫu nhiên. Trên đường Precision–Recall, khoảng cách giữa hai nhóm mô hình giãn ra rõ rệt: bốn biến thể học có giám sát giữ Precision gần 1,0 trên toàn dải Recall, trong khi Precision của Autoencoder suy giảm liên tục và chỉ còn khoảng 0,05 ở mức Recall cao nhất. Cùng một mô hình nhưng hai đồ thị cho hai ấn tượng khác nhau, đó là lý do đề bài yêu cầu không dựa vào một chỉ số duy nhất.</w:t>
-      </w:r>
-    </w:p>
-    <w:p>
-      <w:pPr>
         <w:keepNext/>
-        <w:spacing w:before="160" w:after="60" w:line="276" w:lineRule="auto"/>
+        <w:spacing w:before="360" w:after="120" w:line="276" w:lineRule="auto"/>
         <w:ind w:firstLine="0"/>
         <w:jc w:val="left"/>
       </w:pPr>
@@ -13433,7 +12962,7 @@
           <w:b/>
           <w:i w:val="0"/>
           <w:color w:val="000000"/>
-          <w:sz w:val="26"/>
+          <w:sz w:val="28"/>
         </w:rPr>
         <w:t>5.3. Phân tích ma trận nhầm lẫn</w:t>
       </w:r>
@@ -13447,7 +12976,7 @@
         <w:drawing>
           <wp:inline xmlns:a="http://schemas.openxmlformats.org/drawingml/2006/main" xmlns:pic="http://schemas.openxmlformats.org/drawingml/2006/picture">
             <wp:extent cx="5220000" cy="3450756"/>
-            <wp:docPr id="4" name="Picture 4"/>
+            <wp:docPr id="2" name="Picture 2"/>
             <wp:cNvGraphicFramePr>
               <a:graphicFrameLocks noChangeAspect="1"/>
             </wp:cNvGraphicFramePr>
@@ -13459,7 +12988,7 @@
                     <pic:cNvPicPr/>
                   </pic:nvPicPr>
                   <pic:blipFill>
-                    <a:blip r:embed="rId18"/>
+                    <a:blip r:embed="rId16"/>
                     <a:stretch>
                       <a:fillRect/>
                     </a:stretch>
@@ -13490,7 +13019,7 @@
           <w:color w:val="000000"/>
           <w:sz w:val="21"/>
         </w:rPr>
-        <w:t>Hình 5.3. So sánh riêng bốn thành phần TN, FP, FN và TP theo mô hình</w:t>
+        <w:t>Hình 5.1. So sánh riêng bốn thành phần TN, FP, FN và TP theo mô hình</w:t>
       </w:r>
     </w:p>
     <w:p>
@@ -13507,7 +13036,7 @@
           <w:color w:val="000000"/>
           <w:sz w:val="26"/>
         </w:rPr>
-        <w:t>Hình 5.3 tách TN, FP, FN và TP thành bốn đồ thị để mỗi thành phần có trục tung riêng. Trục hoành biểu diễn năm biến thể mô hình, còn trục tung biểu diễn số giao dịch. Hai đồ thị sai số FP và FN dùng trục tung theo thang logarit vì giá trị trong cùng một đồ thị chênh nhau tới ba bậc độ lớn, ví dụ 1 cảnh báo nhầm của Random Forest kết hợp SMOTENC so với 1.998 cảnh báo nhầm của Autoencoder. Nếu giữ thang tuyến tính, các cột nhỏ bị dí sát trục và không còn so sánh được với nhau. Cách trình bày này giúp quan sát cả những sai số có giá trị nhỏ mà không bị hai nhóm TN và TP có quy mô lớn che khuất.</w:t>
+        <w:t>Hình 5.1 tách TN, FP, FN và TP thành bốn đồ thị để mỗi thành phần có trục tung riêng. Trục hoành biểu diễn năm biến thể mô hình, còn trục tung biểu diễn số giao dịch. Hai đồ thị sai số FP và FN dùng trục tung theo thang logarit vì giá trị trong cùng một đồ thị chênh nhau tới ba bậc độ lớn, ví dụ 1 cảnh báo nhầm của Random Forest kết hợp SMOTENC so với 1.998 cảnh báo nhầm của Autoencoder. Nếu giữ thang tuyến tính, các cột nhỏ bị dí sát trục và không còn so sánh được với nhau. Cách trình bày này giúp quan sát cả những sai số có giá trị nhỏ mà không bị hai nhóm TN và TP có quy mô lớn che khuất.</w:t>
       </w:r>
     </w:p>
     <w:p>
@@ -13547,7 +13076,7 @@
     <w:p>
       <w:pPr>
         <w:keepNext/>
-        <w:spacing w:before="160" w:after="60" w:line="276" w:lineRule="auto"/>
+        <w:spacing w:before="360" w:after="120" w:line="276" w:lineRule="auto"/>
         <w:ind w:firstLine="0"/>
         <w:jc w:val="left"/>
       </w:pPr>
@@ -13559,7 +13088,7 @@
           <w:b/>
           <w:i w:val="0"/>
           <w:color w:val="000000"/>
-          <w:sz w:val="26"/>
+          <w:sz w:val="28"/>
         </w:rPr>
         <w:t>5.4. Ảnh hưởng của SMOTENC và ADASYN</w:t>
       </w:r>
@@ -13601,7 +13130,7 @@
     <w:p>
       <w:pPr>
         <w:keepNext/>
-        <w:spacing w:before="160" w:after="60" w:line="276" w:lineRule="auto"/>
+        <w:spacing w:before="360" w:after="120" w:line="276" w:lineRule="auto"/>
         <w:ind w:firstLine="0"/>
         <w:jc w:val="left"/>
       </w:pPr>
@@ -13613,7 +13142,7 @@
           <w:b/>
           <w:i w:val="0"/>
           <w:color w:val="000000"/>
-          <w:sz w:val="26"/>
+          <w:sz w:val="28"/>
         </w:rPr>
         <w:t>5.5. Mức đóng góp của các đặc trưng</w:t>
       </w:r>
@@ -13639,6 +13168,8 @@
       <w:tblPr>
         <w:tblW w:type="auto" w:w="0"/>
         <w:jc w:val="center"/>
+        <w:tblLayout w:type="fixed"/>
+        <w:tblLook w:firstColumn="1" w:firstRow="1" w:lastColumn="0" w:lastRow="0" w:noHBand="0" w:noVBand="1" w:val="04A0"/>
         <w:tblBorders>
           <w:top w:val="single" w:sz="6" w:space="0" w:color="CCCCCC"/>
           <w:bottom w:val="single" w:sz="6" w:space="0" w:color="CCCCCC"/>
@@ -13647,8 +13178,6 @@
           <w:left w:val="none"/>
           <w:right w:val="none"/>
         </w:tblBorders>
-        <w:tblLayout w:type="fixed"/>
-        <w:tblLook w:firstColumn="1" w:firstRow="1" w:lastColumn="0" w:lastRow="0" w:noHBand="0" w:noVBand="1" w:val="04A0"/>
       </w:tblPr>
       <w:tblGrid>
         <w:gridCol w:w="1814"/>
@@ -13659,8 +13188,8 @@
       </w:tblGrid>
       <w:tr>
         <w:trPr>
+          <w:tblHeader/>
           <w:cantSplit/>
-          <w:tblHeader/>
         </w:trPr>
         <w:tc>
           <w:tcPr>
@@ -14696,7 +14225,7 @@
         <w:drawing>
           <wp:inline xmlns:a="http://schemas.openxmlformats.org/drawingml/2006/main" xmlns:pic="http://schemas.openxmlformats.org/drawingml/2006/picture">
             <wp:extent cx="5220000" cy="3563885"/>
-            <wp:docPr id="5" name="Picture 5"/>
+            <wp:docPr id="3" name="Picture 3"/>
             <wp:cNvGraphicFramePr>
               <a:graphicFrameLocks noChangeAspect="1"/>
             </wp:cNvGraphicFramePr>
@@ -14708,7 +14237,7 @@
                     <pic:cNvPicPr/>
                   </pic:nvPicPr>
                   <pic:blipFill>
-                    <a:blip r:embed="rId19"/>
+                    <a:blip r:embed="rId17"/>
                     <a:stretch>
                       <a:fillRect/>
                     </a:stretch>
@@ -14739,7 +14268,7 @@
           <w:color w:val="000000"/>
           <w:sz w:val="21"/>
         </w:rPr>
-        <w:t>Hình 5.4. Mức đóng góp của toàn bộ 14 đặc trưng theo hai mô hình dùng SMOTENC</w:t>
+        <w:t>Hình 5.2. Mức đóng góp của toàn bộ 14 đặc trưng theo hai mô hình dùng SMOTENC</w:t>
       </w:r>
     </w:p>
     <w:p>
@@ -14756,7 +14285,7 @@
           <w:color w:val="000000"/>
           <w:sz w:val="26"/>
         </w:rPr>
-        <w:t xml:space="preserve">Hình 5.4 trình bày đầy đủ 14 đặc trưng của cả hai mô hình, mỗi mô hình trên một panel riêng vì hai thang đo khác nhau. Màu phân biệt nhóm đặc trưng dẫn xuất từ số dư với phần còn lại, cho thấy mức độ tập trung rõ hơn bảng số. Với Random Forest, mức đóng góp giảm tương đối đều và các đặc trưng thời gian vẫn giữ vai trò nhỏ nhưng khác 0. Với XGBoost, hai đặc trưng đầu chiếm gần như toàn bộ, mười hai đặc trưng còn lại cộng lại chưa tới 3%, trong đó </w:t>
+        <w:t xml:space="preserve">Hình 5.2 trình bày đầy đủ 14 đặc trưng của cả hai mô hình, mỗi mô hình trên một panel riêng vì hai thang đo khác nhau. Màu phân biệt nhóm đặc trưng dẫn xuất từ số dư với phần còn lại, cho thấy mức độ tập trung rõ hơn bảng số. Với Random Forest, mức đóng góp giảm tương đối đều và các đặc trưng thời gian vẫn giữ vai trò nhỏ nhưng khác 0. Với XGBoost, hai đặc trưng đầu chiếm gần như toàn bộ, mười hai đặc trưng còn lại cộng lại chưa tới 3%, trong đó </w:t>
       </w:r>
       <w:r>
         <w:rPr>
@@ -14820,7 +14349,7 @@
     <w:p>
       <w:pPr>
         <w:keepNext/>
-        <w:spacing w:before="160" w:after="60" w:line="276" w:lineRule="auto"/>
+        <w:spacing w:before="360" w:after="120" w:line="276" w:lineRule="auto"/>
         <w:ind w:firstLine="0"/>
         <w:jc w:val="left"/>
       </w:pPr>
@@ -14832,7 +14361,7 @@
           <w:b/>
           <w:i w:val="0"/>
           <w:color w:val="000000"/>
-          <w:sz w:val="26"/>
+          <w:sz w:val="28"/>
         </w:rPr>
         <w:t>5.6. Kết luận tạm thời của chương</w:t>
       </w:r>
@@ -14874,30 +14403,30 @@
     <w:p>
       <w:pPr>
         <w:keepNext/>
-        <w:spacing w:before="240" w:after="80" w:line="276" w:lineRule="auto"/>
+        <w:spacing w:before="480" w:after="240" w:line="276" w:lineRule="auto"/>
+        <w:ind w:firstLine="0"/>
+        <w:jc w:val="center"/>
+      </w:pPr>
+      <w:bookmarkStart w:id="1050" w:name="bm_h1_7"/>
+      <w:bookmarkEnd w:id="1050"/>
+      <w:r>
+        <w:rPr>
+          <w:rFonts w:ascii="Times New Roman" w:hAnsi="Times New Roman"/>
+          <w:b/>
+          <w:i w:val="0"/>
+          <w:color w:val="000000"/>
+          <w:sz w:val="30"/>
+        </w:rPr>
+        <w:t>CHƯƠNG 6. THẢO LUẬN</w:t>
+      </w:r>
+    </w:p>
+    <w:p>
+      <w:pPr>
+        <w:keepNext/>
+        <w:spacing w:before="360" w:after="120" w:line="276" w:lineRule="auto"/>
         <w:ind w:firstLine="0"/>
         <w:jc w:val="left"/>
       </w:pPr>
-      <w:bookmarkStart w:id="1050" w:name="bm_h1_7"/>
-      <w:bookmarkEnd w:id="1050"/>
-      <w:r>
-        <w:rPr>
-          <w:rFonts w:ascii="Times New Roman" w:hAnsi="Times New Roman"/>
-          <w:b/>
-          <w:i w:val="0"/>
-          <w:color w:val="000000"/>
-          <w:sz w:val="27"/>
-        </w:rPr>
-        <w:t>CHƯƠNG 6. THẢO LUẬN</w:t>
-      </w:r>
-    </w:p>
-    <w:p>
-      <w:pPr>
-        <w:keepNext/>
-        <w:spacing w:before="160" w:after="60" w:line="276" w:lineRule="auto"/>
-        <w:ind w:firstLine="0"/>
-        <w:jc w:val="left"/>
-      </w:pPr>
       <w:bookmarkStart w:id="1051" w:name="bm_h2_33"/>
       <w:bookmarkEnd w:id="1051"/>
       <w:r>
@@ -14906,7 +14435,7 @@
           <w:b/>
           <w:i w:val="0"/>
           <w:color w:val="000000"/>
-          <w:sz w:val="26"/>
+          <w:sz w:val="28"/>
         </w:rPr>
         <w:t>6.1. Trả lời các câu hỏi nghiên cứu</w:t>
       </w:r>
@@ -15023,7 +14552,7 @@
     <w:p>
       <w:pPr>
         <w:keepNext/>
-        <w:spacing w:before="160" w:after="60" w:line="276" w:lineRule="auto"/>
+        <w:spacing w:before="360" w:after="120" w:line="276" w:lineRule="auto"/>
         <w:ind w:firstLine="0"/>
         <w:jc w:val="left"/>
       </w:pPr>
@@ -15035,7 +14564,7 @@
           <w:b/>
           <w:i w:val="0"/>
           <w:color w:val="000000"/>
-          <w:sz w:val="26"/>
+          <w:sz w:val="28"/>
         </w:rPr>
         <w:t>6.2. Vì sao các chỉ số đạt mức rất cao</w:t>
       </w:r>
@@ -15148,7 +14677,7 @@
     <w:p>
       <w:pPr>
         <w:keepNext/>
-        <w:spacing w:before="160" w:after="60" w:line="276" w:lineRule="auto"/>
+        <w:spacing w:before="360" w:after="120" w:line="276" w:lineRule="auto"/>
         <w:ind w:firstLine="0"/>
         <w:jc w:val="left"/>
       </w:pPr>
@@ -15160,7 +14689,7 @@
           <w:b/>
           <w:i w:val="0"/>
           <w:color w:val="000000"/>
-          <w:sz w:val="26"/>
+          <w:sz w:val="28"/>
         </w:rPr>
         <w:t>6.3. Hiệu năng ước tính trên tỷ lệ gian lận gốc</w:t>
       </w:r>
@@ -15179,13 +14708,15 @@
           <w:color w:val="000000"/>
           <w:sz w:val="26"/>
         </w:rPr>
-        <w:t>Downsampling chỉ lấy mẫu ngẫu nhiên lớp bình thường nên không làm thay đổi phân bố có điều kiện của từng lớp. Nhờ đó, tỷ lệ phát hiện đúng và tỷ lệ báo động giả đo trên tập kiểm tra vẫn dùng được cho phân bố gốc, chỉ riêng Precision là phụ thuộc tỷ lệ lớp và cần quy chiếu lại. Bảng 6.1 trình bày kết quả quy chiếu về tỷ lệ 0,129082% của PaySim gốc, kèm khoảng tin cậy 95% tính theo phương pháp Clopper–Pearson cho tỷ lệ báo động giả.</w:t>
+        <w:t>Downsampling chỉ lấy mẫu ngẫu nhiên lớp bình thường nên không làm thay đổi phân bố có điều kiện của từng lớp. Nhờ đó, tỷ lệ phát hiện đúng và tỷ lệ báo động giả đo trên tập kiểm tra vẫn dùng được cho phân bố gốc, chỉ riêng Precision là phụ thuộc tỷ lệ lớp và cần quy chiếu lại. Bảng 6.1 trình bày kết quả quy chiếu về tỷ lệ 0,129082% của PaySim gốc, kèm khoảng tin cậy 95% tính theo phương pháp Clopper-Pearson cho tỷ lệ báo động giả.</w:t>
       </w:r>
     </w:p>
     <w:tbl>
       <w:tblPr>
         <w:tblW w:type="auto" w:w="0"/>
         <w:jc w:val="center"/>
+        <w:tblLayout w:type="fixed"/>
+        <w:tblLook w:firstColumn="1" w:firstRow="1" w:lastColumn="0" w:lastRow="0" w:noHBand="0" w:noVBand="1" w:val="04A0"/>
         <w:tblBorders>
           <w:top w:val="single" w:sz="6" w:space="0" w:color="CCCCCC"/>
           <w:bottom w:val="single" w:sz="6" w:space="0" w:color="CCCCCC"/>
@@ -15194,8 +14725,6 @@
           <w:left w:val="none"/>
           <w:right w:val="none"/>
         </w:tblBorders>
-        <w:tblLayout w:type="fixed"/>
-        <w:tblLook w:firstColumn="1" w:firstRow="1" w:lastColumn="0" w:lastRow="0" w:noHBand="0" w:noVBand="1" w:val="04A0"/>
       </w:tblPr>
       <w:tblGrid>
         <w:gridCol w:w="1512"/>
@@ -15207,8 +14736,8 @@
       </w:tblGrid>
       <w:tr>
         <w:trPr>
+          <w:tblHeader/>
           <w:cantSplit/>
-          <w:tblHeader/>
         </w:trPr>
         <w:tc>
           <w:tcPr>
@@ -15536,7 +15065,7 @@
                 <w:color w:val="000000"/>
                 <w:sz w:val="20"/>
               </w:rPr>
-              <w:t>0,8985 – 0,9995</w:t>
+              <w:t>0,8985 - 0,9995</w:t>
             </w:r>
           </w:p>
         </w:tc>
@@ -15720,7 +15249,7 @@
                 <w:color w:val="000000"/>
                 <w:sz w:val="20"/>
               </w:rPr>
-              <w:t>0,8491 – 0,9876</w:t>
+              <w:t>0,8491 - 0,9876</w:t>
             </w:r>
           </w:p>
         </w:tc>
@@ -15900,7 +15429,7 @@
                 <w:color w:val="000000"/>
                 <w:sz w:val="20"/>
               </w:rPr>
-              <w:t>0,8281 – 0,9784</w:t>
+              <w:t>0,8281 - 0,9784</w:t>
             </w:r>
           </w:p>
         </w:tc>
@@ -16084,7 +15613,7 @@
                 <w:color w:val="000000"/>
                 <w:sz w:val="20"/>
               </w:rPr>
-              <w:t>0,7738 – 0,9460</w:t>
+              <w:t>0,7738 - 0,9460</w:t>
             </w:r>
           </w:p>
         </w:tc>
@@ -16264,7 +15793,7 @@
                 <w:color w:val="000000"/>
                 <w:sz w:val="20"/>
               </w:rPr>
-              <w:t>0,0176 – 0,0191</w:t>
+              <w:t>0,0176 - 0,0191</w:t>
             </w:r>
           </w:p>
         </w:tc>
@@ -16352,7 +15881,7 @@
     <w:p>
       <w:pPr>
         <w:keepNext/>
-        <w:spacing w:before="160" w:after="60" w:line="276" w:lineRule="auto"/>
+        <w:spacing w:before="360" w:after="120" w:line="276" w:lineRule="auto"/>
         <w:ind w:firstLine="0"/>
         <w:jc w:val="left"/>
       </w:pPr>
@@ -16364,7 +15893,7 @@
           <w:b/>
           <w:i w:val="0"/>
           <w:color w:val="000000"/>
-          <w:sz w:val="26"/>
+          <w:sz w:val="28"/>
         </w:rPr>
         <w:t>6.4. Khác biệt giữa các mô hình có đủ tin cậy để xếp hạng không</w:t>
       </w:r>
@@ -16422,7 +15951,7 @@
     <w:p>
       <w:pPr>
         <w:keepNext/>
-        <w:spacing w:before="160" w:after="60" w:line="276" w:lineRule="auto"/>
+        <w:spacing w:before="360" w:after="120" w:line="276" w:lineRule="auto"/>
         <w:ind w:firstLine="0"/>
         <w:jc w:val="left"/>
       </w:pPr>
@@ -16434,7 +15963,7 @@
           <w:b/>
           <w:i w:val="0"/>
           <w:color w:val="000000"/>
-          <w:sz w:val="26"/>
+          <w:sz w:val="28"/>
         </w:rPr>
         <w:t>6.5. Vai trò của mô hình phát hiện bất thường</w:t>
       </w:r>
@@ -16493,7 +16022,7 @@
     <w:p>
       <w:pPr>
         <w:keepNext/>
-        <w:spacing w:before="160" w:after="60" w:line="276" w:lineRule="auto"/>
+        <w:spacing w:before="360" w:after="120" w:line="276" w:lineRule="auto"/>
         <w:ind w:firstLine="0"/>
         <w:jc w:val="left"/>
       </w:pPr>
@@ -16505,7 +16034,7 @@
           <w:b/>
           <w:i w:val="0"/>
           <w:color w:val="000000"/>
-          <w:sz w:val="26"/>
+          <w:sz w:val="28"/>
         </w:rPr>
         <w:t>6.6. Hạn chế của nghiên cứu</w:t>
       </w:r>
@@ -16584,7 +16113,7 @@
     <w:p>
       <w:pPr>
         <w:keepNext/>
-        <w:spacing w:before="160" w:after="60" w:line="276" w:lineRule="auto"/>
+        <w:spacing w:before="360" w:after="120" w:line="276" w:lineRule="auto"/>
         <w:ind w:firstLine="0"/>
         <w:jc w:val="left"/>
       </w:pPr>
@@ -16596,7 +16125,7 @@
           <w:b/>
           <w:i w:val="0"/>
           <w:color w:val="000000"/>
-          <w:sz w:val="26"/>
+          <w:sz w:val="28"/>
         </w:rPr>
         <w:t>6.7. Kết luận chương</w:t>
       </w:r>
@@ -16621,30 +16150,30 @@
     <w:p>
       <w:pPr>
         <w:keepNext/>
-        <w:spacing w:before="240" w:after="80" w:line="276" w:lineRule="auto"/>
+        <w:spacing w:before="480" w:after="240" w:line="276" w:lineRule="auto"/>
+        <w:ind w:firstLine="0"/>
+        <w:jc w:val="center"/>
+      </w:pPr>
+      <w:bookmarkStart w:id="1058" w:name="bm_h1_8"/>
+      <w:bookmarkEnd w:id="1058"/>
+      <w:r>
+        <w:rPr>
+          <w:rFonts w:ascii="Times New Roman" w:hAnsi="Times New Roman"/>
+          <w:b/>
+          <w:i w:val="0"/>
+          <w:color w:val="000000"/>
+          <w:sz w:val="30"/>
+        </w:rPr>
+        <w:t>CHƯƠNG 7. KẾT LUẬN VÀ HƯỚNG PHÁT TRIỂN</w:t>
+      </w:r>
+    </w:p>
+    <w:p>
+      <w:pPr>
+        <w:keepNext/>
+        <w:spacing w:before="360" w:after="120" w:line="276" w:lineRule="auto"/>
         <w:ind w:firstLine="0"/>
         <w:jc w:val="left"/>
       </w:pPr>
-      <w:bookmarkStart w:id="1058" w:name="bm_h1_8"/>
-      <w:bookmarkEnd w:id="1058"/>
-      <w:r>
-        <w:rPr>
-          <w:rFonts w:ascii="Times New Roman" w:hAnsi="Times New Roman"/>
-          <w:b/>
-          <w:i w:val="0"/>
-          <w:color w:val="000000"/>
-          <w:sz w:val="27"/>
-        </w:rPr>
-        <w:t>CHƯƠNG 7. KẾT LUẬN VÀ HƯỚNG PHÁT TRIỂN</w:t>
-      </w:r>
-    </w:p>
-    <w:p>
-      <w:pPr>
-        <w:keepNext/>
-        <w:spacing w:before="160" w:after="60" w:line="276" w:lineRule="auto"/>
-        <w:ind w:firstLine="0"/>
-        <w:jc w:val="left"/>
-      </w:pPr>
       <w:bookmarkStart w:id="1059" w:name="bm_h2_40"/>
       <w:bookmarkEnd w:id="1059"/>
       <w:r>
@@ -16653,7 +16182,7 @@
           <w:b/>
           <w:i w:val="0"/>
           <w:color w:val="000000"/>
-          <w:sz w:val="26"/>
+          <w:sz w:val="28"/>
         </w:rPr>
         <w:t>7.1. Tóm tắt công việc đã thực hiện</w:t>
       </w:r>
@@ -16712,7 +16241,7 @@
     <w:p>
       <w:pPr>
         <w:keepNext/>
-        <w:spacing w:before="160" w:after="60" w:line="276" w:lineRule="auto"/>
+        <w:spacing w:before="360" w:after="120" w:line="276" w:lineRule="auto"/>
         <w:ind w:firstLine="0"/>
         <w:jc w:val="left"/>
       </w:pPr>
@@ -16724,7 +16253,7 @@
           <w:b/>
           <w:i w:val="0"/>
           <w:color w:val="000000"/>
-          <w:sz w:val="26"/>
+          <w:sz w:val="28"/>
         </w:rPr>
         <w:t>7.2. Đối chiếu với mục tiêu đề ra</w:t>
       </w:r>
@@ -16749,6 +16278,8 @@
       <w:tblPr>
         <w:tblW w:type="auto" w:w="0"/>
         <w:jc w:val="center"/>
+        <w:tblLayout w:type="fixed"/>
+        <w:tblLook w:firstColumn="1" w:firstRow="1" w:lastColumn="0" w:lastRow="0" w:noHBand="0" w:noVBand="1" w:val="04A0"/>
         <w:tblBorders>
           <w:top w:val="single" w:sz="6" w:space="0" w:color="CCCCCC"/>
           <w:bottom w:val="single" w:sz="6" w:space="0" w:color="CCCCCC"/>
@@ -16757,8 +16288,6 @@
           <w:left w:val="none"/>
           <w:right w:val="none"/>
         </w:tblBorders>
-        <w:tblLayout w:type="fixed"/>
-        <w:tblLook w:firstColumn="1" w:firstRow="1" w:lastColumn="0" w:lastRow="0" w:noHBand="0" w:noVBand="1" w:val="04A0"/>
       </w:tblPr>
       <w:tblGrid>
         <w:gridCol w:w="2268"/>
@@ -16768,8 +16297,8 @@
       </w:tblGrid>
       <w:tr>
         <w:trPr>
+          <w:tblHeader/>
           <w:cantSplit/>
-          <w:tblHeader/>
         </w:trPr>
         <w:tc>
           <w:tcPr>
@@ -17782,7 +17311,7 @@
           <w:color w:val="000000"/>
           <w:sz w:val="26"/>
         </w:rPr>
-        <w:t>Toàn bộ bảy mục tiêu cụ thể đã hoàn thành. Trong đó mục tiêu thứ bảy đã tích hợp mô hình XGBoost-SMOTE cùng bộ tiền xử lý và scaler thật vào giao diện tương tác Streamlit, hỗ trợ bốn kịch bản thử nghiệm và vượt qua kiểm thử Browser QA.</w:t>
+        <w:t>Toàn bộ bảy mục tiêu cụ thể đã hoàn thành. Trong đó mục tiêu thứ bảy đã tích hợp mô hình XGBoost-SMOTE cùng bộ tiền xử lý và scaler thật vào giao diện tương tác Streamlit, hỗ trợ 4 kịch bản thử nghiệm và vượt qua kiểm thử Browser QA.</w:t>
       </w:r>
     </w:p>
     <w:p>
@@ -17805,7 +17334,7 @@
     <w:p>
       <w:pPr>
         <w:keepNext/>
-        <w:spacing w:before="160" w:after="60" w:line="276" w:lineRule="auto"/>
+        <w:spacing w:before="360" w:after="120" w:line="276" w:lineRule="auto"/>
         <w:ind w:firstLine="0"/>
         <w:jc w:val="left"/>
       </w:pPr>
@@ -17817,7 +17346,7 @@
           <w:b/>
           <w:i w:val="0"/>
           <w:color w:val="000000"/>
-          <w:sz w:val="26"/>
+          <w:sz w:val="28"/>
         </w:rPr>
         <w:t>7.3. Đóng góp của đồ án</w:t>
       </w:r>
@@ -17859,7 +17388,7 @@
     <w:p>
       <w:pPr>
         <w:keepNext/>
-        <w:spacing w:before="160" w:after="60" w:line="276" w:lineRule="auto"/>
+        <w:spacing w:before="360" w:after="120" w:line="276" w:lineRule="auto"/>
         <w:ind w:firstLine="0"/>
         <w:jc w:val="left"/>
       </w:pPr>
@@ -17871,7 +17400,7 @@
           <w:b/>
           <w:i w:val="0"/>
           <w:color w:val="000000"/>
-          <w:sz w:val="26"/>
+          <w:sz w:val="28"/>
         </w:rPr>
         <w:t>7.4. Hướng phát triển</w:t>
       </w:r>
@@ -17967,7 +17496,7 @@
     <w:p>
       <w:pPr>
         <w:keepNext/>
-        <w:spacing w:before="160" w:after="60" w:line="276" w:lineRule="auto"/>
+        <w:spacing w:before="360" w:after="120" w:line="276" w:lineRule="auto"/>
         <w:ind w:firstLine="0"/>
         <w:jc w:val="left"/>
       </w:pPr>
@@ -17979,7 +17508,7 @@
           <w:b/>
           <w:i w:val="0"/>
           <w:color w:val="000000"/>
-          <w:sz w:val="26"/>
+          <w:sz w:val="28"/>
         </w:rPr>
         <w:t>7.5. Kết luận chung</w:t>
       </w:r>
@@ -18021,9 +17550,9 @@
     <w:p>
       <w:pPr>
         <w:keepNext/>
-        <w:spacing w:before="240" w:after="80" w:line="276" w:lineRule="auto"/>
+        <w:spacing w:before="480" w:after="240" w:line="276" w:lineRule="auto"/>
         <w:ind w:firstLine="0"/>
-        <w:jc w:val="left"/>
+        <w:jc w:val="center"/>
       </w:pPr>
       <w:bookmarkStart w:id="1064" w:name="bm_h1_9"/>
       <w:bookmarkEnd w:id="1064"/>
@@ -18033,7 +17562,7 @@
           <w:b/>
           <w:i w:val="0"/>
           <w:color w:val="000000"/>
-          <w:sz w:val="27"/>
+          <w:sz w:val="30"/>
         </w:rPr>
         <w:t>TÀI LIỆU THAM KHẢO</w:t>
       </w:r>
@@ -18058,7 +17587,7 @@
     <w:p>
       <w:pPr>
         <w:keepNext/>
-        <w:spacing w:before="160" w:after="60" w:line="276" w:lineRule="auto"/>
+        <w:spacing w:before="360" w:after="120" w:line="276" w:lineRule="auto"/>
         <w:ind w:firstLine="0"/>
         <w:jc w:val="left"/>
       </w:pPr>
@@ -18070,7 +17599,7 @@
           <w:b/>
           <w:i w:val="0"/>
           <w:color w:val="000000"/>
-          <w:sz w:val="26"/>
+          <w:sz w:val="28"/>
         </w:rPr>
         <w:t>Tài liệu nội bộ của dự án</w:t>
       </w:r>
@@ -18079,7 +17608,7 @@
       <w:pPr>
         <w:spacing w:before="20" w:after="40" w:line="300" w:lineRule="auto"/>
         <w:ind w:left="720" w:hanging="283"/>
-        <w:jc w:val="left"/>
+        <w:jc w:val="both"/>
       </w:pPr>
       <w:r>
         <w:rPr>
@@ -18105,7 +17634,7 @@
       <w:pPr>
         <w:spacing w:before="20" w:after="40" w:line="300" w:lineRule="auto"/>
         <w:ind w:left="720" w:hanging="283"/>
-        <w:jc w:val="left"/>
+        <w:jc w:val="both"/>
       </w:pPr>
       <w:r>
         <w:rPr>
@@ -18151,7 +17680,7 @@
       <w:pPr>
         <w:spacing w:before="20" w:after="40" w:line="300" w:lineRule="auto"/>
         <w:ind w:left="720" w:hanging="283"/>
-        <w:jc w:val="left"/>
+        <w:jc w:val="both"/>
       </w:pPr>
       <w:r>
         <w:rPr>
@@ -18217,7 +17746,7 @@
       <w:pPr>
         <w:spacing w:before="20" w:after="40" w:line="300" w:lineRule="auto"/>
         <w:ind w:left="720" w:hanging="283"/>
-        <w:jc w:val="left"/>
+        <w:jc w:val="both"/>
       </w:pPr>
       <w:r>
         <w:rPr>
@@ -18263,7 +17792,7 @@
       <w:pPr>
         <w:spacing w:before="20" w:after="40" w:line="300" w:lineRule="auto"/>
         <w:ind w:left="720" w:hanging="283"/>
-        <w:jc w:val="left"/>
+        <w:jc w:val="both"/>
       </w:pPr>
       <w:r>
         <w:rPr>
@@ -18309,7 +17838,7 @@
       <w:pPr>
         <w:spacing w:before="20" w:after="40" w:line="300" w:lineRule="auto"/>
         <w:ind w:left="720" w:hanging="283"/>
-        <w:jc w:val="left"/>
+        <w:jc w:val="both"/>
       </w:pPr>
       <w:r>
         <w:rPr>
@@ -18355,7 +17884,7 @@
       <w:pPr>
         <w:spacing w:before="20" w:after="40" w:line="300" w:lineRule="auto"/>
         <w:ind w:left="720" w:hanging="283"/>
-        <w:jc w:val="left"/>
+        <w:jc w:val="both"/>
       </w:pPr>
       <w:r>
         <w:rPr>
@@ -18401,7 +17930,7 @@
       <w:pPr>
         <w:spacing w:before="20" w:after="40" w:line="300" w:lineRule="auto"/>
         <w:ind w:left="720" w:hanging="283"/>
-        <w:jc w:val="left"/>
+        <w:jc w:val="both"/>
       </w:pPr>
       <w:r>
         <w:rPr>
@@ -18420,7 +17949,7 @@
           <w:color w:val="000000"/>
           <w:sz w:val="26"/>
         </w:rPr>
-        <w:t xml:space="preserve">Nguyễn Duy Khang, </w:t>
+        <w:t xml:space="preserve">Nhóm 9, </w:t>
       </w:r>
       <w:r>
         <w:rPr>
@@ -18430,7 +17959,7 @@
           <w:color w:val="000000"/>
           <w:sz w:val="25"/>
         </w:rPr>
-        <w:t>reports/model_comparison.csv</w:t>
+        <w:t>reports/rf_smote_feature_importance.csv</w:t>
       </w:r>
       <w:r>
         <w:rPr>
@@ -18440,7 +17969,7 @@
           <w:color w:val="000000"/>
           <w:sz w:val="26"/>
         </w:rPr>
-        <w:t xml:space="preserve">, </w:t>
+        <w:t xml:space="preserve"> và </w:t>
       </w:r>
       <w:r>
         <w:rPr>
@@ -18450,7 +17979,7 @@
           <w:color w:val="000000"/>
           <w:sz w:val="25"/>
         </w:rPr>
-        <w:t>reports/figures/roc_curves_all.png</w:t>
+        <w:t>reports/xgb_smote_feature_importance.csv</w:t>
       </w:r>
       <w:r>
         <w:rPr>
@@ -18460,7 +17989,33 @@
           <w:color w:val="000000"/>
           <w:sz w:val="26"/>
         </w:rPr>
-        <w:t xml:space="preserve"> và </w:t>
+        <w:t>, mức đóng góp đặc trưng đã lưu của hai mô hình dùng SMOTENC.</w:t>
+      </w:r>
+    </w:p>
+    <w:p>
+      <w:pPr>
+        <w:spacing w:before="20" w:after="40" w:line="300" w:lineRule="auto"/>
+        <w:ind w:left="720" w:hanging="283"/>
+        <w:jc w:val="both"/>
+      </w:pPr>
+      <w:r>
+        <w:rPr>
+          <w:rFonts w:ascii="Times New Roman" w:hAnsi="Times New Roman"/>
+          <w:b/>
+          <w:color w:val="000000"/>
+          <w:sz w:val="26"/>
+        </w:rPr>
+        <w:t xml:space="preserve">-  </w:t>
+      </w:r>
+      <w:r>
+        <w:rPr>
+          <w:rFonts w:ascii="Times New Roman" w:hAnsi="Times New Roman"/>
+          <w:b w:val="0"/>
+          <w:i w:val="0"/>
+          <w:color w:val="000000"/>
+          <w:sz w:val="26"/>
+        </w:rPr>
+        <w:t xml:space="preserve">Vũ Văn Duy, </w:t>
       </w:r>
       <w:r>
         <w:rPr>
@@ -18470,7 +18025,7 @@
           <w:color w:val="000000"/>
           <w:sz w:val="25"/>
         </w:rPr>
-        <w:t>reports/figures/pr_curves_all.png</w:t>
+        <w:t>run_report_metrics.py</w:t>
       </w:r>
       <w:r>
         <w:rPr>
@@ -18480,232 +18035,74 @@
           <w:color w:val="000000"/>
           <w:sz w:val="26"/>
         </w:rPr>
-        <w:t>, bảng so sánh tổng hợp và đường ROC, Precision–Recall của bước đánh giá chéo.</w:t>
+        <w:t xml:space="preserve">, </w:t>
+      </w:r>
+      <w:r>
+        <w:rPr>
+          <w:rFonts w:ascii="Courier New" w:hAnsi="Courier New"/>
+          <w:b w:val="0"/>
+          <w:i w:val="0"/>
+          <w:color w:val="000000"/>
+          <w:sz w:val="25"/>
+        </w:rPr>
+        <w:t>reports/ch5_metrics_recomputed.csv</w:t>
+      </w:r>
+      <w:r>
+        <w:rPr>
+          <w:rFonts w:ascii="Times New Roman" w:hAnsi="Times New Roman"/>
+          <w:b w:val="0"/>
+          <w:i w:val="0"/>
+          <w:color w:val="000000"/>
+          <w:sz w:val="26"/>
+        </w:rPr>
+        <w:t xml:space="preserve"> và </w:t>
+      </w:r>
+      <w:r>
+        <w:rPr>
+          <w:rFonts w:ascii="Courier New" w:hAnsi="Courier New"/>
+          <w:b w:val="0"/>
+          <w:i w:val="0"/>
+          <w:color w:val="000000"/>
+          <w:sz w:val="25"/>
+        </w:rPr>
+        <w:t>reports/ch6_prevalence_projection.csv</w:t>
+      </w:r>
+      <w:r>
+        <w:rPr>
+          <w:rFonts w:ascii="Times New Roman" w:hAnsi="Times New Roman"/>
+          <w:b w:val="0"/>
+          <w:i w:val="0"/>
+          <w:color w:val="000000"/>
+          <w:sz w:val="26"/>
+        </w:rPr>
+        <w:t>, kết quả tính lại toàn bộ chỉ số của Chương 5 và phép quy chiếu Precision của Chương 6 từ nhãn thật cùng các tệp dự đoán đã lưu.</w:t>
       </w:r>
     </w:p>
     <w:p>
       <w:pPr>
-        <w:spacing w:before="20" w:after="40" w:line="300" w:lineRule="auto"/>
-        <w:ind w:left="720" w:hanging="283"/>
+        <w:keepNext/>
+        <w:spacing w:before="360" w:after="120" w:line="276" w:lineRule="auto"/>
+        <w:ind w:firstLine="0"/>
         <w:jc w:val="left"/>
       </w:pPr>
+      <w:bookmarkStart w:id="1066" w:name="bm_h2_46"/>
+      <w:bookmarkEnd w:id="1066"/>
       <w:r>
         <w:rPr>
           <w:rFonts w:ascii="Times New Roman" w:hAnsi="Times New Roman"/>
           <w:b/>
-          <w:color w:val="000000"/>
-          <w:sz w:val="26"/>
-        </w:rPr>
-        <w:t xml:space="preserve">-  </w:t>
-      </w:r>
-      <w:r>
-        <w:rPr>
-          <w:rFonts w:ascii="Times New Roman" w:hAnsi="Times New Roman"/>
-          <w:b w:val="0"/>
-          <w:i w:val="0"/>
-          <w:color w:val="000000"/>
-          <w:sz w:val="26"/>
-        </w:rPr>
-        <w:t xml:space="preserve">Hoàng Cao Sơn và Nguyễn Duy Khang, </w:t>
-      </w:r>
-      <w:r>
-        <w:rPr>
-          <w:rFonts w:ascii="Courier New" w:hAnsi="Courier New"/>
-          <w:b w:val="0"/>
-          <w:i w:val="0"/>
-          <w:color w:val="000000"/>
-          <w:sz w:val="25"/>
-        </w:rPr>
-        <w:t>notebooks/06_evaluation_comparison.ipynb</w:t>
-      </w:r>
-      <w:r>
-        <w:rPr>
-          <w:rFonts w:ascii="Times New Roman" w:hAnsi="Times New Roman"/>
-          <w:b w:val="0"/>
-          <w:i w:val="0"/>
-          <w:color w:val="000000"/>
-          <w:sz w:val="26"/>
-        </w:rPr>
-        <w:t>, notebook đánh giá và so sánh chéo các mô hình.</w:t>
+          <w:i w:val="0"/>
+          <w:color w:val="000000"/>
+          <w:sz w:val="28"/>
+        </w:rPr>
+        <w:t>Tài liệu tham khảo bên ngoài</w:t>
       </w:r>
     </w:p>
     <w:p>
       <w:pPr>
-        <w:spacing w:before="20" w:after="40" w:line="300" w:lineRule="auto"/>
-        <w:ind w:left="720" w:hanging="283"/>
-        <w:jc w:val="left"/>
-      </w:pPr>
-      <w:r>
-        <w:rPr>
-          <w:rFonts w:ascii="Times New Roman" w:hAnsi="Times New Roman"/>
-          <w:b/>
-          <w:color w:val="000000"/>
-          <w:sz w:val="26"/>
-        </w:rPr>
-        <w:t xml:space="preserve">-  </w:t>
-      </w:r>
-      <w:r>
-        <w:rPr>
-          <w:rFonts w:ascii="Times New Roman" w:hAnsi="Times New Roman"/>
-          <w:b w:val="0"/>
-          <w:i w:val="0"/>
-          <w:color w:val="000000"/>
-          <w:sz w:val="26"/>
-        </w:rPr>
-        <w:t xml:space="preserve">Nhóm 9, </w:t>
-      </w:r>
-      <w:r>
-        <w:rPr>
-          <w:rFonts w:ascii="Courier New" w:hAnsi="Courier New"/>
-          <w:b w:val="0"/>
-          <w:i w:val="0"/>
-          <w:color w:val="000000"/>
-          <w:sz w:val="25"/>
-        </w:rPr>
-        <w:t>reports/rf_smote_feature_importance.csv</w:t>
-      </w:r>
-      <w:r>
-        <w:rPr>
-          <w:rFonts w:ascii="Times New Roman" w:hAnsi="Times New Roman"/>
-          <w:b w:val="0"/>
-          <w:i w:val="0"/>
-          <w:color w:val="000000"/>
-          <w:sz w:val="26"/>
-        </w:rPr>
-        <w:t xml:space="preserve"> và </w:t>
-      </w:r>
-      <w:r>
-        <w:rPr>
-          <w:rFonts w:ascii="Courier New" w:hAnsi="Courier New"/>
-          <w:b w:val="0"/>
-          <w:i w:val="0"/>
-          <w:color w:val="000000"/>
-          <w:sz w:val="25"/>
-        </w:rPr>
-        <w:t>reports/xgb_smote_feature_importance.csv</w:t>
-      </w:r>
-      <w:r>
-        <w:rPr>
-          <w:rFonts w:ascii="Times New Roman" w:hAnsi="Times New Roman"/>
-          <w:b w:val="0"/>
-          <w:i w:val="0"/>
-          <w:color w:val="000000"/>
-          <w:sz w:val="26"/>
-        </w:rPr>
-        <w:t>, mức đóng góp đặc trưng đã lưu của hai mô hình dùng SMOTENC.</w:t>
-      </w:r>
-    </w:p>
-    <w:p>
-      <w:pPr>
-        <w:spacing w:before="20" w:after="40" w:line="300" w:lineRule="auto"/>
-        <w:ind w:left="720" w:hanging="283"/>
-        <w:jc w:val="left"/>
-      </w:pPr>
-      <w:r>
-        <w:rPr>
-          <w:rFonts w:ascii="Times New Roman" w:hAnsi="Times New Roman"/>
-          <w:b/>
-          <w:color w:val="000000"/>
-          <w:sz w:val="26"/>
-        </w:rPr>
-        <w:t xml:space="preserve">-  </w:t>
-      </w:r>
-      <w:r>
-        <w:rPr>
-          <w:rFonts w:ascii="Times New Roman" w:hAnsi="Times New Roman"/>
-          <w:b w:val="0"/>
-          <w:i w:val="0"/>
-          <w:color w:val="000000"/>
-          <w:sz w:val="26"/>
-        </w:rPr>
-        <w:t xml:space="preserve">Vũ Văn Duy, </w:t>
-      </w:r>
-      <w:r>
-        <w:rPr>
-          <w:rFonts w:ascii="Courier New" w:hAnsi="Courier New"/>
-          <w:b w:val="0"/>
-          <w:i w:val="0"/>
-          <w:color w:val="000000"/>
-          <w:sz w:val="25"/>
-        </w:rPr>
-        <w:t>run_report_metrics.py</w:t>
-      </w:r>
-      <w:r>
-        <w:rPr>
-          <w:rFonts w:ascii="Times New Roman" w:hAnsi="Times New Roman"/>
-          <w:b w:val="0"/>
-          <w:i w:val="0"/>
-          <w:color w:val="000000"/>
-          <w:sz w:val="26"/>
-        </w:rPr>
-        <w:t xml:space="preserve">, </w:t>
-      </w:r>
-      <w:r>
-        <w:rPr>
-          <w:rFonts w:ascii="Courier New" w:hAnsi="Courier New"/>
-          <w:b w:val="0"/>
-          <w:i w:val="0"/>
-          <w:color w:val="000000"/>
-          <w:sz w:val="25"/>
-        </w:rPr>
-        <w:t>reports/ch5_metrics_recomputed.csv</w:t>
-      </w:r>
-      <w:r>
-        <w:rPr>
-          <w:rFonts w:ascii="Times New Roman" w:hAnsi="Times New Roman"/>
-          <w:b w:val="0"/>
-          <w:i w:val="0"/>
-          <w:color w:val="000000"/>
-          <w:sz w:val="26"/>
-        </w:rPr>
-        <w:t xml:space="preserve"> và </w:t>
-      </w:r>
-      <w:r>
-        <w:rPr>
-          <w:rFonts w:ascii="Courier New" w:hAnsi="Courier New"/>
-          <w:b w:val="0"/>
-          <w:i w:val="0"/>
-          <w:color w:val="000000"/>
-          <w:sz w:val="25"/>
-        </w:rPr>
-        <w:t>reports/ch6_prevalence_projection.csv</w:t>
-      </w:r>
-      <w:r>
-        <w:rPr>
-          <w:rFonts w:ascii="Times New Roman" w:hAnsi="Times New Roman"/>
-          <w:b w:val="0"/>
-          <w:i w:val="0"/>
-          <w:color w:val="000000"/>
-          <w:sz w:val="26"/>
-        </w:rPr>
-        <w:t>, kết quả tính lại toàn bộ chỉ số của Chương 5 và phép quy chiếu Precision của Chương 6 từ nhãn thật cùng các tệp dự đoán đã lưu.</w:t>
-      </w:r>
-    </w:p>
-    <w:p>
-      <w:pPr>
-        <w:keepNext/>
-        <w:spacing w:before="160" w:after="60" w:line="276" w:lineRule="auto"/>
-        <w:ind w:firstLine="0"/>
-        <w:jc w:val="left"/>
-      </w:pPr>
-      <w:bookmarkStart w:id="1066" w:name="bm_h2_46"/>
-      <w:bookmarkEnd w:id="1066"/>
-      <w:r>
-        <w:rPr>
-          <w:rFonts w:ascii="Times New Roman" w:hAnsi="Times New Roman"/>
-          <w:b/>
-          <w:i w:val="0"/>
-          <w:color w:val="000000"/>
-          <w:sz w:val="26"/>
-        </w:rPr>
-        <w:t>Tài liệu tham khảo bên ngoài</w:t>
-      </w:r>
-    </w:p>
-    <w:p>
-      <w:pPr>
         <w:spacing w:before="40" w:after="60" w:line="276" w:lineRule="auto"/>
         <w:ind w:left="454" w:hanging="454"/>
-        <w:jc w:val="left"/>
+        <w:jc w:val="both"/>
       </w:pPr>
       <w:bookmarkStart w:id="1067" w:name="ref_1"/>
       <w:bookmarkEnd w:id="1067"/>
@@ -18727,9 +18124,9 @@
           <w:color w:val="000000"/>
           <w:sz w:val="23"/>
         </w:rPr>
-        <w:t xml:space="preserve">A. Abdallah, M. A. Maarof, and A. Zainal, “Fraud detection system: A survey,” Journal of Network and Computer Applications, vol. 68, pp. 90–113, 2016, doi: </w:t>
-      </w:r>
-      <w:hyperlink r:id="rId20">
+        <w:t xml:space="preserve">A. Abdallah, M. A. Maarof, and A. Zainal, “Fraud detection system: A survey,” Journal of Network and Computer Applications, vol. 68, pp. 90-113, 2016, doi: </w:t>
+      </w:r>
+      <w:hyperlink r:id="rId18">
         <w:r>
           <w:rPr>
             <w:rFonts w:ascii="Times New Roman" w:hAnsi="Times New Roman"/>
@@ -18745,7 +18142,7 @@
       <w:pPr>
         <w:spacing w:before="40" w:after="60" w:line="276" w:lineRule="auto"/>
         <w:ind w:left="454" w:hanging="454"/>
-        <w:jc w:val="left"/>
+        <w:jc w:val="both"/>
       </w:pPr>
       <w:bookmarkStart w:id="1068" w:name="ref_2"/>
       <w:bookmarkEnd w:id="1068"/>
@@ -18767,9 +18164,9 @@
           <w:color w:val="000000"/>
           <w:sz w:val="23"/>
         </w:rPr>
-        <w:t xml:space="preserve">E. A. Lopez-Rojas, A. Elmir, and S. Axelsson, “PaySim: A financial mobile money simulator for fraud detection,” in Proc. 28th European Modeling and Simulation Symposium, Larnaca, Cyprus, 2016, pp. 249–255. [Online]. Available: </w:t>
-      </w:r>
-      <w:hyperlink r:id="rId21">
+        <w:t xml:space="preserve">E. A. Lopez-Rojas, A. Elmir, and S. Axelsson, “PaySim: A financial mobile money simulator for fraud detection,” in Proc. 28th European Modeling and Simulation Symposium, Larnaca, Cyprus, 2016, pp. 249-255. [Online]. Available: </w:t>
+      </w:r>
+      <w:hyperlink r:id="rId19">
         <w:r>
           <w:rPr>
             <w:rFonts w:ascii="Times New Roman" w:hAnsi="Times New Roman"/>
@@ -18785,7 +18182,7 @@
       <w:pPr>
         <w:spacing w:before="40" w:after="60" w:line="276" w:lineRule="auto"/>
         <w:ind w:left="454" w:hanging="454"/>
-        <w:jc w:val="left"/>
+        <w:jc w:val="both"/>
       </w:pPr>
       <w:bookmarkStart w:id="1069" w:name="ref_3"/>
       <w:bookmarkEnd w:id="1069"/>
@@ -18809,7 +18206,7 @@
         </w:rPr>
         <w:t xml:space="preserve">E. Lopez-Rojas, “Synthetic Financial Datasets for Fraud Detection,” Kaggle. [Online]. Available: </w:t>
       </w:r>
-      <w:hyperlink r:id="rId22">
+      <w:hyperlink r:id="rId20">
         <w:r>
           <w:rPr>
             <w:rFonts w:ascii="Times New Roman" w:hAnsi="Times New Roman"/>
@@ -18835,7 +18232,7 @@
       <w:pPr>
         <w:spacing w:before="40" w:after="60" w:line="276" w:lineRule="auto"/>
         <w:ind w:left="454" w:hanging="454"/>
-        <w:jc w:val="left"/>
+        <w:jc w:val="both"/>
       </w:pPr>
       <w:bookmarkStart w:id="1070" w:name="ref_4"/>
       <w:bookmarkEnd w:id="1070"/>
@@ -18857,9 +18254,9 @@
           <w:color w:val="000000"/>
           <w:sz w:val="23"/>
         </w:rPr>
-        <w:t xml:space="preserve">N. V. Chawla, K. W. Bowyer, L. O. Hall, and W. P. Kegelmeyer, “SMOTE: Synthetic Minority Over-sampling Technique,” Journal of Artificial Intelligence Research, vol. 16, pp. 321–357, 2002, doi: </w:t>
-      </w:r>
-      <w:hyperlink r:id="rId23">
+        <w:t xml:space="preserve">N. V. Chawla, K. W. Bowyer, L. O. Hall, and W. P. Kegelmeyer, “SMOTE: Synthetic Minority Over-sampling Technique,” Journal of Artificial Intelligence Research, vol. 16, pp. 321-357, 2002, doi: </w:t>
+      </w:r>
+      <w:hyperlink r:id="rId21">
         <w:r>
           <w:rPr>
             <w:rFonts w:ascii="Times New Roman" w:hAnsi="Times New Roman"/>
@@ -18875,7 +18272,7 @@
       <w:pPr>
         <w:spacing w:before="40" w:after="60" w:line="276" w:lineRule="auto"/>
         <w:ind w:left="454" w:hanging="454"/>
-        <w:jc w:val="left"/>
+        <w:jc w:val="both"/>
       </w:pPr>
       <w:bookmarkStart w:id="1071" w:name="ref_5"/>
       <w:bookmarkEnd w:id="1071"/>
@@ -18897,9 +18294,9 @@
           <w:color w:val="000000"/>
           <w:sz w:val="23"/>
         </w:rPr>
-        <w:t xml:space="preserve">H. He, Y. Bai, E. A. Garcia, and S. Li, “ADASYN: Adaptive synthetic sampling approach for imbalanced learning,” in Proc. IEEE International Joint Conference on Neural Networks, Hong Kong, 2008, pp. 1322–1328, doi: </w:t>
-      </w:r>
-      <w:hyperlink r:id="rId24">
+        <w:t xml:space="preserve">H. He, Y. Bai, E. A. Garcia, and S. Li, “ADASYN: Adaptive synthetic sampling approach for imbalanced learning,” in Proc. IEEE International Joint Conference on Neural Networks, Hong Kong, 2008, pp. 1322-1328, doi: </w:t>
+      </w:r>
+      <w:hyperlink r:id="rId22">
         <w:r>
           <w:rPr>
             <w:rFonts w:ascii="Times New Roman" w:hAnsi="Times New Roman"/>
@@ -18915,7 +18312,7 @@
       <w:pPr>
         <w:spacing w:before="40" w:after="60" w:line="276" w:lineRule="auto"/>
         <w:ind w:left="454" w:hanging="454"/>
-        <w:jc w:val="left"/>
+        <w:jc w:val="both"/>
       </w:pPr>
       <w:bookmarkStart w:id="1072" w:name="ref_6"/>
       <w:bookmarkEnd w:id="1072"/>
@@ -18937,9 +18334,9 @@
           <w:color w:val="000000"/>
           <w:sz w:val="23"/>
         </w:rPr>
-        <w:t xml:space="preserve">L. Breiman, “Random Forests,” Machine Learning, vol. 45, no. 1, pp. 5–32, 2001, doi: </w:t>
-      </w:r>
-      <w:hyperlink r:id="rId25">
+        <w:t xml:space="preserve">L. Breiman, “Random Forests,” Machine Learning, vol. 45, no. 1, pp. 5-32, 2001, doi: </w:t>
+      </w:r>
+      <w:hyperlink r:id="rId23">
         <w:r>
           <w:rPr>
             <w:rFonts w:ascii="Times New Roman" w:hAnsi="Times New Roman"/>
@@ -18955,7 +18352,7 @@
       <w:pPr>
         <w:spacing w:before="40" w:after="60" w:line="276" w:lineRule="auto"/>
         <w:ind w:left="454" w:hanging="454"/>
-        <w:jc w:val="left"/>
+        <w:jc w:val="both"/>
       </w:pPr>
       <w:bookmarkStart w:id="1073" w:name="ref_7"/>
       <w:bookmarkEnd w:id="1073"/>
@@ -18977,9 +18374,9 @@
           <w:color w:val="000000"/>
           <w:sz w:val="23"/>
         </w:rPr>
-        <w:t xml:space="preserve">T. Chen and C. Guestrin, “XGBoost: A scalable tree boosting system,” in Proc. 22nd ACM SIGKDD International Conference on Knowledge Discovery and Data Mining, San Francisco, CA, USA, 2016, pp. 785–794, doi: </w:t>
-      </w:r>
-      <w:hyperlink r:id="rId26">
+        <w:t xml:space="preserve">T. Chen and C. Guestrin, “XGBoost: A scalable tree boosting system,” in Proc. 22nd ACM SIGKDD International Conference on Knowledge Discovery and Data Mining, San Francisco, CA, USA, 2016, pp. 785-794, doi: </w:t>
+      </w:r>
+      <w:hyperlink r:id="rId24">
         <w:r>
           <w:rPr>
             <w:rFonts w:ascii="Times New Roman" w:hAnsi="Times New Roman"/>
@@ -18995,7 +18392,7 @@
       <w:pPr>
         <w:spacing w:before="40" w:after="60" w:line="276" w:lineRule="auto"/>
         <w:ind w:left="454" w:hanging="454"/>
-        <w:jc w:val="left"/>
+        <w:jc w:val="both"/>
       </w:pPr>
       <w:bookmarkStart w:id="1074" w:name="ref_8"/>
       <w:bookmarkEnd w:id="1074"/>
@@ -19017,9 +18414,9 @@
           <w:color w:val="000000"/>
           <w:sz w:val="23"/>
         </w:rPr>
-        <w:t xml:space="preserve">G. E. Hinton and R. R. Salakhutdinov, “Reducing the dimensionality of data with neural networks,” Science, vol. 313, no. 5786, pp. 504–507, 2006, doi: </w:t>
-      </w:r>
-      <w:hyperlink r:id="rId27">
+        <w:t xml:space="preserve">G. E. Hinton and R. R. Salakhutdinov, “Reducing the dimensionality of data with neural networks,” Science, vol. 313, no. 5786, pp. 504-507, 2006, doi: </w:t>
+      </w:r>
+      <w:hyperlink r:id="rId25">
         <w:r>
           <w:rPr>
             <w:rFonts w:ascii="Times New Roman" w:hAnsi="Times New Roman"/>

</xml_diff>

<commit_message>
fix(phase07): update heading formatting and add windows docx2pdf support (#34)
Cập nhật cỡ chữ và khoảng cách tiêu đề. Thêm hỗ trợ xuất PDF bằng
docx2pdf cho môi trường Windows.
</commit_message>
<xml_diff>
--- a/draft/fraud-detection/reports/[Nhom9]_BaoCao_FraudDetection.docx
+++ b/draft/fraud-detection/reports/[Nhom9]_BaoCao_FraudDetection.docx
@@ -133,7 +133,7 @@
           <w:color w:val="000000"/>
           <w:sz w:val="27"/>
         </w:rPr>
-        <w:t>HỆ THỐNG PHÁT HIỆN GIAO DỊCH TÀI CHÍNH BẤT THƯỜNG VÀ NGHI VẤN GIAN LẬN</w:t>
+        <w:t>"HỆ THỐNG PHÁT HIỆN GIAO DỊCH TÀI CHÍNH BẤT THƯỜNG VÀ NGHI VẤN GIAN LẬN"</w:t>
       </w:r>
     </w:p>
     <w:tbl>
@@ -341,7 +341,7 @@
     <w:p>
       <w:pPr>
         <w:tabs>
-          <w:tab w:pos="8957" w:val="right" w:leader="dot"/>
+          <w:tab w:pos="9071" w:val="right" w:leader="dot"/>
         </w:tabs>
         <w:spacing w:before="60" w:after="40" w:line="300" w:lineRule="auto"/>
       </w:pPr>
@@ -364,15 +364,14 @@
             <w:b/>
             <w:color w:val="000000"/>
           </w:rPr>
-          <w:tab/>
-          <w:t xml:space="preserve">1</w:t>
+          <w:t xml:space="preserve">	1</w:t>
         </w:r>
       </w:hyperlink>
     </w:p>
     <w:p>
       <w:pPr>
         <w:tabs>
-          <w:tab w:pos="8957" w:val="right" w:leader="dot"/>
+          <w:tab w:pos="9071" w:val="right" w:leader="dot"/>
         </w:tabs>
         <w:spacing w:before="60" w:after="40" w:line="300" w:lineRule="auto"/>
       </w:pPr>
@@ -395,15 +394,14 @@
             <w:b/>
             <w:color w:val="000000"/>
           </w:rPr>
-          <w:tab/>
-          <w:t xml:space="preserve">2</w:t>
+          <w:t xml:space="preserve">	2</w:t>
         </w:r>
       </w:hyperlink>
     </w:p>
     <w:p>
       <w:pPr>
         <w:tabs>
-          <w:tab w:pos="8617" w:val="right" w:leader="dot"/>
+          <w:tab w:pos="9071" w:val="right" w:leader="dot"/>
         </w:tabs>
         <w:spacing w:before="20" w:after="40" w:line="300" w:lineRule="auto"/>
         <w:ind w:left="340"/>
@@ -425,15 +423,14 @@
             <w:sz w:val="23"/>
             <w:color w:val="000000"/>
           </w:rPr>
-          <w:tab/>
-          <w:t xml:space="preserve">2</w:t>
+          <w:t xml:space="preserve">	2</w:t>
         </w:r>
       </w:hyperlink>
     </w:p>
     <w:p>
       <w:pPr>
         <w:tabs>
-          <w:tab w:pos="8617" w:val="right" w:leader="dot"/>
+          <w:tab w:pos="9071" w:val="right" w:leader="dot"/>
         </w:tabs>
         <w:spacing w:before="20" w:after="40" w:line="300" w:lineRule="auto"/>
         <w:ind w:left="340"/>
@@ -455,15 +452,14 @@
             <w:sz w:val="23"/>
             <w:color w:val="000000"/>
           </w:rPr>
-          <w:tab/>
-          <w:t xml:space="preserve">3</w:t>
+          <w:t xml:space="preserve">	2</w:t>
         </w:r>
       </w:hyperlink>
     </w:p>
     <w:p>
       <w:pPr>
         <w:tabs>
-          <w:tab w:pos="8617" w:val="right" w:leader="dot"/>
+          <w:tab w:pos="9071" w:val="right" w:leader="dot"/>
         </w:tabs>
         <w:spacing w:before="20" w:after="40" w:line="300" w:lineRule="auto"/>
         <w:ind w:left="340"/>
@@ -485,15 +481,14 @@
             <w:sz w:val="23"/>
             <w:color w:val="000000"/>
           </w:rPr>
-          <w:tab/>
-          <w:t xml:space="preserve">3</w:t>
+          <w:t xml:space="preserve">	2</w:t>
         </w:r>
       </w:hyperlink>
     </w:p>
     <w:p>
       <w:pPr>
         <w:tabs>
-          <w:tab w:pos="8277" w:val="right" w:leader="dot"/>
+          <w:tab w:pos="9071" w:val="right" w:leader="dot"/>
         </w:tabs>
         <w:spacing w:before="20" w:after="40" w:line="300" w:lineRule="auto"/>
         <w:ind w:left="680"/>
@@ -515,15 +510,14 @@
             <w:sz w:val="23"/>
             <w:color w:val="000000"/>
           </w:rPr>
-          <w:tab/>
-          <w:t xml:space="preserve">3</w:t>
+          <w:t xml:space="preserve">	3</w:t>
         </w:r>
       </w:hyperlink>
     </w:p>
     <w:p>
       <w:pPr>
         <w:tabs>
-          <w:tab w:pos="8277" w:val="right" w:leader="dot"/>
+          <w:tab w:pos="9071" w:val="right" w:leader="dot"/>
         </w:tabs>
         <w:spacing w:before="20" w:after="40" w:line="300" w:lineRule="auto"/>
         <w:ind w:left="680"/>
@@ -545,15 +539,14 @@
             <w:sz w:val="23"/>
             <w:color w:val="000000"/>
           </w:rPr>
-          <w:tab/>
-          <w:t xml:space="preserve">4</w:t>
+          <w:t xml:space="preserve">	3</w:t>
         </w:r>
       </w:hyperlink>
     </w:p>
     <w:p>
       <w:pPr>
         <w:tabs>
-          <w:tab w:pos="8617" w:val="right" w:leader="dot"/>
+          <w:tab w:pos="9071" w:val="right" w:leader="dot"/>
         </w:tabs>
         <w:spacing w:before="20" w:after="40" w:line="300" w:lineRule="auto"/>
         <w:ind w:left="340"/>
@@ -575,15 +568,14 @@
             <w:sz w:val="23"/>
             <w:color w:val="000000"/>
           </w:rPr>
-          <w:tab/>
-          <w:t xml:space="preserve">4</w:t>
+          <w:t xml:space="preserve">	4</w:t>
         </w:r>
       </w:hyperlink>
     </w:p>
     <w:p>
       <w:pPr>
         <w:tabs>
-          <w:tab w:pos="8617" w:val="right" w:leader="dot"/>
+          <w:tab w:pos="9071" w:val="right" w:leader="dot"/>
         </w:tabs>
         <w:spacing w:before="20" w:after="40" w:line="300" w:lineRule="auto"/>
         <w:ind w:left="340"/>
@@ -605,15 +597,14 @@
             <w:sz w:val="23"/>
             <w:color w:val="000000"/>
           </w:rPr>
-          <w:tab/>
-          <w:t xml:space="preserve">5</w:t>
+          <w:t xml:space="preserve">	4</w:t>
         </w:r>
       </w:hyperlink>
     </w:p>
     <w:p>
       <w:pPr>
         <w:tabs>
-          <w:tab w:pos="8957" w:val="right" w:leader="dot"/>
+          <w:tab w:pos="9071" w:val="right" w:leader="dot"/>
         </w:tabs>
         <w:spacing w:before="60" w:after="40" w:line="300" w:lineRule="auto"/>
       </w:pPr>
@@ -636,15 +627,14 @@
             <w:b/>
             <w:color w:val="000000"/>
           </w:rPr>
-          <w:tab/>
-          <w:t xml:space="preserve">5</w:t>
+          <w:t xml:space="preserve">	5</w:t>
         </w:r>
       </w:hyperlink>
     </w:p>
     <w:p>
       <w:pPr>
         <w:tabs>
-          <w:tab w:pos="8617" w:val="right" w:leader="dot"/>
+          <w:tab w:pos="9071" w:val="right" w:leader="dot"/>
         </w:tabs>
         <w:spacing w:before="20" w:after="40" w:line="300" w:lineRule="auto"/>
         <w:ind w:left="340"/>
@@ -666,15 +656,14 @@
             <w:sz w:val="23"/>
             <w:color w:val="000000"/>
           </w:rPr>
-          <w:tab/>
-          <w:t xml:space="preserve">5</w:t>
+          <w:t xml:space="preserve">	5</w:t>
         </w:r>
       </w:hyperlink>
     </w:p>
     <w:p>
       <w:pPr>
         <w:tabs>
-          <w:tab w:pos="8617" w:val="right" w:leader="dot"/>
+          <w:tab w:pos="9071" w:val="right" w:leader="dot"/>
         </w:tabs>
         <w:spacing w:before="20" w:after="40" w:line="300" w:lineRule="auto"/>
         <w:ind w:left="340"/>
@@ -696,15 +685,14 @@
             <w:sz w:val="23"/>
             <w:color w:val="000000"/>
           </w:rPr>
-          <w:tab/>
-          <w:t xml:space="preserve">5</w:t>
+          <w:t xml:space="preserve">	5</w:t>
         </w:r>
       </w:hyperlink>
     </w:p>
     <w:p>
       <w:pPr>
         <w:tabs>
-          <w:tab w:pos="8617" w:val="right" w:leader="dot"/>
+          <w:tab w:pos="9071" w:val="right" w:leader="dot"/>
         </w:tabs>
         <w:spacing w:before="20" w:after="40" w:line="300" w:lineRule="auto"/>
         <w:ind w:left="340"/>
@@ -726,15 +714,14 @@
             <w:sz w:val="23"/>
             <w:color w:val="000000"/>
           </w:rPr>
-          <w:tab/>
-          <w:t xml:space="preserve">6</w:t>
+          <w:t xml:space="preserve">	6</w:t>
         </w:r>
       </w:hyperlink>
     </w:p>
     <w:p>
       <w:pPr>
         <w:tabs>
-          <w:tab w:pos="8277" w:val="right" w:leader="dot"/>
+          <w:tab w:pos="9071" w:val="right" w:leader="dot"/>
         </w:tabs>
         <w:spacing w:before="20" w:after="40" w:line="300" w:lineRule="auto"/>
         <w:ind w:left="680"/>
@@ -756,15 +743,14 @@
             <w:sz w:val="23"/>
             <w:color w:val="000000"/>
           </w:rPr>
-          <w:tab/>
-          <w:t xml:space="preserve">6</w:t>
+          <w:t xml:space="preserve">	6</w:t>
         </w:r>
       </w:hyperlink>
     </w:p>
     <w:p>
       <w:pPr>
         <w:tabs>
-          <w:tab w:pos="8277" w:val="right" w:leader="dot"/>
+          <w:tab w:pos="9071" w:val="right" w:leader="dot"/>
         </w:tabs>
         <w:spacing w:before="20" w:after="40" w:line="300" w:lineRule="auto"/>
         <w:ind w:left="680"/>
@@ -786,15 +772,14 @@
             <w:sz w:val="23"/>
             <w:color w:val="000000"/>
           </w:rPr>
-          <w:tab/>
-          <w:t xml:space="preserve">6</w:t>
+          <w:t xml:space="preserve">	6</w:t>
         </w:r>
       </w:hyperlink>
     </w:p>
     <w:p>
       <w:pPr>
         <w:tabs>
-          <w:tab w:pos="8277" w:val="right" w:leader="dot"/>
+          <w:tab w:pos="9071" w:val="right" w:leader="dot"/>
         </w:tabs>
         <w:spacing w:before="20" w:after="40" w:line="300" w:lineRule="auto"/>
         <w:ind w:left="680"/>
@@ -816,15 +801,14 @@
             <w:sz w:val="23"/>
             <w:color w:val="000000"/>
           </w:rPr>
-          <w:tab/>
-          <w:t xml:space="preserve">6</w:t>
+          <w:t xml:space="preserve">	6</w:t>
         </w:r>
       </w:hyperlink>
     </w:p>
     <w:p>
       <w:pPr>
         <w:tabs>
-          <w:tab w:pos="8277" w:val="right" w:leader="dot"/>
+          <w:tab w:pos="9071" w:val="right" w:leader="dot"/>
         </w:tabs>
         <w:spacing w:before="20" w:after="40" w:line="300" w:lineRule="auto"/>
         <w:ind w:left="680"/>
@@ -846,15 +830,14 @@
             <w:sz w:val="23"/>
             <w:color w:val="000000"/>
           </w:rPr>
-          <w:tab/>
-          <w:t xml:space="preserve">6</w:t>
+          <w:t xml:space="preserve">	6</w:t>
         </w:r>
       </w:hyperlink>
     </w:p>
     <w:p>
       <w:pPr>
         <w:tabs>
-          <w:tab w:pos="8617" w:val="right" w:leader="dot"/>
+          <w:tab w:pos="9071" w:val="right" w:leader="dot"/>
         </w:tabs>
         <w:spacing w:before="20" w:after="40" w:line="300" w:lineRule="auto"/>
         <w:ind w:left="340"/>
@@ -876,15 +859,14 @@
             <w:sz w:val="23"/>
             <w:color w:val="000000"/>
           </w:rPr>
-          <w:tab/>
-          <w:t xml:space="preserve">6</w:t>
+          <w:t xml:space="preserve">	6</w:t>
         </w:r>
       </w:hyperlink>
     </w:p>
     <w:p>
       <w:pPr>
         <w:tabs>
-          <w:tab w:pos="8617" w:val="right" w:leader="dot"/>
+          <w:tab w:pos="9071" w:val="right" w:leader="dot"/>
         </w:tabs>
         <w:spacing w:before="20" w:after="40" w:line="300" w:lineRule="auto"/>
         <w:ind w:left="340"/>
@@ -906,15 +888,14 @@
             <w:sz w:val="23"/>
             <w:color w:val="000000"/>
           </w:rPr>
-          <w:tab/>
-          <w:t xml:space="preserve">7</w:t>
+          <w:t xml:space="preserve">	7</w:t>
         </w:r>
       </w:hyperlink>
     </w:p>
     <w:p>
       <w:pPr>
         <w:tabs>
-          <w:tab w:pos="8957" w:val="right" w:leader="dot"/>
+          <w:tab w:pos="9071" w:val="right" w:leader="dot"/>
         </w:tabs>
         <w:spacing w:before="60" w:after="40" w:line="300" w:lineRule="auto"/>
       </w:pPr>
@@ -937,15 +918,14 @@
             <w:b/>
             <w:color w:val="000000"/>
           </w:rPr>
-          <w:tab/>
-          <w:t xml:space="preserve">7</w:t>
+          <w:t xml:space="preserve">	7</w:t>
         </w:r>
       </w:hyperlink>
     </w:p>
     <w:p>
       <w:pPr>
         <w:tabs>
-          <w:tab w:pos="8617" w:val="right" w:leader="dot"/>
+          <w:tab w:pos="9071" w:val="right" w:leader="dot"/>
         </w:tabs>
         <w:spacing w:before="20" w:after="40" w:line="300" w:lineRule="auto"/>
         <w:ind w:left="340"/>
@@ -967,15 +947,14 @@
             <w:sz w:val="23"/>
             <w:color w:val="000000"/>
           </w:rPr>
-          <w:tab/>
-          <w:t xml:space="preserve">7</w:t>
+          <w:t xml:space="preserve">	7</w:t>
         </w:r>
       </w:hyperlink>
     </w:p>
     <w:p>
       <w:pPr>
         <w:tabs>
-          <w:tab w:pos="8617" w:val="right" w:leader="dot"/>
+          <w:tab w:pos="9071" w:val="right" w:leader="dot"/>
         </w:tabs>
         <w:spacing w:before="20" w:after="40" w:line="300" w:lineRule="auto"/>
         <w:ind w:left="340"/>
@@ -997,15 +976,14 @@
             <w:sz w:val="23"/>
             <w:color w:val="000000"/>
           </w:rPr>
-          <w:tab/>
-          <w:t xml:space="preserve">8</w:t>
+          <w:t xml:space="preserve">	7</w:t>
         </w:r>
       </w:hyperlink>
     </w:p>
     <w:p>
       <w:pPr>
         <w:tabs>
-          <w:tab w:pos="8617" w:val="right" w:leader="dot"/>
+          <w:tab w:pos="9071" w:val="right" w:leader="dot"/>
         </w:tabs>
         <w:spacing w:before="20" w:after="40" w:line="300" w:lineRule="auto"/>
         <w:ind w:left="340"/>
@@ -1027,15 +1005,14 @@
             <w:sz w:val="23"/>
             <w:color w:val="000000"/>
           </w:rPr>
-          <w:tab/>
-          <w:t xml:space="preserve">8</w:t>
+          <w:t xml:space="preserve">	7</w:t>
         </w:r>
       </w:hyperlink>
     </w:p>
     <w:p>
       <w:pPr>
         <w:tabs>
-          <w:tab w:pos="8617" w:val="right" w:leader="dot"/>
+          <w:tab w:pos="9071" w:val="right" w:leader="dot"/>
         </w:tabs>
         <w:spacing w:before="20" w:after="40" w:line="300" w:lineRule="auto"/>
         <w:ind w:left="340"/>
@@ -1057,15 +1034,14 @@
             <w:sz w:val="23"/>
             <w:color w:val="000000"/>
           </w:rPr>
-          <w:tab/>
-          <w:t xml:space="preserve">9</w:t>
+          <w:t xml:space="preserve">	9</w:t>
         </w:r>
       </w:hyperlink>
     </w:p>
     <w:p>
       <w:pPr>
         <w:tabs>
-          <w:tab w:pos="8617" w:val="right" w:leader="dot"/>
+          <w:tab w:pos="9071" w:val="right" w:leader="dot"/>
         </w:tabs>
         <w:spacing w:before="20" w:after="40" w:line="300" w:lineRule="auto"/>
         <w:ind w:left="340"/>
@@ -1087,15 +1063,14 @@
             <w:sz w:val="23"/>
             <w:color w:val="000000"/>
           </w:rPr>
-          <w:tab/>
-          <w:t xml:space="preserve">9</w:t>
+          <w:t xml:space="preserve">	9</w:t>
         </w:r>
       </w:hyperlink>
     </w:p>
     <w:p>
       <w:pPr>
         <w:tabs>
-          <w:tab w:pos="8617" w:val="right" w:leader="dot"/>
+          <w:tab w:pos="9071" w:val="right" w:leader="dot"/>
         </w:tabs>
         <w:spacing w:before="20" w:after="40" w:line="300" w:lineRule="auto"/>
         <w:ind w:left="340"/>
@@ -1117,15 +1092,14 @@
             <w:sz w:val="23"/>
             <w:color w:val="000000"/>
           </w:rPr>
-          <w:tab/>
-          <w:t xml:space="preserve">10</w:t>
+          <w:t xml:space="preserve">	9</w:t>
         </w:r>
       </w:hyperlink>
     </w:p>
     <w:p>
       <w:pPr>
         <w:tabs>
-          <w:tab w:pos="8277" w:val="right" w:leader="dot"/>
+          <w:tab w:pos="9071" w:val="right" w:leader="dot"/>
         </w:tabs>
         <w:spacing w:before="20" w:after="40" w:line="300" w:lineRule="auto"/>
         <w:ind w:left="680"/>
@@ -1147,15 +1121,14 @@
             <w:sz w:val="23"/>
             <w:color w:val="000000"/>
           </w:rPr>
-          <w:tab/>
-          <w:t xml:space="preserve">10</w:t>
+          <w:t xml:space="preserve">	9</w:t>
         </w:r>
       </w:hyperlink>
     </w:p>
     <w:p>
       <w:pPr>
         <w:tabs>
-          <w:tab w:pos="8277" w:val="right" w:leader="dot"/>
+          <w:tab w:pos="9071" w:val="right" w:leader="dot"/>
         </w:tabs>
         <w:spacing w:before="20" w:after="40" w:line="300" w:lineRule="auto"/>
         <w:ind w:left="680"/>
@@ -1177,15 +1150,14 @@
             <w:sz w:val="23"/>
             <w:color w:val="000000"/>
           </w:rPr>
-          <w:tab/>
-          <w:t xml:space="preserve">10</w:t>
+          <w:t xml:space="preserve">	9</w:t>
         </w:r>
       </w:hyperlink>
     </w:p>
     <w:p>
       <w:pPr>
         <w:tabs>
-          <w:tab w:pos="8277" w:val="right" w:leader="dot"/>
+          <w:tab w:pos="9071" w:val="right" w:leader="dot"/>
         </w:tabs>
         <w:spacing w:before="20" w:after="40" w:line="300" w:lineRule="auto"/>
         <w:ind w:left="680"/>
@@ -1207,15 +1179,14 @@
             <w:sz w:val="23"/>
             <w:color w:val="000000"/>
           </w:rPr>
-          <w:tab/>
-          <w:t xml:space="preserve">10</w:t>
+          <w:t xml:space="preserve">	9</w:t>
         </w:r>
       </w:hyperlink>
     </w:p>
     <w:p>
       <w:pPr>
         <w:tabs>
-          <w:tab w:pos="8277" w:val="right" w:leader="dot"/>
+          <w:tab w:pos="9071" w:val="right" w:leader="dot"/>
         </w:tabs>
         <w:spacing w:before="20" w:after="40" w:line="300" w:lineRule="auto"/>
         <w:ind w:left="680"/>
@@ -1237,15 +1208,14 @@
             <w:sz w:val="23"/>
             <w:color w:val="000000"/>
           </w:rPr>
-          <w:tab/>
-          <w:t xml:space="preserve">10</w:t>
+          <w:t xml:space="preserve">	9</w:t>
         </w:r>
       </w:hyperlink>
     </w:p>
     <w:p>
       <w:pPr>
         <w:tabs>
-          <w:tab w:pos="8277" w:val="right" w:leader="dot"/>
+          <w:tab w:pos="9071" w:val="right" w:leader="dot"/>
         </w:tabs>
         <w:spacing w:before="20" w:after="40" w:line="300" w:lineRule="auto"/>
         <w:ind w:left="680"/>
@@ -1267,15 +1237,14 @@
             <w:sz w:val="23"/>
             <w:color w:val="000000"/>
           </w:rPr>
-          <w:tab/>
-          <w:t xml:space="preserve">11</w:t>
+          <w:t xml:space="preserve">	11</w:t>
         </w:r>
       </w:hyperlink>
     </w:p>
     <w:p>
       <w:pPr>
         <w:tabs>
-          <w:tab w:pos="8617" w:val="right" w:leader="dot"/>
+          <w:tab w:pos="9071" w:val="right" w:leader="dot"/>
         </w:tabs>
         <w:spacing w:before="20" w:after="40" w:line="300" w:lineRule="auto"/>
         <w:ind w:left="340"/>
@@ -1297,15 +1266,14 @@
             <w:sz w:val="23"/>
             <w:color w:val="000000"/>
           </w:rPr>
-          <w:tab/>
-          <w:t xml:space="preserve">11</w:t>
+          <w:t xml:space="preserve">	11</w:t>
         </w:r>
       </w:hyperlink>
     </w:p>
     <w:p>
       <w:pPr>
         <w:tabs>
-          <w:tab w:pos="8957" w:val="right" w:leader="dot"/>
+          <w:tab w:pos="9071" w:val="right" w:leader="dot"/>
         </w:tabs>
         <w:spacing w:before="60" w:after="40" w:line="300" w:lineRule="auto"/>
       </w:pPr>
@@ -1328,15 +1296,14 @@
             <w:b/>
             <w:color w:val="000000"/>
           </w:rPr>
-          <w:tab/>
-          <w:t xml:space="preserve">11</w:t>
+          <w:t xml:space="preserve">	12</w:t>
         </w:r>
       </w:hyperlink>
     </w:p>
     <w:p>
       <w:pPr>
         <w:tabs>
-          <w:tab w:pos="8617" w:val="right" w:leader="dot"/>
+          <w:tab w:pos="9071" w:val="right" w:leader="dot"/>
         </w:tabs>
         <w:spacing w:before="20" w:after="40" w:line="300" w:lineRule="auto"/>
         <w:ind w:left="340"/>
@@ -1358,15 +1325,14 @@
             <w:sz w:val="23"/>
             <w:color w:val="000000"/>
           </w:rPr>
-          <w:tab/>
-          <w:t xml:space="preserve">11</w:t>
+          <w:t xml:space="preserve">	12</w:t>
         </w:r>
       </w:hyperlink>
     </w:p>
     <w:p>
       <w:pPr>
         <w:tabs>
-          <w:tab w:pos="8617" w:val="right" w:leader="dot"/>
+          <w:tab w:pos="9071" w:val="right" w:leader="dot"/>
         </w:tabs>
         <w:spacing w:before="20" w:after="40" w:line="300" w:lineRule="auto"/>
         <w:ind w:left="340"/>
@@ -1388,15 +1354,14 @@
             <w:sz w:val="23"/>
             <w:color w:val="000000"/>
           </w:rPr>
-          <w:tab/>
-          <w:t xml:space="preserve">12</w:t>
+          <w:t xml:space="preserve">	12</w:t>
         </w:r>
       </w:hyperlink>
     </w:p>
     <w:p>
       <w:pPr>
         <w:tabs>
-          <w:tab w:pos="8617" w:val="right" w:leader="dot"/>
+          <w:tab w:pos="9071" w:val="right" w:leader="dot"/>
         </w:tabs>
         <w:spacing w:before="20" w:after="40" w:line="300" w:lineRule="auto"/>
         <w:ind w:left="340"/>
@@ -1418,15 +1383,14 @@
             <w:sz w:val="23"/>
             <w:color w:val="000000"/>
           </w:rPr>
-          <w:tab/>
-          <w:t xml:space="preserve">12</w:t>
+          <w:t xml:space="preserve">	12</w:t>
         </w:r>
       </w:hyperlink>
     </w:p>
     <w:p>
       <w:pPr>
         <w:tabs>
-          <w:tab w:pos="8617" w:val="right" w:leader="dot"/>
+          <w:tab w:pos="9071" w:val="right" w:leader="dot"/>
         </w:tabs>
         <w:spacing w:before="20" w:after="40" w:line="300" w:lineRule="auto"/>
         <w:ind w:left="340"/>
@@ -1448,15 +1412,14 @@
             <w:sz w:val="23"/>
             <w:color w:val="000000"/>
           </w:rPr>
-          <w:tab/>
-          <w:t xml:space="preserve">13</w:t>
+          <w:t xml:space="preserve">	13</w:t>
         </w:r>
       </w:hyperlink>
     </w:p>
     <w:p>
       <w:pPr>
         <w:tabs>
-          <w:tab w:pos="8617" w:val="right" w:leader="dot"/>
+          <w:tab w:pos="9071" w:val="right" w:leader="dot"/>
         </w:tabs>
         <w:spacing w:before="20" w:after="40" w:line="300" w:lineRule="auto"/>
         <w:ind w:left="340"/>
@@ -1478,15 +1441,14 @@
             <w:sz w:val="23"/>
             <w:color w:val="000000"/>
           </w:rPr>
-          <w:tab/>
-          <w:t xml:space="preserve">13</w:t>
+          <w:t xml:space="preserve">	14</w:t>
         </w:r>
       </w:hyperlink>
     </w:p>
     <w:p>
       <w:pPr>
         <w:tabs>
-          <w:tab w:pos="8617" w:val="right" w:leader="dot"/>
+          <w:tab w:pos="9071" w:val="right" w:leader="dot"/>
         </w:tabs>
         <w:spacing w:before="20" w:after="40" w:line="300" w:lineRule="auto"/>
         <w:ind w:left="340"/>
@@ -1508,15 +1470,14 @@
             <w:sz w:val="23"/>
             <w:color w:val="000000"/>
           </w:rPr>
-          <w:tab/>
-          <w:t xml:space="preserve">13</w:t>
+          <w:t xml:space="preserve">	14</w:t>
         </w:r>
       </w:hyperlink>
     </w:p>
     <w:p>
       <w:pPr>
         <w:tabs>
-          <w:tab w:pos="8617" w:val="right" w:leader="dot"/>
+          <w:tab w:pos="9071" w:val="right" w:leader="dot"/>
         </w:tabs>
         <w:spacing w:before="20" w:after="40" w:line="300" w:lineRule="auto"/>
         <w:ind w:left="340"/>
@@ -1538,15 +1499,14 @@
             <w:sz w:val="23"/>
             <w:color w:val="000000"/>
           </w:rPr>
-          <w:tab/>
-          <w:t xml:space="preserve">14</w:t>
+          <w:t xml:space="preserve">	15</w:t>
         </w:r>
       </w:hyperlink>
     </w:p>
     <w:p>
       <w:pPr>
         <w:tabs>
-          <w:tab w:pos="8617" w:val="right" w:leader="dot"/>
+          <w:tab w:pos="9071" w:val="right" w:leader="dot"/>
         </w:tabs>
         <w:spacing w:before="20" w:after="40" w:line="300" w:lineRule="auto"/>
         <w:ind w:left="340"/>
@@ -1568,15 +1528,14 @@
             <w:sz w:val="23"/>
             <w:color w:val="000000"/>
           </w:rPr>
-          <w:tab/>
-          <w:t xml:space="preserve">15</w:t>
+          <w:t xml:space="preserve">	15</w:t>
         </w:r>
       </w:hyperlink>
     </w:p>
     <w:p>
       <w:pPr>
         <w:tabs>
-          <w:tab w:pos="8617" w:val="right" w:leader="dot"/>
+          <w:tab w:pos="9071" w:val="right" w:leader="dot"/>
         </w:tabs>
         <w:spacing w:before="20" w:after="40" w:line="300" w:lineRule="auto"/>
         <w:ind w:left="340"/>
@@ -1598,15 +1557,14 @@
             <w:sz w:val="23"/>
             <w:color w:val="000000"/>
           </w:rPr>
-          <w:tab/>
-          <w:t xml:space="preserve">15</w:t>
+          <w:t xml:space="preserve">	15</w:t>
         </w:r>
       </w:hyperlink>
     </w:p>
     <w:p>
       <w:pPr>
         <w:tabs>
-          <w:tab w:pos="8957" w:val="right" w:leader="dot"/>
+          <w:tab w:pos="9071" w:val="right" w:leader="dot"/>
         </w:tabs>
         <w:spacing w:before="60" w:after="40" w:line="300" w:lineRule="auto"/>
       </w:pPr>
@@ -1629,15 +1587,14 @@
             <w:b/>
             <w:color w:val="000000"/>
           </w:rPr>
-          <w:tab/>
-          <w:t xml:space="preserve">15</w:t>
+          <w:t xml:space="preserve">	15</w:t>
         </w:r>
       </w:hyperlink>
     </w:p>
     <w:p>
       <w:pPr>
         <w:tabs>
-          <w:tab w:pos="8617" w:val="right" w:leader="dot"/>
+          <w:tab w:pos="9071" w:val="right" w:leader="dot"/>
         </w:tabs>
         <w:spacing w:before="20" w:after="40" w:line="300" w:lineRule="auto"/>
         <w:ind w:left="340"/>
@@ -1659,15 +1616,14 @@
             <w:sz w:val="23"/>
             <w:color w:val="000000"/>
           </w:rPr>
-          <w:tab/>
-          <w:t xml:space="preserve">15</w:t>
+          <w:t xml:space="preserve">	16</w:t>
         </w:r>
       </w:hyperlink>
     </w:p>
     <w:p>
       <w:pPr>
         <w:tabs>
-          <w:tab w:pos="8617" w:val="right" w:leader="dot"/>
+          <w:tab w:pos="9071" w:val="right" w:leader="dot"/>
         </w:tabs>
         <w:spacing w:before="20" w:after="40" w:line="300" w:lineRule="auto"/>
         <w:ind w:left="340"/>
@@ -1689,15 +1645,14 @@
             <w:sz w:val="23"/>
             <w:color w:val="000000"/>
           </w:rPr>
-          <w:tab/>
-          <w:t xml:space="preserve">16</w:t>
+          <w:t xml:space="preserve">	16</w:t>
         </w:r>
       </w:hyperlink>
     </w:p>
     <w:p>
       <w:pPr>
         <w:tabs>
-          <w:tab w:pos="8617" w:val="right" w:leader="dot"/>
+          <w:tab w:pos="9071" w:val="right" w:leader="dot"/>
         </w:tabs>
         <w:spacing w:before="20" w:after="40" w:line="300" w:lineRule="auto"/>
         <w:ind w:left="340"/>
@@ -1719,15 +1674,14 @@
             <w:sz w:val="23"/>
             <w:color w:val="000000"/>
           </w:rPr>
-          <w:tab/>
-          <w:t xml:space="preserve">18</w:t>
+          <w:t xml:space="preserve">	17</w:t>
         </w:r>
       </w:hyperlink>
     </w:p>
     <w:p>
       <w:pPr>
         <w:tabs>
-          <w:tab w:pos="8617" w:val="right" w:leader="dot"/>
+          <w:tab w:pos="9071" w:val="right" w:leader="dot"/>
         </w:tabs>
         <w:spacing w:before="20" w:after="40" w:line="300" w:lineRule="auto"/>
         <w:ind w:left="340"/>
@@ -1749,15 +1703,14 @@
             <w:sz w:val="23"/>
             <w:color w:val="000000"/>
           </w:rPr>
-          <w:tab/>
-          <w:t xml:space="preserve">19</w:t>
+          <w:t xml:space="preserve">	18</w:t>
         </w:r>
       </w:hyperlink>
     </w:p>
     <w:p>
       <w:pPr>
         <w:tabs>
-          <w:tab w:pos="8617" w:val="right" w:leader="dot"/>
+          <w:tab w:pos="9071" w:val="right" w:leader="dot"/>
         </w:tabs>
         <w:spacing w:before="20" w:after="40" w:line="300" w:lineRule="auto"/>
         <w:ind w:left="340"/>
@@ -1779,15 +1732,14 @@
             <w:sz w:val="23"/>
             <w:color w:val="000000"/>
           </w:rPr>
-          <w:tab/>
-          <w:t xml:space="preserve">19</w:t>
+          <w:t xml:space="preserve">	19</w:t>
         </w:r>
       </w:hyperlink>
     </w:p>
     <w:p>
       <w:pPr>
         <w:tabs>
-          <w:tab w:pos="8617" w:val="right" w:leader="dot"/>
+          <w:tab w:pos="9071" w:val="right" w:leader="dot"/>
         </w:tabs>
         <w:spacing w:before="20" w:after="40" w:line="300" w:lineRule="auto"/>
         <w:ind w:left="340"/>
@@ -1809,15 +1761,14 @@
             <w:sz w:val="23"/>
             <w:color w:val="000000"/>
           </w:rPr>
-          <w:tab/>
-          <w:t xml:space="preserve">21</w:t>
+          <w:t xml:space="preserve">	21</w:t>
         </w:r>
       </w:hyperlink>
     </w:p>
     <w:p>
       <w:pPr>
         <w:tabs>
-          <w:tab w:pos="8957" w:val="right" w:leader="dot"/>
+          <w:tab w:pos="9071" w:val="right" w:leader="dot"/>
         </w:tabs>
         <w:spacing w:before="60" w:after="40" w:line="300" w:lineRule="auto"/>
       </w:pPr>
@@ -1840,15 +1791,14 @@
             <w:b/>
             <w:color w:val="000000"/>
           </w:rPr>
-          <w:tab/>
-          <w:t xml:space="preserve">21</w:t>
+          <w:t xml:space="preserve">	21</w:t>
         </w:r>
       </w:hyperlink>
     </w:p>
     <w:p>
       <w:pPr>
         <w:tabs>
-          <w:tab w:pos="8617" w:val="right" w:leader="dot"/>
+          <w:tab w:pos="9071" w:val="right" w:leader="dot"/>
         </w:tabs>
         <w:spacing w:before="20" w:after="40" w:line="300" w:lineRule="auto"/>
         <w:ind w:left="340"/>
@@ -1870,15 +1820,14 @@
             <w:sz w:val="23"/>
             <w:color w:val="000000"/>
           </w:rPr>
-          <w:tab/>
-          <w:t xml:space="preserve">21</w:t>
+          <w:t xml:space="preserve">	21</w:t>
         </w:r>
       </w:hyperlink>
     </w:p>
     <w:p>
       <w:pPr>
         <w:tabs>
-          <w:tab w:pos="8617" w:val="right" w:leader="dot"/>
+          <w:tab w:pos="9071" w:val="right" w:leader="dot"/>
         </w:tabs>
         <w:spacing w:before="20" w:after="40" w:line="300" w:lineRule="auto"/>
         <w:ind w:left="340"/>
@@ -1900,15 +1849,14 @@
             <w:sz w:val="23"/>
             <w:color w:val="000000"/>
           </w:rPr>
-          <w:tab/>
-          <w:t xml:space="preserve">22</w:t>
+          <w:t xml:space="preserve">	21</w:t>
         </w:r>
       </w:hyperlink>
     </w:p>
     <w:p>
       <w:pPr>
         <w:tabs>
-          <w:tab w:pos="8617" w:val="right" w:leader="dot"/>
+          <w:tab w:pos="9071" w:val="right" w:leader="dot"/>
         </w:tabs>
         <w:spacing w:before="20" w:after="40" w:line="300" w:lineRule="auto"/>
         <w:ind w:left="340"/>
@@ -1930,15 +1878,14 @@
             <w:sz w:val="23"/>
             <w:color w:val="000000"/>
           </w:rPr>
-          <w:tab/>
-          <w:t xml:space="preserve">23</w:t>
+          <w:t xml:space="preserve">	21</w:t>
         </w:r>
       </w:hyperlink>
     </w:p>
     <w:p>
       <w:pPr>
         <w:tabs>
-          <w:tab w:pos="8617" w:val="right" w:leader="dot"/>
+          <w:tab w:pos="9071" w:val="right" w:leader="dot"/>
         </w:tabs>
         <w:spacing w:before="20" w:after="40" w:line="300" w:lineRule="auto"/>
         <w:ind w:left="340"/>
@@ -1960,15 +1907,14 @@
             <w:sz w:val="23"/>
             <w:color w:val="000000"/>
           </w:rPr>
-          <w:tab/>
-          <w:t xml:space="preserve">23</w:t>
+          <w:t xml:space="preserve">	23</w:t>
         </w:r>
       </w:hyperlink>
     </w:p>
     <w:p>
       <w:pPr>
         <w:tabs>
-          <w:tab w:pos="8617" w:val="right" w:leader="dot"/>
+          <w:tab w:pos="9071" w:val="right" w:leader="dot"/>
         </w:tabs>
         <w:spacing w:before="20" w:after="40" w:line="300" w:lineRule="auto"/>
         <w:ind w:left="340"/>
@@ -1990,15 +1936,14 @@
             <w:sz w:val="23"/>
             <w:color w:val="000000"/>
           </w:rPr>
-          <w:tab/>
-          <w:t xml:space="preserve">24</w:t>
+          <w:t xml:space="preserve">	24</w:t>
         </w:r>
       </w:hyperlink>
     </w:p>
     <w:p>
       <w:pPr>
         <w:tabs>
-          <w:tab w:pos="8617" w:val="right" w:leader="dot"/>
+          <w:tab w:pos="9071" w:val="right" w:leader="dot"/>
         </w:tabs>
         <w:spacing w:before="20" w:after="40" w:line="300" w:lineRule="auto"/>
         <w:ind w:left="340"/>
@@ -2020,15 +1965,14 @@
             <w:sz w:val="23"/>
             <w:color w:val="000000"/>
           </w:rPr>
-          <w:tab/>
-          <w:t xml:space="preserve">24</w:t>
+          <w:t xml:space="preserve">	24</w:t>
         </w:r>
       </w:hyperlink>
     </w:p>
     <w:p>
       <w:pPr>
         <w:tabs>
-          <w:tab w:pos="8617" w:val="right" w:leader="dot"/>
+          <w:tab w:pos="9071" w:val="right" w:leader="dot"/>
         </w:tabs>
         <w:spacing w:before="20" w:after="40" w:line="300" w:lineRule="auto"/>
         <w:ind w:left="340"/>
@@ -2050,15 +1994,14 @@
             <w:sz w:val="23"/>
             <w:color w:val="000000"/>
           </w:rPr>
-          <w:tab/>
-          <w:t xml:space="preserve">25</w:t>
+          <w:t xml:space="preserve">	25</w:t>
         </w:r>
       </w:hyperlink>
     </w:p>
     <w:p>
       <w:pPr>
         <w:tabs>
-          <w:tab w:pos="8957" w:val="right" w:leader="dot"/>
+          <w:tab w:pos="9071" w:val="right" w:leader="dot"/>
         </w:tabs>
         <w:spacing w:before="60" w:after="40" w:line="300" w:lineRule="auto"/>
       </w:pPr>
@@ -2081,15 +2024,14 @@
             <w:b/>
             <w:color w:val="000000"/>
           </w:rPr>
-          <w:tab/>
-          <w:t xml:space="preserve">25</w:t>
+          <w:t xml:space="preserve">	25</w:t>
         </w:r>
       </w:hyperlink>
     </w:p>
     <w:p>
       <w:pPr>
         <w:tabs>
-          <w:tab w:pos="8617" w:val="right" w:leader="dot"/>
+          <w:tab w:pos="9071" w:val="right" w:leader="dot"/>
         </w:tabs>
         <w:spacing w:before="20" w:after="40" w:line="300" w:lineRule="auto"/>
         <w:ind w:left="340"/>
@@ -2111,15 +2053,14 @@
             <w:sz w:val="23"/>
             <w:color w:val="000000"/>
           </w:rPr>
-          <w:tab/>
-          <w:t xml:space="preserve">25</w:t>
+          <w:t xml:space="preserve">	25</w:t>
         </w:r>
       </w:hyperlink>
     </w:p>
     <w:p>
       <w:pPr>
         <w:tabs>
-          <w:tab w:pos="8617" w:val="right" w:leader="dot"/>
+          <w:tab w:pos="9071" w:val="right" w:leader="dot"/>
         </w:tabs>
         <w:spacing w:before="20" w:after="40" w:line="300" w:lineRule="auto"/>
         <w:ind w:left="340"/>
@@ -2141,15 +2082,14 @@
             <w:sz w:val="23"/>
             <w:color w:val="000000"/>
           </w:rPr>
-          <w:tab/>
-          <w:t xml:space="preserve">25</w:t>
+          <w:t xml:space="preserve">	25</w:t>
         </w:r>
       </w:hyperlink>
     </w:p>
     <w:p>
       <w:pPr>
         <w:tabs>
-          <w:tab w:pos="8617" w:val="right" w:leader="dot"/>
+          <w:tab w:pos="9071" w:val="right" w:leader="dot"/>
         </w:tabs>
         <w:spacing w:before="20" w:after="40" w:line="300" w:lineRule="auto"/>
         <w:ind w:left="340"/>
@@ -2171,15 +2111,14 @@
             <w:sz w:val="23"/>
             <w:color w:val="000000"/>
           </w:rPr>
-          <w:tab/>
-          <w:t xml:space="preserve">26</w:t>
+          <w:t xml:space="preserve">	25</w:t>
         </w:r>
       </w:hyperlink>
     </w:p>
     <w:p>
       <w:pPr>
         <w:tabs>
-          <w:tab w:pos="8617" w:val="right" w:leader="dot"/>
+          <w:tab w:pos="9071" w:val="right" w:leader="dot"/>
         </w:tabs>
         <w:spacing w:before="20" w:after="40" w:line="300" w:lineRule="auto"/>
         <w:ind w:left="340"/>
@@ -2201,15 +2140,14 @@
             <w:sz w:val="23"/>
             <w:color w:val="000000"/>
           </w:rPr>
-          <w:tab/>
-          <w:t xml:space="preserve">27</w:t>
+          <w:t xml:space="preserve">	27</w:t>
         </w:r>
       </w:hyperlink>
     </w:p>
     <w:p>
       <w:pPr>
         <w:tabs>
-          <w:tab w:pos="8617" w:val="right" w:leader="dot"/>
+          <w:tab w:pos="9071" w:val="right" w:leader="dot"/>
         </w:tabs>
         <w:spacing w:before="20" w:after="40" w:line="300" w:lineRule="auto"/>
         <w:ind w:left="340"/>
@@ -2231,15 +2169,14 @@
             <w:sz w:val="23"/>
             <w:color w:val="000000"/>
           </w:rPr>
-          <w:tab/>
-          <w:t xml:space="preserve">27</w:t>
+          <w:t xml:space="preserve">	27</w:t>
         </w:r>
       </w:hyperlink>
     </w:p>
     <w:p>
       <w:pPr>
         <w:tabs>
-          <w:tab w:pos="8957" w:val="right" w:leader="dot"/>
+          <w:tab w:pos="9071" w:val="right" w:leader="dot"/>
         </w:tabs>
         <w:spacing w:before="60" w:after="40" w:line="300" w:lineRule="auto"/>
       </w:pPr>
@@ -2262,15 +2199,14 @@
             <w:b/>
             <w:color w:val="000000"/>
           </w:rPr>
-          <w:tab/>
-          <w:t xml:space="preserve">27</w:t>
+          <w:t xml:space="preserve">	28</w:t>
         </w:r>
       </w:hyperlink>
     </w:p>
     <w:p>
       <w:pPr>
         <w:tabs>
-          <w:tab w:pos="8617" w:val="right" w:leader="dot"/>
+          <w:tab w:pos="9071" w:val="right" w:leader="dot"/>
         </w:tabs>
         <w:spacing w:before="20" w:after="40" w:line="300" w:lineRule="auto"/>
         <w:ind w:left="340"/>
@@ -2292,15 +2228,14 @@
             <w:sz w:val="23"/>
             <w:color w:val="000000"/>
           </w:rPr>
-          <w:tab/>
-          <w:t xml:space="preserve">28</w:t>
+          <w:t xml:space="preserve">	28</w:t>
         </w:r>
       </w:hyperlink>
     </w:p>
     <w:p>
       <w:pPr>
         <w:tabs>
-          <w:tab w:pos="8617" w:val="right" w:leader="dot"/>
+          <w:tab w:pos="9071" w:val="right" w:leader="dot"/>
         </w:tabs>
         <w:spacing w:before="20" w:after="40" w:line="300" w:lineRule="auto"/>
         <w:ind w:left="340"/>
@@ -2322,8 +2257,7 @@
             <w:sz w:val="23"/>
             <w:color w:val="000000"/>
           </w:rPr>
-          <w:tab/>
-          <w:t xml:space="preserve">28</w:t>
+          <w:t xml:space="preserve">	28</w:t>
         </w:r>
       </w:hyperlink>
     </w:p>
@@ -2354,9 +2288,9 @@
     <w:p>
       <w:pPr>
         <w:keepNext/>
-        <w:spacing w:before="240" w:after="80" w:line="276" w:lineRule="auto"/>
+        <w:spacing w:before="480" w:after="240" w:line="276" w:lineRule="auto"/>
         <w:ind w:firstLine="0"/>
-        <w:jc w:val="left"/>
+        <w:jc w:val="center"/>
       </w:pPr>
       <w:bookmarkStart w:id="1001" w:name="bm_h1_1"/>
       <w:bookmarkEnd w:id="1001"/>
@@ -2366,7 +2300,7 @@
           <w:b/>
           <w:i w:val="0"/>
           <w:color w:val="000000"/>
-          <w:sz w:val="27"/>
+          <w:sz w:val="30"/>
         </w:rPr>
         <w:t>TÓM TẮT</w:t>
       </w:r>
@@ -2492,30 +2426,30 @@
     <w:p>
       <w:pPr>
         <w:keepNext/>
-        <w:spacing w:before="240" w:after="80" w:line="276" w:lineRule="auto"/>
+        <w:spacing w:before="480" w:after="240" w:line="276" w:lineRule="auto"/>
+        <w:ind w:firstLine="0"/>
+        <w:jc w:val="center"/>
+      </w:pPr>
+      <w:bookmarkStart w:id="1002" w:name="bm_h1_2"/>
+      <w:bookmarkEnd w:id="1002"/>
+      <w:r>
+        <w:rPr>
+          <w:rFonts w:ascii="Times New Roman" w:hAnsi="Times New Roman"/>
+          <w:b/>
+          <w:i w:val="0"/>
+          <w:color w:val="000000"/>
+          <w:sz w:val="30"/>
+        </w:rPr>
+        <w:t>CHƯƠNG 1. GIỚI THIỆU</w:t>
+      </w:r>
+    </w:p>
+    <w:p>
+      <w:pPr>
+        <w:keepNext/>
+        <w:spacing w:before="360" w:after="120" w:line="276" w:lineRule="auto"/>
         <w:ind w:firstLine="0"/>
         <w:jc w:val="left"/>
       </w:pPr>
-      <w:bookmarkStart w:id="1002" w:name="bm_h1_2"/>
-      <w:bookmarkEnd w:id="1002"/>
-      <w:r>
-        <w:rPr>
-          <w:rFonts w:ascii="Times New Roman" w:hAnsi="Times New Roman"/>
-          <w:b/>
-          <w:i w:val="0"/>
-          <w:color w:val="000000"/>
-          <w:sz w:val="27"/>
-        </w:rPr>
-        <w:t>CHƯƠNG 1. GIỚI THIỆU</w:t>
-      </w:r>
-    </w:p>
-    <w:p>
-      <w:pPr>
-        <w:keepNext/>
-        <w:spacing w:before="160" w:after="60" w:line="276" w:lineRule="auto"/>
-        <w:ind w:firstLine="0"/>
-        <w:jc w:val="left"/>
-      </w:pPr>
       <w:bookmarkStart w:id="1003" w:name="bm_h2_1"/>
       <w:bookmarkEnd w:id="1003"/>
       <w:r>
@@ -2524,7 +2458,7 @@
           <w:b/>
           <w:i w:val="0"/>
           <w:color w:val="000000"/>
-          <w:sz w:val="26"/>
+          <w:sz w:val="28"/>
         </w:rPr>
         <w:t>1.1. Bối cảnh</w:t>
       </w:r>
@@ -2646,7 +2580,7 @@
     <w:p>
       <w:pPr>
         <w:keepNext/>
-        <w:spacing w:before="160" w:after="60" w:line="276" w:lineRule="auto"/>
+        <w:spacing w:before="360" w:after="120" w:line="276" w:lineRule="auto"/>
         <w:ind w:firstLine="0"/>
         <w:jc w:val="left"/>
       </w:pPr>
@@ -2658,7 +2592,7 @@
           <w:b/>
           <w:i w:val="0"/>
           <w:color w:val="000000"/>
-          <w:sz w:val="26"/>
+          <w:sz w:val="28"/>
         </w:rPr>
         <w:t>1.2. Lý do chọn đề tài</w:t>
       </w:r>
@@ -2677,59 +2611,27 @@
           <w:color w:val="000000"/>
           <w:sz w:val="26"/>
         </w:rPr>
-        <w:t>Đề tài “Hệ thống phát hiện giao dịch tài chính bất thường và nghi vấn gian lận” kết hợp nhiều nội dung quan trọng của môn Trí tuệ Nhân tạo: biểu diễn dữ liệu, tiền xử lý, học có giám sát, phát hiện bất thường, xử lý dữ liệu mất cân bằng và đánh giá mô hình. Đây cũng là bài toán có ý nghĩa thực tiễn rõ ràng vì quyết định của mô hình liên quan trực tiếp đến hai loại rủi ro:</w:t>
-      </w:r>
-    </w:p>
-    <w:p>
-      <w:pPr>
-        <w:spacing w:before="20" w:after="40" w:line="300" w:lineRule="auto"/>
-        <w:ind w:left="720" w:hanging="283"/>
-        <w:jc w:val="left"/>
-      </w:pPr>
+        <w:t xml:space="preserve">Đề tài “Hệ thống phát hiện giao dịch tài chính bất thường và nghi vấn gian lận” kết hợp nhiều nội dung quan trọng của môn Trí tuệ Nhân tạo: biểu diễn dữ liệu, tiền xử lý, học có giám sát, phát hiện bất thường, xử lý dữ liệu mất cân bằng và đánh giá mô hình. Đây cũng là bài toán có ý nghĩa thực tiễn rõ ràng vì quyết định của mô hình liên quan trực tiếp đến hai loại rủi ro: - </w:t>
+      </w:r>
       <w:r>
         <w:rPr>
           <w:rFonts w:ascii="Times New Roman" w:hAnsi="Times New Roman"/>
           <w:b/>
+          <w:i w:val="0"/>
           <w:color w:val="000000"/>
           <w:sz w:val="26"/>
         </w:rPr>
-        <w:t xml:space="preserve">-  </w:t>
-      </w:r>
-      <w:r>
-        <w:rPr>
-          <w:rFonts w:ascii="Times New Roman" w:hAnsi="Times New Roman"/>
-          <w:b/>
+        <w:t>False Negative:</w:t>
+      </w:r>
+      <w:r>
+        <w:rPr>
+          <w:rFonts w:ascii="Times New Roman" w:hAnsi="Times New Roman"/>
+          <w:b w:val="0"/>
           <w:i w:val="0"/>
           <w:color w:val="000000"/>
           <w:sz w:val="26"/>
         </w:rPr>
-        <w:t>False Negative:</w:t>
-      </w:r>
-      <w:r>
-        <w:rPr>
-          <w:rFonts w:ascii="Times New Roman" w:hAnsi="Times New Roman"/>
-          <w:b w:val="0"/>
-          <w:i w:val="0"/>
-          <w:color w:val="000000"/>
-          <w:sz w:val="26"/>
-        </w:rPr>
-        <w:t xml:space="preserve"> giao dịch gian lận không được phát hiện, có thể gây thiệt hại tài chính.</w:t>
-      </w:r>
-    </w:p>
-    <w:p>
-      <w:pPr>
-        <w:spacing w:before="20" w:after="40" w:line="300" w:lineRule="auto"/>
-        <w:ind w:left="720" w:hanging="283"/>
-        <w:jc w:val="left"/>
-      </w:pPr>
-      <w:r>
-        <w:rPr>
-          <w:rFonts w:ascii="Times New Roman" w:hAnsi="Times New Roman"/>
-          <w:b/>
-          <w:color w:val="000000"/>
-          <w:sz w:val="26"/>
-        </w:rPr>
-        <w:t xml:space="preserve">-  </w:t>
+        <w:t xml:space="preserve"> giao dịch gian lận không được phát hiện, có thể gây thiệt hại tài chính. - </w:t>
       </w:r>
       <w:r>
         <w:rPr>
@@ -2772,7 +2674,7 @@
     <w:p>
       <w:pPr>
         <w:keepNext/>
-        <w:spacing w:before="160" w:after="60" w:line="276" w:lineRule="auto"/>
+        <w:spacing w:before="360" w:after="120" w:line="276" w:lineRule="auto"/>
         <w:ind w:firstLine="0"/>
         <w:jc w:val="left"/>
       </w:pPr>
@@ -2784,7 +2686,7 @@
           <w:b/>
           <w:i w:val="0"/>
           <w:color w:val="000000"/>
-          <w:sz w:val="26"/>
+          <w:sz w:val="28"/>
         </w:rPr>
         <w:t>1.3. Mục tiêu đề tài</w:t>
       </w:r>
@@ -2792,7 +2694,7 @@
     <w:p>
       <w:pPr>
         <w:keepNext/>
-        <w:spacing w:before="120" w:after="40" w:line="276" w:lineRule="auto"/>
+        <w:spacing w:before="240" w:after="120" w:line="276" w:lineRule="auto"/>
         <w:ind w:firstLine="0"/>
         <w:jc w:val="left"/>
       </w:pPr>
@@ -2829,7 +2731,7 @@
     <w:p>
       <w:pPr>
         <w:keepNext/>
-        <w:spacing w:before="120" w:after="40" w:line="276" w:lineRule="auto"/>
+        <w:spacing w:before="240" w:after="120" w:line="276" w:lineRule="auto"/>
         <w:ind w:firstLine="0"/>
         <w:jc w:val="left"/>
       </w:pPr>
@@ -2850,7 +2752,7 @@
       <w:pPr>
         <w:spacing w:before="20" w:after="40" w:line="300" w:lineRule="auto"/>
         <w:ind w:left="720" w:hanging="283"/>
-        <w:jc w:val="left"/>
+        <w:jc w:val="both"/>
       </w:pPr>
       <w:r>
         <w:rPr>
@@ -2876,7 +2778,7 @@
       <w:pPr>
         <w:spacing w:before="20" w:after="40" w:line="300" w:lineRule="auto"/>
         <w:ind w:left="720" w:hanging="283"/>
-        <w:jc w:val="left"/>
+        <w:jc w:val="both"/>
       </w:pPr>
       <w:r>
         <w:rPr>
@@ -2902,7 +2804,7 @@
       <w:pPr>
         <w:spacing w:before="20" w:after="40" w:line="300" w:lineRule="auto"/>
         <w:ind w:left="720" w:hanging="283"/>
-        <w:jc w:val="left"/>
+        <w:jc w:val="both"/>
       </w:pPr>
       <w:r>
         <w:rPr>
@@ -2928,7 +2830,7 @@
       <w:pPr>
         <w:spacing w:before="20" w:after="40" w:line="300" w:lineRule="auto"/>
         <w:ind w:left="720" w:hanging="283"/>
-        <w:jc w:val="left"/>
+        <w:jc w:val="both"/>
       </w:pPr>
       <w:r>
         <w:rPr>
@@ -2954,7 +2856,7 @@
       <w:pPr>
         <w:spacing w:before="20" w:after="40" w:line="300" w:lineRule="auto"/>
         <w:ind w:left="720" w:hanging="283"/>
-        <w:jc w:val="left"/>
+        <w:jc w:val="both"/>
       </w:pPr>
       <w:r>
         <w:rPr>
@@ -2980,7 +2882,7 @@
       <w:pPr>
         <w:spacing w:before="20" w:after="40" w:line="300" w:lineRule="auto"/>
         <w:ind w:left="720" w:hanging="283"/>
-        <w:jc w:val="left"/>
+        <w:jc w:val="both"/>
       </w:pPr>
       <w:r>
         <w:rPr>
@@ -3006,7 +2908,7 @@
       <w:pPr>
         <w:spacing w:before="20" w:after="40" w:line="300" w:lineRule="auto"/>
         <w:ind w:left="720" w:hanging="283"/>
-        <w:jc w:val="left"/>
+        <w:jc w:val="both"/>
       </w:pPr>
       <w:r>
         <w:rPr>
@@ -3042,13 +2944,13 @@
           <w:color w:val="000000"/>
           <w:sz w:val="24"/>
         </w:rPr>
-        <w:t>Báo cáo đã trình bày quy trình tiền xử lý, xử lý mất cân bằng và cả ba họ mô hình. Các kết luận thực nghiệm được giới hạn trong tập kiểm tra PaySim đã xử lý, không suy rộng sang dữ liệu giao dịch thực tế.</w:t>
+        <w:t>Bản nháp hiện tại đã mô tả quy trình tiền xử lý, xử lý mất cân bằng và ba họ mô hình. Các kết luận thực nghiệm vẫn được giới hạn trong tập kiểm tra PaySim đã xử lý và sẽ được rà soát lại trước khi hoàn thiện báo cáo cuối.</w:t>
       </w:r>
     </w:p>
     <w:p>
       <w:pPr>
         <w:keepNext/>
-        <w:spacing w:before="160" w:after="60" w:line="276" w:lineRule="auto"/>
+        <w:spacing w:before="360" w:after="120" w:line="276" w:lineRule="auto"/>
         <w:ind w:firstLine="0"/>
         <w:jc w:val="left"/>
       </w:pPr>
@@ -3060,7 +2962,7 @@
           <w:b/>
           <w:i w:val="0"/>
           <w:color w:val="000000"/>
-          <w:sz w:val="26"/>
+          <w:sz w:val="28"/>
         </w:rPr>
         <w:t>1.4. Đối tượng và phạm vi nghiên cứu</w:t>
       </w:r>
@@ -3069,7 +2971,7 @@
       <w:pPr>
         <w:spacing w:before="20" w:after="40" w:line="300" w:lineRule="auto"/>
         <w:ind w:left="720" w:hanging="283"/>
-        <w:jc w:val="left"/>
+        <w:jc w:val="both"/>
       </w:pPr>
       <w:r>
         <w:rPr>
@@ -3105,7 +3007,7 @@
       <w:pPr>
         <w:spacing w:before="20" w:after="40" w:line="300" w:lineRule="auto"/>
         <w:ind w:left="720" w:hanging="283"/>
-        <w:jc w:val="left"/>
+        <w:jc w:val="both"/>
       </w:pPr>
       <w:r>
         <w:rPr>
@@ -3181,7 +3083,7 @@
       <w:pPr>
         <w:spacing w:before="20" w:after="40" w:line="300" w:lineRule="auto"/>
         <w:ind w:left="720" w:hanging="283"/>
-        <w:jc w:val="left"/>
+        <w:jc w:val="both"/>
       </w:pPr>
       <w:r>
         <w:rPr>
@@ -3257,7 +3159,7 @@
       <w:pPr>
         <w:spacing w:before="20" w:after="40" w:line="300" w:lineRule="auto"/>
         <w:ind w:left="720" w:hanging="283"/>
-        <w:jc w:val="left"/>
+        <w:jc w:val="both"/>
       </w:pPr>
       <w:r>
         <w:rPr>
@@ -3293,7 +3195,7 @@
       <w:pPr>
         <w:spacing w:before="20" w:after="40" w:line="300" w:lineRule="auto"/>
         <w:ind w:left="720" w:hanging="283"/>
-        <w:jc w:val="left"/>
+        <w:jc w:val="both"/>
       </w:pPr>
       <w:r>
         <w:rPr>
@@ -3329,7 +3231,7 @@
       <w:pPr>
         <w:spacing w:before="20" w:after="40" w:line="300" w:lineRule="auto"/>
         <w:ind w:left="720" w:hanging="283"/>
-        <w:jc w:val="left"/>
+        <w:jc w:val="both"/>
       </w:pPr>
       <w:r>
         <w:rPr>
@@ -3364,7 +3266,7 @@
     <w:p>
       <w:pPr>
         <w:keepNext/>
-        <w:spacing w:before="160" w:after="60" w:line="276" w:lineRule="auto"/>
+        <w:spacing w:before="360" w:after="120" w:line="276" w:lineRule="auto"/>
         <w:ind w:firstLine="0"/>
         <w:jc w:val="left"/>
       </w:pPr>
@@ -3376,7 +3278,7 @@
           <w:b/>
           <w:i w:val="0"/>
           <w:color w:val="000000"/>
-          <w:sz w:val="26"/>
+          <w:sz w:val="28"/>
         </w:rPr>
         <w:t>1.5. Cấu trúc báo cáo dự kiến</w:t>
       </w:r>
@@ -3385,7 +3287,7 @@
       <w:pPr>
         <w:spacing w:before="20" w:after="40" w:line="300" w:lineRule="auto"/>
         <w:ind w:left="720" w:hanging="283"/>
-        <w:jc w:val="left"/>
+        <w:jc w:val="both"/>
       </w:pPr>
       <w:r>
         <w:rPr>
@@ -3411,7 +3313,7 @@
       <w:pPr>
         <w:spacing w:before="20" w:after="40" w:line="300" w:lineRule="auto"/>
         <w:ind w:left="720" w:hanging="283"/>
-        <w:jc w:val="left"/>
+        <w:jc w:val="both"/>
       </w:pPr>
       <w:r>
         <w:rPr>
@@ -3437,7 +3339,7 @@
       <w:pPr>
         <w:spacing w:before="20" w:after="40" w:line="300" w:lineRule="auto"/>
         <w:ind w:left="720" w:hanging="283"/>
-        <w:jc w:val="left"/>
+        <w:jc w:val="both"/>
       </w:pPr>
       <w:r>
         <w:rPr>
@@ -3463,7 +3365,7 @@
       <w:pPr>
         <w:spacing w:before="20" w:after="40" w:line="300" w:lineRule="auto"/>
         <w:ind w:left="720" w:hanging="283"/>
-        <w:jc w:val="left"/>
+        <w:jc w:val="both"/>
       </w:pPr>
       <w:r>
         <w:rPr>
@@ -3489,7 +3391,7 @@
       <w:pPr>
         <w:spacing w:before="20" w:after="40" w:line="300" w:lineRule="auto"/>
         <w:ind w:left="720" w:hanging="283"/>
-        <w:jc w:val="left"/>
+        <w:jc w:val="both"/>
       </w:pPr>
       <w:r>
         <w:rPr>
@@ -3515,7 +3417,7 @@
       <w:pPr>
         <w:spacing w:before="20" w:after="40" w:line="300" w:lineRule="auto"/>
         <w:ind w:left="720" w:hanging="283"/>
-        <w:jc w:val="left"/>
+        <w:jc w:val="both"/>
       </w:pPr>
       <w:r>
         <w:rPr>
@@ -3541,7 +3443,7 @@
       <w:pPr>
         <w:spacing w:before="20" w:after="40" w:line="300" w:lineRule="auto"/>
         <w:ind w:left="720" w:hanging="283"/>
-        <w:jc w:val="left"/>
+        <w:jc w:val="both"/>
       </w:pPr>
       <w:r>
         <w:rPr>
@@ -3567,7 +3469,7 @@
       <w:pPr>
         <w:spacing w:before="20" w:after="40" w:line="300" w:lineRule="auto"/>
         <w:ind w:left="720" w:hanging="283"/>
-        <w:jc w:val="left"/>
+        <w:jc w:val="both"/>
       </w:pPr>
       <w:r>
         <w:rPr>
@@ -3592,30 +3494,30 @@
     <w:p>
       <w:pPr>
         <w:keepNext/>
-        <w:spacing w:before="240" w:after="80" w:line="276" w:lineRule="auto"/>
+        <w:spacing w:before="480" w:after="240" w:line="276" w:lineRule="auto"/>
+        <w:ind w:firstLine="0"/>
+        <w:jc w:val="center"/>
+      </w:pPr>
+      <w:bookmarkStart w:id="1010" w:name="bm_h1_3"/>
+      <w:bookmarkEnd w:id="1010"/>
+      <w:r>
+        <w:rPr>
+          <w:rFonts w:ascii="Times New Roman" w:hAnsi="Times New Roman"/>
+          <w:b/>
+          <w:i w:val="0"/>
+          <w:color w:val="000000"/>
+          <w:sz w:val="30"/>
+        </w:rPr>
+        <w:t>CHƯƠNG 2. PHÁT BIỂU BÀI TOÁN</w:t>
+      </w:r>
+    </w:p>
+    <w:p>
+      <w:pPr>
+        <w:keepNext/>
+        <w:spacing w:before="360" w:after="120" w:line="276" w:lineRule="auto"/>
         <w:ind w:firstLine="0"/>
         <w:jc w:val="left"/>
       </w:pPr>
-      <w:bookmarkStart w:id="1010" w:name="bm_h1_3"/>
-      <w:bookmarkEnd w:id="1010"/>
-      <w:r>
-        <w:rPr>
-          <w:rFonts w:ascii="Times New Roman" w:hAnsi="Times New Roman"/>
-          <w:b/>
-          <w:i w:val="0"/>
-          <w:color w:val="000000"/>
-          <w:sz w:val="27"/>
-        </w:rPr>
-        <w:t>CHƯƠNG 2. PHÁT BIỂU BÀI TOÁN</w:t>
-      </w:r>
-    </w:p>
-    <w:p>
-      <w:pPr>
-        <w:keepNext/>
-        <w:spacing w:before="160" w:after="60" w:line="276" w:lineRule="auto"/>
-        <w:ind w:firstLine="0"/>
-        <w:jc w:val="left"/>
-      </w:pPr>
       <w:bookmarkStart w:id="1011" w:name="bm_h2_6"/>
       <w:bookmarkEnd w:id="1011"/>
       <w:r>
@@ -3624,7 +3526,7 @@
           <w:b/>
           <w:i w:val="0"/>
           <w:color w:val="000000"/>
-          <w:sz w:val="26"/>
+          <w:sz w:val="28"/>
         </w:rPr>
         <w:t>2.1. Mô tả bài toán</w:t>
       </w:r>
@@ -3643,59 +3545,7 @@
           <w:color w:val="000000"/>
           <w:sz w:val="26"/>
         </w:rPr>
-        <w:t>Cho tập dữ liệu giao dịch tài chính, mỗi giao dịch được biểu diễn bởi vector đặc trưng $x$. Mục tiêu là xây dựng hàm dự đoán $f(x)$ trả về một trong hai nhãn:</w:t>
-      </w:r>
-    </w:p>
-    <w:p>
-      <w:pPr>
-        <w:spacing w:before="20" w:after="40" w:line="300" w:lineRule="auto"/>
-        <w:ind w:left="720" w:hanging="283"/>
-        <w:jc w:val="left"/>
-      </w:pPr>
-      <w:r>
-        <w:rPr>
-          <w:rFonts w:ascii="Times New Roman" w:hAnsi="Times New Roman"/>
-          <w:b/>
-          <w:color w:val="000000"/>
-          <w:sz w:val="26"/>
-        </w:rPr>
-        <w:t xml:space="preserve">-  </w:t>
-      </w:r>
-      <w:r>
-        <w:rPr>
-          <w:rFonts w:ascii="Times New Roman" w:hAnsi="Times New Roman"/>
-          <w:b w:val="0"/>
-          <w:i w:val="0"/>
-          <w:color w:val="000000"/>
-          <w:sz w:val="26"/>
-        </w:rPr>
-        <w:t>$f(x) = 0$: giao dịch hợp lệ.</w:t>
-      </w:r>
-    </w:p>
-    <w:p>
-      <w:pPr>
-        <w:spacing w:before="20" w:after="40" w:line="300" w:lineRule="auto"/>
-        <w:ind w:left="720" w:hanging="283"/>
-        <w:jc w:val="left"/>
-      </w:pPr>
-      <w:r>
-        <w:rPr>
-          <w:rFonts w:ascii="Times New Roman" w:hAnsi="Times New Roman"/>
-          <w:b/>
-          <w:color w:val="000000"/>
-          <w:sz w:val="26"/>
-        </w:rPr>
-        <w:t xml:space="preserve">-  </w:t>
-      </w:r>
-      <w:r>
-        <w:rPr>
-          <w:rFonts w:ascii="Times New Roman" w:hAnsi="Times New Roman"/>
-          <w:b w:val="0"/>
-          <w:i w:val="0"/>
-          <w:color w:val="000000"/>
-          <w:sz w:val="26"/>
-        </w:rPr>
-        <w:t>$f(x) = 1$: giao dịch gian lận.</w:t>
+        <w:t>Cho tập dữ liệu giao dịch tài chính, mỗi giao dịch được biểu diễn bởi vector đặc trưng $x$. Mục tiêu là xây dựng hàm dự đoán $f(x)$ trả về một trong hai nhãn: - $f(x) = 0$: giao dịch hợp lệ. - $f(x) = 1$: giao dịch gian lận.</w:t>
       </w:r>
     </w:p>
     <w:p>
@@ -3755,7 +3605,7 @@
     <w:p>
       <w:pPr>
         <w:keepNext/>
-        <w:spacing w:before="160" w:after="60" w:line="276" w:lineRule="auto"/>
+        <w:spacing w:before="360" w:after="120" w:line="276" w:lineRule="auto"/>
         <w:ind w:firstLine="0"/>
         <w:jc w:val="left"/>
       </w:pPr>
@@ -3767,7 +3617,7 @@
           <w:b/>
           <w:i w:val="0"/>
           <w:color w:val="000000"/>
-          <w:sz w:val="26"/>
+          <w:sz w:val="28"/>
         </w:rPr>
         <w:t>2.2. Đầu vào và đầu ra</w:t>
       </w:r>
@@ -3775,7 +3625,7 @@
     <w:p>
       <w:pPr>
         <w:keepNext/>
-        <w:spacing w:before="120" w:after="40" w:line="276" w:lineRule="auto"/>
+        <w:spacing w:before="240" w:after="120" w:line="276" w:lineRule="auto"/>
         <w:ind w:firstLine="0"/>
         <w:jc w:val="left"/>
       </w:pPr>
@@ -3811,7 +3661,7 @@
       <w:pPr>
         <w:spacing w:before="20" w:after="40" w:line="300" w:lineRule="auto"/>
         <w:ind w:left="720" w:hanging="283"/>
-        <w:jc w:val="left"/>
+        <w:jc w:val="both"/>
       </w:pPr>
       <w:r>
         <w:rPr>
@@ -3857,7 +3707,7 @@
       <w:pPr>
         <w:spacing w:before="20" w:after="40" w:line="300" w:lineRule="auto"/>
         <w:ind w:left="720" w:hanging="283"/>
-        <w:jc w:val="left"/>
+        <w:jc w:val="both"/>
       </w:pPr>
       <w:r>
         <w:rPr>
@@ -3883,7 +3733,7 @@
       <w:pPr>
         <w:spacing w:before="20" w:after="40" w:line="300" w:lineRule="auto"/>
         <w:ind w:left="720" w:hanging="283"/>
-        <w:jc w:val="left"/>
+        <w:jc w:val="both"/>
       </w:pPr>
       <w:r>
         <w:rPr>
@@ -3909,7 +3759,7 @@
       <w:pPr>
         <w:spacing w:before="20" w:after="40" w:line="300" w:lineRule="auto"/>
         <w:ind w:left="720" w:hanging="283"/>
-        <w:jc w:val="left"/>
+        <w:jc w:val="both"/>
       </w:pPr>
       <w:r>
         <w:rPr>
@@ -3935,7 +3785,7 @@
       <w:pPr>
         <w:spacing w:before="20" w:after="40" w:line="300" w:lineRule="auto"/>
         <w:ind w:left="720" w:hanging="283"/>
-        <w:jc w:val="left"/>
+        <w:jc w:val="both"/>
       </w:pPr>
       <w:r>
         <w:rPr>
@@ -3961,7 +3811,7 @@
       <w:pPr>
         <w:spacing w:before="20" w:after="40" w:line="300" w:lineRule="auto"/>
         <w:ind w:left="720" w:hanging="283"/>
-        <w:jc w:val="left"/>
+        <w:jc w:val="both"/>
       </w:pPr>
       <w:r>
         <w:rPr>
@@ -3987,7 +3837,7 @@
       <w:pPr>
         <w:spacing w:before="20" w:after="40" w:line="300" w:lineRule="auto"/>
         <w:ind w:left="720" w:hanging="283"/>
-        <w:jc w:val="left"/>
+        <w:jc w:val="both"/>
       </w:pPr>
       <w:r>
         <w:rPr>
@@ -4013,7 +3863,7 @@
       <w:pPr>
         <w:spacing w:before="20" w:after="40" w:line="300" w:lineRule="auto"/>
         <w:ind w:left="720" w:hanging="283"/>
-        <w:jc w:val="left"/>
+        <w:jc w:val="both"/>
       </w:pPr>
       <w:r>
         <w:rPr>
@@ -4058,7 +3908,7 @@
     <w:p>
       <w:pPr>
         <w:keepNext/>
-        <w:spacing w:before="120" w:after="40" w:line="276" w:lineRule="auto"/>
+        <w:spacing w:before="240" w:after="120" w:line="276" w:lineRule="auto"/>
         <w:ind w:firstLine="0"/>
         <w:jc w:val="left"/>
       </w:pPr>
@@ -4077,7 +3927,7 @@
       <w:pPr>
         <w:spacing w:before="20" w:after="40" w:line="300" w:lineRule="auto"/>
         <w:ind w:left="720" w:hanging="283"/>
-        <w:jc w:val="left"/>
+        <w:jc w:val="both"/>
       </w:pPr>
       <w:r>
         <w:rPr>
@@ -4143,7 +3993,7 @@
       <w:pPr>
         <w:spacing w:before="20" w:after="40" w:line="300" w:lineRule="auto"/>
         <w:ind w:left="720" w:hanging="283"/>
-        <w:jc w:val="left"/>
+        <w:jc w:val="both"/>
       </w:pPr>
       <w:r>
         <w:rPr>
@@ -4169,7 +4019,7 @@
       <w:pPr>
         <w:spacing w:before="20" w:after="40" w:line="300" w:lineRule="auto"/>
         <w:ind w:left="720" w:hanging="283"/>
-        <w:jc w:val="left"/>
+        <w:jc w:val="both"/>
       </w:pPr>
       <w:r>
         <w:rPr>
@@ -4194,7 +4044,7 @@
     <w:p>
       <w:pPr>
         <w:keepNext/>
-        <w:spacing w:before="160" w:after="60" w:line="276" w:lineRule="auto"/>
+        <w:spacing w:before="360" w:after="120" w:line="276" w:lineRule="auto"/>
         <w:ind w:firstLine="0"/>
         <w:jc w:val="left"/>
       </w:pPr>
@@ -4206,7 +4056,7 @@
           <w:b/>
           <w:i w:val="0"/>
           <w:color w:val="000000"/>
-          <w:sz w:val="26"/>
+          <w:sz w:val="28"/>
         </w:rPr>
         <w:t>2.3. Các thách thức chính</w:t>
       </w:r>
@@ -4214,7 +4064,7 @@
     <w:p>
       <w:pPr>
         <w:keepNext/>
-        <w:spacing w:before="120" w:after="40" w:line="276" w:lineRule="auto"/>
+        <w:spacing w:before="240" w:after="120" w:line="276" w:lineRule="auto"/>
         <w:ind w:firstLine="0"/>
         <w:jc w:val="left"/>
       </w:pPr>
@@ -4251,7 +4101,7 @@
     <w:p>
       <w:pPr>
         <w:keepNext/>
-        <w:spacing w:before="120" w:after="40" w:line="276" w:lineRule="auto"/>
+        <w:spacing w:before="240" w:after="120" w:line="276" w:lineRule="auto"/>
         <w:ind w:firstLine="0"/>
         <w:jc w:val="left"/>
       </w:pPr>
@@ -4288,7 +4138,7 @@
     <w:p>
       <w:pPr>
         <w:keepNext/>
-        <w:spacing w:before="120" w:after="40" w:line="276" w:lineRule="auto"/>
+        <w:spacing w:before="240" w:after="120" w:line="276" w:lineRule="auto"/>
         <w:ind w:firstLine="0"/>
         <w:jc w:val="left"/>
       </w:pPr>
@@ -4345,7 +4195,7 @@
     <w:p>
       <w:pPr>
         <w:keepNext/>
-        <w:spacing w:before="120" w:after="40" w:line="276" w:lineRule="auto"/>
+        <w:spacing w:before="240" w:after="120" w:line="276" w:lineRule="auto"/>
         <w:ind w:firstLine="0"/>
         <w:jc w:val="left"/>
       </w:pPr>
@@ -4424,7 +4274,7 @@
     <w:p>
       <w:pPr>
         <w:keepNext/>
-        <w:spacing w:before="160" w:after="60" w:line="276" w:lineRule="auto"/>
+        <w:spacing w:before="360" w:after="120" w:line="276" w:lineRule="auto"/>
         <w:ind w:firstLine="0"/>
         <w:jc w:val="left"/>
       </w:pPr>
@@ -4436,7 +4286,7 @@
           <w:b/>
           <w:i w:val="0"/>
           <w:color w:val="000000"/>
-          <w:sz w:val="26"/>
+          <w:sz w:val="28"/>
         </w:rPr>
         <w:t>2.4. Yêu cầu kỹ thuật</w:t>
       </w:r>
@@ -4462,7 +4312,7 @@
       <w:pPr>
         <w:spacing w:before="20" w:after="40" w:line="300" w:lineRule="auto"/>
         <w:ind w:left="720" w:hanging="283"/>
-        <w:jc w:val="left"/>
+        <w:jc w:val="both"/>
       </w:pPr>
       <w:r>
         <w:rPr>
@@ -4488,7 +4338,7 @@
       <w:pPr>
         <w:spacing w:before="20" w:after="40" w:line="300" w:lineRule="auto"/>
         <w:ind w:left="720" w:hanging="283"/>
-        <w:jc w:val="left"/>
+        <w:jc w:val="both"/>
       </w:pPr>
       <w:r>
         <w:rPr>
@@ -4514,7 +4364,7 @@
       <w:pPr>
         <w:spacing w:before="20" w:after="40" w:line="300" w:lineRule="auto"/>
         <w:ind w:left="720" w:hanging="283"/>
-        <w:jc w:val="left"/>
+        <w:jc w:val="both"/>
       </w:pPr>
       <w:r>
         <w:rPr>
@@ -4540,7 +4390,7 @@
       <w:pPr>
         <w:spacing w:before="20" w:after="40" w:line="300" w:lineRule="auto"/>
         <w:ind w:left="720" w:hanging="283"/>
-        <w:jc w:val="left"/>
+        <w:jc w:val="both"/>
       </w:pPr>
       <w:r>
         <w:rPr>
@@ -4566,7 +4416,7 @@
       <w:pPr>
         <w:spacing w:before="20" w:after="40" w:line="300" w:lineRule="auto"/>
         <w:ind w:left="720" w:hanging="283"/>
-        <w:jc w:val="left"/>
+        <w:jc w:val="both"/>
       </w:pPr>
       <w:r>
         <w:rPr>
@@ -4592,7 +4442,7 @@
       <w:pPr>
         <w:spacing w:before="20" w:after="40" w:line="300" w:lineRule="auto"/>
         <w:ind w:left="720" w:hanging="283"/>
-        <w:jc w:val="left"/>
+        <w:jc w:val="both"/>
       </w:pPr>
       <w:r>
         <w:rPr>
@@ -4634,7 +4484,7 @@
     <w:p>
       <w:pPr>
         <w:keepNext/>
-        <w:spacing w:before="160" w:after="60" w:line="276" w:lineRule="auto"/>
+        <w:spacing w:before="360" w:after="120" w:line="276" w:lineRule="auto"/>
         <w:ind w:firstLine="0"/>
         <w:jc w:val="left"/>
       </w:pPr>
@@ -4646,7 +4496,7 @@
           <w:b/>
           <w:i w:val="0"/>
           <w:color w:val="000000"/>
-          <w:sz w:val="26"/>
+          <w:sz w:val="28"/>
         </w:rPr>
         <w:t>2.5. Câu hỏi nghiên cứu</w:t>
       </w:r>
@@ -4665,114 +4515,36 @@
           <w:color w:val="000000"/>
           <w:sz w:val="26"/>
         </w:rPr>
-        <w:t>Báo cáo hướng tới trả lời các câu hỏi sau khi hoàn tất thực nghiệm:</w:t>
+        <w:t>Báo cáo hướng tới trả lời các câu hỏi sau khi hoàn tất thực nghiệm: - Kỹ thuật xử lý mất cân bằng nào phù hợp hơn trên tập PaySim đã tiền xử lý? - Trong các mô hình được thử nghiệm, mô hình nào đạt cân bằng tốt nhất giữa Precision và Recall cho lớp fraud? - Các đặc trưng nào đóng góp nhiều nhất vào quyết định của mô hình, và các đặc trưng này có nguy cơ phản ánh cơ chế mô phỏng của PaySim hay không?</w:t>
       </w:r>
     </w:p>
     <w:p>
       <w:pPr>
-        <w:spacing w:before="20" w:after="40" w:line="300" w:lineRule="auto"/>
-        <w:ind w:left="720" w:hanging="283"/>
-        <w:jc w:val="left"/>
-      </w:pPr>
+        <w:keepNext/>
+        <w:spacing w:before="480" w:after="240" w:line="276" w:lineRule="auto"/>
+        <w:ind w:firstLine="0"/>
+        <w:jc w:val="center"/>
+      </w:pPr>
+      <w:bookmarkStart w:id="1020" w:name="bm_h1_4"/>
+      <w:bookmarkEnd w:id="1020"/>
       <w:r>
         <w:rPr>
           <w:rFonts w:ascii="Times New Roman" w:hAnsi="Times New Roman"/>
           <w:b/>
-          <w:color w:val="000000"/>
-          <w:sz w:val="26"/>
-        </w:rPr>
-        <w:t xml:space="preserve">-  </w:t>
-      </w:r>
-      <w:r>
-        <w:rPr>
-          <w:rFonts w:ascii="Times New Roman" w:hAnsi="Times New Roman"/>
-          <w:b w:val="0"/>
-          <w:i w:val="0"/>
-          <w:color w:val="000000"/>
-          <w:sz w:val="26"/>
-        </w:rPr>
-        <w:t>Kỹ thuật xử lý mất cân bằng nào phù hợp hơn trên tập PaySim đã tiền xử lý?</w:t>
+          <w:i w:val="0"/>
+          <w:color w:val="000000"/>
+          <w:sz w:val="30"/>
+        </w:rPr>
+        <w:t>CHƯƠNG 3. MÔ TẢ DỮ LIỆU</w:t>
       </w:r>
     </w:p>
     <w:p>
       <w:pPr>
-        <w:spacing w:before="20" w:after="40" w:line="300" w:lineRule="auto"/>
-        <w:ind w:left="720" w:hanging="283"/>
-        <w:jc w:val="left"/>
-      </w:pPr>
-      <w:r>
-        <w:rPr>
-          <w:rFonts w:ascii="Times New Roman" w:hAnsi="Times New Roman"/>
-          <w:b/>
-          <w:color w:val="000000"/>
-          <w:sz w:val="26"/>
-        </w:rPr>
-        <w:t xml:space="preserve">-  </w:t>
-      </w:r>
-      <w:r>
-        <w:rPr>
-          <w:rFonts w:ascii="Times New Roman" w:hAnsi="Times New Roman"/>
-          <w:b w:val="0"/>
-          <w:i w:val="0"/>
-          <w:color w:val="000000"/>
-          <w:sz w:val="26"/>
-        </w:rPr>
-        <w:t>Trong các mô hình được thử nghiệm, mô hình nào đạt cân bằng tốt nhất giữa Precision và Recall cho lớp fraud?</w:t>
-      </w:r>
-    </w:p>
-    <w:p>
-      <w:pPr>
-        <w:spacing w:before="20" w:after="40" w:line="300" w:lineRule="auto"/>
-        <w:ind w:left="720" w:hanging="283"/>
-        <w:jc w:val="left"/>
-      </w:pPr>
-      <w:r>
-        <w:rPr>
-          <w:rFonts w:ascii="Times New Roman" w:hAnsi="Times New Roman"/>
-          <w:b/>
-          <w:color w:val="000000"/>
-          <w:sz w:val="26"/>
-        </w:rPr>
-        <w:t xml:space="preserve">-  </w:t>
-      </w:r>
-      <w:r>
-        <w:rPr>
-          <w:rFonts w:ascii="Times New Roman" w:hAnsi="Times New Roman"/>
-          <w:b w:val="0"/>
-          <w:i w:val="0"/>
-          <w:color w:val="000000"/>
-          <w:sz w:val="26"/>
-        </w:rPr>
-        <w:t>Các đặc trưng nào đóng góp nhiều nhất vào quyết định của mô hình, và các đặc trưng này có nguy cơ phản ánh cơ chế mô phỏng của PaySim hay không?</w:t>
-      </w:r>
-    </w:p>
-    <w:p>
-      <w:pPr>
         <w:keepNext/>
-        <w:spacing w:before="240" w:after="80" w:line="276" w:lineRule="auto"/>
+        <w:spacing w:before="360" w:after="120" w:line="276" w:lineRule="auto"/>
         <w:ind w:firstLine="0"/>
         <w:jc w:val="left"/>
       </w:pPr>
-      <w:bookmarkStart w:id="1020" w:name="bm_h1_4"/>
-      <w:bookmarkEnd w:id="1020"/>
-      <w:r>
-        <w:rPr>
-          <w:rFonts w:ascii="Times New Roman" w:hAnsi="Times New Roman"/>
-          <w:b/>
-          <w:i w:val="0"/>
-          <w:color w:val="000000"/>
-          <w:sz w:val="27"/>
-        </w:rPr>
-        <w:t>CHƯƠNG 3. MÔ TẢ DỮ LIỆU</w:t>
-      </w:r>
-    </w:p>
-    <w:p>
-      <w:pPr>
-        <w:keepNext/>
-        <w:spacing w:before="160" w:after="60" w:line="276" w:lineRule="auto"/>
-        <w:ind w:firstLine="0"/>
-        <w:jc w:val="left"/>
-      </w:pPr>
       <w:bookmarkStart w:id="1021" w:name="bm_h2_11"/>
       <w:bookmarkEnd w:id="1021"/>
       <w:r>
@@ -4781,7 +4553,7 @@
           <w:b/>
           <w:i w:val="0"/>
           <w:color w:val="000000"/>
-          <w:sz w:val="26"/>
+          <w:sz w:val="28"/>
         </w:rPr>
         <w:t>3.1. Nguồn dữ liệu</w:t>
       </w:r>
@@ -5006,7 +4778,7 @@
     <w:p>
       <w:pPr>
         <w:keepNext/>
-        <w:spacing w:before="160" w:after="60" w:line="276" w:lineRule="auto"/>
+        <w:spacing w:before="360" w:after="120" w:line="276" w:lineRule="auto"/>
         <w:ind w:firstLine="0"/>
         <w:jc w:val="left"/>
       </w:pPr>
@@ -5018,7 +4790,7 @@
           <w:b/>
           <w:i w:val="0"/>
           <w:color w:val="000000"/>
-          <w:sz w:val="26"/>
+          <w:sz w:val="28"/>
         </w:rPr>
         <w:t>3.2. Cấu trúc dữ liệu gốc</w:t>
       </w:r>
@@ -5027,6 +4799,8 @@
       <w:tblPr>
         <w:tblW w:type="auto" w:w="0"/>
         <w:jc w:val="center"/>
+        <w:tblLayout w:type="fixed"/>
+        <w:tblLook w:firstColumn="1" w:firstRow="1" w:lastColumn="0" w:lastRow="0" w:noHBand="0" w:noVBand="1" w:val="04A0"/>
         <w:tblBorders>
           <w:top w:val="single" w:sz="6" w:space="0" w:color="CCCCCC"/>
           <w:bottom w:val="single" w:sz="6" w:space="0" w:color="CCCCCC"/>
@@ -5035,8 +4809,6 @@
           <w:left w:val="none"/>
           <w:right w:val="none"/>
         </w:tblBorders>
-        <w:tblLayout w:type="fixed"/>
-        <w:tblLook w:firstColumn="1" w:firstRow="1" w:lastColumn="0" w:lastRow="0" w:noHBand="0" w:noVBand="1" w:val="04A0"/>
       </w:tblPr>
       <w:tblGrid>
         <w:gridCol w:w="3024"/>
@@ -5045,8 +4817,8 @@
       </w:tblGrid>
       <w:tr>
         <w:trPr>
+          <w:tblHeader/>
           <w:cantSplit/>
-          <w:tblHeader/>
         </w:trPr>
         <w:tc>
           <w:tcPr>
@@ -6249,7 +6021,7 @@
     <w:p>
       <w:pPr>
         <w:keepNext/>
-        <w:spacing w:before="160" w:after="60" w:line="276" w:lineRule="auto"/>
+        <w:spacing w:before="360" w:after="120" w:line="276" w:lineRule="auto"/>
         <w:ind w:firstLine="0"/>
         <w:jc w:val="left"/>
       </w:pPr>
@@ -6261,7 +6033,7 @@
           <w:b/>
           <w:i w:val="0"/>
           <w:color w:val="000000"/>
-          <w:sz w:val="26"/>
+          <w:sz w:val="28"/>
         </w:rPr>
         <w:t>3.3. Phân bố giao dịch và nhãn</w:t>
       </w:r>
@@ -6270,6 +6042,8 @@
       <w:tblPr>
         <w:tblW w:type="auto" w:w="0"/>
         <w:jc w:val="center"/>
+        <w:tblLayout w:type="fixed"/>
+        <w:tblLook w:firstColumn="1" w:firstRow="1" w:lastColumn="0" w:lastRow="0" w:noHBand="0" w:noVBand="1" w:val="04A0"/>
         <w:tblBorders>
           <w:top w:val="single" w:sz="6" w:space="0" w:color="CCCCCC"/>
           <w:bottom w:val="single" w:sz="6" w:space="0" w:color="CCCCCC"/>
@@ -6278,8 +6052,6 @@
           <w:left w:val="none"/>
           <w:right w:val="none"/>
         </w:tblBorders>
-        <w:tblLayout w:type="fixed"/>
-        <w:tblLook w:firstColumn="1" w:firstRow="1" w:lastColumn="0" w:lastRow="0" w:noHBand="0" w:noVBand="1" w:val="04A0"/>
       </w:tblPr>
       <w:tblGrid>
         <w:gridCol w:w="2268"/>
@@ -6289,8 +6061,8 @@
       </w:tblGrid>
       <w:tr>
         <w:trPr>
+          <w:tblHeader/>
           <w:cantSplit/>
-          <w:tblHeader/>
         </w:trPr>
         <w:tc>
           <w:tcPr>
@@ -7213,7 +6985,7 @@
     <w:p>
       <w:pPr>
         <w:keepNext/>
-        <w:spacing w:before="160" w:after="60" w:line="276" w:lineRule="auto"/>
+        <w:spacing w:before="360" w:after="120" w:line="276" w:lineRule="auto"/>
         <w:ind w:firstLine="0"/>
         <w:jc w:val="left"/>
       </w:pPr>
@@ -7225,7 +6997,7 @@
           <w:b/>
           <w:i w:val="0"/>
           <w:color w:val="000000"/>
-          <w:sz w:val="26"/>
+          <w:sz w:val="28"/>
         </w:rPr>
         <w:t>3.4. Downsampling và chia tập</w:t>
       </w:r>
@@ -7271,6 +7043,8 @@
       <w:tblPr>
         <w:tblW w:type="auto" w:w="0"/>
         <w:jc w:val="center"/>
+        <w:tblLayout w:type="fixed"/>
+        <w:tblLook w:firstColumn="1" w:firstRow="1" w:lastColumn="0" w:lastRow="0" w:noHBand="0" w:noVBand="1" w:val="04A0"/>
         <w:tblBorders>
           <w:top w:val="single" w:sz="6" w:space="0" w:color="CCCCCC"/>
           <w:bottom w:val="single" w:sz="6" w:space="0" w:color="CCCCCC"/>
@@ -7279,8 +7053,6 @@
           <w:left w:val="none"/>
           <w:right w:val="none"/>
         </w:tblBorders>
-        <w:tblLayout w:type="fixed"/>
-        <w:tblLook w:firstColumn="1" w:firstRow="1" w:lastColumn="0" w:lastRow="0" w:noHBand="0" w:noVBand="1" w:val="04A0"/>
       </w:tblPr>
       <w:tblGrid>
         <w:gridCol w:w="1814"/>
@@ -7291,8 +7063,8 @@
       </w:tblGrid>
       <w:tr>
         <w:trPr>
+          <w:tblHeader/>
           <w:cantSplit/>
-          <w:tblHeader/>
         </w:trPr>
         <w:tc>
           <w:tcPr>
@@ -8076,7 +7848,7 @@
     <w:p>
       <w:pPr>
         <w:keepNext/>
-        <w:spacing w:before="160" w:after="60" w:line="276" w:lineRule="auto"/>
+        <w:spacing w:before="360" w:after="120" w:line="276" w:lineRule="auto"/>
         <w:ind w:firstLine="0"/>
         <w:jc w:val="left"/>
       </w:pPr>
@@ -8088,7 +7860,7 @@
           <w:b/>
           <w:i w:val="0"/>
           <w:color w:val="000000"/>
-          <w:sz w:val="26"/>
+          <w:sz w:val="28"/>
         </w:rPr>
         <w:t>3.5. Các đặc trưng đầu vào sau tiền xử lý</w:t>
       </w:r>
@@ -8214,6 +7986,8 @@
       <w:tblPr>
         <w:tblW w:type="auto" w:w="0"/>
         <w:jc w:val="center"/>
+        <w:tblLayout w:type="fixed"/>
+        <w:tblLook w:firstColumn="1" w:firstRow="1" w:lastColumn="0" w:lastRow="0" w:noHBand="0" w:noVBand="1" w:val="04A0"/>
         <w:tblBorders>
           <w:top w:val="single" w:sz="6" w:space="0" w:color="CCCCCC"/>
           <w:bottom w:val="single" w:sz="6" w:space="0" w:color="CCCCCC"/>
@@ -8222,8 +7996,6 @@
           <w:left w:val="none"/>
           <w:right w:val="none"/>
         </w:tblBorders>
-        <w:tblLayout w:type="fixed"/>
-        <w:tblLook w:firstColumn="1" w:firstRow="1" w:lastColumn="0" w:lastRow="0" w:noHBand="0" w:noVBand="1" w:val="04A0"/>
       </w:tblPr>
       <w:tblGrid>
         <w:gridCol w:w="3024"/>
@@ -8232,8 +8004,8 @@
       </w:tblGrid>
       <w:tr>
         <w:trPr>
+          <w:tblHeader/>
           <w:cantSplit/>
-          <w:tblHeader/>
         </w:trPr>
         <w:tc>
           <w:tcPr>
@@ -9701,7 +9473,7 @@
     <w:p>
       <w:pPr>
         <w:keepNext/>
-        <w:spacing w:before="160" w:after="60" w:line="276" w:lineRule="auto"/>
+        <w:spacing w:before="360" w:after="120" w:line="276" w:lineRule="auto"/>
         <w:ind w:firstLine="0"/>
         <w:jc w:val="left"/>
       </w:pPr>
@@ -9713,7 +9485,7 @@
           <w:b/>
           <w:i w:val="0"/>
           <w:color w:val="000000"/>
-          <w:sz w:val="26"/>
+          <w:sz w:val="28"/>
         </w:rPr>
         <w:t>3.6. Hạn chế và nguy cơ ảnh hưởng tính hợp lệ</w:t>
       </w:r>
@@ -9721,7 +9493,7 @@
     <w:p>
       <w:pPr>
         <w:keepNext/>
-        <w:spacing w:before="120" w:after="40" w:line="276" w:lineRule="auto"/>
+        <w:spacing w:before="240" w:after="120" w:line="276" w:lineRule="auto"/>
         <w:ind w:firstLine="0"/>
         <w:jc w:val="left"/>
       </w:pPr>
@@ -9752,13 +9524,13 @@
           <w:color w:val="000000"/>
           <w:sz w:val="26"/>
         </w:rPr>
-        <w:t>Fraud ratio tăng từ 0,129082% lên khoảng 4,1065% sau downsample. Do Precision và đường Precision–Recall phụ thuộc vào prevalence, kết quả trên test downsample không thể được trình bày như hiệu năng trên phân bố PaySim gốc hoặc trên hệ thống thật.</w:t>
+        <w:t>Fraud ratio tăng từ 0,129082% lên khoảng 4,1065% sau downsample. Do Precision và đường Precision-Recall phụ thuộc vào prevalence, kết quả trên test downsample không thể được trình bày như hiệu năng trên phân bố PaySim gốc hoặc trên hệ thống thật.</w:t>
       </w:r>
     </w:p>
     <w:p>
       <w:pPr>
         <w:keepNext/>
-        <w:spacing w:before="120" w:after="40" w:line="276" w:lineRule="auto"/>
+        <w:spacing w:before="240" w:after="120" w:line="276" w:lineRule="auto"/>
         <w:ind w:firstLine="0"/>
         <w:jc w:val="left"/>
       </w:pPr>
@@ -9890,13 +9662,13 @@
           <w:color w:val="000000"/>
           <w:sz w:val="26"/>
         </w:rPr>
-        <w:t xml:space="preserve"> để phát hiện gian lận. Quy trình hiện tại vẫn sử dụng các cột số dư và hai đặc trưng sai lệch số dư. Vì vậy, mô hình có thể học tín hiệu phát sinh từ cơ chế cập nhật hoặc hủy giao dịch của bộ mô phỏng. Mục 5.5 cho thấy nhóm đặc trưng này thực sự chiếm phần lớn mức đóng góp của cả Random Forest và XGBoost. Báo cáo xem đây là một nguy cơ ảnh hưởng tính hợp lệ. Phép kiểm tra dứt điểm là huấn luyện lại mô hình sau khi loại nhóm đặc trưng số dư rồi so sánh hiệu năng. Thí nghiệm này nằm ngoài phạm vi đồ án và được ghi nhận tại Mục 7.4 như hướng kiểm chứng cần thực hiện trước khi khẳng định kết quả.</w:t>
+        <w:t xml:space="preserve"> để phát hiện gian lận. Quy trình hiện tại vẫn sử dụng các cột số dư và hai đặc trưng sai lệch số dư. Vì vậy, mô hình có thể học tín hiệu phát sinh từ cơ chế cập nhật hoặc hủy giao dịch của bộ mô phỏng. Mục 5.5 cho thấy nhóm đặc trưng này thực sự chiếm phần lớn mức đóng góp của cả Random Forest và XGBoost. Báo cáo xem đây là một nguy cơ ảnh hưởng tính hợp lệ. Phép kiểm tra dứt điểm là huấn luyện lại mô hình sau khi loại nhóm đặc trưng số dư rồi so sánh hiệu năng. Thí nghiệm này nằm ngoài phạm vi bản nháp hiện tại và được ghi nhận như một hướng kiểm chứng cần thực hiện trước khi khẳng định kết quả.</w:t>
       </w:r>
     </w:p>
     <w:p>
       <w:pPr>
         <w:keepNext/>
-        <w:spacing w:before="120" w:after="40" w:line="276" w:lineRule="auto"/>
+        <w:spacing w:before="240" w:after="120" w:line="276" w:lineRule="auto"/>
         <w:ind w:firstLine="0"/>
         <w:jc w:val="left"/>
       </w:pPr>
@@ -9933,7 +9705,7 @@
     <w:p>
       <w:pPr>
         <w:keepNext/>
-        <w:spacing w:before="120" w:after="40" w:line="276" w:lineRule="auto"/>
+        <w:spacing w:before="240" w:after="120" w:line="276" w:lineRule="auto"/>
         <w:ind w:firstLine="0"/>
         <w:jc w:val="left"/>
       </w:pPr>
@@ -9970,7 +9742,7 @@
     <w:p>
       <w:pPr>
         <w:keepNext/>
-        <w:spacing w:before="120" w:after="40" w:line="276" w:lineRule="auto"/>
+        <w:spacing w:before="240" w:after="120" w:line="276" w:lineRule="auto"/>
         <w:ind w:firstLine="0"/>
         <w:jc w:val="left"/>
       </w:pPr>
@@ -10007,7 +9779,7 @@
     <w:p>
       <w:pPr>
         <w:keepNext/>
-        <w:spacing w:before="160" w:after="60" w:line="276" w:lineRule="auto"/>
+        <w:spacing w:before="360" w:after="120" w:line="276" w:lineRule="auto"/>
         <w:ind w:firstLine="0"/>
         <w:jc w:val="left"/>
       </w:pPr>
@@ -10019,7 +9791,7 @@
           <w:b/>
           <w:i w:val="0"/>
           <w:color w:val="000000"/>
-          <w:sz w:val="26"/>
+          <w:sz w:val="28"/>
         </w:rPr>
         <w:t>3.7. Kết luận chương</w:t>
       </w:r>
@@ -10044,30 +9816,30 @@
     <w:p>
       <w:pPr>
         <w:keepNext/>
-        <w:spacing w:before="240" w:after="80" w:line="276" w:lineRule="auto"/>
+        <w:spacing w:before="480" w:after="240" w:line="276" w:lineRule="auto"/>
+        <w:ind w:firstLine="0"/>
+        <w:jc w:val="center"/>
+      </w:pPr>
+      <w:bookmarkStart w:id="1033" w:name="bm_h1_5"/>
+      <w:bookmarkEnd w:id="1033"/>
+      <w:r>
+        <w:rPr>
+          <w:rFonts w:ascii="Times New Roman" w:hAnsi="Times New Roman"/>
+          <w:b/>
+          <w:i w:val="0"/>
+          <w:color w:val="000000"/>
+          <w:sz w:val="30"/>
+        </w:rPr>
+        <w:t>CHƯƠNG 4. PHƯƠNG PHÁP THỰC HIỆN</w:t>
+      </w:r>
+    </w:p>
+    <w:p>
+      <w:pPr>
+        <w:keepNext/>
+        <w:spacing w:before="360" w:after="120" w:line="276" w:lineRule="auto"/>
         <w:ind w:firstLine="0"/>
         <w:jc w:val="left"/>
       </w:pPr>
-      <w:bookmarkStart w:id="1033" w:name="bm_h1_5"/>
-      <w:bookmarkEnd w:id="1033"/>
-      <w:r>
-        <w:rPr>
-          <w:rFonts w:ascii="Times New Roman" w:hAnsi="Times New Roman"/>
-          <w:b/>
-          <w:i w:val="0"/>
-          <w:color w:val="000000"/>
-          <w:sz w:val="27"/>
-        </w:rPr>
-        <w:t>CHƯƠNG 4. PHƯƠNG PHÁP THỰC HIỆN</w:t>
-      </w:r>
-    </w:p>
-    <w:p>
-      <w:pPr>
-        <w:keepNext/>
-        <w:spacing w:before="160" w:after="60" w:line="276" w:lineRule="auto"/>
-        <w:ind w:firstLine="0"/>
-        <w:jc w:val="left"/>
-      </w:pPr>
       <w:bookmarkStart w:id="1034" w:name="bm_h2_18"/>
       <w:bookmarkEnd w:id="1034"/>
       <w:r>
@@ -10076,7 +9848,7 @@
           <w:b/>
           <w:i w:val="0"/>
           <w:color w:val="000000"/>
-          <w:sz w:val="26"/>
+          <w:sz w:val="28"/>
         </w:rPr>
         <w:t>4.1. Quy trình thực nghiệm</w:t>
       </w:r>
@@ -10095,23 +9867,27 @@
           <w:color w:val="000000"/>
           <w:sz w:val="26"/>
         </w:rPr>
-        <w:t>Quy trình thực nghiệm được tổ chức thành sáu bước tuần tự:</w:t>
-      </w:r>
-    </w:p>
-    <w:p>
-      <w:pPr>
-        <w:spacing w:before="20" w:after="40" w:line="300" w:lineRule="auto"/>
-        <w:ind w:left="720" w:hanging="283"/>
-        <w:jc w:val="left"/>
-      </w:pPr>
+        <w:t xml:space="preserve">Quy trình thực nghiệm được tổ chức thành sáu bước tuần tự: - </w:t>
+      </w:r>
       <w:r>
         <w:rPr>
           <w:rFonts w:ascii="Times New Roman" w:hAnsi="Times New Roman"/>
           <w:b/>
+          <w:i w:val="0"/>
           <w:color w:val="000000"/>
           <w:sz w:val="26"/>
         </w:rPr>
-        <w:t xml:space="preserve">-  </w:t>
+        <w:t>Bước 1 - Đọc và kiểm tra dữ liệu:</w:t>
+      </w:r>
+      <w:r>
+        <w:rPr>
+          <w:rFonts w:ascii="Times New Roman" w:hAnsi="Times New Roman"/>
+          <w:b w:val="0"/>
+          <w:i w:val="0"/>
+          <w:color w:val="000000"/>
+          <w:sz w:val="26"/>
+        </w:rPr>
+        <w:t xml:space="preserve"> nạp bộ PaySim, xác nhận cấu trúc cột, kiểu dữ liệu, giá trị thiếu và phân bố nhãn. - </w:t>
       </w:r>
       <w:r>
         <w:rPr>
@@ -10121,43 +9897,7 @@
           <w:color w:val="000000"/>
           <w:sz w:val="26"/>
         </w:rPr>
-        <w:t>Bước 1 — Đọc và kiểm tra dữ liệu:</w:t>
-      </w:r>
-      <w:r>
-        <w:rPr>
-          <w:rFonts w:ascii="Times New Roman" w:hAnsi="Times New Roman"/>
-          <w:b w:val="0"/>
-          <w:i w:val="0"/>
-          <w:color w:val="000000"/>
-          <w:sz w:val="26"/>
-        </w:rPr>
-        <w:t xml:space="preserve"> nạp bộ PaySim, xác nhận cấu trúc cột, kiểu dữ liệu, giá trị thiếu và phân bố nhãn.</w:t>
-      </w:r>
-    </w:p>
-    <w:p>
-      <w:pPr>
-        <w:spacing w:before="20" w:after="40" w:line="300" w:lineRule="auto"/>
-        <w:ind w:left="720" w:hanging="283"/>
-        <w:jc w:val="left"/>
-      </w:pPr>
-      <w:r>
-        <w:rPr>
-          <w:rFonts w:ascii="Times New Roman" w:hAnsi="Times New Roman"/>
-          <w:b/>
-          <w:color w:val="000000"/>
-          <w:sz w:val="26"/>
-        </w:rPr>
-        <w:t xml:space="preserve">-  </w:t>
-      </w:r>
-      <w:r>
-        <w:rPr>
-          <w:rFonts w:ascii="Times New Roman" w:hAnsi="Times New Roman"/>
-          <w:b/>
-          <w:i w:val="0"/>
-          <w:color w:val="000000"/>
-          <w:sz w:val="26"/>
-        </w:rPr>
-        <w:t>Bước 2 — Lọc và downsampling:</w:t>
+        <w:t>Bước 2 - Lọc và downsampling:</w:t>
       </w:r>
       <w:r>
         <w:rPr>
@@ -10207,23 +9947,27 @@
           <w:color w:val="000000"/>
           <w:sz w:val="26"/>
         </w:rPr>
-        <w:t>, bảo toàn toàn bộ giao dịch gian lận và lấy mẫu ngẫu nhiên lớp bình thường để tạo tập làm việc 200.000 giao dịch.</w:t>
-      </w:r>
-    </w:p>
-    <w:p>
-      <w:pPr>
-        <w:spacing w:before="20" w:after="40" w:line="300" w:lineRule="auto"/>
-        <w:ind w:left="720" w:hanging="283"/>
-        <w:jc w:val="left"/>
-      </w:pPr>
+        <w:t xml:space="preserve">, bảo toàn toàn bộ giao dịch gian lận và lấy mẫu ngẫu nhiên lớp bình thường để tạo tập làm việc 200.000 giao dịch. - </w:t>
+      </w:r>
       <w:r>
         <w:rPr>
           <w:rFonts w:ascii="Times New Roman" w:hAnsi="Times New Roman"/>
           <w:b/>
+          <w:i w:val="0"/>
           <w:color w:val="000000"/>
           <w:sz w:val="26"/>
         </w:rPr>
-        <w:t xml:space="preserve">-  </w:t>
+        <w:t>Bước 3 - Chia dữ liệu:</w:t>
+      </w:r>
+      <w:r>
+        <w:rPr>
+          <w:rFonts w:ascii="Times New Roman" w:hAnsi="Times New Roman"/>
+          <w:b w:val="0"/>
+          <w:i w:val="0"/>
+          <w:color w:val="000000"/>
+          <w:sz w:val="26"/>
+        </w:rPr>
+        <w:t xml:space="preserve"> tách tập huấn luyện và tập kiểm tra theo tỷ lệ 80/20 bằng phép chia phân tầng (stratified) theo nhãn. - </w:t>
       </w:r>
       <w:r>
         <w:rPr>
@@ -10233,7 +9977,7 @@
           <w:color w:val="000000"/>
           <w:sz w:val="26"/>
         </w:rPr>
-        <w:t>Bước 3 — Chia dữ liệu:</w:t>
+        <w:t>Bước 4 - Xây dựng đặc trưng:</w:t>
       </w:r>
       <w:r>
         <w:rPr>
@@ -10243,23 +9987,27 @@
           <w:color w:val="000000"/>
           <w:sz w:val="26"/>
         </w:rPr>
-        <w:t xml:space="preserve"> tách tập huấn luyện và tập kiểm tra theo tỷ lệ 80/20 bằng phép chia phân tầng (stratified) theo nhãn.</w:t>
-      </w:r>
-    </w:p>
-    <w:p>
-      <w:pPr>
-        <w:spacing w:before="20" w:after="40" w:line="300" w:lineRule="auto"/>
-        <w:ind w:left="720" w:hanging="283"/>
-        <w:jc w:val="left"/>
-      </w:pPr>
+        <w:t xml:space="preserve"> tạo các đặc trưng dẫn xuất, mã hóa loại giao dịch và chuẩn hóa các biến định lượng bằng tham số học từ tập huấn luyện. - </w:t>
+      </w:r>
       <w:r>
         <w:rPr>
           <w:rFonts w:ascii="Times New Roman" w:hAnsi="Times New Roman"/>
           <w:b/>
+          <w:i w:val="0"/>
           <w:color w:val="000000"/>
           <w:sz w:val="26"/>
         </w:rPr>
-        <w:t xml:space="preserve">-  </w:t>
+        <w:t>Bước 5 - Xử lý mất cân bằng:</w:t>
+      </w:r>
+      <w:r>
+        <w:rPr>
+          <w:rFonts w:ascii="Times New Roman" w:hAnsi="Times New Roman"/>
+          <w:b w:val="0"/>
+          <w:i w:val="0"/>
+          <w:color w:val="000000"/>
+          <w:sz w:val="26"/>
+        </w:rPr>
+        <w:t xml:space="preserve"> áp dụng oversampling bằng SMOTENC hoặc ADASYN trên tập huấn luyện, không thay đổi tập kiểm tra. - </w:t>
       </w:r>
       <w:r>
         <w:rPr>
@@ -10269,79 +10017,7 @@
           <w:color w:val="000000"/>
           <w:sz w:val="26"/>
         </w:rPr>
-        <w:t>Bước 4 — Xây dựng đặc trưng:</w:t>
-      </w:r>
-      <w:r>
-        <w:rPr>
-          <w:rFonts w:ascii="Times New Roman" w:hAnsi="Times New Roman"/>
-          <w:b w:val="0"/>
-          <w:i w:val="0"/>
-          <w:color w:val="000000"/>
-          <w:sz w:val="26"/>
-        </w:rPr>
-        <w:t xml:space="preserve"> tạo các đặc trưng dẫn xuất, mã hóa loại giao dịch và chuẩn hóa các biến định lượng bằng tham số học từ tập huấn luyện.</w:t>
-      </w:r>
-    </w:p>
-    <w:p>
-      <w:pPr>
-        <w:spacing w:before="20" w:after="40" w:line="300" w:lineRule="auto"/>
-        <w:ind w:left="720" w:hanging="283"/>
-        <w:jc w:val="left"/>
-      </w:pPr>
-      <w:r>
-        <w:rPr>
-          <w:rFonts w:ascii="Times New Roman" w:hAnsi="Times New Roman"/>
-          <w:b/>
-          <w:color w:val="000000"/>
-          <w:sz w:val="26"/>
-        </w:rPr>
-        <w:t xml:space="preserve">-  </w:t>
-      </w:r>
-      <w:r>
-        <w:rPr>
-          <w:rFonts w:ascii="Times New Roman" w:hAnsi="Times New Roman"/>
-          <w:b/>
-          <w:i w:val="0"/>
-          <w:color w:val="000000"/>
-          <w:sz w:val="26"/>
-        </w:rPr>
-        <w:t>Bước 5 — Xử lý mất cân bằng:</w:t>
-      </w:r>
-      <w:r>
-        <w:rPr>
-          <w:rFonts w:ascii="Times New Roman" w:hAnsi="Times New Roman"/>
-          <w:b w:val="0"/>
-          <w:i w:val="0"/>
-          <w:color w:val="000000"/>
-          <w:sz w:val="26"/>
-        </w:rPr>
-        <w:t xml:space="preserve"> áp dụng oversampling bằng SMOTENC hoặc ADASYN trên tập huấn luyện, không thay đổi tập kiểm tra.</w:t>
-      </w:r>
-    </w:p>
-    <w:p>
-      <w:pPr>
-        <w:spacing w:before="20" w:after="40" w:line="300" w:lineRule="auto"/>
-        <w:ind w:left="720" w:hanging="283"/>
-        <w:jc w:val="left"/>
-      </w:pPr>
-      <w:r>
-        <w:rPr>
-          <w:rFonts w:ascii="Times New Roman" w:hAnsi="Times New Roman"/>
-          <w:b/>
-          <w:color w:val="000000"/>
-          <w:sz w:val="26"/>
-        </w:rPr>
-        <w:t xml:space="preserve">-  </w:t>
-      </w:r>
-      <w:r>
-        <w:rPr>
-          <w:rFonts w:ascii="Times New Roman" w:hAnsi="Times New Roman"/>
-          <w:b/>
-          <w:i w:val="0"/>
-          <w:color w:val="000000"/>
-          <w:sz w:val="26"/>
-        </w:rPr>
-        <w:t>Bước 6 — Huấn luyện và đánh giá:</w:t>
+        <w:t>Bước 6 - Huấn luyện và đánh giá:</w:t>
       </w:r>
       <w:r>
         <w:rPr>
@@ -10414,7 +10090,7 @@
     <w:p>
       <w:pPr>
         <w:keepNext/>
-        <w:spacing w:before="160" w:after="60" w:line="276" w:lineRule="auto"/>
+        <w:spacing w:before="360" w:after="120" w:line="276" w:lineRule="auto"/>
         <w:ind w:firstLine="0"/>
         <w:jc w:val="left"/>
       </w:pPr>
@@ -10426,7 +10102,7 @@
           <w:b/>
           <w:i w:val="0"/>
           <w:color w:val="000000"/>
-          <w:sz w:val="26"/>
+          <w:sz w:val="28"/>
         </w:rPr>
         <w:t>4.2. Tiền xử lý và xây dựng đặc trưng</w:t>
       </w:r>
@@ -10605,7 +10281,7 @@
     <w:p>
       <w:pPr>
         <w:keepNext/>
-        <w:spacing w:before="160" w:after="60" w:line="276" w:lineRule="auto"/>
+        <w:spacing w:before="360" w:after="120" w:line="276" w:lineRule="auto"/>
         <w:ind w:firstLine="0"/>
         <w:jc w:val="left"/>
       </w:pPr>
@@ -10617,7 +10293,7 @@
           <w:b/>
           <w:i w:val="0"/>
           <w:color w:val="000000"/>
-          <w:sz w:val="26"/>
+          <w:sz w:val="28"/>
         </w:rPr>
         <w:t>4.3. Xử lý mất cân bằng</w:t>
       </w:r>
@@ -10852,7 +10528,7 @@
     <w:p>
       <w:pPr>
         <w:keepNext/>
-        <w:spacing w:before="160" w:after="60" w:line="276" w:lineRule="auto"/>
+        <w:spacing w:before="360" w:after="120" w:line="276" w:lineRule="auto"/>
         <w:ind w:firstLine="0"/>
         <w:jc w:val="left"/>
       </w:pPr>
@@ -10864,7 +10540,7 @@
           <w:b/>
           <w:i w:val="0"/>
           <w:color w:val="000000"/>
-          <w:sz w:val="26"/>
+          <w:sz w:val="28"/>
         </w:rPr>
         <w:t>4.4. Random Forest</w:t>
       </w:r>
@@ -11107,7 +10783,7 @@
     <w:p>
       <w:pPr>
         <w:keepNext/>
-        <w:spacing w:before="160" w:after="60" w:line="276" w:lineRule="auto"/>
+        <w:spacing w:before="360" w:after="120" w:line="276" w:lineRule="auto"/>
         <w:ind w:firstLine="0"/>
         <w:jc w:val="left"/>
       </w:pPr>
@@ -11119,7 +10795,7 @@
           <w:b/>
           <w:i w:val="0"/>
           <w:color w:val="000000"/>
-          <w:sz w:val="26"/>
+          <w:sz w:val="28"/>
         </w:rPr>
         <w:t>4.5. XGBoost</w:t>
       </w:r>
@@ -11422,7 +11098,7 @@
     <w:p>
       <w:pPr>
         <w:keepNext/>
-        <w:spacing w:before="160" w:after="60" w:line="276" w:lineRule="auto"/>
+        <w:spacing w:before="360" w:after="120" w:line="276" w:lineRule="auto"/>
         <w:ind w:firstLine="0"/>
         <w:jc w:val="left"/>
       </w:pPr>
@@ -11434,7 +11110,7 @@
           <w:b/>
           <w:i w:val="0"/>
           <w:color w:val="000000"/>
-          <w:sz w:val="26"/>
+          <w:sz w:val="28"/>
         </w:rPr>
         <w:t>4.6. Autoencoder theo hướng phát hiện bất thường</w:t>
       </w:r>
@@ -11711,7 +11387,7 @@
     <w:p>
       <w:pPr>
         <w:keepNext/>
-        <w:spacing w:before="160" w:after="60" w:line="276" w:lineRule="auto"/>
+        <w:spacing w:before="360" w:after="120" w:line="276" w:lineRule="auto"/>
         <w:ind w:firstLine="0"/>
         <w:jc w:val="left"/>
       </w:pPr>
@@ -11723,7 +11399,7 @@
           <w:b/>
           <w:i w:val="0"/>
           <w:color w:val="000000"/>
-          <w:sz w:val="26"/>
+          <w:sz w:val="28"/>
         </w:rPr>
         <w:t>4.7. Quy trình đánh giá</w:t>
       </w:r>
@@ -11742,7 +11418,7 @@
           <w:color w:val="000000"/>
           <w:sz w:val="26"/>
         </w:rPr>
-        <w:t>Các mô hình được đánh giá trên cùng tập kiểm tra 40.000 giao dịch, không dùng dữ liệu đã qua oversampling. Báo cáo tập trung vào lớp gian lận với bốn chỉ số chính là Precision, Recall, F1-Score và ROC-AUC. Average Precision được báo cáo bổ sung vì phản ánh chất lượng phát hiện lớp gian lận rõ hơn ROC-AUC khi dữ liệu mất cân bằng. Đường ROC và đường Precision–Recall tổng hợp của cả năm biến thể được trình bày tại Mục 5.2.</w:t>
+        <w:t>Các mô hình được đánh giá trên cùng tập kiểm tra 40.000 giao dịch, không dùng dữ liệu đã qua oversampling. Báo cáo tập trung vào lớp gian lận với bốn chỉ số chính là Precision, Recall, F1-Score và ROC-AUC. Average Precision được báo cáo bổ sung vì phản ánh chất lượng phát hiện lớp gian lận rõ hơn ROC-AUC khi dữ liệu mất cân bằng. Đường ROC và đường Precision-Recall tổng hợp sẽ được bổ sung trong bản báo cáo cuối.</w:t>
       </w:r>
     </w:p>
     <w:p>
@@ -11765,7 +11441,7 @@
     <w:p>
       <w:pPr>
         <w:keepNext/>
-        <w:spacing w:before="160" w:after="60" w:line="276" w:lineRule="auto"/>
+        <w:spacing w:before="360" w:after="120" w:line="276" w:lineRule="auto"/>
         <w:ind w:firstLine="0"/>
         <w:jc w:val="left"/>
       </w:pPr>
@@ -11777,7 +11453,7 @@
           <w:b/>
           <w:i w:val="0"/>
           <w:color w:val="000000"/>
-          <w:sz w:val="26"/>
+          <w:sz w:val="28"/>
         </w:rPr>
         <w:t>4.8. Khả năng tái lập và giới hạn phương pháp</w:t>
       </w:r>
@@ -11879,7 +11555,7 @@
     <w:p>
       <w:pPr>
         <w:keepNext/>
-        <w:spacing w:before="160" w:after="60" w:line="276" w:lineRule="auto"/>
+        <w:spacing w:before="360" w:after="120" w:line="276" w:lineRule="auto"/>
         <w:ind w:firstLine="0"/>
         <w:jc w:val="left"/>
       </w:pPr>
@@ -11891,7 +11567,7 @@
           <w:b/>
           <w:i w:val="0"/>
           <w:color w:val="000000"/>
-          <w:sz w:val="26"/>
+          <w:sz w:val="28"/>
         </w:rPr>
         <w:t>4.9. Kết luận chương</w:t>
       </w:r>
@@ -11916,30 +11592,30 @@
     <w:p>
       <w:pPr>
         <w:keepNext/>
-        <w:spacing w:before="240" w:after="80" w:line="276" w:lineRule="auto"/>
+        <w:spacing w:before="480" w:after="240" w:line="276" w:lineRule="auto"/>
+        <w:ind w:firstLine="0"/>
+        <w:jc w:val="center"/>
+      </w:pPr>
+      <w:bookmarkStart w:id="1043" w:name="bm_h1_6"/>
+      <w:bookmarkEnd w:id="1043"/>
+      <w:r>
+        <w:rPr>
+          <w:rFonts w:ascii="Times New Roman" w:hAnsi="Times New Roman"/>
+          <w:b/>
+          <w:i w:val="0"/>
+          <w:color w:val="000000"/>
+          <w:sz w:val="30"/>
+        </w:rPr>
+        <w:t>CHƯƠNG 5. KẾT QUẢ THỰC NGHIỆM</w:t>
+      </w:r>
+    </w:p>
+    <w:p>
+      <w:pPr>
+        <w:keepNext/>
+        <w:spacing w:before="360" w:after="120" w:line="276" w:lineRule="auto"/>
         <w:ind w:firstLine="0"/>
         <w:jc w:val="left"/>
       </w:pPr>
-      <w:bookmarkStart w:id="1043" w:name="bm_h1_6"/>
-      <w:bookmarkEnd w:id="1043"/>
-      <w:r>
-        <w:rPr>
-          <w:rFonts w:ascii="Times New Roman" w:hAnsi="Times New Roman"/>
-          <w:b/>
-          <w:i w:val="0"/>
-          <w:color w:val="000000"/>
-          <w:sz w:val="27"/>
-        </w:rPr>
-        <w:t>CHƯƠNG 5. KẾT QUẢ THỰC NGHIỆM</w:t>
-      </w:r>
-    </w:p>
-    <w:p>
-      <w:pPr>
-        <w:keepNext/>
-        <w:spacing w:before="160" w:after="60" w:line="276" w:lineRule="auto"/>
-        <w:ind w:firstLine="0"/>
-        <w:jc w:val="left"/>
-      </w:pPr>
       <w:bookmarkStart w:id="1044" w:name="bm_h2_27"/>
       <w:bookmarkEnd w:id="1044"/>
       <w:r>
@@ -11948,7 +11624,7 @@
           <w:b/>
           <w:i w:val="0"/>
           <w:color w:val="000000"/>
-          <w:sz w:val="26"/>
+          <w:sz w:val="28"/>
         </w:rPr>
         <w:t>5.1. Phạm vi và nguồn kết quả</w:t>
       </w:r>
@@ -12064,33 +11740,13 @@
           <w:color w:val="000000"/>
           <w:sz w:val="26"/>
         </w:rPr>
-        <w:t xml:space="preserve"> để người đọc có thể đối chiếu từng con số. Bảng so sánh, các biểu đồ và bảng mức đóng góp của đặc trưng dưới đây đều được sinh lại bằng cùng script đó. Toàn bộ giá trị trong Bảng 5.1 đã được đối chiếu và khớp tuyệt đối với </w:t>
-      </w:r>
-      <w:r>
-        <w:rPr>
-          <w:rFonts w:ascii="Courier New" w:hAnsi="Courier New"/>
-          <w:b w:val="0"/>
-          <w:i w:val="0"/>
-          <w:color w:val="000000"/>
-          <w:sz w:val="25"/>
-        </w:rPr>
-        <w:t>reports/model_comparison.csv</w:t>
-      </w:r>
-      <w:r>
-        <w:rPr>
-          <w:rFonts w:ascii="Times New Roman" w:hAnsi="Times New Roman"/>
-          <w:b w:val="0"/>
-          <w:i w:val="0"/>
-          <w:color w:val="000000"/>
-          <w:sz w:val="26"/>
-        </w:rPr>
-        <w:t xml:space="preserve"> do bước đánh giá chéo của nhóm xuất ra, nên hai nguồn tính độc lập cho cùng một kết quả.</w:t>
+        <w:t xml:space="preserve"> để người đọc có thể đối chiếu từng con số. Bảng so sánh, hai biểu đồ và bảng mức đóng góp của đặc trưng dưới đây đều được sinh lại bằng cùng script đó, phản ánh kết quả hiện có trên tập kiểm tra. Đường ROC và đường Precision-Recall tổng hợp sẽ được bổ sung trong bản báo cáo cuối.</w:t>
       </w:r>
     </w:p>
     <w:p>
       <w:pPr>
         <w:keepNext/>
-        <w:spacing w:before="160" w:after="60" w:line="276" w:lineRule="auto"/>
+        <w:spacing w:before="360" w:after="120" w:line="276" w:lineRule="auto"/>
         <w:ind w:firstLine="0"/>
         <w:jc w:val="left"/>
       </w:pPr>
@@ -12102,7 +11758,7 @@
           <w:b/>
           <w:i w:val="0"/>
           <w:color w:val="000000"/>
-          <w:sz w:val="26"/>
+          <w:sz w:val="28"/>
         </w:rPr>
         <w:t>5.2. So sánh hiệu năng các mô hình</w:t>
       </w:r>
@@ -12111,6 +11767,8 @@
       <w:tblPr>
         <w:tblW w:type="auto" w:w="0"/>
         <w:jc w:val="center"/>
+        <w:tblLayout w:type="fixed"/>
+        <w:tblLook w:firstColumn="1" w:firstRow="1" w:lastColumn="0" w:lastRow="0" w:noHBand="0" w:noVBand="1" w:val="04A0"/>
         <w:tblBorders>
           <w:top w:val="single" w:sz="6" w:space="0" w:color="CCCCCC"/>
           <w:bottom w:val="single" w:sz="6" w:space="0" w:color="CCCCCC"/>
@@ -12119,8 +11777,6 @@
           <w:left w:val="none"/>
           <w:right w:val="none"/>
         </w:tblBorders>
-        <w:tblLayout w:type="fixed"/>
-        <w:tblLook w:firstColumn="1" w:firstRow="1" w:lastColumn="0" w:lastRow="0" w:noHBand="0" w:noVBand="1" w:val="04A0"/>
       </w:tblPr>
       <w:tblGrid>
         <w:gridCol w:w="1512"/>
@@ -12132,8 +11788,8 @@
       </w:tblGrid>
       <w:tr>
         <w:trPr>
+          <w:tblHeader/>
           <w:cantSplit/>
-          <w:tblHeader/>
         </w:trPr>
         <w:tc>
           <w:tcPr>
@@ -13288,140 +12944,13 @@
           <w:color w:val="000000"/>
           <w:sz w:val="26"/>
         </w:rPr>
-        <w:t>Khoảng cách giữa hai chỉ số xếp hạng của Autoencoder cho thấy vì sao không nên đọc ROC-AUC một mình trên dữ liệu lệch lớp. ROC-AUC đạt 0,9318 nhưng Average Precision chỉ đạt 0,5973. Nguyên nhân là ROC-AUC lấy toàn bộ 38.357 giao dịch bình thường làm mẫu số cho tỷ lệ dương tính giả, nên gần 2.000 cảnh báo nhầm vẫn chỉ làm chỉ số này giảm nhẹ. Average Precision thì đo trực tiếp Precision dọc theo đường Precision–Recall, nên phản ánh đúng cái giá phải trả để đạt được Recall đó. Với bốn biến thể học có giám sát, hai chỉ số này gần như trùng nhau nên kết luận không thay đổi.</w:t>
+        <w:t>Khoảng cách giữa hai chỉ số xếp hạng của Autoencoder cho thấy vì sao không nên đọc ROC-AUC một mình trên dữ liệu lệch lớp. ROC-AUC đạt 0,9318 nhưng Average Precision chỉ đạt 0,5973. Nguyên nhân là ROC-AUC lấy toàn bộ 38.357 giao dịch bình thường làm mẫu số cho tỷ lệ dương tính giả, nên gần 2.000 cảnh báo nhầm vẫn chỉ làm chỉ số này giảm nhẹ. Average Precision thì đo trực tiếp Precision dọc theo đường Precision-Recall, nên phản ánh đúng cái giá phải trả để đạt được Recall đó. Với bốn biến thể học có giám sát, hai chỉ số này gần như trùng nhau nên kết luận không thay đổi.</w:t>
       </w:r>
     </w:p>
     <w:p>
       <w:pPr>
-        <w:spacing w:before="160" w:after="60"/>
-        <w:jc w:val="center"/>
-      </w:pPr>
-      <w:r>
-        <w:drawing>
-          <wp:inline xmlns:a="http://schemas.openxmlformats.org/drawingml/2006/main" xmlns:pic="http://schemas.openxmlformats.org/drawingml/2006/picture">
-            <wp:extent cx="5220000" cy="3897365"/>
-            <wp:docPr id="2" name="Picture 2"/>
-            <wp:cNvGraphicFramePr>
-              <a:graphicFrameLocks noChangeAspect="1"/>
-            </wp:cNvGraphicFramePr>
-            <a:graphic>
-              <a:graphicData uri="http://schemas.openxmlformats.org/drawingml/2006/picture">
-                <pic:pic>
-                  <pic:nvPicPr>
-                    <pic:cNvPr id="0" name="roc_curves_all.png"/>
-                    <pic:cNvPicPr/>
-                  </pic:nvPicPr>
-                  <pic:blipFill>
-                    <a:blip r:embed="rId16"/>
-                    <a:stretch>
-                      <a:fillRect/>
-                    </a:stretch>
-                  </pic:blipFill>
-                  <pic:spPr>
-                    <a:xfrm>
-                      <a:off x="0" y="0"/>
-                      <a:ext cx="5220000" cy="3897365"/>
-                    </a:xfrm>
-                    <a:prstGeom prst="rect"/>
-                  </pic:spPr>
-                </pic:pic>
-              </a:graphicData>
-            </a:graphic>
-          </wp:inline>
-        </w:drawing>
-      </w:r>
-    </w:p>
-    <w:p>
-      <w:pPr>
-        <w:spacing w:before="40" w:after="160"/>
-        <w:jc w:val="center"/>
-      </w:pPr>
-      <w:r>
-        <w:rPr>
-          <w:rFonts w:ascii="Times New Roman" w:hAnsi="Times New Roman"/>
-          <w:i/>
-          <w:color w:val="000000"/>
-          <w:sz w:val="21"/>
-        </w:rPr>
-        <w:t>Hình 5.1. Đường ROC của năm biến thể mô hình trên tập kiểm tra</w:t>
-      </w:r>
-    </w:p>
-    <w:p>
-      <w:pPr>
-        <w:spacing w:before="160" w:after="60"/>
-        <w:jc w:val="center"/>
-      </w:pPr>
-      <w:r>
-        <w:drawing>
-          <wp:inline xmlns:a="http://schemas.openxmlformats.org/drawingml/2006/main" xmlns:pic="http://schemas.openxmlformats.org/drawingml/2006/picture">
-            <wp:extent cx="5220000" cy="3897365"/>
-            <wp:docPr id="3" name="Picture 3"/>
-            <wp:cNvGraphicFramePr>
-              <a:graphicFrameLocks noChangeAspect="1"/>
-            </wp:cNvGraphicFramePr>
-            <a:graphic>
-              <a:graphicData uri="http://schemas.openxmlformats.org/drawingml/2006/picture">
-                <pic:pic>
-                  <pic:nvPicPr>
-                    <pic:cNvPr id="0" name="pr_curves_all.png"/>
-                    <pic:cNvPicPr/>
-                  </pic:nvPicPr>
-                  <pic:blipFill>
-                    <a:blip r:embed="rId17"/>
-                    <a:stretch>
-                      <a:fillRect/>
-                    </a:stretch>
-                  </pic:blipFill>
-                  <pic:spPr>
-                    <a:xfrm>
-                      <a:off x="0" y="0"/>
-                      <a:ext cx="5220000" cy="3897365"/>
-                    </a:xfrm>
-                    <a:prstGeom prst="rect"/>
-                  </pic:spPr>
-                </pic:pic>
-              </a:graphicData>
-            </a:graphic>
-          </wp:inline>
-        </w:drawing>
-      </w:r>
-    </w:p>
-    <w:p>
-      <w:pPr>
-        <w:spacing w:before="40" w:after="160"/>
-        <w:jc w:val="center"/>
-      </w:pPr>
-      <w:r>
-        <w:rPr>
-          <w:rFonts w:ascii="Times New Roman" w:hAnsi="Times New Roman"/>
-          <w:i/>
-          <w:color w:val="000000"/>
-          <w:sz w:val="21"/>
-        </w:rPr>
-        <w:t>Hình 5.2. Đường Precision–Recall của năm biến thể mô hình trên tập kiểm tra</w:t>
-      </w:r>
-    </w:p>
-    <w:p>
-      <w:pPr>
-        <w:spacing w:before="0" w:after="40" w:line="312" w:lineRule="auto"/>
-        <w:ind w:firstLine="720"/>
-        <w:jc w:val="both"/>
-      </w:pPr>
-      <w:r>
-        <w:rPr>
-          <w:rFonts w:ascii="Times New Roman" w:hAnsi="Times New Roman"/>
-          <w:b w:val="0"/>
-          <w:i w:val="0"/>
-          <w:color w:val="000000"/>
-          <w:sz w:val="26"/>
-        </w:rPr>
-        <w:t>Hình 5.1 và Hình 5.2 trực quan hóa nhận định trên. Trên đường ROC, bốn biến thể học có giám sát gần như trùng nhau và ép sát góc trên bên trái, còn Autoencoder tuy thấp hơn nhưng vẫn cách xa đường chéo ngẫu nhiên. Trên đường Precision–Recall, khoảng cách giữa hai nhóm mô hình giãn ra rõ rệt: bốn biến thể học có giám sát giữ Precision gần 1,0 trên toàn dải Recall, trong khi Precision của Autoencoder suy giảm liên tục và chỉ còn khoảng 0,05 ở mức Recall cao nhất. Cùng một mô hình nhưng hai đồ thị cho hai ấn tượng khác nhau, đó là lý do đề bài yêu cầu không dựa vào một chỉ số duy nhất.</w:t>
-      </w:r>
-    </w:p>
-    <w:p>
-      <w:pPr>
         <w:keepNext/>
-        <w:spacing w:before="160" w:after="60" w:line="276" w:lineRule="auto"/>
+        <w:spacing w:before="360" w:after="120" w:line="276" w:lineRule="auto"/>
         <w:ind w:firstLine="0"/>
         <w:jc w:val="left"/>
       </w:pPr>
@@ -13433,7 +12962,7 @@
           <w:b/>
           <w:i w:val="0"/>
           <w:color w:val="000000"/>
-          <w:sz w:val="26"/>
+          <w:sz w:val="28"/>
         </w:rPr>
         <w:t>5.3. Phân tích ma trận nhầm lẫn</w:t>
       </w:r>
@@ -13447,7 +12976,7 @@
         <w:drawing>
           <wp:inline xmlns:a="http://schemas.openxmlformats.org/drawingml/2006/main" xmlns:pic="http://schemas.openxmlformats.org/drawingml/2006/picture">
             <wp:extent cx="5220000" cy="3450756"/>
-            <wp:docPr id="4" name="Picture 4"/>
+            <wp:docPr id="2" name="Picture 2"/>
             <wp:cNvGraphicFramePr>
               <a:graphicFrameLocks noChangeAspect="1"/>
             </wp:cNvGraphicFramePr>
@@ -13459,7 +12988,7 @@
                     <pic:cNvPicPr/>
                   </pic:nvPicPr>
                   <pic:blipFill>
-                    <a:blip r:embed="rId18"/>
+                    <a:blip r:embed="rId16"/>
                     <a:stretch>
                       <a:fillRect/>
                     </a:stretch>
@@ -13490,7 +13019,7 @@
           <w:color w:val="000000"/>
           <w:sz w:val="21"/>
         </w:rPr>
-        <w:t>Hình 5.3. So sánh riêng bốn thành phần TN, FP, FN và TP theo mô hình</w:t>
+        <w:t>Hình 5.1. So sánh riêng bốn thành phần TN, FP, FN và TP theo mô hình</w:t>
       </w:r>
     </w:p>
     <w:p>
@@ -13507,7 +13036,7 @@
           <w:color w:val="000000"/>
           <w:sz w:val="26"/>
         </w:rPr>
-        <w:t>Hình 5.3 tách TN, FP, FN và TP thành bốn đồ thị để mỗi thành phần có trục tung riêng. Trục hoành biểu diễn năm biến thể mô hình, còn trục tung biểu diễn số giao dịch. Hai đồ thị sai số FP và FN dùng trục tung theo thang logarit vì giá trị trong cùng một đồ thị chênh nhau tới ba bậc độ lớn, ví dụ 1 cảnh báo nhầm của Random Forest kết hợp SMOTENC so với 1.998 cảnh báo nhầm của Autoencoder. Nếu giữ thang tuyến tính, các cột nhỏ bị dí sát trục và không còn so sánh được với nhau. Cách trình bày này giúp quan sát cả những sai số có giá trị nhỏ mà không bị hai nhóm TN và TP có quy mô lớn che khuất.</w:t>
+        <w:t>Hình 5.1 tách TN, FP, FN và TP thành bốn đồ thị để mỗi thành phần có trục tung riêng. Trục hoành biểu diễn năm biến thể mô hình, còn trục tung biểu diễn số giao dịch. Hai đồ thị sai số FP và FN dùng trục tung theo thang logarit vì giá trị trong cùng một đồ thị chênh nhau tới ba bậc độ lớn, ví dụ 1 cảnh báo nhầm của Random Forest kết hợp SMOTENC so với 1.998 cảnh báo nhầm của Autoencoder. Nếu giữ thang tuyến tính, các cột nhỏ bị dí sát trục và không còn so sánh được với nhau. Cách trình bày này giúp quan sát cả những sai số có giá trị nhỏ mà không bị hai nhóm TN và TP có quy mô lớn che khuất.</w:t>
       </w:r>
     </w:p>
     <w:p>
@@ -13547,7 +13076,7 @@
     <w:p>
       <w:pPr>
         <w:keepNext/>
-        <w:spacing w:before="160" w:after="60" w:line="276" w:lineRule="auto"/>
+        <w:spacing w:before="360" w:after="120" w:line="276" w:lineRule="auto"/>
         <w:ind w:firstLine="0"/>
         <w:jc w:val="left"/>
       </w:pPr>
@@ -13559,7 +13088,7 @@
           <w:b/>
           <w:i w:val="0"/>
           <w:color w:val="000000"/>
-          <w:sz w:val="26"/>
+          <w:sz w:val="28"/>
         </w:rPr>
         <w:t>5.4. Ảnh hưởng của SMOTENC và ADASYN</w:t>
       </w:r>
@@ -13601,7 +13130,7 @@
     <w:p>
       <w:pPr>
         <w:keepNext/>
-        <w:spacing w:before="160" w:after="60" w:line="276" w:lineRule="auto"/>
+        <w:spacing w:before="360" w:after="120" w:line="276" w:lineRule="auto"/>
         <w:ind w:firstLine="0"/>
         <w:jc w:val="left"/>
       </w:pPr>
@@ -13613,7 +13142,7 @@
           <w:b/>
           <w:i w:val="0"/>
           <w:color w:val="000000"/>
-          <w:sz w:val="26"/>
+          <w:sz w:val="28"/>
         </w:rPr>
         <w:t>5.5. Mức đóng góp của các đặc trưng</w:t>
       </w:r>
@@ -13639,6 +13168,8 @@
       <w:tblPr>
         <w:tblW w:type="auto" w:w="0"/>
         <w:jc w:val="center"/>
+        <w:tblLayout w:type="fixed"/>
+        <w:tblLook w:firstColumn="1" w:firstRow="1" w:lastColumn="0" w:lastRow="0" w:noHBand="0" w:noVBand="1" w:val="04A0"/>
         <w:tblBorders>
           <w:top w:val="single" w:sz="6" w:space="0" w:color="CCCCCC"/>
           <w:bottom w:val="single" w:sz="6" w:space="0" w:color="CCCCCC"/>
@@ -13647,8 +13178,6 @@
           <w:left w:val="none"/>
           <w:right w:val="none"/>
         </w:tblBorders>
-        <w:tblLayout w:type="fixed"/>
-        <w:tblLook w:firstColumn="1" w:firstRow="1" w:lastColumn="0" w:lastRow="0" w:noHBand="0" w:noVBand="1" w:val="04A0"/>
       </w:tblPr>
       <w:tblGrid>
         <w:gridCol w:w="1814"/>
@@ -13659,8 +13188,8 @@
       </w:tblGrid>
       <w:tr>
         <w:trPr>
+          <w:tblHeader/>
           <w:cantSplit/>
-          <w:tblHeader/>
         </w:trPr>
         <w:tc>
           <w:tcPr>
@@ -14696,7 +14225,7 @@
         <w:drawing>
           <wp:inline xmlns:a="http://schemas.openxmlformats.org/drawingml/2006/main" xmlns:pic="http://schemas.openxmlformats.org/drawingml/2006/picture">
             <wp:extent cx="5220000" cy="3563885"/>
-            <wp:docPr id="5" name="Picture 5"/>
+            <wp:docPr id="3" name="Picture 3"/>
             <wp:cNvGraphicFramePr>
               <a:graphicFrameLocks noChangeAspect="1"/>
             </wp:cNvGraphicFramePr>
@@ -14708,7 +14237,7 @@
                     <pic:cNvPicPr/>
                   </pic:nvPicPr>
                   <pic:blipFill>
-                    <a:blip r:embed="rId19"/>
+                    <a:blip r:embed="rId17"/>
                     <a:stretch>
                       <a:fillRect/>
                     </a:stretch>
@@ -14739,7 +14268,7 @@
           <w:color w:val="000000"/>
           <w:sz w:val="21"/>
         </w:rPr>
-        <w:t>Hình 5.4. Mức đóng góp của toàn bộ 14 đặc trưng theo hai mô hình dùng SMOTENC</w:t>
+        <w:t>Hình 5.2. Mức đóng góp của toàn bộ 14 đặc trưng theo hai mô hình dùng SMOTENC</w:t>
       </w:r>
     </w:p>
     <w:p>
@@ -14756,7 +14285,7 @@
           <w:color w:val="000000"/>
           <w:sz w:val="26"/>
         </w:rPr>
-        <w:t xml:space="preserve">Hình 5.4 trình bày đầy đủ 14 đặc trưng của cả hai mô hình, mỗi mô hình trên một panel riêng vì hai thang đo khác nhau. Màu phân biệt nhóm đặc trưng dẫn xuất từ số dư với phần còn lại, cho thấy mức độ tập trung rõ hơn bảng số. Với Random Forest, mức đóng góp giảm tương đối đều và các đặc trưng thời gian vẫn giữ vai trò nhỏ nhưng khác 0. Với XGBoost, hai đặc trưng đầu chiếm gần như toàn bộ, mười hai đặc trưng còn lại cộng lại chưa tới 3%, trong đó </w:t>
+        <w:t xml:space="preserve">Hình 5.2 trình bày đầy đủ 14 đặc trưng của cả hai mô hình, mỗi mô hình trên một panel riêng vì hai thang đo khác nhau. Màu phân biệt nhóm đặc trưng dẫn xuất từ số dư với phần còn lại, cho thấy mức độ tập trung rõ hơn bảng số. Với Random Forest, mức đóng góp giảm tương đối đều và các đặc trưng thời gian vẫn giữ vai trò nhỏ nhưng khác 0. Với XGBoost, hai đặc trưng đầu chiếm gần như toàn bộ, mười hai đặc trưng còn lại cộng lại chưa tới 3%, trong đó </w:t>
       </w:r>
       <w:r>
         <w:rPr>
@@ -14820,7 +14349,7 @@
     <w:p>
       <w:pPr>
         <w:keepNext/>
-        <w:spacing w:before="160" w:after="60" w:line="276" w:lineRule="auto"/>
+        <w:spacing w:before="360" w:after="120" w:line="276" w:lineRule="auto"/>
         <w:ind w:firstLine="0"/>
         <w:jc w:val="left"/>
       </w:pPr>
@@ -14832,7 +14361,7 @@
           <w:b/>
           <w:i w:val="0"/>
           <w:color w:val="000000"/>
-          <w:sz w:val="26"/>
+          <w:sz w:val="28"/>
         </w:rPr>
         <w:t>5.6. Kết luận tạm thời của chương</w:t>
       </w:r>
@@ -14874,30 +14403,30 @@
     <w:p>
       <w:pPr>
         <w:keepNext/>
-        <w:spacing w:before="240" w:after="80" w:line="276" w:lineRule="auto"/>
+        <w:spacing w:before="480" w:after="240" w:line="276" w:lineRule="auto"/>
+        <w:ind w:firstLine="0"/>
+        <w:jc w:val="center"/>
+      </w:pPr>
+      <w:bookmarkStart w:id="1050" w:name="bm_h1_7"/>
+      <w:bookmarkEnd w:id="1050"/>
+      <w:r>
+        <w:rPr>
+          <w:rFonts w:ascii="Times New Roman" w:hAnsi="Times New Roman"/>
+          <w:b/>
+          <w:i w:val="0"/>
+          <w:color w:val="000000"/>
+          <w:sz w:val="30"/>
+        </w:rPr>
+        <w:t>CHƯƠNG 6. THẢO LUẬN</w:t>
+      </w:r>
+    </w:p>
+    <w:p>
+      <w:pPr>
+        <w:keepNext/>
+        <w:spacing w:before="360" w:after="120" w:line="276" w:lineRule="auto"/>
         <w:ind w:firstLine="0"/>
         <w:jc w:val="left"/>
       </w:pPr>
-      <w:bookmarkStart w:id="1050" w:name="bm_h1_7"/>
-      <w:bookmarkEnd w:id="1050"/>
-      <w:r>
-        <w:rPr>
-          <w:rFonts w:ascii="Times New Roman" w:hAnsi="Times New Roman"/>
-          <w:b/>
-          <w:i w:val="0"/>
-          <w:color w:val="000000"/>
-          <w:sz w:val="27"/>
-        </w:rPr>
-        <w:t>CHƯƠNG 6. THẢO LUẬN</w:t>
-      </w:r>
-    </w:p>
-    <w:p>
-      <w:pPr>
-        <w:keepNext/>
-        <w:spacing w:before="160" w:after="60" w:line="276" w:lineRule="auto"/>
-        <w:ind w:firstLine="0"/>
-        <w:jc w:val="left"/>
-      </w:pPr>
       <w:bookmarkStart w:id="1051" w:name="bm_h2_33"/>
       <w:bookmarkEnd w:id="1051"/>
       <w:r>
@@ -14906,7 +14435,7 @@
           <w:b/>
           <w:i w:val="0"/>
           <w:color w:val="000000"/>
-          <w:sz w:val="26"/>
+          <w:sz w:val="28"/>
         </w:rPr>
         <w:t>6.1. Trả lời các câu hỏi nghiên cứu</w:t>
       </w:r>
@@ -15023,7 +14552,7 @@
     <w:p>
       <w:pPr>
         <w:keepNext/>
-        <w:spacing w:before="160" w:after="60" w:line="276" w:lineRule="auto"/>
+        <w:spacing w:before="360" w:after="120" w:line="276" w:lineRule="auto"/>
         <w:ind w:firstLine="0"/>
         <w:jc w:val="left"/>
       </w:pPr>
@@ -15035,7 +14564,7 @@
           <w:b/>
           <w:i w:val="0"/>
           <w:color w:val="000000"/>
-          <w:sz w:val="26"/>
+          <w:sz w:val="28"/>
         </w:rPr>
         <w:t>6.2. Vì sao các chỉ số đạt mức rất cao</w:t>
       </w:r>
@@ -15148,7 +14677,7 @@
     <w:p>
       <w:pPr>
         <w:keepNext/>
-        <w:spacing w:before="160" w:after="60" w:line="276" w:lineRule="auto"/>
+        <w:spacing w:before="360" w:after="120" w:line="276" w:lineRule="auto"/>
         <w:ind w:firstLine="0"/>
         <w:jc w:val="left"/>
       </w:pPr>
@@ -15160,7 +14689,7 @@
           <w:b/>
           <w:i w:val="0"/>
           <w:color w:val="000000"/>
-          <w:sz w:val="26"/>
+          <w:sz w:val="28"/>
         </w:rPr>
         <w:t>6.3. Hiệu năng ước tính trên tỷ lệ gian lận gốc</w:t>
       </w:r>
@@ -15179,13 +14708,15 @@
           <w:color w:val="000000"/>
           <w:sz w:val="26"/>
         </w:rPr>
-        <w:t>Downsampling chỉ lấy mẫu ngẫu nhiên lớp bình thường nên không làm thay đổi phân bố có điều kiện của từng lớp. Nhờ đó, tỷ lệ phát hiện đúng và tỷ lệ báo động giả đo trên tập kiểm tra vẫn dùng được cho phân bố gốc, chỉ riêng Precision là phụ thuộc tỷ lệ lớp và cần quy chiếu lại. Bảng 6.1 trình bày kết quả quy chiếu về tỷ lệ 0,129082% của PaySim gốc, kèm khoảng tin cậy 95% tính theo phương pháp Clopper–Pearson cho tỷ lệ báo động giả.</w:t>
+        <w:t>Downsampling chỉ lấy mẫu ngẫu nhiên lớp bình thường nên không làm thay đổi phân bố có điều kiện của từng lớp. Nhờ đó, tỷ lệ phát hiện đúng và tỷ lệ báo động giả đo trên tập kiểm tra vẫn dùng được cho phân bố gốc, chỉ riêng Precision là phụ thuộc tỷ lệ lớp và cần quy chiếu lại. Bảng 6.1 trình bày kết quả quy chiếu về tỷ lệ 0,129082% của PaySim gốc, kèm khoảng tin cậy 95% tính theo phương pháp Clopper-Pearson cho tỷ lệ báo động giả.</w:t>
       </w:r>
     </w:p>
     <w:tbl>
       <w:tblPr>
         <w:tblW w:type="auto" w:w="0"/>
         <w:jc w:val="center"/>
+        <w:tblLayout w:type="fixed"/>
+        <w:tblLook w:firstColumn="1" w:firstRow="1" w:lastColumn="0" w:lastRow="0" w:noHBand="0" w:noVBand="1" w:val="04A0"/>
         <w:tblBorders>
           <w:top w:val="single" w:sz="6" w:space="0" w:color="CCCCCC"/>
           <w:bottom w:val="single" w:sz="6" w:space="0" w:color="CCCCCC"/>
@@ -15194,8 +14725,6 @@
           <w:left w:val="none"/>
           <w:right w:val="none"/>
         </w:tblBorders>
-        <w:tblLayout w:type="fixed"/>
-        <w:tblLook w:firstColumn="1" w:firstRow="1" w:lastColumn="0" w:lastRow="0" w:noHBand="0" w:noVBand="1" w:val="04A0"/>
       </w:tblPr>
       <w:tblGrid>
         <w:gridCol w:w="1512"/>
@@ -15207,8 +14736,8 @@
       </w:tblGrid>
       <w:tr>
         <w:trPr>
+          <w:tblHeader/>
           <w:cantSplit/>
-          <w:tblHeader/>
         </w:trPr>
         <w:tc>
           <w:tcPr>
@@ -15536,7 +15065,7 @@
                 <w:color w:val="000000"/>
                 <w:sz w:val="20"/>
               </w:rPr>
-              <w:t>0,8985 – 0,9995</w:t>
+              <w:t>0,8985 - 0,9995</w:t>
             </w:r>
           </w:p>
         </w:tc>
@@ -15720,7 +15249,7 @@
                 <w:color w:val="000000"/>
                 <w:sz w:val="20"/>
               </w:rPr>
-              <w:t>0,8491 – 0,9876</w:t>
+              <w:t>0,8491 - 0,9876</w:t>
             </w:r>
           </w:p>
         </w:tc>
@@ -15900,7 +15429,7 @@
                 <w:color w:val="000000"/>
                 <w:sz w:val="20"/>
               </w:rPr>
-              <w:t>0,8281 – 0,9784</w:t>
+              <w:t>0,8281 - 0,9784</w:t>
             </w:r>
           </w:p>
         </w:tc>
@@ -16084,7 +15613,7 @@
                 <w:color w:val="000000"/>
                 <w:sz w:val="20"/>
               </w:rPr>
-              <w:t>0,7738 – 0,9460</w:t>
+              <w:t>0,7738 - 0,9460</w:t>
             </w:r>
           </w:p>
         </w:tc>
@@ -16264,7 +15793,7 @@
                 <w:color w:val="000000"/>
                 <w:sz w:val="20"/>
               </w:rPr>
-              <w:t>0,0176 – 0,0191</w:t>
+              <w:t>0,0176 - 0,0191</w:t>
             </w:r>
           </w:p>
         </w:tc>
@@ -16352,7 +15881,7 @@
     <w:p>
       <w:pPr>
         <w:keepNext/>
-        <w:spacing w:before="160" w:after="60" w:line="276" w:lineRule="auto"/>
+        <w:spacing w:before="360" w:after="120" w:line="276" w:lineRule="auto"/>
         <w:ind w:firstLine="0"/>
         <w:jc w:val="left"/>
       </w:pPr>
@@ -16364,7 +15893,7 @@
           <w:b/>
           <w:i w:val="0"/>
           <w:color w:val="000000"/>
-          <w:sz w:val="26"/>
+          <w:sz w:val="28"/>
         </w:rPr>
         <w:t>6.4. Khác biệt giữa các mô hình có đủ tin cậy để xếp hạng không</w:t>
       </w:r>
@@ -16422,7 +15951,7 @@
     <w:p>
       <w:pPr>
         <w:keepNext/>
-        <w:spacing w:before="160" w:after="60" w:line="276" w:lineRule="auto"/>
+        <w:spacing w:before="360" w:after="120" w:line="276" w:lineRule="auto"/>
         <w:ind w:firstLine="0"/>
         <w:jc w:val="left"/>
       </w:pPr>
@@ -16434,7 +15963,7 @@
           <w:b/>
           <w:i w:val="0"/>
           <w:color w:val="000000"/>
-          <w:sz w:val="26"/>
+          <w:sz w:val="28"/>
         </w:rPr>
         <w:t>6.5. Vai trò của mô hình phát hiện bất thường</w:t>
       </w:r>
@@ -16493,7 +16022,7 @@
     <w:p>
       <w:pPr>
         <w:keepNext/>
-        <w:spacing w:before="160" w:after="60" w:line="276" w:lineRule="auto"/>
+        <w:spacing w:before="360" w:after="120" w:line="276" w:lineRule="auto"/>
         <w:ind w:firstLine="0"/>
         <w:jc w:val="left"/>
       </w:pPr>
@@ -16505,7 +16034,7 @@
           <w:b/>
           <w:i w:val="0"/>
           <w:color w:val="000000"/>
-          <w:sz w:val="26"/>
+          <w:sz w:val="28"/>
         </w:rPr>
         <w:t>6.6. Hạn chế của nghiên cứu</w:t>
       </w:r>
@@ -16584,7 +16113,7 @@
     <w:p>
       <w:pPr>
         <w:keepNext/>
-        <w:spacing w:before="160" w:after="60" w:line="276" w:lineRule="auto"/>
+        <w:spacing w:before="360" w:after="120" w:line="276" w:lineRule="auto"/>
         <w:ind w:firstLine="0"/>
         <w:jc w:val="left"/>
       </w:pPr>
@@ -16596,7 +16125,7 @@
           <w:b/>
           <w:i w:val="0"/>
           <w:color w:val="000000"/>
-          <w:sz w:val="26"/>
+          <w:sz w:val="28"/>
         </w:rPr>
         <w:t>6.7. Kết luận chương</w:t>
       </w:r>
@@ -16621,30 +16150,30 @@
     <w:p>
       <w:pPr>
         <w:keepNext/>
-        <w:spacing w:before="240" w:after="80" w:line="276" w:lineRule="auto"/>
+        <w:spacing w:before="480" w:after="240" w:line="276" w:lineRule="auto"/>
+        <w:ind w:firstLine="0"/>
+        <w:jc w:val="center"/>
+      </w:pPr>
+      <w:bookmarkStart w:id="1058" w:name="bm_h1_8"/>
+      <w:bookmarkEnd w:id="1058"/>
+      <w:r>
+        <w:rPr>
+          <w:rFonts w:ascii="Times New Roman" w:hAnsi="Times New Roman"/>
+          <w:b/>
+          <w:i w:val="0"/>
+          <w:color w:val="000000"/>
+          <w:sz w:val="30"/>
+        </w:rPr>
+        <w:t>CHƯƠNG 7. KẾT LUẬN VÀ HƯỚNG PHÁT TRIỂN</w:t>
+      </w:r>
+    </w:p>
+    <w:p>
+      <w:pPr>
+        <w:keepNext/>
+        <w:spacing w:before="360" w:after="120" w:line="276" w:lineRule="auto"/>
         <w:ind w:firstLine="0"/>
         <w:jc w:val="left"/>
       </w:pPr>
-      <w:bookmarkStart w:id="1058" w:name="bm_h1_8"/>
-      <w:bookmarkEnd w:id="1058"/>
-      <w:r>
-        <w:rPr>
-          <w:rFonts w:ascii="Times New Roman" w:hAnsi="Times New Roman"/>
-          <w:b/>
-          <w:i w:val="0"/>
-          <w:color w:val="000000"/>
-          <w:sz w:val="27"/>
-        </w:rPr>
-        <w:t>CHƯƠNG 7. KẾT LUẬN VÀ HƯỚNG PHÁT TRIỂN</w:t>
-      </w:r>
-    </w:p>
-    <w:p>
-      <w:pPr>
-        <w:keepNext/>
-        <w:spacing w:before="160" w:after="60" w:line="276" w:lineRule="auto"/>
-        <w:ind w:firstLine="0"/>
-        <w:jc w:val="left"/>
-      </w:pPr>
       <w:bookmarkStart w:id="1059" w:name="bm_h2_40"/>
       <w:bookmarkEnd w:id="1059"/>
       <w:r>
@@ -16653,7 +16182,7 @@
           <w:b/>
           <w:i w:val="0"/>
           <w:color w:val="000000"/>
-          <w:sz w:val="26"/>
+          <w:sz w:val="28"/>
         </w:rPr>
         <w:t>7.1. Tóm tắt công việc đã thực hiện</w:t>
       </w:r>
@@ -16712,7 +16241,7 @@
     <w:p>
       <w:pPr>
         <w:keepNext/>
-        <w:spacing w:before="160" w:after="60" w:line="276" w:lineRule="auto"/>
+        <w:spacing w:before="360" w:after="120" w:line="276" w:lineRule="auto"/>
         <w:ind w:firstLine="0"/>
         <w:jc w:val="left"/>
       </w:pPr>
@@ -16724,7 +16253,7 @@
           <w:b/>
           <w:i w:val="0"/>
           <w:color w:val="000000"/>
-          <w:sz w:val="26"/>
+          <w:sz w:val="28"/>
         </w:rPr>
         <w:t>7.2. Đối chiếu với mục tiêu đề ra</w:t>
       </w:r>
@@ -16749,6 +16278,8 @@
       <w:tblPr>
         <w:tblW w:type="auto" w:w="0"/>
         <w:jc w:val="center"/>
+        <w:tblLayout w:type="fixed"/>
+        <w:tblLook w:firstColumn="1" w:firstRow="1" w:lastColumn="0" w:lastRow="0" w:noHBand="0" w:noVBand="1" w:val="04A0"/>
         <w:tblBorders>
           <w:top w:val="single" w:sz="6" w:space="0" w:color="CCCCCC"/>
           <w:bottom w:val="single" w:sz="6" w:space="0" w:color="CCCCCC"/>
@@ -16757,8 +16288,6 @@
           <w:left w:val="none"/>
           <w:right w:val="none"/>
         </w:tblBorders>
-        <w:tblLayout w:type="fixed"/>
-        <w:tblLook w:firstColumn="1" w:firstRow="1" w:lastColumn="0" w:lastRow="0" w:noHBand="0" w:noVBand="1" w:val="04A0"/>
       </w:tblPr>
       <w:tblGrid>
         <w:gridCol w:w="2268"/>
@@ -16768,8 +16297,8 @@
       </w:tblGrid>
       <w:tr>
         <w:trPr>
+          <w:tblHeader/>
           <w:cantSplit/>
-          <w:tblHeader/>
         </w:trPr>
         <w:tc>
           <w:tcPr>
@@ -17782,7 +17311,7 @@
           <w:color w:val="000000"/>
           <w:sz w:val="26"/>
         </w:rPr>
-        <w:t>Toàn bộ bảy mục tiêu cụ thể đã hoàn thành. Trong đó mục tiêu thứ bảy đã tích hợp mô hình XGBoost-SMOTE cùng bộ tiền xử lý và scaler thật vào giao diện tương tác Streamlit, hỗ trợ bốn kịch bản thử nghiệm và vượt qua kiểm thử Browser QA.</w:t>
+        <w:t>Toàn bộ bảy mục tiêu cụ thể đã hoàn thành. Trong đó mục tiêu thứ bảy đã tích hợp mô hình XGBoost-SMOTE cùng bộ tiền xử lý và scaler thật vào giao diện tương tác Streamlit, hỗ trợ 4 kịch bản thử nghiệm và vượt qua kiểm thử Browser QA.</w:t>
       </w:r>
     </w:p>
     <w:p>
@@ -17805,7 +17334,7 @@
     <w:p>
       <w:pPr>
         <w:keepNext/>
-        <w:spacing w:before="160" w:after="60" w:line="276" w:lineRule="auto"/>
+        <w:spacing w:before="360" w:after="120" w:line="276" w:lineRule="auto"/>
         <w:ind w:firstLine="0"/>
         <w:jc w:val="left"/>
       </w:pPr>
@@ -17817,7 +17346,7 @@
           <w:b/>
           <w:i w:val="0"/>
           <w:color w:val="000000"/>
-          <w:sz w:val="26"/>
+          <w:sz w:val="28"/>
         </w:rPr>
         <w:t>7.3. Đóng góp của đồ án</w:t>
       </w:r>
@@ -17859,7 +17388,7 @@
     <w:p>
       <w:pPr>
         <w:keepNext/>
-        <w:spacing w:before="160" w:after="60" w:line="276" w:lineRule="auto"/>
+        <w:spacing w:before="360" w:after="120" w:line="276" w:lineRule="auto"/>
         <w:ind w:firstLine="0"/>
         <w:jc w:val="left"/>
       </w:pPr>
@@ -17871,7 +17400,7 @@
           <w:b/>
           <w:i w:val="0"/>
           <w:color w:val="000000"/>
-          <w:sz w:val="26"/>
+          <w:sz w:val="28"/>
         </w:rPr>
         <w:t>7.4. Hướng phát triển</w:t>
       </w:r>
@@ -17967,7 +17496,7 @@
     <w:p>
       <w:pPr>
         <w:keepNext/>
-        <w:spacing w:before="160" w:after="60" w:line="276" w:lineRule="auto"/>
+        <w:spacing w:before="360" w:after="120" w:line="276" w:lineRule="auto"/>
         <w:ind w:firstLine="0"/>
         <w:jc w:val="left"/>
       </w:pPr>
@@ -17979,7 +17508,7 @@
           <w:b/>
           <w:i w:val="0"/>
           <w:color w:val="000000"/>
-          <w:sz w:val="26"/>
+          <w:sz w:val="28"/>
         </w:rPr>
         <w:t>7.5. Kết luận chung</w:t>
       </w:r>
@@ -18021,9 +17550,9 @@
     <w:p>
       <w:pPr>
         <w:keepNext/>
-        <w:spacing w:before="240" w:after="80" w:line="276" w:lineRule="auto"/>
+        <w:spacing w:before="480" w:after="240" w:line="276" w:lineRule="auto"/>
         <w:ind w:firstLine="0"/>
-        <w:jc w:val="left"/>
+        <w:jc w:val="center"/>
       </w:pPr>
       <w:bookmarkStart w:id="1064" w:name="bm_h1_9"/>
       <w:bookmarkEnd w:id="1064"/>
@@ -18033,7 +17562,7 @@
           <w:b/>
           <w:i w:val="0"/>
           <w:color w:val="000000"/>
-          <w:sz w:val="27"/>
+          <w:sz w:val="30"/>
         </w:rPr>
         <w:t>TÀI LIỆU THAM KHẢO</w:t>
       </w:r>
@@ -18058,7 +17587,7 @@
     <w:p>
       <w:pPr>
         <w:keepNext/>
-        <w:spacing w:before="160" w:after="60" w:line="276" w:lineRule="auto"/>
+        <w:spacing w:before="360" w:after="120" w:line="276" w:lineRule="auto"/>
         <w:ind w:firstLine="0"/>
         <w:jc w:val="left"/>
       </w:pPr>
@@ -18070,7 +17599,7 @@
           <w:b/>
           <w:i w:val="0"/>
           <w:color w:val="000000"/>
-          <w:sz w:val="26"/>
+          <w:sz w:val="28"/>
         </w:rPr>
         <w:t>Tài liệu nội bộ của dự án</w:t>
       </w:r>
@@ -18079,7 +17608,7 @@
       <w:pPr>
         <w:spacing w:before="20" w:after="40" w:line="300" w:lineRule="auto"/>
         <w:ind w:left="720" w:hanging="283"/>
-        <w:jc w:val="left"/>
+        <w:jc w:val="both"/>
       </w:pPr>
       <w:r>
         <w:rPr>
@@ -18105,7 +17634,7 @@
       <w:pPr>
         <w:spacing w:before="20" w:after="40" w:line="300" w:lineRule="auto"/>
         <w:ind w:left="720" w:hanging="283"/>
-        <w:jc w:val="left"/>
+        <w:jc w:val="both"/>
       </w:pPr>
       <w:r>
         <w:rPr>
@@ -18151,7 +17680,7 @@
       <w:pPr>
         <w:spacing w:before="20" w:after="40" w:line="300" w:lineRule="auto"/>
         <w:ind w:left="720" w:hanging="283"/>
-        <w:jc w:val="left"/>
+        <w:jc w:val="both"/>
       </w:pPr>
       <w:r>
         <w:rPr>
@@ -18217,7 +17746,7 @@
       <w:pPr>
         <w:spacing w:before="20" w:after="40" w:line="300" w:lineRule="auto"/>
         <w:ind w:left="720" w:hanging="283"/>
-        <w:jc w:val="left"/>
+        <w:jc w:val="both"/>
       </w:pPr>
       <w:r>
         <w:rPr>
@@ -18263,7 +17792,7 @@
       <w:pPr>
         <w:spacing w:before="20" w:after="40" w:line="300" w:lineRule="auto"/>
         <w:ind w:left="720" w:hanging="283"/>
-        <w:jc w:val="left"/>
+        <w:jc w:val="both"/>
       </w:pPr>
       <w:r>
         <w:rPr>
@@ -18309,7 +17838,7 @@
       <w:pPr>
         <w:spacing w:before="20" w:after="40" w:line="300" w:lineRule="auto"/>
         <w:ind w:left="720" w:hanging="283"/>
-        <w:jc w:val="left"/>
+        <w:jc w:val="both"/>
       </w:pPr>
       <w:r>
         <w:rPr>
@@ -18355,7 +17884,7 @@
       <w:pPr>
         <w:spacing w:before="20" w:after="40" w:line="300" w:lineRule="auto"/>
         <w:ind w:left="720" w:hanging="283"/>
-        <w:jc w:val="left"/>
+        <w:jc w:val="both"/>
       </w:pPr>
       <w:r>
         <w:rPr>
@@ -18401,7 +17930,7 @@
       <w:pPr>
         <w:spacing w:before="20" w:after="40" w:line="300" w:lineRule="auto"/>
         <w:ind w:left="720" w:hanging="283"/>
-        <w:jc w:val="left"/>
+        <w:jc w:val="both"/>
       </w:pPr>
       <w:r>
         <w:rPr>
@@ -18420,7 +17949,7 @@
           <w:color w:val="000000"/>
           <w:sz w:val="26"/>
         </w:rPr>
-        <w:t xml:space="preserve">Nguyễn Duy Khang, </w:t>
+        <w:t xml:space="preserve">Nhóm 9, </w:t>
       </w:r>
       <w:r>
         <w:rPr>
@@ -18430,7 +17959,7 @@
           <w:color w:val="000000"/>
           <w:sz w:val="25"/>
         </w:rPr>
-        <w:t>reports/model_comparison.csv</w:t>
+        <w:t>reports/rf_smote_feature_importance.csv</w:t>
       </w:r>
       <w:r>
         <w:rPr>
@@ -18440,7 +17969,7 @@
           <w:color w:val="000000"/>
           <w:sz w:val="26"/>
         </w:rPr>
-        <w:t xml:space="preserve">, </w:t>
+        <w:t xml:space="preserve"> và </w:t>
       </w:r>
       <w:r>
         <w:rPr>
@@ -18450,7 +17979,7 @@
           <w:color w:val="000000"/>
           <w:sz w:val="25"/>
         </w:rPr>
-        <w:t>reports/figures/roc_curves_all.png</w:t>
+        <w:t>reports/xgb_smote_feature_importance.csv</w:t>
       </w:r>
       <w:r>
         <w:rPr>
@@ -18460,7 +17989,33 @@
           <w:color w:val="000000"/>
           <w:sz w:val="26"/>
         </w:rPr>
-        <w:t xml:space="preserve"> và </w:t>
+        <w:t>, mức đóng góp đặc trưng đã lưu của hai mô hình dùng SMOTENC.</w:t>
+      </w:r>
+    </w:p>
+    <w:p>
+      <w:pPr>
+        <w:spacing w:before="20" w:after="40" w:line="300" w:lineRule="auto"/>
+        <w:ind w:left="720" w:hanging="283"/>
+        <w:jc w:val="both"/>
+      </w:pPr>
+      <w:r>
+        <w:rPr>
+          <w:rFonts w:ascii="Times New Roman" w:hAnsi="Times New Roman"/>
+          <w:b/>
+          <w:color w:val="000000"/>
+          <w:sz w:val="26"/>
+        </w:rPr>
+        <w:t xml:space="preserve">-  </w:t>
+      </w:r>
+      <w:r>
+        <w:rPr>
+          <w:rFonts w:ascii="Times New Roman" w:hAnsi="Times New Roman"/>
+          <w:b w:val="0"/>
+          <w:i w:val="0"/>
+          <w:color w:val="000000"/>
+          <w:sz w:val="26"/>
+        </w:rPr>
+        <w:t xml:space="preserve">Vũ Văn Duy, </w:t>
       </w:r>
       <w:r>
         <w:rPr>
@@ -18470,7 +18025,7 @@
           <w:color w:val="000000"/>
           <w:sz w:val="25"/>
         </w:rPr>
-        <w:t>reports/figures/pr_curves_all.png</w:t>
+        <w:t>run_report_metrics.py</w:t>
       </w:r>
       <w:r>
         <w:rPr>
@@ -18480,232 +18035,74 @@
           <w:color w:val="000000"/>
           <w:sz w:val="26"/>
         </w:rPr>
-        <w:t>, bảng so sánh tổng hợp và đường ROC, Precision–Recall của bước đánh giá chéo.</w:t>
+        <w:t xml:space="preserve">, </w:t>
+      </w:r>
+      <w:r>
+        <w:rPr>
+          <w:rFonts w:ascii="Courier New" w:hAnsi="Courier New"/>
+          <w:b w:val="0"/>
+          <w:i w:val="0"/>
+          <w:color w:val="000000"/>
+          <w:sz w:val="25"/>
+        </w:rPr>
+        <w:t>reports/ch5_metrics_recomputed.csv</w:t>
+      </w:r>
+      <w:r>
+        <w:rPr>
+          <w:rFonts w:ascii="Times New Roman" w:hAnsi="Times New Roman"/>
+          <w:b w:val="0"/>
+          <w:i w:val="0"/>
+          <w:color w:val="000000"/>
+          <w:sz w:val="26"/>
+        </w:rPr>
+        <w:t xml:space="preserve"> và </w:t>
+      </w:r>
+      <w:r>
+        <w:rPr>
+          <w:rFonts w:ascii="Courier New" w:hAnsi="Courier New"/>
+          <w:b w:val="0"/>
+          <w:i w:val="0"/>
+          <w:color w:val="000000"/>
+          <w:sz w:val="25"/>
+        </w:rPr>
+        <w:t>reports/ch6_prevalence_projection.csv</w:t>
+      </w:r>
+      <w:r>
+        <w:rPr>
+          <w:rFonts w:ascii="Times New Roman" w:hAnsi="Times New Roman"/>
+          <w:b w:val="0"/>
+          <w:i w:val="0"/>
+          <w:color w:val="000000"/>
+          <w:sz w:val="26"/>
+        </w:rPr>
+        <w:t>, kết quả tính lại toàn bộ chỉ số của Chương 5 và phép quy chiếu Precision của Chương 6 từ nhãn thật cùng các tệp dự đoán đã lưu.</w:t>
       </w:r>
     </w:p>
     <w:p>
       <w:pPr>
-        <w:spacing w:before="20" w:after="40" w:line="300" w:lineRule="auto"/>
-        <w:ind w:left="720" w:hanging="283"/>
+        <w:keepNext/>
+        <w:spacing w:before="360" w:after="120" w:line="276" w:lineRule="auto"/>
+        <w:ind w:firstLine="0"/>
         <w:jc w:val="left"/>
       </w:pPr>
+      <w:bookmarkStart w:id="1066" w:name="bm_h2_46"/>
+      <w:bookmarkEnd w:id="1066"/>
       <w:r>
         <w:rPr>
           <w:rFonts w:ascii="Times New Roman" w:hAnsi="Times New Roman"/>
           <w:b/>
-          <w:color w:val="000000"/>
-          <w:sz w:val="26"/>
-        </w:rPr>
-        <w:t xml:space="preserve">-  </w:t>
-      </w:r>
-      <w:r>
-        <w:rPr>
-          <w:rFonts w:ascii="Times New Roman" w:hAnsi="Times New Roman"/>
-          <w:b w:val="0"/>
-          <w:i w:val="0"/>
-          <w:color w:val="000000"/>
-          <w:sz w:val="26"/>
-        </w:rPr>
-        <w:t xml:space="preserve">Hoàng Cao Sơn và Nguyễn Duy Khang, </w:t>
-      </w:r>
-      <w:r>
-        <w:rPr>
-          <w:rFonts w:ascii="Courier New" w:hAnsi="Courier New"/>
-          <w:b w:val="0"/>
-          <w:i w:val="0"/>
-          <w:color w:val="000000"/>
-          <w:sz w:val="25"/>
-        </w:rPr>
-        <w:t>notebooks/06_evaluation_comparison.ipynb</w:t>
-      </w:r>
-      <w:r>
-        <w:rPr>
-          <w:rFonts w:ascii="Times New Roman" w:hAnsi="Times New Roman"/>
-          <w:b w:val="0"/>
-          <w:i w:val="0"/>
-          <w:color w:val="000000"/>
-          <w:sz w:val="26"/>
-        </w:rPr>
-        <w:t>, notebook đánh giá và so sánh chéo các mô hình.</w:t>
+          <w:i w:val="0"/>
+          <w:color w:val="000000"/>
+          <w:sz w:val="28"/>
+        </w:rPr>
+        <w:t>Tài liệu tham khảo bên ngoài</w:t>
       </w:r>
     </w:p>
     <w:p>
       <w:pPr>
-        <w:spacing w:before="20" w:after="40" w:line="300" w:lineRule="auto"/>
-        <w:ind w:left="720" w:hanging="283"/>
-        <w:jc w:val="left"/>
-      </w:pPr>
-      <w:r>
-        <w:rPr>
-          <w:rFonts w:ascii="Times New Roman" w:hAnsi="Times New Roman"/>
-          <w:b/>
-          <w:color w:val="000000"/>
-          <w:sz w:val="26"/>
-        </w:rPr>
-        <w:t xml:space="preserve">-  </w:t>
-      </w:r>
-      <w:r>
-        <w:rPr>
-          <w:rFonts w:ascii="Times New Roman" w:hAnsi="Times New Roman"/>
-          <w:b w:val="0"/>
-          <w:i w:val="0"/>
-          <w:color w:val="000000"/>
-          <w:sz w:val="26"/>
-        </w:rPr>
-        <w:t xml:space="preserve">Nhóm 9, </w:t>
-      </w:r>
-      <w:r>
-        <w:rPr>
-          <w:rFonts w:ascii="Courier New" w:hAnsi="Courier New"/>
-          <w:b w:val="0"/>
-          <w:i w:val="0"/>
-          <w:color w:val="000000"/>
-          <w:sz w:val="25"/>
-        </w:rPr>
-        <w:t>reports/rf_smote_feature_importance.csv</w:t>
-      </w:r>
-      <w:r>
-        <w:rPr>
-          <w:rFonts w:ascii="Times New Roman" w:hAnsi="Times New Roman"/>
-          <w:b w:val="0"/>
-          <w:i w:val="0"/>
-          <w:color w:val="000000"/>
-          <w:sz w:val="26"/>
-        </w:rPr>
-        <w:t xml:space="preserve"> và </w:t>
-      </w:r>
-      <w:r>
-        <w:rPr>
-          <w:rFonts w:ascii="Courier New" w:hAnsi="Courier New"/>
-          <w:b w:val="0"/>
-          <w:i w:val="0"/>
-          <w:color w:val="000000"/>
-          <w:sz w:val="25"/>
-        </w:rPr>
-        <w:t>reports/xgb_smote_feature_importance.csv</w:t>
-      </w:r>
-      <w:r>
-        <w:rPr>
-          <w:rFonts w:ascii="Times New Roman" w:hAnsi="Times New Roman"/>
-          <w:b w:val="0"/>
-          <w:i w:val="0"/>
-          <w:color w:val="000000"/>
-          <w:sz w:val="26"/>
-        </w:rPr>
-        <w:t>, mức đóng góp đặc trưng đã lưu của hai mô hình dùng SMOTENC.</w:t>
-      </w:r>
-    </w:p>
-    <w:p>
-      <w:pPr>
-        <w:spacing w:before="20" w:after="40" w:line="300" w:lineRule="auto"/>
-        <w:ind w:left="720" w:hanging="283"/>
-        <w:jc w:val="left"/>
-      </w:pPr>
-      <w:r>
-        <w:rPr>
-          <w:rFonts w:ascii="Times New Roman" w:hAnsi="Times New Roman"/>
-          <w:b/>
-          <w:color w:val="000000"/>
-          <w:sz w:val="26"/>
-        </w:rPr>
-        <w:t xml:space="preserve">-  </w:t>
-      </w:r>
-      <w:r>
-        <w:rPr>
-          <w:rFonts w:ascii="Times New Roman" w:hAnsi="Times New Roman"/>
-          <w:b w:val="0"/>
-          <w:i w:val="0"/>
-          <w:color w:val="000000"/>
-          <w:sz w:val="26"/>
-        </w:rPr>
-        <w:t xml:space="preserve">Vũ Văn Duy, </w:t>
-      </w:r>
-      <w:r>
-        <w:rPr>
-          <w:rFonts w:ascii="Courier New" w:hAnsi="Courier New"/>
-          <w:b w:val="0"/>
-          <w:i w:val="0"/>
-          <w:color w:val="000000"/>
-          <w:sz w:val="25"/>
-        </w:rPr>
-        <w:t>run_report_metrics.py</w:t>
-      </w:r>
-      <w:r>
-        <w:rPr>
-          <w:rFonts w:ascii="Times New Roman" w:hAnsi="Times New Roman"/>
-          <w:b w:val="0"/>
-          <w:i w:val="0"/>
-          <w:color w:val="000000"/>
-          <w:sz w:val="26"/>
-        </w:rPr>
-        <w:t xml:space="preserve">, </w:t>
-      </w:r>
-      <w:r>
-        <w:rPr>
-          <w:rFonts w:ascii="Courier New" w:hAnsi="Courier New"/>
-          <w:b w:val="0"/>
-          <w:i w:val="0"/>
-          <w:color w:val="000000"/>
-          <w:sz w:val="25"/>
-        </w:rPr>
-        <w:t>reports/ch5_metrics_recomputed.csv</w:t>
-      </w:r>
-      <w:r>
-        <w:rPr>
-          <w:rFonts w:ascii="Times New Roman" w:hAnsi="Times New Roman"/>
-          <w:b w:val="0"/>
-          <w:i w:val="0"/>
-          <w:color w:val="000000"/>
-          <w:sz w:val="26"/>
-        </w:rPr>
-        <w:t xml:space="preserve"> và </w:t>
-      </w:r>
-      <w:r>
-        <w:rPr>
-          <w:rFonts w:ascii="Courier New" w:hAnsi="Courier New"/>
-          <w:b w:val="0"/>
-          <w:i w:val="0"/>
-          <w:color w:val="000000"/>
-          <w:sz w:val="25"/>
-        </w:rPr>
-        <w:t>reports/ch6_prevalence_projection.csv</w:t>
-      </w:r>
-      <w:r>
-        <w:rPr>
-          <w:rFonts w:ascii="Times New Roman" w:hAnsi="Times New Roman"/>
-          <w:b w:val="0"/>
-          <w:i w:val="0"/>
-          <w:color w:val="000000"/>
-          <w:sz w:val="26"/>
-        </w:rPr>
-        <w:t>, kết quả tính lại toàn bộ chỉ số của Chương 5 và phép quy chiếu Precision của Chương 6 từ nhãn thật cùng các tệp dự đoán đã lưu.</w:t>
-      </w:r>
-    </w:p>
-    <w:p>
-      <w:pPr>
-        <w:keepNext/>
-        <w:spacing w:before="160" w:after="60" w:line="276" w:lineRule="auto"/>
-        <w:ind w:firstLine="0"/>
-        <w:jc w:val="left"/>
-      </w:pPr>
-      <w:bookmarkStart w:id="1066" w:name="bm_h2_46"/>
-      <w:bookmarkEnd w:id="1066"/>
-      <w:r>
-        <w:rPr>
-          <w:rFonts w:ascii="Times New Roman" w:hAnsi="Times New Roman"/>
-          <w:b/>
-          <w:i w:val="0"/>
-          <w:color w:val="000000"/>
-          <w:sz w:val="26"/>
-        </w:rPr>
-        <w:t>Tài liệu tham khảo bên ngoài</w:t>
-      </w:r>
-    </w:p>
-    <w:p>
-      <w:pPr>
         <w:spacing w:before="40" w:after="60" w:line="276" w:lineRule="auto"/>
         <w:ind w:left="454" w:hanging="454"/>
-        <w:jc w:val="left"/>
+        <w:jc w:val="both"/>
       </w:pPr>
       <w:bookmarkStart w:id="1067" w:name="ref_1"/>
       <w:bookmarkEnd w:id="1067"/>
@@ -18727,9 +18124,9 @@
           <w:color w:val="000000"/>
           <w:sz w:val="23"/>
         </w:rPr>
-        <w:t xml:space="preserve">A. Abdallah, M. A. Maarof, and A. Zainal, “Fraud detection system: A survey,” Journal of Network and Computer Applications, vol. 68, pp. 90–113, 2016, doi: </w:t>
-      </w:r>
-      <w:hyperlink r:id="rId20">
+        <w:t xml:space="preserve">A. Abdallah, M. A. Maarof, and A. Zainal, “Fraud detection system: A survey,” Journal of Network and Computer Applications, vol. 68, pp. 90-113, 2016, doi: </w:t>
+      </w:r>
+      <w:hyperlink r:id="rId18">
         <w:r>
           <w:rPr>
             <w:rFonts w:ascii="Times New Roman" w:hAnsi="Times New Roman"/>
@@ -18745,7 +18142,7 @@
       <w:pPr>
         <w:spacing w:before="40" w:after="60" w:line="276" w:lineRule="auto"/>
         <w:ind w:left="454" w:hanging="454"/>
-        <w:jc w:val="left"/>
+        <w:jc w:val="both"/>
       </w:pPr>
       <w:bookmarkStart w:id="1068" w:name="ref_2"/>
       <w:bookmarkEnd w:id="1068"/>
@@ -18767,9 +18164,9 @@
           <w:color w:val="000000"/>
           <w:sz w:val="23"/>
         </w:rPr>
-        <w:t xml:space="preserve">E. A. Lopez-Rojas, A. Elmir, and S. Axelsson, “PaySim: A financial mobile money simulator for fraud detection,” in Proc. 28th European Modeling and Simulation Symposium, Larnaca, Cyprus, 2016, pp. 249–255. [Online]. Available: </w:t>
-      </w:r>
-      <w:hyperlink r:id="rId21">
+        <w:t xml:space="preserve">E. A. Lopez-Rojas, A. Elmir, and S. Axelsson, “PaySim: A financial mobile money simulator for fraud detection,” in Proc. 28th European Modeling and Simulation Symposium, Larnaca, Cyprus, 2016, pp. 249-255. [Online]. Available: </w:t>
+      </w:r>
+      <w:hyperlink r:id="rId19">
         <w:r>
           <w:rPr>
             <w:rFonts w:ascii="Times New Roman" w:hAnsi="Times New Roman"/>
@@ -18785,7 +18182,7 @@
       <w:pPr>
         <w:spacing w:before="40" w:after="60" w:line="276" w:lineRule="auto"/>
         <w:ind w:left="454" w:hanging="454"/>
-        <w:jc w:val="left"/>
+        <w:jc w:val="both"/>
       </w:pPr>
       <w:bookmarkStart w:id="1069" w:name="ref_3"/>
       <w:bookmarkEnd w:id="1069"/>
@@ -18809,7 +18206,7 @@
         </w:rPr>
         <w:t xml:space="preserve">E. Lopez-Rojas, “Synthetic Financial Datasets for Fraud Detection,” Kaggle. [Online]. Available: </w:t>
       </w:r>
-      <w:hyperlink r:id="rId22">
+      <w:hyperlink r:id="rId20">
         <w:r>
           <w:rPr>
             <w:rFonts w:ascii="Times New Roman" w:hAnsi="Times New Roman"/>
@@ -18835,7 +18232,7 @@
       <w:pPr>
         <w:spacing w:before="40" w:after="60" w:line="276" w:lineRule="auto"/>
         <w:ind w:left="454" w:hanging="454"/>
-        <w:jc w:val="left"/>
+        <w:jc w:val="both"/>
       </w:pPr>
       <w:bookmarkStart w:id="1070" w:name="ref_4"/>
       <w:bookmarkEnd w:id="1070"/>
@@ -18857,9 +18254,9 @@
           <w:color w:val="000000"/>
           <w:sz w:val="23"/>
         </w:rPr>
-        <w:t xml:space="preserve">N. V. Chawla, K. W. Bowyer, L. O. Hall, and W. P. Kegelmeyer, “SMOTE: Synthetic Minority Over-sampling Technique,” Journal of Artificial Intelligence Research, vol. 16, pp. 321–357, 2002, doi: </w:t>
-      </w:r>
-      <w:hyperlink r:id="rId23">
+        <w:t xml:space="preserve">N. V. Chawla, K. W. Bowyer, L. O. Hall, and W. P. Kegelmeyer, “SMOTE: Synthetic Minority Over-sampling Technique,” Journal of Artificial Intelligence Research, vol. 16, pp. 321-357, 2002, doi: </w:t>
+      </w:r>
+      <w:hyperlink r:id="rId21">
         <w:r>
           <w:rPr>
             <w:rFonts w:ascii="Times New Roman" w:hAnsi="Times New Roman"/>
@@ -18875,7 +18272,7 @@
       <w:pPr>
         <w:spacing w:before="40" w:after="60" w:line="276" w:lineRule="auto"/>
         <w:ind w:left="454" w:hanging="454"/>
-        <w:jc w:val="left"/>
+        <w:jc w:val="both"/>
       </w:pPr>
       <w:bookmarkStart w:id="1071" w:name="ref_5"/>
       <w:bookmarkEnd w:id="1071"/>
@@ -18897,9 +18294,9 @@
           <w:color w:val="000000"/>
           <w:sz w:val="23"/>
         </w:rPr>
-        <w:t xml:space="preserve">H. He, Y. Bai, E. A. Garcia, and S. Li, “ADASYN: Adaptive synthetic sampling approach for imbalanced learning,” in Proc. IEEE International Joint Conference on Neural Networks, Hong Kong, 2008, pp. 1322–1328, doi: </w:t>
-      </w:r>
-      <w:hyperlink r:id="rId24">
+        <w:t xml:space="preserve">H. He, Y. Bai, E. A. Garcia, and S. Li, “ADASYN: Adaptive synthetic sampling approach for imbalanced learning,” in Proc. IEEE International Joint Conference on Neural Networks, Hong Kong, 2008, pp. 1322-1328, doi: </w:t>
+      </w:r>
+      <w:hyperlink r:id="rId22">
         <w:r>
           <w:rPr>
             <w:rFonts w:ascii="Times New Roman" w:hAnsi="Times New Roman"/>
@@ -18915,7 +18312,7 @@
       <w:pPr>
         <w:spacing w:before="40" w:after="60" w:line="276" w:lineRule="auto"/>
         <w:ind w:left="454" w:hanging="454"/>
-        <w:jc w:val="left"/>
+        <w:jc w:val="both"/>
       </w:pPr>
       <w:bookmarkStart w:id="1072" w:name="ref_6"/>
       <w:bookmarkEnd w:id="1072"/>
@@ -18937,9 +18334,9 @@
           <w:color w:val="000000"/>
           <w:sz w:val="23"/>
         </w:rPr>
-        <w:t xml:space="preserve">L. Breiman, “Random Forests,” Machine Learning, vol. 45, no. 1, pp. 5–32, 2001, doi: </w:t>
-      </w:r>
-      <w:hyperlink r:id="rId25">
+        <w:t xml:space="preserve">L. Breiman, “Random Forests,” Machine Learning, vol. 45, no. 1, pp. 5-32, 2001, doi: </w:t>
+      </w:r>
+      <w:hyperlink r:id="rId23">
         <w:r>
           <w:rPr>
             <w:rFonts w:ascii="Times New Roman" w:hAnsi="Times New Roman"/>
@@ -18955,7 +18352,7 @@
       <w:pPr>
         <w:spacing w:before="40" w:after="60" w:line="276" w:lineRule="auto"/>
         <w:ind w:left="454" w:hanging="454"/>
-        <w:jc w:val="left"/>
+        <w:jc w:val="both"/>
       </w:pPr>
       <w:bookmarkStart w:id="1073" w:name="ref_7"/>
       <w:bookmarkEnd w:id="1073"/>
@@ -18977,9 +18374,9 @@
           <w:color w:val="000000"/>
           <w:sz w:val="23"/>
         </w:rPr>
-        <w:t xml:space="preserve">T. Chen and C. Guestrin, “XGBoost: A scalable tree boosting system,” in Proc. 22nd ACM SIGKDD International Conference on Knowledge Discovery and Data Mining, San Francisco, CA, USA, 2016, pp. 785–794, doi: </w:t>
-      </w:r>
-      <w:hyperlink r:id="rId26">
+        <w:t xml:space="preserve">T. Chen and C. Guestrin, “XGBoost: A scalable tree boosting system,” in Proc. 22nd ACM SIGKDD International Conference on Knowledge Discovery and Data Mining, San Francisco, CA, USA, 2016, pp. 785-794, doi: </w:t>
+      </w:r>
+      <w:hyperlink r:id="rId24">
         <w:r>
           <w:rPr>
             <w:rFonts w:ascii="Times New Roman" w:hAnsi="Times New Roman"/>
@@ -18995,7 +18392,7 @@
       <w:pPr>
         <w:spacing w:before="40" w:after="60" w:line="276" w:lineRule="auto"/>
         <w:ind w:left="454" w:hanging="454"/>
-        <w:jc w:val="left"/>
+        <w:jc w:val="both"/>
       </w:pPr>
       <w:bookmarkStart w:id="1074" w:name="ref_8"/>
       <w:bookmarkEnd w:id="1074"/>
@@ -19017,9 +18414,9 @@
           <w:color w:val="000000"/>
           <w:sz w:val="23"/>
         </w:rPr>
-        <w:t xml:space="preserve">G. E. Hinton and R. R. Salakhutdinov, “Reducing the dimensionality of data with neural networks,” Science, vol. 313, no. 5786, pp. 504–507, 2006, doi: </w:t>
-      </w:r>
-      <w:hyperlink r:id="rId27">
+        <w:t xml:space="preserve">G. E. Hinton and R. R. Salakhutdinov, “Reducing the dimensionality of data with neural networks,” Science, vol. 313, no. 5786, pp. 504-507, 2006, doi: </w:t>
+      </w:r>
+      <w:hyperlink r:id="rId25">
         <w:r>
           <w:rPr>
             <w:rFonts w:ascii="Times New Roman" w:hAnsi="Times New Roman"/>

</xml_diff>

<commit_message>
feat(slide): synchronize slides, script, and documentation with 18/18 audit points from Cam
</commit_message>
<xml_diff>
--- a/draft/fraud-detection/reports/[Nhom9]_BaoCao_FraudDetection.docx
+++ b/draft/fraud-detection/reports/[Nhom9]_BaoCao_FraudDetection.docx
@@ -133,7 +133,7 @@
           <w:color w:val="000000"/>
           <w:sz w:val="27"/>
         </w:rPr>
-        <w:t>"HỆ THỐNG PHÁT HIỆN GIAO DỊCH TÀI CHÍNH BẤT THƯỜNG VÀ NGHI VẤN GIAN LẬN"</w:t>
+        <w:t>HỆ THỐNG PHÁT HIỆN GIAO DỊCH TÀI CHÍNH BẤT THƯỜNG VÀ NGHI VẤN GIAN LẬN</w:t>
       </w:r>
     </w:p>
     <w:tbl>
@@ -341,7 +341,7 @@
     <w:p>
       <w:pPr>
         <w:tabs>
-          <w:tab w:pos="9071" w:val="right" w:leader="dot"/>
+          <w:tab w:pos="8957" w:val="right" w:leader="dot"/>
         </w:tabs>
         <w:spacing w:before="60" w:after="40" w:line="300" w:lineRule="auto"/>
       </w:pPr>
@@ -364,14 +364,15 @@
             <w:b/>
             <w:color w:val="000000"/>
           </w:rPr>
-          <w:t xml:space="preserve">	1</w:t>
+          <w:tab/>
+          <w:t xml:space="preserve">1</w:t>
         </w:r>
       </w:hyperlink>
     </w:p>
     <w:p>
       <w:pPr>
         <w:tabs>
-          <w:tab w:pos="9071" w:val="right" w:leader="dot"/>
+          <w:tab w:pos="8957" w:val="right" w:leader="dot"/>
         </w:tabs>
         <w:spacing w:before="60" w:after="40" w:line="300" w:lineRule="auto"/>
       </w:pPr>
@@ -394,14 +395,15 @@
             <w:b/>
             <w:color w:val="000000"/>
           </w:rPr>
-          <w:t xml:space="preserve">	2</w:t>
+          <w:tab/>
+          <w:t xml:space="preserve">2</w:t>
         </w:r>
       </w:hyperlink>
     </w:p>
     <w:p>
       <w:pPr>
         <w:tabs>
-          <w:tab w:pos="9071" w:val="right" w:leader="dot"/>
+          <w:tab w:pos="8617" w:val="right" w:leader="dot"/>
         </w:tabs>
         <w:spacing w:before="20" w:after="40" w:line="300" w:lineRule="auto"/>
         <w:ind w:left="340"/>
@@ -423,14 +425,15 @@
             <w:sz w:val="23"/>
             <w:color w:val="000000"/>
           </w:rPr>
-          <w:t xml:space="preserve">	2</w:t>
+          <w:tab/>
+          <w:t xml:space="preserve">2</w:t>
         </w:r>
       </w:hyperlink>
     </w:p>
     <w:p>
       <w:pPr>
         <w:tabs>
-          <w:tab w:pos="9071" w:val="right" w:leader="dot"/>
+          <w:tab w:pos="8617" w:val="right" w:leader="dot"/>
         </w:tabs>
         <w:spacing w:before="20" w:after="40" w:line="300" w:lineRule="auto"/>
         <w:ind w:left="340"/>
@@ -452,14 +455,15 @@
             <w:sz w:val="23"/>
             <w:color w:val="000000"/>
           </w:rPr>
-          <w:t xml:space="preserve">	2</w:t>
+          <w:tab/>
+          <w:t xml:space="preserve">2</w:t>
         </w:r>
       </w:hyperlink>
     </w:p>
     <w:p>
       <w:pPr>
         <w:tabs>
-          <w:tab w:pos="9071" w:val="right" w:leader="dot"/>
+          <w:tab w:pos="8617" w:val="right" w:leader="dot"/>
         </w:tabs>
         <w:spacing w:before="20" w:after="40" w:line="300" w:lineRule="auto"/>
         <w:ind w:left="340"/>
@@ -481,14 +485,15 @@
             <w:sz w:val="23"/>
             <w:color w:val="000000"/>
           </w:rPr>
-          <w:t xml:space="preserve">	2</w:t>
+          <w:tab/>
+          <w:t xml:space="preserve">2</w:t>
         </w:r>
       </w:hyperlink>
     </w:p>
     <w:p>
       <w:pPr>
         <w:tabs>
-          <w:tab w:pos="9071" w:val="right" w:leader="dot"/>
+          <w:tab w:pos="8277" w:val="right" w:leader="dot"/>
         </w:tabs>
         <w:spacing w:before="20" w:after="40" w:line="300" w:lineRule="auto"/>
         <w:ind w:left="680"/>
@@ -510,14 +515,15 @@
             <w:sz w:val="23"/>
             <w:color w:val="000000"/>
           </w:rPr>
-          <w:t xml:space="preserve">	3</w:t>
+          <w:tab/>
+          <w:t xml:space="preserve">3</w:t>
         </w:r>
       </w:hyperlink>
     </w:p>
     <w:p>
       <w:pPr>
         <w:tabs>
-          <w:tab w:pos="9071" w:val="right" w:leader="dot"/>
+          <w:tab w:pos="8277" w:val="right" w:leader="dot"/>
         </w:tabs>
         <w:spacing w:before="20" w:after="40" w:line="300" w:lineRule="auto"/>
         <w:ind w:left="680"/>
@@ -539,14 +545,15 @@
             <w:sz w:val="23"/>
             <w:color w:val="000000"/>
           </w:rPr>
-          <w:t xml:space="preserve">	3</w:t>
+          <w:tab/>
+          <w:t xml:space="preserve">3</w:t>
         </w:r>
       </w:hyperlink>
     </w:p>
     <w:p>
       <w:pPr>
         <w:tabs>
-          <w:tab w:pos="9071" w:val="right" w:leader="dot"/>
+          <w:tab w:pos="8617" w:val="right" w:leader="dot"/>
         </w:tabs>
         <w:spacing w:before="20" w:after="40" w:line="300" w:lineRule="auto"/>
         <w:ind w:left="340"/>
@@ -568,14 +575,15 @@
             <w:sz w:val="23"/>
             <w:color w:val="000000"/>
           </w:rPr>
-          <w:t xml:space="preserve">	4</w:t>
+          <w:tab/>
+          <w:t xml:space="preserve">4</w:t>
         </w:r>
       </w:hyperlink>
     </w:p>
     <w:p>
       <w:pPr>
         <w:tabs>
-          <w:tab w:pos="9071" w:val="right" w:leader="dot"/>
+          <w:tab w:pos="8617" w:val="right" w:leader="dot"/>
         </w:tabs>
         <w:spacing w:before="20" w:after="40" w:line="300" w:lineRule="auto"/>
         <w:ind w:left="340"/>
@@ -597,14 +605,15 @@
             <w:sz w:val="23"/>
             <w:color w:val="000000"/>
           </w:rPr>
-          <w:t xml:space="preserve">	4</w:t>
+          <w:tab/>
+          <w:t xml:space="preserve">4</w:t>
         </w:r>
       </w:hyperlink>
     </w:p>
     <w:p>
       <w:pPr>
         <w:tabs>
-          <w:tab w:pos="9071" w:val="right" w:leader="dot"/>
+          <w:tab w:pos="8957" w:val="right" w:leader="dot"/>
         </w:tabs>
         <w:spacing w:before="60" w:after="40" w:line="300" w:lineRule="auto"/>
       </w:pPr>
@@ -627,14 +636,15 @@
             <w:b/>
             <w:color w:val="000000"/>
           </w:rPr>
-          <w:t xml:space="preserve">	5</w:t>
+          <w:tab/>
+          <w:t xml:space="preserve">5</w:t>
         </w:r>
       </w:hyperlink>
     </w:p>
     <w:p>
       <w:pPr>
         <w:tabs>
-          <w:tab w:pos="9071" w:val="right" w:leader="dot"/>
+          <w:tab w:pos="8617" w:val="right" w:leader="dot"/>
         </w:tabs>
         <w:spacing w:before="20" w:after="40" w:line="300" w:lineRule="auto"/>
         <w:ind w:left="340"/>
@@ -656,14 +666,15 @@
             <w:sz w:val="23"/>
             <w:color w:val="000000"/>
           </w:rPr>
-          <w:t xml:space="preserve">	5</w:t>
+          <w:tab/>
+          <w:t xml:space="preserve">5</w:t>
         </w:r>
       </w:hyperlink>
     </w:p>
     <w:p>
       <w:pPr>
         <w:tabs>
-          <w:tab w:pos="9071" w:val="right" w:leader="dot"/>
+          <w:tab w:pos="8617" w:val="right" w:leader="dot"/>
         </w:tabs>
         <w:spacing w:before="20" w:after="40" w:line="300" w:lineRule="auto"/>
         <w:ind w:left="340"/>
@@ -685,14 +696,15 @@
             <w:sz w:val="23"/>
             <w:color w:val="000000"/>
           </w:rPr>
-          <w:t xml:space="preserve">	5</w:t>
+          <w:tab/>
+          <w:t xml:space="preserve">5</w:t>
         </w:r>
       </w:hyperlink>
     </w:p>
     <w:p>
       <w:pPr>
         <w:tabs>
-          <w:tab w:pos="9071" w:val="right" w:leader="dot"/>
+          <w:tab w:pos="8617" w:val="right" w:leader="dot"/>
         </w:tabs>
         <w:spacing w:before="20" w:after="40" w:line="300" w:lineRule="auto"/>
         <w:ind w:left="340"/>
@@ -714,14 +726,15 @@
             <w:sz w:val="23"/>
             <w:color w:val="000000"/>
           </w:rPr>
-          <w:t xml:space="preserve">	6</w:t>
+          <w:tab/>
+          <w:t xml:space="preserve">6</w:t>
         </w:r>
       </w:hyperlink>
     </w:p>
     <w:p>
       <w:pPr>
         <w:tabs>
-          <w:tab w:pos="9071" w:val="right" w:leader="dot"/>
+          <w:tab w:pos="8277" w:val="right" w:leader="dot"/>
         </w:tabs>
         <w:spacing w:before="20" w:after="40" w:line="300" w:lineRule="auto"/>
         <w:ind w:left="680"/>
@@ -743,14 +756,15 @@
             <w:sz w:val="23"/>
             <w:color w:val="000000"/>
           </w:rPr>
-          <w:t xml:space="preserve">	6</w:t>
+          <w:tab/>
+          <w:t xml:space="preserve">6</w:t>
         </w:r>
       </w:hyperlink>
     </w:p>
     <w:p>
       <w:pPr>
         <w:tabs>
-          <w:tab w:pos="9071" w:val="right" w:leader="dot"/>
+          <w:tab w:pos="8277" w:val="right" w:leader="dot"/>
         </w:tabs>
         <w:spacing w:before="20" w:after="40" w:line="300" w:lineRule="auto"/>
         <w:ind w:left="680"/>
@@ -772,14 +786,15 @@
             <w:sz w:val="23"/>
             <w:color w:val="000000"/>
           </w:rPr>
-          <w:t xml:space="preserve">	6</w:t>
+          <w:tab/>
+          <w:t xml:space="preserve">6</w:t>
         </w:r>
       </w:hyperlink>
     </w:p>
     <w:p>
       <w:pPr>
         <w:tabs>
-          <w:tab w:pos="9071" w:val="right" w:leader="dot"/>
+          <w:tab w:pos="8277" w:val="right" w:leader="dot"/>
         </w:tabs>
         <w:spacing w:before="20" w:after="40" w:line="300" w:lineRule="auto"/>
         <w:ind w:left="680"/>
@@ -801,14 +816,15 @@
             <w:sz w:val="23"/>
             <w:color w:val="000000"/>
           </w:rPr>
-          <w:t xml:space="preserve">	6</w:t>
+          <w:tab/>
+          <w:t xml:space="preserve">6</w:t>
         </w:r>
       </w:hyperlink>
     </w:p>
     <w:p>
       <w:pPr>
         <w:tabs>
-          <w:tab w:pos="9071" w:val="right" w:leader="dot"/>
+          <w:tab w:pos="8277" w:val="right" w:leader="dot"/>
         </w:tabs>
         <w:spacing w:before="20" w:after="40" w:line="300" w:lineRule="auto"/>
         <w:ind w:left="680"/>
@@ -830,14 +846,15 @@
             <w:sz w:val="23"/>
             <w:color w:val="000000"/>
           </w:rPr>
-          <w:t xml:space="preserve">	6</w:t>
+          <w:tab/>
+          <w:t xml:space="preserve">6</w:t>
         </w:r>
       </w:hyperlink>
     </w:p>
     <w:p>
       <w:pPr>
         <w:tabs>
-          <w:tab w:pos="9071" w:val="right" w:leader="dot"/>
+          <w:tab w:pos="8617" w:val="right" w:leader="dot"/>
         </w:tabs>
         <w:spacing w:before="20" w:after="40" w:line="300" w:lineRule="auto"/>
         <w:ind w:left="340"/>
@@ -859,14 +876,15 @@
             <w:sz w:val="23"/>
             <w:color w:val="000000"/>
           </w:rPr>
-          <w:t xml:space="preserve">	6</w:t>
+          <w:tab/>
+          <w:t xml:space="preserve">6</w:t>
         </w:r>
       </w:hyperlink>
     </w:p>
     <w:p>
       <w:pPr>
         <w:tabs>
-          <w:tab w:pos="9071" w:val="right" w:leader="dot"/>
+          <w:tab w:pos="8617" w:val="right" w:leader="dot"/>
         </w:tabs>
         <w:spacing w:before="20" w:after="40" w:line="300" w:lineRule="auto"/>
         <w:ind w:left="340"/>
@@ -888,14 +906,15 @@
             <w:sz w:val="23"/>
             <w:color w:val="000000"/>
           </w:rPr>
-          <w:t xml:space="preserve">	7</w:t>
+          <w:tab/>
+          <w:t xml:space="preserve">7</w:t>
         </w:r>
       </w:hyperlink>
     </w:p>
     <w:p>
       <w:pPr>
         <w:tabs>
-          <w:tab w:pos="9071" w:val="right" w:leader="dot"/>
+          <w:tab w:pos="8957" w:val="right" w:leader="dot"/>
         </w:tabs>
         <w:spacing w:before="60" w:after="40" w:line="300" w:lineRule="auto"/>
       </w:pPr>
@@ -918,14 +937,15 @@
             <w:b/>
             <w:color w:val="000000"/>
           </w:rPr>
-          <w:t xml:space="preserve">	7</w:t>
+          <w:tab/>
+          <w:t xml:space="preserve">7</w:t>
         </w:r>
       </w:hyperlink>
     </w:p>
     <w:p>
       <w:pPr>
         <w:tabs>
-          <w:tab w:pos="9071" w:val="right" w:leader="dot"/>
+          <w:tab w:pos="8617" w:val="right" w:leader="dot"/>
         </w:tabs>
         <w:spacing w:before="20" w:after="40" w:line="300" w:lineRule="auto"/>
         <w:ind w:left="340"/>
@@ -947,14 +967,15 @@
             <w:sz w:val="23"/>
             <w:color w:val="000000"/>
           </w:rPr>
-          <w:t xml:space="preserve">	7</w:t>
+          <w:tab/>
+          <w:t xml:space="preserve">7</w:t>
         </w:r>
       </w:hyperlink>
     </w:p>
     <w:p>
       <w:pPr>
         <w:tabs>
-          <w:tab w:pos="9071" w:val="right" w:leader="dot"/>
+          <w:tab w:pos="8617" w:val="right" w:leader="dot"/>
         </w:tabs>
         <w:spacing w:before="20" w:after="40" w:line="300" w:lineRule="auto"/>
         <w:ind w:left="340"/>
@@ -976,14 +997,15 @@
             <w:sz w:val="23"/>
             <w:color w:val="000000"/>
           </w:rPr>
-          <w:t xml:space="preserve">	7</w:t>
+          <w:tab/>
+          <w:t xml:space="preserve">7</w:t>
         </w:r>
       </w:hyperlink>
     </w:p>
     <w:p>
       <w:pPr>
         <w:tabs>
-          <w:tab w:pos="9071" w:val="right" w:leader="dot"/>
+          <w:tab w:pos="8617" w:val="right" w:leader="dot"/>
         </w:tabs>
         <w:spacing w:before="20" w:after="40" w:line="300" w:lineRule="auto"/>
         <w:ind w:left="340"/>
@@ -1005,14 +1027,15 @@
             <w:sz w:val="23"/>
             <w:color w:val="000000"/>
           </w:rPr>
-          <w:t xml:space="preserve">	7</w:t>
+          <w:tab/>
+          <w:t xml:space="preserve">7</w:t>
         </w:r>
       </w:hyperlink>
     </w:p>
     <w:p>
       <w:pPr>
         <w:tabs>
-          <w:tab w:pos="9071" w:val="right" w:leader="dot"/>
+          <w:tab w:pos="8617" w:val="right" w:leader="dot"/>
         </w:tabs>
         <w:spacing w:before="20" w:after="40" w:line="300" w:lineRule="auto"/>
         <w:ind w:left="340"/>
@@ -1034,14 +1057,15 @@
             <w:sz w:val="23"/>
             <w:color w:val="000000"/>
           </w:rPr>
-          <w:t xml:space="preserve">	9</w:t>
+          <w:tab/>
+          <w:t xml:space="preserve">9</w:t>
         </w:r>
       </w:hyperlink>
     </w:p>
     <w:p>
       <w:pPr>
         <w:tabs>
-          <w:tab w:pos="9071" w:val="right" w:leader="dot"/>
+          <w:tab w:pos="8617" w:val="right" w:leader="dot"/>
         </w:tabs>
         <w:spacing w:before="20" w:after="40" w:line="300" w:lineRule="auto"/>
         <w:ind w:left="340"/>
@@ -1063,14 +1087,15 @@
             <w:sz w:val="23"/>
             <w:color w:val="000000"/>
           </w:rPr>
-          <w:t xml:space="preserve">	9</w:t>
+          <w:tab/>
+          <w:t xml:space="preserve">9</w:t>
         </w:r>
       </w:hyperlink>
     </w:p>
     <w:p>
       <w:pPr>
         <w:tabs>
-          <w:tab w:pos="9071" w:val="right" w:leader="dot"/>
+          <w:tab w:pos="8617" w:val="right" w:leader="dot"/>
         </w:tabs>
         <w:spacing w:before="20" w:after="40" w:line="300" w:lineRule="auto"/>
         <w:ind w:left="340"/>
@@ -1092,14 +1117,15 @@
             <w:sz w:val="23"/>
             <w:color w:val="000000"/>
           </w:rPr>
-          <w:t xml:space="preserve">	9</w:t>
+          <w:tab/>
+          <w:t xml:space="preserve">9</w:t>
         </w:r>
       </w:hyperlink>
     </w:p>
     <w:p>
       <w:pPr>
         <w:tabs>
-          <w:tab w:pos="9071" w:val="right" w:leader="dot"/>
+          <w:tab w:pos="8277" w:val="right" w:leader="dot"/>
         </w:tabs>
         <w:spacing w:before="20" w:after="40" w:line="300" w:lineRule="auto"/>
         <w:ind w:left="680"/>
@@ -1121,14 +1147,15 @@
             <w:sz w:val="23"/>
             <w:color w:val="000000"/>
           </w:rPr>
-          <w:t xml:space="preserve">	9</w:t>
+          <w:tab/>
+          <w:t xml:space="preserve">9</w:t>
         </w:r>
       </w:hyperlink>
     </w:p>
     <w:p>
       <w:pPr>
         <w:tabs>
-          <w:tab w:pos="9071" w:val="right" w:leader="dot"/>
+          <w:tab w:pos="8277" w:val="right" w:leader="dot"/>
         </w:tabs>
         <w:spacing w:before="20" w:after="40" w:line="300" w:lineRule="auto"/>
         <w:ind w:left="680"/>
@@ -1150,14 +1177,15 @@
             <w:sz w:val="23"/>
             <w:color w:val="000000"/>
           </w:rPr>
-          <w:t xml:space="preserve">	9</w:t>
+          <w:tab/>
+          <w:t xml:space="preserve">9</w:t>
         </w:r>
       </w:hyperlink>
     </w:p>
     <w:p>
       <w:pPr>
         <w:tabs>
-          <w:tab w:pos="9071" w:val="right" w:leader="dot"/>
+          <w:tab w:pos="8277" w:val="right" w:leader="dot"/>
         </w:tabs>
         <w:spacing w:before="20" w:after="40" w:line="300" w:lineRule="auto"/>
         <w:ind w:left="680"/>
@@ -1179,14 +1207,15 @@
             <w:sz w:val="23"/>
             <w:color w:val="000000"/>
           </w:rPr>
-          <w:t xml:space="preserve">	9</w:t>
+          <w:tab/>
+          <w:t xml:space="preserve">9</w:t>
         </w:r>
       </w:hyperlink>
     </w:p>
     <w:p>
       <w:pPr>
         <w:tabs>
-          <w:tab w:pos="9071" w:val="right" w:leader="dot"/>
+          <w:tab w:pos="8277" w:val="right" w:leader="dot"/>
         </w:tabs>
         <w:spacing w:before="20" w:after="40" w:line="300" w:lineRule="auto"/>
         <w:ind w:left="680"/>
@@ -1208,14 +1237,15 @@
             <w:sz w:val="23"/>
             <w:color w:val="000000"/>
           </w:rPr>
-          <w:t xml:space="preserve">	9</w:t>
+          <w:tab/>
+          <w:t xml:space="preserve">9</w:t>
         </w:r>
       </w:hyperlink>
     </w:p>
     <w:p>
       <w:pPr>
         <w:tabs>
-          <w:tab w:pos="9071" w:val="right" w:leader="dot"/>
+          <w:tab w:pos="8277" w:val="right" w:leader="dot"/>
         </w:tabs>
         <w:spacing w:before="20" w:after="40" w:line="300" w:lineRule="auto"/>
         <w:ind w:left="680"/>
@@ -1237,14 +1267,15 @@
             <w:sz w:val="23"/>
             <w:color w:val="000000"/>
           </w:rPr>
-          <w:t xml:space="preserve">	11</w:t>
+          <w:tab/>
+          <w:t xml:space="preserve">11</w:t>
         </w:r>
       </w:hyperlink>
     </w:p>
     <w:p>
       <w:pPr>
         <w:tabs>
-          <w:tab w:pos="9071" w:val="right" w:leader="dot"/>
+          <w:tab w:pos="8617" w:val="right" w:leader="dot"/>
         </w:tabs>
         <w:spacing w:before="20" w:after="40" w:line="300" w:lineRule="auto"/>
         <w:ind w:left="340"/>
@@ -1266,14 +1297,15 @@
             <w:sz w:val="23"/>
             <w:color w:val="000000"/>
           </w:rPr>
-          <w:t xml:space="preserve">	11</w:t>
+          <w:tab/>
+          <w:t xml:space="preserve">11</w:t>
         </w:r>
       </w:hyperlink>
     </w:p>
     <w:p>
       <w:pPr>
         <w:tabs>
-          <w:tab w:pos="9071" w:val="right" w:leader="dot"/>
+          <w:tab w:pos="8957" w:val="right" w:leader="dot"/>
         </w:tabs>
         <w:spacing w:before="60" w:after="40" w:line="300" w:lineRule="auto"/>
       </w:pPr>
@@ -1296,14 +1328,15 @@
             <w:b/>
             <w:color w:val="000000"/>
           </w:rPr>
-          <w:t xml:space="preserve">	12</w:t>
+          <w:tab/>
+          <w:t xml:space="preserve">12</w:t>
         </w:r>
       </w:hyperlink>
     </w:p>
     <w:p>
       <w:pPr>
         <w:tabs>
-          <w:tab w:pos="9071" w:val="right" w:leader="dot"/>
+          <w:tab w:pos="8617" w:val="right" w:leader="dot"/>
         </w:tabs>
         <w:spacing w:before="20" w:after="40" w:line="300" w:lineRule="auto"/>
         <w:ind w:left="340"/>
@@ -1325,14 +1358,15 @@
             <w:sz w:val="23"/>
             <w:color w:val="000000"/>
           </w:rPr>
-          <w:t xml:space="preserve">	12</w:t>
+          <w:tab/>
+          <w:t xml:space="preserve">12</w:t>
         </w:r>
       </w:hyperlink>
     </w:p>
     <w:p>
       <w:pPr>
         <w:tabs>
-          <w:tab w:pos="9071" w:val="right" w:leader="dot"/>
+          <w:tab w:pos="8617" w:val="right" w:leader="dot"/>
         </w:tabs>
         <w:spacing w:before="20" w:after="40" w:line="300" w:lineRule="auto"/>
         <w:ind w:left="340"/>
@@ -1354,14 +1388,15 @@
             <w:sz w:val="23"/>
             <w:color w:val="000000"/>
           </w:rPr>
-          <w:t xml:space="preserve">	12</w:t>
+          <w:tab/>
+          <w:t xml:space="preserve">12</w:t>
         </w:r>
       </w:hyperlink>
     </w:p>
     <w:p>
       <w:pPr>
         <w:tabs>
-          <w:tab w:pos="9071" w:val="right" w:leader="dot"/>
+          <w:tab w:pos="8617" w:val="right" w:leader="dot"/>
         </w:tabs>
         <w:spacing w:before="20" w:after="40" w:line="300" w:lineRule="auto"/>
         <w:ind w:left="340"/>
@@ -1383,14 +1418,15 @@
             <w:sz w:val="23"/>
             <w:color w:val="000000"/>
           </w:rPr>
-          <w:t xml:space="preserve">	12</w:t>
+          <w:tab/>
+          <w:t xml:space="preserve">12</w:t>
         </w:r>
       </w:hyperlink>
     </w:p>
     <w:p>
       <w:pPr>
         <w:tabs>
-          <w:tab w:pos="9071" w:val="right" w:leader="dot"/>
+          <w:tab w:pos="8617" w:val="right" w:leader="dot"/>
         </w:tabs>
         <w:spacing w:before="20" w:after="40" w:line="300" w:lineRule="auto"/>
         <w:ind w:left="340"/>
@@ -1412,14 +1448,15 @@
             <w:sz w:val="23"/>
             <w:color w:val="000000"/>
           </w:rPr>
-          <w:t xml:space="preserve">	13</w:t>
+          <w:tab/>
+          <w:t xml:space="preserve">13</w:t>
         </w:r>
       </w:hyperlink>
     </w:p>
     <w:p>
       <w:pPr>
         <w:tabs>
-          <w:tab w:pos="9071" w:val="right" w:leader="dot"/>
+          <w:tab w:pos="8617" w:val="right" w:leader="dot"/>
         </w:tabs>
         <w:spacing w:before="20" w:after="40" w:line="300" w:lineRule="auto"/>
         <w:ind w:left="340"/>
@@ -1441,14 +1478,15 @@
             <w:sz w:val="23"/>
             <w:color w:val="000000"/>
           </w:rPr>
-          <w:t xml:space="preserve">	14</w:t>
+          <w:tab/>
+          <w:t xml:space="preserve">14</w:t>
         </w:r>
       </w:hyperlink>
     </w:p>
     <w:p>
       <w:pPr>
         <w:tabs>
-          <w:tab w:pos="9071" w:val="right" w:leader="dot"/>
+          <w:tab w:pos="8617" w:val="right" w:leader="dot"/>
         </w:tabs>
         <w:spacing w:before="20" w:after="40" w:line="300" w:lineRule="auto"/>
         <w:ind w:left="340"/>
@@ -1470,14 +1508,15 @@
             <w:sz w:val="23"/>
             <w:color w:val="000000"/>
           </w:rPr>
-          <w:t xml:space="preserve">	14</w:t>
+          <w:tab/>
+          <w:t xml:space="preserve">14</w:t>
         </w:r>
       </w:hyperlink>
     </w:p>
     <w:p>
       <w:pPr>
         <w:tabs>
-          <w:tab w:pos="9071" w:val="right" w:leader="dot"/>
+          <w:tab w:pos="8617" w:val="right" w:leader="dot"/>
         </w:tabs>
         <w:spacing w:before="20" w:after="40" w:line="300" w:lineRule="auto"/>
         <w:ind w:left="340"/>
@@ -1499,14 +1538,15 @@
             <w:sz w:val="23"/>
             <w:color w:val="000000"/>
           </w:rPr>
-          <w:t xml:space="preserve">	15</w:t>
+          <w:tab/>
+          <w:t xml:space="preserve">15</w:t>
         </w:r>
       </w:hyperlink>
     </w:p>
     <w:p>
       <w:pPr>
         <w:tabs>
-          <w:tab w:pos="9071" w:val="right" w:leader="dot"/>
+          <w:tab w:pos="8617" w:val="right" w:leader="dot"/>
         </w:tabs>
         <w:spacing w:before="20" w:after="40" w:line="300" w:lineRule="auto"/>
         <w:ind w:left="340"/>
@@ -1528,14 +1568,15 @@
             <w:sz w:val="23"/>
             <w:color w:val="000000"/>
           </w:rPr>
-          <w:t xml:space="preserve">	15</w:t>
+          <w:tab/>
+          <w:t xml:space="preserve">15</w:t>
         </w:r>
       </w:hyperlink>
     </w:p>
     <w:p>
       <w:pPr>
         <w:tabs>
-          <w:tab w:pos="9071" w:val="right" w:leader="dot"/>
+          <w:tab w:pos="8617" w:val="right" w:leader="dot"/>
         </w:tabs>
         <w:spacing w:before="20" w:after="40" w:line="300" w:lineRule="auto"/>
         <w:ind w:left="340"/>
@@ -1557,14 +1598,15 @@
             <w:sz w:val="23"/>
             <w:color w:val="000000"/>
           </w:rPr>
-          <w:t xml:space="preserve">	15</w:t>
+          <w:tab/>
+          <w:t xml:space="preserve">15</w:t>
         </w:r>
       </w:hyperlink>
     </w:p>
     <w:p>
       <w:pPr>
         <w:tabs>
-          <w:tab w:pos="9071" w:val="right" w:leader="dot"/>
+          <w:tab w:pos="8957" w:val="right" w:leader="dot"/>
         </w:tabs>
         <w:spacing w:before="60" w:after="40" w:line="300" w:lineRule="auto"/>
       </w:pPr>
@@ -1587,14 +1629,15 @@
             <w:b/>
             <w:color w:val="000000"/>
           </w:rPr>
-          <w:t xml:space="preserve">	15</w:t>
+          <w:tab/>
+          <w:t xml:space="preserve">15</w:t>
         </w:r>
       </w:hyperlink>
     </w:p>
     <w:p>
       <w:pPr>
         <w:tabs>
-          <w:tab w:pos="9071" w:val="right" w:leader="dot"/>
+          <w:tab w:pos="8617" w:val="right" w:leader="dot"/>
         </w:tabs>
         <w:spacing w:before="20" w:after="40" w:line="300" w:lineRule="auto"/>
         <w:ind w:left="340"/>
@@ -1616,14 +1659,15 @@
             <w:sz w:val="23"/>
             <w:color w:val="000000"/>
           </w:rPr>
-          <w:t xml:space="preserve">	16</w:t>
+          <w:tab/>
+          <w:t xml:space="preserve">16</w:t>
         </w:r>
       </w:hyperlink>
     </w:p>
     <w:p>
       <w:pPr>
         <w:tabs>
-          <w:tab w:pos="9071" w:val="right" w:leader="dot"/>
+          <w:tab w:pos="8617" w:val="right" w:leader="dot"/>
         </w:tabs>
         <w:spacing w:before="20" w:after="40" w:line="300" w:lineRule="auto"/>
         <w:ind w:left="340"/>
@@ -1645,14 +1689,15 @@
             <w:sz w:val="23"/>
             <w:color w:val="000000"/>
           </w:rPr>
-          <w:t xml:space="preserve">	16</w:t>
+          <w:tab/>
+          <w:t xml:space="preserve">16</w:t>
         </w:r>
       </w:hyperlink>
     </w:p>
     <w:p>
       <w:pPr>
         <w:tabs>
-          <w:tab w:pos="9071" w:val="right" w:leader="dot"/>
+          <w:tab w:pos="8617" w:val="right" w:leader="dot"/>
         </w:tabs>
         <w:spacing w:before="20" w:after="40" w:line="300" w:lineRule="auto"/>
         <w:ind w:left="340"/>
@@ -1674,14 +1719,15 @@
             <w:sz w:val="23"/>
             <w:color w:val="000000"/>
           </w:rPr>
-          <w:t xml:space="preserve">	17</w:t>
+          <w:tab/>
+          <w:t xml:space="preserve">17</w:t>
         </w:r>
       </w:hyperlink>
     </w:p>
     <w:p>
       <w:pPr>
         <w:tabs>
-          <w:tab w:pos="9071" w:val="right" w:leader="dot"/>
+          <w:tab w:pos="8617" w:val="right" w:leader="dot"/>
         </w:tabs>
         <w:spacing w:before="20" w:after="40" w:line="300" w:lineRule="auto"/>
         <w:ind w:left="340"/>
@@ -1703,14 +1749,15 @@
             <w:sz w:val="23"/>
             <w:color w:val="000000"/>
           </w:rPr>
-          <w:t xml:space="preserve">	18</w:t>
+          <w:tab/>
+          <w:t xml:space="preserve">18</w:t>
         </w:r>
       </w:hyperlink>
     </w:p>
     <w:p>
       <w:pPr>
         <w:tabs>
-          <w:tab w:pos="9071" w:val="right" w:leader="dot"/>
+          <w:tab w:pos="8617" w:val="right" w:leader="dot"/>
         </w:tabs>
         <w:spacing w:before="20" w:after="40" w:line="300" w:lineRule="auto"/>
         <w:ind w:left="340"/>
@@ -1732,14 +1779,15 @@
             <w:sz w:val="23"/>
             <w:color w:val="000000"/>
           </w:rPr>
-          <w:t xml:space="preserve">	19</w:t>
+          <w:tab/>
+          <w:t xml:space="preserve">19</w:t>
         </w:r>
       </w:hyperlink>
     </w:p>
     <w:p>
       <w:pPr>
         <w:tabs>
-          <w:tab w:pos="9071" w:val="right" w:leader="dot"/>
+          <w:tab w:pos="8617" w:val="right" w:leader="dot"/>
         </w:tabs>
         <w:spacing w:before="20" w:after="40" w:line="300" w:lineRule="auto"/>
         <w:ind w:left="340"/>
@@ -1761,14 +1809,15 @@
             <w:sz w:val="23"/>
             <w:color w:val="000000"/>
           </w:rPr>
-          <w:t xml:space="preserve">	21</w:t>
+          <w:tab/>
+          <w:t xml:space="preserve">21</w:t>
         </w:r>
       </w:hyperlink>
     </w:p>
     <w:p>
       <w:pPr>
         <w:tabs>
-          <w:tab w:pos="9071" w:val="right" w:leader="dot"/>
+          <w:tab w:pos="8957" w:val="right" w:leader="dot"/>
         </w:tabs>
         <w:spacing w:before="60" w:after="40" w:line="300" w:lineRule="auto"/>
       </w:pPr>
@@ -1791,14 +1840,15 @@
             <w:b/>
             <w:color w:val="000000"/>
           </w:rPr>
-          <w:t xml:space="preserve">	21</w:t>
+          <w:tab/>
+          <w:t xml:space="preserve">21</w:t>
         </w:r>
       </w:hyperlink>
     </w:p>
     <w:p>
       <w:pPr>
         <w:tabs>
-          <w:tab w:pos="9071" w:val="right" w:leader="dot"/>
+          <w:tab w:pos="8617" w:val="right" w:leader="dot"/>
         </w:tabs>
         <w:spacing w:before="20" w:after="40" w:line="300" w:lineRule="auto"/>
         <w:ind w:left="340"/>
@@ -1820,14 +1870,15 @@
             <w:sz w:val="23"/>
             <w:color w:val="000000"/>
           </w:rPr>
-          <w:t xml:space="preserve">	21</w:t>
+          <w:tab/>
+          <w:t xml:space="preserve">21</w:t>
         </w:r>
       </w:hyperlink>
     </w:p>
     <w:p>
       <w:pPr>
         <w:tabs>
-          <w:tab w:pos="9071" w:val="right" w:leader="dot"/>
+          <w:tab w:pos="8617" w:val="right" w:leader="dot"/>
         </w:tabs>
         <w:spacing w:before="20" w:after="40" w:line="300" w:lineRule="auto"/>
         <w:ind w:left="340"/>
@@ -1849,14 +1900,15 @@
             <w:sz w:val="23"/>
             <w:color w:val="000000"/>
           </w:rPr>
-          <w:t xml:space="preserve">	21</w:t>
+          <w:tab/>
+          <w:t xml:space="preserve">21</w:t>
         </w:r>
       </w:hyperlink>
     </w:p>
     <w:p>
       <w:pPr>
         <w:tabs>
-          <w:tab w:pos="9071" w:val="right" w:leader="dot"/>
+          <w:tab w:pos="8617" w:val="right" w:leader="dot"/>
         </w:tabs>
         <w:spacing w:before="20" w:after="40" w:line="300" w:lineRule="auto"/>
         <w:ind w:left="340"/>
@@ -1878,14 +1930,15 @@
             <w:sz w:val="23"/>
             <w:color w:val="000000"/>
           </w:rPr>
-          <w:t xml:space="preserve">	21</w:t>
+          <w:tab/>
+          <w:t xml:space="preserve">21</w:t>
         </w:r>
       </w:hyperlink>
     </w:p>
     <w:p>
       <w:pPr>
         <w:tabs>
-          <w:tab w:pos="9071" w:val="right" w:leader="dot"/>
+          <w:tab w:pos="8617" w:val="right" w:leader="dot"/>
         </w:tabs>
         <w:spacing w:before="20" w:after="40" w:line="300" w:lineRule="auto"/>
         <w:ind w:left="340"/>
@@ -1907,14 +1960,15 @@
             <w:sz w:val="23"/>
             <w:color w:val="000000"/>
           </w:rPr>
-          <w:t xml:space="preserve">	23</w:t>
+          <w:tab/>
+          <w:t xml:space="preserve">23</w:t>
         </w:r>
       </w:hyperlink>
     </w:p>
     <w:p>
       <w:pPr>
         <w:tabs>
-          <w:tab w:pos="9071" w:val="right" w:leader="dot"/>
+          <w:tab w:pos="8617" w:val="right" w:leader="dot"/>
         </w:tabs>
         <w:spacing w:before="20" w:after="40" w:line="300" w:lineRule="auto"/>
         <w:ind w:left="340"/>
@@ -1936,14 +1990,15 @@
             <w:sz w:val="23"/>
             <w:color w:val="000000"/>
           </w:rPr>
-          <w:t xml:space="preserve">	24</w:t>
+          <w:tab/>
+          <w:t xml:space="preserve">24</w:t>
         </w:r>
       </w:hyperlink>
     </w:p>
     <w:p>
       <w:pPr>
         <w:tabs>
-          <w:tab w:pos="9071" w:val="right" w:leader="dot"/>
+          <w:tab w:pos="8617" w:val="right" w:leader="dot"/>
         </w:tabs>
         <w:spacing w:before="20" w:after="40" w:line="300" w:lineRule="auto"/>
         <w:ind w:left="340"/>
@@ -1965,14 +2020,15 @@
             <w:sz w:val="23"/>
             <w:color w:val="000000"/>
           </w:rPr>
-          <w:t xml:space="preserve">	24</w:t>
+          <w:tab/>
+          <w:t xml:space="preserve">24</w:t>
         </w:r>
       </w:hyperlink>
     </w:p>
     <w:p>
       <w:pPr>
         <w:tabs>
-          <w:tab w:pos="9071" w:val="right" w:leader="dot"/>
+          <w:tab w:pos="8617" w:val="right" w:leader="dot"/>
         </w:tabs>
         <w:spacing w:before="20" w:after="40" w:line="300" w:lineRule="auto"/>
         <w:ind w:left="340"/>
@@ -1994,14 +2050,15 @@
             <w:sz w:val="23"/>
             <w:color w:val="000000"/>
           </w:rPr>
-          <w:t xml:space="preserve">	25</w:t>
+          <w:tab/>
+          <w:t xml:space="preserve">25</w:t>
         </w:r>
       </w:hyperlink>
     </w:p>
     <w:p>
       <w:pPr>
         <w:tabs>
-          <w:tab w:pos="9071" w:val="right" w:leader="dot"/>
+          <w:tab w:pos="8957" w:val="right" w:leader="dot"/>
         </w:tabs>
         <w:spacing w:before="60" w:after="40" w:line="300" w:lineRule="auto"/>
       </w:pPr>
@@ -2024,14 +2081,15 @@
             <w:b/>
             <w:color w:val="000000"/>
           </w:rPr>
-          <w:t xml:space="preserve">	25</w:t>
+          <w:tab/>
+          <w:t xml:space="preserve">25</w:t>
         </w:r>
       </w:hyperlink>
     </w:p>
     <w:p>
       <w:pPr>
         <w:tabs>
-          <w:tab w:pos="9071" w:val="right" w:leader="dot"/>
+          <w:tab w:pos="8617" w:val="right" w:leader="dot"/>
         </w:tabs>
         <w:spacing w:before="20" w:after="40" w:line="300" w:lineRule="auto"/>
         <w:ind w:left="340"/>
@@ -2053,14 +2111,15 @@
             <w:sz w:val="23"/>
             <w:color w:val="000000"/>
           </w:rPr>
-          <w:t xml:space="preserve">	25</w:t>
+          <w:tab/>
+          <w:t xml:space="preserve">25</w:t>
         </w:r>
       </w:hyperlink>
     </w:p>
     <w:p>
       <w:pPr>
         <w:tabs>
-          <w:tab w:pos="9071" w:val="right" w:leader="dot"/>
+          <w:tab w:pos="8617" w:val="right" w:leader="dot"/>
         </w:tabs>
         <w:spacing w:before="20" w:after="40" w:line="300" w:lineRule="auto"/>
         <w:ind w:left="340"/>
@@ -2082,14 +2141,15 @@
             <w:sz w:val="23"/>
             <w:color w:val="000000"/>
           </w:rPr>
-          <w:t xml:space="preserve">	25</w:t>
+          <w:tab/>
+          <w:t xml:space="preserve">25</w:t>
         </w:r>
       </w:hyperlink>
     </w:p>
     <w:p>
       <w:pPr>
         <w:tabs>
-          <w:tab w:pos="9071" w:val="right" w:leader="dot"/>
+          <w:tab w:pos="8617" w:val="right" w:leader="dot"/>
         </w:tabs>
         <w:spacing w:before="20" w:after="40" w:line="300" w:lineRule="auto"/>
         <w:ind w:left="340"/>
@@ -2111,14 +2171,15 @@
             <w:sz w:val="23"/>
             <w:color w:val="000000"/>
           </w:rPr>
-          <w:t xml:space="preserve">	25</w:t>
+          <w:tab/>
+          <w:t xml:space="preserve">25</w:t>
         </w:r>
       </w:hyperlink>
     </w:p>
     <w:p>
       <w:pPr>
         <w:tabs>
-          <w:tab w:pos="9071" w:val="right" w:leader="dot"/>
+          <w:tab w:pos="8617" w:val="right" w:leader="dot"/>
         </w:tabs>
         <w:spacing w:before="20" w:after="40" w:line="300" w:lineRule="auto"/>
         <w:ind w:left="340"/>
@@ -2140,14 +2201,15 @@
             <w:sz w:val="23"/>
             <w:color w:val="000000"/>
           </w:rPr>
-          <w:t xml:space="preserve">	27</w:t>
+          <w:tab/>
+          <w:t xml:space="preserve">27</w:t>
         </w:r>
       </w:hyperlink>
     </w:p>
     <w:p>
       <w:pPr>
         <w:tabs>
-          <w:tab w:pos="9071" w:val="right" w:leader="dot"/>
+          <w:tab w:pos="8617" w:val="right" w:leader="dot"/>
         </w:tabs>
         <w:spacing w:before="20" w:after="40" w:line="300" w:lineRule="auto"/>
         <w:ind w:left="340"/>
@@ -2169,14 +2231,15 @@
             <w:sz w:val="23"/>
             <w:color w:val="000000"/>
           </w:rPr>
-          <w:t xml:space="preserve">	27</w:t>
+          <w:tab/>
+          <w:t xml:space="preserve">27</w:t>
         </w:r>
       </w:hyperlink>
     </w:p>
     <w:p>
       <w:pPr>
         <w:tabs>
-          <w:tab w:pos="9071" w:val="right" w:leader="dot"/>
+          <w:tab w:pos="8957" w:val="right" w:leader="dot"/>
         </w:tabs>
         <w:spacing w:before="60" w:after="40" w:line="300" w:lineRule="auto"/>
       </w:pPr>
@@ -2199,14 +2262,15 @@
             <w:b/>
             <w:color w:val="000000"/>
           </w:rPr>
-          <w:t xml:space="preserve">	28</w:t>
+          <w:tab/>
+          <w:t xml:space="preserve">28</w:t>
         </w:r>
       </w:hyperlink>
     </w:p>
     <w:p>
       <w:pPr>
         <w:tabs>
-          <w:tab w:pos="9071" w:val="right" w:leader="dot"/>
+          <w:tab w:pos="8617" w:val="right" w:leader="dot"/>
         </w:tabs>
         <w:spacing w:before="20" w:after="40" w:line="300" w:lineRule="auto"/>
         <w:ind w:left="340"/>
@@ -2228,14 +2292,15 @@
             <w:sz w:val="23"/>
             <w:color w:val="000000"/>
           </w:rPr>
-          <w:t xml:space="preserve">	28</w:t>
+          <w:tab/>
+          <w:t xml:space="preserve">28</w:t>
         </w:r>
       </w:hyperlink>
     </w:p>
     <w:p>
       <w:pPr>
         <w:tabs>
-          <w:tab w:pos="9071" w:val="right" w:leader="dot"/>
+          <w:tab w:pos="8617" w:val="right" w:leader="dot"/>
         </w:tabs>
         <w:spacing w:before="20" w:after="40" w:line="300" w:lineRule="auto"/>
         <w:ind w:left="340"/>
@@ -2257,7 +2322,8 @@
             <w:sz w:val="23"/>
             <w:color w:val="000000"/>
           </w:rPr>
-          <w:t xml:space="preserve">	28</w:t>
+          <w:tab/>
+          <w:t xml:space="preserve">28</w:t>
         </w:r>
       </w:hyperlink>
     </w:p>
@@ -2611,16 +2677,32 @@
           <w:color w:val="000000"/>
           <w:sz w:val="26"/>
         </w:rPr>
-        <w:t xml:space="preserve">Đề tài “Hệ thống phát hiện giao dịch tài chính bất thường và nghi vấn gian lận” kết hợp nhiều nội dung quan trọng của môn Trí tuệ Nhân tạo: biểu diễn dữ liệu, tiền xử lý, học có giám sát, phát hiện bất thường, xử lý dữ liệu mất cân bằng và đánh giá mô hình. Đây cũng là bài toán có ý nghĩa thực tiễn rõ ràng vì quyết định của mô hình liên quan trực tiếp đến hai loại rủi ro: - </w:t>
-      </w:r>
+        <w:t>Đề tài “Hệ thống phát hiện giao dịch tài chính bất thường và nghi vấn gian lận” kết hợp nhiều nội dung quan trọng của môn Trí tuệ Nhân tạo: biểu diễn dữ liệu, tiền xử lý, học có giám sát, phát hiện bất thường, xử lý dữ liệu mất cân bằng và đánh giá mô hình. Đây cũng là bài toán có ý nghĩa thực tiễn rõ ràng vì quyết định của mô hình liên quan trực tiếp đến hai loại rủi ro:</w:t>
+      </w:r>
+    </w:p>
+    <w:p>
+      <w:pPr>
+        <w:spacing w:before="20" w:after="40" w:line="300" w:lineRule="auto"/>
+        <w:ind w:left="720" w:hanging="283"/>
+        <w:jc w:val="left"/>
+      </w:pPr>
       <w:r>
         <w:rPr>
           <w:rFonts w:ascii="Times New Roman" w:hAnsi="Times New Roman"/>
           <w:b/>
-          <w:i w:val="0"/>
           <w:color w:val="000000"/>
           <w:sz w:val="26"/>
         </w:rPr>
+        <w:t xml:space="preserve">-  </w:t>
+      </w:r>
+      <w:r>
+        <w:rPr>
+          <w:rFonts w:ascii="Times New Roman" w:hAnsi="Times New Roman"/>
+          <w:b/>
+          <w:i w:val="0"/>
+          <w:color w:val="000000"/>
+          <w:sz w:val="26"/>
+        </w:rPr>
         <w:t>False Negative:</w:t>
       </w:r>
       <w:r>
@@ -2631,7 +2713,23 @@
           <w:color w:val="000000"/>
           <w:sz w:val="26"/>
         </w:rPr>
-        <w:t xml:space="preserve"> giao dịch gian lận không được phát hiện, có thể gây thiệt hại tài chính. - </w:t>
+        <w:t xml:space="preserve"> giao dịch gian lận không được phát hiện, có thể gây thiệt hại tài chính.</w:t>
+      </w:r>
+    </w:p>
+    <w:p>
+      <w:pPr>
+        <w:spacing w:before="20" w:after="40" w:line="300" w:lineRule="auto"/>
+        <w:ind w:left="720" w:hanging="283"/>
+        <w:jc w:val="left"/>
+      </w:pPr>
+      <w:r>
+        <w:rPr>
+          <w:rFonts w:ascii="Times New Roman" w:hAnsi="Times New Roman"/>
+          <w:b/>
+          <w:color w:val="000000"/>
+          <w:sz w:val="26"/>
+        </w:rPr>
+        <w:t xml:space="preserve">-  </w:t>
       </w:r>
       <w:r>
         <w:rPr>
@@ -2752,7 +2850,7 @@
       <w:pPr>
         <w:spacing w:before="20" w:after="40" w:line="300" w:lineRule="auto"/>
         <w:ind w:left="720" w:hanging="283"/>
-        <w:jc w:val="both"/>
+        <w:jc w:val="left"/>
       </w:pPr>
       <w:r>
         <w:rPr>
@@ -2778,7 +2876,7 @@
       <w:pPr>
         <w:spacing w:before="20" w:after="40" w:line="300" w:lineRule="auto"/>
         <w:ind w:left="720" w:hanging="283"/>
-        <w:jc w:val="both"/>
+        <w:jc w:val="left"/>
       </w:pPr>
       <w:r>
         <w:rPr>
@@ -2804,7 +2902,7 @@
       <w:pPr>
         <w:spacing w:before="20" w:after="40" w:line="300" w:lineRule="auto"/>
         <w:ind w:left="720" w:hanging="283"/>
-        <w:jc w:val="both"/>
+        <w:jc w:val="left"/>
       </w:pPr>
       <w:r>
         <w:rPr>
@@ -2830,7 +2928,7 @@
       <w:pPr>
         <w:spacing w:before="20" w:after="40" w:line="300" w:lineRule="auto"/>
         <w:ind w:left="720" w:hanging="283"/>
-        <w:jc w:val="both"/>
+        <w:jc w:val="left"/>
       </w:pPr>
       <w:r>
         <w:rPr>
@@ -2856,7 +2954,7 @@
       <w:pPr>
         <w:spacing w:before="20" w:after="40" w:line="300" w:lineRule="auto"/>
         <w:ind w:left="720" w:hanging="283"/>
-        <w:jc w:val="both"/>
+        <w:jc w:val="left"/>
       </w:pPr>
       <w:r>
         <w:rPr>
@@ -2882,7 +2980,7 @@
       <w:pPr>
         <w:spacing w:before="20" w:after="40" w:line="300" w:lineRule="auto"/>
         <w:ind w:left="720" w:hanging="283"/>
-        <w:jc w:val="both"/>
+        <w:jc w:val="left"/>
       </w:pPr>
       <w:r>
         <w:rPr>
@@ -2908,7 +3006,7 @@
       <w:pPr>
         <w:spacing w:before="20" w:after="40" w:line="300" w:lineRule="auto"/>
         <w:ind w:left="720" w:hanging="283"/>
-        <w:jc w:val="both"/>
+        <w:jc w:val="left"/>
       </w:pPr>
       <w:r>
         <w:rPr>
@@ -2944,7 +3042,7 @@
           <w:color w:val="000000"/>
           <w:sz w:val="24"/>
         </w:rPr>
-        <w:t>Bản nháp hiện tại đã mô tả quy trình tiền xử lý, xử lý mất cân bằng và ba họ mô hình. Các kết luận thực nghiệm vẫn được giới hạn trong tập kiểm tra PaySim đã xử lý và sẽ được rà soát lại trước khi hoàn thiện báo cáo cuối.</w:t>
+        <w:t>Báo cáo đã trình bày quy trình tiền xử lý, xử lý mất cân bằng và cả ba họ mô hình. Các kết luận thực nghiệm được giới hạn trong tập kiểm tra PaySim đã xử lý, không suy rộng sang dữ liệu giao dịch thực tế.</w:t>
       </w:r>
     </w:p>
     <w:p>
@@ -2971,7 +3069,7 @@
       <w:pPr>
         <w:spacing w:before="20" w:after="40" w:line="300" w:lineRule="auto"/>
         <w:ind w:left="720" w:hanging="283"/>
-        <w:jc w:val="both"/>
+        <w:jc w:val="left"/>
       </w:pPr>
       <w:r>
         <w:rPr>
@@ -3007,7 +3105,7 @@
       <w:pPr>
         <w:spacing w:before="20" w:after="40" w:line="300" w:lineRule="auto"/>
         <w:ind w:left="720" w:hanging="283"/>
-        <w:jc w:val="both"/>
+        <w:jc w:val="left"/>
       </w:pPr>
       <w:r>
         <w:rPr>
@@ -3083,7 +3181,7 @@
       <w:pPr>
         <w:spacing w:before="20" w:after="40" w:line="300" w:lineRule="auto"/>
         <w:ind w:left="720" w:hanging="283"/>
-        <w:jc w:val="both"/>
+        <w:jc w:val="left"/>
       </w:pPr>
       <w:r>
         <w:rPr>
@@ -3159,7 +3257,7 @@
       <w:pPr>
         <w:spacing w:before="20" w:after="40" w:line="300" w:lineRule="auto"/>
         <w:ind w:left="720" w:hanging="283"/>
-        <w:jc w:val="both"/>
+        <w:jc w:val="left"/>
       </w:pPr>
       <w:r>
         <w:rPr>
@@ -3195,7 +3293,7 @@
       <w:pPr>
         <w:spacing w:before="20" w:after="40" w:line="300" w:lineRule="auto"/>
         <w:ind w:left="720" w:hanging="283"/>
-        <w:jc w:val="both"/>
+        <w:jc w:val="left"/>
       </w:pPr>
       <w:r>
         <w:rPr>
@@ -3231,7 +3329,7 @@
       <w:pPr>
         <w:spacing w:before="20" w:after="40" w:line="300" w:lineRule="auto"/>
         <w:ind w:left="720" w:hanging="283"/>
-        <w:jc w:val="both"/>
+        <w:jc w:val="left"/>
       </w:pPr>
       <w:r>
         <w:rPr>
@@ -3287,7 +3385,7 @@
       <w:pPr>
         <w:spacing w:before="20" w:after="40" w:line="300" w:lineRule="auto"/>
         <w:ind w:left="720" w:hanging="283"/>
-        <w:jc w:val="both"/>
+        <w:jc w:val="left"/>
       </w:pPr>
       <w:r>
         <w:rPr>
@@ -3313,7 +3411,7 @@
       <w:pPr>
         <w:spacing w:before="20" w:after="40" w:line="300" w:lineRule="auto"/>
         <w:ind w:left="720" w:hanging="283"/>
-        <w:jc w:val="both"/>
+        <w:jc w:val="left"/>
       </w:pPr>
       <w:r>
         <w:rPr>
@@ -3339,7 +3437,7 @@
       <w:pPr>
         <w:spacing w:before="20" w:after="40" w:line="300" w:lineRule="auto"/>
         <w:ind w:left="720" w:hanging="283"/>
-        <w:jc w:val="both"/>
+        <w:jc w:val="left"/>
       </w:pPr>
       <w:r>
         <w:rPr>
@@ -3365,7 +3463,7 @@
       <w:pPr>
         <w:spacing w:before="20" w:after="40" w:line="300" w:lineRule="auto"/>
         <w:ind w:left="720" w:hanging="283"/>
-        <w:jc w:val="both"/>
+        <w:jc w:val="left"/>
       </w:pPr>
       <w:r>
         <w:rPr>
@@ -3391,7 +3489,7 @@
       <w:pPr>
         <w:spacing w:before="20" w:after="40" w:line="300" w:lineRule="auto"/>
         <w:ind w:left="720" w:hanging="283"/>
-        <w:jc w:val="both"/>
+        <w:jc w:val="left"/>
       </w:pPr>
       <w:r>
         <w:rPr>
@@ -3417,7 +3515,7 @@
       <w:pPr>
         <w:spacing w:before="20" w:after="40" w:line="300" w:lineRule="auto"/>
         <w:ind w:left="720" w:hanging="283"/>
-        <w:jc w:val="both"/>
+        <w:jc w:val="left"/>
       </w:pPr>
       <w:r>
         <w:rPr>
@@ -3443,7 +3541,7 @@
       <w:pPr>
         <w:spacing w:before="20" w:after="40" w:line="300" w:lineRule="auto"/>
         <w:ind w:left="720" w:hanging="283"/>
-        <w:jc w:val="both"/>
+        <w:jc w:val="left"/>
       </w:pPr>
       <w:r>
         <w:rPr>
@@ -3469,7 +3567,7 @@
       <w:pPr>
         <w:spacing w:before="20" w:after="40" w:line="300" w:lineRule="auto"/>
         <w:ind w:left="720" w:hanging="283"/>
-        <w:jc w:val="both"/>
+        <w:jc w:val="left"/>
       </w:pPr>
       <w:r>
         <w:rPr>
@@ -3545,7 +3643,59 @@
           <w:color w:val="000000"/>
           <w:sz w:val="26"/>
         </w:rPr>
-        <w:t>Cho tập dữ liệu giao dịch tài chính, mỗi giao dịch được biểu diễn bởi vector đặc trưng $x$. Mục tiêu là xây dựng hàm dự đoán $f(x)$ trả về một trong hai nhãn: - $f(x) = 0$: giao dịch hợp lệ. - $f(x) = 1$: giao dịch gian lận.</w:t>
+        <w:t>Cho tập dữ liệu giao dịch tài chính, mỗi giao dịch được biểu diễn bởi vector đặc trưng $x$. Mục tiêu là xây dựng hàm dự đoán $f(x)$ trả về một trong hai nhãn:</w:t>
+      </w:r>
+    </w:p>
+    <w:p>
+      <w:pPr>
+        <w:spacing w:before="20" w:after="40" w:line="300" w:lineRule="auto"/>
+        <w:ind w:left="720" w:hanging="283"/>
+        <w:jc w:val="left"/>
+      </w:pPr>
+      <w:r>
+        <w:rPr>
+          <w:rFonts w:ascii="Times New Roman" w:hAnsi="Times New Roman"/>
+          <w:b/>
+          <w:color w:val="000000"/>
+          <w:sz w:val="26"/>
+        </w:rPr>
+        <w:t xml:space="preserve">-  </w:t>
+      </w:r>
+      <w:r>
+        <w:rPr>
+          <w:rFonts w:ascii="Times New Roman" w:hAnsi="Times New Roman"/>
+          <w:b w:val="0"/>
+          <w:i w:val="0"/>
+          <w:color w:val="000000"/>
+          <w:sz w:val="26"/>
+        </w:rPr>
+        <w:t>$f(x) = 0$: giao dịch hợp lệ.</w:t>
+      </w:r>
+    </w:p>
+    <w:p>
+      <w:pPr>
+        <w:spacing w:before="20" w:after="40" w:line="300" w:lineRule="auto"/>
+        <w:ind w:left="720" w:hanging="283"/>
+        <w:jc w:val="left"/>
+      </w:pPr>
+      <w:r>
+        <w:rPr>
+          <w:rFonts w:ascii="Times New Roman" w:hAnsi="Times New Roman"/>
+          <w:b/>
+          <w:color w:val="000000"/>
+          <w:sz w:val="26"/>
+        </w:rPr>
+        <w:t xml:space="preserve">-  </w:t>
+      </w:r>
+      <w:r>
+        <w:rPr>
+          <w:rFonts w:ascii="Times New Roman" w:hAnsi="Times New Roman"/>
+          <w:b w:val="0"/>
+          <w:i w:val="0"/>
+          <w:color w:val="000000"/>
+          <w:sz w:val="26"/>
+        </w:rPr>
+        <w:t>$f(x) = 1$: giao dịch gian lận.</w:t>
       </w:r>
     </w:p>
     <w:p>
@@ -3661,7 +3811,7 @@
       <w:pPr>
         <w:spacing w:before="20" w:after="40" w:line="300" w:lineRule="auto"/>
         <w:ind w:left="720" w:hanging="283"/>
-        <w:jc w:val="both"/>
+        <w:jc w:val="left"/>
       </w:pPr>
       <w:r>
         <w:rPr>
@@ -3707,7 +3857,7 @@
       <w:pPr>
         <w:spacing w:before="20" w:after="40" w:line="300" w:lineRule="auto"/>
         <w:ind w:left="720" w:hanging="283"/>
-        <w:jc w:val="both"/>
+        <w:jc w:val="left"/>
       </w:pPr>
       <w:r>
         <w:rPr>
@@ -3733,7 +3883,7 @@
       <w:pPr>
         <w:spacing w:before="20" w:after="40" w:line="300" w:lineRule="auto"/>
         <w:ind w:left="720" w:hanging="283"/>
-        <w:jc w:val="both"/>
+        <w:jc w:val="left"/>
       </w:pPr>
       <w:r>
         <w:rPr>
@@ -3759,7 +3909,7 @@
       <w:pPr>
         <w:spacing w:before="20" w:after="40" w:line="300" w:lineRule="auto"/>
         <w:ind w:left="720" w:hanging="283"/>
-        <w:jc w:val="both"/>
+        <w:jc w:val="left"/>
       </w:pPr>
       <w:r>
         <w:rPr>
@@ -3785,7 +3935,7 @@
       <w:pPr>
         <w:spacing w:before="20" w:after="40" w:line="300" w:lineRule="auto"/>
         <w:ind w:left="720" w:hanging="283"/>
-        <w:jc w:val="both"/>
+        <w:jc w:val="left"/>
       </w:pPr>
       <w:r>
         <w:rPr>
@@ -3811,7 +3961,7 @@
       <w:pPr>
         <w:spacing w:before="20" w:after="40" w:line="300" w:lineRule="auto"/>
         <w:ind w:left="720" w:hanging="283"/>
-        <w:jc w:val="both"/>
+        <w:jc w:val="left"/>
       </w:pPr>
       <w:r>
         <w:rPr>
@@ -3837,7 +3987,7 @@
       <w:pPr>
         <w:spacing w:before="20" w:after="40" w:line="300" w:lineRule="auto"/>
         <w:ind w:left="720" w:hanging="283"/>
-        <w:jc w:val="both"/>
+        <w:jc w:val="left"/>
       </w:pPr>
       <w:r>
         <w:rPr>
@@ -3863,7 +4013,7 @@
       <w:pPr>
         <w:spacing w:before="20" w:after="40" w:line="300" w:lineRule="auto"/>
         <w:ind w:left="720" w:hanging="283"/>
-        <w:jc w:val="both"/>
+        <w:jc w:val="left"/>
       </w:pPr>
       <w:r>
         <w:rPr>
@@ -3927,7 +4077,7 @@
       <w:pPr>
         <w:spacing w:before="20" w:after="40" w:line="300" w:lineRule="auto"/>
         <w:ind w:left="720" w:hanging="283"/>
-        <w:jc w:val="both"/>
+        <w:jc w:val="left"/>
       </w:pPr>
       <w:r>
         <w:rPr>
@@ -3993,7 +4143,7 @@
       <w:pPr>
         <w:spacing w:before="20" w:after="40" w:line="300" w:lineRule="auto"/>
         <w:ind w:left="720" w:hanging="283"/>
-        <w:jc w:val="both"/>
+        <w:jc w:val="left"/>
       </w:pPr>
       <w:r>
         <w:rPr>
@@ -4019,7 +4169,7 @@
       <w:pPr>
         <w:spacing w:before="20" w:after="40" w:line="300" w:lineRule="auto"/>
         <w:ind w:left="720" w:hanging="283"/>
-        <w:jc w:val="both"/>
+        <w:jc w:val="left"/>
       </w:pPr>
       <w:r>
         <w:rPr>
@@ -4312,7 +4462,7 @@
       <w:pPr>
         <w:spacing w:before="20" w:after="40" w:line="300" w:lineRule="auto"/>
         <w:ind w:left="720" w:hanging="283"/>
-        <w:jc w:val="both"/>
+        <w:jc w:val="left"/>
       </w:pPr>
       <w:r>
         <w:rPr>
@@ -4338,7 +4488,7 @@
       <w:pPr>
         <w:spacing w:before="20" w:after="40" w:line="300" w:lineRule="auto"/>
         <w:ind w:left="720" w:hanging="283"/>
-        <w:jc w:val="both"/>
+        <w:jc w:val="left"/>
       </w:pPr>
       <w:r>
         <w:rPr>
@@ -4364,7 +4514,7 @@
       <w:pPr>
         <w:spacing w:before="20" w:after="40" w:line="300" w:lineRule="auto"/>
         <w:ind w:left="720" w:hanging="283"/>
-        <w:jc w:val="both"/>
+        <w:jc w:val="left"/>
       </w:pPr>
       <w:r>
         <w:rPr>
@@ -4390,7 +4540,7 @@
       <w:pPr>
         <w:spacing w:before="20" w:after="40" w:line="300" w:lineRule="auto"/>
         <w:ind w:left="720" w:hanging="283"/>
-        <w:jc w:val="both"/>
+        <w:jc w:val="left"/>
       </w:pPr>
       <w:r>
         <w:rPr>
@@ -4416,7 +4566,7 @@
       <w:pPr>
         <w:spacing w:before="20" w:after="40" w:line="300" w:lineRule="auto"/>
         <w:ind w:left="720" w:hanging="283"/>
-        <w:jc w:val="both"/>
+        <w:jc w:val="left"/>
       </w:pPr>
       <w:r>
         <w:rPr>
@@ -4442,7 +4592,7 @@
       <w:pPr>
         <w:spacing w:before="20" w:after="40" w:line="300" w:lineRule="auto"/>
         <w:ind w:left="720" w:hanging="283"/>
-        <w:jc w:val="both"/>
+        <w:jc w:val="left"/>
       </w:pPr>
       <w:r>
         <w:rPr>
@@ -4515,7 +4665,85 @@
           <w:color w:val="000000"/>
           <w:sz w:val="26"/>
         </w:rPr>
-        <w:t>Báo cáo hướng tới trả lời các câu hỏi sau khi hoàn tất thực nghiệm: - Kỹ thuật xử lý mất cân bằng nào phù hợp hơn trên tập PaySim đã tiền xử lý? - Trong các mô hình được thử nghiệm, mô hình nào đạt cân bằng tốt nhất giữa Precision và Recall cho lớp fraud? - Các đặc trưng nào đóng góp nhiều nhất vào quyết định của mô hình, và các đặc trưng này có nguy cơ phản ánh cơ chế mô phỏng của PaySim hay không?</w:t>
+        <w:t>Báo cáo hướng tới trả lời các câu hỏi sau khi hoàn tất thực nghiệm:</w:t>
+      </w:r>
+    </w:p>
+    <w:p>
+      <w:pPr>
+        <w:spacing w:before="20" w:after="40" w:line="300" w:lineRule="auto"/>
+        <w:ind w:left="720" w:hanging="283"/>
+        <w:jc w:val="left"/>
+      </w:pPr>
+      <w:r>
+        <w:rPr>
+          <w:rFonts w:ascii="Times New Roman" w:hAnsi="Times New Roman"/>
+          <w:b/>
+          <w:color w:val="000000"/>
+          <w:sz w:val="26"/>
+        </w:rPr>
+        <w:t xml:space="preserve">-  </w:t>
+      </w:r>
+      <w:r>
+        <w:rPr>
+          <w:rFonts w:ascii="Times New Roman" w:hAnsi="Times New Roman"/>
+          <w:b w:val="0"/>
+          <w:i w:val="0"/>
+          <w:color w:val="000000"/>
+          <w:sz w:val="26"/>
+        </w:rPr>
+        <w:t>Kỹ thuật xử lý mất cân bằng nào phù hợp hơn trên tập PaySim đã tiền xử lý?</w:t>
+      </w:r>
+    </w:p>
+    <w:p>
+      <w:pPr>
+        <w:spacing w:before="20" w:after="40" w:line="300" w:lineRule="auto"/>
+        <w:ind w:left="720" w:hanging="283"/>
+        <w:jc w:val="left"/>
+      </w:pPr>
+      <w:r>
+        <w:rPr>
+          <w:rFonts w:ascii="Times New Roman" w:hAnsi="Times New Roman"/>
+          <w:b/>
+          <w:color w:val="000000"/>
+          <w:sz w:val="26"/>
+        </w:rPr>
+        <w:t xml:space="preserve">-  </w:t>
+      </w:r>
+      <w:r>
+        <w:rPr>
+          <w:rFonts w:ascii="Times New Roman" w:hAnsi="Times New Roman"/>
+          <w:b w:val="0"/>
+          <w:i w:val="0"/>
+          <w:color w:val="000000"/>
+          <w:sz w:val="26"/>
+        </w:rPr>
+        <w:t>Trong các mô hình được thử nghiệm, mô hình nào đạt cân bằng tốt nhất giữa Precision và Recall cho lớp fraud?</w:t>
+      </w:r>
+    </w:p>
+    <w:p>
+      <w:pPr>
+        <w:spacing w:before="20" w:after="40" w:line="300" w:lineRule="auto"/>
+        <w:ind w:left="720" w:hanging="283"/>
+        <w:jc w:val="left"/>
+      </w:pPr>
+      <w:r>
+        <w:rPr>
+          <w:rFonts w:ascii="Times New Roman" w:hAnsi="Times New Roman"/>
+          <w:b/>
+          <w:color w:val="000000"/>
+          <w:sz w:val="26"/>
+        </w:rPr>
+        <w:t xml:space="preserve">-  </w:t>
+      </w:r>
+      <w:r>
+        <w:rPr>
+          <w:rFonts w:ascii="Times New Roman" w:hAnsi="Times New Roman"/>
+          <w:b w:val="0"/>
+          <w:i w:val="0"/>
+          <w:color w:val="000000"/>
+          <w:sz w:val="26"/>
+        </w:rPr>
+        <w:t>Các đặc trưng nào đóng góp nhiều nhất vào quyết định của mô hình, và các đặc trưng này có nguy cơ phản ánh cơ chế mô phỏng của PaySim hay không?</w:t>
       </w:r>
     </w:p>
     <w:p>
@@ -4799,8 +5027,6 @@
       <w:tblPr>
         <w:tblW w:type="auto" w:w="0"/>
         <w:jc w:val="center"/>
-        <w:tblLayout w:type="fixed"/>
-        <w:tblLook w:firstColumn="1" w:firstRow="1" w:lastColumn="0" w:lastRow="0" w:noHBand="0" w:noVBand="1" w:val="04A0"/>
         <w:tblBorders>
           <w:top w:val="single" w:sz="6" w:space="0" w:color="CCCCCC"/>
           <w:bottom w:val="single" w:sz="6" w:space="0" w:color="CCCCCC"/>
@@ -4809,6 +5035,8 @@
           <w:left w:val="none"/>
           <w:right w:val="none"/>
         </w:tblBorders>
+        <w:tblLayout w:type="fixed"/>
+        <w:tblLook w:firstColumn="1" w:firstRow="1" w:lastColumn="0" w:lastRow="0" w:noHBand="0" w:noVBand="1" w:val="04A0"/>
       </w:tblPr>
       <w:tblGrid>
         <w:gridCol w:w="3024"/>
@@ -4817,8 +5045,8 @@
       </w:tblGrid>
       <w:tr>
         <w:trPr>
+          <w:cantSplit/>
           <w:tblHeader/>
-          <w:cantSplit/>
         </w:trPr>
         <w:tc>
           <w:tcPr>
@@ -6042,8 +6270,6 @@
       <w:tblPr>
         <w:tblW w:type="auto" w:w="0"/>
         <w:jc w:val="center"/>
-        <w:tblLayout w:type="fixed"/>
-        <w:tblLook w:firstColumn="1" w:firstRow="1" w:lastColumn="0" w:lastRow="0" w:noHBand="0" w:noVBand="1" w:val="04A0"/>
         <w:tblBorders>
           <w:top w:val="single" w:sz="6" w:space="0" w:color="CCCCCC"/>
           <w:bottom w:val="single" w:sz="6" w:space="0" w:color="CCCCCC"/>
@@ -6052,6 +6278,8 @@
           <w:left w:val="none"/>
           <w:right w:val="none"/>
         </w:tblBorders>
+        <w:tblLayout w:type="fixed"/>
+        <w:tblLook w:firstColumn="1" w:firstRow="1" w:lastColumn="0" w:lastRow="0" w:noHBand="0" w:noVBand="1" w:val="04A0"/>
       </w:tblPr>
       <w:tblGrid>
         <w:gridCol w:w="2268"/>
@@ -6061,8 +6289,8 @@
       </w:tblGrid>
       <w:tr>
         <w:trPr>
+          <w:cantSplit/>
           <w:tblHeader/>
-          <w:cantSplit/>
         </w:trPr>
         <w:tc>
           <w:tcPr>
@@ -7043,8 +7271,6 @@
       <w:tblPr>
         <w:tblW w:type="auto" w:w="0"/>
         <w:jc w:val="center"/>
-        <w:tblLayout w:type="fixed"/>
-        <w:tblLook w:firstColumn="1" w:firstRow="1" w:lastColumn="0" w:lastRow="0" w:noHBand="0" w:noVBand="1" w:val="04A0"/>
         <w:tblBorders>
           <w:top w:val="single" w:sz="6" w:space="0" w:color="CCCCCC"/>
           <w:bottom w:val="single" w:sz="6" w:space="0" w:color="CCCCCC"/>
@@ -7053,6 +7279,8 @@
           <w:left w:val="none"/>
           <w:right w:val="none"/>
         </w:tblBorders>
+        <w:tblLayout w:type="fixed"/>
+        <w:tblLook w:firstColumn="1" w:firstRow="1" w:lastColumn="0" w:lastRow="0" w:noHBand="0" w:noVBand="1" w:val="04A0"/>
       </w:tblPr>
       <w:tblGrid>
         <w:gridCol w:w="1814"/>
@@ -7063,8 +7291,8 @@
       </w:tblGrid>
       <w:tr>
         <w:trPr>
+          <w:cantSplit/>
           <w:tblHeader/>
-          <w:cantSplit/>
         </w:trPr>
         <w:tc>
           <w:tcPr>
@@ -7986,8 +8214,6 @@
       <w:tblPr>
         <w:tblW w:type="auto" w:w="0"/>
         <w:jc w:val="center"/>
-        <w:tblLayout w:type="fixed"/>
-        <w:tblLook w:firstColumn="1" w:firstRow="1" w:lastColumn="0" w:lastRow="0" w:noHBand="0" w:noVBand="1" w:val="04A0"/>
         <w:tblBorders>
           <w:top w:val="single" w:sz="6" w:space="0" w:color="CCCCCC"/>
           <w:bottom w:val="single" w:sz="6" w:space="0" w:color="CCCCCC"/>
@@ -7996,6 +8222,8 @@
           <w:left w:val="none"/>
           <w:right w:val="none"/>
         </w:tblBorders>
+        <w:tblLayout w:type="fixed"/>
+        <w:tblLook w:firstColumn="1" w:firstRow="1" w:lastColumn="0" w:lastRow="0" w:noHBand="0" w:noVBand="1" w:val="04A0"/>
       </w:tblPr>
       <w:tblGrid>
         <w:gridCol w:w="3024"/>
@@ -8004,8 +8232,8 @@
       </w:tblGrid>
       <w:tr>
         <w:trPr>
+          <w:cantSplit/>
           <w:tblHeader/>
-          <w:cantSplit/>
         </w:trPr>
         <w:tc>
           <w:tcPr>
@@ -9524,7 +9752,7 @@
           <w:color w:val="000000"/>
           <w:sz w:val="26"/>
         </w:rPr>
-        <w:t>Fraud ratio tăng từ 0,129082% lên khoảng 4,1065% sau downsample. Do Precision và đường Precision-Recall phụ thuộc vào prevalence, kết quả trên test downsample không thể được trình bày như hiệu năng trên phân bố PaySim gốc hoặc trên hệ thống thật.</w:t>
+        <w:t>Fraud ratio tăng từ 0,129082% lên khoảng 4,1065% sau downsample. Do Precision và đường Precision–Recall phụ thuộc vào prevalence, kết quả trên test downsample không thể được trình bày như hiệu năng trên phân bố PaySim gốc hoặc trên hệ thống thật.</w:t>
       </w:r>
     </w:p>
     <w:p>
@@ -9662,7 +9890,7 @@
           <w:color w:val="000000"/>
           <w:sz w:val="26"/>
         </w:rPr>
-        <w:t xml:space="preserve"> để phát hiện gian lận. Quy trình hiện tại vẫn sử dụng các cột số dư và hai đặc trưng sai lệch số dư. Vì vậy, mô hình có thể học tín hiệu phát sinh từ cơ chế cập nhật hoặc hủy giao dịch của bộ mô phỏng. Mục 5.5 cho thấy nhóm đặc trưng này thực sự chiếm phần lớn mức đóng góp của cả Random Forest và XGBoost. Báo cáo xem đây là một nguy cơ ảnh hưởng tính hợp lệ. Phép kiểm tra dứt điểm là huấn luyện lại mô hình sau khi loại nhóm đặc trưng số dư rồi so sánh hiệu năng. Thí nghiệm này nằm ngoài phạm vi bản nháp hiện tại và được ghi nhận như một hướng kiểm chứng cần thực hiện trước khi khẳng định kết quả.</w:t>
+        <w:t xml:space="preserve"> để phát hiện gian lận. Quy trình hiện tại vẫn sử dụng các cột số dư và hai đặc trưng sai lệch số dư. Vì vậy, mô hình có thể học tín hiệu phát sinh từ cơ chế cập nhật hoặc hủy giao dịch của bộ mô phỏng. Mục 5.5 cho thấy nhóm đặc trưng này thực sự chiếm phần lớn mức đóng góp của cả Random Forest và XGBoost. Báo cáo xem đây là một nguy cơ ảnh hưởng tính hợp lệ. Phép kiểm tra dứt điểm là huấn luyện lại mô hình sau khi loại nhóm đặc trưng số dư rồi so sánh hiệu năng. Thí nghiệm này nằm ngoài phạm vi đồ án và được ghi nhận tại Mục 7.4 như hướng kiểm chứng cần thực hiện trước khi khẳng định kết quả.</w:t>
       </w:r>
     </w:p>
     <w:p>
@@ -9867,17 +10095,33 @@
           <w:color w:val="000000"/>
           <w:sz w:val="26"/>
         </w:rPr>
-        <w:t xml:space="preserve">Quy trình thực nghiệm được tổ chức thành sáu bước tuần tự: - </w:t>
-      </w:r>
+        <w:t>Quy trình thực nghiệm được tổ chức thành sáu bước tuần tự:</w:t>
+      </w:r>
+    </w:p>
+    <w:p>
+      <w:pPr>
+        <w:spacing w:before="20" w:after="40" w:line="300" w:lineRule="auto"/>
+        <w:ind w:left="720" w:hanging="283"/>
+        <w:jc w:val="left"/>
+      </w:pPr>
       <w:r>
         <w:rPr>
           <w:rFonts w:ascii="Times New Roman" w:hAnsi="Times New Roman"/>
           <w:b/>
-          <w:i w:val="0"/>
           <w:color w:val="000000"/>
           <w:sz w:val="26"/>
         </w:rPr>
-        <w:t>Bước 1 - Đọc và kiểm tra dữ liệu:</w:t>
+        <w:t xml:space="preserve">-  </w:t>
+      </w:r>
+      <w:r>
+        <w:rPr>
+          <w:rFonts w:ascii="Times New Roman" w:hAnsi="Times New Roman"/>
+          <w:b/>
+          <w:i w:val="0"/>
+          <w:color w:val="000000"/>
+          <w:sz w:val="26"/>
+        </w:rPr>
+        <w:t>Bước 1 — Đọc và kiểm tra dữ liệu:</w:t>
       </w:r>
       <w:r>
         <w:rPr>
@@ -9887,17 +10131,33 @@
           <w:color w:val="000000"/>
           <w:sz w:val="26"/>
         </w:rPr>
-        <w:t xml:space="preserve"> nạp bộ PaySim, xác nhận cấu trúc cột, kiểu dữ liệu, giá trị thiếu và phân bố nhãn. - </w:t>
-      </w:r>
+        <w:t xml:space="preserve"> nạp bộ PaySim, xác nhận cấu trúc cột, kiểu dữ liệu, giá trị thiếu và phân bố nhãn.</w:t>
+      </w:r>
+    </w:p>
+    <w:p>
+      <w:pPr>
+        <w:spacing w:before="20" w:after="40" w:line="300" w:lineRule="auto"/>
+        <w:ind w:left="720" w:hanging="283"/>
+        <w:jc w:val="left"/>
+      </w:pPr>
       <w:r>
         <w:rPr>
           <w:rFonts w:ascii="Times New Roman" w:hAnsi="Times New Roman"/>
           <w:b/>
-          <w:i w:val="0"/>
           <w:color w:val="000000"/>
           <w:sz w:val="26"/>
         </w:rPr>
-        <w:t>Bước 2 - Lọc và downsampling:</w:t>
+        <w:t xml:space="preserve">-  </w:t>
+      </w:r>
+      <w:r>
+        <w:rPr>
+          <w:rFonts w:ascii="Times New Roman" w:hAnsi="Times New Roman"/>
+          <w:b/>
+          <w:i w:val="0"/>
+          <w:color w:val="000000"/>
+          <w:sz w:val="26"/>
+        </w:rPr>
+        <w:t>Bước 2 — Lọc và downsampling:</w:t>
       </w:r>
       <w:r>
         <w:rPr>
@@ -9947,17 +10207,33 @@
           <w:color w:val="000000"/>
           <w:sz w:val="26"/>
         </w:rPr>
-        <w:t xml:space="preserve">, bảo toàn toàn bộ giao dịch gian lận và lấy mẫu ngẫu nhiên lớp bình thường để tạo tập làm việc 200.000 giao dịch. - </w:t>
-      </w:r>
+        <w:t>, bảo toàn toàn bộ giao dịch gian lận và lấy mẫu ngẫu nhiên lớp bình thường để tạo tập làm việc 200.000 giao dịch.</w:t>
+      </w:r>
+    </w:p>
+    <w:p>
+      <w:pPr>
+        <w:spacing w:before="20" w:after="40" w:line="300" w:lineRule="auto"/>
+        <w:ind w:left="720" w:hanging="283"/>
+        <w:jc w:val="left"/>
+      </w:pPr>
       <w:r>
         <w:rPr>
           <w:rFonts w:ascii="Times New Roman" w:hAnsi="Times New Roman"/>
           <w:b/>
-          <w:i w:val="0"/>
           <w:color w:val="000000"/>
           <w:sz w:val="26"/>
         </w:rPr>
-        <w:t>Bước 3 - Chia dữ liệu:</w:t>
+        <w:t xml:space="preserve">-  </w:t>
+      </w:r>
+      <w:r>
+        <w:rPr>
+          <w:rFonts w:ascii="Times New Roman" w:hAnsi="Times New Roman"/>
+          <w:b/>
+          <w:i w:val="0"/>
+          <w:color w:val="000000"/>
+          <w:sz w:val="26"/>
+        </w:rPr>
+        <w:t>Bước 3 — Chia dữ liệu:</w:t>
       </w:r>
       <w:r>
         <w:rPr>
@@ -9967,17 +10243,33 @@
           <w:color w:val="000000"/>
           <w:sz w:val="26"/>
         </w:rPr>
-        <w:t xml:space="preserve"> tách tập huấn luyện và tập kiểm tra theo tỷ lệ 80/20 bằng phép chia phân tầng (stratified) theo nhãn. - </w:t>
-      </w:r>
+        <w:t xml:space="preserve"> tách tập huấn luyện và tập kiểm tra theo tỷ lệ 80/20 bằng phép chia phân tầng (stratified) theo nhãn.</w:t>
+      </w:r>
+    </w:p>
+    <w:p>
+      <w:pPr>
+        <w:spacing w:before="20" w:after="40" w:line="300" w:lineRule="auto"/>
+        <w:ind w:left="720" w:hanging="283"/>
+        <w:jc w:val="left"/>
+      </w:pPr>
       <w:r>
         <w:rPr>
           <w:rFonts w:ascii="Times New Roman" w:hAnsi="Times New Roman"/>
           <w:b/>
-          <w:i w:val="0"/>
           <w:color w:val="000000"/>
           <w:sz w:val="26"/>
         </w:rPr>
-        <w:t>Bước 4 - Xây dựng đặc trưng:</w:t>
+        <w:t xml:space="preserve">-  </w:t>
+      </w:r>
+      <w:r>
+        <w:rPr>
+          <w:rFonts w:ascii="Times New Roman" w:hAnsi="Times New Roman"/>
+          <w:b/>
+          <w:i w:val="0"/>
+          <w:color w:val="000000"/>
+          <w:sz w:val="26"/>
+        </w:rPr>
+        <w:t>Bước 4 — Xây dựng đặc trưng:</w:t>
       </w:r>
       <w:r>
         <w:rPr>
@@ -9987,17 +10279,33 @@
           <w:color w:val="000000"/>
           <w:sz w:val="26"/>
         </w:rPr>
-        <w:t xml:space="preserve"> tạo các đặc trưng dẫn xuất, mã hóa loại giao dịch và chuẩn hóa các biến định lượng bằng tham số học từ tập huấn luyện. - </w:t>
-      </w:r>
+        <w:t xml:space="preserve"> tạo các đặc trưng dẫn xuất, mã hóa loại giao dịch và chuẩn hóa các biến định lượng bằng tham số học từ tập huấn luyện.</w:t>
+      </w:r>
+    </w:p>
+    <w:p>
+      <w:pPr>
+        <w:spacing w:before="20" w:after="40" w:line="300" w:lineRule="auto"/>
+        <w:ind w:left="720" w:hanging="283"/>
+        <w:jc w:val="left"/>
+      </w:pPr>
       <w:r>
         <w:rPr>
           <w:rFonts w:ascii="Times New Roman" w:hAnsi="Times New Roman"/>
           <w:b/>
-          <w:i w:val="0"/>
           <w:color w:val="000000"/>
           <w:sz w:val="26"/>
         </w:rPr>
-        <w:t>Bước 5 - Xử lý mất cân bằng:</w:t>
+        <w:t xml:space="preserve">-  </w:t>
+      </w:r>
+      <w:r>
+        <w:rPr>
+          <w:rFonts w:ascii="Times New Roman" w:hAnsi="Times New Roman"/>
+          <w:b/>
+          <w:i w:val="0"/>
+          <w:color w:val="000000"/>
+          <w:sz w:val="26"/>
+        </w:rPr>
+        <w:t>Bước 5 — Xử lý mất cân bằng:</w:t>
       </w:r>
       <w:r>
         <w:rPr>
@@ -10007,17 +10315,33 @@
           <w:color w:val="000000"/>
           <w:sz w:val="26"/>
         </w:rPr>
-        <w:t xml:space="preserve"> áp dụng oversampling bằng SMOTENC hoặc ADASYN trên tập huấn luyện, không thay đổi tập kiểm tra. - </w:t>
-      </w:r>
+        <w:t xml:space="preserve"> áp dụng oversampling bằng SMOTENC hoặc ADASYN trên tập huấn luyện, không thay đổi tập kiểm tra.</w:t>
+      </w:r>
+    </w:p>
+    <w:p>
+      <w:pPr>
+        <w:spacing w:before="20" w:after="40" w:line="300" w:lineRule="auto"/>
+        <w:ind w:left="720" w:hanging="283"/>
+        <w:jc w:val="left"/>
+      </w:pPr>
       <w:r>
         <w:rPr>
           <w:rFonts w:ascii="Times New Roman" w:hAnsi="Times New Roman"/>
           <w:b/>
-          <w:i w:val="0"/>
           <w:color w:val="000000"/>
           <w:sz w:val="26"/>
         </w:rPr>
-        <w:t>Bước 6 - Huấn luyện và đánh giá:</w:t>
+        <w:t xml:space="preserve">-  </w:t>
+      </w:r>
+      <w:r>
+        <w:rPr>
+          <w:rFonts w:ascii="Times New Roman" w:hAnsi="Times New Roman"/>
+          <w:b/>
+          <w:i w:val="0"/>
+          <w:color w:val="000000"/>
+          <w:sz w:val="26"/>
+        </w:rPr>
+        <w:t>Bước 6 — Huấn luyện và đánh giá:</w:t>
       </w:r>
       <w:r>
         <w:rPr>
@@ -11418,7 +11742,7 @@
           <w:color w:val="000000"/>
           <w:sz w:val="26"/>
         </w:rPr>
-        <w:t>Các mô hình được đánh giá trên cùng tập kiểm tra 40.000 giao dịch, không dùng dữ liệu đã qua oversampling. Báo cáo tập trung vào lớp gian lận với bốn chỉ số chính là Precision, Recall, F1-Score và ROC-AUC. Average Precision được báo cáo bổ sung vì phản ánh chất lượng phát hiện lớp gian lận rõ hơn ROC-AUC khi dữ liệu mất cân bằng. Đường ROC và đường Precision-Recall tổng hợp sẽ được bổ sung trong bản báo cáo cuối.</w:t>
+        <w:t>Các mô hình được đánh giá trên cùng tập kiểm tra 40.000 giao dịch, không dùng dữ liệu đã qua oversampling. Báo cáo tập trung vào lớp gian lận với bốn chỉ số chính là Precision, Recall, F1-Score và ROC-AUC. Average Precision được báo cáo bổ sung vì phản ánh chất lượng phát hiện lớp gian lận rõ hơn ROC-AUC khi dữ liệu mất cân bằng. Đường ROC và đường Precision–Recall tổng hợp của cả năm biến thể được trình bày tại Mục 5.2.</w:t>
       </w:r>
     </w:p>
     <w:p>
@@ -11740,7 +12064,27 @@
           <w:color w:val="000000"/>
           <w:sz w:val="26"/>
         </w:rPr>
-        <w:t xml:space="preserve"> để người đọc có thể đối chiếu từng con số. Bảng so sánh, hai biểu đồ và bảng mức đóng góp của đặc trưng dưới đây đều được sinh lại bằng cùng script đó, phản ánh kết quả hiện có trên tập kiểm tra. Đường ROC và đường Precision-Recall tổng hợp sẽ được bổ sung trong bản báo cáo cuối.</w:t>
+        <w:t xml:space="preserve"> để người đọc có thể đối chiếu từng con số. Bảng so sánh, các biểu đồ và bảng mức đóng góp của đặc trưng dưới đây đều được sinh lại bằng cùng script đó. Toàn bộ giá trị trong Bảng 5.1 đã được đối chiếu và khớp tuyệt đối với </w:t>
+      </w:r>
+      <w:r>
+        <w:rPr>
+          <w:rFonts w:ascii="Courier New" w:hAnsi="Courier New"/>
+          <w:b w:val="0"/>
+          <w:i w:val="0"/>
+          <w:color w:val="000000"/>
+          <w:sz w:val="25"/>
+        </w:rPr>
+        <w:t>reports/model_comparison.csv</w:t>
+      </w:r>
+      <w:r>
+        <w:rPr>
+          <w:rFonts w:ascii="Times New Roman" w:hAnsi="Times New Roman"/>
+          <w:b w:val="0"/>
+          <w:i w:val="0"/>
+          <w:color w:val="000000"/>
+          <w:sz w:val="26"/>
+        </w:rPr>
+        <w:t xml:space="preserve"> do bước đánh giá chéo của nhóm xuất ra, nên hai nguồn tính độc lập cho cùng một kết quả.</w:t>
       </w:r>
     </w:p>
     <w:p>
@@ -11767,8 +12111,6 @@
       <w:tblPr>
         <w:tblW w:type="auto" w:w="0"/>
         <w:jc w:val="center"/>
-        <w:tblLayout w:type="fixed"/>
-        <w:tblLook w:firstColumn="1" w:firstRow="1" w:lastColumn="0" w:lastRow="0" w:noHBand="0" w:noVBand="1" w:val="04A0"/>
         <w:tblBorders>
           <w:top w:val="single" w:sz="6" w:space="0" w:color="CCCCCC"/>
           <w:bottom w:val="single" w:sz="6" w:space="0" w:color="CCCCCC"/>
@@ -11777,6 +12119,8 @@
           <w:left w:val="none"/>
           <w:right w:val="none"/>
         </w:tblBorders>
+        <w:tblLayout w:type="fixed"/>
+        <w:tblLook w:firstColumn="1" w:firstRow="1" w:lastColumn="0" w:lastRow="0" w:noHBand="0" w:noVBand="1" w:val="04A0"/>
       </w:tblPr>
       <w:tblGrid>
         <w:gridCol w:w="1512"/>
@@ -11788,8 +12132,8 @@
       </w:tblGrid>
       <w:tr>
         <w:trPr>
+          <w:cantSplit/>
           <w:tblHeader/>
-          <w:cantSplit/>
         </w:trPr>
         <w:tc>
           <w:tcPr>
@@ -12944,7 +13288,134 @@
           <w:color w:val="000000"/>
           <w:sz w:val="26"/>
         </w:rPr>
-        <w:t>Khoảng cách giữa hai chỉ số xếp hạng của Autoencoder cho thấy vì sao không nên đọc ROC-AUC một mình trên dữ liệu lệch lớp. ROC-AUC đạt 0,9318 nhưng Average Precision chỉ đạt 0,5973. Nguyên nhân là ROC-AUC lấy toàn bộ 38.357 giao dịch bình thường làm mẫu số cho tỷ lệ dương tính giả, nên gần 2.000 cảnh báo nhầm vẫn chỉ làm chỉ số này giảm nhẹ. Average Precision thì đo trực tiếp Precision dọc theo đường Precision-Recall, nên phản ánh đúng cái giá phải trả để đạt được Recall đó. Với bốn biến thể học có giám sát, hai chỉ số này gần như trùng nhau nên kết luận không thay đổi.</w:t>
+        <w:t>Khoảng cách giữa hai chỉ số xếp hạng của Autoencoder cho thấy vì sao không nên đọc ROC-AUC một mình trên dữ liệu lệch lớp. ROC-AUC đạt 0,9318 nhưng Average Precision chỉ đạt 0,5973. Nguyên nhân là ROC-AUC lấy toàn bộ 38.357 giao dịch bình thường làm mẫu số cho tỷ lệ dương tính giả, nên gần 2.000 cảnh báo nhầm vẫn chỉ làm chỉ số này giảm nhẹ. Average Precision thì đo trực tiếp Precision dọc theo đường Precision–Recall, nên phản ánh đúng cái giá phải trả để đạt được Recall đó. Với bốn biến thể học có giám sát, hai chỉ số này gần như trùng nhau nên kết luận không thay đổi.</w:t>
+      </w:r>
+    </w:p>
+    <w:p>
+      <w:pPr>
+        <w:spacing w:before="160" w:after="60"/>
+        <w:jc w:val="center"/>
+      </w:pPr>
+      <w:r>
+        <w:drawing>
+          <wp:inline xmlns:a="http://schemas.openxmlformats.org/drawingml/2006/main" xmlns:pic="http://schemas.openxmlformats.org/drawingml/2006/picture">
+            <wp:extent cx="5220000" cy="3897365"/>
+            <wp:docPr id="2" name="Picture 2"/>
+            <wp:cNvGraphicFramePr>
+              <a:graphicFrameLocks noChangeAspect="1"/>
+            </wp:cNvGraphicFramePr>
+            <a:graphic>
+              <a:graphicData uri="http://schemas.openxmlformats.org/drawingml/2006/picture">
+                <pic:pic>
+                  <pic:nvPicPr>
+                    <pic:cNvPr id="0" name="roc_curves_all.png"/>
+                    <pic:cNvPicPr/>
+                  </pic:nvPicPr>
+                  <pic:blipFill>
+                    <a:blip r:embed="rId16"/>
+                    <a:stretch>
+                      <a:fillRect/>
+                    </a:stretch>
+                  </pic:blipFill>
+                  <pic:spPr>
+                    <a:xfrm>
+                      <a:off x="0" y="0"/>
+                      <a:ext cx="5220000" cy="3897365"/>
+                    </a:xfrm>
+                    <a:prstGeom prst="rect"/>
+                  </pic:spPr>
+                </pic:pic>
+              </a:graphicData>
+            </a:graphic>
+          </wp:inline>
+        </w:drawing>
+      </w:r>
+    </w:p>
+    <w:p>
+      <w:pPr>
+        <w:spacing w:before="40" w:after="160"/>
+        <w:jc w:val="center"/>
+      </w:pPr>
+      <w:r>
+        <w:rPr>
+          <w:rFonts w:ascii="Times New Roman" w:hAnsi="Times New Roman"/>
+          <w:i/>
+          <w:color w:val="000000"/>
+          <w:sz w:val="21"/>
+        </w:rPr>
+        <w:t>Hình 5.1. Đường ROC của năm biến thể mô hình trên tập kiểm tra</w:t>
+      </w:r>
+    </w:p>
+    <w:p>
+      <w:pPr>
+        <w:spacing w:before="160" w:after="60"/>
+        <w:jc w:val="center"/>
+      </w:pPr>
+      <w:r>
+        <w:drawing>
+          <wp:inline xmlns:a="http://schemas.openxmlformats.org/drawingml/2006/main" xmlns:pic="http://schemas.openxmlformats.org/drawingml/2006/picture">
+            <wp:extent cx="5220000" cy="3897365"/>
+            <wp:docPr id="3" name="Picture 3"/>
+            <wp:cNvGraphicFramePr>
+              <a:graphicFrameLocks noChangeAspect="1"/>
+            </wp:cNvGraphicFramePr>
+            <a:graphic>
+              <a:graphicData uri="http://schemas.openxmlformats.org/drawingml/2006/picture">
+                <pic:pic>
+                  <pic:nvPicPr>
+                    <pic:cNvPr id="0" name="pr_curves_all.png"/>
+                    <pic:cNvPicPr/>
+                  </pic:nvPicPr>
+                  <pic:blipFill>
+                    <a:blip r:embed="rId17"/>
+                    <a:stretch>
+                      <a:fillRect/>
+                    </a:stretch>
+                  </pic:blipFill>
+                  <pic:spPr>
+                    <a:xfrm>
+                      <a:off x="0" y="0"/>
+                      <a:ext cx="5220000" cy="3897365"/>
+                    </a:xfrm>
+                    <a:prstGeom prst="rect"/>
+                  </pic:spPr>
+                </pic:pic>
+              </a:graphicData>
+            </a:graphic>
+          </wp:inline>
+        </w:drawing>
+      </w:r>
+    </w:p>
+    <w:p>
+      <w:pPr>
+        <w:spacing w:before="40" w:after="160"/>
+        <w:jc w:val="center"/>
+      </w:pPr>
+      <w:r>
+        <w:rPr>
+          <w:rFonts w:ascii="Times New Roman" w:hAnsi="Times New Roman"/>
+          <w:i/>
+          <w:color w:val="000000"/>
+          <w:sz w:val="21"/>
+        </w:rPr>
+        <w:t>Hình 5.2. Đường Precision–Recall của năm biến thể mô hình trên tập kiểm tra</w:t>
+      </w:r>
+    </w:p>
+    <w:p>
+      <w:pPr>
+        <w:spacing w:before="0" w:after="40" w:line="312" w:lineRule="auto"/>
+        <w:ind w:firstLine="720"/>
+        <w:jc w:val="both"/>
+      </w:pPr>
+      <w:r>
+        <w:rPr>
+          <w:rFonts w:ascii="Times New Roman" w:hAnsi="Times New Roman"/>
+          <w:b w:val="0"/>
+          <w:i w:val="0"/>
+          <w:color w:val="000000"/>
+          <w:sz w:val="26"/>
+        </w:rPr>
+        <w:t>Hình 5.1 và Hình 5.2 trực quan hóa nhận định trên. Trên đường ROC, bốn biến thể học có giám sát gần như trùng nhau và ép sát góc trên bên trái, còn Autoencoder tuy thấp hơn nhưng vẫn cách xa đường chéo ngẫu nhiên. Trên đường Precision–Recall, khoảng cách giữa hai nhóm mô hình giãn ra rõ rệt: bốn biến thể học có giám sát giữ Precision gần 1,0 trên toàn dải Recall, trong khi Precision của Autoencoder suy giảm liên tục và chỉ còn khoảng 0,05 ở mức Recall cao nhất. Cùng một mô hình nhưng hai đồ thị cho hai ấn tượng khác nhau, đó là lý do đề bài yêu cầu không dựa vào một chỉ số duy nhất.</w:t>
       </w:r>
     </w:p>
     <w:p>
@@ -12976,7 +13447,7 @@
         <w:drawing>
           <wp:inline xmlns:a="http://schemas.openxmlformats.org/drawingml/2006/main" xmlns:pic="http://schemas.openxmlformats.org/drawingml/2006/picture">
             <wp:extent cx="5220000" cy="3450756"/>
-            <wp:docPr id="2" name="Picture 2"/>
+            <wp:docPr id="4" name="Picture 4"/>
             <wp:cNvGraphicFramePr>
               <a:graphicFrameLocks noChangeAspect="1"/>
             </wp:cNvGraphicFramePr>
@@ -12988,7 +13459,7 @@
                     <pic:cNvPicPr/>
                   </pic:nvPicPr>
                   <pic:blipFill>
-                    <a:blip r:embed="rId16"/>
+                    <a:blip r:embed="rId18"/>
                     <a:stretch>
                       <a:fillRect/>
                     </a:stretch>
@@ -13019,7 +13490,7 @@
           <w:color w:val="000000"/>
           <w:sz w:val="21"/>
         </w:rPr>
-        <w:t>Hình 5.1. So sánh riêng bốn thành phần TN, FP, FN và TP theo mô hình</w:t>
+        <w:t>Hình 5.3. So sánh riêng bốn thành phần TN, FP, FN và TP theo mô hình</w:t>
       </w:r>
     </w:p>
     <w:p>
@@ -13036,7 +13507,7 @@
           <w:color w:val="000000"/>
           <w:sz w:val="26"/>
         </w:rPr>
-        <w:t>Hình 5.1 tách TN, FP, FN và TP thành bốn đồ thị để mỗi thành phần có trục tung riêng. Trục hoành biểu diễn năm biến thể mô hình, còn trục tung biểu diễn số giao dịch. Hai đồ thị sai số FP và FN dùng trục tung theo thang logarit vì giá trị trong cùng một đồ thị chênh nhau tới ba bậc độ lớn, ví dụ 1 cảnh báo nhầm của Random Forest kết hợp SMOTENC so với 1.998 cảnh báo nhầm của Autoencoder. Nếu giữ thang tuyến tính, các cột nhỏ bị dí sát trục và không còn so sánh được với nhau. Cách trình bày này giúp quan sát cả những sai số có giá trị nhỏ mà không bị hai nhóm TN và TP có quy mô lớn che khuất.</w:t>
+        <w:t>Hình 5.3 tách TN, FP, FN và TP thành bốn đồ thị để mỗi thành phần có trục tung riêng. Trục hoành biểu diễn năm biến thể mô hình, còn trục tung biểu diễn số giao dịch. Hai đồ thị sai số FP và FN dùng trục tung theo thang logarit vì giá trị trong cùng một đồ thị chênh nhau tới ba bậc độ lớn, ví dụ 1 cảnh báo nhầm của Random Forest kết hợp SMOTENC so với 1.998 cảnh báo nhầm của Autoencoder. Nếu giữ thang tuyến tính, các cột nhỏ bị dí sát trục và không còn so sánh được với nhau. Cách trình bày này giúp quan sát cả những sai số có giá trị nhỏ mà không bị hai nhóm TN và TP có quy mô lớn che khuất.</w:t>
       </w:r>
     </w:p>
     <w:p>
@@ -13168,8 +13639,6 @@
       <w:tblPr>
         <w:tblW w:type="auto" w:w="0"/>
         <w:jc w:val="center"/>
-        <w:tblLayout w:type="fixed"/>
-        <w:tblLook w:firstColumn="1" w:firstRow="1" w:lastColumn="0" w:lastRow="0" w:noHBand="0" w:noVBand="1" w:val="04A0"/>
         <w:tblBorders>
           <w:top w:val="single" w:sz="6" w:space="0" w:color="CCCCCC"/>
           <w:bottom w:val="single" w:sz="6" w:space="0" w:color="CCCCCC"/>
@@ -13178,6 +13647,8 @@
           <w:left w:val="none"/>
           <w:right w:val="none"/>
         </w:tblBorders>
+        <w:tblLayout w:type="fixed"/>
+        <w:tblLook w:firstColumn="1" w:firstRow="1" w:lastColumn="0" w:lastRow="0" w:noHBand="0" w:noVBand="1" w:val="04A0"/>
       </w:tblPr>
       <w:tblGrid>
         <w:gridCol w:w="1814"/>
@@ -13188,8 +13659,8 @@
       </w:tblGrid>
       <w:tr>
         <w:trPr>
+          <w:cantSplit/>
           <w:tblHeader/>
-          <w:cantSplit/>
         </w:trPr>
         <w:tc>
           <w:tcPr>
@@ -14225,7 +14696,7 @@
         <w:drawing>
           <wp:inline xmlns:a="http://schemas.openxmlformats.org/drawingml/2006/main" xmlns:pic="http://schemas.openxmlformats.org/drawingml/2006/picture">
             <wp:extent cx="5220000" cy="3563885"/>
-            <wp:docPr id="3" name="Picture 3"/>
+            <wp:docPr id="5" name="Picture 5"/>
             <wp:cNvGraphicFramePr>
               <a:graphicFrameLocks noChangeAspect="1"/>
             </wp:cNvGraphicFramePr>
@@ -14237,7 +14708,7 @@
                     <pic:cNvPicPr/>
                   </pic:nvPicPr>
                   <pic:blipFill>
-                    <a:blip r:embed="rId17"/>
+                    <a:blip r:embed="rId19"/>
                     <a:stretch>
                       <a:fillRect/>
                     </a:stretch>
@@ -14268,7 +14739,7 @@
           <w:color w:val="000000"/>
           <w:sz w:val="21"/>
         </w:rPr>
-        <w:t>Hình 5.2. Mức đóng góp của toàn bộ 14 đặc trưng theo hai mô hình dùng SMOTENC</w:t>
+        <w:t>Hình 5.4. Mức đóng góp của toàn bộ 14 đặc trưng theo hai mô hình dùng SMOTENC</w:t>
       </w:r>
     </w:p>
     <w:p>
@@ -14285,7 +14756,7 @@
           <w:color w:val="000000"/>
           <w:sz w:val="26"/>
         </w:rPr>
-        <w:t xml:space="preserve">Hình 5.2 trình bày đầy đủ 14 đặc trưng của cả hai mô hình, mỗi mô hình trên một panel riêng vì hai thang đo khác nhau. Màu phân biệt nhóm đặc trưng dẫn xuất từ số dư với phần còn lại, cho thấy mức độ tập trung rõ hơn bảng số. Với Random Forest, mức đóng góp giảm tương đối đều và các đặc trưng thời gian vẫn giữ vai trò nhỏ nhưng khác 0. Với XGBoost, hai đặc trưng đầu chiếm gần như toàn bộ, mười hai đặc trưng còn lại cộng lại chưa tới 3%, trong đó </w:t>
+        <w:t xml:space="preserve">Hình 5.4 trình bày đầy đủ 14 đặc trưng của cả hai mô hình, mỗi mô hình trên một panel riêng vì hai thang đo khác nhau. Màu phân biệt nhóm đặc trưng dẫn xuất từ số dư với phần còn lại, cho thấy mức độ tập trung rõ hơn bảng số. Với Random Forest, mức đóng góp giảm tương đối đều và các đặc trưng thời gian vẫn giữ vai trò nhỏ nhưng khác 0. Với XGBoost, hai đặc trưng đầu chiếm gần như toàn bộ, mười hai đặc trưng còn lại cộng lại chưa tới 3%, trong đó </w:t>
       </w:r>
       <w:r>
         <w:rPr>
@@ -14708,15 +15179,13 @@
           <w:color w:val="000000"/>
           <w:sz w:val="26"/>
         </w:rPr>
-        <w:t>Downsampling chỉ lấy mẫu ngẫu nhiên lớp bình thường nên không làm thay đổi phân bố có điều kiện của từng lớp. Nhờ đó, tỷ lệ phát hiện đúng và tỷ lệ báo động giả đo trên tập kiểm tra vẫn dùng được cho phân bố gốc, chỉ riêng Precision là phụ thuộc tỷ lệ lớp và cần quy chiếu lại. Bảng 6.1 trình bày kết quả quy chiếu về tỷ lệ 0,129082% của PaySim gốc, kèm khoảng tin cậy 95% tính theo phương pháp Clopper-Pearson cho tỷ lệ báo động giả.</w:t>
+        <w:t>Downsampling chỉ lấy mẫu ngẫu nhiên lớp bình thường nên không làm thay đổi phân bố có điều kiện của từng lớp. Nhờ đó, tỷ lệ phát hiện đúng và tỷ lệ báo động giả đo trên tập kiểm tra vẫn dùng được cho phân bố gốc, chỉ riêng Precision là phụ thuộc tỷ lệ lớp và cần quy chiếu lại. Bảng 6.1 trình bày kết quả quy chiếu về tỷ lệ 0,129082% của PaySim gốc, kèm khoảng tin cậy 95% tính theo phương pháp Clopper–Pearson cho tỷ lệ báo động giả.</w:t>
       </w:r>
     </w:p>
     <w:tbl>
       <w:tblPr>
         <w:tblW w:type="auto" w:w="0"/>
         <w:jc w:val="center"/>
-        <w:tblLayout w:type="fixed"/>
-        <w:tblLook w:firstColumn="1" w:firstRow="1" w:lastColumn="0" w:lastRow="0" w:noHBand="0" w:noVBand="1" w:val="04A0"/>
         <w:tblBorders>
           <w:top w:val="single" w:sz="6" w:space="0" w:color="CCCCCC"/>
           <w:bottom w:val="single" w:sz="6" w:space="0" w:color="CCCCCC"/>
@@ -14725,6 +15194,8 @@
           <w:left w:val="none"/>
           <w:right w:val="none"/>
         </w:tblBorders>
+        <w:tblLayout w:type="fixed"/>
+        <w:tblLook w:firstColumn="1" w:firstRow="1" w:lastColumn="0" w:lastRow="0" w:noHBand="0" w:noVBand="1" w:val="04A0"/>
       </w:tblPr>
       <w:tblGrid>
         <w:gridCol w:w="1512"/>
@@ -14736,8 +15207,8 @@
       </w:tblGrid>
       <w:tr>
         <w:trPr>
+          <w:cantSplit/>
           <w:tblHeader/>
-          <w:cantSplit/>
         </w:trPr>
         <w:tc>
           <w:tcPr>
@@ -15065,7 +15536,7 @@
                 <w:color w:val="000000"/>
                 <w:sz w:val="20"/>
               </w:rPr>
-              <w:t>0,8985 - 0,9995</w:t>
+              <w:t>0,8985 – 0,9995</w:t>
             </w:r>
           </w:p>
         </w:tc>
@@ -15249,7 +15720,7 @@
                 <w:color w:val="000000"/>
                 <w:sz w:val="20"/>
               </w:rPr>
-              <w:t>0,8491 - 0,9876</w:t>
+              <w:t>0,8491 – 0,9876</w:t>
             </w:r>
           </w:p>
         </w:tc>
@@ -15429,7 +15900,7 @@
                 <w:color w:val="000000"/>
                 <w:sz w:val="20"/>
               </w:rPr>
-              <w:t>0,8281 - 0,9784</w:t>
+              <w:t>0,8281 – 0,9784</w:t>
             </w:r>
           </w:p>
         </w:tc>
@@ -15613,7 +16084,7 @@
                 <w:color w:val="000000"/>
                 <w:sz w:val="20"/>
               </w:rPr>
-              <w:t>0,7738 - 0,9460</w:t>
+              <w:t>0,7738 – 0,9460</w:t>
             </w:r>
           </w:p>
         </w:tc>
@@ -15793,7 +16264,7 @@
                 <w:color w:val="000000"/>
                 <w:sz w:val="20"/>
               </w:rPr>
-              <w:t>0,0176 - 0,0191</w:t>
+              <w:t>0,0176 – 0,0191</w:t>
             </w:r>
           </w:p>
         </w:tc>
@@ -16278,8 +16749,6 @@
       <w:tblPr>
         <w:tblW w:type="auto" w:w="0"/>
         <w:jc w:val="center"/>
-        <w:tblLayout w:type="fixed"/>
-        <w:tblLook w:firstColumn="1" w:firstRow="1" w:lastColumn="0" w:lastRow="0" w:noHBand="0" w:noVBand="1" w:val="04A0"/>
         <w:tblBorders>
           <w:top w:val="single" w:sz="6" w:space="0" w:color="CCCCCC"/>
           <w:bottom w:val="single" w:sz="6" w:space="0" w:color="CCCCCC"/>
@@ -16288,6 +16757,8 @@
           <w:left w:val="none"/>
           <w:right w:val="none"/>
         </w:tblBorders>
+        <w:tblLayout w:type="fixed"/>
+        <w:tblLook w:firstColumn="1" w:firstRow="1" w:lastColumn="0" w:lastRow="0" w:noHBand="0" w:noVBand="1" w:val="04A0"/>
       </w:tblPr>
       <w:tblGrid>
         <w:gridCol w:w="2268"/>
@@ -16297,8 +16768,8 @@
       </w:tblGrid>
       <w:tr>
         <w:trPr>
+          <w:cantSplit/>
           <w:tblHeader/>
-          <w:cantSplit/>
         </w:trPr>
         <w:tc>
           <w:tcPr>
@@ -17311,7 +17782,7 @@
           <w:color w:val="000000"/>
           <w:sz w:val="26"/>
         </w:rPr>
-        <w:t>Toàn bộ bảy mục tiêu cụ thể đã hoàn thành. Trong đó mục tiêu thứ bảy đã tích hợp mô hình XGBoost-SMOTE cùng bộ tiền xử lý và scaler thật vào giao diện tương tác Streamlit, hỗ trợ 4 kịch bản thử nghiệm và vượt qua kiểm thử Browser QA.</w:t>
+        <w:t>Toàn bộ bảy mục tiêu cụ thể đã hoàn thành. Trong đó mục tiêu thứ bảy đã tích hợp mô hình XGBoost-SMOTE cùng bộ tiền xử lý và scaler thật vào giao diện tương tác Streamlit, hỗ trợ bốn kịch bản thử nghiệm và vượt qua kiểm thử Browser QA.</w:t>
       </w:r>
     </w:p>
     <w:p>
@@ -17608,7 +18079,7 @@
       <w:pPr>
         <w:spacing w:before="20" w:after="40" w:line="300" w:lineRule="auto"/>
         <w:ind w:left="720" w:hanging="283"/>
-        <w:jc w:val="both"/>
+        <w:jc w:val="left"/>
       </w:pPr>
       <w:r>
         <w:rPr>
@@ -17634,7 +18105,7 @@
       <w:pPr>
         <w:spacing w:before="20" w:after="40" w:line="300" w:lineRule="auto"/>
         <w:ind w:left="720" w:hanging="283"/>
-        <w:jc w:val="both"/>
+        <w:jc w:val="left"/>
       </w:pPr>
       <w:r>
         <w:rPr>
@@ -17680,7 +18151,7 @@
       <w:pPr>
         <w:spacing w:before="20" w:after="40" w:line="300" w:lineRule="auto"/>
         <w:ind w:left="720" w:hanging="283"/>
-        <w:jc w:val="both"/>
+        <w:jc w:val="left"/>
       </w:pPr>
       <w:r>
         <w:rPr>
@@ -17746,7 +18217,7 @@
       <w:pPr>
         <w:spacing w:before="20" w:after="40" w:line="300" w:lineRule="auto"/>
         <w:ind w:left="720" w:hanging="283"/>
-        <w:jc w:val="both"/>
+        <w:jc w:val="left"/>
       </w:pPr>
       <w:r>
         <w:rPr>
@@ -17792,7 +18263,7 @@
       <w:pPr>
         <w:spacing w:before="20" w:after="40" w:line="300" w:lineRule="auto"/>
         <w:ind w:left="720" w:hanging="283"/>
-        <w:jc w:val="both"/>
+        <w:jc w:val="left"/>
       </w:pPr>
       <w:r>
         <w:rPr>
@@ -17838,7 +18309,7 @@
       <w:pPr>
         <w:spacing w:before="20" w:after="40" w:line="300" w:lineRule="auto"/>
         <w:ind w:left="720" w:hanging="283"/>
-        <w:jc w:val="both"/>
+        <w:jc w:val="left"/>
       </w:pPr>
       <w:r>
         <w:rPr>
@@ -17884,7 +18355,7 @@
       <w:pPr>
         <w:spacing w:before="20" w:after="40" w:line="300" w:lineRule="auto"/>
         <w:ind w:left="720" w:hanging="283"/>
-        <w:jc w:val="both"/>
+        <w:jc w:val="left"/>
       </w:pPr>
       <w:r>
         <w:rPr>
@@ -17930,7 +18401,7 @@
       <w:pPr>
         <w:spacing w:before="20" w:after="40" w:line="300" w:lineRule="auto"/>
         <w:ind w:left="720" w:hanging="283"/>
-        <w:jc w:val="both"/>
+        <w:jc w:val="left"/>
       </w:pPr>
       <w:r>
         <w:rPr>
@@ -17949,7 +18420,7 @@
           <w:color w:val="000000"/>
           <w:sz w:val="26"/>
         </w:rPr>
-        <w:t xml:space="preserve">Nhóm 9, </w:t>
+        <w:t xml:space="preserve">Nguyễn Duy Khang, </w:t>
       </w:r>
       <w:r>
         <w:rPr>
@@ -17959,7 +18430,7 @@
           <w:color w:val="000000"/>
           <w:sz w:val="25"/>
         </w:rPr>
-        <w:t>reports/rf_smote_feature_importance.csv</w:t>
+        <w:t>reports/model_comparison.csv</w:t>
       </w:r>
       <w:r>
         <w:rPr>
@@ -17969,7 +18440,7 @@
           <w:color w:val="000000"/>
           <w:sz w:val="26"/>
         </w:rPr>
-        <w:t xml:space="preserve"> và </w:t>
+        <w:t xml:space="preserve">, </w:t>
       </w:r>
       <w:r>
         <w:rPr>
@@ -17979,7 +18450,7 @@
           <w:color w:val="000000"/>
           <w:sz w:val="25"/>
         </w:rPr>
-        <w:t>reports/xgb_smote_feature_importance.csv</w:t>
+        <w:t>reports/figures/roc_curves_all.png</w:t>
       </w:r>
       <w:r>
         <w:rPr>
@@ -17989,14 +18460,146 @@
           <w:color w:val="000000"/>
           <w:sz w:val="26"/>
         </w:rPr>
-        <w:t>, mức đóng góp đặc trưng đã lưu của hai mô hình dùng SMOTENC.</w:t>
+        <w:t xml:space="preserve"> và </w:t>
+      </w:r>
+      <w:r>
+        <w:rPr>
+          <w:rFonts w:ascii="Courier New" w:hAnsi="Courier New"/>
+          <w:b w:val="0"/>
+          <w:i w:val="0"/>
+          <w:color w:val="000000"/>
+          <w:sz w:val="25"/>
+        </w:rPr>
+        <w:t>reports/figures/pr_curves_all.png</w:t>
+      </w:r>
+      <w:r>
+        <w:rPr>
+          <w:rFonts w:ascii="Times New Roman" w:hAnsi="Times New Roman"/>
+          <w:b w:val="0"/>
+          <w:i w:val="0"/>
+          <w:color w:val="000000"/>
+          <w:sz w:val="26"/>
+        </w:rPr>
+        <w:t>, bảng so sánh tổng hợp và đường ROC, Precision–Recall của bước đánh giá chéo.</w:t>
       </w:r>
     </w:p>
     <w:p>
       <w:pPr>
         <w:spacing w:before="20" w:after="40" w:line="300" w:lineRule="auto"/>
         <w:ind w:left="720" w:hanging="283"/>
-        <w:jc w:val="both"/>
+        <w:jc w:val="left"/>
+      </w:pPr>
+      <w:r>
+        <w:rPr>
+          <w:rFonts w:ascii="Times New Roman" w:hAnsi="Times New Roman"/>
+          <w:b/>
+          <w:color w:val="000000"/>
+          <w:sz w:val="26"/>
+        </w:rPr>
+        <w:t xml:space="preserve">-  </w:t>
+      </w:r>
+      <w:r>
+        <w:rPr>
+          <w:rFonts w:ascii="Times New Roman" w:hAnsi="Times New Roman"/>
+          <w:b w:val="0"/>
+          <w:i w:val="0"/>
+          <w:color w:val="000000"/>
+          <w:sz w:val="26"/>
+        </w:rPr>
+        <w:t xml:space="preserve">Hoàng Cao Sơn và Nguyễn Duy Khang, </w:t>
+      </w:r>
+      <w:r>
+        <w:rPr>
+          <w:rFonts w:ascii="Courier New" w:hAnsi="Courier New"/>
+          <w:b w:val="0"/>
+          <w:i w:val="0"/>
+          <w:color w:val="000000"/>
+          <w:sz w:val="25"/>
+        </w:rPr>
+        <w:t>notebooks/06_evaluation_comparison.ipynb</w:t>
+      </w:r>
+      <w:r>
+        <w:rPr>
+          <w:rFonts w:ascii="Times New Roman" w:hAnsi="Times New Roman"/>
+          <w:b w:val="0"/>
+          <w:i w:val="0"/>
+          <w:color w:val="000000"/>
+          <w:sz w:val="26"/>
+        </w:rPr>
+        <w:t>, notebook đánh giá và so sánh chéo các mô hình.</w:t>
+      </w:r>
+    </w:p>
+    <w:p>
+      <w:pPr>
+        <w:spacing w:before="20" w:after="40" w:line="300" w:lineRule="auto"/>
+        <w:ind w:left="720" w:hanging="283"/>
+        <w:jc w:val="left"/>
+      </w:pPr>
+      <w:r>
+        <w:rPr>
+          <w:rFonts w:ascii="Times New Roman" w:hAnsi="Times New Roman"/>
+          <w:b/>
+          <w:color w:val="000000"/>
+          <w:sz w:val="26"/>
+        </w:rPr>
+        <w:t xml:space="preserve">-  </w:t>
+      </w:r>
+      <w:r>
+        <w:rPr>
+          <w:rFonts w:ascii="Times New Roman" w:hAnsi="Times New Roman"/>
+          <w:b w:val="0"/>
+          <w:i w:val="0"/>
+          <w:color w:val="000000"/>
+          <w:sz w:val="26"/>
+        </w:rPr>
+        <w:t xml:space="preserve">Nhóm 9, </w:t>
+      </w:r>
+      <w:r>
+        <w:rPr>
+          <w:rFonts w:ascii="Courier New" w:hAnsi="Courier New"/>
+          <w:b w:val="0"/>
+          <w:i w:val="0"/>
+          <w:color w:val="000000"/>
+          <w:sz w:val="25"/>
+        </w:rPr>
+        <w:t>reports/rf_smote_feature_importance.csv</w:t>
+      </w:r>
+      <w:r>
+        <w:rPr>
+          <w:rFonts w:ascii="Times New Roman" w:hAnsi="Times New Roman"/>
+          <w:b w:val="0"/>
+          <w:i w:val="0"/>
+          <w:color w:val="000000"/>
+          <w:sz w:val="26"/>
+        </w:rPr>
+        <w:t xml:space="preserve"> và </w:t>
+      </w:r>
+      <w:r>
+        <w:rPr>
+          <w:rFonts w:ascii="Courier New" w:hAnsi="Courier New"/>
+          <w:b w:val="0"/>
+          <w:i w:val="0"/>
+          <w:color w:val="000000"/>
+          <w:sz w:val="25"/>
+        </w:rPr>
+        <w:t>reports/xgb_smote_feature_importance.csv</w:t>
+      </w:r>
+      <w:r>
+        <w:rPr>
+          <w:rFonts w:ascii="Times New Roman" w:hAnsi="Times New Roman"/>
+          <w:b w:val="0"/>
+          <w:i w:val="0"/>
+          <w:color w:val="000000"/>
+          <w:sz w:val="26"/>
+        </w:rPr>
+        <w:t>, mức đóng góp đặc trưng đã lưu của hai mô hình dùng SMOTENC.</w:t>
+      </w:r>
+    </w:p>
+    <w:p>
+      <w:pPr>
+        <w:spacing w:before="20" w:after="40" w:line="300" w:lineRule="auto"/>
+        <w:ind w:left="720" w:hanging="283"/>
+        <w:jc w:val="left"/>
       </w:pPr>
       <w:r>
         <w:rPr>
@@ -18102,7 +18705,7 @@
       <w:pPr>
         <w:spacing w:before="40" w:after="60" w:line="276" w:lineRule="auto"/>
         <w:ind w:left="454" w:hanging="454"/>
-        <w:jc w:val="both"/>
+        <w:jc w:val="left"/>
       </w:pPr>
       <w:bookmarkStart w:id="1067" w:name="ref_1"/>
       <w:bookmarkEnd w:id="1067"/>
@@ -18124,9 +18727,9 @@
           <w:color w:val="000000"/>
           <w:sz w:val="23"/>
         </w:rPr>
-        <w:t xml:space="preserve">A. Abdallah, M. A. Maarof, and A. Zainal, “Fraud detection system: A survey,” Journal of Network and Computer Applications, vol. 68, pp. 90-113, 2016, doi: </w:t>
-      </w:r>
-      <w:hyperlink r:id="rId18">
+        <w:t xml:space="preserve">A. Abdallah, M. A. Maarof, and A. Zainal, “Fraud detection system: A survey,” Journal of Network and Computer Applications, vol. 68, pp. 90–113, 2016, doi: </w:t>
+      </w:r>
+      <w:hyperlink r:id="rId20">
         <w:r>
           <w:rPr>
             <w:rFonts w:ascii="Times New Roman" w:hAnsi="Times New Roman"/>
@@ -18142,7 +18745,7 @@
       <w:pPr>
         <w:spacing w:before="40" w:after="60" w:line="276" w:lineRule="auto"/>
         <w:ind w:left="454" w:hanging="454"/>
-        <w:jc w:val="both"/>
+        <w:jc w:val="left"/>
       </w:pPr>
       <w:bookmarkStart w:id="1068" w:name="ref_2"/>
       <w:bookmarkEnd w:id="1068"/>
@@ -18164,9 +18767,9 @@
           <w:color w:val="000000"/>
           <w:sz w:val="23"/>
         </w:rPr>
-        <w:t xml:space="preserve">E. A. Lopez-Rojas, A. Elmir, and S. Axelsson, “PaySim: A financial mobile money simulator for fraud detection,” in Proc. 28th European Modeling and Simulation Symposium, Larnaca, Cyprus, 2016, pp. 249-255. [Online]. Available: </w:t>
-      </w:r>
-      <w:hyperlink r:id="rId19">
+        <w:t xml:space="preserve">E. A. Lopez-Rojas, A. Elmir, and S. Axelsson, “PaySim: A financial mobile money simulator for fraud detection,” in Proc. 28th European Modeling and Simulation Symposium, Larnaca, Cyprus, 2016, pp. 249–255. [Online]. Available: </w:t>
+      </w:r>
+      <w:hyperlink r:id="rId21">
         <w:r>
           <w:rPr>
             <w:rFonts w:ascii="Times New Roman" w:hAnsi="Times New Roman"/>
@@ -18182,7 +18785,7 @@
       <w:pPr>
         <w:spacing w:before="40" w:after="60" w:line="276" w:lineRule="auto"/>
         <w:ind w:left="454" w:hanging="454"/>
-        <w:jc w:val="both"/>
+        <w:jc w:val="left"/>
       </w:pPr>
       <w:bookmarkStart w:id="1069" w:name="ref_3"/>
       <w:bookmarkEnd w:id="1069"/>
@@ -18206,7 +18809,7 @@
         </w:rPr>
         <w:t xml:space="preserve">E. Lopez-Rojas, “Synthetic Financial Datasets for Fraud Detection,” Kaggle. [Online]. Available: </w:t>
       </w:r>
-      <w:hyperlink r:id="rId20">
+      <w:hyperlink r:id="rId22">
         <w:r>
           <w:rPr>
             <w:rFonts w:ascii="Times New Roman" w:hAnsi="Times New Roman"/>
@@ -18232,7 +18835,7 @@
       <w:pPr>
         <w:spacing w:before="40" w:after="60" w:line="276" w:lineRule="auto"/>
         <w:ind w:left="454" w:hanging="454"/>
-        <w:jc w:val="both"/>
+        <w:jc w:val="left"/>
       </w:pPr>
       <w:bookmarkStart w:id="1070" w:name="ref_4"/>
       <w:bookmarkEnd w:id="1070"/>
@@ -18254,9 +18857,9 @@
           <w:color w:val="000000"/>
           <w:sz w:val="23"/>
         </w:rPr>
-        <w:t xml:space="preserve">N. V. Chawla, K. W. Bowyer, L. O. Hall, and W. P. Kegelmeyer, “SMOTE: Synthetic Minority Over-sampling Technique,” Journal of Artificial Intelligence Research, vol. 16, pp. 321-357, 2002, doi: </w:t>
-      </w:r>
-      <w:hyperlink r:id="rId21">
+        <w:t xml:space="preserve">N. V. Chawla, K. W. Bowyer, L. O. Hall, and W. P. Kegelmeyer, “SMOTE: Synthetic Minority Over-sampling Technique,” Journal of Artificial Intelligence Research, vol. 16, pp. 321–357, 2002, doi: </w:t>
+      </w:r>
+      <w:hyperlink r:id="rId23">
         <w:r>
           <w:rPr>
             <w:rFonts w:ascii="Times New Roman" w:hAnsi="Times New Roman"/>
@@ -18272,7 +18875,7 @@
       <w:pPr>
         <w:spacing w:before="40" w:after="60" w:line="276" w:lineRule="auto"/>
         <w:ind w:left="454" w:hanging="454"/>
-        <w:jc w:val="both"/>
+        <w:jc w:val="left"/>
       </w:pPr>
       <w:bookmarkStart w:id="1071" w:name="ref_5"/>
       <w:bookmarkEnd w:id="1071"/>
@@ -18294,9 +18897,9 @@
           <w:color w:val="000000"/>
           <w:sz w:val="23"/>
         </w:rPr>
-        <w:t xml:space="preserve">H. He, Y. Bai, E. A. Garcia, and S. Li, “ADASYN: Adaptive synthetic sampling approach for imbalanced learning,” in Proc. IEEE International Joint Conference on Neural Networks, Hong Kong, 2008, pp. 1322-1328, doi: </w:t>
-      </w:r>
-      <w:hyperlink r:id="rId22">
+        <w:t xml:space="preserve">H. He, Y. Bai, E. A. Garcia, and S. Li, “ADASYN: Adaptive synthetic sampling approach for imbalanced learning,” in Proc. IEEE International Joint Conference on Neural Networks, Hong Kong, 2008, pp. 1322–1328, doi: </w:t>
+      </w:r>
+      <w:hyperlink r:id="rId24">
         <w:r>
           <w:rPr>
             <w:rFonts w:ascii="Times New Roman" w:hAnsi="Times New Roman"/>
@@ -18312,7 +18915,7 @@
       <w:pPr>
         <w:spacing w:before="40" w:after="60" w:line="276" w:lineRule="auto"/>
         <w:ind w:left="454" w:hanging="454"/>
-        <w:jc w:val="both"/>
+        <w:jc w:val="left"/>
       </w:pPr>
       <w:bookmarkStart w:id="1072" w:name="ref_6"/>
       <w:bookmarkEnd w:id="1072"/>
@@ -18334,9 +18937,9 @@
           <w:color w:val="000000"/>
           <w:sz w:val="23"/>
         </w:rPr>
-        <w:t xml:space="preserve">L. Breiman, “Random Forests,” Machine Learning, vol. 45, no. 1, pp. 5-32, 2001, doi: </w:t>
-      </w:r>
-      <w:hyperlink r:id="rId23">
+        <w:t xml:space="preserve">L. Breiman, “Random Forests,” Machine Learning, vol. 45, no. 1, pp. 5–32, 2001, doi: </w:t>
+      </w:r>
+      <w:hyperlink r:id="rId25">
         <w:r>
           <w:rPr>
             <w:rFonts w:ascii="Times New Roman" w:hAnsi="Times New Roman"/>
@@ -18352,7 +18955,7 @@
       <w:pPr>
         <w:spacing w:before="40" w:after="60" w:line="276" w:lineRule="auto"/>
         <w:ind w:left="454" w:hanging="454"/>
-        <w:jc w:val="both"/>
+        <w:jc w:val="left"/>
       </w:pPr>
       <w:bookmarkStart w:id="1073" w:name="ref_7"/>
       <w:bookmarkEnd w:id="1073"/>
@@ -18374,9 +18977,9 @@
           <w:color w:val="000000"/>
           <w:sz w:val="23"/>
         </w:rPr>
-        <w:t xml:space="preserve">T. Chen and C. Guestrin, “XGBoost: A scalable tree boosting system,” in Proc. 22nd ACM SIGKDD International Conference on Knowledge Discovery and Data Mining, San Francisco, CA, USA, 2016, pp. 785-794, doi: </w:t>
-      </w:r>
-      <w:hyperlink r:id="rId24">
+        <w:t xml:space="preserve">T. Chen and C. Guestrin, “XGBoost: A scalable tree boosting system,” in Proc. 22nd ACM SIGKDD International Conference on Knowledge Discovery and Data Mining, San Francisco, CA, USA, 2016, pp. 785–794, doi: </w:t>
+      </w:r>
+      <w:hyperlink r:id="rId26">
         <w:r>
           <w:rPr>
             <w:rFonts w:ascii="Times New Roman" w:hAnsi="Times New Roman"/>
@@ -18392,7 +18995,7 @@
       <w:pPr>
         <w:spacing w:before="40" w:after="60" w:line="276" w:lineRule="auto"/>
         <w:ind w:left="454" w:hanging="454"/>
-        <w:jc w:val="both"/>
+        <w:jc w:val="left"/>
       </w:pPr>
       <w:bookmarkStart w:id="1074" w:name="ref_8"/>
       <w:bookmarkEnd w:id="1074"/>
@@ -18414,9 +19017,9 @@
           <w:color w:val="000000"/>
           <w:sz w:val="23"/>
         </w:rPr>
-        <w:t xml:space="preserve">G. E. Hinton and R. R. Salakhutdinov, “Reducing the dimensionality of data with neural networks,” Science, vol. 313, no. 5786, pp. 504-507, 2006, doi: </w:t>
-      </w:r>
-      <w:hyperlink r:id="rId25">
+        <w:t xml:space="preserve">G. E. Hinton and R. R. Salakhutdinov, “Reducing the dimensionality of data with neural networks,” Science, vol. 313, no. 5786, pp. 504–507, 2006, doi: </w:t>
+      </w:r>
+      <w:hyperlink r:id="rId27">
         <w:r>
           <w:rPr>
             <w:rFonts w:ascii="Times New Roman" w:hAnsi="Times New Roman"/>

</xml_diff>